<commit_message>
21/05/2026 - 17:17 h
</commit_message>
<xml_diff>
--- a/O joio e o trigo, o mal e o bem/O joio e o trigo.docx
+++ b/O joio e o trigo, o mal e o bem/O joio e o trigo.docx
@@ -58,77 +58,6 @@
       </w:pPr>
       <w:r>
         <w:rPr>
-          <w:rFonts w:eastAsia="Times New Roman" w:cs="Times New Roman" w:ascii="Garamond" w:hAnsi="Garamond"/>
-          <w:b/>
-          <w:i/>
-          <w:color w:val="023F62"/>
-          <w:kern w:val="0"/>
-          <w:sz w:val="48"/>
-          <w:szCs w:val="48"/>
-          <w:shd w:fill="auto" w:val="clear"/>
-          <w:lang w:val="en-US" w:eastAsia="zh-CN" w:bidi="hi-IN"/>
-        </w:rPr>
-      </w:r>
-    </w:p>
-    <w:p>
-      <w:pPr>
-        <w:pStyle w:val="Normal"/>
-        <w:jc w:val="both"/>
-        <w:rPr>
-          <w:sz w:val="36"/>
-          <w:szCs w:val="36"/>
-        </w:rPr>
-      </w:pPr>
-      <w:r>
-        <w:rPr>
-          <w:rFonts w:eastAsia="Times New Roman" w:cs="Times New Roman" w:ascii="Garamond" w:hAnsi="Garamond"/>
-          <w:color w:val="000000"/>
-          <w:kern w:val="0"/>
-          <w:sz w:val="36"/>
-          <w:szCs w:val="36"/>
-          <w:shd w:fill="auto" w:val="clear"/>
-          <w:lang w:val="en-US" w:eastAsia="zh-CN" w:bidi="hi-IN"/>
-        </w:rPr>
-        <w:t xml:space="preserve">O </w:t>
-      </w:r>
-      <w:r>
-        <w:rPr>
-          <w:rFonts w:eastAsia="Times New Roman" w:cs="Times New Roman" w:ascii="Garamond" w:hAnsi="Garamond"/>
-          <w:i w:val="false"/>
-          <w:iCs w:val="false"/>
-          <w:color w:val="000000"/>
-          <w:kern w:val="0"/>
-          <w:sz w:val="36"/>
-          <w:szCs w:val="36"/>
-          <w:shd w:fill="auto" w:val="clear"/>
-          <w:lang w:val="en-US" w:eastAsia="zh-CN" w:bidi="hi-IN"/>
-        </w:rPr>
-        <w:t>Pedi e obtereis</w:t>
-      </w:r>
-      <w:r>
-        <w:rPr>
-          <w:rFonts w:eastAsia="Times New Roman" w:cs="Times New Roman" w:ascii="Garamond" w:hAnsi="Garamond"/>
-          <w:color w:val="000000"/>
-          <w:kern w:val="0"/>
-          <w:sz w:val="36"/>
-          <w:szCs w:val="36"/>
-          <w:shd w:fill="auto" w:val="clear"/>
-          <w:lang w:val="en-US" w:eastAsia="zh-CN" w:bidi="hi-IN"/>
-        </w:rPr>
-        <w:t xml:space="preserve"> é um daqueles ensinamentos de Jesus que continuam sendo mal interpretados até os dias de hoje.</w:t>
-      </w:r>
-    </w:p>
-    <w:p>
-      <w:pPr>
-        <w:pStyle w:val="Normal"/>
-        <w:jc w:val="both"/>
-        <w:rPr>
-          <w:sz w:val="36"/>
-          <w:szCs w:val="36"/>
-        </w:rPr>
-      </w:pPr>
-      <w:r>
-        <w:rPr>
           <w:sz w:val="36"/>
           <w:szCs w:val="36"/>
         </w:rPr>
@@ -394,19 +323,7 @@
           <w:shd w:fill="auto" w:val="clear"/>
           <w:lang w:val="en-US" w:eastAsia="zh-CN" w:bidi="hi-IN"/>
         </w:rPr>
-        <w:t>A parábola traz um enunciado sobre o "fim dos tempos", momento em que Jesus diz que haverá a separação do joio e do trigo. Nós, espíritas, sabemos que não haverá o fim dos tempos ou o fim do mundo conforme entendido por grande parte das escolas religiosas do nosso planeta. O que haverá - e isso já se encontra em andamento a pleno vapor - é a mudança da Terra na escala evolutiva dos mundos. Nosso planeta deixará de ser um mundo de provas e expiações e irá se tornar um mundo de regeneração. Estamos muito próximos do fim dessa transição. Segundo informações do nosso querido e saudoso Chico Xavier, o ápice  da mudança deve ser no ano 2057. Uma das consequências desse processo - e isso é algo que já vem acontecendo - é que, Espíritos rebeldes, orgulhosos, insubmissos aos desígnios de Deus, não terão mais condições de reencarnar na Terra. Se permanecessem na Terra regenerada, eles seriam como maus alunos que permanecem na sala de aula sem estudar, sem fazer suas tarefas, perguntando a ordem, o professor e os colegas que realmente desejam aprender. Tais alunos precisam ir para outra turma para não atrapalhar o desenvolvimento dos demais. É a mesma coisa com os Espíritos</w:t>
-      </w:r>
-      <w:r>
-        <w:rPr>
-          <w:rFonts w:eastAsia="Times New Roman" w:cs="Times New Roman" w:ascii="Garamond" w:hAnsi="Garamond"/>
-          <w:color w:val="000000"/>
-          <w:kern w:val="0"/>
-          <w:sz w:val="36"/>
-          <w:szCs w:val="36"/>
-          <w:shd w:fill="auto" w:val="clear"/>
-          <w:lang w:val="en-US" w:eastAsia="zh-CN" w:bidi="hi-IN"/>
-        </w:rPr>
-        <w:t xml:space="preserve"> que, por hora, se recusam a trabalhar e evoluir moral e espiritualmente: a condição espiritual deles é incompatível com a nova proposta do nosso planeta. Eles serão o joio atado em feixes para serem queimados. Quando se fala em queimar, no sentido religioso, para a grande maioria das pessoas surge a ideia do inferno. Nós, espíritas, também sabemos que o céu e o inferno, como lugares de descanso e sofrimento eternos, não existem. Portanto, esses espíritos que não poderão mais permanecer na Terra regenerada, serão degredados a mundos inferiores, onde terão que trabalhar, vencer suas imperfeições para conquistarem o direito de voltar à Terra;</w:t>
+        <w:t>A parábola traz um enunciado sobre o "fim dos tempos", momento em que Jesus diz que haverá a separação do joio e do trigo. Nós, espíritas, sabemos que não haverá o fim dos tempos ou o fim do mundo conforme entendido por grande parte das escolas religiosas do nosso planeta. O que haverá - e isso já se encontra em andamento a pleno vapor - é a mudança da Terra na escala evolutiva dos mundos. Nosso planeta deixará de ser um mundo de provas e expiações e irá se tornar um mundo de regeneração. Estamos muito próximos do fim dessa transição. Segundo informações do nosso querido e saudoso Chico Xavier, o ápice  da mudança deve ser no ano 2057. Uma das consequências desse processo - e isso é algo que já vem acontecendo - é que, Espíritos rebeldes, orgulhosos, insubmissos aos desígnios de Deus, não terão mais condições de reencarnar na Terra. Se permanecessem na Terra regenerada, eles seriam como maus alunos que permanecem na sala de aula sem estudar, sem fazer suas tarefas, perguntando a ordem, o professor e os colegas que realmente desejam aprender. Tais alunos precisam ir para outra turma para não atrapalhar o desenvolvimento dos demais. É a mesma coisa com os Espíritos que, por hora, se recusam a trabalhar e evoluir moral e espiritualmente: a condição espiritual deles é incompatível com a nova proposta do nosso planeta. Eles serão o joio atado em feixes para serem queimados. Quando se fala em queimar, no sentido religioso, para a grande maioria das pessoas surge a ideia do inferno. Nós, espíritas, também sabemos que o céu e o inferno, como lugares de descanso e sofrimento eternos, não existem. Portanto, esses espíritos que não poderão mais permanecer na Terra regenerada, serão degredados a mundos inferiores, onde terão que trabalhar, vencer suas imperfeições para conquistarem o direito de voltar à Terra;</w:t>
       </w:r>
     </w:p>
     <w:p>
@@ -432,67 +349,7 @@
           <w:shd w:fill="auto" w:val="clear"/>
           <w:lang w:val="en-US" w:eastAsia="zh-CN" w:bidi="hi-IN"/>
         </w:rPr>
-        <w:t xml:space="preserve">[ Ver onde melhor se encaixará esse parágrafo ] A semelhança entre as duas plantas é tão grande, que em algumas regiões costuma-se denominar o joio como "falso trigo". O joio pode ser venenoso e uma pequena quantidade de joio colhida e processada junto ao trigo pode comprometer a qualidade do produto obtido. Podemos fazer uma analogia das plantas com as ações do homem. Muitas pessoas praticam más ações, mas elas são hábeis em esconder sua verdadeira intenção. Elas dão aos seus atos um verniz de bondade, o que faz com que pareçam boas ações. É o joio dando aparência de trigo. </w:t>
-      </w:r>
-      <w:r>
-        <w:rPr>
-          <w:rFonts w:eastAsia="Times New Roman" w:cs="Times New Roman" w:ascii="Garamond" w:hAnsi="Garamond"/>
-          <w:color w:val="000000"/>
-          <w:kern w:val="0"/>
-          <w:sz w:val="36"/>
-          <w:szCs w:val="36"/>
-          <w:shd w:fill="auto" w:val="clear"/>
-          <w:lang w:val="en-US" w:eastAsia="zh-CN" w:bidi="hi-IN"/>
-        </w:rPr>
-        <w:t>Também o fato de que uma pequena quantidade</w:t>
-      </w:r>
-      <w:r>
-        <w:rPr>
-          <w:rFonts w:eastAsia="Times New Roman" w:cs="Times New Roman" w:ascii="Garamond" w:hAnsi="Garamond"/>
-          <w:color w:val="000000"/>
-          <w:kern w:val="0"/>
-          <w:sz w:val="36"/>
-          <w:szCs w:val="36"/>
-          <w:shd w:fill="auto" w:val="clear"/>
-          <w:lang w:val="en-US" w:eastAsia="zh-CN" w:bidi="hi-IN"/>
-        </w:rPr>
-        <w:t xml:space="preserve"> joio</w:t>
-      </w:r>
-      <w:r>
-        <w:rPr>
-          <w:rFonts w:eastAsia="Times New Roman" w:cs="Times New Roman" w:ascii="Garamond" w:hAnsi="Garamond"/>
-          <w:color w:val="000000"/>
-          <w:kern w:val="0"/>
-          <w:sz w:val="36"/>
-          <w:szCs w:val="36"/>
-          <w:shd w:fill="auto" w:val="clear"/>
-          <w:lang w:val="en-US" w:eastAsia="zh-CN" w:bidi="hi-IN"/>
-        </w:rPr>
-        <w:t xml:space="preserve"> </w:t>
-      </w:r>
-      <w:r>
-        <w:rPr>
-          <w:rFonts w:eastAsia="Times New Roman" w:cs="Times New Roman" w:ascii="Garamond" w:hAnsi="Garamond"/>
-          <w:color w:val="000000"/>
-          <w:kern w:val="0"/>
-          <w:sz w:val="36"/>
-          <w:szCs w:val="36"/>
-          <w:shd w:fill="auto" w:val="clear"/>
-          <w:lang w:val="en-US" w:eastAsia="zh-CN" w:bidi="hi-IN"/>
-        </w:rPr>
-        <w:t xml:space="preserve">que permaneça junto ao trigo processado pode estragar </w:t>
-      </w:r>
-      <w:r>
-        <w:rPr>
-          <w:rFonts w:eastAsia="Times New Roman" w:cs="Times New Roman" w:ascii="Garamond" w:hAnsi="Garamond"/>
-          <w:color w:val="000000"/>
-          <w:kern w:val="0"/>
-          <w:sz w:val="36"/>
-          <w:szCs w:val="36"/>
-          <w:shd w:fill="auto" w:val="clear"/>
-          <w:lang w:val="en-US" w:eastAsia="zh-CN" w:bidi="hi-IN"/>
-        </w:rPr>
-        <w:t>toda a produção. Assim também é conosco. Muitas vezes, pelo esforço que empreendemos e com o auxílio da Espiritualidade amiga, pouco a pouco vamos desenvolvendo e conquistando virtudes. Entretanto, ainda existe em nós o joio de nossas imperfeições. Se não formos vigilantes, a manifestação de uma pequena parte do joio pode comprometer gravemente o trigo já cultivado;</w:t>
+        <w:t>[ Ver onde melhor se encaixará esse parágrafo ] A semelhança entre as duas plantas é tão grande, que em algumas regiões costuma-se denominar o joio como "falso trigo". O joio pode ser venenoso e uma pequena quantidade de joio colhida e processada junto ao trigo pode comprometer a qualidade do produto obtido. Podemos fazer uma analogia das plantas com as ações do homem. Muitas pessoas praticam más ações, mas elas são hábeis em esconder sua verdadeira intenção. Elas dão aos seus atos um verniz de bondade, o que faz com que pareçam boas ações. É o joio dando aparência de trigo. Também o fato de que uma pequena quantidade joio que permaneça junto ao trigo processado pode estragar toda a produção. Assim também é conosco. Muitas vezes, pelo esforço que empreendemos e com o auxílio da Espiritualidade amiga, pouco a pouco vamos desenvolvendo e conquistando virtudes. Entretanto, ainda existe em nós o joio de nossas imperfeições. Se não formos vigilantes, a manifestação de uma pequena parte do joio pode comprometer gravemente o trigo já cultivado;</w:t>
       </w:r>
     </w:p>
     <w:p>
@@ -544,43 +401,7 @@
           <w:shd w:fill="auto" w:val="clear"/>
           <w:lang w:val="en-US" w:eastAsia="zh-CN" w:bidi="hi-IN"/>
         </w:rPr>
-        <w:t xml:space="preserve">De certa forma, é necessário que o mal esteja presente em meio a nós, pois ele funciona como um medidor dos nossos valores superiores. Em outras palavras: só é possível realmente atestar a aquisição de virtudes, convivendo com o oposto daquela virtude e não cedendo a ele. Por exemplo: eu só posso provar que realmente adquiri a paciência, estando em contato constante com tudo aquilo que poderia me fazer perder a paciência. Se diante de tais situações eu não me entrego à </w:t>
-      </w:r>
-      <w:r>
-        <w:rPr>
-          <w:rFonts w:eastAsia="Times New Roman" w:cs="Times New Roman" w:ascii="Garamond" w:hAnsi="Garamond"/>
-          <w:color w:val="000000"/>
-          <w:kern w:val="0"/>
-          <w:sz w:val="36"/>
-          <w:szCs w:val="36"/>
-          <w:shd w:fill="auto" w:val="clear"/>
-          <w:lang w:val="en-US" w:eastAsia="zh-CN" w:bidi="hi-IN"/>
-        </w:rPr>
-        <w:t>irritação</w:t>
-      </w:r>
-      <w:r>
-        <w:rPr>
-          <w:rFonts w:eastAsia="Times New Roman" w:cs="Times New Roman" w:ascii="Garamond" w:hAnsi="Garamond"/>
-          <w:color w:val="000000"/>
-          <w:kern w:val="0"/>
-          <w:sz w:val="36"/>
-          <w:szCs w:val="36"/>
-          <w:shd w:fill="auto" w:val="clear"/>
-          <w:lang w:val="en-US" w:eastAsia="zh-CN" w:bidi="hi-IN"/>
-        </w:rPr>
-        <w:t>, à intolerância</w:t>
-      </w:r>
-      <w:r>
-        <w:rPr>
-          <w:rFonts w:eastAsia="Times New Roman" w:cs="Times New Roman" w:ascii="Garamond" w:hAnsi="Garamond"/>
-          <w:color w:val="000000"/>
-          <w:kern w:val="0"/>
-          <w:sz w:val="36"/>
-          <w:szCs w:val="36"/>
-          <w:shd w:fill="auto" w:val="clear"/>
-          <w:lang w:val="en-US" w:eastAsia="zh-CN" w:bidi="hi-IN"/>
-        </w:rPr>
-        <w:t xml:space="preserve"> ou ao nervosismo, então eu realmente tenho a paciência bem desenvolvida em mim. A paciência é o trigo; as situações que podem me fazer perder a paciência são o joio;</w:t>
+        <w:t>De certa forma, é necessário que o mal esteja presente em meio a nós, pois ele funciona como um medidor dos nossos valores superiores. Em outras palavras: só é possível realmente atestar a aquisição de virtudes, convivendo com o oposto daquela virtude e não cedendo a ele. Por exemplo: eu só posso provar que realmente adquiri a paciência, estando em contato constante com tudo aquilo que poderia me fazer perder a paciência. Se diante de tais situações eu não me entrego à irritação, à intolerância ou ao nervosismo, então eu realmente tenho a paciência bem desenvolvida em mim. A paciência é o trigo; as situações que podem me fazer perder a paciência são o joio;</w:t>
       </w:r>
     </w:p>
     <w:p>
@@ -659,6 +480,44 @@
           <w:lang w:val="en-US" w:eastAsia="zh-CN" w:bidi="hi-IN"/>
         </w:rPr>
         <w:t>Jesus é o homem que semeou a boa semente no seu campo. A humanidade terrena é o campo de Jesus. Seu evangelho de amor e bondade é a semente que Ele plantou em nós. Como nos diz a parábola do semeador, nós decidimos que tipo de terreno seremos e como vamos acolher as sementes lançadas por Jesus sobre nós. Na verdade, todos nós, sem exceção iremos acolher essas sementes no solo do coração, permitindo que ela germine, floresça e frutifique. Porém, cada um de nós fará isso em momentos diferentes. Uns já estão fazendo isso, outros ainda não despertaram para essa realidade;</w:t>
+      </w:r>
+    </w:p>
+    <w:p>
+      <w:pPr>
+        <w:pStyle w:val="Normal"/>
+        <w:numPr>
+          <w:ilvl w:val="0"/>
+          <w:numId w:val="1"/>
+        </w:numPr>
+        <w:jc w:val="both"/>
+        <w:rPr>
+          <w:sz w:val="36"/>
+          <w:szCs w:val="36"/>
+        </w:rPr>
+      </w:pPr>
+      <w:r>
+        <w:rPr>
+          <w:rFonts w:eastAsia="Times New Roman" w:cs="Times New Roman" w:ascii="Garamond" w:hAnsi="Garamond"/>
+          <w:color w:val="000000"/>
+          <w:kern w:val="0"/>
+          <w:sz w:val="36"/>
+          <w:szCs w:val="36"/>
+          <w:shd w:fill="auto" w:val="clear"/>
+          <w:lang w:val="en-US" w:eastAsia="zh-CN" w:bidi="hi-IN"/>
+        </w:rPr>
+        <w:t>"Todos dormiam" pode também representar o conjunto de nossas existências passadas, nas quais não despertamos para os ensinamentos do Cristo. É o sono da alma. Pode também representar as mentes ociosas. Quantos milhões de irmãos na humanidade terrena ainda não despertaram para a vida espiritual? Passam toda a existência vivendo exclusivamente para a matéria. Não há o menor traço de preo</w:t>
+      </w:r>
+      <w:r>
+        <w:rPr>
+          <w:rFonts w:eastAsia="Times New Roman" w:cs="Times New Roman" w:ascii="Garamond" w:hAnsi="Garamond"/>
+          <w:color w:val="000000"/>
+          <w:kern w:val="0"/>
+          <w:sz w:val="36"/>
+          <w:szCs w:val="36"/>
+          <w:shd w:fill="auto" w:val="clear"/>
+          <w:lang w:val="en-US" w:eastAsia="zh-CN" w:bidi="hi-IN"/>
+        </w:rPr>
+        <w:t>cupação com a vida no porvir. E todos nós sabemos que, quando nos encontramos distantes das verdades espirituais, os inimigos que carregamos dentro de nós - orgulho, egoísmo, vaidade, sensualidade, cólera, intolerância - todos eles, tendem a aflorar</w:t>
       </w:r>
     </w:p>
     <w:p>
@@ -780,7 +639,7 @@
         <w:bCs/>
         <w:rFonts w:ascii="Garamond" w:hAnsi="Garamond"/>
       </w:rPr>
-      <w:t>10</w:t>
+      <w:t>8</w:t>
     </w:r>
     <w:r>
       <w:rPr>

</xml_diff>

<commit_message>
22/05/2025 - 20:58 h
</commit_message>
<xml_diff>
--- a/O joio e o trigo, o mal e o bem/O joio e o trigo.docx
+++ b/O joio e o trigo, o mal e o bem/O joio e o trigo.docx
@@ -58,9 +58,1091 @@
       </w:pPr>
       <w:r>
         <w:rPr>
-          <w:sz w:val="36"/>
-          <w:szCs w:val="36"/>
-        </w:rPr>
+          <w:rFonts w:eastAsia="Times New Roman" w:cs="Times New Roman" w:ascii="Garamond" w:hAnsi="Garamond"/>
+          <w:b/>
+          <w:i/>
+          <w:color w:val="023F62"/>
+          <w:kern w:val="0"/>
+          <w:sz w:val="48"/>
+          <w:szCs w:val="48"/>
+          <w:shd w:fill="auto" w:val="clear"/>
+          <w:lang w:val="en-US" w:eastAsia="zh-CN" w:bidi="hi-IN"/>
+        </w:rPr>
+      </w:r>
+    </w:p>
+    <w:p>
+      <w:pPr>
+        <w:pStyle w:val="Normal"/>
+        <w:jc w:val="both"/>
+        <w:rPr>
+          <w:sz w:val="36"/>
+          <w:szCs w:val="36"/>
+        </w:rPr>
+      </w:pPr>
+      <w:r>
+        <w:rPr>
+          <w:rFonts w:eastAsia="Times New Roman" w:cs="Times New Roman" w:ascii="Garamond" w:hAnsi="Garamond"/>
+          <w:color w:val="000000"/>
+          <w:kern w:val="0"/>
+          <w:sz w:val="36"/>
+          <w:szCs w:val="36"/>
+          <w:shd w:fill="auto" w:val="clear"/>
+          <w:lang w:val="en-US" w:eastAsia="zh-CN" w:bidi="hi-IN"/>
+        </w:rPr>
+        <w:t>Não sei se temos aqui hoje pessoas que estão tendo contato com a Doutrina Espírita pela primeira vez. Não digo a primeira vez aqui na Casa de Glacus, mas o primeiro contato com o Espiritismo.</w:t>
+      </w:r>
+    </w:p>
+    <w:p>
+      <w:pPr>
+        <w:pStyle w:val="Normal"/>
+        <w:jc w:val="both"/>
+        <w:rPr>
+          <w:sz w:val="36"/>
+          <w:szCs w:val="36"/>
+        </w:rPr>
+      </w:pPr>
+      <w:r>
+        <w:rPr/>
+      </w:r>
+    </w:p>
+    <w:p>
+      <w:pPr>
+        <w:pStyle w:val="Normal"/>
+        <w:jc w:val="both"/>
+        <w:rPr>
+          <w:sz w:val="36"/>
+          <w:szCs w:val="36"/>
+        </w:rPr>
+      </w:pPr>
+      <w:r>
+        <w:rPr>
+          <w:rFonts w:eastAsia="Times New Roman" w:cs="Times New Roman" w:ascii="Garamond" w:hAnsi="Garamond"/>
+          <w:color w:val="000000"/>
+          <w:kern w:val="0"/>
+          <w:sz w:val="36"/>
+          <w:szCs w:val="36"/>
+          <w:shd w:fill="auto" w:val="clear"/>
+          <w:lang w:val="en-US" w:eastAsia="zh-CN" w:bidi="hi-IN"/>
+        </w:rPr>
+        <w:t>A Doutrina Espírita tem como base a ciência, a filosofia e a religião. Por isso, não existem dogmas no Espiritismo, existe a fé raciocinada.</w:t>
+      </w:r>
+    </w:p>
+    <w:p>
+      <w:pPr>
+        <w:pStyle w:val="Normal"/>
+        <w:jc w:val="both"/>
+        <w:rPr>
+          <w:sz w:val="36"/>
+          <w:szCs w:val="36"/>
+        </w:rPr>
+      </w:pPr>
+      <w:r>
+        <w:rPr/>
+      </w:r>
+    </w:p>
+    <w:p>
+      <w:pPr>
+        <w:pStyle w:val="Normal"/>
+        <w:jc w:val="both"/>
+        <w:rPr>
+          <w:sz w:val="36"/>
+          <w:szCs w:val="36"/>
+        </w:rPr>
+      </w:pPr>
+      <w:r>
+        <w:rPr>
+          <w:rFonts w:eastAsia="Times New Roman" w:cs="Times New Roman" w:ascii="Garamond" w:hAnsi="Garamond"/>
+          <w:color w:val="000000"/>
+          <w:kern w:val="0"/>
+          <w:sz w:val="36"/>
+          <w:szCs w:val="36"/>
+          <w:shd w:fill="auto" w:val="clear"/>
+          <w:lang w:val="en-US" w:eastAsia="zh-CN" w:bidi="hi-IN"/>
+        </w:rPr>
+        <w:t>O que é um dogma? No sentido religioso, um dogma é uma verdade considerada oficialmente revelada por Deus e aceita como obrigatória dentro de uma determinada tradição religiosa. É uma verdade imposta; os seguidores daquela religião não têm o direito de contestar um dogma.</w:t>
+      </w:r>
+    </w:p>
+    <w:p>
+      <w:pPr>
+        <w:pStyle w:val="Normal"/>
+        <w:jc w:val="both"/>
+        <w:rPr>
+          <w:sz w:val="36"/>
+          <w:szCs w:val="36"/>
+        </w:rPr>
+      </w:pPr>
+      <w:r>
+        <w:rPr/>
+      </w:r>
+    </w:p>
+    <w:p>
+      <w:pPr>
+        <w:pStyle w:val="Normal"/>
+        <w:jc w:val="both"/>
+        <w:rPr>
+          <w:sz w:val="36"/>
+          <w:szCs w:val="36"/>
+        </w:rPr>
+      </w:pPr>
+      <w:r>
+        <w:rPr/>
+      </w:r>
+    </w:p>
+    <w:p>
+      <w:pPr>
+        <w:pStyle w:val="Normal"/>
+        <w:jc w:val="both"/>
+        <w:rPr>
+          <w:sz w:val="36"/>
+          <w:szCs w:val="36"/>
+        </w:rPr>
+      </w:pPr>
+      <w:r>
+        <w:rPr>
+          <w:rFonts w:eastAsia="Times New Roman" w:cs="Times New Roman" w:ascii="Garamond" w:hAnsi="Garamond"/>
+          <w:color w:val="000000"/>
+          <w:kern w:val="0"/>
+          <w:sz w:val="36"/>
+          <w:szCs w:val="36"/>
+          <w:shd w:fill="auto" w:val="clear"/>
+          <w:lang w:val="en-US" w:eastAsia="zh-CN" w:bidi="hi-IN"/>
+        </w:rPr>
+        <w:t xml:space="preserve">E o que é a fé raciocinada? Como o próprio nome sugere, é a fé construída através do raciocínio, do bom senso, do sentimento de justiça e até da lógica. Em outras palavras: quando eu creio em algo, eu sei por que creio naquilo. </w:t>
+      </w:r>
+    </w:p>
+    <w:p>
+      <w:pPr>
+        <w:pStyle w:val="Normal"/>
+        <w:jc w:val="both"/>
+        <w:rPr>
+          <w:sz w:val="36"/>
+          <w:szCs w:val="36"/>
+        </w:rPr>
+      </w:pPr>
+      <w:r>
+        <w:rPr>
+          <w:rFonts w:eastAsia="Times New Roman" w:cs="Times New Roman" w:ascii="Garamond" w:hAnsi="Garamond"/>
+          <w:color w:val="000000"/>
+          <w:kern w:val="0"/>
+          <w:sz w:val="36"/>
+          <w:szCs w:val="36"/>
+          <w:shd w:fill="auto" w:val="clear"/>
+          <w:lang w:val="en-US" w:eastAsia="zh-CN" w:bidi="hi-IN"/>
+        </w:rPr>
+        <w:t xml:space="preserve">Com a fé raciocinada, não há imposição de ideias. O que existe é </w:t>
+      </w:r>
+      <w:r>
+        <w:rPr>
+          <w:rFonts w:eastAsia="Times New Roman" w:cs="Times New Roman" w:ascii="Garamond" w:hAnsi="Garamond"/>
+          <w:color w:val="000000"/>
+          <w:kern w:val="0"/>
+          <w:sz w:val="36"/>
+          <w:szCs w:val="36"/>
+          <w:shd w:fill="auto" w:val="clear"/>
+          <w:lang w:val="en-US" w:eastAsia="zh-CN" w:bidi="hi-IN"/>
+        </w:rPr>
+        <w:t>uma ideia que me foi apresentada, sobre a qual eu refleti, raciocinei e analisei cuidadosamente, até concluir que realmente faz sentido acreditar n</w:t>
+      </w:r>
+      <w:r>
+        <w:rPr>
+          <w:rFonts w:eastAsia="Times New Roman" w:cs="Times New Roman" w:ascii="Garamond" w:hAnsi="Garamond"/>
+          <w:color w:val="000000"/>
+          <w:kern w:val="0"/>
+          <w:sz w:val="36"/>
+          <w:szCs w:val="36"/>
+          <w:shd w:fill="auto" w:val="clear"/>
+          <w:lang w:val="en-US" w:eastAsia="zh-CN" w:bidi="hi-IN"/>
+        </w:rPr>
+        <w:t>aquela ideia</w:t>
+      </w:r>
+      <w:r>
+        <w:rPr>
+          <w:rFonts w:eastAsia="Times New Roman" w:cs="Times New Roman" w:ascii="Garamond" w:hAnsi="Garamond"/>
+          <w:color w:val="000000"/>
+          <w:kern w:val="0"/>
+          <w:sz w:val="36"/>
+          <w:szCs w:val="36"/>
+          <w:shd w:fill="auto" w:val="clear"/>
+          <w:lang w:val="en-US" w:eastAsia="zh-CN" w:bidi="hi-IN"/>
+        </w:rPr>
+        <w:t>.</w:t>
+      </w:r>
+    </w:p>
+    <w:p>
+      <w:pPr>
+        <w:pStyle w:val="Normal"/>
+        <w:jc w:val="both"/>
+        <w:rPr>
+          <w:sz w:val="36"/>
+          <w:szCs w:val="36"/>
+        </w:rPr>
+      </w:pPr>
+      <w:r>
+        <w:rPr/>
+      </w:r>
+    </w:p>
+    <w:p>
+      <w:pPr>
+        <w:pStyle w:val="Normal"/>
+        <w:jc w:val="both"/>
+        <w:rPr>
+          <w:sz w:val="36"/>
+          <w:szCs w:val="36"/>
+        </w:rPr>
+      </w:pPr>
+      <w:r>
+        <w:rPr>
+          <w:rFonts w:eastAsia="Times New Roman" w:cs="Times New Roman" w:ascii="Garamond" w:hAnsi="Garamond"/>
+          <w:color w:val="000000"/>
+          <w:kern w:val="0"/>
+          <w:sz w:val="36"/>
+          <w:szCs w:val="36"/>
+          <w:shd w:fill="auto" w:val="clear"/>
+          <w:lang w:val="en-US" w:eastAsia="zh-CN" w:bidi="hi-IN"/>
+        </w:rPr>
+        <w:t>Vamos tomar</w:t>
+      </w:r>
+      <w:r>
+        <w:rPr>
+          <w:rFonts w:eastAsia="Times New Roman" w:cs="Times New Roman" w:ascii="Garamond" w:hAnsi="Garamond"/>
+          <w:color w:val="000000"/>
+          <w:kern w:val="0"/>
+          <w:sz w:val="36"/>
+          <w:szCs w:val="36"/>
+          <w:shd w:fill="auto" w:val="clear"/>
+          <w:lang w:val="en-US" w:eastAsia="zh-CN" w:bidi="hi-IN"/>
+        </w:rPr>
+        <w:t xml:space="preserve"> como exemplo o dogma das penas eternas.  Ele sustenta que após uma única existência terrena a alma recebe um destino definitivo: felicidade eterna no céu ou sofrimento eterno no inferno. </w:t>
+      </w:r>
+    </w:p>
+    <w:p>
+      <w:pPr>
+        <w:pStyle w:val="Normal"/>
+        <w:jc w:val="both"/>
+        <w:rPr>
+          <w:sz w:val="36"/>
+          <w:szCs w:val="36"/>
+        </w:rPr>
+      </w:pPr>
+      <w:r>
+        <w:rPr/>
+      </w:r>
+    </w:p>
+    <w:p>
+      <w:pPr>
+        <w:pStyle w:val="Normal"/>
+        <w:jc w:val="both"/>
+        <w:rPr>
+          <w:sz w:val="36"/>
+          <w:szCs w:val="36"/>
+        </w:rPr>
+      </w:pPr>
+      <w:r>
+        <w:rPr>
+          <w:rFonts w:eastAsia="Times New Roman" w:cs="Times New Roman" w:ascii="Garamond" w:hAnsi="Garamond"/>
+          <w:color w:val="000000"/>
+          <w:kern w:val="0"/>
+          <w:sz w:val="36"/>
+          <w:szCs w:val="36"/>
+          <w:shd w:fill="auto" w:val="clear"/>
+          <w:lang w:val="en-US" w:eastAsia="zh-CN" w:bidi="hi-IN"/>
+        </w:rPr>
+        <w:t>O que determina esse destino é a maneira como aquela alma conduziu sua existência única: se fez o bem, vai para o céu; se fez o mal, irá para o inferno.</w:t>
+      </w:r>
+    </w:p>
+    <w:p>
+      <w:pPr>
+        <w:pStyle w:val="Normal"/>
+        <w:jc w:val="both"/>
+        <w:rPr>
+          <w:sz w:val="36"/>
+          <w:szCs w:val="36"/>
+        </w:rPr>
+      </w:pPr>
+      <w:r>
+        <w:rPr/>
+      </w:r>
+    </w:p>
+    <w:p>
+      <w:pPr>
+        <w:pStyle w:val="Normal"/>
+        <w:jc w:val="both"/>
+        <w:rPr>
+          <w:sz w:val="36"/>
+          <w:szCs w:val="36"/>
+        </w:rPr>
+      </w:pPr>
+      <w:r>
+        <w:rPr/>
+      </w:r>
+    </w:p>
+    <w:p>
+      <w:pPr>
+        <w:pStyle w:val="Normal"/>
+        <w:jc w:val="both"/>
+        <w:rPr>
+          <w:sz w:val="36"/>
+          <w:szCs w:val="36"/>
+        </w:rPr>
+      </w:pPr>
+      <w:r>
+        <w:rPr>
+          <w:rFonts w:eastAsia="Times New Roman" w:cs="Times New Roman" w:ascii="Garamond" w:hAnsi="Garamond"/>
+          <w:color w:val="000000"/>
+          <w:kern w:val="0"/>
+          <w:sz w:val="36"/>
+          <w:szCs w:val="36"/>
+          <w:shd w:fill="auto" w:val="clear"/>
+          <w:lang w:val="en-US" w:eastAsia="zh-CN" w:bidi="hi-IN"/>
+        </w:rPr>
+        <w:t xml:space="preserve">Mas esse dogma não esclarece certas questões. Por exemplo: não existe ninguém perfeito no nosso mundo. Todos nós temos virtudes e </w:t>
+      </w:r>
+      <w:r>
+        <w:rPr>
+          <w:rFonts w:eastAsia="Times New Roman" w:cs="Times New Roman" w:ascii="Garamond" w:hAnsi="Garamond"/>
+          <w:color w:val="000000"/>
+          <w:kern w:val="0"/>
+          <w:sz w:val="36"/>
+          <w:szCs w:val="36"/>
+          <w:shd w:fill="auto" w:val="clear"/>
+          <w:lang w:val="en-US" w:eastAsia="zh-CN" w:bidi="hi-IN"/>
+        </w:rPr>
+        <w:t>impefeições</w:t>
+      </w:r>
+      <w:r>
+        <w:rPr>
+          <w:rFonts w:eastAsia="Times New Roman" w:cs="Times New Roman" w:ascii="Garamond" w:hAnsi="Garamond"/>
+          <w:color w:val="000000"/>
+          <w:kern w:val="0"/>
+          <w:sz w:val="36"/>
+          <w:szCs w:val="36"/>
+          <w:shd w:fill="auto" w:val="clear"/>
+          <w:lang w:val="en-US" w:eastAsia="zh-CN" w:bidi="hi-IN"/>
+        </w:rPr>
+        <w:t>, acertamos e erramos. Qual a quantidade de bem eu devo fazer para merecer o céu e qual a quantidade de mal vai me condenar ao inferno?</w:t>
+      </w:r>
+      <w:r>
+        <w:rPr>
+          <w:rFonts w:eastAsia="Times New Roman" w:cs="Times New Roman" w:ascii="Garamond" w:hAnsi="Garamond"/>
+          <w:color w:val="000000"/>
+          <w:kern w:val="0"/>
+          <w:sz w:val="36"/>
+          <w:szCs w:val="36"/>
+          <w:shd w:fill="auto" w:val="clear"/>
+          <w:lang w:val="en-US" w:eastAsia="zh-CN" w:bidi="hi-IN"/>
+        </w:rPr>
+        <w:t xml:space="preserve"> Porque ninguém erra ou acerta 100% em uma única existência. Como Deus mede o bem e o mal que praticamos para decidir nosso destino?</w:t>
+      </w:r>
+    </w:p>
+    <w:p>
+      <w:pPr>
+        <w:pStyle w:val="Normal"/>
+        <w:jc w:val="both"/>
+        <w:rPr>
+          <w:sz w:val="36"/>
+          <w:szCs w:val="36"/>
+        </w:rPr>
+      </w:pPr>
+      <w:r>
+        <w:rPr/>
+      </w:r>
+    </w:p>
+    <w:p>
+      <w:pPr>
+        <w:pStyle w:val="Normal"/>
+        <w:jc w:val="both"/>
+        <w:rPr>
+          <w:sz w:val="36"/>
+          <w:szCs w:val="36"/>
+        </w:rPr>
+      </w:pPr>
+      <w:r>
+        <w:rPr>
+          <w:rFonts w:eastAsia="Times New Roman" w:cs="Times New Roman" w:ascii="Garamond" w:hAnsi="Garamond"/>
+          <w:color w:val="000000"/>
+          <w:kern w:val="0"/>
+          <w:sz w:val="36"/>
+          <w:szCs w:val="36"/>
+          <w:shd w:fill="auto" w:val="clear"/>
+          <w:lang w:val="en-US" w:eastAsia="zh-CN" w:bidi="hi-IN"/>
+        </w:rPr>
+        <w:t>Outra questão</w:t>
+      </w:r>
+      <w:r>
+        <w:rPr>
+          <w:rFonts w:eastAsia="Times New Roman" w:cs="Times New Roman" w:ascii="Garamond" w:hAnsi="Garamond"/>
+          <w:color w:val="000000"/>
+          <w:kern w:val="0"/>
+          <w:sz w:val="36"/>
+          <w:szCs w:val="36"/>
+          <w:shd w:fill="auto" w:val="clear"/>
+          <w:lang w:val="en-US" w:eastAsia="zh-CN" w:bidi="hi-IN"/>
+        </w:rPr>
+        <w:t>, ainda mais importante</w:t>
+      </w:r>
+      <w:r>
+        <w:rPr>
+          <w:rFonts w:eastAsia="Times New Roman" w:cs="Times New Roman" w:ascii="Garamond" w:hAnsi="Garamond"/>
+          <w:color w:val="000000"/>
+          <w:kern w:val="0"/>
+          <w:sz w:val="36"/>
+          <w:szCs w:val="36"/>
+          <w:shd w:fill="auto" w:val="clear"/>
+          <w:lang w:val="en-US" w:eastAsia="zh-CN" w:bidi="hi-IN"/>
+        </w:rPr>
+        <w:t>: todos nós conhecemos famílias em que quase todos os membros são pessoas de bem, vivem de maneira honrada e honesta. Mas há alguém que se desvia completamente d</w:t>
+      </w:r>
+      <w:r>
+        <w:rPr>
+          <w:rFonts w:eastAsia="Times New Roman" w:cs="Times New Roman" w:ascii="Garamond" w:hAnsi="Garamond"/>
+          <w:color w:val="000000"/>
+          <w:kern w:val="0"/>
+          <w:sz w:val="36"/>
+          <w:szCs w:val="36"/>
+          <w:shd w:fill="auto" w:val="clear"/>
+          <w:lang w:val="en-US" w:eastAsia="zh-CN" w:bidi="hi-IN"/>
+        </w:rPr>
+        <w:t>esse</w:t>
+      </w:r>
+      <w:r>
+        <w:rPr>
+          <w:rFonts w:eastAsia="Times New Roman" w:cs="Times New Roman" w:ascii="Garamond" w:hAnsi="Garamond"/>
+          <w:color w:val="000000"/>
+          <w:kern w:val="0"/>
+          <w:sz w:val="36"/>
+          <w:szCs w:val="36"/>
+          <w:shd w:fill="auto" w:val="clear"/>
+          <w:lang w:val="en-US" w:eastAsia="zh-CN" w:bidi="hi-IN"/>
+        </w:rPr>
+        <w:t xml:space="preserve"> padrão </w:t>
+      </w:r>
+      <w:r>
+        <w:rPr>
+          <w:rFonts w:eastAsia="Times New Roman" w:cs="Times New Roman" w:ascii="Garamond" w:hAnsi="Garamond"/>
+          <w:color w:val="000000"/>
+          <w:kern w:val="0"/>
+          <w:sz w:val="36"/>
+          <w:szCs w:val="36"/>
+          <w:shd w:fill="auto" w:val="clear"/>
+          <w:lang w:val="en-US" w:eastAsia="zh-CN" w:bidi="hi-IN"/>
+        </w:rPr>
+        <w:t>familiar</w:t>
+      </w:r>
+      <w:r>
+        <w:rPr>
+          <w:rFonts w:eastAsia="Times New Roman" w:cs="Times New Roman" w:ascii="Garamond" w:hAnsi="Garamond"/>
+          <w:color w:val="000000"/>
+          <w:kern w:val="0"/>
+          <w:sz w:val="36"/>
+          <w:szCs w:val="36"/>
+          <w:shd w:fill="auto" w:val="clear"/>
+          <w:lang w:val="en-US" w:eastAsia="zh-CN" w:bidi="hi-IN"/>
+        </w:rPr>
+        <w:t>, alguém que se entrega aos vícios, ao crime, à preguiça ou à desonestidade. De acordo com o dogma das penas eternas, essa ovelha negra da família certamente irá para o inferno, ao passo que os demais integran</w:t>
+      </w:r>
+      <w:r>
+        <w:rPr>
+          <w:rFonts w:eastAsia="Times New Roman" w:cs="Times New Roman" w:ascii="Garamond" w:hAnsi="Garamond"/>
+          <w:color w:val="000000"/>
+          <w:kern w:val="0"/>
+          <w:sz w:val="36"/>
+          <w:szCs w:val="36"/>
+          <w:shd w:fill="auto" w:val="clear"/>
+          <w:lang w:val="en-US" w:eastAsia="zh-CN" w:bidi="hi-IN"/>
+        </w:rPr>
+        <w:t>tes irão para o céu.</w:t>
+      </w:r>
+    </w:p>
+    <w:p>
+      <w:pPr>
+        <w:pStyle w:val="Normal"/>
+        <w:jc w:val="both"/>
+        <w:rPr>
+          <w:sz w:val="36"/>
+          <w:szCs w:val="36"/>
+        </w:rPr>
+      </w:pPr>
+      <w:r>
+        <w:rPr/>
+      </w:r>
+    </w:p>
+    <w:p>
+      <w:pPr>
+        <w:pStyle w:val="Normal"/>
+        <w:jc w:val="both"/>
+        <w:rPr>
+          <w:sz w:val="36"/>
+          <w:szCs w:val="36"/>
+        </w:rPr>
+      </w:pPr>
+      <w:r>
+        <w:rPr>
+          <w:rFonts w:eastAsia="Times New Roman" w:cs="Times New Roman" w:ascii="Garamond" w:hAnsi="Garamond"/>
+          <w:color w:val="000000"/>
+          <w:kern w:val="0"/>
+          <w:sz w:val="36"/>
+          <w:szCs w:val="36"/>
+          <w:shd w:fill="auto" w:val="clear"/>
+          <w:lang w:val="en-US" w:eastAsia="zh-CN" w:bidi="hi-IN"/>
+        </w:rPr>
+        <w:t>Mas eu pergunto: qual pai ou qual mãe estaria realmente feliz no céu, sabendo que o filho muito amado, a despeito de todos os erros que cometeu em vida, sofrerá no inferno por toda a eternidade?</w:t>
+      </w:r>
+    </w:p>
+    <w:p>
+      <w:pPr>
+        <w:pStyle w:val="Normal"/>
+        <w:jc w:val="both"/>
+        <w:rPr>
+          <w:sz w:val="36"/>
+          <w:szCs w:val="36"/>
+        </w:rPr>
+      </w:pPr>
+      <w:r>
+        <w:rPr/>
+      </w:r>
+    </w:p>
+    <w:p>
+      <w:pPr>
+        <w:pStyle w:val="Normal"/>
+        <w:jc w:val="both"/>
+        <w:rPr>
+          <w:sz w:val="36"/>
+          <w:szCs w:val="36"/>
+        </w:rPr>
+      </w:pPr>
+      <w:r>
+        <w:rPr>
+          <w:rFonts w:eastAsia="Times New Roman" w:cs="Times New Roman" w:ascii="Garamond" w:hAnsi="Garamond"/>
+          <w:color w:val="000000"/>
+          <w:kern w:val="0"/>
+          <w:sz w:val="36"/>
+          <w:szCs w:val="36"/>
+          <w:shd w:fill="auto" w:val="clear"/>
+          <w:lang w:val="en-US" w:eastAsia="zh-CN" w:bidi="hi-IN"/>
+        </w:rPr>
+        <w:t xml:space="preserve">De duas, uma: ou os pais seriam eternamente infelizes pela condição do filho - e nesse caso o céu seria também um lugar de tristezas -, ou eles seriam felizes mesmo sabendo que a condenação do filho é irremediável. </w:t>
+      </w:r>
+    </w:p>
+    <w:p>
+      <w:pPr>
+        <w:pStyle w:val="Normal"/>
+        <w:jc w:val="both"/>
+        <w:rPr>
+          <w:sz w:val="36"/>
+          <w:szCs w:val="36"/>
+        </w:rPr>
+      </w:pPr>
+      <w:r>
+        <w:rPr/>
+      </w:r>
+    </w:p>
+    <w:p>
+      <w:pPr>
+        <w:pStyle w:val="Normal"/>
+        <w:jc w:val="both"/>
+        <w:rPr>
+          <w:sz w:val="36"/>
+          <w:szCs w:val="36"/>
+        </w:rPr>
+      </w:pPr>
+      <w:r>
+        <w:rPr>
+          <w:rFonts w:eastAsia="Times New Roman" w:cs="Times New Roman" w:ascii="Garamond" w:hAnsi="Garamond"/>
+          <w:color w:val="000000"/>
+          <w:kern w:val="0"/>
+          <w:sz w:val="36"/>
+          <w:szCs w:val="36"/>
+          <w:shd w:fill="auto" w:val="clear"/>
+          <w:lang w:val="en-US" w:eastAsia="zh-CN" w:bidi="hi-IN"/>
+        </w:rPr>
+        <w:t>Entretanto, nessa segunda hipótese, os pais teriam que ignorar completamente a situação deplorável do filho, mas isso representaria a total negação do amor.</w:t>
+      </w:r>
+    </w:p>
+    <w:p>
+      <w:pPr>
+        <w:pStyle w:val="Normal"/>
+        <w:jc w:val="both"/>
+        <w:rPr>
+          <w:sz w:val="36"/>
+          <w:szCs w:val="36"/>
+        </w:rPr>
+      </w:pPr>
+      <w:r>
+        <w:rPr/>
+      </w:r>
+    </w:p>
+    <w:p>
+      <w:pPr>
+        <w:pStyle w:val="Normal"/>
+        <w:jc w:val="both"/>
+        <w:rPr>
+          <w:sz w:val="36"/>
+          <w:szCs w:val="36"/>
+        </w:rPr>
+      </w:pPr>
+      <w:r>
+        <w:rPr>
+          <w:rFonts w:eastAsia="Times New Roman" w:cs="Times New Roman" w:ascii="Garamond" w:hAnsi="Garamond"/>
+          <w:color w:val="000000"/>
+          <w:kern w:val="0"/>
+          <w:sz w:val="36"/>
+          <w:szCs w:val="36"/>
+          <w:shd w:fill="auto" w:val="clear"/>
+          <w:lang w:val="en-US" w:eastAsia="zh-CN" w:bidi="hi-IN"/>
+        </w:rPr>
+        <w:t>Então o dogma das penas eternas não esclarece e muito menos consola.</w:t>
+      </w:r>
+    </w:p>
+    <w:p>
+      <w:pPr>
+        <w:pStyle w:val="Normal"/>
+        <w:jc w:val="both"/>
+        <w:rPr>
+          <w:sz w:val="36"/>
+          <w:szCs w:val="36"/>
+        </w:rPr>
+      </w:pPr>
+      <w:r>
+        <w:rPr/>
+      </w:r>
+    </w:p>
+    <w:p>
+      <w:pPr>
+        <w:pStyle w:val="Normal"/>
+        <w:jc w:val="both"/>
+        <w:rPr>
+          <w:sz w:val="36"/>
+          <w:szCs w:val="36"/>
+        </w:rPr>
+      </w:pPr>
+      <w:r>
+        <w:rPr/>
+      </w:r>
+    </w:p>
+    <w:p>
+      <w:pPr>
+        <w:pStyle w:val="Normal"/>
+        <w:jc w:val="both"/>
+        <w:rPr>
+          <w:sz w:val="36"/>
+          <w:szCs w:val="36"/>
+        </w:rPr>
+      </w:pPr>
+      <w:r>
+        <w:rPr>
+          <w:rFonts w:eastAsia="Times New Roman" w:cs="Times New Roman" w:ascii="Garamond" w:hAnsi="Garamond"/>
+          <w:color w:val="000000"/>
+          <w:kern w:val="0"/>
+          <w:sz w:val="36"/>
+          <w:szCs w:val="36"/>
+          <w:shd w:fill="auto" w:val="clear"/>
+          <w:lang w:val="en-US" w:eastAsia="zh-CN" w:bidi="hi-IN"/>
+        </w:rPr>
+        <w:t xml:space="preserve">O Espiritismo rejeita a ideia de penas eternas porque ela é incompatível com a justiça e a misericórdia divinas. A alma não tem uma única existência; ela nasce e renasce inúmeras vezes. </w:t>
+      </w:r>
+      <w:r>
+        <w:rPr>
+          <w:rFonts w:eastAsia="Times New Roman" w:cs="Times New Roman" w:ascii="Garamond" w:hAnsi="Garamond"/>
+          <w:color w:val="000000"/>
+          <w:kern w:val="0"/>
+          <w:sz w:val="36"/>
+          <w:szCs w:val="36"/>
+          <w:shd w:fill="auto" w:val="clear"/>
+          <w:lang w:val="en-US" w:eastAsia="zh-CN" w:bidi="hi-IN"/>
+        </w:rPr>
+        <w:t>Cada nova existência é programada de acordo com os méritos adquiridos e débitos contraídos pelo Espírito até então.</w:t>
+      </w:r>
+    </w:p>
+    <w:p>
+      <w:pPr>
+        <w:pStyle w:val="Normal"/>
+        <w:jc w:val="both"/>
+        <w:rPr>
+          <w:sz w:val="36"/>
+          <w:szCs w:val="36"/>
+        </w:rPr>
+      </w:pPr>
+      <w:r>
+        <w:rPr/>
+      </w:r>
+    </w:p>
+    <w:p>
+      <w:pPr>
+        <w:pStyle w:val="Normal"/>
+        <w:jc w:val="both"/>
+        <w:rPr>
+          <w:sz w:val="36"/>
+          <w:szCs w:val="36"/>
+        </w:rPr>
+      </w:pPr>
+      <w:r>
+        <w:rPr>
+          <w:rFonts w:eastAsia="Times New Roman" w:cs="Times New Roman" w:ascii="Garamond" w:hAnsi="Garamond"/>
+          <w:color w:val="000000"/>
+          <w:kern w:val="0"/>
+          <w:sz w:val="36"/>
+          <w:szCs w:val="36"/>
+          <w:shd w:fill="auto" w:val="clear"/>
+          <w:lang w:val="en-US" w:eastAsia="zh-CN" w:bidi="hi-IN"/>
+        </w:rPr>
+        <w:t>O sofrimento espiritual existe</w:t>
+      </w:r>
+      <w:r>
+        <w:rPr>
+          <w:rFonts w:eastAsia="Times New Roman" w:cs="Times New Roman" w:ascii="Garamond" w:hAnsi="Garamond"/>
+          <w:color w:val="000000"/>
+          <w:kern w:val="0"/>
+          <w:sz w:val="36"/>
+          <w:szCs w:val="36"/>
+          <w:shd w:fill="auto" w:val="clear"/>
+          <w:lang w:val="en-US" w:eastAsia="zh-CN" w:bidi="hi-IN"/>
+        </w:rPr>
+        <w:t xml:space="preserve"> sim</w:t>
+      </w:r>
+      <w:r>
+        <w:rPr>
+          <w:rFonts w:eastAsia="Times New Roman" w:cs="Times New Roman" w:ascii="Garamond" w:hAnsi="Garamond"/>
+          <w:color w:val="000000"/>
+          <w:kern w:val="0"/>
+          <w:sz w:val="36"/>
+          <w:szCs w:val="36"/>
+          <w:shd w:fill="auto" w:val="clear"/>
+          <w:lang w:val="en-US" w:eastAsia="zh-CN" w:bidi="hi-IN"/>
+        </w:rPr>
+        <w:t xml:space="preserve">, mas é sempre temporário e educativo, pois todo Espírito está destinado ao progresso moral. </w:t>
+      </w:r>
+    </w:p>
+    <w:p>
+      <w:pPr>
+        <w:pStyle w:val="Normal"/>
+        <w:jc w:val="both"/>
+        <w:rPr>
+          <w:sz w:val="36"/>
+          <w:szCs w:val="36"/>
+        </w:rPr>
+      </w:pPr>
+      <w:r>
+        <w:rPr/>
+      </w:r>
+    </w:p>
+    <w:p>
+      <w:pPr>
+        <w:pStyle w:val="Normal"/>
+        <w:jc w:val="both"/>
+        <w:rPr>
+          <w:sz w:val="36"/>
+          <w:szCs w:val="36"/>
+        </w:rPr>
+      </w:pPr>
+      <w:r>
+        <w:rPr>
+          <w:rFonts w:eastAsia="Times New Roman" w:cs="Times New Roman" w:ascii="Garamond" w:hAnsi="Garamond"/>
+          <w:color w:val="000000"/>
+          <w:kern w:val="0"/>
+          <w:sz w:val="36"/>
+          <w:szCs w:val="36"/>
+          <w:shd w:fill="auto" w:val="clear"/>
+          <w:lang w:val="en-US" w:eastAsia="zh-CN" w:bidi="hi-IN"/>
+        </w:rPr>
+        <w:t>Céu e inferno deixam de ser locais definitivos de recompensa ou condenação e passam a representar estados transitórios da consciência, diretamente ligados às escolhas e ao grau evolutivo de cada Espírito.</w:t>
+      </w:r>
+    </w:p>
+    <w:p>
+      <w:pPr>
+        <w:pStyle w:val="Normal"/>
+        <w:jc w:val="both"/>
+        <w:rPr>
+          <w:sz w:val="36"/>
+          <w:szCs w:val="36"/>
+        </w:rPr>
+      </w:pPr>
+      <w:r>
+        <w:rPr/>
+      </w:r>
+    </w:p>
+    <w:p>
+      <w:pPr>
+        <w:pStyle w:val="Normal"/>
+        <w:jc w:val="both"/>
+        <w:rPr>
+          <w:sz w:val="36"/>
+          <w:szCs w:val="36"/>
+        </w:rPr>
+      </w:pPr>
+      <w:r>
+        <w:rPr>
+          <w:rFonts w:eastAsia="Times New Roman" w:cs="Times New Roman" w:ascii="Garamond" w:hAnsi="Garamond"/>
+          <w:color w:val="000000"/>
+          <w:kern w:val="0"/>
+          <w:sz w:val="36"/>
+          <w:szCs w:val="36"/>
+          <w:shd w:fill="auto" w:val="clear"/>
+          <w:lang w:val="en-US" w:eastAsia="zh-CN" w:bidi="hi-IN"/>
+        </w:rPr>
+        <w:t>P</w:t>
+      </w:r>
+      <w:r>
+        <w:rPr>
+          <w:rFonts w:eastAsia="Times New Roman" w:cs="Times New Roman" w:ascii="Garamond" w:hAnsi="Garamond"/>
+          <w:color w:val="000000"/>
+          <w:kern w:val="0"/>
+          <w:sz w:val="36"/>
+          <w:szCs w:val="36"/>
+          <w:shd w:fill="auto" w:val="clear"/>
+          <w:lang w:val="en-US" w:eastAsia="zh-CN" w:bidi="hi-IN"/>
+        </w:rPr>
+        <w:t xml:space="preserve">or maior que seja o sofrimento pelo qual o Espírito - encarnado ou desencarnado - esteja passando, </w:t>
+      </w:r>
+      <w:r>
+        <w:rPr>
+          <w:rFonts w:eastAsia="Times New Roman" w:cs="Times New Roman" w:ascii="Garamond" w:hAnsi="Garamond"/>
+          <w:color w:val="000000"/>
+          <w:kern w:val="0"/>
+          <w:sz w:val="36"/>
+          <w:szCs w:val="36"/>
+          <w:shd w:fill="auto" w:val="clear"/>
+          <w:lang w:val="en-US" w:eastAsia="zh-CN" w:bidi="hi-IN"/>
+        </w:rPr>
+        <w:t xml:space="preserve">há um motivo justo para aquele sofrimento, mas o Espírito </w:t>
+      </w:r>
+      <w:r>
+        <w:rPr>
+          <w:rFonts w:eastAsia="Times New Roman" w:cs="Times New Roman" w:ascii="Garamond" w:hAnsi="Garamond"/>
+          <w:color w:val="000000"/>
+          <w:kern w:val="0"/>
+          <w:sz w:val="36"/>
+          <w:szCs w:val="36"/>
+          <w:shd w:fill="auto" w:val="clear"/>
+          <w:lang w:val="en-US" w:eastAsia="zh-CN" w:bidi="hi-IN"/>
+        </w:rPr>
+        <w:t>jamais deixa de ser amparado pelo amor e pela misericórdia de Deus.</w:t>
+      </w:r>
+    </w:p>
+    <w:p>
+      <w:pPr>
+        <w:pStyle w:val="Normal"/>
+        <w:jc w:val="both"/>
+        <w:rPr>
+          <w:sz w:val="36"/>
+          <w:szCs w:val="36"/>
+        </w:rPr>
+      </w:pPr>
+      <w:r>
+        <w:rPr/>
+      </w:r>
+    </w:p>
+    <w:p>
+      <w:pPr>
+        <w:pStyle w:val="Normal"/>
+        <w:jc w:val="both"/>
+        <w:rPr>
+          <w:sz w:val="36"/>
+          <w:szCs w:val="36"/>
+        </w:rPr>
+      </w:pPr>
+      <w:r>
+        <w:rPr>
+          <w:rFonts w:eastAsia="Times New Roman" w:cs="Times New Roman" w:ascii="Garamond" w:hAnsi="Garamond"/>
+          <w:color w:val="000000"/>
+          <w:kern w:val="0"/>
+          <w:sz w:val="36"/>
+          <w:szCs w:val="36"/>
+          <w:shd w:fill="auto" w:val="clear"/>
+          <w:lang w:val="en-US" w:eastAsia="zh-CN" w:bidi="hi-IN"/>
+        </w:rPr>
+        <w:t>Por isso a Doutrina Espírita é tão consoladora: ela nos revela um Deus que rege o universo com sabedoria, amor e misericórdia, ao mesmo tempo em que esclarece os ensinamentos do Evangelho de Jesus de forma simples e profunda, ajudando-nos a compreendê-los e aplicá-los em nossa vida.</w:t>
+      </w:r>
+    </w:p>
+    <w:p>
+      <w:pPr>
+        <w:pStyle w:val="Normal"/>
+        <w:jc w:val="both"/>
+        <w:rPr>
+          <w:sz w:val="36"/>
+          <w:szCs w:val="36"/>
+        </w:rPr>
+      </w:pPr>
+      <w:r>
+        <w:rPr/>
+      </w:r>
+    </w:p>
+    <w:p>
+      <w:pPr>
+        <w:pStyle w:val="Normal"/>
+        <w:jc w:val="both"/>
+        <w:rPr>
+          <w:sz w:val="36"/>
+          <w:szCs w:val="36"/>
+        </w:rPr>
+      </w:pPr>
+      <w:r>
+        <w:rPr>
+          <w:rFonts w:eastAsia="Times New Roman" w:cs="Times New Roman" w:ascii="Garamond" w:hAnsi="Garamond"/>
+          <w:color w:val="000000"/>
+          <w:kern w:val="0"/>
+          <w:sz w:val="36"/>
+          <w:szCs w:val="36"/>
+          <w:shd w:fill="auto" w:val="clear"/>
+          <w:lang w:val="en-US" w:eastAsia="zh-CN" w:bidi="hi-IN"/>
+        </w:rPr>
+        <w:t>Mas, mesmo com toda a luz que o Espiritismo nos traz, alguns conceitos ainda são de difícil compreensão. Não por alguma deficiência da doutrina, mas pela nossa incapacidade de compreendê-los, considerando o estágio evolutivo em que nos encontramos.</w:t>
+      </w:r>
+    </w:p>
+    <w:p>
+      <w:pPr>
+        <w:pStyle w:val="Normal"/>
+        <w:jc w:val="both"/>
+        <w:rPr>
+          <w:sz w:val="36"/>
+          <w:szCs w:val="36"/>
+        </w:rPr>
+      </w:pPr>
+      <w:r>
+        <w:rPr/>
+      </w:r>
+    </w:p>
+    <w:p>
+      <w:pPr>
+        <w:pStyle w:val="Normal"/>
+        <w:jc w:val="both"/>
+        <w:rPr>
+          <w:sz w:val="36"/>
+          <w:szCs w:val="36"/>
+        </w:rPr>
+      </w:pPr>
+      <w:r>
+        <w:rPr/>
+      </w:r>
+    </w:p>
+    <w:p>
+      <w:pPr>
+        <w:pStyle w:val="Normal"/>
+        <w:jc w:val="both"/>
+        <w:rPr>
+          <w:sz w:val="36"/>
+          <w:szCs w:val="36"/>
+        </w:rPr>
+      </w:pPr>
+      <w:r>
+        <w:rPr>
+          <w:rFonts w:eastAsia="Times New Roman" w:cs="Times New Roman" w:ascii="Garamond" w:hAnsi="Garamond"/>
+          <w:color w:val="000000"/>
+          <w:kern w:val="0"/>
+          <w:sz w:val="36"/>
+          <w:szCs w:val="36"/>
+          <w:shd w:fill="auto" w:val="clear"/>
+          <w:lang w:val="en-US" w:eastAsia="zh-CN" w:bidi="hi-IN"/>
+        </w:rPr>
+        <w:t>Deus é um desses conceitos. Em O Livro dos Espíritos, a Espiritualidade diz a Kardec que Deus é a inteligência suprema, causa primária de todas as coisas. Deus é eterno, infinito, imutável. Criou o Universo, que abrange todos os seres animados e inanimados, materiais e imateriais.</w:t>
+      </w:r>
+    </w:p>
+    <w:p>
+      <w:pPr>
+        <w:pStyle w:val="Normal"/>
+        <w:jc w:val="both"/>
+        <w:rPr>
+          <w:sz w:val="36"/>
+          <w:szCs w:val="36"/>
+        </w:rPr>
+      </w:pPr>
+      <w:r>
+        <w:rPr/>
+      </w:r>
+    </w:p>
+    <w:p>
+      <w:pPr>
+        <w:pStyle w:val="Normal"/>
+        <w:jc w:val="both"/>
+        <w:rPr>
+          <w:sz w:val="36"/>
+          <w:szCs w:val="36"/>
+        </w:rPr>
+      </w:pPr>
+      <w:r>
+        <w:rPr>
+          <w:rFonts w:eastAsia="Times New Roman" w:cs="Times New Roman" w:ascii="Garamond" w:hAnsi="Garamond"/>
+          <w:color w:val="000000"/>
+          <w:kern w:val="0"/>
+          <w:sz w:val="36"/>
+          <w:szCs w:val="36"/>
+          <w:shd w:fill="auto" w:val="clear"/>
+          <w:lang w:val="en-US" w:eastAsia="zh-CN" w:bidi="hi-IN"/>
+        </w:rPr>
+        <w:t>Não teve começo e não terá fim.</w:t>
+      </w:r>
+    </w:p>
+    <w:p>
+      <w:pPr>
+        <w:pStyle w:val="Normal"/>
+        <w:jc w:val="both"/>
+        <w:rPr>
+          <w:sz w:val="36"/>
+          <w:szCs w:val="36"/>
+        </w:rPr>
+      </w:pPr>
+      <w:r>
+        <w:rPr/>
+      </w:r>
+    </w:p>
+    <w:p>
+      <w:pPr>
+        <w:pStyle w:val="Normal"/>
+        <w:jc w:val="both"/>
+        <w:rPr>
+          <w:sz w:val="36"/>
+          <w:szCs w:val="36"/>
+        </w:rPr>
+      </w:pPr>
+      <w:r>
+        <w:rPr>
+          <w:rFonts w:eastAsia="Times New Roman" w:cs="Times New Roman" w:ascii="Garamond" w:hAnsi="Garamond"/>
+          <w:color w:val="000000"/>
+          <w:kern w:val="0"/>
+          <w:sz w:val="36"/>
+          <w:szCs w:val="36"/>
+          <w:shd w:fill="auto" w:val="clear"/>
+          <w:lang w:val="en-US" w:eastAsia="zh-CN" w:bidi="hi-IN"/>
+        </w:rPr>
+        <w:t xml:space="preserve">Falando com bastante sinceridade, nós não compreendemos </w:t>
+      </w:r>
+    </w:p>
+    <w:p>
+      <w:pPr>
+        <w:pStyle w:val="Normal"/>
+        <w:jc w:val="both"/>
+        <w:rPr>
+          <w:sz w:val="36"/>
+          <w:szCs w:val="36"/>
+        </w:rPr>
+      </w:pPr>
+      <w:r>
+        <w:rPr/>
+      </w:r>
+    </w:p>
+    <w:p>
+      <w:pPr>
+        <w:pStyle w:val="Normal"/>
+        <w:jc w:val="both"/>
+        <w:rPr>
+          <w:sz w:val="36"/>
+          <w:szCs w:val="36"/>
+        </w:rPr>
+      </w:pPr>
+      <w:r>
+        <w:rPr/>
+      </w:r>
+    </w:p>
+    <w:p>
+      <w:pPr>
+        <w:pStyle w:val="Normal"/>
+        <w:jc w:val="both"/>
+        <w:rPr>
+          <w:sz w:val="36"/>
+          <w:szCs w:val="36"/>
+        </w:rPr>
+      </w:pPr>
+      <w:r>
+        <w:rPr/>
       </w:r>
     </w:p>
     <w:p>
@@ -505,19 +1587,7 @@
           <w:shd w:fill="auto" w:val="clear"/>
           <w:lang w:val="en-US" w:eastAsia="zh-CN" w:bidi="hi-IN"/>
         </w:rPr>
-        <w:t>"Todos dormiam" pode também representar o conjunto de nossas existências passadas, nas quais não despertamos para os ensinamentos do Cristo. É o sono da alma. Pode também representar as mentes ociosas. Quantos milhões de irmãos na humanidade terrena ainda não despertaram para a vida espiritual? Passam toda a existência vivendo exclusivamente para a matéria. Não há o menor traço de preo</w:t>
-      </w:r>
-      <w:r>
-        <w:rPr>
-          <w:rFonts w:eastAsia="Times New Roman" w:cs="Times New Roman" w:ascii="Garamond" w:hAnsi="Garamond"/>
-          <w:color w:val="000000"/>
-          <w:kern w:val="0"/>
-          <w:sz w:val="36"/>
-          <w:szCs w:val="36"/>
-          <w:shd w:fill="auto" w:val="clear"/>
-          <w:lang w:val="en-US" w:eastAsia="zh-CN" w:bidi="hi-IN"/>
-        </w:rPr>
-        <w:t>cupação com a vida no porvir. E todos nós sabemos que, quando nos encontramos distantes das verdades espirituais, os inimigos que carregamos dentro de nós - orgulho, egoísmo, vaidade, sensualidade, cólera, intolerância - todos eles, tendem a aflorar</w:t>
+        <w:t>"Todos dormiam" pode também representar o conjunto de nossas existências passadas, nas quais não despertamos para os ensinamentos do Cristo. É o sono da alma. Pode também representar as mentes ociosas. Quantos milhões de irmãos na humanidade terrena ainda não despertaram para a vida espiritual? Passam toda a existência vivendo exclusivamente para a matéria. Não há o menor traço de preocupação com a vida no porvir. E todos nós sabemos que, quando nos encontramos distantes das verdades espirituais, os inimigos que carregamos dentro de nós - orgulho, egoísmo, vaidade, sensualidade, cólera, intolerância - todos eles, tendem a aflorar</w:t>
       </w:r>
     </w:p>
     <w:p>
@@ -639,7 +1709,7 @@
         <w:bCs/>
         <w:rFonts w:ascii="Garamond" w:hAnsi="Garamond"/>
       </w:rPr>
-      <w:t>8</w:t>
+      <w:t>16</w:t>
     </w:r>
     <w:r>
       <w:rPr>

</xml_diff>

<commit_message>
25/05/2026 - 21:04 h
</commit_message>
<xml_diff>
--- a/O joio e o trigo, o mal e o bem/O joio e o trigo.docx
+++ b/O joio e o trigo, o mal e o bem/O joio e o trigo.docx
@@ -89,115 +89,284 @@
           <w:shd w:fill="auto" w:val="clear"/>
           <w:lang w:val="en-US" w:eastAsia="zh-CN" w:bidi="hi-IN"/>
         </w:rPr>
-        <w:t>Não sei se temos aqui hoje pessoas que estão tendo contato com a Doutrina Espírita pela primeira vez. Não digo a primeira vez aqui na Casa de Glacus, mas o primeiro contato com o Espiritismo.</w:t>
-      </w:r>
-    </w:p>
-    <w:p>
-      <w:pPr>
-        <w:pStyle w:val="Normal"/>
-        <w:jc w:val="both"/>
-        <w:rPr>
-          <w:sz w:val="36"/>
-          <w:szCs w:val="36"/>
-        </w:rPr>
-      </w:pPr>
-      <w:r>
-        <w:rPr>
-          <w:sz w:val="36"/>
-          <w:szCs w:val="36"/>
-        </w:rPr>
-      </w:r>
-    </w:p>
-    <w:p>
-      <w:pPr>
-        <w:pStyle w:val="Normal"/>
-        <w:jc w:val="both"/>
-        <w:rPr>
-          <w:sz w:val="36"/>
-          <w:szCs w:val="36"/>
-        </w:rPr>
-      </w:pPr>
-      <w:r>
-        <w:rPr>
-          <w:rFonts w:eastAsia="Times New Roman" w:cs="Times New Roman" w:ascii="Garamond" w:hAnsi="Garamond"/>
-          <w:color w:val="000000"/>
-          <w:kern w:val="0"/>
-          <w:sz w:val="36"/>
-          <w:szCs w:val="36"/>
-          <w:shd w:fill="auto" w:val="clear"/>
-          <w:lang w:val="en-US" w:eastAsia="zh-CN" w:bidi="hi-IN"/>
-        </w:rPr>
-        <w:t>A Doutrina Espírita tem como base a ciência, a filosofia e a religião. Por isso, não existem dogmas no Espiritismo, existe a fé raciocinada.</w:t>
-      </w:r>
-    </w:p>
-    <w:p>
-      <w:pPr>
-        <w:pStyle w:val="Normal"/>
-        <w:jc w:val="both"/>
-        <w:rPr>
-          <w:sz w:val="36"/>
-          <w:szCs w:val="36"/>
-        </w:rPr>
-      </w:pPr>
-      <w:r>
-        <w:rPr>
-          <w:sz w:val="36"/>
-          <w:szCs w:val="36"/>
-        </w:rPr>
-      </w:r>
-    </w:p>
-    <w:p>
-      <w:pPr>
-        <w:pStyle w:val="Normal"/>
-        <w:jc w:val="both"/>
-        <w:rPr>
-          <w:sz w:val="36"/>
-          <w:szCs w:val="36"/>
-        </w:rPr>
-      </w:pPr>
-      <w:r>
-        <w:rPr>
-          <w:rFonts w:eastAsia="Times New Roman" w:cs="Times New Roman" w:ascii="Garamond" w:hAnsi="Garamond"/>
-          <w:color w:val="000000"/>
-          <w:kern w:val="0"/>
-          <w:sz w:val="36"/>
-          <w:szCs w:val="36"/>
-          <w:shd w:fill="auto" w:val="clear"/>
-          <w:lang w:val="en-US" w:eastAsia="zh-CN" w:bidi="hi-IN"/>
-        </w:rPr>
-        <w:t>O que é um dogma? No sentido religioso, um dogma é uma verdade considerada oficialmente revelada por Deus e aceita como obrigatória dentro de uma determinada tradição religiosa. É uma verdade imposta; os seguidores daquela religião não têm o direito de contestar um dogma.</w:t>
-      </w:r>
-    </w:p>
-    <w:p>
-      <w:pPr>
-        <w:pStyle w:val="Normal"/>
-        <w:jc w:val="both"/>
-        <w:rPr>
-          <w:sz w:val="36"/>
-          <w:szCs w:val="36"/>
-        </w:rPr>
-      </w:pPr>
-      <w:r>
-        <w:rPr>
-          <w:sz w:val="36"/>
-          <w:szCs w:val="36"/>
-        </w:rPr>
-      </w:r>
-    </w:p>
-    <w:p>
-      <w:pPr>
-        <w:pStyle w:val="Normal"/>
-        <w:jc w:val="both"/>
-        <w:rPr>
-          <w:sz w:val="36"/>
-          <w:szCs w:val="36"/>
-        </w:rPr>
-      </w:pPr>
-      <w:r>
-        <w:rPr>
-          <w:sz w:val="36"/>
-          <w:szCs w:val="36"/>
-        </w:rPr>
+        <w:t>A Doutrina Espírita tem como base a ciência, a filosofia e a religião. Por isso, no Espiritismo não existem dogmas, existe a fé raciocinada.</w:t>
+      </w:r>
+    </w:p>
+    <w:p>
+      <w:pPr>
+        <w:pStyle w:val="Normal"/>
+        <w:jc w:val="both"/>
+        <w:rPr>
+          <w:sz w:val="36"/>
+          <w:szCs w:val="36"/>
+        </w:rPr>
+      </w:pPr>
+      <w:r>
+        <w:rPr>
+          <w:sz w:val="36"/>
+          <w:szCs w:val="36"/>
+        </w:rPr>
+      </w:r>
+    </w:p>
+    <w:p>
+      <w:pPr>
+        <w:pStyle w:val="Normal"/>
+        <w:jc w:val="both"/>
+        <w:rPr>
+          <w:sz w:val="36"/>
+          <w:szCs w:val="36"/>
+        </w:rPr>
+      </w:pPr>
+      <w:r>
+        <w:rPr>
+          <w:rFonts w:eastAsia="Times New Roman" w:cs="Times New Roman" w:ascii="Garamond" w:hAnsi="Garamond"/>
+          <w:color w:val="000000"/>
+          <w:kern w:val="0"/>
+          <w:sz w:val="36"/>
+          <w:szCs w:val="36"/>
+          <w:shd w:fill="auto" w:val="clear"/>
+          <w:lang w:val="en-US" w:eastAsia="zh-CN" w:bidi="hi-IN"/>
+        </w:rPr>
+        <w:t>Mas o</w:t>
+      </w:r>
+      <w:r>
+        <w:rPr>
+          <w:rFonts w:eastAsia="Times New Roman" w:cs="Times New Roman" w:ascii="Garamond" w:hAnsi="Garamond"/>
+          <w:color w:val="000000"/>
+          <w:kern w:val="0"/>
+          <w:sz w:val="36"/>
+          <w:szCs w:val="36"/>
+          <w:shd w:fill="auto" w:val="clear"/>
+          <w:lang w:val="en-US" w:eastAsia="zh-CN" w:bidi="hi-IN"/>
+        </w:rPr>
+        <w:t xml:space="preserve"> que é um dogma? No sentido religioso, um dogma é uma verdade considerada oficialmente revelada por Deus e aceita como obrigatória dentro de uma determinada tradição religiosa. É uma verdade imposta; os seguidores daquela religião não têm o direito de contestar um dogma.</w:t>
+      </w:r>
+    </w:p>
+    <w:p>
+      <w:pPr>
+        <w:pStyle w:val="Normal"/>
+        <w:jc w:val="both"/>
+        <w:rPr>
+          <w:sz w:val="36"/>
+          <w:szCs w:val="36"/>
+        </w:rPr>
+      </w:pPr>
+      <w:r>
+        <w:rPr>
+          <w:sz w:val="36"/>
+          <w:szCs w:val="36"/>
+        </w:rPr>
+      </w:r>
+    </w:p>
+    <w:p>
+      <w:pPr>
+        <w:pStyle w:val="Normal"/>
+        <w:jc w:val="both"/>
+        <w:rPr>
+          <w:sz w:val="36"/>
+          <w:szCs w:val="36"/>
+        </w:rPr>
+      </w:pPr>
+      <w:r>
+        <w:rPr>
+          <w:rFonts w:eastAsia="Times New Roman" w:cs="Times New Roman" w:ascii="Garamond" w:hAnsi="Garamond"/>
+          <w:color w:val="000000"/>
+          <w:kern w:val="0"/>
+          <w:sz w:val="36"/>
+          <w:szCs w:val="36"/>
+          <w:shd w:fill="auto" w:val="clear"/>
+          <w:lang w:val="en-US" w:eastAsia="zh-CN" w:bidi="hi-IN"/>
+        </w:rPr>
+        <w:t>Um</w:t>
+      </w:r>
+      <w:r>
+        <w:rPr>
+          <w:rFonts w:eastAsia="Times New Roman" w:cs="Times New Roman" w:ascii="Garamond" w:hAnsi="Garamond"/>
+          <w:color w:val="000000"/>
+          <w:kern w:val="0"/>
+          <w:sz w:val="36"/>
+          <w:szCs w:val="36"/>
+          <w:shd w:fill="auto" w:val="clear"/>
+          <w:lang w:val="en-US" w:eastAsia="zh-CN" w:bidi="hi-IN"/>
+        </w:rPr>
+        <w:t xml:space="preserve"> exemplo é</w:t>
+      </w:r>
+      <w:r>
+        <w:rPr>
+          <w:rFonts w:eastAsia="Times New Roman" w:cs="Times New Roman" w:ascii="Garamond" w:hAnsi="Garamond"/>
+          <w:color w:val="000000"/>
+          <w:kern w:val="0"/>
+          <w:sz w:val="36"/>
+          <w:szCs w:val="36"/>
+          <w:shd w:fill="auto" w:val="clear"/>
+          <w:lang w:val="en-US" w:eastAsia="zh-CN" w:bidi="hi-IN"/>
+        </w:rPr>
+        <w:t xml:space="preserve"> </w:t>
+      </w:r>
+      <w:r>
+        <w:rPr>
+          <w:rFonts w:eastAsia="Times New Roman" w:cs="Times New Roman" w:ascii="Garamond" w:hAnsi="Garamond"/>
+          <w:color w:val="000000"/>
+          <w:kern w:val="0"/>
+          <w:sz w:val="36"/>
+          <w:szCs w:val="36"/>
+          <w:shd w:fill="auto" w:val="clear"/>
+          <w:lang w:val="en-US" w:eastAsia="zh-CN" w:bidi="hi-IN"/>
+        </w:rPr>
+        <w:t xml:space="preserve">o dogma das penas eternas. Ele </w:t>
+      </w:r>
+      <w:r>
+        <w:rPr>
+          <w:rFonts w:eastAsia="Times New Roman" w:cs="Times New Roman" w:ascii="Garamond" w:hAnsi="Garamond"/>
+          <w:color w:val="000000"/>
+          <w:kern w:val="0"/>
+          <w:sz w:val="36"/>
+          <w:szCs w:val="36"/>
+          <w:shd w:fill="auto" w:val="clear"/>
+          <w:lang w:val="en-US" w:eastAsia="zh-CN" w:bidi="hi-IN"/>
+        </w:rPr>
+        <w:t>estabelece</w:t>
+      </w:r>
+      <w:r>
+        <w:rPr>
+          <w:rFonts w:eastAsia="Times New Roman" w:cs="Times New Roman" w:ascii="Garamond" w:hAnsi="Garamond"/>
+          <w:color w:val="000000"/>
+          <w:kern w:val="0"/>
+          <w:sz w:val="36"/>
+          <w:szCs w:val="36"/>
+          <w:shd w:fill="auto" w:val="clear"/>
+          <w:lang w:val="en-US" w:eastAsia="zh-CN" w:bidi="hi-IN"/>
+        </w:rPr>
+        <w:t xml:space="preserve"> que</w:t>
+      </w:r>
+      <w:r>
+        <w:rPr>
+          <w:rFonts w:eastAsia="Times New Roman" w:cs="Times New Roman" w:ascii="Garamond" w:hAnsi="Garamond"/>
+          <w:color w:val="000000"/>
+          <w:kern w:val="0"/>
+          <w:sz w:val="36"/>
+          <w:szCs w:val="36"/>
+          <w:shd w:fill="auto" w:val="clear"/>
+          <w:lang w:val="en-US" w:eastAsia="zh-CN" w:bidi="hi-IN"/>
+        </w:rPr>
+        <w:t>,</w:t>
+      </w:r>
+      <w:r>
+        <w:rPr>
+          <w:rFonts w:eastAsia="Times New Roman" w:cs="Times New Roman" w:ascii="Garamond" w:hAnsi="Garamond"/>
+          <w:color w:val="000000"/>
+          <w:kern w:val="0"/>
+          <w:sz w:val="36"/>
+          <w:szCs w:val="36"/>
+          <w:shd w:fill="auto" w:val="clear"/>
+          <w:lang w:val="en-US" w:eastAsia="zh-CN" w:bidi="hi-IN"/>
+        </w:rPr>
+        <w:t xml:space="preserve"> após uma única existência terrena</w:t>
+      </w:r>
+      <w:r>
+        <w:rPr>
+          <w:rFonts w:eastAsia="Times New Roman" w:cs="Times New Roman" w:ascii="Garamond" w:hAnsi="Garamond"/>
+          <w:color w:val="000000"/>
+          <w:kern w:val="0"/>
+          <w:sz w:val="36"/>
+          <w:szCs w:val="36"/>
+          <w:shd w:fill="auto" w:val="clear"/>
+          <w:lang w:val="en-US" w:eastAsia="zh-CN" w:bidi="hi-IN"/>
+        </w:rPr>
+        <w:t>,</w:t>
+      </w:r>
+      <w:r>
+        <w:rPr>
+          <w:rFonts w:eastAsia="Times New Roman" w:cs="Times New Roman" w:ascii="Garamond" w:hAnsi="Garamond"/>
+          <w:color w:val="000000"/>
+          <w:kern w:val="0"/>
+          <w:sz w:val="36"/>
+          <w:szCs w:val="36"/>
+          <w:shd w:fill="auto" w:val="clear"/>
+          <w:lang w:val="en-US" w:eastAsia="zh-CN" w:bidi="hi-IN"/>
+        </w:rPr>
+        <w:t xml:space="preserve"> a alma recebe um destino definitivo: felicidade eterna no céu ou sofrimento eterno no inferno. </w:t>
+      </w:r>
+    </w:p>
+    <w:p>
+      <w:pPr>
+        <w:pStyle w:val="Normal"/>
+        <w:jc w:val="both"/>
+        <w:rPr>
+          <w:sz w:val="36"/>
+          <w:szCs w:val="36"/>
+        </w:rPr>
+      </w:pPr>
+      <w:r>
+        <w:rPr>
+          <w:sz w:val="36"/>
+          <w:szCs w:val="36"/>
+        </w:rPr>
+      </w:r>
+    </w:p>
+    <w:p>
+      <w:pPr>
+        <w:pStyle w:val="Normal"/>
+        <w:jc w:val="both"/>
+        <w:rPr>
+          <w:sz w:val="36"/>
+          <w:szCs w:val="36"/>
+        </w:rPr>
+      </w:pPr>
+      <w:r>
+        <w:rPr>
+          <w:rFonts w:eastAsia="Times New Roman" w:cs="Times New Roman" w:ascii="Garamond" w:hAnsi="Garamond"/>
+          <w:color w:val="000000"/>
+          <w:kern w:val="0"/>
+          <w:sz w:val="36"/>
+          <w:szCs w:val="36"/>
+          <w:shd w:fill="auto" w:val="clear"/>
+          <w:lang w:val="en-US" w:eastAsia="zh-CN" w:bidi="hi-IN"/>
+        </w:rPr>
+        <w:t xml:space="preserve">O que determina esse destino é a maneira como aquela alma conduziu sua existência única: se fez o bem, </w:t>
+      </w:r>
+      <w:r>
+        <w:rPr>
+          <w:rFonts w:eastAsia="Times New Roman" w:cs="Times New Roman" w:ascii="Garamond" w:hAnsi="Garamond"/>
+          <w:color w:val="000000"/>
+          <w:kern w:val="0"/>
+          <w:sz w:val="36"/>
+          <w:szCs w:val="36"/>
+          <w:shd w:fill="auto" w:val="clear"/>
+          <w:lang w:val="en-US" w:eastAsia="zh-CN" w:bidi="hi-IN"/>
+        </w:rPr>
+        <w:t>irá</w:t>
+      </w:r>
+      <w:r>
+        <w:rPr>
+          <w:rFonts w:eastAsia="Times New Roman" w:cs="Times New Roman" w:ascii="Garamond" w:hAnsi="Garamond"/>
+          <w:color w:val="000000"/>
+          <w:kern w:val="0"/>
+          <w:sz w:val="36"/>
+          <w:szCs w:val="36"/>
+          <w:shd w:fill="auto" w:val="clear"/>
+          <w:lang w:val="en-US" w:eastAsia="zh-CN" w:bidi="hi-IN"/>
+        </w:rPr>
+        <w:t xml:space="preserve"> para o céu; se fez o mal, irá para o inferno.</w:t>
+      </w:r>
+    </w:p>
+    <w:p>
+      <w:pPr>
+        <w:pStyle w:val="Normal"/>
+        <w:jc w:val="both"/>
+        <w:rPr>
+          <w:sz w:val="36"/>
+          <w:szCs w:val="36"/>
+        </w:rPr>
+      </w:pPr>
+      <w:r>
+        <w:rPr>
+          <w:sz w:val="36"/>
+          <w:szCs w:val="36"/>
+        </w:rPr>
+      </w:r>
+      <w:r>
+        <w:br w:type="page"/>
       </w:r>
     </w:p>
     <w:p>
@@ -232,6 +401,19 @@
         </w:rPr>
       </w:pPr>
       <w:r>
+        <w:rPr/>
+      </w:r>
+    </w:p>
+    <w:p>
+      <w:pPr>
+        <w:pStyle w:val="Normal"/>
+        <w:jc w:val="both"/>
+        <w:rPr>
+          <w:sz w:val="36"/>
+          <w:szCs w:val="36"/>
+        </w:rPr>
+      </w:pPr>
+      <w:r>
         <w:rPr>
           <w:rFonts w:eastAsia="Times New Roman" w:cs="Times New Roman" w:ascii="Garamond" w:hAnsi="Garamond"/>
           <w:color w:val="000000"/>
@@ -254,368 +436,95 @@
         </w:rPr>
       </w:pPr>
       <w:r>
-        <w:rPr>
-          <w:sz w:val="36"/>
-          <w:szCs w:val="36"/>
-        </w:rPr>
-      </w:r>
-    </w:p>
-    <w:p>
-      <w:pPr>
-        <w:pStyle w:val="Normal"/>
-        <w:jc w:val="both"/>
-        <w:rPr>
-          <w:sz w:val="36"/>
-          <w:szCs w:val="36"/>
-        </w:rPr>
-      </w:pPr>
-      <w:r>
-        <w:rPr>
-          <w:rFonts w:eastAsia="Times New Roman" w:cs="Times New Roman" w:ascii="Garamond" w:hAnsi="Garamond"/>
-          <w:color w:val="000000"/>
-          <w:kern w:val="0"/>
-          <w:sz w:val="36"/>
-          <w:szCs w:val="36"/>
-          <w:shd w:fill="auto" w:val="clear"/>
-          <w:lang w:val="en-US" w:eastAsia="zh-CN" w:bidi="hi-IN"/>
-        </w:rPr>
-        <w:t xml:space="preserve">Vamos tomar como exemplo o dogma das penas eternas.  Ele sustenta que após uma única existência terrena a alma recebe um destino definitivo: felicidade eterna no céu ou sofrimento eterno no inferno. </w:t>
-      </w:r>
-    </w:p>
-    <w:p>
-      <w:pPr>
-        <w:pStyle w:val="Normal"/>
-        <w:jc w:val="both"/>
-        <w:rPr>
-          <w:sz w:val="36"/>
-          <w:szCs w:val="36"/>
-        </w:rPr>
-      </w:pPr>
-      <w:r>
-        <w:rPr>
-          <w:sz w:val="36"/>
-          <w:szCs w:val="36"/>
-        </w:rPr>
-      </w:r>
-    </w:p>
-    <w:p>
-      <w:pPr>
-        <w:pStyle w:val="Normal"/>
-        <w:jc w:val="both"/>
-        <w:rPr>
-          <w:sz w:val="36"/>
-          <w:szCs w:val="36"/>
-        </w:rPr>
-      </w:pPr>
-      <w:r>
-        <w:rPr>
-          <w:rFonts w:eastAsia="Times New Roman" w:cs="Times New Roman" w:ascii="Garamond" w:hAnsi="Garamond"/>
-          <w:color w:val="000000"/>
-          <w:kern w:val="0"/>
-          <w:sz w:val="36"/>
-          <w:szCs w:val="36"/>
-          <w:shd w:fill="auto" w:val="clear"/>
-          <w:lang w:val="en-US" w:eastAsia="zh-CN" w:bidi="hi-IN"/>
-        </w:rPr>
-        <w:t>O que determina esse destino é a maneira como aquela alma conduziu sua existência única: se fez o bem, vai para o céu; se fez o mal, irá para o inferno.</w:t>
-      </w:r>
-    </w:p>
-    <w:p>
-      <w:pPr>
-        <w:pStyle w:val="Normal"/>
-        <w:jc w:val="both"/>
-        <w:rPr>
-          <w:sz w:val="36"/>
-          <w:szCs w:val="36"/>
-        </w:rPr>
-      </w:pPr>
-      <w:r>
-        <w:rPr>
-          <w:sz w:val="36"/>
-          <w:szCs w:val="36"/>
-        </w:rPr>
-      </w:r>
-    </w:p>
-    <w:p>
-      <w:pPr>
-        <w:pStyle w:val="Normal"/>
-        <w:jc w:val="both"/>
-        <w:rPr>
-          <w:sz w:val="36"/>
-          <w:szCs w:val="36"/>
-        </w:rPr>
-      </w:pPr>
-      <w:r>
-        <w:rPr>
-          <w:sz w:val="36"/>
-          <w:szCs w:val="36"/>
-        </w:rPr>
-      </w:r>
-    </w:p>
-    <w:p>
-      <w:pPr>
-        <w:pStyle w:val="Normal"/>
-        <w:jc w:val="both"/>
-        <w:rPr>
-          <w:sz w:val="36"/>
-          <w:szCs w:val="36"/>
-        </w:rPr>
-      </w:pPr>
-      <w:r>
-        <w:rPr>
-          <w:rFonts w:eastAsia="Times New Roman" w:cs="Times New Roman" w:ascii="Garamond" w:hAnsi="Garamond"/>
-          <w:color w:val="000000"/>
-          <w:kern w:val="0"/>
-          <w:sz w:val="36"/>
-          <w:szCs w:val="36"/>
-          <w:shd w:fill="auto" w:val="clear"/>
-          <w:lang w:val="en-US" w:eastAsia="zh-CN" w:bidi="hi-IN"/>
-        </w:rPr>
-        <w:t>Mas esse dogma não esclarece certas questões. Por exemplo: não existe ninguém perfeito no nosso mundo. Todos nós temos virtudes e impefeições, acertamos e erramos. Qual a quantidade de bem eu devo fazer para merecer o céu e qual a quantidade de mal vai me condenar ao inferno? Porque ninguém erra ou acerta 100% em uma única existência. Como Deus mede o bem e o mal que praticamos para decidir nosso destino?</w:t>
-      </w:r>
-    </w:p>
-    <w:p>
-      <w:pPr>
-        <w:pStyle w:val="Normal"/>
-        <w:jc w:val="both"/>
-        <w:rPr>
-          <w:sz w:val="36"/>
-          <w:szCs w:val="36"/>
-        </w:rPr>
-      </w:pPr>
-      <w:r>
-        <w:rPr>
-          <w:sz w:val="36"/>
-          <w:szCs w:val="36"/>
-        </w:rPr>
-      </w:r>
-    </w:p>
-    <w:p>
-      <w:pPr>
-        <w:pStyle w:val="Normal"/>
-        <w:jc w:val="both"/>
-        <w:rPr>
-          <w:sz w:val="36"/>
-          <w:szCs w:val="36"/>
-        </w:rPr>
-      </w:pPr>
-      <w:r>
-        <w:rPr>
-          <w:rFonts w:eastAsia="Times New Roman" w:cs="Times New Roman" w:ascii="Garamond" w:hAnsi="Garamond"/>
-          <w:color w:val="000000"/>
-          <w:kern w:val="0"/>
-          <w:sz w:val="36"/>
-          <w:szCs w:val="36"/>
-          <w:shd w:fill="auto" w:val="clear"/>
-          <w:lang w:val="en-US" w:eastAsia="zh-CN" w:bidi="hi-IN"/>
-        </w:rPr>
-        <w:t>Outra questão, ainda mais importante: todos nós conhecemos famílias em que quase todos os membros são pessoas de bem, vivem de maneira honrada e honesta. Mas há alguém que se desvia completamente desse padrão familiar, alguém que se entrega aos vícios, ao crime, à preguiça ou à desonestidade. De acordo com o dogma das penas eternas, essa ovelha negra da família certamente irá para o inferno, ao passo que os demais integrantes irão para o céu.</w:t>
-      </w:r>
-    </w:p>
-    <w:p>
-      <w:pPr>
-        <w:pStyle w:val="Normal"/>
-        <w:jc w:val="both"/>
-        <w:rPr>
-          <w:sz w:val="36"/>
-          <w:szCs w:val="36"/>
-        </w:rPr>
-      </w:pPr>
-      <w:r>
-        <w:rPr>
-          <w:sz w:val="36"/>
-          <w:szCs w:val="36"/>
-        </w:rPr>
-      </w:r>
-    </w:p>
-    <w:p>
-      <w:pPr>
-        <w:pStyle w:val="Normal"/>
-        <w:jc w:val="both"/>
-        <w:rPr>
-          <w:sz w:val="36"/>
-          <w:szCs w:val="36"/>
-        </w:rPr>
-      </w:pPr>
-      <w:r>
-        <w:rPr>
-          <w:rFonts w:eastAsia="Times New Roman" w:cs="Times New Roman" w:ascii="Garamond" w:hAnsi="Garamond"/>
-          <w:color w:val="000000"/>
-          <w:kern w:val="0"/>
-          <w:sz w:val="36"/>
-          <w:szCs w:val="36"/>
-          <w:shd w:fill="auto" w:val="clear"/>
-          <w:lang w:val="en-US" w:eastAsia="zh-CN" w:bidi="hi-IN"/>
-        </w:rPr>
-        <w:t>Mas eu pergunto: qual pai ou qual mãe estaria realmente feliz no céu, sabendo que o filho muito amado, a despeito de todos os erros que cometeu em vida, sofrerá no inferno por toda a eternidade?</w:t>
-      </w:r>
-    </w:p>
-    <w:p>
-      <w:pPr>
-        <w:pStyle w:val="Normal"/>
-        <w:jc w:val="both"/>
-        <w:rPr>
-          <w:sz w:val="36"/>
-          <w:szCs w:val="36"/>
-        </w:rPr>
-      </w:pPr>
-      <w:r>
-        <w:rPr>
-          <w:sz w:val="36"/>
-          <w:szCs w:val="36"/>
-        </w:rPr>
-      </w:r>
-    </w:p>
-    <w:p>
-      <w:pPr>
-        <w:pStyle w:val="Normal"/>
-        <w:jc w:val="both"/>
-        <w:rPr>
-          <w:sz w:val="36"/>
-          <w:szCs w:val="36"/>
-        </w:rPr>
-      </w:pPr>
-      <w:r>
-        <w:rPr>
-          <w:rFonts w:eastAsia="Times New Roman" w:cs="Times New Roman" w:ascii="Garamond" w:hAnsi="Garamond"/>
-          <w:color w:val="000000"/>
-          <w:kern w:val="0"/>
-          <w:sz w:val="36"/>
-          <w:szCs w:val="36"/>
-          <w:shd w:fill="auto" w:val="clear"/>
-          <w:lang w:val="en-US" w:eastAsia="zh-CN" w:bidi="hi-IN"/>
-        </w:rPr>
-        <w:t xml:space="preserve">De duas, uma: ou os pais seriam eternamente infelizes pela condição do filho - e nesse caso o céu seria também um lugar de tristezas -, ou eles seriam felizes mesmo sabendo que a condenação do filho é irremediável. </w:t>
-      </w:r>
-    </w:p>
-    <w:p>
-      <w:pPr>
-        <w:pStyle w:val="Normal"/>
-        <w:jc w:val="both"/>
-        <w:rPr>
-          <w:sz w:val="36"/>
-          <w:szCs w:val="36"/>
-        </w:rPr>
-      </w:pPr>
-      <w:r>
-        <w:rPr>
-          <w:sz w:val="36"/>
-          <w:szCs w:val="36"/>
-        </w:rPr>
-      </w:r>
-    </w:p>
-    <w:p>
-      <w:pPr>
-        <w:pStyle w:val="Normal"/>
-        <w:jc w:val="both"/>
-        <w:rPr>
-          <w:sz w:val="36"/>
-          <w:szCs w:val="36"/>
-        </w:rPr>
-      </w:pPr>
-      <w:r>
-        <w:rPr>
-          <w:rFonts w:eastAsia="Times New Roman" w:cs="Times New Roman" w:ascii="Garamond" w:hAnsi="Garamond"/>
-          <w:color w:val="000000"/>
-          <w:kern w:val="0"/>
-          <w:sz w:val="36"/>
-          <w:szCs w:val="36"/>
-          <w:shd w:fill="auto" w:val="clear"/>
-          <w:lang w:val="en-US" w:eastAsia="zh-CN" w:bidi="hi-IN"/>
-        </w:rPr>
-        <w:t>Entretanto, nessa segunda hipótese, os pais teriam que ignorar completamente a situação deplorável do filho, mas isso representaria a total negação do amor.</w:t>
-      </w:r>
-    </w:p>
-    <w:p>
-      <w:pPr>
-        <w:pStyle w:val="Normal"/>
-        <w:jc w:val="both"/>
-        <w:rPr>
-          <w:sz w:val="36"/>
-          <w:szCs w:val="36"/>
-        </w:rPr>
-      </w:pPr>
-      <w:r>
-        <w:rPr>
-          <w:sz w:val="36"/>
-          <w:szCs w:val="36"/>
-        </w:rPr>
-      </w:r>
-    </w:p>
-    <w:p>
-      <w:pPr>
-        <w:pStyle w:val="Normal"/>
-        <w:jc w:val="both"/>
-        <w:rPr>
-          <w:sz w:val="36"/>
-          <w:szCs w:val="36"/>
-        </w:rPr>
-      </w:pPr>
-      <w:r>
-        <w:rPr>
-          <w:rFonts w:eastAsia="Times New Roman" w:cs="Times New Roman" w:ascii="Garamond" w:hAnsi="Garamond"/>
-          <w:color w:val="000000"/>
-          <w:kern w:val="0"/>
-          <w:sz w:val="36"/>
-          <w:szCs w:val="36"/>
-          <w:shd w:fill="auto" w:val="clear"/>
-          <w:lang w:val="en-US" w:eastAsia="zh-CN" w:bidi="hi-IN"/>
-        </w:rPr>
-        <w:t>Então o dogma das penas eternas não esclarece e muito menos consola.</w:t>
-      </w:r>
-    </w:p>
-    <w:p>
-      <w:pPr>
-        <w:pStyle w:val="Normal"/>
-        <w:jc w:val="both"/>
-        <w:rPr>
-          <w:sz w:val="36"/>
-          <w:szCs w:val="36"/>
-        </w:rPr>
-      </w:pPr>
-      <w:r>
-        <w:rPr>
-          <w:sz w:val="36"/>
-          <w:szCs w:val="36"/>
-        </w:rPr>
-      </w:r>
-    </w:p>
-    <w:p>
-      <w:pPr>
-        <w:pStyle w:val="Normal"/>
-        <w:jc w:val="both"/>
-        <w:rPr>
-          <w:sz w:val="36"/>
-          <w:szCs w:val="36"/>
-        </w:rPr>
-      </w:pPr>
-      <w:r>
-        <w:rPr>
-          <w:sz w:val="36"/>
-          <w:szCs w:val="36"/>
-        </w:rPr>
-      </w:r>
-    </w:p>
-    <w:p>
-      <w:pPr>
-        <w:pStyle w:val="Normal"/>
-        <w:jc w:val="both"/>
-        <w:rPr>
-          <w:sz w:val="36"/>
-          <w:szCs w:val="36"/>
-        </w:rPr>
-      </w:pPr>
-      <w:r>
-        <w:rPr>
-          <w:rFonts w:eastAsia="Times New Roman" w:cs="Times New Roman" w:ascii="Garamond" w:hAnsi="Garamond"/>
-          <w:color w:val="000000"/>
-          <w:kern w:val="0"/>
-          <w:sz w:val="36"/>
-          <w:szCs w:val="36"/>
-          <w:shd w:fill="auto" w:val="clear"/>
-          <w:lang w:val="en-US" w:eastAsia="zh-CN" w:bidi="hi-IN"/>
-        </w:rPr>
-        <w:t>O Espiritismo rejeita a ideia de penas eternas porque ela é incompatível com a justiça e a misericórdia divinas. A alma não tem uma única existência; ela nasce e renasce inúmeras vezes. Cada nova existência é programada de acordo com os méritos adquiridos e débitos contraídos pelo Espírito até então.</w:t>
+        <w:rPr/>
+      </w:r>
+    </w:p>
+    <w:p>
+      <w:pPr>
+        <w:pStyle w:val="Normal"/>
+        <w:jc w:val="both"/>
+        <w:rPr>
+          <w:sz w:val="36"/>
+          <w:szCs w:val="36"/>
+        </w:rPr>
+      </w:pPr>
+      <w:r>
+        <w:rPr>
+          <w:rFonts w:eastAsia="Times New Roman" w:cs="Times New Roman" w:ascii="Garamond" w:hAnsi="Garamond"/>
+          <w:color w:val="000000"/>
+          <w:kern w:val="0"/>
+          <w:sz w:val="36"/>
+          <w:szCs w:val="36"/>
+          <w:shd w:fill="auto" w:val="clear"/>
+          <w:lang w:val="en-US" w:eastAsia="zh-CN" w:bidi="hi-IN"/>
+        </w:rPr>
+        <w:t xml:space="preserve">Como fica então </w:t>
+      </w:r>
+      <w:r>
+        <w:rPr>
+          <w:rFonts w:eastAsia="Times New Roman" w:cs="Times New Roman" w:ascii="Garamond" w:hAnsi="Garamond"/>
+          <w:color w:val="000000"/>
+          <w:kern w:val="0"/>
+          <w:sz w:val="36"/>
+          <w:szCs w:val="36"/>
+          <w:shd w:fill="auto" w:val="clear"/>
+          <w:lang w:val="en-US" w:eastAsia="zh-CN" w:bidi="hi-IN"/>
+        </w:rPr>
+        <w:t>[ parei aqui em 25/05/2026 para resolver problemas da contratação ]</w:t>
+      </w:r>
+    </w:p>
+    <w:p>
+      <w:pPr>
+        <w:pStyle w:val="Normal"/>
+        <w:jc w:val="both"/>
+        <w:rPr>
+          <w:sz w:val="36"/>
+          <w:szCs w:val="36"/>
+        </w:rPr>
+      </w:pPr>
+      <w:r>
+        <w:rPr>
+          <w:sz w:val="36"/>
+          <w:szCs w:val="36"/>
+        </w:rPr>
+      </w:r>
+    </w:p>
+    <w:p>
+      <w:pPr>
+        <w:pStyle w:val="Normal"/>
+        <w:jc w:val="both"/>
+        <w:rPr>
+          <w:sz w:val="36"/>
+          <w:szCs w:val="36"/>
+        </w:rPr>
+      </w:pPr>
+      <w:r>
+        <w:rPr>
+          <w:sz w:val="36"/>
+          <w:szCs w:val="36"/>
+        </w:rPr>
+      </w:r>
+    </w:p>
+    <w:p>
+      <w:pPr>
+        <w:pStyle w:val="Normal"/>
+        <w:jc w:val="both"/>
+        <w:rPr>
+          <w:sz w:val="36"/>
+          <w:szCs w:val="36"/>
+        </w:rPr>
+      </w:pPr>
+      <w:r>
+        <w:rPr>
+          <w:rFonts w:eastAsia="Times New Roman" w:cs="Times New Roman" w:ascii="Garamond" w:hAnsi="Garamond"/>
+          <w:color w:val="000000"/>
+          <w:kern w:val="0"/>
+          <w:sz w:val="36"/>
+          <w:szCs w:val="36"/>
+          <w:shd w:fill="auto" w:val="clear"/>
+          <w:lang w:val="en-US" w:eastAsia="zh-CN" w:bidi="hi-IN"/>
+        </w:rPr>
+        <w:t>O Espiritismo rejeita a ideia de penas eternas por considerá-la incompatível com a justiça e a misericórdia divinas. A alma não tem uma única existência, mas nasce e renasce inúmeras vezes. Cada nova existência é programada de acordo com os méritos adquiridos e os débitos contraídos pelo Espírito até então.</w:t>
       </w:r>
     </w:p>
     <w:p>
@@ -2756,7 +2665,15 @@
         </w:rPr>
       </w:pPr>
       <w:r>
-        <w:rPr/>
+        <w:rPr>
+          <w:rFonts w:eastAsia="Times New Roman" w:cs="Times New Roman" w:ascii="Garamond" w:hAnsi="Garamond"/>
+          <w:color w:val="000000"/>
+          <w:kern w:val="0"/>
+          <w:sz w:val="36"/>
+          <w:szCs w:val="36"/>
+          <w:shd w:fill="auto" w:val="clear"/>
+          <w:lang w:val="en-US" w:eastAsia="zh-CN" w:bidi="hi-IN"/>
+        </w:rPr>
       </w:r>
     </w:p>
     <w:p>
@@ -2795,7 +2712,15 @@
         </w:rPr>
       </w:pPr>
       <w:r>
-        <w:rPr/>
+        <w:rPr>
+          <w:rFonts w:eastAsia="Times New Roman" w:cs="Times New Roman" w:ascii="Garamond" w:hAnsi="Garamond"/>
+          <w:color w:val="000000"/>
+          <w:kern w:val="0"/>
+          <w:sz w:val="36"/>
+          <w:szCs w:val="36"/>
+          <w:shd w:fill="auto" w:val="clear"/>
+          <w:lang w:val="en-US" w:eastAsia="zh-CN" w:bidi="hi-IN"/>
+        </w:rPr>
       </w:r>
     </w:p>
     <w:p>
@@ -2852,181 +2777,121 @@
         </w:rPr>
       </w:pPr>
       <w:r>
-        <w:rPr/>
-      </w:r>
-    </w:p>
-    <w:p>
-      <w:pPr>
-        <w:pStyle w:val="Normal"/>
-        <w:jc w:val="both"/>
-        <w:rPr>
-          <w:rFonts w:ascii="Garamond" w:hAnsi="Garamond" w:eastAsia="Times New Roman" w:cs="Times New Roman"/>
-          <w:color w:val="000000"/>
-          <w:kern w:val="0"/>
-          <w:sz w:val="36"/>
-          <w:szCs w:val="36"/>
-          <w:shd w:fill="auto" w:val="clear"/>
-          <w:lang w:val="en-US" w:eastAsia="zh-CN" w:bidi="hi-IN"/>
-        </w:rPr>
-      </w:pPr>
-      <w:r>
-        <w:rPr>
-          <w:rFonts w:eastAsia="Times New Roman" w:cs="Times New Roman" w:ascii="Garamond" w:hAnsi="Garamond"/>
-          <w:color w:val="000000"/>
-          <w:kern w:val="0"/>
-          <w:sz w:val="36"/>
-          <w:szCs w:val="36"/>
-          <w:shd w:fill="auto" w:val="clear"/>
-          <w:lang w:val="en-US" w:eastAsia="zh-CN" w:bidi="hi-IN"/>
-        </w:rPr>
-        <w:t>O</w:t>
-      </w:r>
-      <w:r>
-        <w:rPr>
-          <w:rFonts w:eastAsia="Times New Roman" w:cs="Times New Roman" w:ascii="Garamond" w:hAnsi="Garamond"/>
-          <w:color w:val="000000"/>
-          <w:kern w:val="0"/>
-          <w:sz w:val="36"/>
-          <w:szCs w:val="36"/>
-          <w:shd w:fill="auto" w:val="clear"/>
-          <w:lang w:val="en-US" w:eastAsia="zh-CN" w:bidi="hi-IN"/>
-        </w:rPr>
-        <w:t xml:space="preserve"> capítulo 13 do evangelho de Mateus</w:t>
-      </w:r>
-      <w:r>
-        <w:rPr>
-          <w:rFonts w:eastAsia="Times New Roman" w:cs="Times New Roman" w:ascii="Garamond" w:hAnsi="Garamond"/>
-          <w:color w:val="000000"/>
-          <w:kern w:val="0"/>
-          <w:sz w:val="36"/>
-          <w:szCs w:val="36"/>
-          <w:shd w:fill="auto" w:val="clear"/>
-          <w:lang w:val="en-US" w:eastAsia="zh-CN" w:bidi="hi-IN"/>
-        </w:rPr>
-        <w:t xml:space="preserve"> </w:t>
-      </w:r>
-      <w:r>
-        <w:rPr>
-          <w:rFonts w:eastAsia="Times New Roman" w:cs="Times New Roman" w:ascii="Garamond" w:hAnsi="Garamond"/>
-          <w:color w:val="000000"/>
-          <w:kern w:val="0"/>
-          <w:sz w:val="36"/>
-          <w:szCs w:val="36"/>
-          <w:shd w:fill="auto" w:val="clear"/>
-          <w:lang w:val="en-US" w:eastAsia="zh-CN" w:bidi="hi-IN"/>
-        </w:rPr>
-        <w:t>é uma espécie de divisor nos ensinamentos de Jesus</w:t>
-      </w:r>
-      <w:r>
-        <w:rPr>
-          <w:rFonts w:eastAsia="Times New Roman" w:cs="Times New Roman" w:ascii="Garamond" w:hAnsi="Garamond"/>
-          <w:color w:val="000000"/>
-          <w:kern w:val="0"/>
-          <w:sz w:val="36"/>
-          <w:szCs w:val="36"/>
-          <w:shd w:fill="auto" w:val="clear"/>
-          <w:lang w:val="en-US" w:eastAsia="zh-CN" w:bidi="hi-IN"/>
-        </w:rPr>
-        <w:t xml:space="preserve">, no que diz respeito às </w:t>
-      </w:r>
-      <w:r>
-        <w:rPr>
-          <w:rFonts w:eastAsia="Times New Roman" w:cs="Times New Roman" w:ascii="Garamond" w:hAnsi="Garamond"/>
-          <w:color w:val="000000"/>
-          <w:kern w:val="0"/>
-          <w:sz w:val="36"/>
-          <w:szCs w:val="36"/>
-          <w:shd w:fill="auto" w:val="clear"/>
-          <w:lang w:val="en-US" w:eastAsia="zh-CN" w:bidi="hi-IN"/>
-        </w:rPr>
-        <w:t>parábolas.</w:t>
-      </w:r>
-    </w:p>
-    <w:p>
-      <w:pPr>
-        <w:pStyle w:val="Normal"/>
-        <w:jc w:val="both"/>
-        <w:rPr>
-          <w:rFonts w:ascii="Garamond" w:hAnsi="Garamond" w:eastAsia="Times New Roman" w:cs="Times New Roman"/>
-          <w:color w:val="000000"/>
-          <w:kern w:val="0"/>
-          <w:sz w:val="36"/>
-          <w:szCs w:val="36"/>
-          <w:shd w:fill="auto" w:val="clear"/>
-          <w:lang w:val="en-US" w:eastAsia="zh-CN" w:bidi="hi-IN"/>
-        </w:rPr>
-      </w:pPr>
-      <w:r>
-        <w:rPr/>
-      </w:r>
-    </w:p>
-    <w:p>
-      <w:pPr>
-        <w:pStyle w:val="Normal"/>
-        <w:jc w:val="both"/>
-        <w:rPr>
-          <w:rFonts w:ascii="Garamond" w:hAnsi="Garamond" w:eastAsia="Times New Roman" w:cs="Times New Roman"/>
-          <w:color w:val="000000"/>
-          <w:kern w:val="0"/>
-          <w:sz w:val="36"/>
-          <w:szCs w:val="36"/>
-          <w:shd w:fill="auto" w:val="clear"/>
-          <w:lang w:val="en-US" w:eastAsia="zh-CN" w:bidi="hi-IN"/>
-        </w:rPr>
-      </w:pPr>
-      <w:r>
-        <w:rPr>
-          <w:rFonts w:eastAsia="Times New Roman" w:cs="Times New Roman" w:ascii="Garamond" w:hAnsi="Garamond"/>
-          <w:color w:val="000000"/>
-          <w:kern w:val="0"/>
-          <w:sz w:val="36"/>
-          <w:szCs w:val="36"/>
-          <w:shd w:fill="auto" w:val="clear"/>
-          <w:lang w:val="en-US" w:eastAsia="zh-CN" w:bidi="hi-IN"/>
-        </w:rPr>
-        <w:t>Antes d</w:t>
-      </w:r>
-      <w:r>
-        <w:rPr>
-          <w:rFonts w:eastAsia="Times New Roman" w:cs="Times New Roman" w:ascii="Garamond" w:hAnsi="Garamond"/>
-          <w:color w:val="000000"/>
-          <w:kern w:val="0"/>
-          <w:sz w:val="36"/>
-          <w:szCs w:val="36"/>
-          <w:shd w:fill="auto" w:val="clear"/>
-          <w:lang w:val="en-US" w:eastAsia="zh-CN" w:bidi="hi-IN"/>
-        </w:rPr>
-        <w:t>ele</w:t>
-      </w:r>
-      <w:r>
-        <w:rPr>
-          <w:rFonts w:eastAsia="Times New Roman" w:cs="Times New Roman" w:ascii="Garamond" w:hAnsi="Garamond"/>
-          <w:color w:val="000000"/>
-          <w:kern w:val="0"/>
-          <w:sz w:val="36"/>
-          <w:szCs w:val="36"/>
-          <w:shd w:fill="auto" w:val="clear"/>
-          <w:lang w:val="en-US" w:eastAsia="zh-CN" w:bidi="hi-IN"/>
-        </w:rPr>
-        <w:t>, Jesus já havia falado por parábolas. Nós temos, por exemplo:</w:t>
-      </w:r>
-    </w:p>
-    <w:p>
-      <w:pPr>
-        <w:pStyle w:val="Normal"/>
-        <w:jc w:val="both"/>
-        <w:rPr>
-          <w:rFonts w:ascii="Garamond" w:hAnsi="Garamond" w:eastAsia="Times New Roman" w:cs="Times New Roman"/>
-          <w:color w:val="000000"/>
-          <w:kern w:val="0"/>
-          <w:sz w:val="36"/>
-          <w:szCs w:val="36"/>
-          <w:shd w:fill="auto" w:val="clear"/>
-          <w:lang w:val="en-US" w:eastAsia="zh-CN" w:bidi="hi-IN"/>
-        </w:rPr>
-      </w:pPr>
-      <w:r>
-        <w:rPr/>
+        <w:rPr>
+          <w:rFonts w:eastAsia="Times New Roman" w:cs="Times New Roman" w:ascii="Garamond" w:hAnsi="Garamond"/>
+          <w:color w:val="000000"/>
+          <w:kern w:val="0"/>
+          <w:sz w:val="36"/>
+          <w:szCs w:val="36"/>
+          <w:shd w:fill="auto" w:val="clear"/>
+          <w:lang w:val="en-US" w:eastAsia="zh-CN" w:bidi="hi-IN"/>
+        </w:rPr>
+      </w:r>
+    </w:p>
+    <w:p>
+      <w:pPr>
+        <w:pStyle w:val="Normal"/>
+        <w:jc w:val="both"/>
+        <w:rPr>
+          <w:rFonts w:ascii="Garamond" w:hAnsi="Garamond" w:eastAsia="Times New Roman" w:cs="Times New Roman"/>
+          <w:color w:val="000000"/>
+          <w:kern w:val="0"/>
+          <w:sz w:val="36"/>
+          <w:szCs w:val="36"/>
+          <w:shd w:fill="auto" w:val="clear"/>
+          <w:lang w:val="en-US" w:eastAsia="zh-CN" w:bidi="hi-IN"/>
+        </w:rPr>
+      </w:pPr>
+      <w:r>
+        <w:rPr>
+          <w:rFonts w:eastAsia="Times New Roman" w:cs="Times New Roman" w:ascii="Garamond" w:hAnsi="Garamond"/>
+          <w:color w:val="000000"/>
+          <w:kern w:val="0"/>
+          <w:sz w:val="36"/>
+          <w:szCs w:val="36"/>
+          <w:shd w:fill="auto" w:val="clear"/>
+          <w:lang w:val="en-US" w:eastAsia="zh-CN" w:bidi="hi-IN"/>
+        </w:rPr>
+        <w:t>O capítulo 13 do evangelho de Mateus é uma espécie de divisor nos ensinamentos de Jesus, no que diz respeito às parábolas.</w:t>
+      </w:r>
+    </w:p>
+    <w:p>
+      <w:pPr>
+        <w:pStyle w:val="Normal"/>
+        <w:jc w:val="both"/>
+        <w:rPr>
+          <w:rFonts w:ascii="Garamond" w:hAnsi="Garamond" w:eastAsia="Times New Roman" w:cs="Times New Roman"/>
+          <w:color w:val="000000"/>
+          <w:kern w:val="0"/>
+          <w:sz w:val="36"/>
+          <w:szCs w:val="36"/>
+          <w:shd w:fill="auto" w:val="clear"/>
+          <w:lang w:val="en-US" w:eastAsia="zh-CN" w:bidi="hi-IN"/>
+        </w:rPr>
+      </w:pPr>
+      <w:r>
+        <w:rPr>
+          <w:rFonts w:eastAsia="Times New Roman" w:cs="Times New Roman" w:ascii="Garamond" w:hAnsi="Garamond"/>
+          <w:color w:val="000000"/>
+          <w:kern w:val="0"/>
+          <w:sz w:val="36"/>
+          <w:szCs w:val="36"/>
+          <w:shd w:fill="auto" w:val="clear"/>
+          <w:lang w:val="en-US" w:eastAsia="zh-CN" w:bidi="hi-IN"/>
+        </w:rPr>
+      </w:r>
+    </w:p>
+    <w:p>
+      <w:pPr>
+        <w:pStyle w:val="Normal"/>
+        <w:jc w:val="both"/>
+        <w:rPr>
+          <w:rFonts w:ascii="Garamond" w:hAnsi="Garamond" w:eastAsia="Times New Roman" w:cs="Times New Roman"/>
+          <w:color w:val="000000"/>
+          <w:kern w:val="0"/>
+          <w:sz w:val="36"/>
+          <w:szCs w:val="36"/>
+          <w:shd w:fill="auto" w:val="clear"/>
+          <w:lang w:val="en-US" w:eastAsia="zh-CN" w:bidi="hi-IN"/>
+        </w:rPr>
+      </w:pPr>
+      <w:r>
+        <w:rPr>
+          <w:rFonts w:eastAsia="Times New Roman" w:cs="Times New Roman" w:ascii="Garamond" w:hAnsi="Garamond"/>
+          <w:color w:val="000000"/>
+          <w:kern w:val="0"/>
+          <w:sz w:val="36"/>
+          <w:szCs w:val="36"/>
+          <w:shd w:fill="auto" w:val="clear"/>
+          <w:lang w:val="en-US" w:eastAsia="zh-CN" w:bidi="hi-IN"/>
+        </w:rPr>
+        <w:t>Antes dele, Jesus já havia falado por parábolas. Nós temos, por exemplo:</w:t>
+      </w:r>
+    </w:p>
+    <w:p>
+      <w:pPr>
+        <w:pStyle w:val="Normal"/>
+        <w:jc w:val="both"/>
+        <w:rPr>
+          <w:rFonts w:ascii="Garamond" w:hAnsi="Garamond" w:eastAsia="Times New Roman" w:cs="Times New Roman"/>
+          <w:color w:val="000000"/>
+          <w:kern w:val="0"/>
+          <w:sz w:val="36"/>
+          <w:szCs w:val="36"/>
+          <w:shd w:fill="auto" w:val="clear"/>
+          <w:lang w:val="en-US" w:eastAsia="zh-CN" w:bidi="hi-IN"/>
+        </w:rPr>
+      </w:pPr>
+      <w:r>
+        <w:rPr>
+          <w:rFonts w:eastAsia="Times New Roman" w:cs="Times New Roman" w:ascii="Garamond" w:hAnsi="Garamond"/>
+          <w:color w:val="000000"/>
+          <w:kern w:val="0"/>
+          <w:sz w:val="36"/>
+          <w:szCs w:val="36"/>
+          <w:shd w:fill="auto" w:val="clear"/>
+          <w:lang w:val="en-US" w:eastAsia="zh-CN" w:bidi="hi-IN"/>
+        </w:rPr>
       </w:r>
     </w:p>
     <w:p>
@@ -3069,15 +2934,7 @@
           <w:sz w:val="36"/>
           <w:szCs w:val="36"/>
         </w:rPr>
-        <w:t>sal da terra</w:t>
-      </w:r>
-      <w:r>
-        <w:rPr>
-          <w:rFonts w:ascii="Garamond" w:hAnsi="Garamond"/>
-          <w:sz w:val="36"/>
-          <w:szCs w:val="36"/>
-        </w:rPr>
-        <w:t>;</w:t>
+        <w:t>sal da terra;</w:t>
       </w:r>
     </w:p>
     <w:p>
@@ -3199,31 +3056,7 @@
           <w:sz w:val="36"/>
           <w:szCs w:val="36"/>
         </w:rPr>
-        <w:t xml:space="preserve">a casa construída sobre a rocha e </w:t>
-      </w:r>
-      <w:r>
-        <w:rPr>
-          <w:rFonts w:ascii="Garamond" w:hAnsi="Garamond"/>
-          <w:sz w:val="36"/>
-          <w:szCs w:val="36"/>
-        </w:rPr>
-        <w:t xml:space="preserve">a casa construída </w:t>
-      </w:r>
-      <w:r>
-        <w:rPr>
-          <w:rFonts w:ascii="Garamond" w:hAnsi="Garamond"/>
-          <w:sz w:val="36"/>
-          <w:szCs w:val="36"/>
-        </w:rPr>
-        <w:t>sobre a areia</w:t>
-      </w:r>
-      <w:r>
-        <w:rPr>
-          <w:rFonts w:ascii="Garamond" w:hAnsi="Garamond"/>
-          <w:sz w:val="36"/>
-          <w:szCs w:val="36"/>
-        </w:rPr>
-        <w:t>;</w:t>
+        <w:t>a casa construída sobre a rocha e a casa construída sobre a areia;</w:t>
       </w:r>
     </w:p>
     <w:p>
@@ -3311,7 +3144,15 @@
         </w:rPr>
       </w:pPr>
       <w:r>
-        <w:rPr/>
+        <w:rPr>
+          <w:rFonts w:eastAsia="Times New Roman" w:cs="Times New Roman" w:ascii="Garamond" w:hAnsi="Garamond"/>
+          <w:color w:val="000000"/>
+          <w:kern w:val="0"/>
+          <w:sz w:val="36"/>
+          <w:szCs w:val="36"/>
+          <w:shd w:fill="auto" w:val="clear"/>
+          <w:lang w:val="en-US" w:eastAsia="zh-CN" w:bidi="hi-IN"/>
+        </w:rPr>
       </w:r>
     </w:p>
     <w:p>
@@ -3356,205 +3197,121 @@
         </w:rPr>
       </w:pPr>
       <w:r>
-        <w:rPr/>
-      </w:r>
-    </w:p>
-    <w:p>
-      <w:pPr>
-        <w:pStyle w:val="Normal"/>
-        <w:jc w:val="both"/>
-        <w:rPr>
-          <w:rFonts w:ascii="Garamond" w:hAnsi="Garamond" w:eastAsia="Times New Roman" w:cs="Times New Roman"/>
-          <w:color w:val="000000"/>
-          <w:kern w:val="0"/>
-          <w:sz w:val="36"/>
-          <w:szCs w:val="36"/>
-          <w:shd w:fill="auto" w:val="clear"/>
-          <w:lang w:val="en-US" w:eastAsia="zh-CN" w:bidi="hi-IN"/>
-        </w:rPr>
-      </w:pPr>
-      <w:r>
-        <w:rPr>
-          <w:rFonts w:eastAsia="Times New Roman" w:cs="Times New Roman" w:ascii="Garamond" w:hAnsi="Garamond"/>
-          <w:color w:val="000000"/>
-          <w:kern w:val="0"/>
-          <w:sz w:val="36"/>
-          <w:szCs w:val="36"/>
-          <w:shd w:fill="auto" w:val="clear"/>
-          <w:lang w:val="en-US" w:eastAsia="zh-CN" w:bidi="hi-IN"/>
-        </w:rPr>
-        <w:t>O</w:t>
-      </w:r>
-      <w:r>
-        <w:rPr>
-          <w:rFonts w:eastAsia="Times New Roman" w:cs="Times New Roman" w:ascii="Garamond" w:hAnsi="Garamond"/>
-          <w:color w:val="000000"/>
-          <w:kern w:val="0"/>
-          <w:sz w:val="36"/>
-          <w:szCs w:val="36"/>
-          <w:shd w:fill="auto" w:val="clear"/>
-          <w:lang w:val="en-US" w:eastAsia="zh-CN" w:bidi="hi-IN"/>
-        </w:rPr>
-        <w:t xml:space="preserve"> capítulo 13 marca uma mudança importante no modo de ensino de Jesus. A partir d</w:t>
-      </w:r>
-      <w:r>
-        <w:rPr>
-          <w:rFonts w:eastAsia="Times New Roman" w:cs="Times New Roman" w:ascii="Garamond" w:hAnsi="Garamond"/>
-          <w:color w:val="000000"/>
-          <w:kern w:val="0"/>
-          <w:sz w:val="36"/>
-          <w:szCs w:val="36"/>
-          <w:shd w:fill="auto" w:val="clear"/>
-          <w:lang w:val="en-US" w:eastAsia="zh-CN" w:bidi="hi-IN"/>
-        </w:rPr>
-        <w:t>ele, o Mestre</w:t>
-      </w:r>
-      <w:r>
-        <w:rPr>
-          <w:rFonts w:eastAsia="Times New Roman" w:cs="Times New Roman" w:ascii="Garamond" w:hAnsi="Garamond"/>
-          <w:color w:val="000000"/>
-          <w:kern w:val="0"/>
-          <w:sz w:val="36"/>
-          <w:szCs w:val="36"/>
-          <w:shd w:fill="auto" w:val="clear"/>
-          <w:lang w:val="en-US" w:eastAsia="zh-CN" w:bidi="hi-IN"/>
-        </w:rPr>
-        <w:t xml:space="preserve"> passa a ensinar intensamente por parábolas, </w:t>
-      </w:r>
-      <w:r>
-        <w:rPr>
-          <w:rFonts w:eastAsia="Times New Roman" w:cs="Times New Roman" w:ascii="Garamond" w:hAnsi="Garamond"/>
-          <w:color w:val="000000"/>
-          <w:kern w:val="0"/>
-          <w:sz w:val="36"/>
-          <w:szCs w:val="36"/>
-          <w:shd w:fill="auto" w:val="clear"/>
-          <w:lang w:val="en-US" w:eastAsia="zh-CN" w:bidi="hi-IN"/>
-        </w:rPr>
-        <w:t xml:space="preserve">e ele se utiliza de palavras tais como </w:t>
-      </w:r>
-      <w:r>
-        <w:rPr>
-          <w:rFonts w:eastAsia="Times New Roman" w:cs="Times New Roman" w:ascii="Garamond" w:hAnsi="Garamond"/>
-          <w:color w:val="000000"/>
-          <w:kern w:val="0"/>
-          <w:sz w:val="36"/>
-          <w:szCs w:val="36"/>
-          <w:shd w:fill="auto" w:val="clear"/>
-          <w:lang w:val="en-US" w:eastAsia="zh-CN" w:bidi="hi-IN"/>
-        </w:rPr>
-        <w:t xml:space="preserve"> sementes, </w:t>
-      </w:r>
-      <w:r>
-        <w:rPr>
-          <w:rFonts w:eastAsia="Times New Roman" w:cs="Times New Roman" w:ascii="Garamond" w:hAnsi="Garamond"/>
-          <w:color w:val="000000"/>
-          <w:kern w:val="0"/>
-          <w:sz w:val="36"/>
-          <w:szCs w:val="36"/>
-          <w:shd w:fill="auto" w:val="clear"/>
-          <w:lang w:val="en-US" w:eastAsia="zh-CN" w:bidi="hi-IN"/>
-        </w:rPr>
-        <w:t xml:space="preserve">plantio, </w:t>
-      </w:r>
-      <w:r>
-        <w:rPr>
-          <w:rFonts w:eastAsia="Times New Roman" w:cs="Times New Roman" w:ascii="Garamond" w:hAnsi="Garamond"/>
-          <w:color w:val="000000"/>
-          <w:kern w:val="0"/>
-          <w:sz w:val="36"/>
-          <w:szCs w:val="36"/>
-          <w:shd w:fill="auto" w:val="clear"/>
-          <w:lang w:val="en-US" w:eastAsia="zh-CN" w:bidi="hi-IN"/>
-        </w:rPr>
-        <w:t>solo, joio, árvores, colheita</w:t>
-      </w:r>
-      <w:r>
-        <w:rPr>
-          <w:rFonts w:eastAsia="Times New Roman" w:cs="Times New Roman" w:ascii="Garamond" w:hAnsi="Garamond"/>
-          <w:color w:val="000000"/>
-          <w:kern w:val="0"/>
-          <w:sz w:val="36"/>
-          <w:szCs w:val="36"/>
-          <w:shd w:fill="auto" w:val="clear"/>
-          <w:lang w:val="en-US" w:eastAsia="zh-CN" w:bidi="hi-IN"/>
-        </w:rPr>
-        <w:t>. As pessoas assimilavam com facilidade essas palavras porque o povo da Galileia era uma sociedade fortemente rural.</w:t>
-      </w:r>
-    </w:p>
-    <w:p>
-      <w:pPr>
-        <w:pStyle w:val="Normal"/>
-        <w:jc w:val="both"/>
-        <w:rPr>
-          <w:rFonts w:ascii="Garamond" w:hAnsi="Garamond" w:eastAsia="Times New Roman" w:cs="Times New Roman"/>
-          <w:color w:val="000000"/>
-          <w:kern w:val="0"/>
-          <w:sz w:val="36"/>
-          <w:szCs w:val="36"/>
-          <w:shd w:fill="auto" w:val="clear"/>
-          <w:lang w:val="en-US" w:eastAsia="zh-CN" w:bidi="hi-IN"/>
-        </w:rPr>
-      </w:pPr>
-      <w:r>
-        <w:rPr/>
-      </w:r>
-    </w:p>
-    <w:p>
-      <w:pPr>
-        <w:pStyle w:val="Normal"/>
-        <w:jc w:val="both"/>
-        <w:rPr>
-          <w:rFonts w:ascii="Garamond" w:hAnsi="Garamond" w:eastAsia="Times New Roman" w:cs="Times New Roman"/>
-          <w:color w:val="000000"/>
-          <w:kern w:val="0"/>
-          <w:sz w:val="36"/>
-          <w:szCs w:val="36"/>
-          <w:shd w:fill="auto" w:val="clear"/>
-          <w:lang w:val="en-US" w:eastAsia="zh-CN" w:bidi="hi-IN"/>
-        </w:rPr>
-      </w:pPr>
-      <w:r>
-        <w:rPr>
-          <w:rFonts w:eastAsia="Times New Roman" w:cs="Times New Roman" w:ascii="Garamond" w:hAnsi="Garamond"/>
-          <w:color w:val="000000"/>
-          <w:kern w:val="0"/>
-          <w:sz w:val="36"/>
-          <w:szCs w:val="36"/>
-          <w:shd w:fill="auto" w:val="clear"/>
-          <w:lang w:val="en-US" w:eastAsia="zh-CN" w:bidi="hi-IN"/>
-        </w:rPr>
-        <w:t>Mas por que houve essa</w:t>
-      </w:r>
-      <w:r>
-        <w:rPr>
-          <w:rFonts w:eastAsia="Times New Roman" w:cs="Times New Roman" w:ascii="Garamond" w:hAnsi="Garamond"/>
-          <w:color w:val="000000"/>
-          <w:kern w:val="0"/>
-          <w:sz w:val="36"/>
-          <w:szCs w:val="36"/>
-          <w:shd w:fill="auto" w:val="clear"/>
-          <w:lang w:val="en-US" w:eastAsia="zh-CN" w:bidi="hi-IN"/>
-        </w:rPr>
-        <w:t xml:space="preserve"> mudança? Bem, se nós analisarmos os capítulos 11 e 12, também do evangelho de Mateus, veremos que há neles uma crescente rejeição aos ensinamentos de Jesus.</w:t>
-      </w:r>
-    </w:p>
-    <w:p>
-      <w:pPr>
-        <w:pStyle w:val="Normal"/>
-        <w:jc w:val="both"/>
-        <w:rPr>
-          <w:rFonts w:ascii="Garamond" w:hAnsi="Garamond" w:eastAsia="Times New Roman" w:cs="Times New Roman"/>
-          <w:color w:val="000000"/>
-          <w:kern w:val="0"/>
-          <w:sz w:val="36"/>
-          <w:szCs w:val="36"/>
-          <w:shd w:fill="auto" w:val="clear"/>
-          <w:lang w:val="en-US" w:eastAsia="zh-CN" w:bidi="hi-IN"/>
-        </w:rPr>
-      </w:pPr>
-      <w:r>
-        <w:rPr/>
+        <w:rPr>
+          <w:rFonts w:eastAsia="Times New Roman" w:cs="Times New Roman" w:ascii="Garamond" w:hAnsi="Garamond"/>
+          <w:color w:val="000000"/>
+          <w:kern w:val="0"/>
+          <w:sz w:val="36"/>
+          <w:szCs w:val="36"/>
+          <w:shd w:fill="auto" w:val="clear"/>
+          <w:lang w:val="en-US" w:eastAsia="zh-CN" w:bidi="hi-IN"/>
+        </w:rPr>
+      </w:r>
+    </w:p>
+    <w:p>
+      <w:pPr>
+        <w:pStyle w:val="Normal"/>
+        <w:jc w:val="both"/>
+        <w:rPr>
+          <w:rFonts w:ascii="Garamond" w:hAnsi="Garamond" w:eastAsia="Times New Roman" w:cs="Times New Roman"/>
+          <w:color w:val="000000"/>
+          <w:kern w:val="0"/>
+          <w:sz w:val="36"/>
+          <w:szCs w:val="36"/>
+          <w:shd w:fill="auto" w:val="clear"/>
+          <w:lang w:val="en-US" w:eastAsia="zh-CN" w:bidi="hi-IN"/>
+        </w:rPr>
+      </w:pPr>
+      <w:r>
+        <w:rPr>
+          <w:rFonts w:eastAsia="Times New Roman" w:cs="Times New Roman" w:ascii="Garamond" w:hAnsi="Garamond"/>
+          <w:color w:val="000000"/>
+          <w:kern w:val="0"/>
+          <w:sz w:val="36"/>
+          <w:szCs w:val="36"/>
+          <w:shd w:fill="auto" w:val="clear"/>
+          <w:lang w:val="en-US" w:eastAsia="zh-CN" w:bidi="hi-IN"/>
+        </w:rPr>
+        <w:t>O capítulo 13 marca uma mudança importante no modo de ensino de Jesus. A partir dele, o Mestre passa a ensinar intensamente por parábolas, e ele se utiliza de palavras tais como  sementes, plantio, solo, joio, árvores, colheita. As pessoas assimilavam com facilidade essas palavras porque o povo da Galileia era uma sociedade fortemente rural.</w:t>
+      </w:r>
+    </w:p>
+    <w:p>
+      <w:pPr>
+        <w:pStyle w:val="Normal"/>
+        <w:jc w:val="both"/>
+        <w:rPr>
+          <w:rFonts w:ascii="Garamond" w:hAnsi="Garamond" w:eastAsia="Times New Roman" w:cs="Times New Roman"/>
+          <w:color w:val="000000"/>
+          <w:kern w:val="0"/>
+          <w:sz w:val="36"/>
+          <w:szCs w:val="36"/>
+          <w:shd w:fill="auto" w:val="clear"/>
+          <w:lang w:val="en-US" w:eastAsia="zh-CN" w:bidi="hi-IN"/>
+        </w:rPr>
+      </w:pPr>
+      <w:r>
+        <w:rPr>
+          <w:rFonts w:eastAsia="Times New Roman" w:cs="Times New Roman" w:ascii="Garamond" w:hAnsi="Garamond"/>
+          <w:color w:val="000000"/>
+          <w:kern w:val="0"/>
+          <w:sz w:val="36"/>
+          <w:szCs w:val="36"/>
+          <w:shd w:fill="auto" w:val="clear"/>
+          <w:lang w:val="en-US" w:eastAsia="zh-CN" w:bidi="hi-IN"/>
+        </w:rPr>
+      </w:r>
+    </w:p>
+    <w:p>
+      <w:pPr>
+        <w:pStyle w:val="Normal"/>
+        <w:jc w:val="both"/>
+        <w:rPr>
+          <w:rFonts w:ascii="Garamond" w:hAnsi="Garamond" w:eastAsia="Times New Roman" w:cs="Times New Roman"/>
+          <w:color w:val="000000"/>
+          <w:kern w:val="0"/>
+          <w:sz w:val="36"/>
+          <w:szCs w:val="36"/>
+          <w:shd w:fill="auto" w:val="clear"/>
+          <w:lang w:val="en-US" w:eastAsia="zh-CN" w:bidi="hi-IN"/>
+        </w:rPr>
+      </w:pPr>
+      <w:r>
+        <w:rPr>
+          <w:rFonts w:eastAsia="Times New Roman" w:cs="Times New Roman" w:ascii="Garamond" w:hAnsi="Garamond"/>
+          <w:color w:val="000000"/>
+          <w:kern w:val="0"/>
+          <w:sz w:val="36"/>
+          <w:szCs w:val="36"/>
+          <w:shd w:fill="auto" w:val="clear"/>
+          <w:lang w:val="en-US" w:eastAsia="zh-CN" w:bidi="hi-IN"/>
+        </w:rPr>
+        <w:t>Mas por que houve essa mudança? Bem, se nós analisarmos os capítulos 11 e 12, também do evangelho de Mateus, veremos que há neles uma crescente rejeição aos ensinamentos de Jesus.</w:t>
+      </w:r>
+    </w:p>
+    <w:p>
+      <w:pPr>
+        <w:pStyle w:val="Normal"/>
+        <w:jc w:val="both"/>
+        <w:rPr>
+          <w:rFonts w:ascii="Garamond" w:hAnsi="Garamond" w:eastAsia="Times New Roman" w:cs="Times New Roman"/>
+          <w:color w:val="000000"/>
+          <w:kern w:val="0"/>
+          <w:sz w:val="36"/>
+          <w:szCs w:val="36"/>
+          <w:shd w:fill="auto" w:val="clear"/>
+          <w:lang w:val="en-US" w:eastAsia="zh-CN" w:bidi="hi-IN"/>
+        </w:rPr>
+      </w:pPr>
+      <w:r>
+        <w:rPr>
+          <w:rFonts w:eastAsia="Times New Roman" w:cs="Times New Roman" w:ascii="Garamond" w:hAnsi="Garamond"/>
+          <w:color w:val="000000"/>
+          <w:kern w:val="0"/>
+          <w:sz w:val="36"/>
+          <w:szCs w:val="36"/>
+          <w:shd w:fill="auto" w:val="clear"/>
+          <w:lang w:val="en-US" w:eastAsia="zh-CN" w:bidi="hi-IN"/>
+        </w:rPr>
       </w:r>
     </w:p>
     <w:p>
@@ -3656,22 +3413,231 @@
         </w:rPr>
       </w:pPr>
       <w:r>
+        <w:rPr>
+          <w:rFonts w:eastAsia="Times New Roman" w:cs="Times New Roman" w:ascii="Garamond" w:hAnsi="Garamond"/>
+          <w:color w:val="000000"/>
+          <w:kern w:val="0"/>
+          <w:sz w:val="36"/>
+          <w:szCs w:val="36"/>
+          <w:shd w:fill="auto" w:val="clear"/>
+          <w:lang w:val="en-US" w:eastAsia="zh-CN" w:bidi="hi-IN"/>
+        </w:rPr>
+      </w:r>
+    </w:p>
+    <w:p>
+      <w:pPr>
+        <w:pStyle w:val="Normal"/>
+        <w:jc w:val="both"/>
+        <w:rPr>
+          <w:rFonts w:ascii="Garamond" w:hAnsi="Garamond" w:eastAsia="Times New Roman" w:cs="Times New Roman"/>
+          <w:color w:val="000000"/>
+          <w:kern w:val="0"/>
+          <w:sz w:val="36"/>
+          <w:szCs w:val="36"/>
+          <w:shd w:fill="auto" w:val="clear"/>
+          <w:lang w:val="en-US" w:eastAsia="zh-CN" w:bidi="hi-IN"/>
+        </w:rPr>
+      </w:pPr>
+      <w:r>
+        <w:rPr>
+          <w:rFonts w:eastAsia="Times New Roman" w:cs="Times New Roman" w:ascii="Garamond" w:hAnsi="Garamond"/>
+          <w:color w:val="000000"/>
+          <w:kern w:val="0"/>
+          <w:sz w:val="36"/>
+          <w:szCs w:val="36"/>
+          <w:shd w:fill="auto" w:val="clear"/>
+          <w:lang w:val="en-US" w:eastAsia="zh-CN" w:bidi="hi-IN"/>
+        </w:rPr>
+      </w:r>
+    </w:p>
+    <w:p>
+      <w:pPr>
+        <w:pStyle w:val="Normal"/>
+        <w:jc w:val="both"/>
+        <w:rPr>
+          <w:rFonts w:ascii="Garamond" w:hAnsi="Garamond" w:eastAsia="Times New Roman" w:cs="Times New Roman"/>
+          <w:color w:val="000000"/>
+          <w:kern w:val="0"/>
+          <w:sz w:val="36"/>
+          <w:szCs w:val="36"/>
+          <w:shd w:fill="auto" w:val="clear"/>
+          <w:lang w:val="en-US" w:eastAsia="zh-CN" w:bidi="hi-IN"/>
+        </w:rPr>
+      </w:pPr>
+      <w:r>
+        <w:rPr>
+          <w:rFonts w:eastAsia="Times New Roman" w:cs="Times New Roman" w:ascii="Garamond" w:hAnsi="Garamond"/>
+          <w:color w:val="000000"/>
+          <w:kern w:val="0"/>
+          <w:sz w:val="36"/>
+          <w:szCs w:val="36"/>
+          <w:shd w:fill="auto" w:val="clear"/>
+          <w:lang w:val="en-US" w:eastAsia="zh-CN" w:bidi="hi-IN"/>
+        </w:rPr>
+      </w:r>
+    </w:p>
+    <w:p>
+      <w:pPr>
+        <w:pStyle w:val="Normal"/>
+        <w:jc w:val="both"/>
+        <w:rPr>
+          <w:rFonts w:ascii="Garamond" w:hAnsi="Garamond" w:eastAsia="Times New Roman" w:cs="Times New Roman"/>
+          <w:color w:val="000000"/>
+          <w:kern w:val="0"/>
+          <w:sz w:val="36"/>
+          <w:szCs w:val="36"/>
+          <w:shd w:fill="auto" w:val="clear"/>
+          <w:lang w:val="en-US" w:eastAsia="zh-CN" w:bidi="hi-IN"/>
+        </w:rPr>
+      </w:pPr>
+      <w:r>
+        <w:rPr>
+          <w:rFonts w:eastAsia="Times New Roman" w:cs="Times New Roman" w:ascii="Garamond" w:hAnsi="Garamond"/>
+          <w:color w:val="000000"/>
+          <w:kern w:val="0"/>
+          <w:sz w:val="36"/>
+          <w:szCs w:val="36"/>
+          <w:shd w:fill="auto" w:val="clear"/>
+          <w:lang w:val="en-US" w:eastAsia="zh-CN" w:bidi="hi-IN"/>
+        </w:rPr>
+      </w:r>
+    </w:p>
+    <w:p>
+      <w:pPr>
+        <w:pStyle w:val="Normal"/>
+        <w:jc w:val="both"/>
+        <w:rPr>
+          <w:rFonts w:ascii="Garamond" w:hAnsi="Garamond" w:eastAsia="Times New Roman" w:cs="Times New Roman"/>
+          <w:color w:val="000000"/>
+          <w:kern w:val="0"/>
+          <w:sz w:val="36"/>
+          <w:szCs w:val="36"/>
+          <w:shd w:fill="auto" w:val="clear"/>
+          <w:lang w:val="en-US" w:eastAsia="zh-CN" w:bidi="hi-IN"/>
+        </w:rPr>
+      </w:pPr>
+      <w:r>
+        <w:rPr>
+          <w:rFonts w:eastAsia="Times New Roman" w:cs="Times New Roman" w:ascii="Garamond" w:hAnsi="Garamond"/>
+          <w:color w:val="000000"/>
+          <w:kern w:val="0"/>
+          <w:sz w:val="36"/>
+          <w:szCs w:val="36"/>
+          <w:shd w:fill="auto" w:val="clear"/>
+          <w:lang w:val="en-US" w:eastAsia="zh-CN" w:bidi="hi-IN"/>
+        </w:rPr>
+      </w:r>
+    </w:p>
+    <w:p>
+      <w:pPr>
+        <w:pStyle w:val="Normal"/>
+        <w:jc w:val="both"/>
+        <w:rPr>
+          <w:rFonts w:ascii="Garamond" w:hAnsi="Garamond" w:eastAsia="Times New Roman" w:cs="Times New Roman"/>
+          <w:color w:val="000000"/>
+          <w:kern w:val="0"/>
+          <w:sz w:val="36"/>
+          <w:szCs w:val="36"/>
+          <w:shd w:fill="auto" w:val="clear"/>
+          <w:lang w:val="en-US" w:eastAsia="zh-CN" w:bidi="hi-IN"/>
+        </w:rPr>
+      </w:pPr>
+      <w:r>
+        <w:rPr>
+          <w:rFonts w:eastAsia="Times New Roman" w:cs="Times New Roman" w:ascii="Garamond" w:hAnsi="Garamond"/>
+          <w:color w:val="000000"/>
+          <w:kern w:val="0"/>
+          <w:sz w:val="36"/>
+          <w:szCs w:val="36"/>
+          <w:shd w:fill="auto" w:val="clear"/>
+          <w:lang w:val="en-US" w:eastAsia="zh-CN" w:bidi="hi-IN"/>
+        </w:rPr>
+      </w:r>
+    </w:p>
+    <w:p>
+      <w:pPr>
+        <w:pStyle w:val="Normal"/>
+        <w:jc w:val="both"/>
+        <w:rPr>
+          <w:rFonts w:ascii="Garamond" w:hAnsi="Garamond" w:eastAsia="Times New Roman" w:cs="Times New Roman"/>
+          <w:color w:val="000000"/>
+          <w:kern w:val="0"/>
+          <w:sz w:val="36"/>
+          <w:szCs w:val="36"/>
+          <w:shd w:fill="auto" w:val="clear"/>
+          <w:lang w:val="en-US" w:eastAsia="zh-CN" w:bidi="hi-IN"/>
+        </w:rPr>
+      </w:pPr>
+      <w:r>
+        <w:rPr>
+          <w:rFonts w:eastAsia="Times New Roman" w:cs="Times New Roman" w:ascii="Garamond" w:hAnsi="Garamond"/>
+          <w:color w:val="000000"/>
+          <w:kern w:val="0"/>
+          <w:sz w:val="36"/>
+          <w:szCs w:val="36"/>
+          <w:shd w:fill="auto" w:val="clear"/>
+          <w:lang w:val="en-US" w:eastAsia="zh-CN" w:bidi="hi-IN"/>
+        </w:rPr>
+      </w:r>
+    </w:p>
+    <w:p>
+      <w:pPr>
+        <w:pStyle w:val="Normal"/>
+        <w:jc w:val="both"/>
+        <w:rPr>
+          <w:rFonts w:ascii="Garamond" w:hAnsi="Garamond" w:eastAsia="Times New Roman" w:cs="Times New Roman"/>
+          <w:color w:val="000000"/>
+          <w:kern w:val="0"/>
+          <w:sz w:val="36"/>
+          <w:szCs w:val="36"/>
+          <w:shd w:fill="auto" w:val="clear"/>
+          <w:lang w:val="en-US" w:eastAsia="zh-CN" w:bidi="hi-IN"/>
+        </w:rPr>
+      </w:pPr>
+      <w:r>
+        <w:rPr>
+          <w:rFonts w:eastAsia="Times New Roman" w:cs="Times New Roman" w:ascii="Garamond" w:hAnsi="Garamond"/>
+          <w:color w:val="000000"/>
+          <w:kern w:val="0"/>
+          <w:sz w:val="36"/>
+          <w:szCs w:val="36"/>
+          <w:shd w:fill="auto" w:val="clear"/>
+          <w:lang w:val="en-US" w:eastAsia="zh-CN" w:bidi="hi-IN"/>
+        </w:rPr>
+        <w:t>ensinamentos de Jesus.</w:t>
+      </w:r>
+    </w:p>
+    <w:p>
+      <w:pPr>
+        <w:pStyle w:val="Normal"/>
+        <w:jc w:val="both"/>
+        <w:rPr>
+          <w:rFonts w:ascii="Garamond" w:hAnsi="Garamond" w:eastAsia="Times New Roman" w:cs="Times New Roman"/>
+          <w:color w:val="000000"/>
+          <w:kern w:val="0"/>
+          <w:sz w:val="36"/>
+          <w:szCs w:val="36"/>
+          <w:shd w:fill="auto" w:val="clear"/>
+          <w:lang w:val="en-US" w:eastAsia="zh-CN" w:bidi="hi-IN"/>
+        </w:rPr>
+      </w:pPr>
+      <w:r>
+        <w:rPr>
+          <w:rFonts w:eastAsia="Times New Roman" w:cs="Times New Roman" w:ascii="Garamond" w:hAnsi="Garamond"/>
+          <w:color w:val="000000"/>
+          <w:kern w:val="0"/>
+          <w:sz w:val="36"/>
+          <w:szCs w:val="36"/>
+          <w:shd w:fill="auto" w:val="clear"/>
+          <w:lang w:val="en-US" w:eastAsia="zh-CN" w:bidi="hi-IN"/>
+        </w:rPr>
+      </w:r>
+    </w:p>
+    <w:p>
+      <w:pPr>
+        <w:pStyle w:val="Normal"/>
+        <w:jc w:val="both"/>
         <w:rPr/>
-      </w:r>
-    </w:p>
-    <w:p>
-      <w:pPr>
-        <w:pStyle w:val="Normal"/>
-        <w:jc w:val="both"/>
-        <w:rPr>
-          <w:rFonts w:ascii="Garamond" w:hAnsi="Garamond" w:eastAsia="Times New Roman" w:cs="Times New Roman"/>
-          <w:color w:val="000000"/>
-          <w:kern w:val="0"/>
-          <w:sz w:val="36"/>
-          <w:szCs w:val="36"/>
-          <w:shd w:fill="auto" w:val="clear"/>
-          <w:lang w:val="en-US" w:eastAsia="zh-CN" w:bidi="hi-IN"/>
-        </w:rPr>
       </w:pPr>
       <w:r>
         <w:rPr/>
@@ -3692,152 +3658,15 @@
         </w:rPr>
       </w:pPr>
       <w:r>
-        <w:rPr/>
-      </w:r>
-    </w:p>
-    <w:p>
-      <w:pPr>
-        <w:pStyle w:val="Normal"/>
-        <w:jc w:val="both"/>
-        <w:rPr>
-          <w:rFonts w:ascii="Garamond" w:hAnsi="Garamond" w:eastAsia="Times New Roman" w:cs="Times New Roman"/>
-          <w:color w:val="000000"/>
-          <w:kern w:val="0"/>
-          <w:sz w:val="36"/>
-          <w:szCs w:val="36"/>
-          <w:shd w:fill="auto" w:val="clear"/>
-          <w:lang w:val="en-US" w:eastAsia="zh-CN" w:bidi="hi-IN"/>
-        </w:rPr>
-      </w:pPr>
-      <w:r>
-        <w:rPr/>
-      </w:r>
-    </w:p>
-    <w:p>
-      <w:pPr>
-        <w:pStyle w:val="Normal"/>
-        <w:jc w:val="both"/>
-        <w:rPr>
-          <w:rFonts w:ascii="Garamond" w:hAnsi="Garamond" w:eastAsia="Times New Roman" w:cs="Times New Roman"/>
-          <w:color w:val="000000"/>
-          <w:kern w:val="0"/>
-          <w:sz w:val="36"/>
-          <w:szCs w:val="36"/>
-          <w:shd w:fill="auto" w:val="clear"/>
-          <w:lang w:val="en-US" w:eastAsia="zh-CN" w:bidi="hi-IN"/>
-        </w:rPr>
-      </w:pPr>
-      <w:r>
-        <w:rPr/>
-      </w:r>
-    </w:p>
-    <w:p>
-      <w:pPr>
-        <w:pStyle w:val="Normal"/>
-        <w:jc w:val="both"/>
-        <w:rPr>
-          <w:rFonts w:ascii="Garamond" w:hAnsi="Garamond" w:eastAsia="Times New Roman" w:cs="Times New Roman"/>
-          <w:color w:val="000000"/>
-          <w:kern w:val="0"/>
-          <w:sz w:val="36"/>
-          <w:szCs w:val="36"/>
-          <w:shd w:fill="auto" w:val="clear"/>
-          <w:lang w:val="en-US" w:eastAsia="zh-CN" w:bidi="hi-IN"/>
-        </w:rPr>
-      </w:pPr>
-      <w:r>
-        <w:rPr/>
-      </w:r>
-    </w:p>
-    <w:p>
-      <w:pPr>
-        <w:pStyle w:val="Normal"/>
-        <w:jc w:val="both"/>
-        <w:rPr>
-          <w:rFonts w:ascii="Garamond" w:hAnsi="Garamond" w:eastAsia="Times New Roman" w:cs="Times New Roman"/>
-          <w:color w:val="000000"/>
-          <w:kern w:val="0"/>
-          <w:sz w:val="36"/>
-          <w:szCs w:val="36"/>
-          <w:shd w:fill="auto" w:val="clear"/>
-          <w:lang w:val="en-US" w:eastAsia="zh-CN" w:bidi="hi-IN"/>
-        </w:rPr>
-      </w:pPr>
-      <w:r>
-        <w:rPr/>
-      </w:r>
-    </w:p>
-    <w:p>
-      <w:pPr>
-        <w:pStyle w:val="Normal"/>
-        <w:jc w:val="both"/>
-        <w:rPr>
-          <w:rFonts w:ascii="Garamond" w:hAnsi="Garamond" w:eastAsia="Times New Roman" w:cs="Times New Roman"/>
-          <w:color w:val="000000"/>
-          <w:kern w:val="0"/>
-          <w:sz w:val="36"/>
-          <w:szCs w:val="36"/>
-          <w:shd w:fill="auto" w:val="clear"/>
-          <w:lang w:val="en-US" w:eastAsia="zh-CN" w:bidi="hi-IN"/>
-        </w:rPr>
-      </w:pPr>
-      <w:r>
-        <w:rPr>
-          <w:rFonts w:eastAsia="Times New Roman" w:cs="Times New Roman" w:ascii="Garamond" w:hAnsi="Garamond"/>
-          <w:color w:val="000000"/>
-          <w:kern w:val="0"/>
-          <w:sz w:val="36"/>
-          <w:szCs w:val="36"/>
-          <w:shd w:fill="auto" w:val="clear"/>
-          <w:lang w:val="en-US" w:eastAsia="zh-CN" w:bidi="hi-IN"/>
-        </w:rPr>
-        <w:t>ensinamentos de Jesus.</w:t>
-      </w:r>
-    </w:p>
-    <w:p>
-      <w:pPr>
-        <w:pStyle w:val="Normal"/>
-        <w:jc w:val="both"/>
-        <w:rPr>
-          <w:rFonts w:ascii="Garamond" w:hAnsi="Garamond" w:eastAsia="Times New Roman" w:cs="Times New Roman"/>
-          <w:color w:val="000000"/>
-          <w:kern w:val="0"/>
-          <w:sz w:val="36"/>
-          <w:szCs w:val="36"/>
-          <w:shd w:fill="auto" w:val="clear"/>
-          <w:lang w:val="en-US" w:eastAsia="zh-CN" w:bidi="hi-IN"/>
-        </w:rPr>
-      </w:pPr>
-      <w:r>
-        <w:rPr/>
-      </w:r>
-    </w:p>
-    <w:p>
-      <w:pPr>
-        <w:pStyle w:val="Normal"/>
-        <w:jc w:val="both"/>
-        <w:rPr/>
-      </w:pPr>
-      <w:r>
-        <w:rPr/>
-      </w:r>
-    </w:p>
-    <w:p>
-      <w:pPr>
-        <w:pStyle w:val="Normal"/>
-        <w:jc w:val="both"/>
-        <w:rPr>
-          <w:rFonts w:ascii="Garamond" w:hAnsi="Garamond" w:eastAsia="Times New Roman" w:cs="Times New Roman"/>
-          <w:color w:val="000000"/>
-          <w:kern w:val="0"/>
-          <w:sz w:val="36"/>
-          <w:szCs w:val="36"/>
-          <w:shd w:fill="auto" w:val="clear"/>
-          <w:lang w:val="en-US" w:eastAsia="zh-CN" w:bidi="hi-IN"/>
-        </w:rPr>
-      </w:pPr>
-      <w:r>
-        <w:rPr/>
+        <w:rPr>
+          <w:rFonts w:eastAsia="Times New Roman" w:cs="Times New Roman" w:ascii="Garamond" w:hAnsi="Garamond"/>
+          <w:color w:val="000000"/>
+          <w:kern w:val="0"/>
+          <w:sz w:val="36"/>
+          <w:szCs w:val="36"/>
+          <w:shd w:fill="auto" w:val="clear"/>
+          <w:lang w:val="en-US" w:eastAsia="zh-CN" w:bidi="hi-IN"/>
+        </w:rPr>
       </w:r>
     </w:p>
     <w:p>
@@ -4199,19 +4028,7 @@
           <w:shd w:fill="auto" w:val="clear"/>
           <w:lang w:val="en-US" w:eastAsia="zh-CN" w:bidi="hi-IN"/>
         </w:rPr>
-        <w:t>Esta é a única parábola de Jesus que é explicada  pelo próprio Mestre</w:t>
-      </w:r>
-      <w:r>
-        <w:rPr>
-          <w:rFonts w:eastAsia="Times New Roman" w:cs="Times New Roman" w:ascii="Garamond" w:hAnsi="Garamond"/>
-          <w:color w:val="000000"/>
-          <w:kern w:val="0"/>
-          <w:sz w:val="36"/>
-          <w:szCs w:val="36"/>
-          <w:shd w:fill="auto" w:val="clear"/>
-          <w:lang w:val="en-US" w:eastAsia="zh-CN" w:bidi="hi-IN"/>
-        </w:rPr>
-        <w:t xml:space="preserve"> [ Errado: a parábola do semeador também é explicada por Jesus ]</w:t>
+        <w:t>Esta é a única parábola de Jesus que é explicada  pelo próprio Mestre [ Errado: a parábola do semeador também é explicada por Jesus ]</w:t>
       </w:r>
     </w:p>
     <w:p>
@@ -4541,7 +4358,7 @@
         <w:bCs/>
         <w:rFonts w:ascii="Garamond" w:hAnsi="Garamond"/>
       </w:rPr>
-      <w:t>24</w:t>
+      <w:t>23</w:t>
     </w:r>
     <w:r>
       <w:rPr>

</xml_diff>

<commit_message>
26/05/2026 - 18:20 h
</commit_message>
<xml_diff>
--- a/O joio e o trigo, o mal e o bem/O joio e o trigo.docx
+++ b/O joio e o trigo, o mal e o bem/O joio e o trigo.docx
@@ -127,69 +127,331 @@
           <w:shd w:fill="auto" w:val="clear"/>
           <w:lang w:val="en-US" w:eastAsia="zh-CN" w:bidi="hi-IN"/>
         </w:rPr>
-        <w:t>Mas o</w:t>
-      </w:r>
-      <w:r>
-        <w:rPr>
-          <w:rFonts w:eastAsia="Times New Roman" w:cs="Times New Roman" w:ascii="Garamond" w:hAnsi="Garamond"/>
-          <w:color w:val="000000"/>
-          <w:kern w:val="0"/>
-          <w:sz w:val="36"/>
-          <w:szCs w:val="36"/>
-          <w:shd w:fill="auto" w:val="clear"/>
-          <w:lang w:val="en-US" w:eastAsia="zh-CN" w:bidi="hi-IN"/>
-        </w:rPr>
-        <w:t xml:space="preserve"> que é um dogma? No sentido religioso, um dogma é uma verdade considerada oficialmente revelada por Deus e aceita como obrigatória dentro de uma determinada tradição religiosa. É uma verdade imposta; os seguidores daquela religião não têm o direito de contestar um dogma.</w:t>
-      </w:r>
-    </w:p>
-    <w:p>
-      <w:pPr>
-        <w:pStyle w:val="Normal"/>
-        <w:jc w:val="both"/>
-        <w:rPr>
-          <w:sz w:val="36"/>
-          <w:szCs w:val="36"/>
-        </w:rPr>
-      </w:pPr>
-      <w:r>
-        <w:rPr>
-          <w:sz w:val="36"/>
-          <w:szCs w:val="36"/>
-        </w:rPr>
-      </w:r>
-    </w:p>
-    <w:p>
-      <w:pPr>
-        <w:pStyle w:val="Normal"/>
-        <w:jc w:val="both"/>
-        <w:rPr>
-          <w:sz w:val="36"/>
-          <w:szCs w:val="36"/>
-        </w:rPr>
-      </w:pPr>
-      <w:r>
-        <w:rPr>
-          <w:rFonts w:eastAsia="Times New Roman" w:cs="Times New Roman" w:ascii="Garamond" w:hAnsi="Garamond"/>
-          <w:color w:val="000000"/>
-          <w:kern w:val="0"/>
-          <w:sz w:val="36"/>
-          <w:szCs w:val="36"/>
-          <w:shd w:fill="auto" w:val="clear"/>
-          <w:lang w:val="en-US" w:eastAsia="zh-CN" w:bidi="hi-IN"/>
-        </w:rPr>
-        <w:t>Um</w:t>
-      </w:r>
-      <w:r>
-        <w:rPr>
-          <w:rFonts w:eastAsia="Times New Roman" w:cs="Times New Roman" w:ascii="Garamond" w:hAnsi="Garamond"/>
-          <w:color w:val="000000"/>
-          <w:kern w:val="0"/>
-          <w:sz w:val="36"/>
-          <w:szCs w:val="36"/>
-          <w:shd w:fill="auto" w:val="clear"/>
-          <w:lang w:val="en-US" w:eastAsia="zh-CN" w:bidi="hi-IN"/>
-        </w:rPr>
-        <w:t xml:space="preserve"> exemplo é</w:t>
+        <w:t xml:space="preserve">Mas o que é um dogma? No sentido religioso, um dogma é uma verdade considerada oficialmente revelada por Deus e aceita como obrigatória dentro de uma determinada tradição religiosa. É uma verdade imposta; os seguidores daquela religião não têm o direito de </w:t>
+      </w:r>
+      <w:r>
+        <w:rPr>
+          <w:rFonts w:eastAsia="Times New Roman" w:cs="Times New Roman" w:ascii="Garamond" w:hAnsi="Garamond"/>
+          <w:color w:val="000000"/>
+          <w:kern w:val="0"/>
+          <w:sz w:val="36"/>
+          <w:szCs w:val="36"/>
+          <w:shd w:fill="auto" w:val="clear"/>
+          <w:lang w:val="en-US" w:eastAsia="zh-CN" w:bidi="hi-IN"/>
+        </w:rPr>
+        <w:t>questionar</w:t>
+      </w:r>
+      <w:r>
+        <w:rPr>
+          <w:rFonts w:eastAsia="Times New Roman" w:cs="Times New Roman" w:ascii="Garamond" w:hAnsi="Garamond"/>
+          <w:color w:val="000000"/>
+          <w:kern w:val="0"/>
+          <w:sz w:val="36"/>
+          <w:szCs w:val="36"/>
+          <w:shd w:fill="auto" w:val="clear"/>
+          <w:lang w:val="en-US" w:eastAsia="zh-CN" w:bidi="hi-IN"/>
+        </w:rPr>
+        <w:t xml:space="preserve"> um dogma.</w:t>
+      </w:r>
+    </w:p>
+    <w:p>
+      <w:pPr>
+        <w:pStyle w:val="Normal"/>
+        <w:jc w:val="both"/>
+        <w:rPr>
+          <w:sz w:val="36"/>
+          <w:szCs w:val="36"/>
+        </w:rPr>
+      </w:pPr>
+      <w:r>
+        <w:rPr>
+          <w:sz w:val="36"/>
+          <w:szCs w:val="36"/>
+        </w:rPr>
+      </w:r>
+    </w:p>
+    <w:p>
+      <w:pPr>
+        <w:pStyle w:val="Normal"/>
+        <w:jc w:val="both"/>
+        <w:rPr>
+          <w:sz w:val="36"/>
+          <w:szCs w:val="36"/>
+        </w:rPr>
+      </w:pPr>
+      <w:r>
+        <w:rPr>
+          <w:rFonts w:eastAsia="Times New Roman" w:cs="Times New Roman" w:ascii="Garamond" w:hAnsi="Garamond"/>
+          <w:color w:val="000000"/>
+          <w:kern w:val="0"/>
+          <w:sz w:val="36"/>
+          <w:szCs w:val="36"/>
+          <w:shd w:fill="auto" w:val="clear"/>
+          <w:lang w:val="en-US" w:eastAsia="zh-CN" w:bidi="hi-IN"/>
+        </w:rPr>
+        <w:t xml:space="preserve">Um exemplo é o dogma das penas eternas. Ele estabelece que, após uma única existência terrena, a alma recebe um destino definitivo: felicidade eterna no céu ou sofrimento eterno no inferno. </w:t>
+      </w:r>
+    </w:p>
+    <w:p>
+      <w:pPr>
+        <w:pStyle w:val="Normal"/>
+        <w:jc w:val="both"/>
+        <w:rPr>
+          <w:sz w:val="36"/>
+          <w:szCs w:val="36"/>
+        </w:rPr>
+      </w:pPr>
+      <w:r>
+        <w:rPr>
+          <w:sz w:val="36"/>
+          <w:szCs w:val="36"/>
+        </w:rPr>
+      </w:r>
+    </w:p>
+    <w:p>
+      <w:pPr>
+        <w:pStyle w:val="Normal"/>
+        <w:jc w:val="both"/>
+        <w:rPr>
+          <w:sz w:val="36"/>
+          <w:szCs w:val="36"/>
+        </w:rPr>
+      </w:pPr>
+      <w:r>
+        <w:rPr>
+          <w:rFonts w:eastAsia="Times New Roman" w:cs="Times New Roman" w:ascii="Garamond" w:hAnsi="Garamond"/>
+          <w:color w:val="000000"/>
+          <w:kern w:val="0"/>
+          <w:sz w:val="36"/>
+          <w:szCs w:val="36"/>
+          <w:shd w:fill="auto" w:val="clear"/>
+          <w:lang w:val="en-US" w:eastAsia="zh-CN" w:bidi="hi-IN"/>
+        </w:rPr>
+        <w:t xml:space="preserve">O que determina esse destino é a maneira como </w:t>
+      </w:r>
+      <w:r>
+        <w:rPr>
+          <w:rFonts w:eastAsia="Times New Roman" w:cs="Times New Roman" w:ascii="Garamond" w:hAnsi="Garamond"/>
+          <w:color w:val="000000"/>
+          <w:kern w:val="0"/>
+          <w:sz w:val="36"/>
+          <w:szCs w:val="36"/>
+          <w:shd w:fill="auto" w:val="clear"/>
+          <w:lang w:val="en-US" w:eastAsia="zh-CN" w:bidi="hi-IN"/>
+        </w:rPr>
+        <w:t>a</w:t>
+      </w:r>
+      <w:r>
+        <w:rPr>
+          <w:rFonts w:eastAsia="Times New Roman" w:cs="Times New Roman" w:ascii="Garamond" w:hAnsi="Garamond"/>
+          <w:color w:val="000000"/>
+          <w:kern w:val="0"/>
+          <w:sz w:val="36"/>
+          <w:szCs w:val="36"/>
+          <w:shd w:fill="auto" w:val="clear"/>
+          <w:lang w:val="en-US" w:eastAsia="zh-CN" w:bidi="hi-IN"/>
+        </w:rPr>
+        <w:t xml:space="preserve"> alma conduziu sua existência única: se fez o bem, irá para o céu; se fez o mal, irá para o inferno.</w:t>
+      </w:r>
+    </w:p>
+    <w:p>
+      <w:pPr>
+        <w:pStyle w:val="Normal"/>
+        <w:jc w:val="both"/>
+        <w:rPr>
+          <w:sz w:val="36"/>
+          <w:szCs w:val="36"/>
+        </w:rPr>
+      </w:pPr>
+      <w:r>
+        <w:rPr>
+          <w:sz w:val="36"/>
+          <w:szCs w:val="36"/>
+        </w:rPr>
+      </w:r>
+      <w:r>
+        <w:br w:type="page"/>
+      </w:r>
+    </w:p>
+    <w:p>
+      <w:pPr>
+        <w:pStyle w:val="Normal"/>
+        <w:jc w:val="both"/>
+        <w:rPr>
+          <w:sz w:val="36"/>
+          <w:szCs w:val="36"/>
+        </w:rPr>
+      </w:pPr>
+      <w:r>
+        <w:rPr>
+          <w:rFonts w:eastAsia="Times New Roman" w:cs="Times New Roman" w:ascii="Garamond" w:hAnsi="Garamond"/>
+          <w:color w:val="000000"/>
+          <w:kern w:val="0"/>
+          <w:sz w:val="36"/>
+          <w:szCs w:val="36"/>
+          <w:shd w:fill="auto" w:val="clear"/>
+          <w:lang w:val="en-US" w:eastAsia="zh-CN" w:bidi="hi-IN"/>
+        </w:rPr>
+        <w:t xml:space="preserve">E o que é a fé raciocinada? Como o próprio nome sugere, é a fé construída através do raciocínio, do bom senso, do sentimento de justiça e até da lógica. Em outras palavras: quando eu creio em algo, eu sei </w:t>
+      </w:r>
+      <w:r>
+        <w:rPr>
+          <w:rFonts w:eastAsia="Times New Roman" w:cs="Times New Roman" w:ascii="Garamond" w:hAnsi="Garamond"/>
+          <w:color w:val="000000"/>
+          <w:kern w:val="0"/>
+          <w:sz w:val="36"/>
+          <w:szCs w:val="36"/>
+          <w:shd w:fill="auto" w:val="clear"/>
+          <w:lang w:val="en-US" w:eastAsia="zh-CN" w:bidi="hi-IN"/>
+        </w:rPr>
+        <w:t>a razão pela qual eu</w:t>
+      </w:r>
+      <w:r>
+        <w:rPr>
+          <w:rFonts w:eastAsia="Times New Roman" w:cs="Times New Roman" w:ascii="Garamond" w:hAnsi="Garamond"/>
+          <w:color w:val="000000"/>
+          <w:kern w:val="0"/>
+          <w:sz w:val="36"/>
+          <w:szCs w:val="36"/>
+          <w:shd w:fill="auto" w:val="clear"/>
+          <w:lang w:val="en-US" w:eastAsia="zh-CN" w:bidi="hi-IN"/>
+        </w:rPr>
+        <w:t xml:space="preserve"> creio naquilo. </w:t>
+      </w:r>
+    </w:p>
+    <w:p>
+      <w:pPr>
+        <w:pStyle w:val="Normal"/>
+        <w:jc w:val="both"/>
+        <w:rPr>
+          <w:sz w:val="36"/>
+          <w:szCs w:val="36"/>
+        </w:rPr>
+      </w:pPr>
+      <w:r>
+        <w:rPr>
+          <w:sz w:val="36"/>
+          <w:szCs w:val="36"/>
+        </w:rPr>
+      </w:r>
+    </w:p>
+    <w:p>
+      <w:pPr>
+        <w:pStyle w:val="TextBody"/>
+        <w:jc w:val="both"/>
+        <w:rPr>
+          <w:sz w:val="36"/>
+          <w:szCs w:val="36"/>
+        </w:rPr>
+      </w:pPr>
+      <w:r>
+        <w:rPr>
+          <w:rFonts w:eastAsia="Times New Roman" w:cs="Times New Roman" w:ascii="Garamond" w:hAnsi="Garamond"/>
+          <w:color w:val="000000"/>
+          <w:kern w:val="0"/>
+          <w:sz w:val="36"/>
+          <w:szCs w:val="36"/>
+          <w:shd w:fill="auto" w:val="clear"/>
+          <w:lang w:val="en-US" w:eastAsia="zh-CN" w:bidi="hi-IN"/>
+        </w:rPr>
+        <w:t>Com a fé raciocinada, não há imposição de ideias. O que existe é um ensinamento que me foi apresentado, sobre o qual refleti, raciocinei e analisei cuidadosamente, até concluir que realmente faz sentido acreditar nele.</w:t>
+      </w:r>
+    </w:p>
+    <w:p>
+      <w:pPr>
+        <w:pStyle w:val="Normal"/>
+        <w:jc w:val="both"/>
+        <w:rPr>
+          <w:sz w:val="36"/>
+          <w:szCs w:val="36"/>
+        </w:rPr>
+      </w:pPr>
+      <w:r>
+        <w:rPr/>
+      </w:r>
+    </w:p>
+    <w:p>
+      <w:pPr>
+        <w:pStyle w:val="Normal"/>
+        <w:jc w:val="both"/>
+        <w:rPr>
+          <w:sz w:val="36"/>
+          <w:szCs w:val="36"/>
+        </w:rPr>
+      </w:pPr>
+      <w:r>
+        <w:rPr>
+          <w:rFonts w:eastAsia="Times New Roman" w:cs="Times New Roman" w:ascii="Garamond" w:hAnsi="Garamond"/>
+          <w:color w:val="000000"/>
+          <w:kern w:val="0"/>
+          <w:sz w:val="36"/>
+          <w:szCs w:val="36"/>
+          <w:shd w:fill="auto" w:val="clear"/>
+          <w:lang w:val="en-US" w:eastAsia="zh-CN" w:bidi="hi-IN"/>
+        </w:rPr>
+        <w:t>Como a Doutrina Espírita interpreta a questão das penas eternas?</w:t>
+      </w:r>
+    </w:p>
+    <w:p>
+      <w:pPr>
+        <w:pStyle w:val="Normal"/>
+        <w:jc w:val="both"/>
+        <w:rPr>
+          <w:sz w:val="36"/>
+          <w:szCs w:val="36"/>
+        </w:rPr>
+      </w:pPr>
+      <w:r>
+        <w:rPr>
+          <w:sz w:val="36"/>
+          <w:szCs w:val="36"/>
+        </w:rPr>
+      </w:r>
+    </w:p>
+    <w:p>
+      <w:pPr>
+        <w:pStyle w:val="Normal"/>
+        <w:jc w:val="both"/>
+        <w:rPr>
+          <w:sz w:val="36"/>
+          <w:szCs w:val="36"/>
+        </w:rPr>
+      </w:pPr>
+      <w:r>
+        <w:rPr>
+          <w:rFonts w:eastAsia="Times New Roman" w:cs="Times New Roman" w:ascii="Garamond" w:hAnsi="Garamond"/>
+          <w:color w:val="000000"/>
+          <w:kern w:val="0"/>
+          <w:sz w:val="36"/>
+          <w:szCs w:val="36"/>
+          <w:shd w:fill="auto" w:val="clear"/>
+          <w:lang w:val="en-US" w:eastAsia="zh-CN" w:bidi="hi-IN"/>
+        </w:rPr>
+        <w:t xml:space="preserve">O Espiritismo rejeita </w:t>
+      </w:r>
+      <w:r>
+        <w:rPr>
+          <w:rFonts w:eastAsia="Times New Roman" w:cs="Times New Roman" w:ascii="Garamond" w:hAnsi="Garamond"/>
+          <w:color w:val="000000"/>
+          <w:kern w:val="0"/>
+          <w:sz w:val="36"/>
+          <w:szCs w:val="36"/>
+          <w:shd w:fill="auto" w:val="clear"/>
+          <w:lang w:val="en-US" w:eastAsia="zh-CN" w:bidi="hi-IN"/>
+        </w:rPr>
+        <w:t>ess</w:t>
+      </w:r>
+      <w:r>
+        <w:rPr>
+          <w:rFonts w:eastAsia="Times New Roman" w:cs="Times New Roman" w:ascii="Garamond" w:hAnsi="Garamond"/>
+          <w:color w:val="000000"/>
+          <w:kern w:val="0"/>
+          <w:sz w:val="36"/>
+          <w:szCs w:val="36"/>
+          <w:shd w:fill="auto" w:val="clear"/>
+          <w:lang w:val="en-US" w:eastAsia="zh-CN" w:bidi="hi-IN"/>
+        </w:rPr>
+        <w:t>a ideia</w:t>
       </w:r>
       <w:r>
         <w:rPr>
@@ -213,154 +475,543 @@
           <w:shd w:fill="auto" w:val="clear"/>
           <w:lang w:val="en-US" w:eastAsia="zh-CN" w:bidi="hi-IN"/>
         </w:rPr>
-        <w:t xml:space="preserve">o dogma das penas eternas. Ele </w:t>
-      </w:r>
-      <w:r>
-        <w:rPr>
-          <w:rFonts w:eastAsia="Times New Roman" w:cs="Times New Roman" w:ascii="Garamond" w:hAnsi="Garamond"/>
-          <w:color w:val="000000"/>
-          <w:kern w:val="0"/>
-          <w:sz w:val="36"/>
-          <w:szCs w:val="36"/>
-          <w:shd w:fill="auto" w:val="clear"/>
-          <w:lang w:val="en-US" w:eastAsia="zh-CN" w:bidi="hi-IN"/>
-        </w:rPr>
-        <w:t>estabelece</w:t>
-      </w:r>
-      <w:r>
-        <w:rPr>
-          <w:rFonts w:eastAsia="Times New Roman" w:cs="Times New Roman" w:ascii="Garamond" w:hAnsi="Garamond"/>
-          <w:color w:val="000000"/>
-          <w:kern w:val="0"/>
-          <w:sz w:val="36"/>
-          <w:szCs w:val="36"/>
-          <w:shd w:fill="auto" w:val="clear"/>
-          <w:lang w:val="en-US" w:eastAsia="zh-CN" w:bidi="hi-IN"/>
-        </w:rPr>
-        <w:t xml:space="preserve"> que</w:t>
-      </w:r>
-      <w:r>
-        <w:rPr>
-          <w:rFonts w:eastAsia="Times New Roman" w:cs="Times New Roman" w:ascii="Garamond" w:hAnsi="Garamond"/>
-          <w:color w:val="000000"/>
-          <w:kern w:val="0"/>
-          <w:sz w:val="36"/>
-          <w:szCs w:val="36"/>
-          <w:shd w:fill="auto" w:val="clear"/>
-          <w:lang w:val="en-US" w:eastAsia="zh-CN" w:bidi="hi-IN"/>
-        </w:rPr>
-        <w:t>,</w:t>
-      </w:r>
-      <w:r>
-        <w:rPr>
-          <w:rFonts w:eastAsia="Times New Roman" w:cs="Times New Roman" w:ascii="Garamond" w:hAnsi="Garamond"/>
-          <w:color w:val="000000"/>
-          <w:kern w:val="0"/>
-          <w:sz w:val="36"/>
-          <w:szCs w:val="36"/>
-          <w:shd w:fill="auto" w:val="clear"/>
-          <w:lang w:val="en-US" w:eastAsia="zh-CN" w:bidi="hi-IN"/>
-        </w:rPr>
-        <w:t xml:space="preserve"> após uma única existência terrena</w:t>
-      </w:r>
-      <w:r>
-        <w:rPr>
-          <w:rFonts w:eastAsia="Times New Roman" w:cs="Times New Roman" w:ascii="Garamond" w:hAnsi="Garamond"/>
-          <w:color w:val="000000"/>
-          <w:kern w:val="0"/>
-          <w:sz w:val="36"/>
-          <w:szCs w:val="36"/>
-          <w:shd w:fill="auto" w:val="clear"/>
-          <w:lang w:val="en-US" w:eastAsia="zh-CN" w:bidi="hi-IN"/>
-        </w:rPr>
-        <w:t>,</w:t>
-      </w:r>
-      <w:r>
-        <w:rPr>
-          <w:rFonts w:eastAsia="Times New Roman" w:cs="Times New Roman" w:ascii="Garamond" w:hAnsi="Garamond"/>
-          <w:color w:val="000000"/>
-          <w:kern w:val="0"/>
-          <w:sz w:val="36"/>
-          <w:szCs w:val="36"/>
-          <w:shd w:fill="auto" w:val="clear"/>
-          <w:lang w:val="en-US" w:eastAsia="zh-CN" w:bidi="hi-IN"/>
-        </w:rPr>
-        <w:t xml:space="preserve"> a alma recebe um destino definitivo: felicidade eterna no céu ou sofrimento eterno no inferno. </w:t>
-      </w:r>
-    </w:p>
-    <w:p>
-      <w:pPr>
-        <w:pStyle w:val="Normal"/>
-        <w:jc w:val="both"/>
-        <w:rPr>
-          <w:sz w:val="36"/>
-          <w:szCs w:val="36"/>
-        </w:rPr>
-      </w:pPr>
-      <w:r>
-        <w:rPr>
-          <w:sz w:val="36"/>
-          <w:szCs w:val="36"/>
-        </w:rPr>
-      </w:r>
-    </w:p>
-    <w:p>
-      <w:pPr>
-        <w:pStyle w:val="Normal"/>
-        <w:jc w:val="both"/>
-        <w:rPr>
-          <w:sz w:val="36"/>
-          <w:szCs w:val="36"/>
-        </w:rPr>
-      </w:pPr>
-      <w:r>
-        <w:rPr>
-          <w:rFonts w:eastAsia="Times New Roman" w:cs="Times New Roman" w:ascii="Garamond" w:hAnsi="Garamond"/>
-          <w:color w:val="000000"/>
-          <w:kern w:val="0"/>
-          <w:sz w:val="36"/>
-          <w:szCs w:val="36"/>
-          <w:shd w:fill="auto" w:val="clear"/>
-          <w:lang w:val="en-US" w:eastAsia="zh-CN" w:bidi="hi-IN"/>
-        </w:rPr>
-        <w:t xml:space="preserve">O que determina esse destino é a maneira como aquela alma conduziu sua existência única: se fez o bem, </w:t>
-      </w:r>
-      <w:r>
-        <w:rPr>
-          <w:rFonts w:eastAsia="Times New Roman" w:cs="Times New Roman" w:ascii="Garamond" w:hAnsi="Garamond"/>
-          <w:color w:val="000000"/>
-          <w:kern w:val="0"/>
-          <w:sz w:val="36"/>
-          <w:szCs w:val="36"/>
-          <w:shd w:fill="auto" w:val="clear"/>
-          <w:lang w:val="en-US" w:eastAsia="zh-CN" w:bidi="hi-IN"/>
-        </w:rPr>
-        <w:t>irá</w:t>
-      </w:r>
-      <w:r>
-        <w:rPr>
-          <w:rFonts w:eastAsia="Times New Roman" w:cs="Times New Roman" w:ascii="Garamond" w:hAnsi="Garamond"/>
-          <w:color w:val="000000"/>
-          <w:kern w:val="0"/>
-          <w:sz w:val="36"/>
-          <w:szCs w:val="36"/>
-          <w:shd w:fill="auto" w:val="clear"/>
-          <w:lang w:val="en-US" w:eastAsia="zh-CN" w:bidi="hi-IN"/>
-        </w:rPr>
-        <w:t xml:space="preserve"> para o céu; se fez o mal, irá para o inferno.</w:t>
-      </w:r>
-    </w:p>
-    <w:p>
-      <w:pPr>
-        <w:pStyle w:val="Normal"/>
-        <w:jc w:val="both"/>
-        <w:rPr>
-          <w:sz w:val="36"/>
-          <w:szCs w:val="36"/>
-        </w:rPr>
-      </w:pPr>
-      <w:r>
-        <w:rPr>
+        <w:t>por considerá-la incompatível com a justiça e a misericórdia divinas. A alma não tem uma única existência, mas nasce e renasce inúmeras vezes. Cada nova existência é programada de acordo com os méritos adquiridos e os débitos contraídos pelo Espírito até então.</w:t>
+      </w:r>
+    </w:p>
+    <w:p>
+      <w:pPr>
+        <w:pStyle w:val="Normal"/>
+        <w:jc w:val="both"/>
+        <w:rPr>
+          <w:sz w:val="36"/>
+          <w:szCs w:val="36"/>
+        </w:rPr>
+      </w:pPr>
+      <w:r>
+        <w:rPr>
+          <w:sz w:val="36"/>
+          <w:szCs w:val="36"/>
+        </w:rPr>
+      </w:r>
+    </w:p>
+    <w:p>
+      <w:pPr>
+        <w:pStyle w:val="Normal"/>
+        <w:jc w:val="both"/>
+        <w:rPr>
+          <w:sz w:val="36"/>
+          <w:szCs w:val="36"/>
+        </w:rPr>
+      </w:pPr>
+      <w:r>
+        <w:rPr>
+          <w:rFonts w:eastAsia="Times New Roman" w:cs="Times New Roman" w:ascii="Garamond" w:hAnsi="Garamond"/>
+          <w:color w:val="000000"/>
+          <w:kern w:val="0"/>
+          <w:sz w:val="36"/>
+          <w:szCs w:val="36"/>
+          <w:shd w:fill="auto" w:val="clear"/>
+          <w:lang w:val="en-US" w:eastAsia="zh-CN" w:bidi="hi-IN"/>
+        </w:rPr>
+        <w:t xml:space="preserve">O sofrimento espiritual existe sim, mas é sempre temporário e educativo, pois todo Espírito está destinado ao progresso moral. </w:t>
+      </w:r>
+    </w:p>
+    <w:p>
+      <w:pPr>
+        <w:pStyle w:val="Normal"/>
+        <w:jc w:val="both"/>
+        <w:rPr>
+          <w:sz w:val="36"/>
+          <w:szCs w:val="36"/>
+        </w:rPr>
+      </w:pPr>
+      <w:r>
+        <w:rPr>
+          <w:rFonts w:eastAsia="Times New Roman" w:cs="Times New Roman" w:ascii="Garamond" w:hAnsi="Garamond"/>
+          <w:color w:val="000000"/>
+          <w:kern w:val="0"/>
+          <w:sz w:val="36"/>
+          <w:szCs w:val="36"/>
+          <w:shd w:fill="auto" w:val="clear"/>
+          <w:lang w:val="en-US" w:eastAsia="zh-CN" w:bidi="hi-IN"/>
+        </w:rPr>
+        <w:t>Céu e inferno deixam de ser locais definitivos de recompensa ou condenação e passam a representar estados transitórios da consciência, diretamente ligados às escolhas e ao grau evolutivo de cada Espírito.</w:t>
+      </w:r>
+    </w:p>
+    <w:p>
+      <w:pPr>
+        <w:pStyle w:val="Normal"/>
+        <w:jc w:val="both"/>
+        <w:rPr>
+          <w:sz w:val="36"/>
+          <w:szCs w:val="36"/>
+        </w:rPr>
+      </w:pPr>
+      <w:r>
+        <w:rPr>
+          <w:sz w:val="36"/>
+          <w:szCs w:val="36"/>
+        </w:rPr>
+      </w:r>
+    </w:p>
+    <w:p>
+      <w:pPr>
+        <w:pStyle w:val="Normal"/>
+        <w:jc w:val="both"/>
+        <w:rPr>
+          <w:sz w:val="36"/>
+          <w:szCs w:val="36"/>
+        </w:rPr>
+      </w:pPr>
+      <w:r>
+        <w:rPr>
+          <w:rFonts w:eastAsia="Times New Roman" w:cs="Times New Roman" w:ascii="Garamond" w:hAnsi="Garamond"/>
+          <w:color w:val="000000"/>
+          <w:kern w:val="0"/>
+          <w:sz w:val="36"/>
+          <w:szCs w:val="36"/>
+          <w:shd w:fill="auto" w:val="clear"/>
+          <w:lang w:val="en-US" w:eastAsia="zh-CN" w:bidi="hi-IN"/>
+        </w:rPr>
+        <w:t>Por maior que seja o sofrimento pelo qual o Espírito - encarnado ou desencarnado - esteja passando, há um motivo justo para aquele sofrimento, mas o Espírito jamais deixa de ser amparado pelo amor e pela misericórdia de Deus.</w:t>
+      </w:r>
+    </w:p>
+    <w:p>
+      <w:pPr>
+        <w:pStyle w:val="Normal"/>
+        <w:jc w:val="both"/>
+        <w:rPr>
+          <w:sz w:val="36"/>
+          <w:szCs w:val="36"/>
+        </w:rPr>
+      </w:pPr>
+      <w:r>
+        <w:rPr>
+          <w:sz w:val="36"/>
+          <w:szCs w:val="36"/>
+        </w:rPr>
+      </w:r>
+    </w:p>
+    <w:p>
+      <w:pPr>
+        <w:pStyle w:val="Normal"/>
+        <w:jc w:val="both"/>
+        <w:rPr>
+          <w:sz w:val="36"/>
+          <w:szCs w:val="36"/>
+        </w:rPr>
+      </w:pPr>
+      <w:r>
+        <w:rPr>
+          <w:rFonts w:eastAsia="Times New Roman" w:cs="Times New Roman" w:ascii="Garamond" w:hAnsi="Garamond"/>
+          <w:color w:val="000000"/>
+          <w:kern w:val="0"/>
+          <w:sz w:val="36"/>
+          <w:szCs w:val="36"/>
+          <w:shd w:fill="auto" w:val="clear"/>
+          <w:lang w:val="en-US" w:eastAsia="zh-CN" w:bidi="hi-IN"/>
+        </w:rPr>
+        <w:t>Por isso a Doutrina Espírita é tão consoladora: ela nos revela um Deus que rege o universo com sabedoria, amor e misericórdia, ao mesmo tempo em que esclarece os ensinamentos do Evangelho de Jesus de forma simples e profunda, ajudando-nos a compreendê-los e aplicá-los em nossa vida.</w:t>
+      </w:r>
+    </w:p>
+    <w:p>
+      <w:pPr>
+        <w:pStyle w:val="Normal"/>
+        <w:jc w:val="both"/>
+        <w:rPr>
+          <w:sz w:val="36"/>
+          <w:szCs w:val="36"/>
+        </w:rPr>
+      </w:pPr>
+      <w:r>
+        <w:rPr>
+          <w:sz w:val="36"/>
+          <w:szCs w:val="36"/>
+        </w:rPr>
+      </w:r>
+    </w:p>
+    <w:p>
+      <w:pPr>
+        <w:pStyle w:val="Normal"/>
+        <w:jc w:val="both"/>
+        <w:rPr>
+          <w:sz w:val="36"/>
+          <w:szCs w:val="36"/>
+        </w:rPr>
+      </w:pPr>
+      <w:r>
+        <w:rPr>
+          <w:rFonts w:eastAsia="Times New Roman" w:cs="Times New Roman" w:ascii="Garamond" w:hAnsi="Garamond"/>
+          <w:color w:val="000000"/>
+          <w:kern w:val="0"/>
+          <w:sz w:val="36"/>
+          <w:szCs w:val="36"/>
+          <w:shd w:fill="auto" w:val="clear"/>
+          <w:lang w:val="en-US" w:eastAsia="zh-CN" w:bidi="hi-IN"/>
+        </w:rPr>
+        <w:t>Mas, mesmo com toda a luz que o Espiritismo traz, ainda não conseguimos compreender determinados conceitos, não por alguma deficiência da doutrina, mas porque nos faltam conhecimentos acerca de muitas coisas. E não tem nada de errado com isso. É uma condição natural, considerando o atual estágio evolutivo em que nos encontramos.</w:t>
+      </w:r>
+    </w:p>
+    <w:p>
+      <w:pPr>
+        <w:pStyle w:val="Normal"/>
+        <w:jc w:val="both"/>
+        <w:rPr>
+          <w:sz w:val="36"/>
+          <w:szCs w:val="36"/>
+        </w:rPr>
+      </w:pPr>
+      <w:r>
+        <w:rPr>
+          <w:sz w:val="36"/>
+          <w:szCs w:val="36"/>
+        </w:rPr>
+      </w:r>
+    </w:p>
+    <w:p>
+      <w:pPr>
+        <w:pStyle w:val="Normal"/>
+        <w:jc w:val="both"/>
+        <w:rPr>
+          <w:sz w:val="36"/>
+          <w:szCs w:val="36"/>
+        </w:rPr>
+      </w:pPr>
+      <w:r>
+        <w:rPr>
+          <w:rFonts w:eastAsia="Times New Roman" w:cs="Times New Roman" w:ascii="Garamond" w:hAnsi="Garamond"/>
+          <w:color w:val="000000"/>
+          <w:kern w:val="0"/>
+          <w:sz w:val="36"/>
+          <w:szCs w:val="36"/>
+          <w:shd w:fill="auto" w:val="clear"/>
+          <w:lang w:val="en-US" w:eastAsia="zh-CN" w:bidi="hi-IN"/>
+        </w:rPr>
+        <w:t xml:space="preserve">Um dos conceitos que ainda não compreendemos completamente é </w:t>
+      </w:r>
+      <w:r>
+        <w:rPr>
+          <w:rFonts w:eastAsia="Times New Roman" w:cs="Times New Roman" w:ascii="Garamond" w:hAnsi="Garamond"/>
+          <w:color w:val="000000"/>
+          <w:kern w:val="0"/>
+          <w:sz w:val="36"/>
+          <w:szCs w:val="36"/>
+          <w:shd w:fill="auto" w:val="clear"/>
+          <w:lang w:val="en-US" w:eastAsia="zh-CN" w:bidi="hi-IN"/>
+        </w:rPr>
+        <w:t>Deus. Em O Livro dos Espíritos, a Espiritualidade diz a Kardec que Deus é a inteligência suprema, causa primária de todas as coisas. Deus é eterno, infinito, imutável. Criou o Universo, que abrange todos os seres animados e inanimados, materiais e imateriais.</w:t>
+      </w:r>
+    </w:p>
+    <w:p>
+      <w:pPr>
+        <w:pStyle w:val="Normal"/>
+        <w:jc w:val="both"/>
+        <w:rPr>
+          <w:sz w:val="36"/>
+          <w:szCs w:val="36"/>
+        </w:rPr>
+      </w:pPr>
+      <w:r>
+        <w:rPr>
+          <w:sz w:val="36"/>
+          <w:szCs w:val="36"/>
+        </w:rPr>
+      </w:r>
+    </w:p>
+    <w:p>
+      <w:pPr>
+        <w:pStyle w:val="Normal"/>
+        <w:jc w:val="both"/>
+        <w:rPr>
+          <w:sz w:val="36"/>
+          <w:szCs w:val="36"/>
+        </w:rPr>
+      </w:pPr>
+      <w:r>
+        <w:rPr>
+          <w:rFonts w:eastAsia="Times New Roman" w:cs="Times New Roman" w:ascii="Garamond" w:hAnsi="Garamond"/>
+          <w:color w:val="000000"/>
+          <w:kern w:val="0"/>
+          <w:sz w:val="36"/>
+          <w:szCs w:val="36"/>
+          <w:shd w:fill="auto" w:val="clear"/>
+          <w:lang w:val="en-US" w:eastAsia="zh-CN" w:bidi="hi-IN"/>
+        </w:rPr>
+        <w:t>Deus não teve começo e não terá fim.</w:t>
+      </w:r>
+    </w:p>
+    <w:p>
+      <w:pPr>
+        <w:pStyle w:val="Normal"/>
+        <w:jc w:val="both"/>
+        <w:rPr>
+          <w:sz w:val="36"/>
+          <w:szCs w:val="36"/>
+        </w:rPr>
+      </w:pPr>
+      <w:r>
+        <w:rPr>
+          <w:sz w:val="36"/>
+          <w:szCs w:val="36"/>
+        </w:rPr>
+      </w:r>
+    </w:p>
+    <w:p>
+      <w:pPr>
+        <w:pStyle w:val="Normal"/>
+        <w:jc w:val="both"/>
+        <w:rPr>
+          <w:sz w:val="36"/>
+          <w:szCs w:val="36"/>
+        </w:rPr>
+      </w:pPr>
+      <w:r>
+        <w:rPr>
+          <w:rFonts w:eastAsia="Times New Roman" w:cs="Times New Roman" w:ascii="Garamond" w:hAnsi="Garamond"/>
+          <w:color w:val="000000"/>
+          <w:kern w:val="0"/>
+          <w:sz w:val="36"/>
+          <w:szCs w:val="36"/>
+          <w:shd w:fill="auto" w:val="clear"/>
+          <w:lang w:val="en-US" w:eastAsia="zh-CN" w:bidi="hi-IN"/>
+        </w:rPr>
+        <w:t>Falando com bastante sinceridade, nós não conseguimos compreender realmente o que Deus é. Como é possível que exista algo que não teve começo? Tudo, absolutamente tudo o que nós conhecemos teve um começo, foi criado por alguém</w:t>
+      </w:r>
+      <w:r>
+        <w:rPr>
+          <w:rFonts w:eastAsia="Times New Roman" w:cs="Times New Roman" w:ascii="Garamond" w:hAnsi="Garamond"/>
+          <w:color w:val="000000"/>
+          <w:kern w:val="0"/>
+          <w:sz w:val="36"/>
+          <w:szCs w:val="36"/>
+          <w:shd w:fill="auto" w:val="clear"/>
+          <w:lang w:val="en-US" w:eastAsia="zh-CN" w:bidi="hi-IN"/>
+        </w:rPr>
+        <w:t xml:space="preserve"> ou por </w:t>
+      </w:r>
+      <w:r>
+        <w:rPr>
+          <w:rFonts w:eastAsia="Times New Roman" w:cs="Times New Roman" w:ascii="Garamond" w:hAnsi="Garamond"/>
+          <w:color w:val="000000"/>
+          <w:kern w:val="0"/>
+          <w:sz w:val="36"/>
+          <w:szCs w:val="36"/>
+          <w:shd w:fill="auto" w:val="clear"/>
+          <w:lang w:val="en-US" w:eastAsia="zh-CN" w:bidi="hi-IN"/>
+        </w:rPr>
+        <w:t>Deus.</w:t>
+      </w:r>
+    </w:p>
+    <w:p>
+      <w:pPr>
+        <w:pStyle w:val="Normal"/>
+        <w:jc w:val="both"/>
+        <w:rPr>
+          <w:sz w:val="36"/>
+          <w:szCs w:val="36"/>
+        </w:rPr>
+      </w:pPr>
+      <w:r>
+        <w:rPr>
+          <w:sz w:val="36"/>
+          <w:szCs w:val="36"/>
+        </w:rPr>
+      </w:r>
+    </w:p>
+    <w:p>
+      <w:pPr>
+        <w:pStyle w:val="Normal"/>
+        <w:jc w:val="both"/>
+        <w:rPr>
+          <w:sz w:val="36"/>
+          <w:szCs w:val="36"/>
+        </w:rPr>
+      </w:pPr>
+      <w:r>
+        <w:rPr>
+          <w:rFonts w:eastAsia="Times New Roman" w:cs="Times New Roman" w:ascii="Garamond" w:hAnsi="Garamond"/>
+          <w:color w:val="000000"/>
+          <w:kern w:val="0"/>
+          <w:sz w:val="36"/>
+          <w:szCs w:val="36"/>
+          <w:shd w:fill="auto" w:val="clear"/>
+          <w:lang w:val="en-US" w:eastAsia="zh-CN" w:bidi="hi-IN"/>
+        </w:rPr>
+        <w:t>Por mais longe que nossa imaginação consiga retroceder no tempo, sempre concebemos tudo como tendo sido criado por alguém. Por isso, aceitar a ideia de algo “incriado” é extremamente difícil para nós.</w:t>
+      </w:r>
+    </w:p>
+    <w:p>
+      <w:pPr>
+        <w:pStyle w:val="Normal"/>
+        <w:jc w:val="both"/>
+        <w:rPr>
+          <w:sz w:val="36"/>
+          <w:szCs w:val="36"/>
+        </w:rPr>
+      </w:pPr>
+      <w:r>
+        <w:rPr>
+          <w:rFonts w:eastAsia="Times New Roman" w:cs="Times New Roman" w:ascii="Garamond" w:hAnsi="Garamond"/>
+          <w:color w:val="000000"/>
+          <w:kern w:val="0"/>
+          <w:sz w:val="36"/>
+          <w:szCs w:val="36"/>
+          <w:shd w:fill="auto" w:val="clear"/>
+          <w:lang w:val="en-US" w:eastAsia="zh-CN" w:bidi="hi-IN"/>
+        </w:rPr>
+        <w:t>Então, sendo honestos conosco mesmo, a verdade é que ainda não conseguimos compreender o que é Deus.</w:t>
+      </w:r>
+    </w:p>
+    <w:p>
+      <w:pPr>
+        <w:pStyle w:val="Normal"/>
+        <w:jc w:val="both"/>
+        <w:rPr>
+          <w:sz w:val="36"/>
+          <w:szCs w:val="36"/>
+        </w:rPr>
+      </w:pPr>
+      <w:r>
+        <w:rPr>
+          <w:sz w:val="36"/>
+          <w:szCs w:val="36"/>
+        </w:rPr>
+      </w:r>
+    </w:p>
+    <w:p>
+      <w:pPr>
+        <w:pStyle w:val="Normal"/>
+        <w:jc w:val="both"/>
+        <w:rPr>
+          <w:sz w:val="36"/>
+          <w:szCs w:val="36"/>
+        </w:rPr>
+      </w:pPr>
+      <w:r>
+        <w:rPr>
+          <w:rFonts w:eastAsia="Times New Roman" w:cs="Times New Roman" w:ascii="Garamond" w:hAnsi="Garamond"/>
+          <w:color w:val="000000"/>
+          <w:kern w:val="0"/>
+          <w:sz w:val="36"/>
+          <w:szCs w:val="36"/>
+          <w:shd w:fill="auto" w:val="clear"/>
+          <w:lang w:val="en-US" w:eastAsia="zh-CN" w:bidi="hi-IN"/>
+        </w:rPr>
+        <w:t>Como nós lidamos com isso? Seguindo a recomendação da própria Espiritualidade. Na resposta da pergunta 14 de O Livro dos Espíritos, ela nos aconselha a não tentarmos descobrir a essência de Deus, po</w:t>
+      </w:r>
+      <w:r>
+        <w:rPr>
+          <w:rFonts w:eastAsia="Times New Roman" w:cs="Times New Roman" w:ascii="Garamond" w:hAnsi="Garamond"/>
+          <w:color w:val="000000"/>
+          <w:kern w:val="0"/>
+          <w:sz w:val="36"/>
+          <w:szCs w:val="36"/>
+          <w:shd w:fill="auto" w:val="clear"/>
+          <w:lang w:val="en-US" w:eastAsia="zh-CN" w:bidi="hi-IN"/>
+        </w:rPr>
+        <w:t>r que</w:t>
+      </w:r>
+      <w:r>
+        <w:rPr>
+          <w:rFonts w:eastAsia="Times New Roman" w:cs="Times New Roman" w:ascii="Garamond" w:hAnsi="Garamond"/>
+          <w:color w:val="000000"/>
+          <w:kern w:val="0"/>
+          <w:sz w:val="36"/>
+          <w:szCs w:val="36"/>
+          <w:shd w:fill="auto" w:val="clear"/>
+          <w:lang w:val="en-US" w:eastAsia="zh-CN" w:bidi="hi-IN"/>
+        </w:rPr>
+        <w:t xml:space="preserve"> entraríamos em um labirinto do qual jamais sairíamos.</w:t>
+      </w:r>
+    </w:p>
+    <w:p>
+      <w:pPr>
+        <w:pStyle w:val="Normal"/>
+        <w:jc w:val="both"/>
+        <w:rPr>
+          <w:sz w:val="36"/>
+          <w:szCs w:val="36"/>
+        </w:rPr>
+      </w:pPr>
+      <w:r>
+        <w:rPr>
+          <w:sz w:val="36"/>
+          <w:szCs w:val="36"/>
+        </w:rPr>
+      </w:r>
+    </w:p>
+    <w:p>
+      <w:pPr>
+        <w:pStyle w:val="Normal"/>
+        <w:jc w:val="both"/>
+        <w:rPr>
+          <w:sz w:val="36"/>
+          <w:szCs w:val="36"/>
+        </w:rPr>
+      </w:pPr>
+      <w:r>
+        <w:rPr>
+          <w:rFonts w:eastAsia="Times New Roman" w:cs="Times New Roman" w:ascii="Garamond" w:hAnsi="Garamond"/>
+          <w:color w:val="000000"/>
+          <w:kern w:val="0"/>
+          <w:sz w:val="36"/>
+          <w:szCs w:val="36"/>
+          <w:shd w:fill="auto" w:val="clear"/>
+          <w:lang w:val="en-US" w:eastAsia="zh-CN" w:bidi="hi-IN"/>
+        </w:rPr>
+        <w:t>Então, para o momento, devemos simplesmente seguir os conselhos da Espiritualidade. E convenhamos: nós já temos preocupações suficientes com nossas imperfeições. Se ocuparmos nosso tempo tentando superá-las, já teremos feito muito na atual existência.</w:t>
+      </w:r>
+    </w:p>
+    <w:p>
+      <w:pPr>
+        <w:pStyle w:val="Normal"/>
+        <w:jc w:val="both"/>
+        <w:rPr>
+          <w:sz w:val="36"/>
+          <w:szCs w:val="36"/>
+        </w:rPr>
+      </w:pPr>
+      <w:r>
+        <w:rPr>
+          <w:sz w:val="36"/>
+          <w:szCs w:val="36"/>
+        </w:rPr>
+      </w:r>
+    </w:p>
+    <w:p>
+      <w:pPr>
+        <w:pStyle w:val="Normal"/>
+        <w:jc w:val="both"/>
+        <w:rPr>
+          <w:sz w:val="36"/>
+          <w:szCs w:val="36"/>
+        </w:rPr>
+      </w:pPr>
+      <w:r>
+        <w:rPr>
+          <w:rFonts w:eastAsia="Times New Roman" w:cs="Times New Roman" w:ascii="Garamond" w:hAnsi="Garamond"/>
+          <w:color w:val="000000"/>
+          <w:kern w:val="0"/>
+          <w:sz w:val="36"/>
+          <w:szCs w:val="36"/>
+          <w:shd w:fill="auto" w:val="clear"/>
+          <w:lang w:val="en-US" w:eastAsia="zh-CN" w:bidi="hi-IN"/>
+        </w:rPr>
+        <w:t>Outro conceito cuja compreensão ainda nos escapa, e que abordaremos hoje dentro do nosso tema, é o mal.</w:t>
+      </w:r>
+    </w:p>
+    <w:p>
+      <w:pPr>
+        <w:pStyle w:val="Normal"/>
+        <w:jc w:val="both"/>
+        <w:rPr>
+          <w:sz w:val="36"/>
+          <w:szCs w:val="36"/>
+        </w:rPr>
+      </w:pPr>
+      <w:r>
+        <w:rPr>
+          <w:rFonts w:ascii="Garamond" w:hAnsi="Garamond"/>
           <w:sz w:val="36"/>
           <w:szCs w:val="36"/>
         </w:rPr>
@@ -371,33 +1022,443 @@
     </w:p>
     <w:p>
       <w:pPr>
-        <w:pStyle w:val="Normal"/>
-        <w:jc w:val="both"/>
-        <w:rPr>
-          <w:sz w:val="36"/>
-          <w:szCs w:val="36"/>
-        </w:rPr>
-      </w:pPr>
-      <w:r>
-        <w:rPr>
-          <w:rFonts w:eastAsia="Times New Roman" w:cs="Times New Roman" w:ascii="Garamond" w:hAnsi="Garamond"/>
-          <w:color w:val="000000"/>
-          <w:kern w:val="0"/>
-          <w:sz w:val="36"/>
-          <w:szCs w:val="36"/>
-          <w:shd w:fill="auto" w:val="clear"/>
-          <w:lang w:val="en-US" w:eastAsia="zh-CN" w:bidi="hi-IN"/>
-        </w:rPr>
-        <w:t xml:space="preserve">E o que é a fé raciocinada? Como o próprio nome sugere, é a fé construída através do raciocínio, do bom senso, do sentimento de justiça e até da lógica. Em outras palavras: quando eu creio em algo, eu sei por que creio naquilo. </w:t>
-      </w:r>
-    </w:p>
-    <w:p>
-      <w:pPr>
-        <w:pStyle w:val="Normal"/>
-        <w:jc w:val="both"/>
-        <w:rPr>
-          <w:sz w:val="36"/>
-          <w:szCs w:val="36"/>
+        <w:pStyle w:val="TextBody"/>
+        <w:jc w:val="both"/>
+        <w:rPr>
+          <w:rFonts w:ascii="Garamond" w:hAnsi="Garamond"/>
+          <w:sz w:val="36"/>
+          <w:szCs w:val="36"/>
+        </w:rPr>
+      </w:pPr>
+      <w:r>
+        <w:rPr>
+          <w:rFonts w:ascii="Garamond" w:hAnsi="Garamond"/>
+          <w:sz w:val="36"/>
+          <w:szCs w:val="36"/>
+        </w:rPr>
+        <w:t xml:space="preserve">A Doutrina Espírita nos ensina que o mal não existe. À primeira vista, essa afirmação </w:t>
+      </w:r>
+      <w:r>
+        <w:rPr>
+          <w:rFonts w:eastAsia="Arial" w:cs="Arial" w:ascii="Garamond" w:hAnsi="Garamond"/>
+          <w:color w:val="auto"/>
+          <w:kern w:val="0"/>
+          <w:sz w:val="36"/>
+          <w:szCs w:val="36"/>
+          <w:lang w:val="en-US" w:eastAsia="zh-CN" w:bidi="hi-IN"/>
+        </w:rPr>
+        <w:t>parece completamente equivocada</w:t>
+      </w:r>
+      <w:r>
+        <w:rPr>
+          <w:rFonts w:ascii="Garamond" w:hAnsi="Garamond"/>
+          <w:sz w:val="36"/>
+          <w:szCs w:val="36"/>
+        </w:rPr>
+        <w:t xml:space="preserve">. </w:t>
+      </w:r>
+    </w:p>
+    <w:p>
+      <w:pPr>
+        <w:pStyle w:val="Normal"/>
+        <w:jc w:val="both"/>
+        <w:rPr>
+          <w:rFonts w:ascii="Garamond" w:hAnsi="Garamond"/>
+          <w:sz w:val="36"/>
+          <w:szCs w:val="36"/>
+        </w:rPr>
+      </w:pPr>
+      <w:r>
+        <w:rPr>
+          <w:rFonts w:ascii="Garamond" w:hAnsi="Garamond"/>
+          <w:sz w:val="36"/>
+          <w:szCs w:val="36"/>
+        </w:rPr>
+      </w:r>
+    </w:p>
+    <w:p>
+      <w:pPr>
+        <w:pStyle w:val="TextBody"/>
+        <w:jc w:val="both"/>
+        <w:rPr>
+          <w:rFonts w:ascii="Garamond" w:hAnsi="Garamond"/>
+        </w:rPr>
+      </w:pPr>
+      <w:r>
+        <w:rPr>
+          <w:rFonts w:eastAsia="Times New Roman" w:cs="Times New Roman" w:ascii="Garamond" w:hAnsi="Garamond"/>
+          <w:color w:val="000000"/>
+          <w:kern w:val="0"/>
+          <w:sz w:val="36"/>
+          <w:szCs w:val="36"/>
+          <w:shd w:fill="auto" w:val="clear"/>
+          <w:lang w:val="en-US" w:eastAsia="zh-CN" w:bidi="hi-IN"/>
+        </w:rPr>
+        <w:t>Afinal de contas, v</w:t>
+      </w:r>
+      <w:r>
+        <w:rPr>
+          <w:rFonts w:eastAsia="Times New Roman" w:cs="Times New Roman" w:ascii="Garamond" w:hAnsi="Garamond"/>
+          <w:color w:val="000000"/>
+          <w:kern w:val="0"/>
+          <w:sz w:val="36"/>
+          <w:szCs w:val="36"/>
+          <w:shd w:fill="auto" w:val="clear"/>
+          <w:lang w:val="en-US" w:eastAsia="zh-CN" w:bidi="hi-IN"/>
+        </w:rPr>
+        <w:t>emos o mal sendo praticado, nós mesmos</w:t>
+      </w:r>
+      <w:r>
+        <w:rPr>
+          <w:rFonts w:eastAsia="Times New Roman" w:cs="Times New Roman" w:ascii="Garamond" w:hAnsi="Garamond"/>
+          <w:color w:val="000000"/>
+          <w:kern w:val="0"/>
+          <w:sz w:val="36"/>
+          <w:szCs w:val="36"/>
+          <w:shd w:fill="auto" w:val="clear"/>
+          <w:lang w:val="en-US" w:eastAsia="zh-CN" w:bidi="hi-IN"/>
+        </w:rPr>
+        <w:t xml:space="preserve"> </w:t>
+      </w:r>
+      <w:r>
+        <w:rPr>
+          <w:rFonts w:eastAsia="Times New Roman" w:cs="Times New Roman" w:ascii="Garamond" w:hAnsi="Garamond"/>
+          <w:color w:val="000000"/>
+          <w:kern w:val="0"/>
+          <w:sz w:val="36"/>
+          <w:szCs w:val="36"/>
+          <w:shd w:fill="auto" w:val="clear"/>
+          <w:lang w:val="en-US" w:eastAsia="zh-CN" w:bidi="hi-IN"/>
+        </w:rPr>
+        <w:t>ainda o praticamos</w:t>
+      </w:r>
+      <w:r>
+        <w:rPr>
+          <w:rFonts w:eastAsia="Times New Roman" w:cs="Times New Roman" w:ascii="Garamond" w:hAnsi="Garamond"/>
+          <w:color w:val="000000"/>
+          <w:kern w:val="0"/>
+          <w:sz w:val="36"/>
+          <w:szCs w:val="36"/>
+          <w:shd w:fill="auto" w:val="clear"/>
+          <w:lang w:val="en-US" w:eastAsia="zh-CN" w:bidi="hi-IN"/>
+        </w:rPr>
+        <w:t xml:space="preserve"> - apesar de nossos esforços em nos melhorarmos -</w:t>
+      </w:r>
+      <w:r>
+        <w:rPr>
+          <w:rFonts w:eastAsia="Times New Roman" w:cs="Times New Roman" w:ascii="Garamond" w:hAnsi="Garamond"/>
+          <w:color w:val="000000"/>
+          <w:kern w:val="0"/>
+          <w:sz w:val="36"/>
+          <w:szCs w:val="36"/>
+          <w:shd w:fill="auto" w:val="clear"/>
+          <w:lang w:val="en-US" w:eastAsia="zh-CN" w:bidi="hi-IN"/>
+        </w:rPr>
+        <w:t>, presenciamos e sentimos as consequências de sua açã</w:t>
+      </w:r>
+      <w:r>
+        <w:rPr>
+          <w:rFonts w:eastAsia="Times New Roman" w:cs="Times New Roman" w:ascii="Garamond" w:hAnsi="Garamond"/>
+          <w:color w:val="000000"/>
+          <w:kern w:val="0"/>
+          <w:sz w:val="36"/>
+          <w:szCs w:val="36"/>
+          <w:shd w:fill="auto" w:val="clear"/>
+          <w:lang w:val="en-US" w:eastAsia="zh-CN" w:bidi="hi-IN"/>
+        </w:rPr>
+        <w:t xml:space="preserve">o, </w:t>
+      </w:r>
+      <w:r>
+        <w:rPr>
+          <w:rFonts w:eastAsia="Times New Roman" w:cs="Times New Roman" w:ascii="Garamond" w:hAnsi="Garamond"/>
+          <w:color w:val="000000"/>
+          <w:kern w:val="0"/>
+          <w:sz w:val="36"/>
+          <w:szCs w:val="36"/>
+          <w:shd w:fill="auto" w:val="clear"/>
+          <w:lang w:val="en-US" w:eastAsia="zh-CN" w:bidi="hi-IN"/>
+        </w:rPr>
+        <w:t>e</w:t>
+      </w:r>
+      <w:r>
+        <w:rPr>
+          <w:rFonts w:eastAsia="Times New Roman" w:cs="Times New Roman" w:ascii="Garamond" w:hAnsi="Garamond"/>
+          <w:color w:val="000000"/>
+          <w:kern w:val="0"/>
+          <w:sz w:val="36"/>
+          <w:szCs w:val="36"/>
+          <w:shd w:fill="auto" w:val="clear"/>
+          <w:lang w:val="en-US" w:eastAsia="zh-CN" w:bidi="hi-IN"/>
+        </w:rPr>
+        <w:t xml:space="preserve"> </w:t>
+      </w:r>
+      <w:r>
+        <w:rPr>
+          <w:rFonts w:eastAsia="Times New Roman" w:cs="Times New Roman" w:ascii="Garamond" w:hAnsi="Garamond"/>
+          <w:color w:val="000000"/>
+          <w:kern w:val="0"/>
+          <w:sz w:val="36"/>
+          <w:szCs w:val="36"/>
+          <w:shd w:fill="auto" w:val="clear"/>
+          <w:lang w:val="en-US" w:eastAsia="zh-CN" w:bidi="hi-IN"/>
+        </w:rPr>
+        <w:t>a Doutrina Espírita afirma que ele não existe</w:t>
+      </w:r>
+      <w:r>
+        <w:rPr>
+          <w:rFonts w:eastAsia="Times New Roman" w:cs="Times New Roman" w:ascii="Garamond" w:hAnsi="Garamond"/>
+          <w:color w:val="000000"/>
+          <w:kern w:val="0"/>
+          <w:sz w:val="36"/>
+          <w:szCs w:val="36"/>
+          <w:shd w:fill="auto" w:val="clear"/>
+          <w:lang w:val="en-US" w:eastAsia="zh-CN" w:bidi="hi-IN"/>
+        </w:rPr>
+        <w:t>.</w:t>
+      </w:r>
+    </w:p>
+    <w:p>
+      <w:pPr>
+        <w:pStyle w:val="Normal"/>
+        <w:jc w:val="both"/>
+        <w:rPr>
+          <w:rFonts w:eastAsia="Times New Roman" w:cs="Times New Roman"/>
+          <w:color w:val="000000"/>
+          <w:kern w:val="0"/>
+          <w:sz w:val="36"/>
+          <w:szCs w:val="36"/>
+          <w:shd w:fill="auto" w:val="clear"/>
+          <w:lang w:val="en-US" w:eastAsia="zh-CN" w:bidi="hi-IN"/>
+        </w:rPr>
+      </w:pPr>
+      <w:r>
+        <w:rPr>
+          <w:rFonts w:ascii="Garamond" w:hAnsi="Garamond"/>
+        </w:rPr>
+      </w:r>
+    </w:p>
+    <w:p>
+      <w:pPr>
+        <w:pStyle w:val="Normal"/>
+        <w:jc w:val="both"/>
+        <w:rPr>
+          <w:rFonts w:ascii="Garamond" w:hAnsi="Garamond" w:eastAsia="Times New Roman" w:cs="Times New Roman"/>
+          <w:color w:val="000000"/>
+          <w:kern w:val="0"/>
+          <w:sz w:val="36"/>
+          <w:szCs w:val="36"/>
+          <w:shd w:fill="auto" w:val="clear"/>
+          <w:lang w:val="en-US" w:eastAsia="zh-CN" w:bidi="hi-IN"/>
+        </w:rPr>
+      </w:pPr>
+      <w:r>
+        <w:rPr>
+          <w:rFonts w:eastAsia="Times New Roman" w:cs="Times New Roman" w:ascii="Garamond" w:hAnsi="Garamond"/>
+          <w:color w:val="000000"/>
+          <w:kern w:val="0"/>
+          <w:sz w:val="36"/>
+          <w:szCs w:val="36"/>
+          <w:shd w:fill="auto" w:val="clear"/>
+          <w:lang w:val="en-US" w:eastAsia="zh-CN" w:bidi="hi-IN"/>
+        </w:rPr>
+        <w:t>Vamos analisar mais detalhadamente o que o Espiritismo realmente nos diz sobre o mal. Isso será  fundamental para nossas reflexões nesta noite.</w:t>
+      </w:r>
+    </w:p>
+    <w:p>
+      <w:pPr>
+        <w:pStyle w:val="Normal"/>
+        <w:jc w:val="both"/>
+        <w:rPr>
+          <w:rFonts w:ascii="Garamond" w:hAnsi="Garamond" w:eastAsia="Times New Roman" w:cs="Times New Roman"/>
+          <w:color w:val="000000"/>
+          <w:kern w:val="0"/>
+          <w:sz w:val="36"/>
+          <w:szCs w:val="36"/>
+          <w:shd w:fill="auto" w:val="clear"/>
+          <w:lang w:val="en-US" w:eastAsia="zh-CN" w:bidi="hi-IN"/>
+        </w:rPr>
+      </w:pPr>
+      <w:r>
+        <w:rPr>
+          <w:rFonts w:eastAsia="Times New Roman" w:cs="Times New Roman" w:ascii="Garamond" w:hAnsi="Garamond"/>
+          <w:color w:val="000000"/>
+          <w:kern w:val="0"/>
+          <w:sz w:val="36"/>
+          <w:szCs w:val="36"/>
+          <w:shd w:fill="auto" w:val="clear"/>
+          <w:lang w:val="en-US" w:eastAsia="zh-CN" w:bidi="hi-IN"/>
+        </w:rPr>
+      </w:r>
+    </w:p>
+    <w:p>
+      <w:pPr>
+        <w:pStyle w:val="Normal"/>
+        <w:jc w:val="both"/>
+        <w:rPr>
+          <w:sz w:val="36"/>
+          <w:szCs w:val="36"/>
+        </w:rPr>
+      </w:pPr>
+      <w:r>
+        <w:rPr>
+          <w:rFonts w:eastAsia="Times New Roman" w:cs="Times New Roman" w:ascii="Garamond" w:hAnsi="Garamond"/>
+          <w:color w:val="000000"/>
+          <w:kern w:val="0"/>
+          <w:sz w:val="36"/>
+          <w:szCs w:val="36"/>
+          <w:shd w:fill="auto" w:val="clear"/>
+          <w:lang w:val="en-US" w:eastAsia="zh-CN" w:bidi="hi-IN"/>
+        </w:rPr>
+        <w:t>No Espiritismo, a ideia de que “</w:t>
+      </w:r>
+      <w:r>
+        <w:rPr>
+          <w:rFonts w:eastAsia="Times New Roman" w:cs="Times New Roman" w:ascii="Garamond" w:hAnsi="Garamond"/>
+          <w:i/>
+          <w:iCs/>
+          <w:color w:val="000000"/>
+          <w:kern w:val="0"/>
+          <w:sz w:val="36"/>
+          <w:szCs w:val="36"/>
+          <w:shd w:fill="auto" w:val="clear"/>
+          <w:lang w:val="en-US" w:eastAsia="zh-CN" w:bidi="hi-IN"/>
+        </w:rPr>
+        <w:t>o mal não existe em si</w:t>
+      </w:r>
+      <w:r>
+        <w:rPr>
+          <w:rFonts w:eastAsia="Times New Roman" w:cs="Times New Roman" w:ascii="Garamond" w:hAnsi="Garamond"/>
+          <w:color w:val="000000"/>
+          <w:kern w:val="0"/>
+          <w:sz w:val="36"/>
+          <w:szCs w:val="36"/>
+          <w:shd w:fill="auto" w:val="clear"/>
+          <w:lang w:val="en-US" w:eastAsia="zh-CN" w:bidi="hi-IN"/>
+        </w:rPr>
+        <w:t>” significa que o mal não é um princípio absoluto, eterno ou criado por Deus como uma força independente. O mal seria, antes, resultado da ignorância, do atraso moral e do afastamento das leis divinas.</w:t>
+      </w:r>
+    </w:p>
+    <w:p>
+      <w:pPr>
+        <w:pStyle w:val="Normal"/>
+        <w:jc w:val="both"/>
+        <w:rPr>
+          <w:rFonts w:ascii="Garamond" w:hAnsi="Garamond" w:eastAsia="Times New Roman" w:cs="Times New Roman"/>
+          <w:color w:val="000000"/>
+          <w:kern w:val="0"/>
+          <w:sz w:val="36"/>
+          <w:szCs w:val="36"/>
+          <w:shd w:fill="auto" w:val="clear"/>
+          <w:lang w:val="en-US" w:eastAsia="zh-CN" w:bidi="hi-IN"/>
+        </w:rPr>
+      </w:pPr>
+      <w:r>
+        <w:rPr>
+          <w:rFonts w:eastAsia="Times New Roman" w:cs="Times New Roman" w:ascii="Garamond" w:hAnsi="Garamond"/>
+          <w:color w:val="000000"/>
+          <w:kern w:val="0"/>
+          <w:sz w:val="36"/>
+          <w:szCs w:val="36"/>
+          <w:shd w:fill="auto" w:val="clear"/>
+          <w:lang w:val="en-US" w:eastAsia="zh-CN" w:bidi="hi-IN"/>
+        </w:rPr>
+      </w:r>
+      <w:r>
+        <w:br w:type="page"/>
+      </w:r>
+    </w:p>
+    <w:p>
+      <w:pPr>
+        <w:pStyle w:val="Normal"/>
+        <w:jc w:val="both"/>
+        <w:rPr>
+          <w:rFonts w:ascii="Garamond" w:hAnsi="Garamond" w:eastAsia="Times New Roman" w:cs="Times New Roman"/>
+          <w:color w:val="000000"/>
+          <w:kern w:val="0"/>
+          <w:sz w:val="36"/>
+          <w:szCs w:val="36"/>
+          <w:shd w:fill="auto" w:val="clear"/>
+          <w:lang w:val="en-US" w:eastAsia="zh-CN" w:bidi="hi-IN"/>
+        </w:rPr>
+      </w:pPr>
+      <w:r>
+        <w:rPr>
+          <w:rFonts w:eastAsia="Times New Roman" w:cs="Times New Roman" w:ascii="Garamond" w:hAnsi="Garamond"/>
+          <w:color w:val="000000"/>
+          <w:kern w:val="0"/>
+          <w:sz w:val="36"/>
+          <w:szCs w:val="36"/>
+          <w:shd w:fill="auto" w:val="clear"/>
+          <w:lang w:val="en-US" w:eastAsia="zh-CN" w:bidi="hi-IN"/>
+        </w:rPr>
+        <w:t>Deus cria todos os Espíritos simples e ignorantes, ignorantes no sentido de nada saberem, mas todos têm o livre-arbítrio, isto é, o direito de escolher o que fazer e quais caminhos seguir.</w:t>
+      </w:r>
+    </w:p>
+    <w:p>
+      <w:pPr>
+        <w:pStyle w:val="Normal"/>
+        <w:jc w:val="both"/>
+        <w:rPr>
+          <w:rFonts w:ascii="Garamond" w:hAnsi="Garamond" w:eastAsia="Times New Roman" w:cs="Times New Roman"/>
+          <w:color w:val="000000"/>
+          <w:kern w:val="0"/>
+          <w:sz w:val="36"/>
+          <w:szCs w:val="36"/>
+          <w:shd w:fill="auto" w:val="clear"/>
+          <w:lang w:val="en-US" w:eastAsia="zh-CN" w:bidi="hi-IN"/>
+        </w:rPr>
+      </w:pPr>
+      <w:r>
+        <w:rPr>
+          <w:rFonts w:eastAsia="Times New Roman" w:cs="Times New Roman" w:ascii="Garamond" w:hAnsi="Garamond"/>
+          <w:color w:val="000000"/>
+          <w:kern w:val="0"/>
+          <w:sz w:val="36"/>
+          <w:szCs w:val="36"/>
+          <w:shd w:fill="auto" w:val="clear"/>
+          <w:lang w:val="en-US" w:eastAsia="zh-CN" w:bidi="hi-IN"/>
+        </w:rPr>
+      </w:r>
+    </w:p>
+    <w:p>
+      <w:pPr>
+        <w:pStyle w:val="Normal"/>
+        <w:jc w:val="both"/>
+        <w:rPr>
+          <w:rFonts w:ascii="Garamond" w:hAnsi="Garamond" w:eastAsia="Times New Roman" w:cs="Times New Roman"/>
+          <w:color w:val="000000"/>
+          <w:kern w:val="0"/>
+          <w:sz w:val="36"/>
+          <w:szCs w:val="36"/>
+          <w:shd w:fill="auto" w:val="clear"/>
+          <w:lang w:val="en-US" w:eastAsia="zh-CN" w:bidi="hi-IN"/>
+        </w:rPr>
+      </w:pPr>
+      <w:r>
+        <w:rPr>
+          <w:rFonts w:eastAsia="Times New Roman" w:cs="Times New Roman" w:ascii="Garamond" w:hAnsi="Garamond"/>
+          <w:color w:val="000000"/>
+          <w:kern w:val="0"/>
+          <w:sz w:val="36"/>
+          <w:szCs w:val="36"/>
+          <w:shd w:fill="auto" w:val="clear"/>
+          <w:lang w:val="en-US" w:eastAsia="zh-CN" w:bidi="hi-IN"/>
+        </w:rPr>
+        <w:t xml:space="preserve">A ignorância inicial seria uma condição de infância espiritual, necessária para que o ser desenvolva consciência, experiência e mérito próprios ao longo da evolução. </w:t>
+      </w:r>
+    </w:p>
+    <w:p>
+      <w:pPr>
+        <w:pStyle w:val="Normal"/>
+        <w:jc w:val="both"/>
+        <w:rPr>
+          <w:rFonts w:ascii="Garamond" w:hAnsi="Garamond" w:eastAsia="Times New Roman" w:cs="Times New Roman"/>
+          <w:color w:val="000000"/>
+          <w:kern w:val="0"/>
+          <w:sz w:val="36"/>
+          <w:szCs w:val="36"/>
+          <w:shd w:fill="auto" w:val="clear"/>
+          <w:lang w:val="en-US" w:eastAsia="zh-CN" w:bidi="hi-IN"/>
         </w:rPr>
       </w:pPr>
       <w:r>
@@ -409,1079 +1470,203 @@
         <w:pStyle w:val="Normal"/>
         <w:jc w:val="both"/>
         <w:rPr>
-          <w:sz w:val="36"/>
-          <w:szCs w:val="36"/>
-        </w:rPr>
-      </w:pPr>
-      <w:r>
-        <w:rPr>
-          <w:rFonts w:eastAsia="Times New Roman" w:cs="Times New Roman" w:ascii="Garamond" w:hAnsi="Garamond"/>
-          <w:color w:val="000000"/>
-          <w:kern w:val="0"/>
-          <w:sz w:val="36"/>
-          <w:szCs w:val="36"/>
-          <w:shd w:fill="auto" w:val="clear"/>
-          <w:lang w:val="en-US" w:eastAsia="zh-CN" w:bidi="hi-IN"/>
-        </w:rPr>
-        <w:t>Com a fé raciocinada, não há imposição de ideias. O que existe é uma ideia que me foi apresentada, sobre a qual eu refleti, raciocinei e analisei cuidadosamente, até concluir que realmente faz sentido acreditar naquela ideia.</w:t>
-      </w:r>
-    </w:p>
-    <w:p>
-      <w:pPr>
-        <w:pStyle w:val="Normal"/>
-        <w:jc w:val="both"/>
-        <w:rPr>
-          <w:sz w:val="36"/>
-          <w:szCs w:val="36"/>
+          <w:rFonts w:ascii="Garamond" w:hAnsi="Garamond" w:eastAsia="Times New Roman" w:cs="Times New Roman"/>
+          <w:color w:val="000000"/>
+          <w:kern w:val="0"/>
+          <w:sz w:val="36"/>
+          <w:szCs w:val="36"/>
+          <w:shd w:fill="auto" w:val="clear"/>
+          <w:lang w:val="en-US" w:eastAsia="zh-CN" w:bidi="hi-IN"/>
+        </w:rPr>
+      </w:pPr>
+      <w:r>
+        <w:rPr>
+          <w:rFonts w:eastAsia="Times New Roman" w:cs="Times New Roman" w:ascii="Garamond" w:hAnsi="Garamond"/>
+          <w:color w:val="000000"/>
+          <w:kern w:val="0"/>
+          <w:sz w:val="36"/>
+          <w:szCs w:val="36"/>
+          <w:shd w:fill="auto" w:val="clear"/>
+          <w:lang w:val="en-US" w:eastAsia="zh-CN" w:bidi="hi-IN"/>
+        </w:rPr>
+        <w:t>O mal surge quando o Espírito, ainda imperfeito, escolhe agir em desacordo com as leis divinas. Portanto, Deus criou a possibilidade do progresso livre, não o mal em si.</w:t>
+      </w:r>
+    </w:p>
+    <w:p>
+      <w:pPr>
+        <w:pStyle w:val="Normal"/>
+        <w:jc w:val="both"/>
+        <w:rPr>
+          <w:rFonts w:ascii="Garamond" w:hAnsi="Garamond" w:eastAsia="Times New Roman" w:cs="Times New Roman"/>
+          <w:color w:val="000000"/>
+          <w:kern w:val="0"/>
+          <w:sz w:val="36"/>
+          <w:szCs w:val="36"/>
+          <w:shd w:fill="auto" w:val="clear"/>
+          <w:lang w:val="en-US" w:eastAsia="zh-CN" w:bidi="hi-IN"/>
+        </w:rPr>
+      </w:pPr>
+      <w:r>
+        <w:rPr>
+          <w:rFonts w:eastAsia="Times New Roman" w:cs="Times New Roman" w:ascii="Garamond" w:hAnsi="Garamond"/>
+          <w:color w:val="000000"/>
+          <w:kern w:val="0"/>
+          <w:sz w:val="36"/>
+          <w:szCs w:val="36"/>
+          <w:shd w:fill="auto" w:val="clear"/>
+          <w:lang w:val="en-US" w:eastAsia="zh-CN" w:bidi="hi-IN"/>
+        </w:rPr>
+      </w:r>
+    </w:p>
+    <w:p>
+      <w:pPr>
+        <w:pStyle w:val="Normal"/>
+        <w:jc w:val="both"/>
+        <w:rPr>
+          <w:rFonts w:ascii="Garamond" w:hAnsi="Garamond" w:eastAsia="Times New Roman" w:cs="Times New Roman"/>
+          <w:color w:val="000000"/>
+          <w:kern w:val="0"/>
+          <w:sz w:val="36"/>
+          <w:szCs w:val="36"/>
+          <w:shd w:fill="auto" w:val="clear"/>
+          <w:lang w:val="en-US" w:eastAsia="zh-CN" w:bidi="hi-IN"/>
+        </w:rPr>
+      </w:pPr>
+      <w:r>
+        <w:rPr>
+          <w:rFonts w:eastAsia="Times New Roman" w:cs="Times New Roman" w:ascii="Garamond" w:hAnsi="Garamond"/>
+          <w:color w:val="000000"/>
+          <w:kern w:val="0"/>
+          <w:sz w:val="36"/>
+          <w:szCs w:val="36"/>
+          <w:shd w:fill="auto" w:val="clear"/>
+          <w:lang w:val="en-US" w:eastAsia="zh-CN" w:bidi="hi-IN"/>
+        </w:rPr>
+        <w:t xml:space="preserve">O Espiritismo não nega o sofrimento, a violência ou as injustiças. O que ele nos diz é que o mal não tem existência eterna nem natureza própria. Ele é tão somente a consequência temporária da imperfeição espiritual. </w:t>
+      </w:r>
+    </w:p>
+    <w:p>
+      <w:pPr>
+        <w:pStyle w:val="Normal"/>
+        <w:jc w:val="both"/>
+        <w:rPr>
+          <w:rFonts w:ascii="Garamond" w:hAnsi="Garamond" w:eastAsia="Times New Roman" w:cs="Times New Roman"/>
+          <w:color w:val="000000"/>
+          <w:kern w:val="0"/>
+          <w:sz w:val="36"/>
+          <w:szCs w:val="36"/>
+          <w:shd w:fill="auto" w:val="clear"/>
+          <w:lang w:val="en-US" w:eastAsia="zh-CN" w:bidi="hi-IN"/>
+        </w:rPr>
+      </w:pPr>
+      <w:r>
+        <w:rPr>
+          <w:rFonts w:eastAsia="Times New Roman" w:cs="Times New Roman" w:ascii="Garamond" w:hAnsi="Garamond"/>
+          <w:color w:val="000000"/>
+          <w:kern w:val="0"/>
+          <w:sz w:val="36"/>
+          <w:szCs w:val="36"/>
+          <w:shd w:fill="auto" w:val="clear"/>
+          <w:lang w:val="en-US" w:eastAsia="zh-CN" w:bidi="hi-IN"/>
+        </w:rPr>
+      </w:r>
+    </w:p>
+    <w:p>
+      <w:pPr>
+        <w:pStyle w:val="Normal"/>
+        <w:jc w:val="both"/>
+        <w:rPr>
+          <w:rFonts w:ascii="Garamond" w:hAnsi="Garamond" w:eastAsia="Times New Roman" w:cs="Times New Roman"/>
+          <w:color w:val="000000"/>
+          <w:kern w:val="0"/>
+          <w:sz w:val="36"/>
+          <w:szCs w:val="36"/>
+          <w:shd w:fill="auto" w:val="clear"/>
+          <w:lang w:val="en-US" w:eastAsia="zh-CN" w:bidi="hi-IN"/>
+        </w:rPr>
+      </w:pPr>
+      <w:r>
+        <w:rPr>
+          <w:rFonts w:eastAsia="Times New Roman" w:cs="Times New Roman" w:ascii="Garamond" w:hAnsi="Garamond"/>
+          <w:color w:val="000000"/>
+          <w:kern w:val="0"/>
+          <w:sz w:val="36"/>
+          <w:szCs w:val="36"/>
+          <w:shd w:fill="auto" w:val="clear"/>
+          <w:lang w:val="en-US" w:eastAsia="zh-CN" w:bidi="hi-IN"/>
+        </w:rPr>
+        <w:t>Resumindo: Deus cria seres perfectíveis; o mal nasce do uso imperfeito da liberdade antes que o Espírito compreenda plenamente o bem.</w:t>
+      </w:r>
+    </w:p>
+    <w:p>
+      <w:pPr>
+        <w:pStyle w:val="Normal"/>
+        <w:jc w:val="both"/>
+        <w:rPr>
+          <w:rFonts w:ascii="Garamond" w:hAnsi="Garamond" w:eastAsia="Times New Roman" w:cs="Times New Roman"/>
+          <w:color w:val="000000"/>
+          <w:kern w:val="0"/>
+          <w:sz w:val="36"/>
+          <w:szCs w:val="36"/>
+          <w:shd w:fill="auto" w:val="clear"/>
+          <w:lang w:val="en-US" w:eastAsia="zh-CN" w:bidi="hi-IN"/>
+        </w:rPr>
+      </w:pPr>
+      <w:r>
+        <w:rPr>
+          <w:rFonts w:eastAsia="Times New Roman" w:cs="Times New Roman" w:ascii="Garamond" w:hAnsi="Garamond"/>
+          <w:color w:val="000000"/>
+          <w:kern w:val="0"/>
+          <w:sz w:val="36"/>
+          <w:szCs w:val="36"/>
+          <w:shd w:fill="auto" w:val="clear"/>
+          <w:lang w:val="en-US" w:eastAsia="zh-CN" w:bidi="hi-IN"/>
+        </w:rPr>
+      </w:r>
+    </w:p>
+    <w:p>
+      <w:pPr>
+        <w:pStyle w:val="TextBody"/>
+        <w:jc w:val="both"/>
+        <w:rPr>
+          <w:rFonts w:ascii="Garamond" w:hAnsi="Garamond" w:eastAsia="Times New Roman" w:cs="Times New Roman"/>
+          <w:color w:val="000000"/>
+          <w:kern w:val="0"/>
+          <w:sz w:val="36"/>
+          <w:szCs w:val="36"/>
+          <w:shd w:fill="auto" w:val="clear"/>
+          <w:lang w:val="en-US" w:eastAsia="zh-CN" w:bidi="hi-IN"/>
+        </w:rPr>
+      </w:pPr>
+      <w:r>
+        <w:rPr>
+          <w:rFonts w:eastAsia="Times New Roman" w:cs="Times New Roman" w:ascii="Garamond" w:hAnsi="Garamond"/>
+          <w:color w:val="000000"/>
+          <w:kern w:val="0"/>
+          <w:sz w:val="36"/>
+          <w:szCs w:val="36"/>
+          <w:shd w:fill="auto" w:val="clear"/>
+          <w:lang w:val="en-US" w:eastAsia="zh-CN" w:bidi="hi-IN"/>
+        </w:rPr>
+        <w:t>Trouxemos essas explicações porque elas nos ajudarão a compreender a parábola do joio e do trigo, já que apresentaremos diferentes interpretações a respeito dela.</w:t>
+      </w:r>
+    </w:p>
+    <w:p>
+      <w:pPr>
+        <w:pStyle w:val="Normal"/>
+        <w:jc w:val="both"/>
+        <w:rPr>
+          <w:rFonts w:ascii="Garamond" w:hAnsi="Garamond" w:eastAsia="Times New Roman" w:cs="Times New Roman"/>
+          <w:color w:val="000000"/>
+          <w:kern w:val="0"/>
+          <w:sz w:val="36"/>
+          <w:szCs w:val="36"/>
+          <w:shd w:fill="auto" w:val="clear"/>
+          <w:lang w:val="en-US" w:eastAsia="zh-CN" w:bidi="hi-IN"/>
         </w:rPr>
       </w:pPr>
       <w:r>
         <w:rPr/>
-      </w:r>
-    </w:p>
-    <w:p>
-      <w:pPr>
-        <w:pStyle w:val="Normal"/>
-        <w:jc w:val="both"/>
-        <w:rPr>
-          <w:sz w:val="36"/>
-          <w:szCs w:val="36"/>
-        </w:rPr>
-      </w:pPr>
-      <w:r>
-        <w:rPr>
-          <w:rFonts w:eastAsia="Times New Roman" w:cs="Times New Roman" w:ascii="Garamond" w:hAnsi="Garamond"/>
-          <w:color w:val="000000"/>
-          <w:kern w:val="0"/>
-          <w:sz w:val="36"/>
-          <w:szCs w:val="36"/>
-          <w:shd w:fill="auto" w:val="clear"/>
-          <w:lang w:val="en-US" w:eastAsia="zh-CN" w:bidi="hi-IN"/>
-        </w:rPr>
-        <w:t xml:space="preserve">Como fica então </w:t>
-      </w:r>
-      <w:r>
-        <w:rPr>
-          <w:rFonts w:eastAsia="Times New Roman" w:cs="Times New Roman" w:ascii="Garamond" w:hAnsi="Garamond"/>
-          <w:color w:val="000000"/>
-          <w:kern w:val="0"/>
-          <w:sz w:val="36"/>
-          <w:szCs w:val="36"/>
-          <w:shd w:fill="auto" w:val="clear"/>
-          <w:lang w:val="en-US" w:eastAsia="zh-CN" w:bidi="hi-IN"/>
-        </w:rPr>
-        <w:t>[ parei aqui em 25/05/2026 para resolver problemas da contratação ]</w:t>
-      </w:r>
-    </w:p>
-    <w:p>
-      <w:pPr>
-        <w:pStyle w:val="Normal"/>
-        <w:jc w:val="both"/>
-        <w:rPr>
-          <w:sz w:val="36"/>
-          <w:szCs w:val="36"/>
-        </w:rPr>
-      </w:pPr>
-      <w:r>
-        <w:rPr>
-          <w:sz w:val="36"/>
-          <w:szCs w:val="36"/>
-        </w:rPr>
-      </w:r>
-    </w:p>
-    <w:p>
-      <w:pPr>
-        <w:pStyle w:val="Normal"/>
-        <w:jc w:val="both"/>
-        <w:rPr>
-          <w:sz w:val="36"/>
-          <w:szCs w:val="36"/>
-        </w:rPr>
-      </w:pPr>
-      <w:r>
-        <w:rPr>
-          <w:sz w:val="36"/>
-          <w:szCs w:val="36"/>
-        </w:rPr>
-      </w:r>
-    </w:p>
-    <w:p>
-      <w:pPr>
-        <w:pStyle w:val="Normal"/>
-        <w:jc w:val="both"/>
-        <w:rPr>
-          <w:sz w:val="36"/>
-          <w:szCs w:val="36"/>
-        </w:rPr>
-      </w:pPr>
-      <w:r>
-        <w:rPr>
-          <w:rFonts w:eastAsia="Times New Roman" w:cs="Times New Roman" w:ascii="Garamond" w:hAnsi="Garamond"/>
-          <w:color w:val="000000"/>
-          <w:kern w:val="0"/>
-          <w:sz w:val="36"/>
-          <w:szCs w:val="36"/>
-          <w:shd w:fill="auto" w:val="clear"/>
-          <w:lang w:val="en-US" w:eastAsia="zh-CN" w:bidi="hi-IN"/>
-        </w:rPr>
-        <w:t>O Espiritismo rejeita a ideia de penas eternas por considerá-la incompatível com a justiça e a misericórdia divinas. A alma não tem uma única existência, mas nasce e renasce inúmeras vezes. Cada nova existência é programada de acordo com os méritos adquiridos e os débitos contraídos pelo Espírito até então.</w:t>
-      </w:r>
-    </w:p>
-    <w:p>
-      <w:pPr>
-        <w:pStyle w:val="Normal"/>
-        <w:jc w:val="both"/>
-        <w:rPr>
-          <w:sz w:val="36"/>
-          <w:szCs w:val="36"/>
-        </w:rPr>
-      </w:pPr>
-      <w:r>
-        <w:rPr>
-          <w:sz w:val="36"/>
-          <w:szCs w:val="36"/>
-        </w:rPr>
-      </w:r>
-    </w:p>
-    <w:p>
-      <w:pPr>
-        <w:pStyle w:val="Normal"/>
-        <w:jc w:val="both"/>
-        <w:rPr>
-          <w:sz w:val="36"/>
-          <w:szCs w:val="36"/>
-        </w:rPr>
-      </w:pPr>
-      <w:r>
-        <w:rPr>
-          <w:rFonts w:eastAsia="Times New Roman" w:cs="Times New Roman" w:ascii="Garamond" w:hAnsi="Garamond"/>
-          <w:color w:val="000000"/>
-          <w:kern w:val="0"/>
-          <w:sz w:val="36"/>
-          <w:szCs w:val="36"/>
-          <w:shd w:fill="auto" w:val="clear"/>
-          <w:lang w:val="en-US" w:eastAsia="zh-CN" w:bidi="hi-IN"/>
-        </w:rPr>
-        <w:t xml:space="preserve">O sofrimento espiritual existe sim, mas é sempre temporário e educativo, pois todo Espírito está destinado ao progresso moral. </w:t>
-      </w:r>
-    </w:p>
-    <w:p>
-      <w:pPr>
-        <w:pStyle w:val="Normal"/>
-        <w:jc w:val="both"/>
-        <w:rPr>
-          <w:sz w:val="36"/>
-          <w:szCs w:val="36"/>
-        </w:rPr>
-      </w:pPr>
-      <w:r>
-        <w:rPr>
-          <w:sz w:val="36"/>
-          <w:szCs w:val="36"/>
-        </w:rPr>
-      </w:r>
-    </w:p>
-    <w:p>
-      <w:pPr>
-        <w:pStyle w:val="Normal"/>
-        <w:jc w:val="both"/>
-        <w:rPr>
-          <w:sz w:val="36"/>
-          <w:szCs w:val="36"/>
-        </w:rPr>
-      </w:pPr>
-      <w:r>
-        <w:rPr>
-          <w:rFonts w:eastAsia="Times New Roman" w:cs="Times New Roman" w:ascii="Garamond" w:hAnsi="Garamond"/>
-          <w:color w:val="000000"/>
-          <w:kern w:val="0"/>
-          <w:sz w:val="36"/>
-          <w:szCs w:val="36"/>
-          <w:shd w:fill="auto" w:val="clear"/>
-          <w:lang w:val="en-US" w:eastAsia="zh-CN" w:bidi="hi-IN"/>
-        </w:rPr>
-        <w:t>Céu e inferno deixam de ser locais definitivos de recompensa ou condenação e passam a representar estados transitórios da consciência, diretamente ligados às escolhas e ao grau evolutivo de cada Espírito.</w:t>
-      </w:r>
-    </w:p>
-    <w:p>
-      <w:pPr>
-        <w:pStyle w:val="Normal"/>
-        <w:jc w:val="both"/>
-        <w:rPr>
-          <w:sz w:val="36"/>
-          <w:szCs w:val="36"/>
-        </w:rPr>
-      </w:pPr>
-      <w:r>
-        <w:rPr>
-          <w:sz w:val="36"/>
-          <w:szCs w:val="36"/>
-        </w:rPr>
-      </w:r>
-    </w:p>
-    <w:p>
-      <w:pPr>
-        <w:pStyle w:val="Normal"/>
-        <w:jc w:val="both"/>
-        <w:rPr>
-          <w:sz w:val="36"/>
-          <w:szCs w:val="36"/>
-        </w:rPr>
-      </w:pPr>
-      <w:r>
-        <w:rPr>
-          <w:rFonts w:eastAsia="Times New Roman" w:cs="Times New Roman" w:ascii="Garamond" w:hAnsi="Garamond"/>
-          <w:color w:val="000000"/>
-          <w:kern w:val="0"/>
-          <w:sz w:val="36"/>
-          <w:szCs w:val="36"/>
-          <w:shd w:fill="auto" w:val="clear"/>
-          <w:lang w:val="en-US" w:eastAsia="zh-CN" w:bidi="hi-IN"/>
-        </w:rPr>
-        <w:t>Por maior que seja o sofrimento pelo qual o Espírito - encarnado ou desencarnado - esteja passando, há um motivo justo para aquele sofrimento, mas o Espírito jamais deixa de ser amparado pelo amor e pela misericórdia de Deus.</w:t>
-      </w:r>
-    </w:p>
-    <w:p>
-      <w:pPr>
-        <w:pStyle w:val="Normal"/>
-        <w:jc w:val="both"/>
-        <w:rPr>
-          <w:sz w:val="36"/>
-          <w:szCs w:val="36"/>
-        </w:rPr>
-      </w:pPr>
-      <w:r>
-        <w:rPr>
-          <w:sz w:val="36"/>
-          <w:szCs w:val="36"/>
-        </w:rPr>
-      </w:r>
-    </w:p>
-    <w:p>
-      <w:pPr>
-        <w:pStyle w:val="Normal"/>
-        <w:jc w:val="both"/>
-        <w:rPr>
-          <w:sz w:val="36"/>
-          <w:szCs w:val="36"/>
-        </w:rPr>
-      </w:pPr>
-      <w:r>
-        <w:rPr>
-          <w:rFonts w:eastAsia="Times New Roman" w:cs="Times New Roman" w:ascii="Garamond" w:hAnsi="Garamond"/>
-          <w:color w:val="000000"/>
-          <w:kern w:val="0"/>
-          <w:sz w:val="36"/>
-          <w:szCs w:val="36"/>
-          <w:shd w:fill="auto" w:val="clear"/>
-          <w:lang w:val="en-US" w:eastAsia="zh-CN" w:bidi="hi-IN"/>
-        </w:rPr>
-        <w:t>Por isso a Doutrina Espírita é tão consoladora: ela nos revela um Deus que rege o universo com sabedoria, amor e misericórdia, ao mesmo tempo em que esclarece os ensinamentos do Evangelho de Jesus de forma simples e profunda, ajudando-nos a compreendê-los e aplicá-los em nossa vida.</w:t>
-      </w:r>
-    </w:p>
-    <w:p>
-      <w:pPr>
-        <w:pStyle w:val="Normal"/>
-        <w:jc w:val="both"/>
-        <w:rPr>
-          <w:sz w:val="36"/>
-          <w:szCs w:val="36"/>
-        </w:rPr>
-      </w:pPr>
-      <w:r>
-        <w:rPr>
-          <w:sz w:val="36"/>
-          <w:szCs w:val="36"/>
-        </w:rPr>
-      </w:r>
-    </w:p>
-    <w:p>
-      <w:pPr>
-        <w:pStyle w:val="Normal"/>
-        <w:jc w:val="both"/>
-        <w:rPr>
-          <w:sz w:val="36"/>
-          <w:szCs w:val="36"/>
-        </w:rPr>
-      </w:pPr>
-      <w:r>
-        <w:rPr>
-          <w:rFonts w:eastAsia="Times New Roman" w:cs="Times New Roman" w:ascii="Garamond" w:hAnsi="Garamond"/>
-          <w:color w:val="000000"/>
-          <w:kern w:val="0"/>
-          <w:sz w:val="36"/>
-          <w:szCs w:val="36"/>
-          <w:shd w:fill="auto" w:val="clear"/>
-          <w:lang w:val="en-US" w:eastAsia="zh-CN" w:bidi="hi-IN"/>
-        </w:rPr>
-        <w:t>Mas, mesmo com toda a luz que o Espiritismo traz, ainda não conseguimos compreender determinados conceitos, não por alguma deficiência da doutrina, mas porque nos faltam conhecimentos acerca de muitas coisas. E não tem nada de errado com isso. É uma condição natural, considerando o atual estágio evolutivo em que nos encontramos.</w:t>
-      </w:r>
-    </w:p>
-    <w:p>
-      <w:pPr>
-        <w:pStyle w:val="Normal"/>
-        <w:jc w:val="both"/>
-        <w:rPr>
-          <w:sz w:val="36"/>
-          <w:szCs w:val="36"/>
-        </w:rPr>
-      </w:pPr>
-      <w:r>
-        <w:rPr>
-          <w:sz w:val="36"/>
-          <w:szCs w:val="36"/>
-        </w:rPr>
-      </w:r>
-    </w:p>
-    <w:p>
-      <w:pPr>
-        <w:pStyle w:val="Normal"/>
-        <w:jc w:val="both"/>
-        <w:rPr>
-          <w:sz w:val="36"/>
-          <w:szCs w:val="36"/>
-        </w:rPr>
-      </w:pPr>
-      <w:r>
-        <w:rPr>
-          <w:sz w:val="36"/>
-          <w:szCs w:val="36"/>
-        </w:rPr>
-      </w:r>
-    </w:p>
-    <w:p>
-      <w:pPr>
-        <w:pStyle w:val="Normal"/>
-        <w:jc w:val="both"/>
-        <w:rPr>
-          <w:sz w:val="36"/>
-          <w:szCs w:val="36"/>
-        </w:rPr>
-      </w:pPr>
-      <w:r>
-        <w:rPr>
-          <w:rFonts w:eastAsia="Times New Roman" w:cs="Times New Roman" w:ascii="Garamond" w:hAnsi="Garamond"/>
-          <w:color w:val="000000"/>
-          <w:kern w:val="0"/>
-          <w:sz w:val="36"/>
-          <w:szCs w:val="36"/>
-          <w:shd w:fill="auto" w:val="clear"/>
-          <w:lang w:val="en-US" w:eastAsia="zh-CN" w:bidi="hi-IN"/>
-        </w:rPr>
-        <w:t>Deus é um desses conceitos. Em O Livro dos Espíritos, a Espiritualidade diz a Kardec que Deus é a inteligência suprema, causa primária de todas as coisas. Deus é eterno, infinito, imutável. Criou o Universo, que abrange todos os seres animados e inanimados, materiais e imateriais.</w:t>
-      </w:r>
-    </w:p>
-    <w:p>
-      <w:pPr>
-        <w:pStyle w:val="Normal"/>
-        <w:jc w:val="both"/>
-        <w:rPr>
-          <w:sz w:val="36"/>
-          <w:szCs w:val="36"/>
-        </w:rPr>
-      </w:pPr>
-      <w:r>
-        <w:rPr>
-          <w:sz w:val="36"/>
-          <w:szCs w:val="36"/>
-        </w:rPr>
-      </w:r>
-    </w:p>
-    <w:p>
-      <w:pPr>
-        <w:pStyle w:val="Normal"/>
-        <w:jc w:val="both"/>
-        <w:rPr>
-          <w:sz w:val="36"/>
-          <w:szCs w:val="36"/>
-        </w:rPr>
-      </w:pPr>
-      <w:r>
-        <w:rPr>
-          <w:rFonts w:eastAsia="Times New Roman" w:cs="Times New Roman" w:ascii="Garamond" w:hAnsi="Garamond"/>
-          <w:color w:val="000000"/>
-          <w:kern w:val="0"/>
-          <w:sz w:val="36"/>
-          <w:szCs w:val="36"/>
-          <w:shd w:fill="auto" w:val="clear"/>
-          <w:lang w:val="en-US" w:eastAsia="zh-CN" w:bidi="hi-IN"/>
-        </w:rPr>
-        <w:t>Deus não teve começo e não terá fim.</w:t>
-      </w:r>
-    </w:p>
-    <w:p>
-      <w:pPr>
-        <w:pStyle w:val="Normal"/>
-        <w:jc w:val="both"/>
-        <w:rPr>
-          <w:sz w:val="36"/>
-          <w:szCs w:val="36"/>
-        </w:rPr>
-      </w:pPr>
-      <w:r>
-        <w:rPr>
-          <w:sz w:val="36"/>
-          <w:szCs w:val="36"/>
-        </w:rPr>
-      </w:r>
-    </w:p>
-    <w:p>
-      <w:pPr>
-        <w:pStyle w:val="Normal"/>
-        <w:jc w:val="both"/>
-        <w:rPr>
-          <w:sz w:val="36"/>
-          <w:szCs w:val="36"/>
-        </w:rPr>
-      </w:pPr>
-      <w:r>
-        <w:rPr>
-          <w:rFonts w:eastAsia="Times New Roman" w:cs="Times New Roman" w:ascii="Garamond" w:hAnsi="Garamond"/>
-          <w:color w:val="000000"/>
-          <w:kern w:val="0"/>
-          <w:sz w:val="36"/>
-          <w:szCs w:val="36"/>
-          <w:shd w:fill="auto" w:val="clear"/>
-          <w:lang w:val="en-US" w:eastAsia="zh-CN" w:bidi="hi-IN"/>
-        </w:rPr>
-        <w:t>Falando com bastante sinceridade, nós não conseguimos compreender realmente o que Deus é. Como é possível que exista algo que não teve começo? Tudo, absolutamente tudo o que nós conhecemos teve um começo, foi criado por alguém, ainda que seja o próprio Deus.</w:t>
-      </w:r>
-    </w:p>
-    <w:p>
-      <w:pPr>
-        <w:pStyle w:val="Normal"/>
-        <w:jc w:val="both"/>
-        <w:rPr>
-          <w:sz w:val="36"/>
-          <w:szCs w:val="36"/>
-        </w:rPr>
-      </w:pPr>
-      <w:r>
-        <w:rPr>
-          <w:sz w:val="36"/>
-          <w:szCs w:val="36"/>
-        </w:rPr>
-      </w:r>
-    </w:p>
-    <w:p>
-      <w:pPr>
-        <w:pStyle w:val="Normal"/>
-        <w:jc w:val="both"/>
-        <w:rPr>
-          <w:sz w:val="36"/>
-          <w:szCs w:val="36"/>
-        </w:rPr>
-      </w:pPr>
-      <w:r>
-        <w:rPr>
-          <w:rFonts w:eastAsia="Times New Roman" w:cs="Times New Roman" w:ascii="Garamond" w:hAnsi="Garamond"/>
-          <w:color w:val="000000"/>
-          <w:kern w:val="0"/>
-          <w:sz w:val="36"/>
-          <w:szCs w:val="36"/>
-          <w:shd w:fill="auto" w:val="clear"/>
-          <w:lang w:val="en-US" w:eastAsia="zh-CN" w:bidi="hi-IN"/>
-        </w:rPr>
-        <w:t>Por mais remotos sejam os tempos nos quais nossa imaginação consiga retroceder, só conseguimos conceber alguma coisa como tendo sido criada por alguém. Aceitar a ideia de que algo é "incriado" é muito difícil para nós.</w:t>
-      </w:r>
-    </w:p>
-    <w:p>
-      <w:pPr>
-        <w:pStyle w:val="Normal"/>
-        <w:jc w:val="both"/>
-        <w:rPr>
-          <w:sz w:val="36"/>
-          <w:szCs w:val="36"/>
-        </w:rPr>
-      </w:pPr>
-      <w:r>
-        <w:rPr>
-          <w:sz w:val="36"/>
-          <w:szCs w:val="36"/>
-        </w:rPr>
-      </w:r>
-    </w:p>
-    <w:p>
-      <w:pPr>
-        <w:pStyle w:val="Normal"/>
-        <w:jc w:val="both"/>
-        <w:rPr>
-          <w:sz w:val="36"/>
-          <w:szCs w:val="36"/>
-        </w:rPr>
-      </w:pPr>
-      <w:r>
-        <w:rPr>
-          <w:rFonts w:eastAsia="Times New Roman" w:cs="Times New Roman" w:ascii="Garamond" w:hAnsi="Garamond"/>
-          <w:color w:val="000000"/>
-          <w:kern w:val="0"/>
-          <w:sz w:val="36"/>
-          <w:szCs w:val="36"/>
-          <w:shd w:fill="auto" w:val="clear"/>
-          <w:lang w:val="en-US" w:eastAsia="zh-CN" w:bidi="hi-IN"/>
-        </w:rPr>
-        <w:t>Então, sendo honestos conosco mesmo, a verdade é que ainda não conseguimos compreender o que é Deus.</w:t>
-      </w:r>
-    </w:p>
-    <w:p>
-      <w:pPr>
-        <w:pStyle w:val="Normal"/>
-        <w:jc w:val="both"/>
-        <w:rPr>
-          <w:sz w:val="36"/>
-          <w:szCs w:val="36"/>
-        </w:rPr>
-      </w:pPr>
-      <w:r>
-        <w:rPr>
-          <w:sz w:val="36"/>
-          <w:szCs w:val="36"/>
-        </w:rPr>
-      </w:r>
-    </w:p>
-    <w:p>
-      <w:pPr>
-        <w:pStyle w:val="Normal"/>
-        <w:jc w:val="both"/>
-        <w:rPr>
-          <w:sz w:val="36"/>
-          <w:szCs w:val="36"/>
-        </w:rPr>
-      </w:pPr>
-      <w:r>
-        <w:rPr>
-          <w:rFonts w:eastAsia="Times New Roman" w:cs="Times New Roman" w:ascii="Garamond" w:hAnsi="Garamond"/>
-          <w:color w:val="000000"/>
-          <w:kern w:val="0"/>
-          <w:sz w:val="36"/>
-          <w:szCs w:val="36"/>
-          <w:shd w:fill="auto" w:val="clear"/>
-          <w:lang w:val="en-US" w:eastAsia="zh-CN" w:bidi="hi-IN"/>
-        </w:rPr>
-        <w:t>Como nós lidamos com isso? Seguindo a recomendação da própria Espiritualidade. Na resposta da pergunta 14 de O Livro dos Espíritos, ela nos aconselha a não tentarmos descobrir a essência de Deus, pois entraríamos em um labirinto do qual jamais sairíamos.</w:t>
-      </w:r>
-    </w:p>
-    <w:p>
-      <w:pPr>
-        <w:pStyle w:val="Normal"/>
-        <w:jc w:val="both"/>
-        <w:rPr>
-          <w:sz w:val="36"/>
-          <w:szCs w:val="36"/>
-        </w:rPr>
-      </w:pPr>
-      <w:r>
-        <w:rPr>
-          <w:sz w:val="36"/>
-          <w:szCs w:val="36"/>
-        </w:rPr>
-      </w:r>
-    </w:p>
-    <w:p>
-      <w:pPr>
-        <w:pStyle w:val="Normal"/>
-        <w:jc w:val="both"/>
-        <w:rPr>
-          <w:sz w:val="36"/>
-          <w:szCs w:val="36"/>
-        </w:rPr>
-      </w:pPr>
-      <w:r>
-        <w:rPr>
-          <w:rFonts w:eastAsia="Times New Roman" w:cs="Times New Roman" w:ascii="Garamond" w:hAnsi="Garamond"/>
-          <w:color w:val="000000"/>
-          <w:kern w:val="0"/>
-          <w:sz w:val="36"/>
-          <w:szCs w:val="36"/>
-          <w:shd w:fill="auto" w:val="clear"/>
-          <w:lang w:val="en-US" w:eastAsia="zh-CN" w:bidi="hi-IN"/>
-        </w:rPr>
-        <w:t>Então, para o momento, devemos simplesmente seguir os conselhos da Espiritualidade. E convenhamos: nós já temos preocupações suficientes com nossas imperfeições. Se ocuparmos nosso tempo tentando superá-las, já teremos feito muito na atual existência.</w:t>
-      </w:r>
-    </w:p>
-    <w:p>
-      <w:pPr>
-        <w:pStyle w:val="Normal"/>
-        <w:jc w:val="both"/>
-        <w:rPr>
-          <w:sz w:val="36"/>
-          <w:szCs w:val="36"/>
-        </w:rPr>
-      </w:pPr>
-      <w:r>
-        <w:rPr>
-          <w:sz w:val="36"/>
-          <w:szCs w:val="36"/>
-        </w:rPr>
-      </w:r>
-    </w:p>
-    <w:p>
-      <w:pPr>
-        <w:pStyle w:val="Normal"/>
-        <w:jc w:val="both"/>
-        <w:rPr>
-          <w:sz w:val="36"/>
-          <w:szCs w:val="36"/>
-        </w:rPr>
-      </w:pPr>
-      <w:r>
-        <w:rPr>
-          <w:rFonts w:eastAsia="Times New Roman" w:cs="Times New Roman" w:ascii="Garamond" w:hAnsi="Garamond"/>
-          <w:color w:val="000000"/>
-          <w:kern w:val="0"/>
-          <w:sz w:val="36"/>
-          <w:szCs w:val="36"/>
-          <w:shd w:fill="auto" w:val="clear"/>
-          <w:lang w:val="en-US" w:eastAsia="zh-CN" w:bidi="hi-IN"/>
-        </w:rPr>
-        <w:t>Outro conceito cuja compreensão ainda nos escapa - e sobre o qual nós falaremos hoje dentro do nosso tema -, é o mal.</w:t>
-      </w:r>
-    </w:p>
-    <w:p>
-      <w:pPr>
-        <w:pStyle w:val="Normal"/>
-        <w:jc w:val="both"/>
-        <w:rPr>
-          <w:sz w:val="36"/>
-          <w:szCs w:val="36"/>
-        </w:rPr>
-      </w:pPr>
-      <w:r>
-        <w:rPr>
-          <w:sz w:val="36"/>
-          <w:szCs w:val="36"/>
-        </w:rPr>
-      </w:r>
-    </w:p>
-    <w:p>
-      <w:pPr>
-        <w:pStyle w:val="Normal"/>
-        <w:jc w:val="both"/>
-        <w:rPr>
-          <w:sz w:val="36"/>
-          <w:szCs w:val="36"/>
-        </w:rPr>
-      </w:pPr>
-      <w:r>
-        <w:rPr>
-          <w:rFonts w:eastAsia="Times New Roman" w:cs="Times New Roman" w:ascii="Garamond" w:hAnsi="Garamond"/>
-          <w:color w:val="000000"/>
-          <w:kern w:val="0"/>
-          <w:sz w:val="36"/>
-          <w:szCs w:val="36"/>
-          <w:shd w:fill="auto" w:val="clear"/>
-          <w:lang w:val="en-US" w:eastAsia="zh-CN" w:bidi="hi-IN"/>
-        </w:rPr>
-        <w:t xml:space="preserve">A Doutrina Espírita nos ensina que o mal não existe. Bom, é um pouco difícil aceitarmos isso. Se tem algo que salta aos nossos olhos em qualquer direção que nós olhamos, é o mal. </w:t>
-      </w:r>
-    </w:p>
-    <w:p>
-      <w:pPr>
-        <w:pStyle w:val="Normal"/>
-        <w:jc w:val="both"/>
-        <w:rPr>
-          <w:sz w:val="36"/>
-          <w:szCs w:val="36"/>
-        </w:rPr>
-      </w:pPr>
-      <w:r>
-        <w:rPr>
-          <w:sz w:val="36"/>
-          <w:szCs w:val="36"/>
-        </w:rPr>
-      </w:r>
-    </w:p>
-    <w:p>
-      <w:pPr>
-        <w:pStyle w:val="Normal"/>
-        <w:jc w:val="both"/>
-        <w:rPr>
-          <w:rFonts w:ascii="Garamond" w:hAnsi="Garamond" w:eastAsia="Times New Roman" w:cs="Times New Roman"/>
-          <w:color w:val="000000"/>
-          <w:kern w:val="0"/>
-          <w:sz w:val="36"/>
-          <w:szCs w:val="36"/>
-          <w:shd w:fill="auto" w:val="clear"/>
-          <w:lang w:val="en-US" w:eastAsia="zh-CN" w:bidi="hi-IN"/>
-        </w:rPr>
-      </w:pPr>
-      <w:r>
-        <w:rPr>
-          <w:rFonts w:eastAsia="Times New Roman" w:cs="Times New Roman" w:ascii="Garamond" w:hAnsi="Garamond"/>
-          <w:color w:val="000000"/>
-          <w:kern w:val="0"/>
-          <w:sz w:val="36"/>
-          <w:szCs w:val="36"/>
-          <w:shd w:fill="auto" w:val="clear"/>
-          <w:lang w:val="en-US" w:eastAsia="zh-CN" w:bidi="hi-IN"/>
-        </w:rPr>
-        <w:t>Vemos o mal sendo praticado, nós mesmos ainda o praticamos, presenciamos e sentimos as consequências de sua prática e a Doutrina Espírita diz que ele não existe?</w:t>
-      </w:r>
-    </w:p>
-    <w:p>
-      <w:pPr>
-        <w:pStyle w:val="Normal"/>
-        <w:jc w:val="both"/>
-        <w:rPr>
-          <w:rFonts w:ascii="Garamond" w:hAnsi="Garamond" w:eastAsia="Times New Roman" w:cs="Times New Roman"/>
-          <w:color w:val="000000"/>
-          <w:kern w:val="0"/>
-          <w:sz w:val="36"/>
-          <w:szCs w:val="36"/>
-          <w:shd w:fill="auto" w:val="clear"/>
-          <w:lang w:val="en-US" w:eastAsia="zh-CN" w:bidi="hi-IN"/>
-        </w:rPr>
-      </w:pPr>
-      <w:r>
-        <w:rPr>
-          <w:rFonts w:eastAsia="Times New Roman" w:cs="Times New Roman" w:ascii="Garamond" w:hAnsi="Garamond"/>
-          <w:color w:val="000000"/>
-          <w:kern w:val="0"/>
-          <w:sz w:val="36"/>
-          <w:szCs w:val="36"/>
-          <w:shd w:fill="auto" w:val="clear"/>
-          <w:lang w:val="en-US" w:eastAsia="zh-CN" w:bidi="hi-IN"/>
-        </w:rPr>
-      </w:r>
-    </w:p>
-    <w:p>
-      <w:pPr>
-        <w:pStyle w:val="Normal"/>
-        <w:jc w:val="both"/>
-        <w:rPr>
-          <w:rFonts w:ascii="Garamond" w:hAnsi="Garamond" w:eastAsia="Times New Roman" w:cs="Times New Roman"/>
-          <w:color w:val="000000"/>
-          <w:kern w:val="0"/>
-          <w:sz w:val="36"/>
-          <w:szCs w:val="36"/>
-          <w:shd w:fill="auto" w:val="clear"/>
-          <w:lang w:val="en-US" w:eastAsia="zh-CN" w:bidi="hi-IN"/>
-        </w:rPr>
-      </w:pPr>
-      <w:r>
-        <w:rPr>
-          <w:rFonts w:eastAsia="Times New Roman" w:cs="Times New Roman" w:ascii="Garamond" w:hAnsi="Garamond"/>
-          <w:color w:val="000000"/>
-          <w:kern w:val="0"/>
-          <w:sz w:val="36"/>
-          <w:szCs w:val="36"/>
-          <w:shd w:fill="auto" w:val="clear"/>
-          <w:lang w:val="en-US" w:eastAsia="zh-CN" w:bidi="hi-IN"/>
-        </w:rPr>
-        <w:t>Vamos analisar mais detalhadamente o que o Espiritismo realmente nos diz sobre o mal. Isso será  fundamental para compreendermos tudo o que falaremos ao longo de nossas reflexões nesta noite.</w:t>
-      </w:r>
-    </w:p>
-    <w:p>
-      <w:pPr>
-        <w:pStyle w:val="Normal"/>
-        <w:jc w:val="both"/>
-        <w:rPr>
-          <w:rFonts w:ascii="Garamond" w:hAnsi="Garamond" w:eastAsia="Times New Roman" w:cs="Times New Roman"/>
-          <w:color w:val="000000"/>
-          <w:kern w:val="0"/>
-          <w:sz w:val="36"/>
-          <w:szCs w:val="36"/>
-          <w:shd w:fill="auto" w:val="clear"/>
-          <w:lang w:val="en-US" w:eastAsia="zh-CN" w:bidi="hi-IN"/>
-        </w:rPr>
-      </w:pPr>
-      <w:r>
-        <w:rPr>
-          <w:rFonts w:eastAsia="Times New Roman" w:cs="Times New Roman" w:ascii="Garamond" w:hAnsi="Garamond"/>
-          <w:color w:val="000000"/>
-          <w:kern w:val="0"/>
-          <w:sz w:val="36"/>
-          <w:szCs w:val="36"/>
-          <w:shd w:fill="auto" w:val="clear"/>
-          <w:lang w:val="en-US" w:eastAsia="zh-CN" w:bidi="hi-IN"/>
-        </w:rPr>
-      </w:r>
-    </w:p>
-    <w:p>
-      <w:pPr>
-        <w:pStyle w:val="Normal"/>
-        <w:jc w:val="both"/>
-        <w:rPr>
-          <w:sz w:val="36"/>
-          <w:szCs w:val="36"/>
-        </w:rPr>
-      </w:pPr>
-      <w:r>
-        <w:rPr>
-          <w:rFonts w:eastAsia="Times New Roman" w:cs="Times New Roman" w:ascii="Garamond" w:hAnsi="Garamond"/>
-          <w:color w:val="000000"/>
-          <w:kern w:val="0"/>
-          <w:sz w:val="36"/>
-          <w:szCs w:val="36"/>
-          <w:shd w:fill="auto" w:val="clear"/>
-          <w:lang w:val="en-US" w:eastAsia="zh-CN" w:bidi="hi-IN"/>
-        </w:rPr>
-        <w:t>No Espiritismo, a ideia de que “o mal não existe em si” significa que o mal não é um princípio absoluto, eterno ou criado por Deus como uma força independente. O mal seria, antes, resultado da ignorância, do atraso moral e do afastamento das leis divinas.</w:t>
-      </w:r>
-    </w:p>
-    <w:p>
-      <w:pPr>
-        <w:pStyle w:val="Normal"/>
-        <w:jc w:val="both"/>
-        <w:rPr>
-          <w:rFonts w:ascii="Garamond" w:hAnsi="Garamond" w:eastAsia="Times New Roman" w:cs="Times New Roman"/>
-          <w:color w:val="000000"/>
-          <w:kern w:val="0"/>
-          <w:sz w:val="36"/>
-          <w:szCs w:val="36"/>
-          <w:shd w:fill="auto" w:val="clear"/>
-          <w:lang w:val="en-US" w:eastAsia="zh-CN" w:bidi="hi-IN"/>
-        </w:rPr>
-      </w:pPr>
-      <w:r>
-        <w:rPr>
-          <w:rFonts w:eastAsia="Times New Roman" w:cs="Times New Roman" w:ascii="Garamond" w:hAnsi="Garamond"/>
-          <w:color w:val="000000"/>
-          <w:kern w:val="0"/>
-          <w:sz w:val="36"/>
-          <w:szCs w:val="36"/>
-          <w:shd w:fill="auto" w:val="clear"/>
-          <w:lang w:val="en-US" w:eastAsia="zh-CN" w:bidi="hi-IN"/>
-        </w:rPr>
-      </w:r>
-    </w:p>
-    <w:p>
-      <w:pPr>
-        <w:pStyle w:val="Normal"/>
-        <w:jc w:val="both"/>
-        <w:rPr>
-          <w:rFonts w:ascii="Garamond" w:hAnsi="Garamond" w:eastAsia="Times New Roman" w:cs="Times New Roman"/>
-          <w:color w:val="000000"/>
-          <w:kern w:val="0"/>
-          <w:sz w:val="36"/>
-          <w:szCs w:val="36"/>
-          <w:shd w:fill="auto" w:val="clear"/>
-          <w:lang w:val="en-US" w:eastAsia="zh-CN" w:bidi="hi-IN"/>
-        </w:rPr>
-      </w:pPr>
-      <w:r>
-        <w:rPr>
-          <w:rFonts w:eastAsia="Times New Roman" w:cs="Times New Roman" w:ascii="Garamond" w:hAnsi="Garamond"/>
-          <w:color w:val="000000"/>
-          <w:kern w:val="0"/>
-          <w:sz w:val="36"/>
-          <w:szCs w:val="36"/>
-          <w:shd w:fill="auto" w:val="clear"/>
-          <w:lang w:val="en-US" w:eastAsia="zh-CN" w:bidi="hi-IN"/>
-        </w:rPr>
-        <w:t>Deus cria todos os Espíritos simples e ignorantes, ignorantes no sentido de nada saberem, mas todos têm o livre-arbítrio, isto é, o direito de escolher o que fazer e quais caminhos seguir.</w:t>
-      </w:r>
-    </w:p>
-    <w:p>
-      <w:pPr>
-        <w:pStyle w:val="Normal"/>
-        <w:jc w:val="both"/>
-        <w:rPr>
-          <w:rFonts w:ascii="Garamond" w:hAnsi="Garamond" w:eastAsia="Times New Roman" w:cs="Times New Roman"/>
-          <w:color w:val="000000"/>
-          <w:kern w:val="0"/>
-          <w:sz w:val="36"/>
-          <w:szCs w:val="36"/>
-          <w:shd w:fill="auto" w:val="clear"/>
-          <w:lang w:val="en-US" w:eastAsia="zh-CN" w:bidi="hi-IN"/>
-        </w:rPr>
-      </w:pPr>
-      <w:r>
-        <w:rPr>
-          <w:rFonts w:eastAsia="Times New Roman" w:cs="Times New Roman" w:ascii="Garamond" w:hAnsi="Garamond"/>
-          <w:color w:val="000000"/>
-          <w:kern w:val="0"/>
-          <w:sz w:val="36"/>
-          <w:szCs w:val="36"/>
-          <w:shd w:fill="auto" w:val="clear"/>
-          <w:lang w:val="en-US" w:eastAsia="zh-CN" w:bidi="hi-IN"/>
-        </w:rPr>
-      </w:r>
-    </w:p>
-    <w:p>
-      <w:pPr>
-        <w:pStyle w:val="Normal"/>
-        <w:jc w:val="both"/>
-        <w:rPr>
-          <w:rFonts w:ascii="Garamond" w:hAnsi="Garamond" w:eastAsia="Times New Roman" w:cs="Times New Roman"/>
-          <w:color w:val="000000"/>
-          <w:kern w:val="0"/>
-          <w:sz w:val="36"/>
-          <w:szCs w:val="36"/>
-          <w:shd w:fill="auto" w:val="clear"/>
-          <w:lang w:val="en-US" w:eastAsia="zh-CN" w:bidi="hi-IN"/>
-        </w:rPr>
-      </w:pPr>
-      <w:r>
-        <w:rPr>
-          <w:rFonts w:eastAsia="Times New Roman" w:cs="Times New Roman" w:ascii="Garamond" w:hAnsi="Garamond"/>
-          <w:color w:val="000000"/>
-          <w:kern w:val="0"/>
-          <w:sz w:val="36"/>
-          <w:szCs w:val="36"/>
-          <w:shd w:fill="auto" w:val="clear"/>
-          <w:lang w:val="en-US" w:eastAsia="zh-CN" w:bidi="hi-IN"/>
-        </w:rPr>
-        <w:t>A ignorância inicial seria uma condição de infância espiritual, necessária para que o ser desenvolva consciência, experiência e mérito próprios ao longo da evolução. O mal surge quando o Espírito, ainda imperfeito, escolhe agir em desacordo com as leis divinas. Portanto, Deus criou a possibilidade do progresso livre, não o mal em si.</w:t>
-      </w:r>
-    </w:p>
-    <w:p>
-      <w:pPr>
-        <w:pStyle w:val="Normal"/>
-        <w:jc w:val="both"/>
-        <w:rPr>
-          <w:rFonts w:ascii="Garamond" w:hAnsi="Garamond" w:eastAsia="Times New Roman" w:cs="Times New Roman"/>
-          <w:color w:val="000000"/>
-          <w:kern w:val="0"/>
-          <w:sz w:val="36"/>
-          <w:szCs w:val="36"/>
-          <w:shd w:fill="auto" w:val="clear"/>
-          <w:lang w:val="en-US" w:eastAsia="zh-CN" w:bidi="hi-IN"/>
-        </w:rPr>
-      </w:pPr>
-      <w:r>
-        <w:rPr>
-          <w:rFonts w:eastAsia="Times New Roman" w:cs="Times New Roman" w:ascii="Garamond" w:hAnsi="Garamond"/>
-          <w:color w:val="000000"/>
-          <w:kern w:val="0"/>
-          <w:sz w:val="36"/>
-          <w:szCs w:val="36"/>
-          <w:shd w:fill="auto" w:val="clear"/>
-          <w:lang w:val="en-US" w:eastAsia="zh-CN" w:bidi="hi-IN"/>
-        </w:rPr>
-      </w:r>
-    </w:p>
-    <w:p>
-      <w:pPr>
-        <w:pStyle w:val="Normal"/>
-        <w:jc w:val="both"/>
-        <w:rPr>
-          <w:rFonts w:ascii="Garamond" w:hAnsi="Garamond" w:eastAsia="Times New Roman" w:cs="Times New Roman"/>
-          <w:color w:val="000000"/>
-          <w:kern w:val="0"/>
-          <w:sz w:val="36"/>
-          <w:szCs w:val="36"/>
-          <w:shd w:fill="auto" w:val="clear"/>
-          <w:lang w:val="en-US" w:eastAsia="zh-CN" w:bidi="hi-IN"/>
-        </w:rPr>
-      </w:pPr>
-      <w:r>
-        <w:rPr>
-          <w:rFonts w:eastAsia="Times New Roman" w:cs="Times New Roman" w:ascii="Garamond" w:hAnsi="Garamond"/>
-          <w:color w:val="000000"/>
-          <w:kern w:val="0"/>
-          <w:sz w:val="36"/>
-          <w:szCs w:val="36"/>
-          <w:shd w:fill="auto" w:val="clear"/>
-          <w:lang w:val="en-US" w:eastAsia="zh-CN" w:bidi="hi-IN"/>
-        </w:rPr>
-        <w:t xml:space="preserve">O Espiritismo não nega o sofrimento, a violência ou as injustiças. O que ele nos diz é que o mal não tem existência eterna nem natureza própria. Ele é tão somente a consequência temporária da imperfeição espiritual. </w:t>
-      </w:r>
-    </w:p>
-    <w:p>
-      <w:pPr>
-        <w:pStyle w:val="Normal"/>
-        <w:jc w:val="both"/>
-        <w:rPr>
-          <w:rFonts w:ascii="Garamond" w:hAnsi="Garamond" w:eastAsia="Times New Roman" w:cs="Times New Roman"/>
-          <w:color w:val="000000"/>
-          <w:kern w:val="0"/>
-          <w:sz w:val="36"/>
-          <w:szCs w:val="36"/>
-          <w:shd w:fill="auto" w:val="clear"/>
-          <w:lang w:val="en-US" w:eastAsia="zh-CN" w:bidi="hi-IN"/>
-        </w:rPr>
-      </w:pPr>
-      <w:r>
-        <w:rPr>
-          <w:rFonts w:eastAsia="Times New Roman" w:cs="Times New Roman" w:ascii="Garamond" w:hAnsi="Garamond"/>
-          <w:color w:val="000000"/>
-          <w:kern w:val="0"/>
-          <w:sz w:val="36"/>
-          <w:szCs w:val="36"/>
-          <w:shd w:fill="auto" w:val="clear"/>
-          <w:lang w:val="en-US" w:eastAsia="zh-CN" w:bidi="hi-IN"/>
-        </w:rPr>
-      </w:r>
-    </w:p>
-    <w:p>
-      <w:pPr>
-        <w:pStyle w:val="Normal"/>
-        <w:jc w:val="both"/>
-        <w:rPr>
-          <w:rFonts w:ascii="Garamond" w:hAnsi="Garamond" w:eastAsia="Times New Roman" w:cs="Times New Roman"/>
-          <w:color w:val="000000"/>
-          <w:kern w:val="0"/>
-          <w:sz w:val="36"/>
-          <w:szCs w:val="36"/>
-          <w:shd w:fill="auto" w:val="clear"/>
-          <w:lang w:val="en-US" w:eastAsia="zh-CN" w:bidi="hi-IN"/>
-        </w:rPr>
-      </w:pPr>
-      <w:r>
-        <w:rPr>
-          <w:rFonts w:eastAsia="Times New Roman" w:cs="Times New Roman" w:ascii="Garamond" w:hAnsi="Garamond"/>
-          <w:color w:val="000000"/>
-          <w:kern w:val="0"/>
-          <w:sz w:val="36"/>
-          <w:szCs w:val="36"/>
-          <w:shd w:fill="auto" w:val="clear"/>
-          <w:lang w:val="en-US" w:eastAsia="zh-CN" w:bidi="hi-IN"/>
-        </w:rPr>
-        <w:t>Resumindo: Deus cria seres perfectíveis; o mal nasce do uso imperfeito da liberdade antes que o Espírito compreenda plenamente o bem.</w:t>
-      </w:r>
-    </w:p>
-    <w:p>
-      <w:pPr>
-        <w:pStyle w:val="Normal"/>
-        <w:jc w:val="both"/>
-        <w:rPr>
-          <w:rFonts w:ascii="Garamond" w:hAnsi="Garamond" w:eastAsia="Times New Roman" w:cs="Times New Roman"/>
-          <w:color w:val="000000"/>
-          <w:kern w:val="0"/>
-          <w:sz w:val="36"/>
-          <w:szCs w:val="36"/>
-          <w:shd w:fill="auto" w:val="clear"/>
-          <w:lang w:val="en-US" w:eastAsia="zh-CN" w:bidi="hi-IN"/>
-        </w:rPr>
-      </w:pPr>
-      <w:r>
-        <w:rPr>
-          <w:rFonts w:eastAsia="Times New Roman" w:cs="Times New Roman" w:ascii="Garamond" w:hAnsi="Garamond"/>
-          <w:color w:val="000000"/>
-          <w:kern w:val="0"/>
-          <w:sz w:val="36"/>
-          <w:szCs w:val="36"/>
-          <w:shd w:fill="auto" w:val="clear"/>
-          <w:lang w:val="en-US" w:eastAsia="zh-CN" w:bidi="hi-IN"/>
-        </w:rPr>
-      </w:r>
-    </w:p>
-    <w:p>
-      <w:pPr>
-        <w:pStyle w:val="Normal"/>
-        <w:jc w:val="both"/>
-        <w:rPr>
-          <w:rFonts w:ascii="Garamond" w:hAnsi="Garamond" w:eastAsia="Times New Roman" w:cs="Times New Roman"/>
-          <w:color w:val="000000"/>
-          <w:kern w:val="0"/>
-          <w:sz w:val="36"/>
-          <w:szCs w:val="36"/>
-          <w:shd w:fill="auto" w:val="clear"/>
-          <w:lang w:val="en-US" w:eastAsia="zh-CN" w:bidi="hi-IN"/>
-        </w:rPr>
-      </w:pPr>
-      <w:r>
-        <w:rPr>
-          <w:rFonts w:eastAsia="Times New Roman" w:cs="Times New Roman" w:ascii="Garamond" w:hAnsi="Garamond"/>
-          <w:color w:val="000000"/>
-          <w:kern w:val="0"/>
-          <w:sz w:val="36"/>
-          <w:szCs w:val="36"/>
-          <w:shd w:fill="auto" w:val="clear"/>
-          <w:lang w:val="en-US" w:eastAsia="zh-CN" w:bidi="hi-IN"/>
-        </w:rPr>
-        <w:t>Trouxemos essas explicações para nos auxiliarem a compreender a parábola do joio e do trigo, já que vamos apresentar diferentes interpretações dela.</w:t>
       </w:r>
     </w:p>
     <w:p>
@@ -3456,24 +3641,25 @@
         <w:jc w:val="both"/>
         <w:rPr>
           <w:rFonts w:ascii="Garamond" w:hAnsi="Garamond" w:eastAsia="Times New Roman" w:cs="Times New Roman"/>
-          <w:color w:val="000000"/>
-          <w:kern w:val="0"/>
-          <w:sz w:val="36"/>
-          <w:szCs w:val="36"/>
-          <w:shd w:fill="auto" w:val="clear"/>
-          <w:lang w:val="en-US" w:eastAsia="zh-CN" w:bidi="hi-IN"/>
-        </w:rPr>
-      </w:pPr>
-      <w:r>
-        <w:rPr>
-          <w:rFonts w:eastAsia="Times New Roman" w:cs="Times New Roman" w:ascii="Garamond" w:hAnsi="Garamond"/>
-          <w:color w:val="000000"/>
-          <w:kern w:val="0"/>
-          <w:sz w:val="36"/>
-          <w:szCs w:val="36"/>
-          <w:shd w:fill="auto" w:val="clear"/>
-          <w:lang w:val="en-US" w:eastAsia="zh-CN" w:bidi="hi-IN"/>
-        </w:rPr>
+          <w:color w:val="E327FF"/>
+          <w:kern w:val="0"/>
+          <w:sz w:val="36"/>
+          <w:szCs w:val="36"/>
+          <w:shd w:fill="auto" w:val="clear"/>
+          <w:lang w:val="en-US" w:eastAsia="zh-CN" w:bidi="hi-IN"/>
+        </w:rPr>
+      </w:pPr>
+      <w:r>
+        <w:rPr>
+          <w:rFonts w:eastAsia="Times New Roman" w:cs="Times New Roman" w:ascii="Garamond" w:hAnsi="Garamond"/>
+          <w:color w:val="E327FF"/>
+          <w:kern w:val="0"/>
+          <w:sz w:val="36"/>
+          <w:szCs w:val="36"/>
+          <w:shd w:fill="auto" w:val="clear"/>
+          <w:lang w:val="en-US" w:eastAsia="zh-CN" w:bidi="hi-IN"/>
+        </w:rPr>
+        <w:t>[ Continuar desenvolvendo esse tópico ]</w:t>
       </w:r>
     </w:p>
     <w:p>
@@ -3688,6 +3874,234 @@
           <w:lang w:val="en-US" w:eastAsia="zh-CN" w:bidi="hi-IN"/>
         </w:rPr>
         <w:t>[ Término do tópico 1 - Ver onde encaixar ]</w:t>
+      </w:r>
+    </w:p>
+    <w:p>
+      <w:pPr>
+        <w:pStyle w:val="Normal"/>
+        <w:jc w:val="both"/>
+        <w:rPr>
+          <w:color w:val="FC5C00"/>
+        </w:rPr>
+      </w:pPr>
+      <w:r>
+        <w:rPr/>
+      </w:r>
+    </w:p>
+    <w:p>
+      <w:pPr>
+        <w:pStyle w:val="Normal"/>
+        <w:jc w:val="both"/>
+        <w:rPr>
+          <w:color w:val="FC5C00"/>
+        </w:rPr>
+      </w:pPr>
+      <w:r>
+        <w:rPr/>
+      </w:r>
+    </w:p>
+    <w:p>
+      <w:pPr>
+        <w:pStyle w:val="Normal"/>
+        <w:jc w:val="both"/>
+        <w:rPr>
+          <w:color w:val="FC5C00"/>
+        </w:rPr>
+      </w:pPr>
+      <w:r>
+        <w:rPr>
+          <w:rFonts w:eastAsia="Times New Roman" w:cs="Times New Roman" w:ascii="Garamond" w:hAnsi="Garamond"/>
+          <w:color w:val="FC5C00"/>
+          <w:kern w:val="0"/>
+          <w:sz w:val="36"/>
+          <w:szCs w:val="36"/>
+          <w:shd w:fill="auto" w:val="clear"/>
+          <w:lang w:val="en-US" w:eastAsia="zh-CN" w:bidi="hi-IN"/>
+        </w:rPr>
+        <w:t xml:space="preserve">[ </w:t>
+      </w:r>
+      <w:r>
+        <w:rPr>
+          <w:rFonts w:eastAsia="Times New Roman" w:cs="Times New Roman" w:ascii="Garamond" w:hAnsi="Garamond"/>
+          <w:color w:val="FC5C00"/>
+          <w:kern w:val="0"/>
+          <w:sz w:val="36"/>
+          <w:szCs w:val="36"/>
+          <w:shd w:fill="auto" w:val="clear"/>
+          <w:lang w:val="en-US" w:eastAsia="zh-CN" w:bidi="hi-IN"/>
+        </w:rPr>
+        <w:t xml:space="preserve">Usar essa passagem evangélica em algum ponto </w:t>
+      </w:r>
+      <w:r>
+        <w:rPr>
+          <w:rFonts w:eastAsia="Times New Roman" w:cs="Times New Roman" w:ascii="Garamond" w:hAnsi="Garamond"/>
+          <w:color w:val="FC5C00"/>
+          <w:kern w:val="0"/>
+          <w:sz w:val="36"/>
+          <w:szCs w:val="36"/>
+          <w:shd w:fill="auto" w:val="clear"/>
+          <w:lang w:val="en-US" w:eastAsia="zh-CN" w:bidi="hi-IN"/>
+        </w:rPr>
+        <w:t>]</w:t>
+      </w:r>
+    </w:p>
+    <w:p>
+      <w:pPr>
+        <w:pStyle w:val="Normal"/>
+        <w:jc w:val="both"/>
+        <w:rPr>
+          <w:color w:val="auto"/>
+        </w:rPr>
+      </w:pPr>
+      <w:r>
+        <w:rPr>
+          <w:rFonts w:eastAsia="Times New Roman" w:cs="Times New Roman" w:ascii="Garamond" w:hAnsi="Garamond"/>
+          <w:color w:val="000000"/>
+          <w:kern w:val="0"/>
+          <w:sz w:val="36"/>
+          <w:szCs w:val="36"/>
+          <w:shd w:fill="auto" w:val="clear"/>
+          <w:lang w:val="en-US" w:eastAsia="zh-CN" w:bidi="hi-IN"/>
+        </w:rPr>
+        <w:t>"Por mim mesmo juro - disse o Senhor</w:t>
+      </w:r>
+      <w:r>
+        <w:rPr>
+          <w:rFonts w:eastAsia="Times New Roman" w:cs="Times New Roman" w:ascii="Garamond" w:hAnsi="Garamond"/>
+          <w:color w:val="000000"/>
+          <w:kern w:val="0"/>
+          <w:sz w:val="36"/>
+          <w:szCs w:val="36"/>
+          <w:shd w:fill="auto" w:val="clear"/>
+          <w:lang w:val="en-US" w:eastAsia="zh-CN" w:bidi="hi-IN"/>
+        </w:rPr>
+        <w:t xml:space="preserve"> </w:t>
+      </w:r>
+      <w:r>
+        <w:rPr>
+          <w:rFonts w:eastAsia="Times New Roman" w:cs="Times New Roman" w:ascii="Garamond" w:hAnsi="Garamond"/>
+          <w:color w:val="000000"/>
+          <w:kern w:val="0"/>
+          <w:sz w:val="36"/>
+          <w:szCs w:val="36"/>
+          <w:shd w:fill="auto" w:val="clear"/>
+          <w:lang w:val="en-US" w:eastAsia="zh-CN" w:bidi="hi-IN"/>
+        </w:rPr>
+        <w:t>Deus - que não quero a morte do ímpio,</w:t>
+      </w:r>
+      <w:r>
+        <w:rPr>
+          <w:rFonts w:eastAsia="Times New Roman" w:cs="Times New Roman" w:ascii="Garamond" w:hAnsi="Garamond"/>
+          <w:color w:val="000000"/>
+          <w:kern w:val="0"/>
+          <w:sz w:val="36"/>
+          <w:szCs w:val="36"/>
+          <w:shd w:fill="auto" w:val="clear"/>
+          <w:lang w:val="en-US" w:eastAsia="zh-CN" w:bidi="hi-IN"/>
+        </w:rPr>
+        <w:t xml:space="preserve"> </w:t>
+      </w:r>
+      <w:r>
+        <w:rPr>
+          <w:rFonts w:eastAsia="Times New Roman" w:cs="Times New Roman" w:ascii="Garamond" w:hAnsi="Garamond"/>
+          <w:color w:val="000000"/>
+          <w:kern w:val="0"/>
+          <w:sz w:val="36"/>
+          <w:szCs w:val="36"/>
+          <w:shd w:fill="auto" w:val="clear"/>
+          <w:lang w:val="en-US" w:eastAsia="zh-CN" w:bidi="hi-IN"/>
+        </w:rPr>
+        <w:t>senão que ele se converta, que deixe o</w:t>
+      </w:r>
+      <w:r>
+        <w:rPr>
+          <w:rFonts w:eastAsia="Times New Roman" w:cs="Times New Roman" w:ascii="Garamond" w:hAnsi="Garamond"/>
+          <w:color w:val="000000"/>
+          <w:kern w:val="0"/>
+          <w:sz w:val="36"/>
+          <w:szCs w:val="36"/>
+          <w:shd w:fill="auto" w:val="clear"/>
+          <w:lang w:val="en-US" w:eastAsia="zh-CN" w:bidi="hi-IN"/>
+        </w:rPr>
+        <w:t xml:space="preserve"> </w:t>
+      </w:r>
+      <w:r>
+        <w:rPr>
+          <w:rFonts w:eastAsia="Times New Roman" w:cs="Times New Roman" w:ascii="Garamond" w:hAnsi="Garamond"/>
+          <w:color w:val="000000"/>
+          <w:kern w:val="0"/>
+          <w:sz w:val="36"/>
+          <w:szCs w:val="36"/>
+          <w:shd w:fill="auto" w:val="clear"/>
+          <w:lang w:val="en-US" w:eastAsia="zh-CN" w:bidi="hi-IN"/>
+        </w:rPr>
+        <w:t>mau caminho e que viva".</w:t>
+      </w:r>
+    </w:p>
+    <w:p>
+      <w:pPr>
+        <w:pStyle w:val="Normal"/>
+        <w:jc w:val="both"/>
+        <w:rPr>
+          <w:color w:val="auto"/>
+        </w:rPr>
+      </w:pPr>
+      <w:r>
+        <w:rPr>
+          <w:rFonts w:eastAsia="Times New Roman" w:cs="Times New Roman" w:ascii="Garamond" w:hAnsi="Garamond"/>
+          <w:color w:val="000000"/>
+          <w:kern w:val="0"/>
+          <w:sz w:val="36"/>
+          <w:szCs w:val="36"/>
+          <w:shd w:fill="auto" w:val="clear"/>
+          <w:lang w:val="en-US" w:eastAsia="zh-CN" w:bidi="hi-IN"/>
+        </w:rPr>
+        <w:t>(EZEQUIEL, 33:11.)</w:t>
+      </w:r>
+    </w:p>
+    <w:p>
+      <w:pPr>
+        <w:pStyle w:val="Normal"/>
+        <w:jc w:val="both"/>
+        <w:rPr>
+          <w:color w:val="FC5C00"/>
+        </w:rPr>
+      </w:pPr>
+      <w:r>
+        <w:rPr>
+          <w:rFonts w:eastAsia="Times New Roman" w:cs="Times New Roman" w:ascii="Garamond" w:hAnsi="Garamond"/>
+          <w:color w:val="FC5C00"/>
+          <w:kern w:val="0"/>
+          <w:sz w:val="36"/>
+          <w:szCs w:val="36"/>
+          <w:shd w:fill="auto" w:val="clear"/>
+          <w:lang w:val="en-US" w:eastAsia="zh-CN" w:bidi="hi-IN"/>
+        </w:rPr>
+        <w:t xml:space="preserve">[ </w:t>
+      </w:r>
+      <w:r>
+        <w:rPr>
+          <w:rFonts w:eastAsia="Times New Roman" w:cs="Times New Roman" w:ascii="Garamond" w:hAnsi="Garamond"/>
+          <w:color w:val="FC5C00"/>
+          <w:kern w:val="0"/>
+          <w:sz w:val="36"/>
+          <w:szCs w:val="36"/>
+          <w:shd w:fill="auto" w:val="clear"/>
+          <w:lang w:val="en-US" w:eastAsia="zh-CN" w:bidi="hi-IN"/>
+        </w:rPr>
+        <w:t xml:space="preserve">Usar essa passagem evangélica em algum ponto </w:t>
+      </w:r>
+      <w:r>
+        <w:rPr>
+          <w:rFonts w:eastAsia="Times New Roman" w:cs="Times New Roman" w:ascii="Garamond" w:hAnsi="Garamond"/>
+          <w:color w:val="FC5C00"/>
+          <w:kern w:val="0"/>
+          <w:sz w:val="36"/>
+          <w:szCs w:val="36"/>
+          <w:shd w:fill="auto" w:val="clear"/>
+          <w:lang w:val="en-US" w:eastAsia="zh-CN" w:bidi="hi-IN"/>
+        </w:rPr>
+        <w:t>]</w:t>
       </w:r>
     </w:p>
     <w:p>

</xml_diff>

<commit_message>
05/06/2026 - 21:55 h
</commit_message>
<xml_diff>
--- a/O joio e o trigo, o mal e o bem/O joio e o trigo.docx
+++ b/O joio e o trigo, o mal e o bem/O joio e o trigo.docx
@@ -127,189 +127,45 @@
           <w:shd w:fill="auto" w:val="clear"/>
           <w:lang w:val="en-US" w:eastAsia="zh-CN" w:bidi="hi-IN"/>
         </w:rPr>
-        <w:t xml:space="preserve">Mas o que é um dogma? É uma verdade considerada oficialmente revelada por Deus e obrigatória dentro de uma determinada </w:t>
-      </w:r>
-      <w:r>
-        <w:rPr>
-          <w:rFonts w:eastAsia="Times New Roman" w:cs="Times New Roman" w:ascii="Garamond" w:hAnsi="Garamond"/>
-          <w:color w:val="000000"/>
-          <w:kern w:val="0"/>
-          <w:sz w:val="36"/>
-          <w:szCs w:val="36"/>
-          <w:shd w:fill="auto" w:val="clear"/>
-          <w:lang w:val="en-US" w:eastAsia="zh-CN" w:bidi="hi-IN"/>
-        </w:rPr>
-        <w:t>religião</w:t>
-      </w:r>
-      <w:r>
-        <w:rPr>
-          <w:rFonts w:eastAsia="Times New Roman" w:cs="Times New Roman" w:ascii="Garamond" w:hAnsi="Garamond"/>
-          <w:color w:val="000000"/>
-          <w:kern w:val="0"/>
-          <w:sz w:val="36"/>
-          <w:szCs w:val="36"/>
-          <w:shd w:fill="auto" w:val="clear"/>
-          <w:lang w:val="en-US" w:eastAsia="zh-CN" w:bidi="hi-IN"/>
-        </w:rPr>
-        <w:t xml:space="preserve">. É uma </w:t>
-      </w:r>
-      <w:r>
-        <w:rPr>
-          <w:rFonts w:eastAsia="Times New Roman" w:cs="Times New Roman" w:ascii="Garamond" w:hAnsi="Garamond"/>
-          <w:color w:val="000000"/>
-          <w:kern w:val="0"/>
-          <w:sz w:val="36"/>
-          <w:szCs w:val="36"/>
-          <w:shd w:fill="auto" w:val="clear"/>
-          <w:lang w:val="en-US" w:eastAsia="zh-CN" w:bidi="hi-IN"/>
-        </w:rPr>
-        <w:t>imposição</w:t>
-      </w:r>
-      <w:r>
-        <w:rPr>
-          <w:rFonts w:eastAsia="Times New Roman" w:cs="Times New Roman" w:ascii="Garamond" w:hAnsi="Garamond"/>
-          <w:color w:val="000000"/>
-          <w:kern w:val="0"/>
-          <w:sz w:val="36"/>
-          <w:szCs w:val="36"/>
-          <w:shd w:fill="auto" w:val="clear"/>
-          <w:lang w:val="en-US" w:eastAsia="zh-CN" w:bidi="hi-IN"/>
-        </w:rPr>
-        <w:t xml:space="preserve">; os </w:t>
-      </w:r>
-      <w:r>
-        <w:rPr>
-          <w:rFonts w:eastAsia="Times New Roman" w:cs="Times New Roman" w:ascii="Garamond" w:hAnsi="Garamond"/>
-          <w:color w:val="000000"/>
-          <w:kern w:val="0"/>
-          <w:sz w:val="36"/>
-          <w:szCs w:val="36"/>
-          <w:shd w:fill="auto" w:val="clear"/>
-          <w:lang w:val="en-US" w:eastAsia="zh-CN" w:bidi="hi-IN"/>
-        </w:rPr>
-        <w:t>adeptos</w:t>
-      </w:r>
-      <w:r>
-        <w:rPr>
-          <w:rFonts w:eastAsia="Times New Roman" w:cs="Times New Roman" w:ascii="Garamond" w:hAnsi="Garamond"/>
-          <w:color w:val="000000"/>
-          <w:kern w:val="0"/>
-          <w:sz w:val="36"/>
-          <w:szCs w:val="36"/>
-          <w:shd w:fill="auto" w:val="clear"/>
-          <w:lang w:val="en-US" w:eastAsia="zh-CN" w:bidi="hi-IN"/>
-        </w:rPr>
-        <w:t xml:space="preserve"> daquela religião não têm o direito de question</w:t>
-      </w:r>
-      <w:r>
-        <w:rPr>
-          <w:rFonts w:eastAsia="Times New Roman" w:cs="Times New Roman" w:ascii="Garamond" w:hAnsi="Garamond"/>
-          <w:color w:val="000000"/>
-          <w:kern w:val="0"/>
-          <w:sz w:val="36"/>
-          <w:szCs w:val="36"/>
-          <w:shd w:fill="auto" w:val="clear"/>
-          <w:lang w:val="en-US" w:eastAsia="zh-CN" w:bidi="hi-IN"/>
-        </w:rPr>
-        <w:t>ar aquela verdade</w:t>
-      </w:r>
-      <w:r>
-        <w:rPr>
-          <w:rFonts w:eastAsia="Times New Roman" w:cs="Times New Roman" w:ascii="Garamond" w:hAnsi="Garamond"/>
-          <w:color w:val="000000"/>
-          <w:kern w:val="0"/>
-          <w:sz w:val="36"/>
-          <w:szCs w:val="36"/>
-          <w:shd w:fill="auto" w:val="clear"/>
-          <w:lang w:val="en-US" w:eastAsia="zh-CN" w:bidi="hi-IN"/>
-        </w:rPr>
-        <w:t>.</w:t>
-      </w:r>
-    </w:p>
-    <w:p>
-      <w:pPr>
-        <w:pStyle w:val="Normal"/>
-        <w:jc w:val="both"/>
-        <w:rPr>
-          <w:sz w:val="36"/>
-          <w:szCs w:val="36"/>
-        </w:rPr>
-      </w:pPr>
-      <w:r>
-        <w:rPr>
-          <w:sz w:val="36"/>
-          <w:szCs w:val="36"/>
-        </w:rPr>
-      </w:r>
-    </w:p>
-    <w:p>
-      <w:pPr>
-        <w:pStyle w:val="Normal"/>
-        <w:jc w:val="both"/>
-        <w:rPr>
-          <w:sz w:val="36"/>
-          <w:szCs w:val="36"/>
-        </w:rPr>
-      </w:pPr>
-      <w:r>
-        <w:rPr>
-          <w:rFonts w:eastAsia="Times New Roman" w:cs="Times New Roman" w:ascii="Garamond" w:hAnsi="Garamond"/>
-          <w:color w:val="000000"/>
-          <w:kern w:val="0"/>
-          <w:sz w:val="36"/>
-          <w:szCs w:val="36"/>
-          <w:shd w:fill="auto" w:val="clear"/>
-          <w:lang w:val="en-US" w:eastAsia="zh-CN" w:bidi="hi-IN"/>
-        </w:rPr>
-        <w:t>Um exemplo disso é o dogma das penas eternas</w:t>
-      </w:r>
-      <w:r>
-        <w:rPr>
-          <w:rFonts w:eastAsia="Times New Roman" w:cs="Times New Roman" w:ascii="Garamond" w:hAnsi="Garamond"/>
-          <w:color w:val="000000"/>
-          <w:kern w:val="0"/>
-          <w:sz w:val="36"/>
-          <w:szCs w:val="36"/>
-          <w:shd w:fill="auto" w:val="clear"/>
-          <w:lang w:val="en-US" w:eastAsia="zh-CN" w:bidi="hi-IN"/>
-        </w:rPr>
-        <w:t>, segundo o qual</w:t>
-      </w:r>
-      <w:r>
-        <w:rPr>
-          <w:rFonts w:eastAsia="Times New Roman" w:cs="Times New Roman" w:ascii="Garamond" w:hAnsi="Garamond"/>
-          <w:color w:val="000000"/>
-          <w:kern w:val="0"/>
-          <w:sz w:val="36"/>
-          <w:szCs w:val="36"/>
-          <w:shd w:fill="auto" w:val="clear"/>
-          <w:lang w:val="en-US" w:eastAsia="zh-CN" w:bidi="hi-IN"/>
-        </w:rPr>
-        <w:t xml:space="preserve">, após uma única existência terrena, a alma recebe um destino </w:t>
-      </w:r>
-      <w:r>
-        <w:rPr>
-          <w:rFonts w:eastAsia="Times New Roman" w:cs="Times New Roman" w:ascii="Garamond" w:hAnsi="Garamond"/>
-          <w:color w:val="000000"/>
-          <w:kern w:val="0"/>
-          <w:sz w:val="36"/>
-          <w:szCs w:val="36"/>
-          <w:shd w:fill="auto" w:val="clear"/>
-          <w:lang w:val="en-US" w:eastAsia="zh-CN" w:bidi="hi-IN"/>
-        </w:rPr>
-        <w:t>eterno e imutável</w:t>
-      </w:r>
-      <w:r>
-        <w:rPr>
-          <w:rFonts w:eastAsia="Times New Roman" w:cs="Times New Roman" w:ascii="Garamond" w:hAnsi="Garamond"/>
-          <w:color w:val="000000"/>
-          <w:kern w:val="0"/>
-          <w:sz w:val="36"/>
-          <w:szCs w:val="36"/>
-          <w:shd w:fill="auto" w:val="clear"/>
-          <w:lang w:val="en-US" w:eastAsia="zh-CN" w:bidi="hi-IN"/>
-        </w:rPr>
-        <w:t>: felicidade no céu ou sofrimento no inferno.</w:t>
+        <w:t>Mas o que é um dogma? É uma verdade considerada oficialmente revelada por Deus e obrigatória dentro de uma determinada religião. É uma imposição; os adeptos daquela religião não têm o direito de questionar aquela verdade.</w:t>
+      </w:r>
+    </w:p>
+    <w:p>
+      <w:pPr>
+        <w:pStyle w:val="Normal"/>
+        <w:jc w:val="both"/>
+        <w:rPr>
+          <w:sz w:val="36"/>
+          <w:szCs w:val="36"/>
+        </w:rPr>
+      </w:pPr>
+      <w:r>
+        <w:rPr>
+          <w:sz w:val="36"/>
+          <w:szCs w:val="36"/>
+        </w:rPr>
+      </w:r>
+    </w:p>
+    <w:p>
+      <w:pPr>
+        <w:pStyle w:val="Normal"/>
+        <w:jc w:val="both"/>
+        <w:rPr>
+          <w:sz w:val="36"/>
+          <w:szCs w:val="36"/>
+        </w:rPr>
+      </w:pPr>
+      <w:r>
+        <w:rPr>
+          <w:rFonts w:eastAsia="Times New Roman" w:cs="Times New Roman" w:ascii="Garamond" w:hAnsi="Garamond"/>
+          <w:color w:val="000000"/>
+          <w:kern w:val="0"/>
+          <w:sz w:val="36"/>
+          <w:szCs w:val="36"/>
+          <w:shd w:fill="auto" w:val="clear"/>
+          <w:lang w:val="en-US" w:eastAsia="zh-CN" w:bidi="hi-IN"/>
+        </w:rPr>
+        <w:t>Um exemplo disso é o dogma das penas eternas, segundo o qual, após uma única existência terrena, a alma recebe um destino eterno e imutável: felicidade no céu ou sofrimento no inferno.</w:t>
       </w:r>
     </w:p>
     <w:p>
@@ -388,55 +244,7 @@
           <w:shd w:fill="auto" w:val="clear"/>
           <w:lang w:val="en-US" w:eastAsia="zh-CN" w:bidi="hi-IN"/>
         </w:rPr>
-        <w:t xml:space="preserve">E o que é a fé raciocinada? Como o próprio nome sugere, é a fé construída através do raciocínio, do bom senso, do senso de justiça e da lógica. Quando </w:t>
-      </w:r>
-      <w:r>
-        <w:rPr>
-          <w:rFonts w:eastAsia="Times New Roman" w:cs="Times New Roman" w:ascii="Garamond" w:hAnsi="Garamond"/>
-          <w:color w:val="000000"/>
-          <w:kern w:val="0"/>
-          <w:sz w:val="36"/>
-          <w:szCs w:val="36"/>
-          <w:shd w:fill="auto" w:val="clear"/>
-          <w:lang w:val="en-US" w:eastAsia="zh-CN" w:bidi="hi-IN"/>
-        </w:rPr>
-        <w:t>eu acredito em alguma coisa</w:t>
-      </w:r>
-      <w:r>
-        <w:rPr>
-          <w:rFonts w:eastAsia="Times New Roman" w:cs="Times New Roman" w:ascii="Garamond" w:hAnsi="Garamond"/>
-          <w:color w:val="000000"/>
-          <w:kern w:val="0"/>
-          <w:sz w:val="36"/>
-          <w:szCs w:val="36"/>
-          <w:shd w:fill="auto" w:val="clear"/>
-          <w:lang w:val="en-US" w:eastAsia="zh-CN" w:bidi="hi-IN"/>
-        </w:rPr>
-        <w:t xml:space="preserve">, sei </w:t>
-      </w:r>
-      <w:r>
-        <w:rPr>
-          <w:rFonts w:eastAsia="Times New Roman" w:cs="Times New Roman" w:ascii="Garamond" w:hAnsi="Garamond"/>
-          <w:color w:val="000000"/>
-          <w:kern w:val="0"/>
-          <w:sz w:val="36"/>
-          <w:szCs w:val="36"/>
-          <w:shd w:fill="auto" w:val="clear"/>
-          <w:lang w:val="en-US" w:eastAsia="zh-CN" w:bidi="hi-IN"/>
-        </w:rPr>
-        <w:t xml:space="preserve">exatamente </w:t>
-      </w:r>
-      <w:r>
-        <w:rPr>
-          <w:rFonts w:eastAsia="Times New Roman" w:cs="Times New Roman" w:ascii="Garamond" w:hAnsi="Garamond"/>
-          <w:color w:val="000000"/>
-          <w:kern w:val="0"/>
-          <w:sz w:val="36"/>
-          <w:szCs w:val="36"/>
-          <w:shd w:fill="auto" w:val="clear"/>
-          <w:lang w:val="en-US" w:eastAsia="zh-CN" w:bidi="hi-IN"/>
-        </w:rPr>
-        <w:t>por que creio naquilo.</w:t>
+        <w:t>E o que é a fé raciocinada? Como o próprio nome sugere, é a fé construída através do raciocínio, do bom senso, do senso de justiça e da lógica. Quando eu acredito em alguma coisa, sei exatamente por que creio naquilo.</w:t>
       </w:r>
     </w:p>
     <w:p>
@@ -474,19 +282,7 @@
           <w:shd w:fill="auto" w:val="clear"/>
           <w:lang w:val="en-US" w:eastAsia="zh-CN" w:bidi="hi-IN"/>
         </w:rPr>
-        <w:t xml:space="preserve">Com a fé raciocinada, não há imposição de ideias. </w:t>
-      </w:r>
-      <w:r>
-        <w:rPr>
-          <w:rFonts w:eastAsia="Times New Roman" w:cs="Times New Roman" w:ascii="Garamond" w:hAnsi="Garamond"/>
-          <w:color w:val="000000"/>
-          <w:kern w:val="0"/>
-          <w:sz w:val="36"/>
-          <w:szCs w:val="36"/>
-          <w:shd w:fill="auto" w:val="clear"/>
-          <w:lang w:val="en-US" w:eastAsia="zh-CN" w:bidi="hi-IN"/>
-        </w:rPr>
-        <w:t>Se um determinado ensinamento me é apresentado, eu submeto esse ensinamento ao crivo do raciocínio, da lógica, do bom senso e da justiça, e decido, por mim mesmo, se aceito ou não aquela ideia.</w:t>
+        <w:t>Com a fé raciocinada, não há imposição de ideias. Se um determinado ensinamento me é apresentado, eu submeto esse ensinamento ao crivo do raciocínio, da lógica, do bom senso e da justiça, e decido, por mim mesmo, se aceito ou não aquela ideia.</w:t>
       </w:r>
     </w:p>
     <w:p>
@@ -499,103 +295,70 @@
         </w:rPr>
       </w:pPr>
       <w:r>
-        <w:rPr/>
-      </w:r>
-    </w:p>
-    <w:p>
-      <w:pPr>
-        <w:pStyle w:val="Normal"/>
-        <w:jc w:val="both"/>
-        <w:rPr>
-          <w:sz w:val="36"/>
-          <w:szCs w:val="36"/>
-        </w:rPr>
-      </w:pPr>
-      <w:r>
-        <w:rPr>
-          <w:rFonts w:eastAsia="Times New Roman" w:cs="Times New Roman" w:ascii="Garamond" w:hAnsi="Garamond"/>
-          <w:color w:val="000000"/>
-          <w:kern w:val="0"/>
-          <w:sz w:val="36"/>
-          <w:szCs w:val="36"/>
-          <w:shd w:fill="auto" w:val="clear"/>
-          <w:lang w:val="en-US" w:eastAsia="zh-CN" w:bidi="hi-IN"/>
-        </w:rPr>
-        <w:t>E c</w:t>
-      </w:r>
-      <w:r>
-        <w:rPr>
-          <w:rFonts w:eastAsia="Times New Roman" w:cs="Times New Roman" w:ascii="Garamond" w:hAnsi="Garamond"/>
-          <w:color w:val="000000"/>
-          <w:kern w:val="0"/>
-          <w:sz w:val="36"/>
-          <w:szCs w:val="36"/>
-          <w:shd w:fill="auto" w:val="clear"/>
-          <w:lang w:val="en-US" w:eastAsia="zh-CN" w:bidi="hi-IN"/>
-        </w:rPr>
-        <w:t>omo o Espiritismo interpreta a questão das penas eternas?</w:t>
-      </w:r>
-    </w:p>
-    <w:p>
-      <w:pPr>
-        <w:pStyle w:val="Normal"/>
-        <w:jc w:val="both"/>
-        <w:rPr>
-          <w:sz w:val="36"/>
-          <w:szCs w:val="36"/>
-        </w:rPr>
-      </w:pPr>
-      <w:r>
-        <w:rPr>
-          <w:sz w:val="36"/>
-          <w:szCs w:val="36"/>
-        </w:rPr>
-      </w:r>
-    </w:p>
-    <w:p>
-      <w:pPr>
-        <w:pStyle w:val="Normal"/>
-        <w:jc w:val="both"/>
-        <w:rPr>
-          <w:sz w:val="36"/>
-          <w:szCs w:val="36"/>
-        </w:rPr>
-      </w:pPr>
-      <w:r>
-        <w:rPr>
-          <w:rFonts w:eastAsia="Times New Roman" w:cs="Times New Roman" w:ascii="Garamond" w:hAnsi="Garamond"/>
-          <w:color w:val="000000"/>
-          <w:kern w:val="0"/>
-          <w:sz w:val="36"/>
-          <w:szCs w:val="36"/>
-          <w:shd w:fill="auto" w:val="clear"/>
-          <w:lang w:val="en-US" w:eastAsia="zh-CN" w:bidi="hi-IN"/>
-        </w:rPr>
-        <w:t>Ele rejeita essa ideia por considerá-la incompatível com a justiça e a misericórdia divinas. A alma não tem uma única existência na carne</w:t>
-      </w:r>
-      <w:r>
-        <w:rPr>
-          <w:rFonts w:eastAsia="Times New Roman" w:cs="Times New Roman" w:ascii="Garamond" w:hAnsi="Garamond"/>
-          <w:color w:val="000000"/>
-          <w:kern w:val="0"/>
-          <w:sz w:val="36"/>
-          <w:szCs w:val="36"/>
-          <w:shd w:fill="auto" w:val="clear"/>
-          <w:lang w:val="en-US" w:eastAsia="zh-CN" w:bidi="hi-IN"/>
-        </w:rPr>
-        <w:t>; ela</w:t>
-      </w:r>
-      <w:r>
-        <w:rPr>
-          <w:rFonts w:eastAsia="Times New Roman" w:cs="Times New Roman" w:ascii="Garamond" w:hAnsi="Garamond"/>
-          <w:color w:val="000000"/>
-          <w:kern w:val="0"/>
-          <w:sz w:val="36"/>
-          <w:szCs w:val="36"/>
-          <w:shd w:fill="auto" w:val="clear"/>
-          <w:lang w:val="en-US" w:eastAsia="zh-CN" w:bidi="hi-IN"/>
-        </w:rPr>
-        <w:t xml:space="preserve"> nasce e renasce inúmeras vezes. Cada nova existência é programada de acordo com os méritos adquiridos e os débitos contraídos pelo Espírito até então.</w:t>
+        <w:rPr>
+          <w:sz w:val="36"/>
+          <w:szCs w:val="36"/>
+        </w:rPr>
+      </w:r>
+    </w:p>
+    <w:p>
+      <w:pPr>
+        <w:pStyle w:val="Normal"/>
+        <w:jc w:val="both"/>
+        <w:rPr>
+          <w:sz w:val="36"/>
+          <w:szCs w:val="36"/>
+        </w:rPr>
+      </w:pPr>
+      <w:r>
+        <w:rPr>
+          <w:rFonts w:eastAsia="Times New Roman" w:cs="Times New Roman" w:ascii="Garamond" w:hAnsi="Garamond"/>
+          <w:color w:val="000000"/>
+          <w:kern w:val="0"/>
+          <w:sz w:val="36"/>
+          <w:szCs w:val="36"/>
+          <w:shd w:fill="auto" w:val="clear"/>
+          <w:lang w:val="en-US" w:eastAsia="zh-CN" w:bidi="hi-IN"/>
+        </w:rPr>
+        <w:t>E como o Espiritismo interpreta a questão das penas eternas?</w:t>
+      </w:r>
+    </w:p>
+    <w:p>
+      <w:pPr>
+        <w:pStyle w:val="Normal"/>
+        <w:jc w:val="both"/>
+        <w:rPr>
+          <w:sz w:val="36"/>
+          <w:szCs w:val="36"/>
+        </w:rPr>
+      </w:pPr>
+      <w:r>
+        <w:rPr>
+          <w:sz w:val="36"/>
+          <w:szCs w:val="36"/>
+        </w:rPr>
+      </w:r>
+    </w:p>
+    <w:p>
+      <w:pPr>
+        <w:pStyle w:val="Normal"/>
+        <w:jc w:val="both"/>
+        <w:rPr>
+          <w:sz w:val="36"/>
+          <w:szCs w:val="36"/>
+        </w:rPr>
+      </w:pPr>
+      <w:r>
+        <w:rPr>
+          <w:rFonts w:eastAsia="Times New Roman" w:cs="Times New Roman" w:ascii="Garamond" w:hAnsi="Garamond"/>
+          <w:color w:val="000000"/>
+          <w:kern w:val="0"/>
+          <w:sz w:val="36"/>
+          <w:szCs w:val="36"/>
+          <w:shd w:fill="auto" w:val="clear"/>
+          <w:lang w:val="en-US" w:eastAsia="zh-CN" w:bidi="hi-IN"/>
+        </w:rPr>
+        <w:t>Ele rejeita essa ideia por considerá-la incompatível com a justiça e a misericórdia divinas. A alma não tem uma única existência na carne; ela nasce e renasce inúmeras vezes. Cada nova existência é programada de acordo com os méritos adquiridos e os débitos contraídos pelo Espírito até então.</w:t>
       </w:r>
       <w:r>
         <w:br w:type="page"/>
@@ -633,7 +396,10 @@
         </w:rPr>
       </w:pPr>
       <w:r>
-        <w:rPr/>
+        <w:rPr>
+          <w:sz w:val="36"/>
+          <w:szCs w:val="36"/>
+        </w:rPr>
       </w:r>
     </w:p>
     <w:p>
@@ -668,89 +434,32 @@
         </w:rPr>
       </w:pPr>
       <w:r>
-        <w:rPr/>
-      </w:r>
-    </w:p>
-    <w:p>
-      <w:pPr>
-        <w:pStyle w:val="Normal"/>
-        <w:jc w:val="both"/>
-        <w:rPr>
-          <w:sz w:val="36"/>
-          <w:szCs w:val="36"/>
-        </w:rPr>
-      </w:pPr>
-      <w:r>
-        <w:rPr>
-          <w:rFonts w:eastAsia="Times New Roman" w:cs="Times New Roman" w:ascii="Garamond" w:hAnsi="Garamond"/>
-          <w:color w:val="000000"/>
-          <w:kern w:val="0"/>
-          <w:sz w:val="36"/>
-          <w:szCs w:val="36"/>
-          <w:shd w:fill="auto" w:val="clear"/>
-          <w:lang w:val="en-US" w:eastAsia="zh-CN" w:bidi="hi-IN"/>
-        </w:rPr>
-        <w:t>De igual maneira, c</w:t>
-      </w:r>
-      <w:r>
-        <w:rPr>
-          <w:rFonts w:eastAsia="Times New Roman" w:cs="Times New Roman" w:ascii="Garamond" w:hAnsi="Garamond"/>
-          <w:color w:val="000000"/>
-          <w:kern w:val="0"/>
-          <w:sz w:val="36"/>
-          <w:szCs w:val="36"/>
-          <w:shd w:fill="auto" w:val="clear"/>
-          <w:lang w:val="en-US" w:eastAsia="zh-CN" w:bidi="hi-IN"/>
-        </w:rPr>
-        <w:t xml:space="preserve">éu e inferno </w:t>
-      </w:r>
-      <w:r>
-        <w:rPr>
-          <w:rFonts w:eastAsia="Times New Roman" w:cs="Times New Roman" w:ascii="Garamond" w:hAnsi="Garamond"/>
-          <w:color w:val="000000"/>
-          <w:kern w:val="0"/>
-          <w:sz w:val="36"/>
-          <w:szCs w:val="36"/>
-          <w:shd w:fill="auto" w:val="clear"/>
-          <w:lang w:val="en-US" w:eastAsia="zh-CN" w:bidi="hi-IN"/>
-        </w:rPr>
-        <w:t>não são</w:t>
-      </w:r>
-      <w:r>
-        <w:rPr>
-          <w:rFonts w:eastAsia="Times New Roman" w:cs="Times New Roman" w:ascii="Garamond" w:hAnsi="Garamond"/>
-          <w:color w:val="000000"/>
-          <w:kern w:val="0"/>
-          <w:sz w:val="36"/>
-          <w:szCs w:val="36"/>
-          <w:shd w:fill="auto" w:val="clear"/>
-          <w:lang w:val="en-US" w:eastAsia="zh-CN" w:bidi="hi-IN"/>
-        </w:rPr>
-        <w:t xml:space="preserve"> locais definitivos de recompensa ou condenação</w:t>
-      </w:r>
-      <w:r>
-        <w:rPr>
-          <w:rFonts w:eastAsia="Times New Roman" w:cs="Times New Roman" w:ascii="Garamond" w:hAnsi="Garamond"/>
-          <w:color w:val="000000"/>
-          <w:kern w:val="0"/>
-          <w:sz w:val="36"/>
-          <w:szCs w:val="36"/>
-          <w:shd w:fill="auto" w:val="clear"/>
-          <w:lang w:val="en-US" w:eastAsia="zh-CN" w:bidi="hi-IN"/>
-        </w:rPr>
-        <w:t>; são</w:t>
-      </w:r>
-      <w:r>
-        <w:rPr>
-          <w:rFonts w:eastAsia="Times New Roman" w:cs="Times New Roman" w:ascii="Garamond" w:hAnsi="Garamond"/>
-          <w:color w:val="000000"/>
-          <w:kern w:val="0"/>
-          <w:sz w:val="36"/>
-          <w:szCs w:val="36"/>
-          <w:shd w:fill="auto" w:val="clear"/>
-          <w:lang w:val="en-US" w:eastAsia="zh-CN" w:bidi="hi-IN"/>
-        </w:rPr>
-        <w:t xml:space="preserve"> estados transitórios da consciência, diretamente ligados às escolhas e ao grau evolutivo de cada Espírito.</w:t>
+        <w:rPr>
+          <w:sz w:val="36"/>
+          <w:szCs w:val="36"/>
+        </w:rPr>
+      </w:r>
+    </w:p>
+    <w:p>
+      <w:pPr>
+        <w:pStyle w:val="Normal"/>
+        <w:jc w:val="both"/>
+        <w:rPr>
+          <w:sz w:val="36"/>
+          <w:szCs w:val="36"/>
+        </w:rPr>
+      </w:pPr>
+      <w:r>
+        <w:rPr>
+          <w:rFonts w:eastAsia="Times New Roman" w:cs="Times New Roman" w:ascii="Garamond" w:hAnsi="Garamond"/>
+          <w:color w:val="000000"/>
+          <w:kern w:val="0"/>
+          <w:sz w:val="36"/>
+          <w:szCs w:val="36"/>
+          <w:shd w:fill="auto" w:val="clear"/>
+          <w:lang w:val="en-US" w:eastAsia="zh-CN" w:bidi="hi-IN"/>
+        </w:rPr>
+        <w:t>De igual maneira, céu e inferno não são locais definitivos de recompensa ou condenação; são estados transitórios da consciência, diretamente ligados às escolhas e ao grau evolutivo de cada Espírito.</w:t>
       </w:r>
     </w:p>
     <w:p>
@@ -813,114 +522,45 @@
           <w:shd w:fill="auto" w:val="clear"/>
           <w:lang w:val="en-US" w:eastAsia="zh-CN" w:bidi="hi-IN"/>
         </w:rPr>
-        <w:t>Entretanto, mesmo com a luz que o Espiritismo nos traz, ainda não compreendemos plenamente certos conceitos, não por deficiência da doutrina</w:t>
-      </w:r>
-      <w:r>
-        <w:rPr>
-          <w:rFonts w:eastAsia="Times New Roman" w:cs="Times New Roman" w:ascii="Garamond" w:hAnsi="Garamond"/>
-          <w:color w:val="000000"/>
-          <w:kern w:val="0"/>
-          <w:sz w:val="36"/>
-          <w:szCs w:val="36"/>
-          <w:shd w:fill="auto" w:val="clear"/>
-          <w:lang w:val="en-US" w:eastAsia="zh-CN" w:bidi="hi-IN"/>
-        </w:rPr>
-        <w:t xml:space="preserve"> em nos explicar</w:t>
-      </w:r>
-      <w:r>
-        <w:rPr>
-          <w:rFonts w:eastAsia="Times New Roman" w:cs="Times New Roman" w:ascii="Garamond" w:hAnsi="Garamond"/>
-          <w:color w:val="000000"/>
-          <w:kern w:val="0"/>
-          <w:sz w:val="36"/>
-          <w:szCs w:val="36"/>
-          <w:shd w:fill="auto" w:val="clear"/>
-          <w:lang w:val="en-US" w:eastAsia="zh-CN" w:bidi="hi-IN"/>
-        </w:rPr>
-        <w:t xml:space="preserve">, mas por </w:t>
-      </w:r>
-      <w:r>
-        <w:rPr>
-          <w:rFonts w:eastAsia="Times New Roman" w:cs="Times New Roman" w:ascii="Garamond" w:hAnsi="Garamond"/>
-          <w:color w:val="000000"/>
-          <w:kern w:val="0"/>
-          <w:sz w:val="36"/>
-          <w:szCs w:val="36"/>
-          <w:shd w:fill="auto" w:val="clear"/>
-          <w:lang w:val="en-US" w:eastAsia="zh-CN" w:bidi="hi-IN"/>
-        </w:rPr>
-        <w:t>falta de conhecimento de nossa parte</w:t>
-      </w:r>
-      <w:r>
-        <w:rPr>
-          <w:rFonts w:eastAsia="Times New Roman" w:cs="Times New Roman" w:ascii="Garamond" w:hAnsi="Garamond"/>
-          <w:color w:val="000000"/>
-          <w:kern w:val="0"/>
-          <w:sz w:val="36"/>
-          <w:szCs w:val="36"/>
-          <w:shd w:fill="auto" w:val="clear"/>
-          <w:lang w:val="en-US" w:eastAsia="zh-CN" w:bidi="hi-IN"/>
-        </w:rPr>
-        <w:t>. Isso é natural, considerando o atual estágio evolutivo em que nos encontramos.</w:t>
-      </w:r>
-    </w:p>
-    <w:p>
-      <w:pPr>
-        <w:pStyle w:val="Normal"/>
-        <w:jc w:val="both"/>
-        <w:rPr>
-          <w:sz w:val="36"/>
-          <w:szCs w:val="36"/>
-        </w:rPr>
-      </w:pPr>
-      <w:r>
-        <w:rPr/>
-      </w:r>
-    </w:p>
-    <w:p>
-      <w:pPr>
-        <w:pStyle w:val="Normal"/>
-        <w:jc w:val="both"/>
-        <w:rPr>
-          <w:sz w:val="36"/>
-          <w:szCs w:val="36"/>
-        </w:rPr>
-      </w:pPr>
-      <w:r>
-        <w:rPr>
-          <w:rFonts w:eastAsia="Times New Roman" w:cs="Times New Roman" w:ascii="Garamond" w:hAnsi="Garamond"/>
-          <w:color w:val="000000"/>
-          <w:kern w:val="0"/>
-          <w:sz w:val="36"/>
-          <w:szCs w:val="36"/>
-          <w:shd w:fill="auto" w:val="clear"/>
-          <w:lang w:val="en-US" w:eastAsia="zh-CN" w:bidi="hi-IN"/>
-        </w:rPr>
-        <w:t xml:space="preserve">Um dos conceitos </w:t>
-      </w:r>
-      <w:r>
-        <w:rPr>
-          <w:rFonts w:eastAsia="Times New Roman" w:cs="Times New Roman" w:ascii="Garamond" w:hAnsi="Garamond"/>
-          <w:color w:val="000000"/>
-          <w:kern w:val="0"/>
-          <w:sz w:val="36"/>
-          <w:szCs w:val="36"/>
-          <w:shd w:fill="auto" w:val="clear"/>
-          <w:lang w:val="en-US" w:eastAsia="zh-CN" w:bidi="hi-IN"/>
-        </w:rPr>
-        <w:t>que se enquadra nessa categoria</w:t>
-      </w:r>
-      <w:r>
-        <w:rPr>
-          <w:rFonts w:eastAsia="Times New Roman" w:cs="Times New Roman" w:ascii="Garamond" w:hAnsi="Garamond"/>
-          <w:color w:val="000000"/>
-          <w:kern w:val="0"/>
-          <w:sz w:val="36"/>
-          <w:szCs w:val="36"/>
-          <w:shd w:fill="auto" w:val="clear"/>
-          <w:lang w:val="en-US" w:eastAsia="zh-CN" w:bidi="hi-IN"/>
-        </w:rPr>
-        <w:t>, e que abordaremos dentro do nosso tema, é o mal.</w:t>
+        <w:t>Entretanto, mesmo com a luz que o Espiritismo nos traz, ainda não compreendemos plenamente certos conceitos, não por deficiência da doutrina em nos explicar, mas por falta de conhecimento de nossa parte. Isso é natural, considerando o atual estágio evolutivo em que nos encontramos.</w:t>
+      </w:r>
+    </w:p>
+    <w:p>
+      <w:pPr>
+        <w:pStyle w:val="Normal"/>
+        <w:jc w:val="both"/>
+        <w:rPr>
+          <w:sz w:val="36"/>
+          <w:szCs w:val="36"/>
+        </w:rPr>
+      </w:pPr>
+      <w:r>
+        <w:rPr>
+          <w:sz w:val="36"/>
+          <w:szCs w:val="36"/>
+        </w:rPr>
+      </w:r>
+    </w:p>
+    <w:p>
+      <w:pPr>
+        <w:pStyle w:val="Normal"/>
+        <w:jc w:val="both"/>
+        <w:rPr>
+          <w:sz w:val="36"/>
+          <w:szCs w:val="36"/>
+        </w:rPr>
+      </w:pPr>
+      <w:r>
+        <w:rPr>
+          <w:rFonts w:eastAsia="Times New Roman" w:cs="Times New Roman" w:ascii="Garamond" w:hAnsi="Garamond"/>
+          <w:color w:val="000000"/>
+          <w:kern w:val="0"/>
+          <w:sz w:val="36"/>
+          <w:szCs w:val="36"/>
+          <w:shd w:fill="auto" w:val="clear"/>
+          <w:lang w:val="en-US" w:eastAsia="zh-CN" w:bidi="hi-IN"/>
+        </w:rPr>
+        <w:t>Um dos conceitos que se enquadra nessa categoria, e que abordaremos dentro do nosso tema, é o mal.</w:t>
       </w:r>
     </w:p>
     <w:p>
@@ -1013,79 +653,7 @@
           <w:shd w:fill="auto" w:val="clear"/>
           <w:lang w:val="en-US" w:eastAsia="zh-CN" w:bidi="hi-IN"/>
         </w:rPr>
-        <w:t>Afinal, em todos os cantos do nosso planeta vemos o mal sendo praticado. Apesar dos nossos esforços de melhoria, nós mesmos ainda o praticamos</w:t>
-      </w:r>
-      <w:r>
-        <w:rPr>
-          <w:rFonts w:eastAsia="Times New Roman" w:cs="Times New Roman" w:ascii="Garamond" w:hAnsi="Garamond"/>
-          <w:color w:val="000000"/>
-          <w:kern w:val="0"/>
-          <w:sz w:val="36"/>
-          <w:szCs w:val="36"/>
-          <w:shd w:fill="auto" w:val="clear"/>
-          <w:lang w:val="en-US" w:eastAsia="zh-CN" w:bidi="hi-IN"/>
-        </w:rPr>
-        <w:t xml:space="preserve">. </w:t>
-      </w:r>
-      <w:r>
-        <w:rPr>
-          <w:rFonts w:eastAsia="Times New Roman" w:cs="Times New Roman" w:ascii="Garamond" w:hAnsi="Garamond"/>
-          <w:color w:val="000000"/>
-          <w:kern w:val="0"/>
-          <w:sz w:val="36"/>
-          <w:szCs w:val="36"/>
-          <w:shd w:fill="auto" w:val="clear"/>
-          <w:lang w:val="en-US" w:eastAsia="zh-CN" w:bidi="hi-IN"/>
-        </w:rPr>
-        <w:t xml:space="preserve"> </w:t>
-      </w:r>
-      <w:r>
-        <w:rPr>
-          <w:rFonts w:eastAsia="Times New Roman" w:cs="Times New Roman" w:ascii="Garamond" w:hAnsi="Garamond"/>
-          <w:color w:val="000000"/>
-          <w:kern w:val="0"/>
-          <w:sz w:val="36"/>
-          <w:szCs w:val="36"/>
-          <w:shd w:fill="auto" w:val="clear"/>
-          <w:lang w:val="en-US" w:eastAsia="zh-CN" w:bidi="hi-IN"/>
-        </w:rPr>
-        <w:t>P</w:t>
-      </w:r>
-      <w:r>
-        <w:rPr>
-          <w:rFonts w:eastAsia="Times New Roman" w:cs="Times New Roman" w:ascii="Garamond" w:hAnsi="Garamond"/>
-          <w:color w:val="000000"/>
-          <w:kern w:val="0"/>
-          <w:sz w:val="36"/>
-          <w:szCs w:val="36"/>
-          <w:shd w:fill="auto" w:val="clear"/>
-          <w:lang w:val="en-US" w:eastAsia="zh-CN" w:bidi="hi-IN"/>
-        </w:rPr>
-        <w:t xml:space="preserve">resenciamos e sofremos as consequências </w:t>
-      </w:r>
-      <w:r>
-        <w:rPr>
-          <w:rFonts w:eastAsia="Times New Roman" w:cs="Times New Roman" w:ascii="Garamond" w:hAnsi="Garamond"/>
-          <w:color w:val="000000"/>
-          <w:kern w:val="0"/>
-          <w:sz w:val="36"/>
-          <w:szCs w:val="36"/>
-          <w:shd w:fill="auto" w:val="clear"/>
-          <w:lang w:val="en-US" w:eastAsia="zh-CN" w:bidi="hi-IN"/>
-        </w:rPr>
-        <w:t>da ação do mal</w:t>
-      </w:r>
-      <w:r>
-        <w:rPr>
-          <w:rFonts w:eastAsia="Times New Roman" w:cs="Times New Roman" w:ascii="Garamond" w:hAnsi="Garamond"/>
-          <w:color w:val="000000"/>
-          <w:kern w:val="0"/>
-          <w:sz w:val="36"/>
-          <w:szCs w:val="36"/>
-          <w:shd w:fill="auto" w:val="clear"/>
-          <w:lang w:val="en-US" w:eastAsia="zh-CN" w:bidi="hi-IN"/>
-        </w:rPr>
-        <w:t>, e a Doutrina Espírita afirma que ele não existe?</w:t>
+        <w:t>Afinal, em todos os cantos do nosso planeta vemos o mal sendo praticado. Apesar dos nossos esforços de melhoria, nós mesmos ainda o praticamos.  Presenciamos e sofremos as consequências da ação do mal, e a Doutrina Espírita afirma que ele não existe?</w:t>
       </w:r>
     </w:p>
     <w:p>
@@ -1138,31 +706,7 @@
           <w:shd w:fill="auto" w:val="clear"/>
           <w:lang w:val="en-US" w:eastAsia="zh-CN" w:bidi="hi-IN"/>
         </w:rPr>
-        <w:t xml:space="preserve">Vamos </w:t>
-      </w:r>
-      <w:r>
-        <w:rPr>
-          <w:rFonts w:eastAsia="Times New Roman" w:cs="Times New Roman" w:ascii="Garamond" w:hAnsi="Garamond"/>
-          <w:color w:val="000000"/>
-          <w:kern w:val="0"/>
-          <w:sz w:val="36"/>
-          <w:szCs w:val="36"/>
-          <w:shd w:fill="auto" w:val="clear"/>
-          <w:lang w:val="en-US" w:eastAsia="zh-CN" w:bidi="hi-IN"/>
-        </w:rPr>
-        <w:t>ver</w:t>
-      </w:r>
-      <w:r>
-        <w:rPr>
-          <w:rFonts w:eastAsia="Times New Roman" w:cs="Times New Roman" w:ascii="Garamond" w:hAnsi="Garamond"/>
-          <w:color w:val="000000"/>
-          <w:kern w:val="0"/>
-          <w:sz w:val="36"/>
-          <w:szCs w:val="36"/>
-          <w:shd w:fill="auto" w:val="clear"/>
-          <w:lang w:val="en-US" w:eastAsia="zh-CN" w:bidi="hi-IN"/>
-        </w:rPr>
-        <w:t xml:space="preserve"> o que o Espiritismo realmente nos diz sobre o mal.</w:t>
+        <w:t>Vamos ver o que o Espiritismo realmente nos diz sobre o mal.</w:t>
       </w:r>
       <w:r>
         <w:br w:type="page"/>
@@ -1218,108 +762,60 @@
           <w:shd w:fill="auto" w:val="clear"/>
           <w:lang w:val="en-US" w:eastAsia="zh-CN" w:bidi="hi-IN"/>
         </w:rPr>
-        <w:t xml:space="preserve"> significa que ele não constitui um princípio absoluto. Não é eterno nem foi criado por Deus como uma força independente. </w:t>
-      </w:r>
-      <w:r>
-        <w:rPr>
-          <w:rFonts w:eastAsia="Times New Roman" w:cs="Times New Roman" w:ascii="Garamond" w:hAnsi="Garamond"/>
-          <w:color w:val="000000"/>
-          <w:kern w:val="0"/>
-          <w:sz w:val="36"/>
-          <w:szCs w:val="36"/>
-          <w:shd w:fill="auto" w:val="clear"/>
-          <w:lang w:val="en-US" w:eastAsia="zh-CN" w:bidi="hi-IN"/>
-        </w:rPr>
-        <w:t>O mal é</w:t>
-      </w:r>
-      <w:r>
-        <w:rPr>
-          <w:rFonts w:eastAsia="Times New Roman" w:cs="Times New Roman" w:ascii="Garamond" w:hAnsi="Garamond"/>
-          <w:color w:val="000000"/>
-          <w:kern w:val="0"/>
-          <w:sz w:val="36"/>
-          <w:szCs w:val="36"/>
-          <w:shd w:fill="auto" w:val="clear"/>
-          <w:lang w:val="en-US" w:eastAsia="zh-CN" w:bidi="hi-IN"/>
-        </w:rPr>
-        <w:t>, na verdade, resultado da ignorância, do atraso moral e do afastamento das leis divinas.</w:t>
-      </w:r>
-    </w:p>
-    <w:p>
-      <w:pPr>
-        <w:pStyle w:val="Normal"/>
-        <w:jc w:val="both"/>
-        <w:rPr>
-          <w:rFonts w:ascii="Garamond" w:hAnsi="Garamond" w:eastAsia="Times New Roman" w:cs="Times New Roman"/>
-          <w:color w:val="000000"/>
-          <w:kern w:val="0"/>
-          <w:sz w:val="36"/>
-          <w:szCs w:val="36"/>
-          <w:shd w:fill="auto" w:val="clear"/>
-          <w:lang w:val="en-US" w:eastAsia="zh-CN" w:bidi="hi-IN"/>
-        </w:rPr>
-      </w:pPr>
-      <w:r>
-        <w:rPr>
-          <w:rFonts w:eastAsia="Times New Roman" w:cs="Times New Roman" w:ascii="Garamond" w:hAnsi="Garamond"/>
-          <w:color w:val="000000"/>
-          <w:kern w:val="0"/>
-          <w:sz w:val="36"/>
-          <w:szCs w:val="36"/>
-          <w:shd w:fill="auto" w:val="clear"/>
-          <w:lang w:val="en-US" w:eastAsia="zh-CN" w:bidi="hi-IN"/>
-        </w:rPr>
-      </w:r>
-    </w:p>
-    <w:p>
-      <w:pPr>
-        <w:pStyle w:val="Normal"/>
-        <w:jc w:val="both"/>
-        <w:rPr>
-          <w:rFonts w:ascii="Garamond" w:hAnsi="Garamond" w:eastAsia="Times New Roman" w:cs="Times New Roman"/>
-          <w:color w:val="000000"/>
-          <w:kern w:val="0"/>
-          <w:sz w:val="36"/>
-          <w:szCs w:val="36"/>
-          <w:shd w:fill="auto" w:val="clear"/>
-          <w:lang w:val="en-US" w:eastAsia="zh-CN" w:bidi="hi-IN"/>
-        </w:rPr>
-      </w:pPr>
-      <w:r>
-        <w:rPr>
-          <w:rFonts w:eastAsia="Times New Roman" w:cs="Times New Roman" w:ascii="Garamond" w:hAnsi="Garamond"/>
-          <w:color w:val="000000"/>
-          <w:kern w:val="0"/>
-          <w:sz w:val="36"/>
-          <w:szCs w:val="36"/>
-          <w:shd w:fill="auto" w:val="clear"/>
-          <w:lang w:val="en-US" w:eastAsia="zh-CN" w:bidi="hi-IN"/>
-        </w:rPr>
-        <w:t xml:space="preserve">Deus cria todos os Espíritos simples e ignorantes — ignorantes no sentido de nada saberem —, mas todos possuem livre-arbítrio, </w:t>
-      </w:r>
-      <w:r>
-        <w:rPr>
-          <w:rFonts w:eastAsia="Times New Roman" w:cs="Times New Roman" w:ascii="Garamond" w:hAnsi="Garamond"/>
-          <w:color w:val="000000"/>
-          <w:kern w:val="0"/>
-          <w:sz w:val="36"/>
-          <w:szCs w:val="36"/>
-          <w:shd w:fill="auto" w:val="clear"/>
-          <w:lang w:val="en-US" w:eastAsia="zh-CN" w:bidi="hi-IN"/>
-        </w:rPr>
-        <w:t>que é</w:t>
-      </w:r>
-      <w:r>
-        <w:rPr>
-          <w:rFonts w:eastAsia="Times New Roman" w:cs="Times New Roman" w:ascii="Garamond" w:hAnsi="Garamond"/>
-          <w:color w:val="000000"/>
-          <w:kern w:val="0"/>
-          <w:sz w:val="36"/>
-          <w:szCs w:val="36"/>
-          <w:shd w:fill="auto" w:val="clear"/>
-          <w:lang w:val="en-US" w:eastAsia="zh-CN" w:bidi="hi-IN"/>
-        </w:rPr>
-        <w:t xml:space="preserve"> a capacidade de escolher o que fazer e quais caminhos seguir.</w:t>
+        <w:t xml:space="preserve"> significa que ele não constitui um princípio absoluto. Não é eterno nem foi criado por Deus como uma força independente. O mal é, na verdade, resultado da ignorância, do atraso moral e do afastamento das leis divinas.</w:t>
+      </w:r>
+    </w:p>
+    <w:p>
+      <w:pPr>
+        <w:pStyle w:val="Normal"/>
+        <w:jc w:val="both"/>
+        <w:rPr>
+          <w:rFonts w:ascii="Garamond" w:hAnsi="Garamond" w:eastAsia="Times New Roman" w:cs="Times New Roman"/>
+          <w:color w:val="000000"/>
+          <w:kern w:val="0"/>
+          <w:sz w:val="36"/>
+          <w:szCs w:val="36"/>
+          <w:shd w:fill="auto" w:val="clear"/>
+          <w:lang w:val="en-US" w:eastAsia="zh-CN" w:bidi="hi-IN"/>
+        </w:rPr>
+      </w:pPr>
+      <w:r>
+        <w:rPr>
+          <w:rFonts w:eastAsia="Times New Roman" w:cs="Times New Roman" w:ascii="Garamond" w:hAnsi="Garamond"/>
+          <w:color w:val="000000"/>
+          <w:kern w:val="0"/>
+          <w:sz w:val="36"/>
+          <w:szCs w:val="36"/>
+          <w:shd w:fill="auto" w:val="clear"/>
+          <w:lang w:val="en-US" w:eastAsia="zh-CN" w:bidi="hi-IN"/>
+        </w:rPr>
+      </w:r>
+    </w:p>
+    <w:p>
+      <w:pPr>
+        <w:pStyle w:val="Normal"/>
+        <w:jc w:val="both"/>
+        <w:rPr>
+          <w:rFonts w:ascii="Garamond" w:hAnsi="Garamond" w:eastAsia="Times New Roman" w:cs="Times New Roman"/>
+          <w:color w:val="000000"/>
+          <w:kern w:val="0"/>
+          <w:sz w:val="36"/>
+          <w:szCs w:val="36"/>
+          <w:shd w:fill="auto" w:val="clear"/>
+          <w:lang w:val="en-US" w:eastAsia="zh-CN" w:bidi="hi-IN"/>
+        </w:rPr>
+      </w:pPr>
+      <w:r>
+        <w:rPr>
+          <w:rFonts w:eastAsia="Times New Roman" w:cs="Times New Roman" w:ascii="Garamond" w:hAnsi="Garamond"/>
+          <w:color w:val="000000"/>
+          <w:kern w:val="0"/>
+          <w:sz w:val="36"/>
+          <w:szCs w:val="36"/>
+          <w:shd w:fill="auto" w:val="clear"/>
+          <w:lang w:val="en-US" w:eastAsia="zh-CN" w:bidi="hi-IN"/>
+        </w:rPr>
+        <w:t>Deus cria todos os Espíritos simples e ignorantes — ignorantes no sentido de nada saberem —, mas todos possuem livre-arbítrio, que é a capacidade de escolher o que fazer e quais caminhos seguir.</w:t>
       </w:r>
     </w:p>
     <w:p>
@@ -1425,79 +921,7 @@
           <w:shd w:fill="auto" w:val="clear"/>
           <w:lang w:val="en-US" w:eastAsia="zh-CN" w:bidi="hi-IN"/>
         </w:rPr>
-        <w:t xml:space="preserve">O mal surge quando o Espírito, ainda imperfeito, escolhe agir em desacordo com as leis divinas. Portanto, Deus criou a </w:t>
-      </w:r>
-      <w:r>
-        <w:rPr>
-          <w:rFonts w:eastAsia="Times New Roman" w:cs="Times New Roman" w:ascii="Garamond" w:hAnsi="Garamond"/>
-          <w:color w:val="000000"/>
-          <w:kern w:val="0"/>
-          <w:sz w:val="36"/>
-          <w:szCs w:val="36"/>
-          <w:shd w:fill="auto" w:val="clear"/>
-          <w:lang w:val="en-US" w:eastAsia="zh-CN" w:bidi="hi-IN"/>
-        </w:rPr>
-        <w:t>liberdade de progredir,</w:t>
-      </w:r>
-      <w:r>
-        <w:rPr>
-          <w:rFonts w:eastAsia="Times New Roman" w:cs="Times New Roman" w:ascii="Garamond" w:hAnsi="Garamond"/>
-          <w:color w:val="000000"/>
-          <w:kern w:val="0"/>
-          <w:sz w:val="36"/>
-          <w:szCs w:val="36"/>
-          <w:shd w:fill="auto" w:val="clear"/>
-          <w:lang w:val="en-US" w:eastAsia="zh-CN" w:bidi="hi-IN"/>
-        </w:rPr>
-        <w:t xml:space="preserve"> </w:t>
-      </w:r>
-      <w:r>
-        <w:rPr>
-          <w:rFonts w:eastAsia="Times New Roman" w:cs="Times New Roman" w:ascii="Garamond" w:hAnsi="Garamond"/>
-          <w:color w:val="000000"/>
-          <w:kern w:val="0"/>
-          <w:sz w:val="36"/>
-          <w:szCs w:val="36"/>
-          <w:shd w:fill="auto" w:val="clear"/>
-          <w:lang w:val="en-US" w:eastAsia="zh-CN" w:bidi="hi-IN"/>
-        </w:rPr>
-        <w:t xml:space="preserve">mas </w:t>
-      </w:r>
-      <w:r>
-        <w:rPr>
-          <w:rFonts w:eastAsia="Times New Roman" w:cs="Times New Roman" w:ascii="Garamond" w:hAnsi="Garamond"/>
-          <w:color w:val="000000"/>
-          <w:kern w:val="0"/>
-          <w:sz w:val="36"/>
-          <w:szCs w:val="36"/>
-          <w:shd w:fill="auto" w:val="clear"/>
-          <w:lang w:val="en-US" w:eastAsia="zh-CN" w:bidi="hi-IN"/>
-        </w:rPr>
-        <w:t xml:space="preserve">não </w:t>
-      </w:r>
-      <w:r>
-        <w:rPr>
-          <w:rFonts w:eastAsia="Times New Roman" w:cs="Times New Roman" w:ascii="Garamond" w:hAnsi="Garamond"/>
-          <w:color w:val="000000"/>
-          <w:kern w:val="0"/>
-          <w:sz w:val="36"/>
-          <w:szCs w:val="36"/>
-          <w:shd w:fill="auto" w:val="clear"/>
-          <w:lang w:val="en-US" w:eastAsia="zh-CN" w:bidi="hi-IN"/>
-        </w:rPr>
-        <w:t xml:space="preserve">criou </w:t>
-      </w:r>
-      <w:r>
-        <w:rPr>
-          <w:rFonts w:eastAsia="Times New Roman" w:cs="Times New Roman" w:ascii="Garamond" w:hAnsi="Garamond"/>
-          <w:color w:val="000000"/>
-          <w:kern w:val="0"/>
-          <w:sz w:val="36"/>
-          <w:szCs w:val="36"/>
-          <w:shd w:fill="auto" w:val="clear"/>
-          <w:lang w:val="en-US" w:eastAsia="zh-CN" w:bidi="hi-IN"/>
-        </w:rPr>
-        <w:t>o mal em si.</w:t>
+        <w:t>O mal surge quando o Espírito, ainda imperfeito, escolhe agir em desacordo com as leis divinas. Portanto, Deus criou a liberdade de progredir, mas não criou o mal em si.</w:t>
       </w:r>
     </w:p>
     <w:p>
@@ -1553,197 +977,113 @@
           <w:shd w:fill="auto" w:val="clear"/>
           <w:lang w:val="en-US" w:eastAsia="zh-CN" w:bidi="hi-IN"/>
         </w:rPr>
-        <w:t xml:space="preserve">O Espiritismo não nega a existência do sofrimento, da violência ou das injustiças. O que ele nos mostra é que, ao contrário do bem — </w:t>
-      </w:r>
-      <w:r>
-        <w:rPr>
-          <w:rFonts w:eastAsia="Times New Roman" w:cs="Times New Roman" w:ascii="Garamond" w:hAnsi="Garamond"/>
-          <w:color w:val="000000"/>
-          <w:kern w:val="0"/>
-          <w:sz w:val="36"/>
-          <w:szCs w:val="36"/>
-          <w:shd w:fill="auto" w:val="clear"/>
-          <w:lang w:val="en-US" w:eastAsia="zh-CN" w:bidi="hi-IN"/>
-        </w:rPr>
-        <w:t>este sim,</w:t>
-      </w:r>
-      <w:r>
-        <w:rPr>
-          <w:rFonts w:eastAsia="Times New Roman" w:cs="Times New Roman" w:ascii="Garamond" w:hAnsi="Garamond"/>
-          <w:color w:val="000000"/>
-          <w:kern w:val="0"/>
-          <w:sz w:val="36"/>
-          <w:szCs w:val="36"/>
-          <w:shd w:fill="auto" w:val="clear"/>
-          <w:lang w:val="en-US" w:eastAsia="zh-CN" w:bidi="hi-IN"/>
-        </w:rPr>
-        <w:t xml:space="preserve"> </w:t>
-      </w:r>
-      <w:r>
-        <w:rPr>
-          <w:rFonts w:eastAsia="Times New Roman" w:cs="Times New Roman" w:ascii="Garamond" w:hAnsi="Garamond"/>
-          <w:color w:val="000000"/>
-          <w:kern w:val="0"/>
-          <w:sz w:val="36"/>
-          <w:szCs w:val="36"/>
-          <w:shd w:fill="auto" w:val="clear"/>
-          <w:lang w:val="en-US" w:eastAsia="zh-CN" w:bidi="hi-IN"/>
-        </w:rPr>
-        <w:t>nascido</w:t>
-      </w:r>
-      <w:r>
-        <w:rPr>
-          <w:rFonts w:eastAsia="Times New Roman" w:cs="Times New Roman" w:ascii="Garamond" w:hAnsi="Garamond"/>
-          <w:color w:val="000000"/>
-          <w:kern w:val="0"/>
-          <w:sz w:val="36"/>
-          <w:szCs w:val="36"/>
-          <w:shd w:fill="auto" w:val="clear"/>
-          <w:lang w:val="en-US" w:eastAsia="zh-CN" w:bidi="hi-IN"/>
-        </w:rPr>
-        <w:t xml:space="preserve"> de Deus —, o mal não possui natureza própria e não é permanente. Ele é apenas a consequência temporária da imperfeição espiritual.</w:t>
-      </w:r>
-    </w:p>
-    <w:p>
-      <w:pPr>
-        <w:pStyle w:val="Normal"/>
-        <w:jc w:val="both"/>
-        <w:rPr>
-          <w:rFonts w:ascii="Garamond" w:hAnsi="Garamond" w:eastAsia="Times New Roman" w:cs="Times New Roman"/>
-          <w:color w:val="000000"/>
-          <w:kern w:val="0"/>
-          <w:sz w:val="36"/>
-          <w:szCs w:val="36"/>
-          <w:shd w:fill="auto" w:val="clear"/>
-          <w:lang w:val="en-US" w:eastAsia="zh-CN" w:bidi="hi-IN"/>
-        </w:rPr>
-      </w:pPr>
-      <w:r>
-        <w:rPr>
-          <w:rFonts w:eastAsia="Times New Roman" w:cs="Times New Roman" w:ascii="Garamond" w:hAnsi="Garamond"/>
-          <w:color w:val="000000"/>
-          <w:kern w:val="0"/>
-          <w:sz w:val="36"/>
-          <w:szCs w:val="36"/>
-          <w:shd w:fill="auto" w:val="clear"/>
-          <w:lang w:val="en-US" w:eastAsia="zh-CN" w:bidi="hi-IN"/>
-        </w:rPr>
-      </w:r>
-    </w:p>
-    <w:p>
-      <w:pPr>
-        <w:pStyle w:val="Normal"/>
-        <w:jc w:val="both"/>
-        <w:rPr>
-          <w:rFonts w:ascii="Garamond" w:hAnsi="Garamond" w:eastAsia="Times New Roman" w:cs="Times New Roman"/>
-          <w:color w:val="000000"/>
-          <w:kern w:val="0"/>
-          <w:sz w:val="36"/>
-          <w:szCs w:val="36"/>
-          <w:shd w:fill="auto" w:val="clear"/>
-          <w:lang w:val="en-US" w:eastAsia="zh-CN" w:bidi="hi-IN"/>
-        </w:rPr>
-      </w:pPr>
-      <w:r>
-        <w:rPr>
-          <w:rFonts w:eastAsia="Times New Roman" w:cs="Times New Roman" w:ascii="Garamond" w:hAnsi="Garamond"/>
-          <w:color w:val="000000"/>
-          <w:kern w:val="0"/>
-          <w:sz w:val="36"/>
-          <w:szCs w:val="36"/>
-          <w:shd w:fill="auto" w:val="clear"/>
-          <w:lang w:val="en-US" w:eastAsia="zh-CN" w:bidi="hi-IN"/>
-        </w:rPr>
-        <w:t xml:space="preserve">Deus cria seres perfectíveis; o mal nasce do uso </w:t>
-      </w:r>
-      <w:r>
-        <w:rPr>
-          <w:rFonts w:eastAsia="Times New Roman" w:cs="Times New Roman" w:ascii="Garamond" w:hAnsi="Garamond"/>
-          <w:color w:val="000000"/>
-          <w:kern w:val="0"/>
-          <w:sz w:val="36"/>
-          <w:szCs w:val="36"/>
-          <w:shd w:fill="auto" w:val="clear"/>
-          <w:lang w:val="en-US" w:eastAsia="zh-CN" w:bidi="hi-IN"/>
-        </w:rPr>
-        <w:t>incorreto</w:t>
-      </w:r>
-      <w:r>
-        <w:rPr>
-          <w:rFonts w:eastAsia="Times New Roman" w:cs="Times New Roman" w:ascii="Garamond" w:hAnsi="Garamond"/>
-          <w:color w:val="000000"/>
-          <w:kern w:val="0"/>
-          <w:sz w:val="36"/>
-          <w:szCs w:val="36"/>
-          <w:shd w:fill="auto" w:val="clear"/>
-          <w:lang w:val="en-US" w:eastAsia="zh-CN" w:bidi="hi-IN"/>
-        </w:rPr>
-        <w:t xml:space="preserve"> da liberdade antes que o Espírito compreenda plenamente o bem.</w:t>
-      </w:r>
-    </w:p>
-    <w:p>
-      <w:pPr>
-        <w:pStyle w:val="Normal"/>
-        <w:jc w:val="both"/>
-        <w:rPr>
-          <w:rFonts w:ascii="Garamond" w:hAnsi="Garamond" w:eastAsia="Times New Roman" w:cs="Times New Roman"/>
-          <w:color w:val="000000"/>
-          <w:kern w:val="0"/>
-          <w:sz w:val="36"/>
-          <w:szCs w:val="36"/>
-          <w:shd w:fill="auto" w:val="clear"/>
-          <w:lang w:val="en-US" w:eastAsia="zh-CN" w:bidi="hi-IN"/>
-        </w:rPr>
-      </w:pPr>
-      <w:r>
-        <w:rPr>
-          <w:rFonts w:eastAsia="Times New Roman" w:cs="Times New Roman" w:ascii="Garamond" w:hAnsi="Garamond"/>
-          <w:color w:val="000000"/>
-          <w:kern w:val="0"/>
-          <w:sz w:val="36"/>
-          <w:szCs w:val="36"/>
-          <w:shd w:fill="auto" w:val="clear"/>
-          <w:lang w:val="en-US" w:eastAsia="zh-CN" w:bidi="hi-IN"/>
-        </w:rPr>
-      </w:r>
-    </w:p>
-    <w:p>
-      <w:pPr>
-        <w:pStyle w:val="Normal"/>
-        <w:jc w:val="both"/>
-        <w:rPr>
-          <w:rFonts w:ascii="Garamond" w:hAnsi="Garamond" w:eastAsia="Times New Roman" w:cs="Times New Roman"/>
-          <w:color w:val="000000"/>
-          <w:kern w:val="0"/>
-          <w:sz w:val="36"/>
-          <w:szCs w:val="36"/>
-          <w:shd w:fill="auto" w:val="clear"/>
-          <w:lang w:val="en-US" w:eastAsia="zh-CN" w:bidi="hi-IN"/>
-        </w:rPr>
-      </w:pPr>
-      <w:r>
-        <w:rPr>
-          <w:rFonts w:eastAsia="Times New Roman" w:cs="Times New Roman" w:ascii="Garamond" w:hAnsi="Garamond"/>
-          <w:color w:val="000000"/>
-          <w:kern w:val="0"/>
-          <w:sz w:val="36"/>
-          <w:szCs w:val="36"/>
-          <w:shd w:fill="auto" w:val="clear"/>
-          <w:lang w:val="en-US" w:eastAsia="zh-CN" w:bidi="hi-IN"/>
-        </w:rPr>
-        <w:t>Feitos estes esclarecimentos, importantes para nossas reflexões, passemos então à parábola do joio e do trigo.</w:t>
-      </w:r>
-      <w:r>
-        <w:rPr>
-          <w:rFonts w:eastAsia="Times New Roman" w:cs="Times New Roman" w:ascii="Garamond" w:hAnsi="Garamond"/>
-          <w:color w:val="000000"/>
-          <w:kern w:val="0"/>
-          <w:sz w:val="36"/>
-          <w:szCs w:val="36"/>
-          <w:shd w:fill="auto" w:val="clear"/>
-          <w:lang w:val="en-US" w:eastAsia="zh-CN" w:bidi="hi-IN"/>
-        </w:rPr>
-        <w:t xml:space="preserve"> Ela se encontra em Mateus 13:24–30.</w:t>
+        <w:t>O Espiritismo não nega a existência do sofrimento, da violência ou das injustiças. O que ele nos mostra é que, ao contrário do bem — este sim, nascido de Deus —, o mal não possui natureza própria e não é permanente. Ele é apenas a consequência temporária da imperfeição espiritual.</w:t>
+      </w:r>
+    </w:p>
+    <w:p>
+      <w:pPr>
+        <w:pStyle w:val="Normal"/>
+        <w:jc w:val="both"/>
+        <w:rPr>
+          <w:rFonts w:ascii="Garamond" w:hAnsi="Garamond" w:eastAsia="Times New Roman" w:cs="Times New Roman"/>
+          <w:color w:val="000000"/>
+          <w:kern w:val="0"/>
+          <w:sz w:val="36"/>
+          <w:szCs w:val="36"/>
+          <w:shd w:fill="auto" w:val="clear"/>
+          <w:lang w:val="en-US" w:eastAsia="zh-CN" w:bidi="hi-IN"/>
+        </w:rPr>
+      </w:pPr>
+      <w:r>
+        <w:rPr>
+          <w:rFonts w:eastAsia="Times New Roman" w:cs="Times New Roman" w:ascii="Garamond" w:hAnsi="Garamond"/>
+          <w:color w:val="000000"/>
+          <w:kern w:val="0"/>
+          <w:sz w:val="36"/>
+          <w:szCs w:val="36"/>
+          <w:shd w:fill="auto" w:val="clear"/>
+          <w:lang w:val="en-US" w:eastAsia="zh-CN" w:bidi="hi-IN"/>
+        </w:rPr>
+      </w:r>
+    </w:p>
+    <w:p>
+      <w:pPr>
+        <w:pStyle w:val="Normal"/>
+        <w:jc w:val="both"/>
+        <w:rPr>
+          <w:rFonts w:ascii="Garamond" w:hAnsi="Garamond" w:eastAsia="Times New Roman" w:cs="Times New Roman"/>
+          <w:color w:val="000000"/>
+          <w:kern w:val="0"/>
+          <w:sz w:val="36"/>
+          <w:szCs w:val="36"/>
+          <w:shd w:fill="auto" w:val="clear"/>
+          <w:lang w:val="en-US" w:eastAsia="zh-CN" w:bidi="hi-IN"/>
+        </w:rPr>
+      </w:pPr>
+      <w:r>
+        <w:rPr>
+          <w:rFonts w:eastAsia="Times New Roman" w:cs="Times New Roman" w:ascii="Garamond" w:hAnsi="Garamond"/>
+          <w:color w:val="000000"/>
+          <w:kern w:val="0"/>
+          <w:sz w:val="36"/>
+          <w:szCs w:val="36"/>
+          <w:shd w:fill="auto" w:val="clear"/>
+          <w:lang w:val="en-US" w:eastAsia="zh-CN" w:bidi="hi-IN"/>
+        </w:rPr>
+        <w:t>Deus cria seres perfectíveis; o mal nasce do uso incorreto da liberdade antes que o Espírito compreenda plenamente o bem.</w:t>
+      </w:r>
+    </w:p>
+    <w:p>
+      <w:pPr>
+        <w:pStyle w:val="Normal"/>
+        <w:jc w:val="both"/>
+        <w:rPr>
+          <w:rFonts w:ascii="Garamond" w:hAnsi="Garamond" w:eastAsia="Times New Roman" w:cs="Times New Roman"/>
+          <w:color w:val="000000"/>
+          <w:kern w:val="0"/>
+          <w:sz w:val="36"/>
+          <w:szCs w:val="36"/>
+          <w:shd w:fill="auto" w:val="clear"/>
+          <w:lang w:val="en-US" w:eastAsia="zh-CN" w:bidi="hi-IN"/>
+        </w:rPr>
+      </w:pPr>
+      <w:r>
+        <w:rPr>
+          <w:rFonts w:eastAsia="Times New Roman" w:cs="Times New Roman" w:ascii="Garamond" w:hAnsi="Garamond"/>
+          <w:color w:val="000000"/>
+          <w:kern w:val="0"/>
+          <w:sz w:val="36"/>
+          <w:szCs w:val="36"/>
+          <w:shd w:fill="auto" w:val="clear"/>
+          <w:lang w:val="en-US" w:eastAsia="zh-CN" w:bidi="hi-IN"/>
+        </w:rPr>
+      </w:r>
+    </w:p>
+    <w:p>
+      <w:pPr>
+        <w:pStyle w:val="Normal"/>
+        <w:jc w:val="both"/>
+        <w:rPr>
+          <w:rFonts w:ascii="Garamond" w:hAnsi="Garamond" w:eastAsia="Times New Roman" w:cs="Times New Roman"/>
+          <w:color w:val="000000"/>
+          <w:kern w:val="0"/>
+          <w:sz w:val="36"/>
+          <w:szCs w:val="36"/>
+          <w:shd w:fill="auto" w:val="clear"/>
+          <w:lang w:val="en-US" w:eastAsia="zh-CN" w:bidi="hi-IN"/>
+        </w:rPr>
+      </w:pPr>
+      <w:r>
+        <w:rPr>
+          <w:rFonts w:eastAsia="Times New Roman" w:cs="Times New Roman" w:ascii="Garamond" w:hAnsi="Garamond"/>
+          <w:color w:val="000000"/>
+          <w:kern w:val="0"/>
+          <w:sz w:val="36"/>
+          <w:szCs w:val="36"/>
+          <w:shd w:fill="auto" w:val="clear"/>
+          <w:lang w:val="en-US" w:eastAsia="zh-CN" w:bidi="hi-IN"/>
+        </w:rPr>
+        <w:t>Feitos estes esclarecimentos, importantes para nossas reflexões, passemos então à parábola do joio e do trigo. Ela se encontra em Mateus 13:24–30.</w:t>
       </w:r>
     </w:p>
     <w:p>
@@ -2300,31 +1640,7 @@
           <w:shd w:fill="auto" w:val="clear"/>
           <w:lang w:val="en-US" w:eastAsia="zh-CN" w:bidi="hi-IN"/>
         </w:rPr>
-        <w:t>Assim como aconteceu com a parábola do semeador, Jesus também explica a parábola do joio e do trigo. Es</w:t>
-      </w:r>
-      <w:r>
-        <w:rPr>
-          <w:rFonts w:eastAsia="Times New Roman" w:cs="Times New Roman" w:ascii="Garamond" w:hAnsi="Garamond"/>
-          <w:color w:val="000000"/>
-          <w:kern w:val="0"/>
-          <w:sz w:val="36"/>
-          <w:szCs w:val="36"/>
-          <w:shd w:fill="auto" w:val="clear"/>
-          <w:lang w:val="en-US" w:eastAsia="zh-CN" w:bidi="hi-IN"/>
-        </w:rPr>
-        <w:t>t</w:t>
-      </w:r>
-      <w:r>
-        <w:rPr>
-          <w:rFonts w:eastAsia="Times New Roman" w:cs="Times New Roman" w:ascii="Garamond" w:hAnsi="Garamond"/>
-          <w:color w:val="000000"/>
-          <w:kern w:val="0"/>
-          <w:sz w:val="36"/>
-          <w:szCs w:val="36"/>
-          <w:shd w:fill="auto" w:val="clear"/>
-          <w:lang w:val="en-US" w:eastAsia="zh-CN" w:bidi="hi-IN"/>
-        </w:rPr>
-        <w:t>a explicação está em Mateus 13:36–43:</w:t>
+        <w:t>Assim como aconteceu com a parábola do semeador, Jesus também explica a parábola do joio e do trigo. Esta explicação está em Mateus 13:36–43:</w:t>
       </w:r>
       <w:r>
         <w:br w:type="page"/>
@@ -2910,165 +2226,113 @@
           <w:shd w:fill="auto" w:val="clear"/>
           <w:lang w:val="en-US" w:eastAsia="zh-CN" w:bidi="hi-IN"/>
         </w:rPr>
-        <w:t>É importante compreender o contexto em que Jesus apresentou</w:t>
-      </w:r>
-      <w:r>
-        <w:rPr>
-          <w:rFonts w:eastAsia="Times New Roman" w:cs="Times New Roman" w:ascii="Garamond" w:hAnsi="Garamond"/>
-          <w:color w:val="000000"/>
-          <w:kern w:val="0"/>
-          <w:sz w:val="36"/>
-          <w:szCs w:val="36"/>
-          <w:shd w:fill="auto" w:val="clear"/>
-          <w:lang w:val="en-US" w:eastAsia="zh-CN" w:bidi="hi-IN"/>
-        </w:rPr>
-        <w:t xml:space="preserve"> esta parábola</w:t>
-      </w:r>
-      <w:r>
-        <w:rPr>
-          <w:rFonts w:eastAsia="Times New Roman" w:cs="Times New Roman" w:ascii="Garamond" w:hAnsi="Garamond"/>
-          <w:color w:val="000000"/>
-          <w:kern w:val="0"/>
-          <w:sz w:val="36"/>
-          <w:szCs w:val="36"/>
-          <w:shd w:fill="auto" w:val="clear"/>
-          <w:lang w:val="en-US" w:eastAsia="zh-CN" w:bidi="hi-IN"/>
-        </w:rPr>
-        <w:t>.</w:t>
-      </w:r>
-    </w:p>
-    <w:p>
-      <w:pPr>
-        <w:pStyle w:val="Normal"/>
-        <w:jc w:val="both"/>
-        <w:rPr>
-          <w:rFonts w:ascii="Garamond" w:hAnsi="Garamond" w:eastAsia="Times New Roman" w:cs="Times New Roman"/>
-          <w:color w:val="000000"/>
-          <w:kern w:val="0"/>
-          <w:sz w:val="36"/>
-          <w:szCs w:val="36"/>
-          <w:shd w:fill="auto" w:val="clear"/>
-          <w:lang w:val="en-US" w:eastAsia="zh-CN" w:bidi="hi-IN"/>
-        </w:rPr>
-      </w:pPr>
-      <w:r>
-        <w:rPr>
-          <w:rFonts w:eastAsia="Times New Roman" w:cs="Times New Roman" w:ascii="Garamond" w:hAnsi="Garamond"/>
-          <w:color w:val="000000"/>
-          <w:kern w:val="0"/>
-          <w:sz w:val="36"/>
-          <w:szCs w:val="36"/>
-          <w:shd w:fill="auto" w:val="clear"/>
-          <w:lang w:val="en-US" w:eastAsia="zh-CN" w:bidi="hi-IN"/>
-        </w:rPr>
-      </w:r>
-    </w:p>
-    <w:p>
-      <w:pPr>
-        <w:pStyle w:val="Normal"/>
-        <w:jc w:val="both"/>
-        <w:rPr>
-          <w:rFonts w:ascii="Garamond" w:hAnsi="Garamond" w:eastAsia="Times New Roman" w:cs="Times New Roman"/>
-          <w:color w:val="000000"/>
-          <w:kern w:val="0"/>
-          <w:sz w:val="36"/>
-          <w:szCs w:val="36"/>
-          <w:shd w:fill="auto" w:val="clear"/>
-          <w:lang w:val="en-US" w:eastAsia="zh-CN" w:bidi="hi-IN"/>
-        </w:rPr>
-      </w:pPr>
-      <w:r>
-        <w:rPr>
-          <w:rFonts w:eastAsia="Times New Roman" w:cs="Times New Roman" w:ascii="Garamond" w:hAnsi="Garamond"/>
-          <w:color w:val="000000"/>
-          <w:kern w:val="0"/>
-          <w:sz w:val="36"/>
-          <w:szCs w:val="36"/>
-          <w:shd w:fill="auto" w:val="clear"/>
-          <w:lang w:val="en-US" w:eastAsia="zh-CN" w:bidi="hi-IN"/>
-        </w:rPr>
-        <w:t>O capítulo 13 do evangelho de Mateus é uma espécie de divisor nos ensinamentos de Jesus</w:t>
-      </w:r>
-      <w:r>
-        <w:rPr>
-          <w:rFonts w:eastAsia="Times New Roman" w:cs="Times New Roman" w:ascii="Garamond" w:hAnsi="Garamond"/>
-          <w:color w:val="000000"/>
-          <w:kern w:val="0"/>
-          <w:sz w:val="36"/>
-          <w:szCs w:val="36"/>
-          <w:shd w:fill="auto" w:val="clear"/>
-          <w:lang w:val="en-US" w:eastAsia="zh-CN" w:bidi="hi-IN"/>
-        </w:rPr>
-        <w:t>.</w:t>
-      </w:r>
-    </w:p>
-    <w:p>
-      <w:pPr>
-        <w:pStyle w:val="Normal"/>
-        <w:jc w:val="both"/>
-        <w:rPr>
-          <w:rFonts w:ascii="Garamond" w:hAnsi="Garamond" w:eastAsia="Times New Roman" w:cs="Times New Roman"/>
-          <w:color w:val="000000"/>
-          <w:kern w:val="0"/>
-          <w:sz w:val="36"/>
-          <w:szCs w:val="36"/>
-          <w:shd w:fill="auto" w:val="clear"/>
-          <w:lang w:val="en-US" w:eastAsia="zh-CN" w:bidi="hi-IN"/>
-        </w:rPr>
-      </w:pPr>
-      <w:r>
-        <w:rPr/>
-      </w:r>
-    </w:p>
-    <w:p>
-      <w:pPr>
-        <w:pStyle w:val="Normal"/>
-        <w:jc w:val="both"/>
-        <w:rPr>
-          <w:rFonts w:ascii="Garamond" w:hAnsi="Garamond" w:eastAsia="Times New Roman" w:cs="Times New Roman"/>
-          <w:color w:val="000000"/>
-          <w:kern w:val="0"/>
-          <w:sz w:val="36"/>
-          <w:szCs w:val="36"/>
-          <w:shd w:fill="auto" w:val="clear"/>
-          <w:lang w:val="en-US" w:eastAsia="zh-CN" w:bidi="hi-IN"/>
-        </w:rPr>
-      </w:pPr>
-      <w:r>
-        <w:rPr>
-          <w:rFonts w:eastAsia="Times New Roman" w:cs="Times New Roman" w:ascii="Garamond" w:hAnsi="Garamond"/>
-          <w:color w:val="000000"/>
-          <w:kern w:val="0"/>
-          <w:sz w:val="36"/>
-          <w:szCs w:val="36"/>
-          <w:shd w:fill="auto" w:val="clear"/>
-          <w:lang w:val="en-US" w:eastAsia="zh-CN" w:bidi="hi-IN"/>
-        </w:rPr>
-        <w:t xml:space="preserve">Antes dele, </w:t>
-      </w:r>
-      <w:r>
-        <w:rPr>
-          <w:rFonts w:eastAsia="Times New Roman" w:cs="Times New Roman" w:ascii="Garamond" w:hAnsi="Garamond"/>
-          <w:color w:val="000000"/>
-          <w:kern w:val="0"/>
-          <w:sz w:val="36"/>
-          <w:szCs w:val="36"/>
-          <w:shd w:fill="auto" w:val="clear"/>
-          <w:lang w:val="en-US" w:eastAsia="zh-CN" w:bidi="hi-IN"/>
-        </w:rPr>
-        <w:t>o Mestre já se utilizava de imagens e comparações em seus ensinamentos</w:t>
-      </w:r>
-      <w:r>
-        <w:rPr>
-          <w:rFonts w:eastAsia="Times New Roman" w:cs="Times New Roman" w:ascii="Garamond" w:hAnsi="Garamond"/>
-          <w:color w:val="000000"/>
-          <w:kern w:val="0"/>
-          <w:sz w:val="36"/>
-          <w:szCs w:val="36"/>
-          <w:shd w:fill="auto" w:val="clear"/>
-          <w:lang w:val="en-US" w:eastAsia="zh-CN" w:bidi="hi-IN"/>
-        </w:rPr>
-        <w:t>. Nós temos, por exemplo:</w:t>
+        <w:t>É importante compreender o contexto em que Jesus apresentou esta parábola.</w:t>
+      </w:r>
+    </w:p>
+    <w:p>
+      <w:pPr>
+        <w:pStyle w:val="Normal"/>
+        <w:jc w:val="both"/>
+        <w:rPr>
+          <w:rFonts w:ascii="Garamond" w:hAnsi="Garamond" w:eastAsia="Times New Roman" w:cs="Times New Roman"/>
+          <w:color w:val="000000"/>
+          <w:kern w:val="0"/>
+          <w:sz w:val="36"/>
+          <w:szCs w:val="36"/>
+          <w:shd w:fill="auto" w:val="clear"/>
+          <w:lang w:val="en-US" w:eastAsia="zh-CN" w:bidi="hi-IN"/>
+        </w:rPr>
+      </w:pPr>
+      <w:r>
+        <w:rPr>
+          <w:rFonts w:eastAsia="Times New Roman" w:cs="Times New Roman" w:ascii="Garamond" w:hAnsi="Garamond"/>
+          <w:color w:val="000000"/>
+          <w:kern w:val="0"/>
+          <w:sz w:val="36"/>
+          <w:szCs w:val="36"/>
+          <w:shd w:fill="auto" w:val="clear"/>
+          <w:lang w:val="en-US" w:eastAsia="zh-CN" w:bidi="hi-IN"/>
+        </w:rPr>
+      </w:r>
+    </w:p>
+    <w:p>
+      <w:pPr>
+        <w:pStyle w:val="Normal"/>
+        <w:jc w:val="both"/>
+        <w:rPr>
+          <w:rFonts w:ascii="Garamond" w:hAnsi="Garamond" w:eastAsia="Times New Roman" w:cs="Times New Roman"/>
+          <w:color w:val="000000"/>
+          <w:kern w:val="0"/>
+          <w:sz w:val="36"/>
+          <w:szCs w:val="36"/>
+          <w:shd w:fill="auto" w:val="clear"/>
+          <w:lang w:val="en-US" w:eastAsia="zh-CN" w:bidi="hi-IN"/>
+        </w:rPr>
+      </w:pPr>
+      <w:r>
+        <w:rPr>
+          <w:rFonts w:eastAsia="Times New Roman" w:cs="Times New Roman" w:ascii="Garamond" w:hAnsi="Garamond"/>
+          <w:color w:val="000000"/>
+          <w:kern w:val="0"/>
+          <w:sz w:val="36"/>
+          <w:szCs w:val="36"/>
+          <w:shd w:fill="auto" w:val="clear"/>
+          <w:lang w:val="en-US" w:eastAsia="zh-CN" w:bidi="hi-IN"/>
+        </w:rPr>
+        <w:t>O capítulo 13 do evangelho de Mateus é uma espécie de divisor nos ensinamentos de Jesus.</w:t>
+      </w:r>
+    </w:p>
+    <w:p>
+      <w:pPr>
+        <w:pStyle w:val="Normal"/>
+        <w:jc w:val="both"/>
+        <w:rPr>
+          <w:rFonts w:ascii="Garamond" w:hAnsi="Garamond" w:eastAsia="Times New Roman" w:cs="Times New Roman"/>
+          <w:color w:val="000000"/>
+          <w:kern w:val="0"/>
+          <w:sz w:val="36"/>
+          <w:szCs w:val="36"/>
+          <w:shd w:fill="auto" w:val="clear"/>
+          <w:lang w:val="en-US" w:eastAsia="zh-CN" w:bidi="hi-IN"/>
+        </w:rPr>
+      </w:pPr>
+      <w:r>
+        <w:rPr>
+          <w:rFonts w:eastAsia="Times New Roman" w:cs="Times New Roman" w:ascii="Garamond" w:hAnsi="Garamond"/>
+          <w:color w:val="000000"/>
+          <w:kern w:val="0"/>
+          <w:sz w:val="36"/>
+          <w:szCs w:val="36"/>
+          <w:shd w:fill="auto" w:val="clear"/>
+          <w:lang w:val="en-US" w:eastAsia="zh-CN" w:bidi="hi-IN"/>
+        </w:rPr>
+      </w:r>
+    </w:p>
+    <w:p>
+      <w:pPr>
+        <w:pStyle w:val="Normal"/>
+        <w:jc w:val="both"/>
+        <w:rPr>
+          <w:rFonts w:ascii="Garamond" w:hAnsi="Garamond" w:eastAsia="Times New Roman" w:cs="Times New Roman"/>
+          <w:color w:val="000000"/>
+          <w:kern w:val="0"/>
+          <w:sz w:val="36"/>
+          <w:szCs w:val="36"/>
+          <w:shd w:fill="auto" w:val="clear"/>
+          <w:lang w:val="en-US" w:eastAsia="zh-CN" w:bidi="hi-IN"/>
+        </w:rPr>
+      </w:pPr>
+      <w:r>
+        <w:rPr>
+          <w:rFonts w:eastAsia="Times New Roman" w:cs="Times New Roman" w:ascii="Garamond" w:hAnsi="Garamond"/>
+          <w:color w:val="000000"/>
+          <w:kern w:val="0"/>
+          <w:sz w:val="36"/>
+          <w:szCs w:val="36"/>
+          <w:shd w:fill="auto" w:val="clear"/>
+          <w:lang w:val="en-US" w:eastAsia="zh-CN" w:bidi="hi-IN"/>
+        </w:rPr>
+        <w:t>Antes dele, o Mestre já se utilizava de imagens e comparações em seus ensinamentos. Nós temos, por exemplo:</w:t>
       </w:r>
     </w:p>
     <w:p>
@@ -3137,7 +2401,11 @@
         </w:rPr>
       </w:pPr>
       <w:r>
-        <w:rPr/>
+        <w:rPr>
+          <w:rFonts w:ascii="Garamond" w:hAnsi="Garamond"/>
+          <w:sz w:val="36"/>
+          <w:szCs w:val="36"/>
+        </w:rPr>
       </w:r>
     </w:p>
     <w:p>
@@ -3259,7 +2527,11 @@
         </w:rPr>
       </w:pPr>
       <w:r>
-        <w:rPr/>
+        <w:rPr>
+          <w:rFonts w:ascii="Garamond" w:hAnsi="Garamond"/>
+          <w:sz w:val="36"/>
+          <w:szCs w:val="36"/>
+        </w:rPr>
       </w:r>
     </w:p>
     <w:p>
@@ -3320,30 +2592,26 @@
           <w:sz w:val="36"/>
           <w:szCs w:val="36"/>
         </w:rPr>
-        <w:t>a casa construída sobre a rocha e a casa construída sobre a areia</w:t>
-      </w:r>
-      <w:r>
+        <w:t>a casa construída sobre a rocha e a casa construída sobre a areia.</w:t>
+      </w:r>
+    </w:p>
+    <w:p>
+      <w:pPr>
+        <w:pStyle w:val="Normal"/>
+        <w:ind w:left="1440" w:hanging="0"/>
+        <w:jc w:val="both"/>
         <w:rPr>
           <w:rFonts w:ascii="Garamond" w:hAnsi="Garamond"/>
           <w:sz w:val="36"/>
           <w:szCs w:val="36"/>
         </w:rPr>
-        <w:t>.</w:t>
-      </w:r>
-    </w:p>
-    <w:p>
-      <w:pPr>
-        <w:pStyle w:val="Normal"/>
-        <w:ind w:left="1440" w:hanging="0"/>
-        <w:jc w:val="both"/>
+      </w:pPr>
+      <w:r>
         <w:rPr>
           <w:rFonts w:ascii="Garamond" w:hAnsi="Garamond"/>
           <w:sz w:val="36"/>
           <w:szCs w:val="36"/>
         </w:rPr>
-      </w:pPr>
-      <w:r>
-        <w:rPr/>
       </w:r>
     </w:p>
     <w:p>
@@ -3374,30 +2642,26 @@
           <w:sz w:val="36"/>
           <w:szCs w:val="36"/>
         </w:rPr>
-        <w:t xml:space="preserve"> vida espiritual é resultado de escolhas conscientes. Não basta ouvir ou conhecer a verdade; é preciso acolhê-la, praticá-la e transformá-la em obras</w:t>
-      </w:r>
-      <w:r>
+        <w:t xml:space="preserve"> vida espiritual é resultado de escolhas conscientes. Não basta ouvir ou conhecer a verdade; é preciso acolhê-la, praticá-la e transformá-la em obras.</w:t>
+      </w:r>
+    </w:p>
+    <w:p>
+      <w:pPr>
+        <w:pStyle w:val="Normal"/>
+        <w:ind w:left="720" w:hanging="0"/>
+        <w:jc w:val="both"/>
         <w:rPr>
           <w:rFonts w:ascii="Garamond" w:hAnsi="Garamond"/>
           <w:sz w:val="36"/>
           <w:szCs w:val="36"/>
         </w:rPr>
-        <w:t>.</w:t>
-      </w:r>
-    </w:p>
-    <w:p>
-      <w:pPr>
-        <w:pStyle w:val="Normal"/>
-        <w:ind w:left="720" w:hanging="0"/>
-        <w:jc w:val="both"/>
+      </w:pPr>
+      <w:r>
         <w:rPr>
           <w:rFonts w:ascii="Garamond" w:hAnsi="Garamond"/>
           <w:sz w:val="36"/>
           <w:szCs w:val="36"/>
         </w:rPr>
-      </w:pPr>
-      <w:r>
-        <w:rPr/>
       </w:r>
     </w:p>
     <w:p>
@@ -3435,7 +2699,11 @@
         </w:rPr>
       </w:pPr>
       <w:r>
-        <w:rPr/>
+        <w:rPr>
+          <w:rFonts w:ascii="Garamond" w:hAnsi="Garamond"/>
+          <w:sz w:val="36"/>
+          <w:szCs w:val="36"/>
+        </w:rPr>
       </w:r>
     </w:p>
     <w:p>
@@ -3488,7 +2756,11 @@
         </w:rPr>
       </w:pPr>
       <w:r>
-        <w:rPr/>
+        <w:rPr>
+          <w:rFonts w:ascii="Garamond" w:hAnsi="Garamond"/>
+          <w:sz w:val="36"/>
+          <w:szCs w:val="36"/>
+        </w:rPr>
       </w:r>
     </w:p>
     <w:p>
@@ -3528,53 +2800,37 @@
       </w:pPr>
       <w:r>
         <w:rPr>
-          <w:rFonts w:eastAsia="Times New Roman" w:cs="Times New Roman" w:ascii="Garamond" w:hAnsi="Garamond"/>
-          <w:color w:val="000000"/>
-          <w:kern w:val="0"/>
-          <w:sz w:val="36"/>
-          <w:szCs w:val="36"/>
-          <w:shd w:fill="auto" w:val="clear"/>
-          <w:lang w:val="en-US" w:eastAsia="zh-CN" w:bidi="hi-IN"/>
-        </w:rPr>
-      </w:r>
-    </w:p>
-    <w:p>
-      <w:pPr>
-        <w:pStyle w:val="Normal"/>
-        <w:jc w:val="both"/>
-        <w:rPr>
-          <w:rFonts w:ascii="Garamond" w:hAnsi="Garamond" w:eastAsia="Times New Roman" w:cs="Times New Roman"/>
-          <w:color w:val="000000"/>
-          <w:kern w:val="0"/>
-          <w:sz w:val="36"/>
-          <w:szCs w:val="36"/>
-          <w:shd w:fill="auto" w:val="clear"/>
-          <w:lang w:val="en-US" w:eastAsia="zh-CN" w:bidi="hi-IN"/>
-        </w:rPr>
-      </w:pPr>
-      <w:r>
-        <w:rPr>
-          <w:rFonts w:eastAsia="Times New Roman" w:cs="Times New Roman" w:ascii="Garamond" w:hAnsi="Garamond"/>
-          <w:color w:val="000000"/>
-          <w:kern w:val="0"/>
-          <w:sz w:val="36"/>
-          <w:szCs w:val="36"/>
-          <w:shd w:fill="auto" w:val="clear"/>
-          <w:lang w:val="en-US" w:eastAsia="zh-CN" w:bidi="hi-IN"/>
-        </w:rPr>
-        <w:t>Entretanto, essas mensagens</w:t>
-      </w:r>
-      <w:r>
-        <w:rPr>
-          <w:rFonts w:eastAsia="Times New Roman" w:cs="Times New Roman" w:ascii="Garamond" w:hAnsi="Garamond"/>
-          <w:color w:val="000000"/>
-          <w:kern w:val="0"/>
-          <w:sz w:val="36"/>
-          <w:szCs w:val="36"/>
-          <w:shd w:fill="auto" w:val="clear"/>
-          <w:lang w:val="en-US" w:eastAsia="zh-CN" w:bidi="hi-IN"/>
-        </w:rPr>
-        <w:t xml:space="preserve"> são mais curtas e menos desenvolvidas do que aquelas que viriam posteriormente.</w:t>
+          <w:rFonts w:ascii="Garamond" w:hAnsi="Garamond"/>
+          <w:sz w:val="36"/>
+          <w:szCs w:val="36"/>
+        </w:rPr>
+      </w:r>
+    </w:p>
+    <w:p>
+      <w:pPr>
+        <w:pStyle w:val="Normal"/>
+        <w:jc w:val="both"/>
+        <w:rPr>
+          <w:rFonts w:ascii="Garamond" w:hAnsi="Garamond" w:eastAsia="Times New Roman" w:cs="Times New Roman"/>
+          <w:color w:val="000000"/>
+          <w:kern w:val="0"/>
+          <w:sz w:val="36"/>
+          <w:szCs w:val="36"/>
+          <w:shd w:fill="auto" w:val="clear"/>
+          <w:lang w:val="en-US" w:eastAsia="zh-CN" w:bidi="hi-IN"/>
+        </w:rPr>
+      </w:pPr>
+      <w:r>
+        <w:rPr>
+          <w:rFonts w:eastAsia="Times New Roman" w:cs="Times New Roman" w:ascii="Garamond" w:hAnsi="Garamond"/>
+          <w:color w:val="000000"/>
+          <w:kern w:val="0"/>
+          <w:sz w:val="36"/>
+          <w:szCs w:val="36"/>
+          <w:shd w:fill="auto" w:val="clear"/>
+          <w:lang w:val="en-US" w:eastAsia="zh-CN" w:bidi="hi-IN"/>
+        </w:rPr>
+        <w:t>Entretanto, essas mensagens são mais curtas e menos desenvolvidas do que aquelas que viriam posteriormente.</w:t>
       </w:r>
       <w:r>
         <w:br w:type="page"/>
@@ -3604,49 +2860,33 @@
           <w:shd w:fill="auto" w:val="clear"/>
           <w:lang w:val="en-US" w:eastAsia="zh-CN" w:bidi="hi-IN"/>
         </w:rPr>
-        <w:t xml:space="preserve">A partir do capítulo 13, Jesus passa a ensinar intensamente por parábolas, usando </w:t>
-      </w:r>
-      <w:r>
-        <w:rPr>
-          <w:rFonts w:eastAsia="Times New Roman" w:cs="Times New Roman" w:ascii="Garamond" w:hAnsi="Garamond"/>
-          <w:color w:val="000000"/>
-          <w:kern w:val="0"/>
-          <w:sz w:val="36"/>
-          <w:szCs w:val="36"/>
-          <w:shd w:fill="auto" w:val="clear"/>
-          <w:lang w:val="en-US" w:eastAsia="zh-CN" w:bidi="hi-IN"/>
-        </w:rPr>
-        <w:t>símbolos</w:t>
-      </w:r>
-      <w:r>
-        <w:rPr>
-          <w:rFonts w:eastAsia="Times New Roman" w:cs="Times New Roman" w:ascii="Garamond" w:hAnsi="Garamond"/>
-          <w:color w:val="000000"/>
-          <w:kern w:val="0"/>
-          <w:sz w:val="36"/>
-          <w:szCs w:val="36"/>
-          <w:shd w:fill="auto" w:val="clear"/>
-          <w:lang w:val="en-US" w:eastAsia="zh-CN" w:bidi="hi-IN"/>
-        </w:rPr>
-        <w:t xml:space="preserve"> como sementes, plantio, solo, joio, árvores e colheita. </w:t>
-      </w:r>
-    </w:p>
-    <w:p>
-      <w:pPr>
-        <w:pStyle w:val="Normal"/>
-        <w:jc w:val="both"/>
-        <w:rPr>
-          <w:rFonts w:ascii="Garamond" w:hAnsi="Garamond" w:eastAsia="Times New Roman" w:cs="Times New Roman"/>
-          <w:color w:val="000000"/>
-          <w:kern w:val="0"/>
-          <w:sz w:val="36"/>
-          <w:szCs w:val="36"/>
-          <w:shd w:fill="auto" w:val="clear"/>
-          <w:lang w:val="en-US" w:eastAsia="zh-CN" w:bidi="hi-IN"/>
-        </w:rPr>
-      </w:pPr>
-      <w:r>
-        <w:rPr/>
+        <w:t xml:space="preserve">A partir do capítulo 13, Jesus passa a ensinar intensamente por parábolas, usando símbolos como sementes, plantio, solo, joio, árvores e colheita. </w:t>
+      </w:r>
+    </w:p>
+    <w:p>
+      <w:pPr>
+        <w:pStyle w:val="Normal"/>
+        <w:jc w:val="both"/>
+        <w:rPr>
+          <w:rFonts w:ascii="Garamond" w:hAnsi="Garamond" w:eastAsia="Times New Roman" w:cs="Times New Roman"/>
+          <w:color w:val="000000"/>
+          <w:kern w:val="0"/>
+          <w:sz w:val="36"/>
+          <w:szCs w:val="36"/>
+          <w:shd w:fill="auto" w:val="clear"/>
+          <w:lang w:val="en-US" w:eastAsia="zh-CN" w:bidi="hi-IN"/>
+        </w:rPr>
+      </w:pPr>
+      <w:r>
+        <w:rPr>
+          <w:rFonts w:eastAsia="Times New Roman" w:cs="Times New Roman" w:ascii="Garamond" w:hAnsi="Garamond"/>
+          <w:color w:val="000000"/>
+          <w:kern w:val="0"/>
+          <w:sz w:val="36"/>
+          <w:szCs w:val="36"/>
+          <w:shd w:fill="auto" w:val="clear"/>
+          <w:lang w:val="en-US" w:eastAsia="zh-CN" w:bidi="hi-IN"/>
+        </w:rPr>
       </w:r>
     </w:p>
     <w:p>
@@ -3726,43 +2966,7 @@
           <w:shd w:fill="auto" w:val="clear"/>
           <w:lang w:val="en-US" w:eastAsia="zh-CN" w:bidi="hi-IN"/>
         </w:rPr>
-        <w:t>E</w:t>
-      </w:r>
-      <w:r>
-        <w:rPr>
-          <w:rFonts w:eastAsia="Times New Roman" w:cs="Times New Roman" w:ascii="Garamond" w:hAnsi="Garamond"/>
-          <w:color w:val="000000"/>
-          <w:kern w:val="0"/>
-          <w:sz w:val="36"/>
-          <w:szCs w:val="36"/>
-          <w:shd w:fill="auto" w:val="clear"/>
-          <w:lang w:val="en-US" w:eastAsia="zh-CN" w:bidi="hi-IN"/>
-        </w:rPr>
-        <w:t xml:space="preserve"> por que houve essa mudança? </w:t>
-      </w:r>
-      <w:r>
-        <w:rPr>
-          <w:rFonts w:eastAsia="Times New Roman" w:cs="Times New Roman" w:ascii="Garamond" w:hAnsi="Garamond"/>
-          <w:color w:val="000000"/>
-          <w:kern w:val="0"/>
-          <w:sz w:val="36"/>
-          <w:szCs w:val="36"/>
-          <w:shd w:fill="auto" w:val="clear"/>
-          <w:lang w:val="en-US" w:eastAsia="zh-CN" w:bidi="hi-IN"/>
-        </w:rPr>
-        <w:t>Se olharmos</w:t>
-      </w:r>
-      <w:r>
-        <w:rPr>
-          <w:rFonts w:eastAsia="Times New Roman" w:cs="Times New Roman" w:ascii="Garamond" w:hAnsi="Garamond"/>
-          <w:color w:val="000000"/>
-          <w:kern w:val="0"/>
-          <w:sz w:val="36"/>
-          <w:szCs w:val="36"/>
-          <w:shd w:fill="auto" w:val="clear"/>
-          <w:lang w:val="en-US" w:eastAsia="zh-CN" w:bidi="hi-IN"/>
-        </w:rPr>
-        <w:t xml:space="preserve"> os capítulos 11 e 12, também do evangelho de Mateus, veremos que há neles uma crescente rejeição aos ensinamentos de Jesus.</w:t>
+        <w:t>E por que houve essa mudança? Se olharmos os capítulos 11 e 12, também do evangelho de Mateus, veremos que há neles uma crescente rejeição aos ensinamentos de Jesus.</w:t>
       </w:r>
     </w:p>
     <w:p>
@@ -3818,41 +3022,32 @@
           <w:shd w:fill="auto" w:val="clear"/>
           <w:lang w:val="en-US" w:eastAsia="zh-CN" w:bidi="hi-IN"/>
         </w:rPr>
-        <w:t xml:space="preserve">No capítulo 11, vemos a dúvida dos discípulos de João Batista, que </w:t>
-      </w:r>
-      <w:r>
-        <w:rPr>
-          <w:rFonts w:eastAsia="Times New Roman" w:cs="Times New Roman" w:ascii="Garamond" w:hAnsi="Garamond"/>
-          <w:b w:val="false"/>
-          <w:bCs w:val="false"/>
-          <w:color w:val="000000"/>
-          <w:kern w:val="0"/>
-          <w:sz w:val="36"/>
-          <w:szCs w:val="36"/>
-          <w:shd w:fill="auto" w:val="clear"/>
-          <w:lang w:val="en-US" w:eastAsia="zh-CN" w:bidi="hi-IN"/>
-        </w:rPr>
-        <w:t>expressam dúvida sobre Jesus ser de fato o Messias.</w:t>
-      </w:r>
-    </w:p>
-    <w:p>
-      <w:pPr>
-        <w:pStyle w:val="Normal"/>
-        <w:jc w:val="both"/>
-        <w:rPr>
-          <w:rFonts w:ascii="Garamond" w:hAnsi="Garamond" w:eastAsia="Times New Roman" w:cs="Times New Roman"/>
-          <w:color w:val="000000"/>
-          <w:kern w:val="0"/>
-          <w:sz w:val="36"/>
-          <w:szCs w:val="36"/>
-          <w:shd w:fill="auto" w:val="clear"/>
-          <w:lang w:val="en-US" w:eastAsia="zh-CN" w:bidi="hi-IN"/>
-        </w:rPr>
-      </w:pPr>
-      <w:r>
-        <w:rPr>
-          <w:b w:val="false"/>
-          <w:bCs w:val="false"/>
+        <w:t>No capítulo 11, vemos a dúvida dos discípulos de João Batista, que expressam dúvida sobre Jesus ser de fato o Messias.</w:t>
+      </w:r>
+    </w:p>
+    <w:p>
+      <w:pPr>
+        <w:pStyle w:val="Normal"/>
+        <w:jc w:val="both"/>
+        <w:rPr>
+          <w:rFonts w:ascii="Garamond" w:hAnsi="Garamond" w:eastAsia="Times New Roman" w:cs="Times New Roman"/>
+          <w:color w:val="000000"/>
+          <w:kern w:val="0"/>
+          <w:sz w:val="36"/>
+          <w:szCs w:val="36"/>
+          <w:shd w:fill="auto" w:val="clear"/>
+          <w:lang w:val="en-US" w:eastAsia="zh-CN" w:bidi="hi-IN"/>
+        </w:rPr>
+      </w:pPr>
+      <w:r>
+        <w:rPr>
+          <w:rFonts w:eastAsia="Times New Roman" w:cs="Times New Roman" w:ascii="Garamond" w:hAnsi="Garamond"/>
+          <w:color w:val="000000"/>
+          <w:kern w:val="0"/>
+          <w:sz w:val="36"/>
+          <w:szCs w:val="36"/>
+          <w:shd w:fill="auto" w:val="clear"/>
+          <w:lang w:val="en-US" w:eastAsia="zh-CN" w:bidi="hi-IN"/>
         </w:rPr>
       </w:r>
     </w:p>
@@ -3878,97 +3073,32 @@
           <w:shd w:fill="auto" w:val="clear"/>
           <w:lang w:val="en-US" w:eastAsia="zh-CN" w:bidi="hi-IN"/>
         </w:rPr>
-        <w:t>Vemos ainda</w:t>
-      </w:r>
-      <w:r>
-        <w:rPr>
-          <w:rFonts w:eastAsia="Times New Roman" w:cs="Times New Roman" w:ascii="Garamond" w:hAnsi="Garamond"/>
-          <w:b w:val="false"/>
-          <w:bCs w:val="false"/>
-          <w:color w:val="000000"/>
-          <w:kern w:val="0"/>
-          <w:sz w:val="36"/>
-          <w:szCs w:val="36"/>
-          <w:shd w:fill="auto" w:val="clear"/>
-          <w:lang w:val="en-US" w:eastAsia="zh-CN" w:bidi="hi-IN"/>
-        </w:rPr>
-        <w:t xml:space="preserve"> a rejeição </w:t>
-      </w:r>
-      <w:r>
-        <w:rPr>
-          <w:rFonts w:eastAsia="Times New Roman" w:cs="Times New Roman" w:ascii="Garamond" w:hAnsi="Garamond"/>
-          <w:b w:val="false"/>
-          <w:bCs w:val="false"/>
-          <w:color w:val="000000"/>
-          <w:kern w:val="0"/>
-          <w:sz w:val="36"/>
-          <w:szCs w:val="36"/>
-          <w:shd w:fill="auto" w:val="clear"/>
-          <w:lang w:val="en-US" w:eastAsia="zh-CN" w:bidi="hi-IN"/>
-        </w:rPr>
-        <w:t xml:space="preserve">por parte das pessoas </w:t>
-      </w:r>
-      <w:r>
-        <w:rPr>
-          <w:rFonts w:eastAsia="Times New Roman" w:cs="Times New Roman" w:ascii="Garamond" w:hAnsi="Garamond"/>
-          <w:b w:val="false"/>
-          <w:bCs w:val="false"/>
-          <w:color w:val="000000"/>
-          <w:kern w:val="0"/>
-          <w:sz w:val="36"/>
-          <w:szCs w:val="36"/>
-          <w:shd w:fill="auto" w:val="clear"/>
-          <w:lang w:val="en-US" w:eastAsia="zh-CN" w:bidi="hi-IN"/>
-        </w:rPr>
-        <w:t>de cidades como Corazim, Betsaida e Cafarnaum, que, apesar dos milagres realizados</w:t>
-      </w:r>
-      <w:r>
-        <w:rPr>
-          <w:rFonts w:eastAsia="Times New Roman" w:cs="Times New Roman" w:ascii="Garamond" w:hAnsi="Garamond"/>
-          <w:b w:val="false"/>
-          <w:bCs w:val="false"/>
-          <w:color w:val="000000"/>
-          <w:kern w:val="0"/>
-          <w:sz w:val="36"/>
-          <w:szCs w:val="36"/>
-          <w:shd w:fill="auto" w:val="clear"/>
-          <w:lang w:val="en-US" w:eastAsia="zh-CN" w:bidi="hi-IN"/>
-        </w:rPr>
-        <w:t xml:space="preserve"> por Jesus</w:t>
-      </w:r>
-      <w:r>
-        <w:rPr>
-          <w:rFonts w:eastAsia="Times New Roman" w:cs="Times New Roman" w:ascii="Garamond" w:hAnsi="Garamond"/>
-          <w:b w:val="false"/>
-          <w:bCs w:val="false"/>
-          <w:color w:val="000000"/>
-          <w:kern w:val="0"/>
-          <w:sz w:val="36"/>
-          <w:szCs w:val="36"/>
-          <w:shd w:fill="auto" w:val="clear"/>
-          <w:lang w:val="en-US" w:eastAsia="zh-CN" w:bidi="hi-IN"/>
-        </w:rPr>
-        <w:t>, não se arrependeram.</w:t>
-      </w:r>
-    </w:p>
-    <w:p>
-      <w:pPr>
-        <w:pStyle w:val="Normal"/>
-        <w:jc w:val="both"/>
-        <w:rPr>
-          <w:rFonts w:ascii="Garamond" w:hAnsi="Garamond" w:eastAsia="Times New Roman" w:cs="Times New Roman"/>
-          <w:color w:val="000000"/>
-          <w:kern w:val="0"/>
-          <w:sz w:val="36"/>
-          <w:szCs w:val="36"/>
-          <w:shd w:fill="auto" w:val="clear"/>
-          <w:lang w:val="en-US" w:eastAsia="zh-CN" w:bidi="hi-IN"/>
-        </w:rPr>
-      </w:pPr>
-      <w:r>
-        <w:rPr>
-          <w:b w:val="false"/>
-          <w:bCs w:val="false"/>
+        <w:t>Vemos ainda a rejeição por parte das pessoas de cidades como Corazim, Betsaida e Cafarnaum, que, apesar dos milagres realizados por Jesus, não se arrependeram.</w:t>
+      </w:r>
+    </w:p>
+    <w:p>
+      <w:pPr>
+        <w:pStyle w:val="Normal"/>
+        <w:jc w:val="both"/>
+        <w:rPr>
+          <w:rFonts w:ascii="Garamond" w:hAnsi="Garamond" w:eastAsia="Times New Roman" w:cs="Times New Roman"/>
+          <w:color w:val="000000"/>
+          <w:kern w:val="0"/>
+          <w:sz w:val="36"/>
+          <w:szCs w:val="36"/>
+          <w:shd w:fill="auto" w:val="clear"/>
+          <w:lang w:val="en-US" w:eastAsia="zh-CN" w:bidi="hi-IN"/>
+        </w:rPr>
+      </w:pPr>
+      <w:r>
+        <w:rPr>
+          <w:rFonts w:eastAsia="Times New Roman" w:cs="Times New Roman" w:ascii="Garamond" w:hAnsi="Garamond"/>
+          <w:color w:val="000000"/>
+          <w:kern w:val="0"/>
+          <w:sz w:val="36"/>
+          <w:szCs w:val="36"/>
+          <w:shd w:fill="auto" w:val="clear"/>
+          <w:lang w:val="en-US" w:eastAsia="zh-CN" w:bidi="hi-IN"/>
         </w:rPr>
       </w:r>
     </w:p>
@@ -3994,36 +3124,8 @@
           <w:shd w:fill="auto" w:val="clear"/>
           <w:lang w:val="en-US" w:eastAsia="zh-CN" w:bidi="hi-IN"/>
         </w:rPr>
-        <w:t>No capítulo 12, essa resistência se intensifica com a acusação dos fariseus de que Jesus agia pelo poder de Belzebu</w:t>
-      </w:r>
-      <w:r>
-        <w:rPr>
-          <w:rFonts w:eastAsia="Times New Roman" w:cs="Times New Roman" w:ascii="Garamond" w:hAnsi="Garamond"/>
-          <w:b w:val="false"/>
-          <w:bCs w:val="false"/>
-          <w:color w:val="000000"/>
-          <w:kern w:val="0"/>
-          <w:sz w:val="36"/>
-          <w:szCs w:val="36"/>
-          <w:shd w:fill="auto" w:val="clear"/>
-          <w:lang w:val="en-US" w:eastAsia="zh-CN" w:bidi="hi-IN"/>
-        </w:rPr>
-        <w:t>, atribuindo Sua ação espiritual a uma origem demoníaca.</w:t>
-      </w:r>
-    </w:p>
-    <w:p>
-      <w:pPr>
-        <w:sectPr>
-          <w:headerReference w:type="default" r:id="rId2"/>
-          <w:type w:val="nextPage"/>
-          <w:pgSz w:w="11906" w:h="16838"/>
-          <w:pgMar w:left="1440" w:right="1440" w:gutter="0" w:header="720" w:top="1440" w:footer="0" w:bottom="1440"/>
-          <w:pgNumType w:start="1" w:fmt="decimal"/>
-          <w:formProt w:val="true"/>
-          <w:textDirection w:val="lrTb"/>
-          <w:docGrid w:type="default" w:linePitch="100" w:charSpace="4096"/>
-        </w:sectPr>
-      </w:pPr>
+        <w:t>No capítulo 12, essa resistência se intensifica com a acusação dos fariseus de que Jesus agia pelo poder de Belzebu, atribuindo Sua ação espiritual a uma origem demoníaca.</w:t>
+      </w:r>
     </w:p>
     <w:p>
       <w:pPr>
@@ -4036,19 +3138,19 @@
         </w:rPr>
       </w:pPr>
       <w:r>
-        <w:rPr>
-          <w:rFonts w:eastAsia="Times New Roman" w:cs="Times New Roman" w:ascii="Garamond" w:hAnsi="Garamond"/>
+        <w:rPr/>
+      </w:r>
+    </w:p>
+    <w:p>
+      <w:pPr>
+        <w:pStyle w:val="Normal"/>
+        <w:jc w:val="both"/>
+        <w:rPr>
+          <w:b w:val="false"/>
           <w:b w:val="false"/>
           <w:bCs w:val="false"/>
-          <w:color w:val="000000"/>
-          <w:kern w:val="0"/>
-          <w:sz w:val="36"/>
-          <w:szCs w:val="36"/>
-          <w:shd w:fill="auto" w:val="clear"/>
-          <w:lang w:val="en-US" w:eastAsia="zh-CN" w:bidi="hi-IN"/>
-        </w:rPr>
-        <w:t>Eles também pedem a Jesus</w:t>
-      </w:r>
+        </w:rPr>
+      </w:pPr>
       <w:r>
         <w:rPr>
           <w:rFonts w:eastAsia="Times New Roman" w:cs="Times New Roman" w:ascii="Garamond" w:hAnsi="Garamond"/>
@@ -4061,63 +3163,326 @@
           <w:shd w:fill="auto" w:val="clear"/>
           <w:lang w:val="en-US" w:eastAsia="zh-CN" w:bidi="hi-IN"/>
         </w:rPr>
-        <w:t xml:space="preserve"> um “sinal”, mesmo após tantos milagres, revelando não falta de evidências, mas uma recusa interior em acolher </w:t>
-      </w:r>
-      <w:r>
-        <w:rPr>
-          <w:rFonts w:eastAsia="Times New Roman" w:cs="Times New Roman" w:ascii="Garamond" w:hAnsi="Garamond"/>
+        <w:t>Eles também pedem a Jesus um “sinal”, mesmo após tantos milagres, revelando não falta de evidências, mas uma recusa interior em acolher a mensagem do Mestre.</w:t>
+      </w:r>
+    </w:p>
+    <w:p>
+      <w:pPr>
+        <w:pStyle w:val="Normal"/>
+        <w:ind w:left="0" w:hanging="0"/>
+        <w:jc w:val="both"/>
+        <w:rPr>
+          <w:rFonts w:ascii="Garamond" w:hAnsi="Garamond" w:eastAsia="Times New Roman" w:cs="Times New Roman"/>
+          <w:color w:val="000000"/>
+          <w:kern w:val="0"/>
+          <w:sz w:val="36"/>
+          <w:szCs w:val="36"/>
+          <w:shd w:fill="auto" w:val="clear"/>
+          <w:lang w:val="en-US" w:eastAsia="zh-CN" w:bidi="hi-IN"/>
+        </w:rPr>
+      </w:pPr>
+      <w:r>
+        <w:rPr>
+          <w:rFonts w:eastAsia="Times New Roman" w:cs="Times New Roman" w:ascii="Garamond" w:hAnsi="Garamond"/>
+          <w:color w:val="000000"/>
+          <w:kern w:val="0"/>
+          <w:sz w:val="36"/>
+          <w:szCs w:val="36"/>
+          <w:shd w:fill="auto" w:val="clear"/>
+          <w:lang w:val="en-US" w:eastAsia="zh-CN" w:bidi="hi-IN"/>
+        </w:rPr>
+      </w:r>
+    </w:p>
+    <w:p>
+      <w:pPr>
+        <w:pStyle w:val="Normal"/>
+        <w:ind w:left="0" w:hanging="0"/>
+        <w:jc w:val="both"/>
+        <w:rPr>
+          <w:rFonts w:ascii="Garamond" w:hAnsi="Garamond" w:eastAsia="Times New Roman" w:cs="Times New Roman"/>
+          <w:color w:val="000000"/>
+          <w:kern w:val="0"/>
+          <w:sz w:val="36"/>
+          <w:szCs w:val="36"/>
+          <w:shd w:fill="auto" w:val="clear"/>
+          <w:lang w:val="en-US" w:eastAsia="zh-CN" w:bidi="hi-IN"/>
+        </w:rPr>
+      </w:pPr>
+      <w:r>
+        <w:rPr>
+          <w:rFonts w:eastAsia="Times New Roman" w:cs="Times New Roman" w:ascii="Garamond" w:hAnsi="Garamond"/>
+          <w:color w:val="000000"/>
+          <w:kern w:val="0"/>
+          <w:sz w:val="36"/>
+          <w:szCs w:val="36"/>
+          <w:shd w:fill="auto" w:val="clear"/>
+          <w:lang w:val="en-US" w:eastAsia="zh-CN" w:bidi="hi-IN"/>
+        </w:rPr>
+        <w:t>Então, enquanto alguns ouviam e procuravam compreender e acolher os ensinamentos de Jesus, outros permaneciam indiferentes, ou até mesmo hostis, apesar de tudo o que haviam visto e testemunhado.</w:t>
+      </w:r>
+    </w:p>
+    <w:p>
+      <w:pPr>
+        <w:pStyle w:val="Normal"/>
+        <w:ind w:left="0" w:hanging="0"/>
+        <w:jc w:val="both"/>
+        <w:rPr>
+          <w:rFonts w:ascii="Garamond" w:hAnsi="Garamond" w:eastAsia="Times New Roman" w:cs="Times New Roman"/>
+          <w:color w:val="000000"/>
+          <w:kern w:val="0"/>
+          <w:sz w:val="36"/>
+          <w:szCs w:val="36"/>
+          <w:shd w:fill="auto" w:val="clear"/>
+          <w:lang w:val="en-US" w:eastAsia="zh-CN" w:bidi="hi-IN"/>
+        </w:rPr>
+      </w:pPr>
+      <w:r>
+        <w:rPr>
+          <w:rFonts w:eastAsia="Times New Roman" w:cs="Times New Roman" w:ascii="Garamond" w:hAnsi="Garamond"/>
+          <w:color w:val="000000"/>
+          <w:kern w:val="0"/>
+          <w:sz w:val="36"/>
+          <w:szCs w:val="36"/>
+          <w:shd w:fill="auto" w:val="clear"/>
+          <w:lang w:val="en-US" w:eastAsia="zh-CN" w:bidi="hi-IN"/>
+        </w:rPr>
+      </w:r>
+    </w:p>
+    <w:p>
+      <w:pPr>
+        <w:pStyle w:val="Normal"/>
+        <w:ind w:left="0" w:hanging="0"/>
+        <w:jc w:val="both"/>
+        <w:rPr>
+          <w:rFonts w:ascii="Garamond" w:hAnsi="Garamond" w:eastAsia="Times New Roman" w:cs="Times New Roman"/>
+          <w:color w:val="000000"/>
+          <w:kern w:val="0"/>
+          <w:sz w:val="36"/>
+          <w:szCs w:val="36"/>
+          <w:shd w:fill="auto" w:val="clear"/>
+          <w:lang w:val="en-US" w:eastAsia="zh-CN" w:bidi="hi-IN"/>
+        </w:rPr>
+      </w:pPr>
+      <w:r>
+        <w:rPr>
+          <w:rFonts w:eastAsia="Times New Roman" w:cs="Times New Roman" w:ascii="Garamond" w:hAnsi="Garamond"/>
+          <w:color w:val="000000"/>
+          <w:kern w:val="0"/>
+          <w:sz w:val="36"/>
+          <w:szCs w:val="36"/>
+          <w:shd w:fill="auto" w:val="clear"/>
+          <w:lang w:val="en-US" w:eastAsia="zh-CN" w:bidi="hi-IN"/>
+        </w:rPr>
+        <w:t>Por essa razão, a partir do capítulo 13, Jesus passa a falar mais diretamente àqueles que teriam condições de compreender seus ensinamentos e se esforçar para praticá-los.</w:t>
+      </w:r>
+    </w:p>
+    <w:p>
+      <w:pPr>
+        <w:pStyle w:val="Normal"/>
+        <w:ind w:left="0" w:hanging="0"/>
+        <w:jc w:val="both"/>
+        <w:rPr>
+          <w:rFonts w:ascii="Garamond" w:hAnsi="Garamond" w:eastAsia="Times New Roman" w:cs="Times New Roman"/>
+          <w:color w:val="000000"/>
+          <w:kern w:val="0"/>
+          <w:sz w:val="36"/>
+          <w:szCs w:val="36"/>
+          <w:shd w:fill="auto" w:val="clear"/>
+          <w:lang w:val="en-US" w:eastAsia="zh-CN" w:bidi="hi-IN"/>
+        </w:rPr>
+      </w:pPr>
+      <w:r>
+        <w:rPr>
+          <w:rFonts w:eastAsia="Times New Roman" w:cs="Times New Roman" w:ascii="Garamond" w:hAnsi="Garamond"/>
+          <w:color w:val="000000"/>
+          <w:kern w:val="0"/>
+          <w:sz w:val="36"/>
+          <w:szCs w:val="36"/>
+          <w:shd w:fill="auto" w:val="clear"/>
+          <w:lang w:val="en-US" w:eastAsia="zh-CN" w:bidi="hi-IN"/>
+        </w:rPr>
+      </w:r>
+    </w:p>
+    <w:p>
+      <w:pPr>
+        <w:pStyle w:val="Normal"/>
+        <w:ind w:left="0" w:hanging="0"/>
+        <w:jc w:val="both"/>
+        <w:rPr>
+          <w:rFonts w:ascii="Garamond" w:hAnsi="Garamond" w:eastAsia="Times New Roman" w:cs="Times New Roman"/>
+          <w:color w:val="000000"/>
+          <w:kern w:val="0"/>
+          <w:sz w:val="36"/>
+          <w:szCs w:val="36"/>
+          <w:shd w:fill="auto" w:val="clear"/>
+          <w:lang w:val="en-US" w:eastAsia="zh-CN" w:bidi="hi-IN"/>
+        </w:rPr>
+      </w:pPr>
+      <w:r>
+        <w:rPr>
+          <w:rFonts w:eastAsia="Times New Roman" w:cs="Times New Roman" w:ascii="Garamond" w:hAnsi="Garamond"/>
+          <w:color w:val="000000"/>
+          <w:kern w:val="0"/>
+          <w:sz w:val="36"/>
+          <w:szCs w:val="36"/>
+          <w:shd w:fill="auto" w:val="clear"/>
+          <w:lang w:val="en-US" w:eastAsia="zh-CN" w:bidi="hi-IN"/>
+        </w:rPr>
+        <w:t>É nesse contexto que Jesus apresenta a parábola do joio e do trigo. De certa forma, podemos dizer que os capítulos 11 e 12 já nos mostram o joio em ação antes mesmo de a parábola ser contada.</w:t>
+      </w:r>
+      <w:r>
+        <w:br w:type="page"/>
+      </w:r>
+    </w:p>
+    <w:p>
+      <w:pPr>
+        <w:pStyle w:val="Normal"/>
+        <w:ind w:left="0" w:hanging="0"/>
+        <w:jc w:val="both"/>
+        <w:rPr>
+          <w:rFonts w:ascii="Garamond" w:hAnsi="Garamond" w:eastAsia="Times New Roman" w:cs="Times New Roman"/>
+          <w:color w:val="000000"/>
+          <w:kern w:val="0"/>
+          <w:sz w:val="36"/>
+          <w:szCs w:val="36"/>
+          <w:shd w:fill="auto" w:val="clear"/>
+          <w:lang w:val="en-US" w:eastAsia="zh-CN" w:bidi="hi-IN"/>
+        </w:rPr>
+      </w:pPr>
+      <w:r>
+        <w:rPr>
+          <w:rFonts w:eastAsia="Times New Roman" w:cs="Times New Roman" w:ascii="Garamond" w:hAnsi="Garamond"/>
+          <w:color w:val="000000"/>
+          <w:kern w:val="0"/>
+          <w:sz w:val="36"/>
+          <w:szCs w:val="36"/>
+          <w:shd w:fill="auto" w:val="clear"/>
+          <w:lang w:val="en-US" w:eastAsia="zh-CN" w:bidi="hi-IN"/>
+        </w:rPr>
+        <w:t>Feitos estes esclarecimentos, passemos então a uma análise mais detalhada da parábola. Embora o próprio Jesus a tenha explicado, como vimos anteriormente, seu conteúdo é tão rico que ainda podemos extrair novos ensinamentos dela.</w:t>
+      </w:r>
+    </w:p>
+    <w:p>
+      <w:pPr>
+        <w:pStyle w:val="Normal"/>
+        <w:ind w:left="0" w:hanging="0"/>
+        <w:jc w:val="both"/>
+        <w:rPr>
+          <w:rFonts w:ascii="Garamond" w:hAnsi="Garamond" w:eastAsia="Times New Roman" w:cs="Times New Roman"/>
+          <w:color w:val="000000"/>
+          <w:kern w:val="0"/>
+          <w:sz w:val="36"/>
+          <w:szCs w:val="36"/>
+          <w:shd w:fill="auto" w:val="clear"/>
+          <w:lang w:val="en-US" w:eastAsia="zh-CN" w:bidi="hi-IN"/>
+        </w:rPr>
+      </w:pPr>
+      <w:r>
+        <w:rPr/>
+      </w:r>
+    </w:p>
+    <w:p>
+      <w:pPr>
+        <w:pStyle w:val="Normal"/>
+        <w:ind w:left="0" w:hanging="0"/>
+        <w:jc w:val="both"/>
+        <w:rPr>
+          <w:rFonts w:ascii="Garamond" w:hAnsi="Garamond" w:eastAsia="Times New Roman" w:cs="Times New Roman"/>
+          <w:color w:val="000000"/>
+          <w:kern w:val="0"/>
+          <w:sz w:val="36"/>
+          <w:szCs w:val="36"/>
+          <w:shd w:fill="auto" w:val="clear"/>
+          <w:lang w:val="en-US" w:eastAsia="zh-CN" w:bidi="hi-IN"/>
+        </w:rPr>
+      </w:pPr>
+      <w:r>
+        <w:rPr>
+          <w:rFonts w:eastAsia="Times New Roman" w:cs="Times New Roman" w:ascii="Garamond" w:hAnsi="Garamond"/>
+          <w:color w:val="000000"/>
+          <w:kern w:val="0"/>
+          <w:sz w:val="36"/>
+          <w:szCs w:val="36"/>
+          <w:shd w:fill="auto" w:val="clear"/>
+          <w:lang w:val="en-US" w:eastAsia="zh-CN" w:bidi="hi-IN"/>
+        </w:rPr>
+        <w:t xml:space="preserve">[ </w:t>
+      </w:r>
+      <w:r>
+        <w:rPr>
+          <w:rFonts w:eastAsia="Times New Roman" w:cs="Times New Roman" w:ascii="Garamond" w:hAnsi="Garamond"/>
+          <w:b/>
+          <w:bCs/>
+          <w:color w:val="18A303"/>
+          <w:kern w:val="0"/>
+          <w:sz w:val="36"/>
+          <w:szCs w:val="36"/>
+          <w:shd w:fill="auto" w:val="clear"/>
+          <w:lang w:val="en-US" w:eastAsia="zh-CN" w:bidi="hi-IN"/>
+        </w:rPr>
+        <w:t>Ver quais trechos podem ser desmembrados</w:t>
+      </w:r>
+      <w:r>
+        <w:rPr>
+          <w:rFonts w:eastAsia="Times New Roman" w:cs="Times New Roman" w:ascii="Garamond" w:hAnsi="Garamond"/>
+          <w:color w:val="000000"/>
+          <w:kern w:val="0"/>
+          <w:sz w:val="36"/>
+          <w:szCs w:val="36"/>
+          <w:shd w:fill="auto" w:val="clear"/>
+          <w:lang w:val="en-US" w:eastAsia="zh-CN" w:bidi="hi-IN"/>
+        </w:rPr>
+        <w:t xml:space="preserve"> ]</w:t>
+      </w:r>
+    </w:p>
+    <w:p>
+      <w:pPr>
+        <w:pStyle w:val="Normal"/>
+        <w:ind w:left="0" w:hanging="0"/>
+        <w:jc w:val="both"/>
+        <w:rPr>
+          <w:rFonts w:ascii="Garamond" w:hAnsi="Garamond" w:eastAsia="Times New Roman" w:cs="Times New Roman"/>
+          <w:color w:val="000000"/>
+          <w:kern w:val="0"/>
+          <w:sz w:val="36"/>
+          <w:szCs w:val="36"/>
+          <w:shd w:fill="auto" w:val="clear"/>
+          <w:lang w:val="en-US" w:eastAsia="zh-CN" w:bidi="hi-IN"/>
+        </w:rPr>
+      </w:pPr>
+      <w:r>
+        <w:rPr/>
+      </w:r>
+    </w:p>
+    <w:p>
+      <w:pPr>
+        <w:pStyle w:val="Normal"/>
+        <w:ind w:left="0" w:hanging="0"/>
+        <w:jc w:val="both"/>
+        <w:rPr>
+          <w:b w:val="false"/>
           <w:b w:val="false"/>
           <w:bCs w:val="false"/>
-          <w:color w:val="000000"/>
-          <w:kern w:val="0"/>
-          <w:sz w:val="36"/>
-          <w:szCs w:val="36"/>
-          <w:shd w:fill="auto" w:val="clear"/>
-          <w:lang w:val="en-US" w:eastAsia="zh-CN" w:bidi="hi-IN"/>
-        </w:rPr>
-        <w:t>a</w:t>
-      </w:r>
+          <w:color w:val="auto"/>
+          <w:u w:val="none"/>
+        </w:rPr>
+      </w:pPr>
       <w:r>
         <w:rPr>
           <w:rFonts w:eastAsia="Times New Roman" w:cs="Times New Roman" w:ascii="Garamond" w:hAnsi="Garamond"/>
           <w:b w:val="false"/>
           <w:bCs w:val="false"/>
-          <w:color w:val="000000"/>
-          <w:kern w:val="0"/>
-          <w:sz w:val="36"/>
-          <w:szCs w:val="36"/>
-          <w:shd w:fill="auto" w:val="clear"/>
-          <w:lang w:val="en-US" w:eastAsia="zh-CN" w:bidi="hi-IN"/>
-        </w:rPr>
-        <w:t xml:space="preserve"> mensagem</w:t>
-      </w:r>
-      <w:r>
-        <w:rPr>
-          <w:rFonts w:eastAsia="Times New Roman" w:cs="Times New Roman" w:ascii="Garamond" w:hAnsi="Garamond"/>
-          <w:b w:val="false"/>
-          <w:bCs w:val="false"/>
-          <w:color w:val="000000"/>
-          <w:kern w:val="0"/>
-          <w:sz w:val="36"/>
-          <w:szCs w:val="36"/>
-          <w:shd w:fill="auto" w:val="clear"/>
-          <w:lang w:val="en-US" w:eastAsia="zh-CN" w:bidi="hi-IN"/>
-        </w:rPr>
-        <w:t xml:space="preserve"> do Mestre</w:t>
-      </w:r>
-      <w:r>
-        <w:rPr>
-          <w:rFonts w:eastAsia="Times New Roman" w:cs="Times New Roman" w:ascii="Garamond" w:hAnsi="Garamond"/>
-          <w:b w:val="false"/>
-          <w:bCs w:val="false"/>
-          <w:color w:val="000000"/>
-          <w:kern w:val="0"/>
-          <w:sz w:val="36"/>
-          <w:szCs w:val="36"/>
-          <w:shd w:fill="auto" w:val="clear"/>
-          <w:lang w:val="en-US" w:eastAsia="zh-CN" w:bidi="hi-IN"/>
-        </w:rPr>
-        <w:t>.</w:t>
+          <w:i/>
+          <w:iCs/>
+          <w:color w:val="000000"/>
+          <w:kern w:val="0"/>
+          <w:sz w:val="36"/>
+          <w:szCs w:val="36"/>
+          <w:u w:val="single"/>
+          <w:shd w:fill="auto" w:val="clear"/>
+          <w:lang w:val="en-US" w:eastAsia="zh-CN" w:bidi="hi-IN"/>
+        </w:rPr>
+        <w:t>Mas, dormindo os homens, veio o seu inimigo, e semeou joio no meio do trigo, e retirou-se</w:t>
       </w:r>
     </w:p>
     <w:p>
@@ -4136,15 +3501,7 @@
         </w:rPr>
       </w:pPr>
       <w:r>
-        <w:rPr>
-          <w:rFonts w:eastAsia="Times New Roman" w:cs="Times New Roman" w:ascii="Garamond" w:hAnsi="Garamond"/>
-          <w:color w:val="000000"/>
-          <w:kern w:val="0"/>
-          <w:sz w:val="36"/>
-          <w:szCs w:val="36"/>
-          <w:shd w:fill="auto" w:val="clear"/>
-          <w:lang w:val="en-US" w:eastAsia="zh-CN" w:bidi="hi-IN"/>
-        </w:rPr>
+        <w:rPr/>
       </w:r>
     </w:p>
     <w:p>
@@ -4165,86 +3522,126 @@
       <w:r>
         <w:rPr>
           <w:rFonts w:eastAsia="Times New Roman" w:cs="Times New Roman" w:ascii="Garamond" w:hAnsi="Garamond"/>
-          <w:color w:val="000000"/>
-          <w:kern w:val="0"/>
-          <w:sz w:val="36"/>
-          <w:szCs w:val="36"/>
-          <w:shd w:fill="auto" w:val="clear"/>
-          <w:lang w:val="en-US" w:eastAsia="zh-CN" w:bidi="hi-IN"/>
-        </w:rPr>
-        <w:t>E</w:t>
-      </w:r>
-      <w:r>
-        <w:rPr>
-          <w:rFonts w:eastAsia="Times New Roman" w:cs="Times New Roman" w:ascii="Garamond" w:hAnsi="Garamond"/>
-          <w:color w:val="000000"/>
-          <w:kern w:val="0"/>
-          <w:sz w:val="36"/>
-          <w:szCs w:val="36"/>
-          <w:shd w:fill="auto" w:val="clear"/>
-          <w:lang w:val="en-US" w:eastAsia="zh-CN" w:bidi="hi-IN"/>
-        </w:rPr>
-        <w:t>ntão, e</w:t>
-      </w:r>
-      <w:r>
-        <w:rPr>
-          <w:rFonts w:eastAsia="Times New Roman" w:cs="Times New Roman" w:ascii="Garamond" w:hAnsi="Garamond"/>
-          <w:color w:val="000000"/>
-          <w:kern w:val="0"/>
-          <w:sz w:val="36"/>
-          <w:szCs w:val="36"/>
-          <w:shd w:fill="auto" w:val="clear"/>
-          <w:lang w:val="en-US" w:eastAsia="zh-CN" w:bidi="hi-IN"/>
-        </w:rPr>
-        <w:t xml:space="preserve">nquanto alguns ouviam e procuravam compreender </w:t>
-      </w:r>
-      <w:r>
-        <w:rPr>
-          <w:rFonts w:eastAsia="Times New Roman" w:cs="Times New Roman" w:ascii="Garamond" w:hAnsi="Garamond"/>
-          <w:color w:val="000000"/>
-          <w:kern w:val="0"/>
-          <w:sz w:val="36"/>
-          <w:szCs w:val="36"/>
-          <w:shd w:fill="auto" w:val="clear"/>
-          <w:lang w:val="en-US" w:eastAsia="zh-CN" w:bidi="hi-IN"/>
-        </w:rPr>
-        <w:t xml:space="preserve">e acolher </w:t>
-      </w:r>
-      <w:r>
-        <w:rPr>
-          <w:rFonts w:eastAsia="Times New Roman" w:cs="Times New Roman" w:ascii="Garamond" w:hAnsi="Garamond"/>
-          <w:color w:val="000000"/>
-          <w:kern w:val="0"/>
-          <w:sz w:val="36"/>
-          <w:szCs w:val="36"/>
-          <w:shd w:fill="auto" w:val="clear"/>
-          <w:lang w:val="en-US" w:eastAsia="zh-CN" w:bidi="hi-IN"/>
-        </w:rPr>
-        <w:t xml:space="preserve">os ensinamentos de Jesus, outros permaneciam indiferentes, ou </w:t>
-      </w:r>
-      <w:r>
-        <w:rPr>
-          <w:rFonts w:eastAsia="Times New Roman" w:cs="Times New Roman" w:ascii="Garamond" w:hAnsi="Garamond"/>
-          <w:color w:val="000000"/>
-          <w:kern w:val="0"/>
-          <w:sz w:val="36"/>
-          <w:szCs w:val="36"/>
-          <w:shd w:fill="auto" w:val="clear"/>
-          <w:lang w:val="en-US" w:eastAsia="zh-CN" w:bidi="hi-IN"/>
-        </w:rPr>
-        <w:t xml:space="preserve">até </w:t>
-      </w:r>
-      <w:r>
-        <w:rPr>
-          <w:rFonts w:eastAsia="Times New Roman" w:cs="Times New Roman" w:ascii="Garamond" w:hAnsi="Garamond"/>
-          <w:color w:val="000000"/>
-          <w:kern w:val="0"/>
-          <w:sz w:val="36"/>
-          <w:szCs w:val="36"/>
-          <w:shd w:fill="auto" w:val="clear"/>
-          <w:lang w:val="en-US" w:eastAsia="zh-CN" w:bidi="hi-IN"/>
-        </w:rPr>
-        <w:t>mesmo hostis, apesar de tudo o que haviam visto e testemunhado.</w:t>
+          <w:i/>
+          <w:iCs/>
+          <w:color w:val="000000"/>
+          <w:kern w:val="0"/>
+          <w:sz w:val="36"/>
+          <w:szCs w:val="36"/>
+          <w:shd w:fill="auto" w:val="clear"/>
+          <w:lang w:val="en-US" w:eastAsia="zh-CN" w:bidi="hi-IN"/>
+        </w:rPr>
+        <w:t>Dormindo os homens</w:t>
+      </w:r>
+      <w:r>
+        <w:rPr>
+          <w:rFonts w:eastAsia="Times New Roman" w:cs="Times New Roman" w:ascii="Garamond" w:hAnsi="Garamond"/>
+          <w:color w:val="000000"/>
+          <w:kern w:val="0"/>
+          <w:sz w:val="36"/>
+          <w:szCs w:val="36"/>
+          <w:shd w:fill="auto" w:val="clear"/>
+          <w:lang w:val="en-US" w:eastAsia="zh-CN" w:bidi="hi-IN"/>
+        </w:rPr>
+        <w:t xml:space="preserve">: </w:t>
+      </w:r>
+      <w:r>
+        <w:rPr>
+          <w:rFonts w:eastAsia="Times New Roman" w:cs="Times New Roman" w:ascii="Garamond" w:hAnsi="Garamond"/>
+          <w:color w:val="000000"/>
+          <w:kern w:val="0"/>
+          <w:sz w:val="36"/>
+          <w:szCs w:val="36"/>
+          <w:shd w:fill="auto" w:val="clear"/>
+          <w:lang w:val="en-US" w:eastAsia="zh-CN" w:bidi="hi-IN"/>
+        </w:rPr>
+        <w:t>do ponto de vista</w:t>
+      </w:r>
+      <w:r>
+        <w:rPr>
+          <w:rFonts w:eastAsia="Times New Roman" w:cs="Times New Roman" w:ascii="Garamond" w:hAnsi="Garamond"/>
+          <w:color w:val="000000"/>
+          <w:kern w:val="0"/>
+          <w:sz w:val="36"/>
+          <w:szCs w:val="36"/>
+          <w:shd w:fill="auto" w:val="clear"/>
+          <w:lang w:val="en-US" w:eastAsia="zh-CN" w:bidi="hi-IN"/>
+        </w:rPr>
+        <w:t xml:space="preserve"> individual, </w:t>
+      </w:r>
+      <w:r>
+        <w:rPr>
+          <w:rFonts w:eastAsia="Times New Roman" w:cs="Times New Roman" w:ascii="Garamond" w:hAnsi="Garamond"/>
+          <w:i/>
+          <w:iCs/>
+          <w:color w:val="000000"/>
+          <w:kern w:val="0"/>
+          <w:sz w:val="36"/>
+          <w:szCs w:val="36"/>
+          <w:shd w:fill="auto" w:val="clear"/>
+          <w:lang w:val="en-US" w:eastAsia="zh-CN" w:bidi="hi-IN"/>
+        </w:rPr>
+        <w:t>os homens</w:t>
+      </w:r>
+      <w:r>
+        <w:rPr>
+          <w:rFonts w:eastAsia="Times New Roman" w:cs="Times New Roman" w:ascii="Garamond" w:hAnsi="Garamond"/>
+          <w:color w:val="000000"/>
+          <w:kern w:val="0"/>
+          <w:sz w:val="36"/>
+          <w:szCs w:val="36"/>
+          <w:shd w:fill="auto" w:val="clear"/>
+          <w:lang w:val="en-US" w:eastAsia="zh-CN" w:bidi="hi-IN"/>
+        </w:rPr>
+        <w:t xml:space="preserve"> representam as diversas existências que </w:t>
+      </w:r>
+      <w:r>
+        <w:rPr>
+          <w:rFonts w:eastAsia="Times New Roman" w:cs="Times New Roman" w:ascii="Garamond" w:hAnsi="Garamond"/>
+          <w:color w:val="000000"/>
+          <w:kern w:val="0"/>
+          <w:sz w:val="36"/>
+          <w:szCs w:val="36"/>
+          <w:shd w:fill="auto" w:val="clear"/>
+          <w:lang w:val="en-US" w:eastAsia="zh-CN" w:bidi="hi-IN"/>
+        </w:rPr>
+        <w:t>cada um de nós já teve</w:t>
+      </w:r>
+      <w:r>
+        <w:rPr>
+          <w:rFonts w:eastAsia="Times New Roman" w:cs="Times New Roman" w:ascii="Garamond" w:hAnsi="Garamond"/>
+          <w:color w:val="000000"/>
+          <w:kern w:val="0"/>
+          <w:sz w:val="36"/>
+          <w:szCs w:val="36"/>
+          <w:shd w:fill="auto" w:val="clear"/>
+          <w:lang w:val="en-US" w:eastAsia="zh-CN" w:bidi="hi-IN"/>
+        </w:rPr>
+        <w:t xml:space="preserve">, nas quais não despertamos para </w:t>
+      </w:r>
+      <w:r>
+        <w:rPr>
+          <w:rFonts w:eastAsia="Times New Roman" w:cs="Times New Roman" w:ascii="Garamond" w:hAnsi="Garamond"/>
+          <w:color w:val="000000"/>
+          <w:kern w:val="0"/>
+          <w:sz w:val="36"/>
+          <w:szCs w:val="36"/>
+          <w:shd w:fill="auto" w:val="clear"/>
+          <w:lang w:val="en-US" w:eastAsia="zh-CN" w:bidi="hi-IN"/>
+        </w:rPr>
+        <w:t>a luz</w:t>
+      </w:r>
+      <w:r>
+        <w:rPr>
+          <w:rFonts w:eastAsia="Times New Roman" w:cs="Times New Roman" w:ascii="Garamond" w:hAnsi="Garamond"/>
+          <w:color w:val="000000"/>
+          <w:kern w:val="0"/>
+          <w:sz w:val="36"/>
+          <w:szCs w:val="36"/>
+          <w:shd w:fill="auto" w:val="clear"/>
+          <w:lang w:val="en-US" w:eastAsia="zh-CN" w:bidi="hi-IN"/>
+        </w:rPr>
+        <w:t xml:space="preserve"> do Evangelho de Jesus. </w:t>
       </w:r>
     </w:p>
     <w:p>
@@ -4291,7 +3688,7 @@
           <w:shd w:fill="auto" w:val="clear"/>
           <w:lang w:val="en-US" w:eastAsia="zh-CN" w:bidi="hi-IN"/>
         </w:rPr>
-        <w:t>Por essa razão, a partir do capítulo 13, Jesus passa a falar mais diretamente àqueles que teriam condições de compreender seus ensinamentos e se esforçar para praticá-los.</w:t>
+        <w:t xml:space="preserve">Na atual existência, já demonstramos algum progresso e uma preocupação sincera com nossa evolução espiritual. Portanto, já estamos a caminho dela. </w:t>
       </w:r>
     </w:p>
     <w:p>
@@ -4310,15 +3707,7 @@
         </w:rPr>
       </w:pPr>
       <w:r>
-        <w:rPr>
-          <w:rFonts w:eastAsia="Times New Roman" w:cs="Times New Roman" w:ascii="Garamond" w:hAnsi="Garamond"/>
-          <w:color w:val="000000"/>
-          <w:kern w:val="0"/>
-          <w:sz w:val="36"/>
-          <w:szCs w:val="36"/>
-          <w:shd w:fill="auto" w:val="clear"/>
-          <w:lang w:val="en-US" w:eastAsia="zh-CN" w:bidi="hi-IN"/>
-        </w:rPr>
+        <w:rPr/>
       </w:r>
     </w:p>
     <w:p>
@@ -4346,7 +3735,31 @@
           <w:shd w:fill="auto" w:val="clear"/>
           <w:lang w:val="en-US" w:eastAsia="zh-CN" w:bidi="hi-IN"/>
         </w:rPr>
-        <w:t>É nesse contexto que Jesus apresenta a parábola do joio e do trigo. De certa forma, podemos dizer que os capítulos 11 e 12 já nos mostram o joio em ação antes mesmo de a parábola ser contada.</w:t>
+        <w:t xml:space="preserve">Mas é inegável que, em existências passadas, negligenciamos os ensinamentos </w:t>
+      </w:r>
+      <w:r>
+        <w:rPr>
+          <w:rFonts w:eastAsia="Times New Roman" w:cs="Times New Roman" w:ascii="Garamond" w:hAnsi="Garamond"/>
+          <w:color w:val="000000"/>
+          <w:kern w:val="0"/>
+          <w:sz w:val="36"/>
+          <w:szCs w:val="36"/>
+          <w:shd w:fill="auto" w:val="clear"/>
+          <w:lang w:val="en-US" w:eastAsia="zh-CN" w:bidi="hi-IN"/>
+        </w:rPr>
+        <w:t>do Mestre</w:t>
+      </w:r>
+      <w:r>
+        <w:rPr>
+          <w:rFonts w:eastAsia="Times New Roman" w:cs="Times New Roman" w:ascii="Garamond" w:hAnsi="Garamond"/>
+          <w:color w:val="000000"/>
+          <w:kern w:val="0"/>
+          <w:sz w:val="36"/>
+          <w:szCs w:val="36"/>
+          <w:shd w:fill="auto" w:val="clear"/>
+          <w:lang w:val="en-US" w:eastAsia="zh-CN" w:bidi="hi-IN"/>
+        </w:rPr>
+        <w:t xml:space="preserve"> e contraímos débitos perante as leis de Deus, débitos que precisamos resgatar, seja nesta encarnação, seja nas que ainda virão.</w:t>
       </w:r>
     </w:p>
     <w:p>
@@ -4365,15 +3778,7 @@
         </w:rPr>
       </w:pPr>
       <w:r>
-        <w:rPr>
-          <w:rFonts w:eastAsia="Times New Roman" w:cs="Times New Roman" w:ascii="Garamond" w:hAnsi="Garamond"/>
-          <w:color w:val="000000"/>
-          <w:kern w:val="0"/>
-          <w:sz w:val="36"/>
-          <w:szCs w:val="36"/>
-          <w:shd w:fill="auto" w:val="clear"/>
-          <w:lang w:val="en-US" w:eastAsia="zh-CN" w:bidi="hi-IN"/>
-        </w:rPr>
+        <w:rPr/>
       </w:r>
     </w:p>
     <w:p>
@@ -4401,59 +3806,877 @@
           <w:shd w:fill="auto" w:val="clear"/>
           <w:lang w:val="en-US" w:eastAsia="zh-CN" w:bidi="hi-IN"/>
         </w:rPr>
-        <w:t>[ Parei aqui em 31/05/2026 - Daqui em diante, é hora de começar a explorar a parábola ]</w:t>
-      </w:r>
-    </w:p>
-    <w:p>
-      <w:pPr>
-        <w:pStyle w:val="Normal"/>
-        <w:jc w:val="both"/>
-        <w:rPr>
-          <w:rFonts w:ascii="Garamond" w:hAnsi="Garamond" w:eastAsia="Times New Roman" w:cs="Times New Roman"/>
-          <w:color w:val="000000"/>
-          <w:kern w:val="0"/>
-          <w:sz w:val="36"/>
-          <w:szCs w:val="36"/>
-          <w:shd w:fill="auto" w:val="clear"/>
-          <w:lang w:val="en-US" w:eastAsia="zh-CN" w:bidi="hi-IN"/>
-        </w:rPr>
-      </w:pPr>
-      <w:r>
-        <w:rPr>
-          <w:rFonts w:eastAsia="Times New Roman" w:cs="Times New Roman" w:ascii="Garamond" w:hAnsi="Garamond"/>
-          <w:color w:val="000000"/>
-          <w:kern w:val="0"/>
-          <w:sz w:val="36"/>
-          <w:szCs w:val="36"/>
-          <w:shd w:fill="auto" w:val="clear"/>
-          <w:lang w:val="en-US" w:eastAsia="zh-CN" w:bidi="hi-IN"/>
-        </w:rPr>
-      </w:r>
-    </w:p>
-    <w:p>
-      <w:pPr>
-        <w:pStyle w:val="Normal"/>
-        <w:jc w:val="both"/>
-        <w:rPr>
-          <w:rFonts w:ascii="Garamond" w:hAnsi="Garamond" w:eastAsia="Times New Roman" w:cs="Times New Roman"/>
-          <w:color w:val="000000"/>
-          <w:kern w:val="0"/>
-          <w:sz w:val="36"/>
-          <w:szCs w:val="36"/>
-          <w:shd w:fill="auto" w:val="clear"/>
-          <w:lang w:val="en-US" w:eastAsia="zh-CN" w:bidi="hi-IN"/>
-        </w:rPr>
-      </w:pPr>
-      <w:r>
-        <w:rPr>
-          <w:rFonts w:eastAsia="Times New Roman" w:cs="Times New Roman" w:ascii="Garamond" w:hAnsi="Garamond"/>
-          <w:color w:val="000000"/>
-          <w:kern w:val="0"/>
-          <w:sz w:val="36"/>
-          <w:szCs w:val="36"/>
-          <w:shd w:fill="auto" w:val="clear"/>
-          <w:lang w:val="en-US" w:eastAsia="zh-CN" w:bidi="hi-IN"/>
-        </w:rPr>
+        <w:t>T</w:t>
+      </w:r>
+      <w:r>
+        <w:rPr>
+          <w:rFonts w:eastAsia="Times New Roman" w:cs="Times New Roman" w:ascii="Garamond" w:hAnsi="Garamond"/>
+          <w:color w:val="000000"/>
+          <w:kern w:val="0"/>
+          <w:sz w:val="36"/>
+          <w:szCs w:val="36"/>
+          <w:shd w:fill="auto" w:val="clear"/>
+          <w:lang w:val="en-US" w:eastAsia="zh-CN" w:bidi="hi-IN"/>
+        </w:rPr>
+        <w:t xml:space="preserve">ambém podemos interpretar o ato de dormir como sendo nossa invigilância. </w:t>
+      </w:r>
+      <w:r>
+        <w:rPr>
+          <w:rFonts w:eastAsia="Times New Roman" w:cs="Times New Roman" w:ascii="Garamond" w:hAnsi="Garamond"/>
+          <w:color w:val="000000"/>
+          <w:kern w:val="0"/>
+          <w:sz w:val="36"/>
+          <w:szCs w:val="36"/>
+          <w:shd w:fill="auto" w:val="clear"/>
+          <w:lang w:val="en-US" w:eastAsia="zh-CN" w:bidi="hi-IN"/>
+        </w:rPr>
+        <w:t>Não sei se vocês já ouviram falar de Amir Klink. Ele é um renomado navegador, escritor e palestrante brasileiro, famoso por suas inéditas expedições marítimas, como a primeira travessia a remo do Oceano Atlântico Sul em 1984 e suas inúmeras viagens à Antártica.</w:t>
+      </w:r>
+    </w:p>
+    <w:p>
+      <w:pPr>
+        <w:pStyle w:val="Normal"/>
+        <w:ind w:left="0" w:hanging="0"/>
+        <w:jc w:val="both"/>
+        <w:rPr>
+          <w:rFonts w:ascii="Garamond" w:hAnsi="Garamond" w:eastAsia="Times New Roman" w:cs="Times New Roman"/>
+          <w:color w:val="000000"/>
+          <w:kern w:val="0"/>
+          <w:sz w:val="36"/>
+          <w:szCs w:val="36"/>
+          <w:shd w:fill="auto" w:val="clear"/>
+          <w:lang w:val="en-US" w:eastAsia="zh-CN" w:bidi="hi-IN"/>
+        </w:rPr>
+      </w:pPr>
+      <w:r>
+        <w:rPr/>
+      </w:r>
+    </w:p>
+    <w:p>
+      <w:pPr>
+        <w:pStyle w:val="Normal"/>
+        <w:ind w:left="0" w:hanging="0"/>
+        <w:jc w:val="both"/>
+        <w:rPr>
+          <w:rFonts w:ascii="Garamond" w:hAnsi="Garamond" w:eastAsia="Times New Roman" w:cs="Times New Roman"/>
+          <w:color w:val="000000"/>
+          <w:kern w:val="0"/>
+          <w:sz w:val="36"/>
+          <w:szCs w:val="36"/>
+          <w:shd w:fill="auto" w:val="clear"/>
+          <w:lang w:val="en-US" w:eastAsia="zh-CN" w:bidi="hi-IN"/>
+        </w:rPr>
+      </w:pPr>
+      <w:r>
+        <w:rPr>
+          <w:rFonts w:eastAsia="Times New Roman" w:cs="Times New Roman" w:ascii="Garamond" w:hAnsi="Garamond"/>
+          <w:color w:val="000000"/>
+          <w:kern w:val="0"/>
+          <w:sz w:val="36"/>
+          <w:szCs w:val="36"/>
+          <w:shd w:fill="auto" w:val="clear"/>
+          <w:lang w:val="en-US" w:eastAsia="zh-CN" w:bidi="hi-IN"/>
+        </w:rPr>
+        <w:t>Klink sempre menciona que o verdadeiro perigo no mar não são as grandes tempestades, mas sim os momentos de calmaria ou a proximidade da chegada.</w:t>
+      </w:r>
+    </w:p>
+    <w:p>
+      <w:pPr>
+        <w:pStyle w:val="Normal"/>
+        <w:ind w:left="0" w:hanging="0"/>
+        <w:jc w:val="both"/>
+        <w:rPr>
+          <w:rFonts w:ascii="Garamond" w:hAnsi="Garamond" w:eastAsia="Times New Roman" w:cs="Times New Roman"/>
+          <w:color w:val="000000"/>
+          <w:kern w:val="0"/>
+          <w:sz w:val="36"/>
+          <w:szCs w:val="36"/>
+          <w:shd w:fill="auto" w:val="clear"/>
+          <w:lang w:val="en-US" w:eastAsia="zh-CN" w:bidi="hi-IN"/>
+        </w:rPr>
+      </w:pPr>
+      <w:r>
+        <w:rPr/>
+      </w:r>
+    </w:p>
+    <w:p>
+      <w:pPr>
+        <w:pStyle w:val="Normal"/>
+        <w:ind w:left="0" w:hanging="0"/>
+        <w:jc w:val="both"/>
+        <w:rPr>
+          <w:rFonts w:ascii="Garamond" w:hAnsi="Garamond" w:eastAsia="Times New Roman" w:cs="Times New Roman"/>
+          <w:color w:val="000000"/>
+          <w:kern w:val="0"/>
+          <w:sz w:val="36"/>
+          <w:szCs w:val="36"/>
+          <w:shd w:fill="auto" w:val="clear"/>
+          <w:lang w:val="en-US" w:eastAsia="zh-CN" w:bidi="hi-IN"/>
+        </w:rPr>
+      </w:pPr>
+      <w:r>
+        <w:rPr>
+          <w:rFonts w:eastAsia="Times New Roman" w:cs="Times New Roman" w:ascii="Garamond" w:hAnsi="Garamond"/>
+          <w:color w:val="000000"/>
+          <w:kern w:val="0"/>
+          <w:sz w:val="36"/>
+          <w:szCs w:val="36"/>
+          <w:shd w:fill="auto" w:val="clear"/>
+          <w:lang w:val="en-US" w:eastAsia="zh-CN" w:bidi="hi-IN"/>
+        </w:rPr>
+        <w:t>Quando as condições parecem seguras, a tripulação tende a relaxar, negligenciar os procedimentos de segurança, baixar a guarda e cometer erros bobos. É o excesso de confiança (a invigilância) que costuma gerar os incidentes mais graves.</w:t>
+      </w:r>
+    </w:p>
+    <w:p>
+      <w:pPr>
+        <w:pStyle w:val="Normal"/>
+        <w:ind w:left="0" w:hanging="0"/>
+        <w:jc w:val="both"/>
+        <w:rPr>
+          <w:rFonts w:ascii="Garamond" w:hAnsi="Garamond" w:eastAsia="Times New Roman" w:cs="Times New Roman"/>
+          <w:color w:val="000000"/>
+          <w:kern w:val="0"/>
+          <w:sz w:val="36"/>
+          <w:szCs w:val="36"/>
+          <w:shd w:fill="auto" w:val="clear"/>
+          <w:lang w:val="en-US" w:eastAsia="zh-CN" w:bidi="hi-IN"/>
+        </w:rPr>
+      </w:pPr>
+      <w:r>
+        <w:rPr/>
+      </w:r>
+    </w:p>
+    <w:p>
+      <w:pPr>
+        <w:pStyle w:val="Normal"/>
+        <w:ind w:left="0" w:hanging="0"/>
+        <w:jc w:val="both"/>
+        <w:rPr>
+          <w:rFonts w:ascii="Garamond" w:hAnsi="Garamond" w:eastAsia="Times New Roman" w:cs="Times New Roman"/>
+          <w:color w:val="000000"/>
+          <w:kern w:val="0"/>
+          <w:sz w:val="36"/>
+          <w:szCs w:val="36"/>
+          <w:shd w:fill="auto" w:val="clear"/>
+          <w:lang w:val="en-US" w:eastAsia="zh-CN" w:bidi="hi-IN"/>
+        </w:rPr>
+      </w:pPr>
+      <w:r>
+        <w:rPr>
+          <w:rFonts w:eastAsia="Times New Roman" w:cs="Times New Roman" w:ascii="Garamond" w:hAnsi="Garamond"/>
+          <w:color w:val="000000"/>
+          <w:kern w:val="0"/>
+          <w:sz w:val="36"/>
+          <w:szCs w:val="36"/>
+          <w:shd w:fill="auto" w:val="clear"/>
+          <w:lang w:val="en-US" w:eastAsia="zh-CN" w:bidi="hi-IN"/>
+        </w:rPr>
+        <w:t xml:space="preserve">É exatamente isso que acontece conosco. Quando estamos nos momentos turbulentos da vida, com muitos problemas, muitas preocupações, costumamos ficar atentos. </w:t>
+      </w:r>
+    </w:p>
+    <w:p>
+      <w:pPr>
+        <w:pStyle w:val="Normal"/>
+        <w:ind w:left="0" w:hanging="0"/>
+        <w:jc w:val="both"/>
+        <w:rPr>
+          <w:rFonts w:ascii="Garamond" w:hAnsi="Garamond" w:eastAsia="Times New Roman" w:cs="Times New Roman"/>
+          <w:color w:val="000000"/>
+          <w:kern w:val="0"/>
+          <w:sz w:val="36"/>
+          <w:szCs w:val="36"/>
+          <w:shd w:fill="auto" w:val="clear"/>
+          <w:lang w:val="en-US" w:eastAsia="zh-CN" w:bidi="hi-IN"/>
+        </w:rPr>
+      </w:pPr>
+      <w:r>
+        <w:rPr/>
+      </w:r>
+    </w:p>
+    <w:p>
+      <w:pPr>
+        <w:pStyle w:val="Normal"/>
+        <w:ind w:left="0" w:hanging="0"/>
+        <w:jc w:val="both"/>
+        <w:rPr>
+          <w:rFonts w:ascii="Garamond" w:hAnsi="Garamond" w:eastAsia="Times New Roman" w:cs="Times New Roman"/>
+          <w:color w:val="000000"/>
+          <w:kern w:val="0"/>
+          <w:sz w:val="36"/>
+          <w:szCs w:val="36"/>
+          <w:shd w:fill="auto" w:val="clear"/>
+          <w:lang w:val="en-US" w:eastAsia="zh-CN" w:bidi="hi-IN"/>
+        </w:rPr>
+      </w:pPr>
+      <w:r>
+        <w:rPr>
+          <w:rFonts w:eastAsia="Times New Roman" w:cs="Times New Roman" w:ascii="Garamond" w:hAnsi="Garamond"/>
+          <w:color w:val="000000"/>
+          <w:kern w:val="0"/>
+          <w:sz w:val="36"/>
+          <w:szCs w:val="36"/>
+          <w:shd w:fill="auto" w:val="clear"/>
+          <w:lang w:val="en-US" w:eastAsia="zh-CN" w:bidi="hi-IN"/>
+        </w:rPr>
+        <w:t>Nós oramos com mais fé, procuramos melhorar nossa sintonia com os amigos espirituais, ficamos atentos, alertas.</w:t>
+      </w:r>
+    </w:p>
+    <w:p>
+      <w:pPr>
+        <w:pStyle w:val="Normal"/>
+        <w:ind w:left="0" w:hanging="0"/>
+        <w:jc w:val="both"/>
+        <w:rPr>
+          <w:rFonts w:ascii="Garamond" w:hAnsi="Garamond" w:eastAsia="Times New Roman" w:cs="Times New Roman"/>
+          <w:color w:val="000000"/>
+          <w:kern w:val="0"/>
+          <w:sz w:val="36"/>
+          <w:szCs w:val="36"/>
+          <w:shd w:fill="auto" w:val="clear"/>
+          <w:lang w:val="en-US" w:eastAsia="zh-CN" w:bidi="hi-IN"/>
+        </w:rPr>
+      </w:pPr>
+      <w:r>
+        <w:rPr/>
+      </w:r>
+    </w:p>
+    <w:p>
+      <w:pPr>
+        <w:pStyle w:val="Normal"/>
+        <w:ind w:left="0" w:hanging="0"/>
+        <w:jc w:val="both"/>
+        <w:rPr>
+          <w:rFonts w:ascii="Garamond" w:hAnsi="Garamond" w:eastAsia="Times New Roman" w:cs="Times New Roman"/>
+          <w:color w:val="000000"/>
+          <w:kern w:val="0"/>
+          <w:sz w:val="36"/>
+          <w:szCs w:val="36"/>
+          <w:shd w:fill="auto" w:val="clear"/>
+          <w:lang w:val="en-US" w:eastAsia="zh-CN" w:bidi="hi-IN"/>
+        </w:rPr>
+      </w:pPr>
+      <w:r>
+        <w:rPr>
+          <w:rFonts w:eastAsia="Times New Roman" w:cs="Times New Roman" w:ascii="Garamond" w:hAnsi="Garamond"/>
+          <w:color w:val="000000"/>
+          <w:kern w:val="0"/>
+          <w:sz w:val="36"/>
+          <w:szCs w:val="36"/>
+          <w:shd w:fill="auto" w:val="clear"/>
+          <w:lang w:val="en-US" w:eastAsia="zh-CN" w:bidi="hi-IN"/>
+        </w:rPr>
+        <w:t>Quando tudo vai bem e nossas preocupações são menores, nós relaxamos de maneira excessiva. Nos preocupamos menos com as questões espirituais. Já não oramos com tanta frequência, nos esquecemos um pouco dos amigos espirituais, ficamos desatentos.</w:t>
+      </w:r>
+    </w:p>
+    <w:p>
+      <w:pPr>
+        <w:pStyle w:val="Normal"/>
+        <w:ind w:left="0" w:hanging="0"/>
+        <w:jc w:val="both"/>
+        <w:rPr>
+          <w:rFonts w:ascii="Garamond" w:hAnsi="Garamond" w:eastAsia="Times New Roman" w:cs="Times New Roman"/>
+          <w:color w:val="000000"/>
+          <w:kern w:val="0"/>
+          <w:sz w:val="36"/>
+          <w:szCs w:val="36"/>
+          <w:shd w:fill="auto" w:val="clear"/>
+          <w:lang w:val="en-US" w:eastAsia="zh-CN" w:bidi="hi-IN"/>
+        </w:rPr>
+      </w:pPr>
+      <w:r>
+        <w:rPr/>
+      </w:r>
+    </w:p>
+    <w:p>
+      <w:pPr>
+        <w:pStyle w:val="Normal"/>
+        <w:ind w:left="0" w:hanging="0"/>
+        <w:jc w:val="both"/>
+        <w:rPr>
+          <w:rFonts w:ascii="Garamond" w:hAnsi="Garamond" w:eastAsia="Times New Roman" w:cs="Times New Roman"/>
+          <w:color w:val="000000"/>
+          <w:kern w:val="0"/>
+          <w:sz w:val="36"/>
+          <w:szCs w:val="36"/>
+          <w:shd w:fill="auto" w:val="clear"/>
+          <w:lang w:val="en-US" w:eastAsia="zh-CN" w:bidi="hi-IN"/>
+        </w:rPr>
+      </w:pPr>
+      <w:r>
+        <w:rPr>
+          <w:rFonts w:eastAsia="Times New Roman" w:cs="Times New Roman" w:ascii="Garamond" w:hAnsi="Garamond"/>
+          <w:color w:val="000000"/>
+          <w:kern w:val="0"/>
+          <w:sz w:val="36"/>
+          <w:szCs w:val="36"/>
+          <w:shd w:fill="auto" w:val="clear"/>
+          <w:lang w:val="en-US" w:eastAsia="zh-CN" w:bidi="hi-IN"/>
+        </w:rPr>
+        <w:t xml:space="preserve">O mar da vida se torna revolto e nossa embarcação fica à deriva. Nesse momento, o joio é semeado em nossa vida. </w:t>
+      </w:r>
+    </w:p>
+    <w:p>
+      <w:pPr>
+        <w:pStyle w:val="Normal"/>
+        <w:ind w:left="0" w:hanging="0"/>
+        <w:jc w:val="both"/>
+        <w:rPr>
+          <w:rFonts w:ascii="Garamond" w:hAnsi="Garamond" w:eastAsia="Times New Roman" w:cs="Times New Roman"/>
+          <w:color w:val="000000"/>
+          <w:kern w:val="0"/>
+          <w:sz w:val="36"/>
+          <w:szCs w:val="36"/>
+          <w:shd w:fill="auto" w:val="clear"/>
+          <w:lang w:val="en-US" w:eastAsia="zh-CN" w:bidi="hi-IN"/>
+        </w:rPr>
+      </w:pPr>
+      <w:r>
+        <w:rPr/>
+      </w:r>
+    </w:p>
+    <w:p>
+      <w:pPr>
+        <w:pStyle w:val="Normal"/>
+        <w:ind w:left="0" w:hanging="0"/>
+        <w:jc w:val="both"/>
+        <w:rPr>
+          <w:rFonts w:ascii="Garamond" w:hAnsi="Garamond" w:eastAsia="Times New Roman" w:cs="Times New Roman"/>
+          <w:color w:val="000000"/>
+          <w:kern w:val="0"/>
+          <w:sz w:val="36"/>
+          <w:szCs w:val="36"/>
+          <w:shd w:fill="auto" w:val="clear"/>
+          <w:lang w:val="en-US" w:eastAsia="zh-CN" w:bidi="hi-IN"/>
+        </w:rPr>
+      </w:pPr>
+      <w:r>
+        <w:rPr>
+          <w:rFonts w:eastAsia="Times New Roman" w:cs="Times New Roman" w:ascii="Garamond" w:hAnsi="Garamond"/>
+          <w:color w:val="000000"/>
+          <w:kern w:val="0"/>
+          <w:sz w:val="36"/>
+          <w:szCs w:val="36"/>
+          <w:shd w:fill="auto" w:val="clear"/>
+          <w:lang w:val="en-US" w:eastAsia="zh-CN" w:bidi="hi-IN"/>
+        </w:rPr>
+        <w:t xml:space="preserve">No sentido coletivo, a expressão </w:t>
+      </w:r>
+      <w:r>
+        <w:rPr>
+          <w:rFonts w:eastAsia="Times New Roman" w:cs="Times New Roman" w:ascii="Garamond" w:hAnsi="Garamond"/>
+          <w:i/>
+          <w:iCs/>
+          <w:color w:val="000000"/>
+          <w:kern w:val="0"/>
+          <w:sz w:val="36"/>
+          <w:szCs w:val="36"/>
+          <w:shd w:fill="auto" w:val="clear"/>
+          <w:lang w:val="en-US" w:eastAsia="zh-CN" w:bidi="hi-IN"/>
+        </w:rPr>
+        <w:t>dormindo os homens</w:t>
+      </w:r>
+      <w:r>
+        <w:rPr>
+          <w:rFonts w:eastAsia="Times New Roman" w:cs="Times New Roman" w:ascii="Garamond" w:hAnsi="Garamond"/>
+          <w:color w:val="000000"/>
+          <w:kern w:val="0"/>
+          <w:sz w:val="36"/>
+          <w:szCs w:val="36"/>
+          <w:shd w:fill="auto" w:val="clear"/>
+          <w:lang w:val="en-US" w:eastAsia="zh-CN" w:bidi="hi-IN"/>
+        </w:rPr>
+        <w:t xml:space="preserve"> é ainda mais fácil de ser compreendida. </w:t>
+      </w:r>
+      <w:r>
+        <w:rPr>
+          <w:rFonts w:eastAsia="Times New Roman" w:cs="Times New Roman" w:ascii="Garamond" w:hAnsi="Garamond"/>
+          <w:color w:val="000000"/>
+          <w:kern w:val="0"/>
+          <w:sz w:val="36"/>
+          <w:szCs w:val="36"/>
+          <w:shd w:fill="auto" w:val="clear"/>
+          <w:lang w:val="en-US" w:eastAsia="zh-CN" w:bidi="hi-IN"/>
+        </w:rPr>
+        <w:t>Basta u</w:t>
+      </w:r>
+      <w:r>
+        <w:rPr>
+          <w:rFonts w:eastAsia="Times New Roman" w:cs="Times New Roman" w:ascii="Garamond" w:hAnsi="Garamond"/>
+          <w:color w:val="000000"/>
+          <w:kern w:val="0"/>
+          <w:sz w:val="36"/>
+          <w:szCs w:val="36"/>
+          <w:shd w:fill="auto" w:val="clear"/>
+          <w:lang w:val="en-US" w:eastAsia="zh-CN" w:bidi="hi-IN"/>
+        </w:rPr>
+        <w:t xml:space="preserve">m único olhar mais apurado sobre a humanidade </w:t>
+      </w:r>
+      <w:r>
+        <w:rPr>
+          <w:rFonts w:eastAsia="Times New Roman" w:cs="Times New Roman" w:ascii="Garamond" w:hAnsi="Garamond"/>
+          <w:color w:val="000000"/>
+          <w:kern w:val="0"/>
+          <w:sz w:val="36"/>
+          <w:szCs w:val="36"/>
+          <w:shd w:fill="auto" w:val="clear"/>
+          <w:lang w:val="en-US" w:eastAsia="zh-CN" w:bidi="hi-IN"/>
+        </w:rPr>
+        <w:t xml:space="preserve"> para </w:t>
+      </w:r>
+      <w:r>
+        <w:rPr>
+          <w:rFonts w:eastAsia="Times New Roman" w:cs="Times New Roman" w:ascii="Garamond" w:hAnsi="Garamond"/>
+          <w:color w:val="000000"/>
+          <w:kern w:val="0"/>
+          <w:sz w:val="36"/>
+          <w:szCs w:val="36"/>
+          <w:shd w:fill="auto" w:val="clear"/>
+          <w:lang w:val="en-US" w:eastAsia="zh-CN" w:bidi="hi-IN"/>
+        </w:rPr>
+        <w:t>percebe</w:t>
+      </w:r>
+      <w:r>
+        <w:rPr>
+          <w:rFonts w:eastAsia="Times New Roman" w:cs="Times New Roman" w:ascii="Garamond" w:hAnsi="Garamond"/>
+          <w:color w:val="000000"/>
+          <w:kern w:val="0"/>
+          <w:sz w:val="36"/>
+          <w:szCs w:val="36"/>
+          <w:shd w:fill="auto" w:val="clear"/>
+          <w:lang w:val="en-US" w:eastAsia="zh-CN" w:bidi="hi-IN"/>
+        </w:rPr>
+        <w:t>r</w:t>
+      </w:r>
+      <w:r>
+        <w:rPr>
+          <w:rFonts w:eastAsia="Times New Roman" w:cs="Times New Roman" w:ascii="Garamond" w:hAnsi="Garamond"/>
+          <w:color w:val="000000"/>
+          <w:kern w:val="0"/>
+          <w:sz w:val="36"/>
+          <w:szCs w:val="36"/>
+          <w:shd w:fill="auto" w:val="clear"/>
+          <w:lang w:val="en-US" w:eastAsia="zh-CN" w:bidi="hi-IN"/>
+        </w:rPr>
+        <w:t>mos claramente que bilhões de pessoas</w:t>
+      </w:r>
+      <w:r>
+        <w:rPr>
+          <w:rFonts w:eastAsia="Times New Roman" w:cs="Times New Roman" w:ascii="Garamond" w:hAnsi="Garamond"/>
+          <w:color w:val="000000"/>
+          <w:kern w:val="0"/>
+          <w:sz w:val="36"/>
+          <w:szCs w:val="36"/>
+          <w:shd w:fill="auto" w:val="clear"/>
+          <w:lang w:val="en-US" w:eastAsia="zh-CN" w:bidi="hi-IN"/>
+        </w:rPr>
+        <w:t xml:space="preserve"> em todo o mundo</w:t>
+      </w:r>
+      <w:r>
+        <w:rPr>
+          <w:rFonts w:eastAsia="Times New Roman" w:cs="Times New Roman" w:ascii="Garamond" w:hAnsi="Garamond"/>
+          <w:color w:val="000000"/>
+          <w:kern w:val="0"/>
+          <w:sz w:val="36"/>
+          <w:szCs w:val="36"/>
+          <w:shd w:fill="auto" w:val="clear"/>
+          <w:lang w:val="en-US" w:eastAsia="zh-CN" w:bidi="hi-IN"/>
+        </w:rPr>
+        <w:t xml:space="preserve">, </w:t>
+      </w:r>
+      <w:r>
+        <w:rPr>
+          <w:rFonts w:eastAsia="Times New Roman" w:cs="Times New Roman" w:ascii="Garamond" w:hAnsi="Garamond"/>
+          <w:color w:val="000000"/>
+          <w:kern w:val="0"/>
+          <w:sz w:val="36"/>
+          <w:szCs w:val="36"/>
+          <w:shd w:fill="auto" w:val="clear"/>
+          <w:lang w:val="en-US" w:eastAsia="zh-CN" w:bidi="hi-IN"/>
+        </w:rPr>
+        <w:t xml:space="preserve">sequer despertaram para a realidade da vida espiritual. </w:t>
+      </w:r>
+    </w:p>
+    <w:p>
+      <w:pPr>
+        <w:pStyle w:val="Normal"/>
+        <w:ind w:left="0" w:hanging="0"/>
+        <w:jc w:val="both"/>
+        <w:rPr>
+          <w:rFonts w:ascii="Garamond" w:hAnsi="Garamond" w:eastAsia="Times New Roman" w:cs="Times New Roman"/>
+          <w:color w:val="000000"/>
+          <w:kern w:val="0"/>
+          <w:sz w:val="36"/>
+          <w:szCs w:val="36"/>
+          <w:shd w:fill="auto" w:val="clear"/>
+          <w:lang w:val="en-US" w:eastAsia="zh-CN" w:bidi="hi-IN"/>
+        </w:rPr>
+      </w:pPr>
+      <w:r>
+        <w:rPr/>
+      </w:r>
+    </w:p>
+    <w:p>
+      <w:pPr>
+        <w:pStyle w:val="Normal"/>
+        <w:jc w:val="both"/>
+        <w:rPr>
+          <w:sz w:val="36"/>
+          <w:szCs w:val="36"/>
+        </w:rPr>
+      </w:pPr>
+      <w:r>
+        <w:rPr>
+          <w:rFonts w:eastAsia="Times New Roman" w:cs="Times New Roman" w:ascii="Garamond" w:hAnsi="Garamond"/>
+          <w:color w:val="000000"/>
+          <w:kern w:val="0"/>
+          <w:sz w:val="36"/>
+          <w:szCs w:val="36"/>
+          <w:shd w:fill="auto" w:val="clear"/>
+          <w:lang w:val="en-US" w:eastAsia="zh-CN" w:bidi="hi-IN"/>
+        </w:rPr>
+        <w:t xml:space="preserve">Emmanuel, na obra </w:t>
+      </w:r>
+      <w:r>
+        <w:rPr>
+          <w:rFonts w:eastAsia="Times New Roman" w:cs="Times New Roman" w:ascii="Garamond" w:hAnsi="Garamond"/>
+          <w:i/>
+          <w:iCs/>
+          <w:color w:val="000000"/>
+          <w:kern w:val="0"/>
+          <w:sz w:val="36"/>
+          <w:szCs w:val="36"/>
+          <w:shd w:fill="auto" w:val="clear"/>
+          <w:lang w:val="en-US" w:eastAsia="zh-CN" w:bidi="hi-IN"/>
+        </w:rPr>
+        <w:t>A Caminho da Luz</w:t>
+      </w:r>
+      <w:r>
+        <w:rPr>
+          <w:rFonts w:eastAsia="Times New Roman" w:cs="Times New Roman" w:ascii="Garamond" w:hAnsi="Garamond"/>
+          <w:color w:val="000000"/>
+          <w:kern w:val="0"/>
+          <w:sz w:val="36"/>
+          <w:szCs w:val="36"/>
+          <w:shd w:fill="auto" w:val="clear"/>
+          <w:lang w:val="en-US" w:eastAsia="zh-CN" w:bidi="hi-IN"/>
+        </w:rPr>
+        <w:t xml:space="preserve">, no capítulo IX — </w:t>
+      </w:r>
+      <w:r>
+        <w:rPr>
+          <w:rFonts w:eastAsia="Times New Roman" w:cs="Times New Roman" w:ascii="Garamond" w:hAnsi="Garamond"/>
+          <w:i/>
+          <w:iCs/>
+          <w:color w:val="000000"/>
+          <w:kern w:val="0"/>
+          <w:sz w:val="36"/>
+          <w:szCs w:val="36"/>
+          <w:shd w:fill="auto" w:val="clear"/>
+          <w:lang w:val="en-US" w:eastAsia="zh-CN" w:bidi="hi-IN"/>
+        </w:rPr>
+        <w:t>As grandes religiões do passado</w:t>
+      </w:r>
+      <w:r>
+        <w:rPr>
+          <w:rFonts w:eastAsia="Times New Roman" w:cs="Times New Roman" w:ascii="Garamond" w:hAnsi="Garamond"/>
+          <w:color w:val="000000"/>
+          <w:kern w:val="0"/>
+          <w:sz w:val="36"/>
+          <w:szCs w:val="36"/>
+          <w:shd w:fill="auto" w:val="clear"/>
+          <w:lang w:val="en-US" w:eastAsia="zh-CN" w:bidi="hi-IN"/>
+        </w:rPr>
+        <w:t xml:space="preserve">, item </w:t>
+      </w:r>
+      <w:r>
+        <w:rPr>
+          <w:rFonts w:eastAsia="Times New Roman" w:cs="Times New Roman" w:ascii="Garamond" w:hAnsi="Garamond"/>
+          <w:i/>
+          <w:iCs/>
+          <w:color w:val="000000"/>
+          <w:kern w:val="0"/>
+          <w:sz w:val="36"/>
+          <w:szCs w:val="36"/>
+          <w:shd w:fill="auto" w:val="clear"/>
+          <w:lang w:val="en-US" w:eastAsia="zh-CN" w:bidi="hi-IN"/>
+        </w:rPr>
+        <w:t>A gênese das crenças religiosas</w:t>
+      </w:r>
+      <w:r>
+        <w:rPr>
+          <w:rFonts w:eastAsia="Times New Roman" w:cs="Times New Roman" w:ascii="Garamond" w:hAnsi="Garamond"/>
+          <w:color w:val="000000"/>
+          <w:kern w:val="0"/>
+          <w:sz w:val="36"/>
+          <w:szCs w:val="36"/>
+          <w:shd w:fill="auto" w:val="clear"/>
+          <w:lang w:val="en-US" w:eastAsia="zh-CN" w:bidi="hi-IN"/>
+        </w:rPr>
+        <w:t xml:space="preserve"> —, nos diz que todas as religiões do mundo têm sua origem no amor incondicional do Cristo.</w:t>
+      </w:r>
+    </w:p>
+    <w:p>
+      <w:pPr>
+        <w:pStyle w:val="Normal"/>
+        <w:jc w:val="both"/>
+        <w:rPr>
+          <w:sz w:val="36"/>
+          <w:szCs w:val="36"/>
+        </w:rPr>
+      </w:pPr>
+      <w:r>
+        <w:rPr/>
+      </w:r>
+    </w:p>
+    <w:p>
+      <w:pPr>
+        <w:pStyle w:val="Normal"/>
+        <w:jc w:val="both"/>
+        <w:rPr>
+          <w:sz w:val="36"/>
+          <w:szCs w:val="36"/>
+        </w:rPr>
+      </w:pPr>
+      <w:r>
+        <w:rPr>
+          <w:rFonts w:eastAsia="Times New Roman" w:cs="Times New Roman" w:ascii="Garamond" w:hAnsi="Garamond"/>
+          <w:color w:val="000000"/>
+          <w:kern w:val="0"/>
+          <w:sz w:val="36"/>
+          <w:szCs w:val="36"/>
+          <w:shd w:fill="auto" w:val="clear"/>
+          <w:lang w:val="en-US" w:eastAsia="zh-CN" w:bidi="hi-IN"/>
+        </w:rPr>
+        <w:t>Ele nos diz também que os grandes líderes religiosos e filosóficos da humanidade — como Buda, Lao-Tsé, Confúcio, Moisés e Maomé — exerceram suas missões junto aos seus povos sob o seu comando.</w:t>
+      </w:r>
+    </w:p>
+    <w:p>
+      <w:pPr>
+        <w:pStyle w:val="Normal"/>
+        <w:jc w:val="both"/>
+        <w:rPr>
+          <w:sz w:val="36"/>
+          <w:szCs w:val="36"/>
+        </w:rPr>
+      </w:pPr>
+      <w:r>
+        <w:rPr/>
+      </w:r>
+    </w:p>
+    <w:p>
+      <w:pPr>
+        <w:pStyle w:val="Normal"/>
+        <w:jc w:val="both"/>
+        <w:rPr>
+          <w:sz w:val="36"/>
+          <w:szCs w:val="36"/>
+        </w:rPr>
+      </w:pPr>
+      <w:r>
+        <w:rPr>
+          <w:rFonts w:eastAsia="Times New Roman" w:cs="Times New Roman" w:ascii="Garamond" w:hAnsi="Garamond"/>
+          <w:color w:val="000000"/>
+          <w:kern w:val="0"/>
+          <w:sz w:val="36"/>
+          <w:szCs w:val="36"/>
+          <w:shd w:fill="auto" w:val="clear"/>
+          <w:lang w:val="en-US" w:eastAsia="zh-CN" w:bidi="hi-IN"/>
+        </w:rPr>
+        <w:t>Portanto, não há povo ou civilização que não tenha recebido, direta ou indiretamente, esses ensinamentos.</w:t>
+      </w:r>
+    </w:p>
+    <w:p>
+      <w:pPr>
+        <w:pStyle w:val="Normal"/>
+        <w:ind w:left="0" w:hanging="0"/>
+        <w:jc w:val="both"/>
+        <w:rPr>
+          <w:rFonts w:ascii="Garamond" w:hAnsi="Garamond" w:eastAsia="Times New Roman" w:cs="Times New Roman"/>
+          <w:color w:val="000000"/>
+          <w:kern w:val="0"/>
+          <w:sz w:val="36"/>
+          <w:szCs w:val="36"/>
+          <w:shd w:fill="auto" w:val="clear"/>
+          <w:lang w:val="en-US" w:eastAsia="zh-CN" w:bidi="hi-IN"/>
+        </w:rPr>
+      </w:pPr>
+      <w:r>
+        <w:rPr/>
+      </w:r>
+    </w:p>
+    <w:p>
+      <w:pPr>
+        <w:pStyle w:val="Normal"/>
+        <w:ind w:left="0" w:hanging="0"/>
+        <w:jc w:val="both"/>
+        <w:rPr/>
+      </w:pPr>
+      <w:r>
+        <w:rPr>
+          <w:rFonts w:eastAsia="Times New Roman" w:cs="Times New Roman" w:ascii="Garamond" w:hAnsi="Garamond"/>
+          <w:color w:val="000000"/>
+          <w:kern w:val="0"/>
+          <w:sz w:val="36"/>
+          <w:szCs w:val="36"/>
+          <w:shd w:fill="auto" w:val="clear"/>
+          <w:lang w:val="en-US" w:eastAsia="zh-CN" w:bidi="hi-IN"/>
+        </w:rPr>
+        <w:t>Apesar disso, uma enorme parcela da humanidade ainda vive voltada exclusivamente para as questões materiais e terrenas. Nem mesmo a dor e o sofrimento têm sido suficientes para o despertar dessas pessoas.</w:t>
+      </w:r>
+    </w:p>
+    <w:p>
+      <w:pPr>
+        <w:pStyle w:val="Normal"/>
+        <w:ind w:left="0" w:hanging="0"/>
+        <w:jc w:val="both"/>
+        <w:rPr>
+          <w:rFonts w:ascii="Garamond" w:hAnsi="Garamond" w:eastAsia="Times New Roman" w:cs="Times New Roman"/>
+          <w:color w:val="000000"/>
+          <w:kern w:val="0"/>
+          <w:sz w:val="36"/>
+          <w:szCs w:val="36"/>
+          <w:shd w:fill="auto" w:val="clear"/>
+          <w:lang w:val="en-US" w:eastAsia="zh-CN" w:bidi="hi-IN"/>
+        </w:rPr>
+      </w:pPr>
+      <w:r>
+        <w:rPr/>
+      </w:r>
+    </w:p>
+    <w:p>
+      <w:pPr>
+        <w:pStyle w:val="Normal"/>
+        <w:ind w:left="0" w:hanging="0"/>
+        <w:jc w:val="both"/>
+        <w:rPr/>
+      </w:pPr>
+      <w:r>
+        <w:rPr>
+          <w:rFonts w:eastAsia="Times New Roman" w:cs="Times New Roman" w:ascii="Garamond" w:hAnsi="Garamond"/>
+          <w:color w:val="000000"/>
+          <w:kern w:val="0"/>
+          <w:sz w:val="36"/>
+          <w:szCs w:val="36"/>
+          <w:shd w:fill="auto" w:val="clear"/>
+          <w:lang w:val="en-US" w:eastAsia="zh-CN" w:bidi="hi-IN"/>
+        </w:rPr>
+        <w:t>Temos um exemplo muito claro disso na pandemia. Foi um período de muita tristeza e medo para a população mundial. Ali, deveríamos ter aprendido a valorizar a liberdade, o contato com amigos, familiares</w:t>
+      </w:r>
+      <w:r>
+        <w:rPr>
+          <w:rFonts w:eastAsia="Times New Roman" w:cs="Times New Roman" w:ascii="Garamond" w:hAnsi="Garamond"/>
+          <w:color w:val="000000"/>
+          <w:kern w:val="0"/>
+          <w:sz w:val="36"/>
+          <w:szCs w:val="36"/>
+          <w:shd w:fill="auto" w:val="clear"/>
+          <w:lang w:val="en-US" w:eastAsia="zh-CN" w:bidi="hi-IN"/>
+        </w:rPr>
+        <w:t>, vizinhos</w:t>
+      </w:r>
+      <w:r>
+        <w:rPr>
+          <w:rFonts w:eastAsia="Times New Roman" w:cs="Times New Roman" w:ascii="Garamond" w:hAnsi="Garamond"/>
+          <w:color w:val="000000"/>
+          <w:kern w:val="0"/>
+          <w:sz w:val="36"/>
+          <w:szCs w:val="36"/>
+          <w:shd w:fill="auto" w:val="clear"/>
+          <w:lang w:val="en-US" w:eastAsia="zh-CN" w:bidi="hi-IN"/>
+        </w:rPr>
+        <w:t xml:space="preserve"> e colegas de trabalho; deveríamos ter aprendido a ser mais solidários, empáticos e caridosos.</w:t>
+      </w:r>
+    </w:p>
+    <w:p>
+      <w:pPr>
+        <w:pStyle w:val="Normal"/>
+        <w:ind w:left="0" w:hanging="0"/>
+        <w:jc w:val="both"/>
+        <w:rPr>
+          <w:rFonts w:ascii="Garamond" w:hAnsi="Garamond" w:eastAsia="Times New Roman" w:cs="Times New Roman"/>
+          <w:color w:val="000000"/>
+          <w:kern w:val="0"/>
+          <w:sz w:val="36"/>
+          <w:szCs w:val="36"/>
+          <w:shd w:fill="auto" w:val="clear"/>
+          <w:lang w:val="en-US" w:eastAsia="zh-CN" w:bidi="hi-IN"/>
+        </w:rPr>
+      </w:pPr>
+      <w:r>
+        <w:rPr/>
+      </w:r>
+    </w:p>
+    <w:p>
+      <w:pPr>
+        <w:pStyle w:val="Normal"/>
+        <w:ind w:left="0" w:hanging="0"/>
+        <w:jc w:val="both"/>
+        <w:rPr/>
+      </w:pPr>
+      <w:r>
+        <w:rPr>
+          <w:rFonts w:eastAsia="Times New Roman" w:cs="Times New Roman" w:ascii="Garamond" w:hAnsi="Garamond"/>
+          <w:color w:val="000000"/>
+          <w:kern w:val="0"/>
+          <w:sz w:val="36"/>
+          <w:szCs w:val="36"/>
+          <w:shd w:fill="auto" w:val="clear"/>
+          <w:lang w:val="en-US" w:eastAsia="zh-CN" w:bidi="hi-IN"/>
+        </w:rPr>
+        <w:t>Mas, tão logo a pandemia terminou, o que aconteceu? As pessoas voltaram ao seu antigo modo de vida, ignorando as dores e dificuldades alheias e buscando freneticamente a satisfação dos prazeres materiais, como quem deseja recuperar o tempo perdido.</w:t>
+      </w:r>
+    </w:p>
+    <w:p>
+      <w:pPr>
+        <w:pStyle w:val="Normal"/>
+        <w:jc w:val="both"/>
+        <w:rPr>
+          <w:rFonts w:ascii="Garamond" w:hAnsi="Garamond" w:eastAsia="Times New Roman" w:cs="Times New Roman"/>
+          <w:color w:val="000000"/>
+          <w:kern w:val="0"/>
+          <w:sz w:val="36"/>
+          <w:szCs w:val="36"/>
+          <w:shd w:fill="auto" w:val="clear"/>
+          <w:lang w:val="en-US" w:eastAsia="zh-CN" w:bidi="hi-IN"/>
+        </w:rPr>
+      </w:pPr>
+      <w:r>
+        <w:rPr>
+          <w:rFonts w:eastAsia="Times New Roman" w:cs="Times New Roman" w:ascii="Garamond" w:hAnsi="Garamond"/>
+          <w:color w:val="000000"/>
+          <w:kern w:val="0"/>
+          <w:sz w:val="36"/>
+          <w:szCs w:val="36"/>
+          <w:shd w:fill="auto" w:val="clear"/>
+          <w:lang w:val="en-US" w:eastAsia="zh-CN" w:bidi="hi-IN"/>
+        </w:rPr>
+      </w:r>
+    </w:p>
+    <w:p>
+      <w:pPr>
+        <w:pStyle w:val="Normal"/>
+        <w:jc w:val="both"/>
+        <w:rPr>
+          <w:rFonts w:ascii="Garamond" w:hAnsi="Garamond" w:eastAsia="Times New Roman" w:cs="Times New Roman"/>
+          <w:color w:val="000000"/>
+          <w:kern w:val="0"/>
+          <w:sz w:val="36"/>
+          <w:szCs w:val="36"/>
+          <w:shd w:fill="auto" w:val="clear"/>
+          <w:lang w:val="en-US" w:eastAsia="zh-CN" w:bidi="hi-IN"/>
+        </w:rPr>
+      </w:pPr>
+      <w:r>
+        <w:rPr>
+          <w:rFonts w:eastAsia="Times New Roman" w:cs="Times New Roman" w:ascii="Garamond" w:hAnsi="Garamond"/>
+          <w:color w:val="000000"/>
+          <w:kern w:val="0"/>
+          <w:sz w:val="36"/>
+          <w:szCs w:val="36"/>
+          <w:shd w:fill="auto" w:val="clear"/>
+          <w:lang w:val="en-US" w:eastAsia="zh-CN" w:bidi="hi-IN"/>
+        </w:rPr>
+        <w:t>A maioria das pessoas saiu da pandemia sem aprender nada, sem despertar para a vida espiritual.</w:t>
       </w:r>
     </w:p>
     <w:p>
@@ -4465,180 +4688,101 @@
         </w:rPr>
       </w:pPr>
       <w:r>
-        <w:rPr>
-          <w:color w:val="FC5C00"/>
-        </w:rPr>
-      </w:r>
-    </w:p>
-    <w:p>
-      <w:pPr>
-        <w:pStyle w:val="Normal"/>
-        <w:jc w:val="both"/>
-        <w:rPr>
-          <w:color w:val="FC5C00"/>
-        </w:rPr>
-      </w:pPr>
-      <w:r>
-        <w:rPr>
-          <w:color w:val="FC5C00"/>
-        </w:rPr>
-      </w:r>
-    </w:p>
-    <w:p>
-      <w:pPr>
-        <w:pStyle w:val="Normal"/>
-        <w:jc w:val="both"/>
-        <w:rPr>
-          <w:color w:val="FC5C00"/>
-        </w:rPr>
-      </w:pPr>
-      <w:r>
-        <w:rPr>
-          <w:rFonts w:eastAsia="Times New Roman" w:cs="Times New Roman" w:ascii="Garamond" w:hAnsi="Garamond"/>
-          <w:color w:val="FC5C00"/>
-          <w:kern w:val="0"/>
-          <w:sz w:val="36"/>
-          <w:szCs w:val="36"/>
-          <w:shd w:fill="auto" w:val="clear"/>
-          <w:lang w:val="en-US" w:eastAsia="zh-CN" w:bidi="hi-IN"/>
-        </w:rPr>
-        <w:t>[ Usar essa passagem evangélica em algum ponto ]</w:t>
-      </w:r>
-    </w:p>
-    <w:p>
-      <w:pPr>
-        <w:pStyle w:val="Normal"/>
-        <w:jc w:val="both"/>
-        <w:rPr>
-          <w:color w:val="auto"/>
-        </w:rPr>
-      </w:pPr>
-      <w:r>
-        <w:rPr>
-          <w:rFonts w:eastAsia="Times New Roman" w:cs="Times New Roman" w:ascii="Garamond" w:hAnsi="Garamond"/>
-          <w:color w:val="000000"/>
-          <w:kern w:val="0"/>
-          <w:sz w:val="36"/>
-          <w:szCs w:val="36"/>
-          <w:shd w:fill="auto" w:val="clear"/>
-          <w:lang w:val="en-US" w:eastAsia="zh-CN" w:bidi="hi-IN"/>
-        </w:rPr>
-        <w:t>"Por mim mesmo juro - disse o Senhor Deus - que não quero a morte do ímpio, senão que ele se converta, que deixe o mau caminho e que viva".</w:t>
-      </w:r>
-    </w:p>
-    <w:p>
-      <w:pPr>
-        <w:pStyle w:val="Normal"/>
-        <w:jc w:val="both"/>
-        <w:rPr>
-          <w:color w:val="auto"/>
-        </w:rPr>
-      </w:pPr>
-      <w:r>
-        <w:rPr>
-          <w:rFonts w:eastAsia="Times New Roman" w:cs="Times New Roman" w:ascii="Garamond" w:hAnsi="Garamond"/>
-          <w:color w:val="000000"/>
-          <w:kern w:val="0"/>
-          <w:sz w:val="36"/>
-          <w:szCs w:val="36"/>
-          <w:shd w:fill="auto" w:val="clear"/>
-          <w:lang w:val="en-US" w:eastAsia="zh-CN" w:bidi="hi-IN"/>
-        </w:rPr>
-        <w:t>(EZEQUIEL, 33:11.)</w:t>
-      </w:r>
-    </w:p>
-    <w:p>
-      <w:pPr>
-        <w:pStyle w:val="Normal"/>
-        <w:jc w:val="both"/>
-        <w:rPr>
-          <w:color w:val="FC5C00"/>
-        </w:rPr>
-      </w:pPr>
-      <w:r>
-        <w:rPr>
-          <w:rFonts w:eastAsia="Times New Roman" w:cs="Times New Roman" w:ascii="Garamond" w:hAnsi="Garamond"/>
-          <w:color w:val="FC5C00"/>
-          <w:kern w:val="0"/>
-          <w:sz w:val="36"/>
-          <w:szCs w:val="36"/>
-          <w:shd w:fill="auto" w:val="clear"/>
-          <w:lang w:val="en-US" w:eastAsia="zh-CN" w:bidi="hi-IN"/>
-        </w:rPr>
-        <w:t>[ Usar essa passagem evangélica em algum ponto ]</w:t>
-      </w:r>
-    </w:p>
-    <w:p>
-      <w:pPr>
-        <w:pStyle w:val="Normal"/>
-        <w:jc w:val="both"/>
-        <w:rPr>
-          <w:rFonts w:ascii="Garamond" w:hAnsi="Garamond" w:eastAsia="Times New Roman" w:cs="Times New Roman"/>
-          <w:color w:val="000000"/>
-          <w:kern w:val="0"/>
-          <w:sz w:val="36"/>
-          <w:szCs w:val="36"/>
-          <w:shd w:fill="auto" w:val="clear"/>
-          <w:lang w:val="en-US" w:eastAsia="zh-CN" w:bidi="hi-IN"/>
-        </w:rPr>
-      </w:pPr>
-      <w:r>
-        <w:rPr>
-          <w:rFonts w:eastAsia="Times New Roman" w:cs="Times New Roman" w:ascii="Garamond" w:hAnsi="Garamond"/>
-          <w:color w:val="000000"/>
-          <w:kern w:val="0"/>
-          <w:sz w:val="36"/>
-          <w:szCs w:val="36"/>
-          <w:shd w:fill="auto" w:val="clear"/>
-          <w:lang w:val="en-US" w:eastAsia="zh-CN" w:bidi="hi-IN"/>
-        </w:rPr>
-      </w:r>
-    </w:p>
-    <w:p>
-      <w:pPr>
-        <w:pStyle w:val="Normal"/>
-        <w:jc w:val="both"/>
-        <w:rPr>
-          <w:color w:val="FC5C00"/>
-        </w:rPr>
-      </w:pPr>
-      <w:r>
-        <w:rPr>
-          <w:rFonts w:eastAsia="Times New Roman" w:cs="Times New Roman" w:ascii="Garamond" w:hAnsi="Garamond"/>
-          <w:color w:val="FC5C00"/>
-          <w:kern w:val="0"/>
-          <w:sz w:val="36"/>
-          <w:szCs w:val="36"/>
-          <w:shd w:fill="auto" w:val="clear"/>
-          <w:lang w:val="en-US" w:eastAsia="zh-CN" w:bidi="hi-IN"/>
-        </w:rPr>
-        <w:t>[ Procurar no ESE onde se fala que, enquanto o homem insistir em praticar o mal, Deus continuará usando o homem como instrumento de evolução do próprio homem ]</w:t>
-      </w:r>
-    </w:p>
-    <w:p>
-      <w:pPr>
-        <w:pStyle w:val="Normal"/>
-        <w:jc w:val="both"/>
-        <w:rPr>
-          <w:rFonts w:ascii="Garamond" w:hAnsi="Garamond" w:eastAsia="Times New Roman" w:cs="Times New Roman"/>
-          <w:color w:val="000000"/>
-          <w:kern w:val="0"/>
-          <w:sz w:val="36"/>
-          <w:szCs w:val="36"/>
-          <w:shd w:fill="auto" w:val="clear"/>
-          <w:lang w:val="en-US" w:eastAsia="zh-CN" w:bidi="hi-IN"/>
-        </w:rPr>
-      </w:pPr>
-      <w:r>
-        <w:rPr>
-          <w:rFonts w:eastAsia="Times New Roman" w:cs="Times New Roman" w:ascii="Garamond" w:hAnsi="Garamond"/>
-          <w:color w:val="000000"/>
-          <w:kern w:val="0"/>
-          <w:sz w:val="36"/>
-          <w:szCs w:val="36"/>
-          <w:shd w:fill="auto" w:val="clear"/>
-          <w:lang w:val="en-US" w:eastAsia="zh-CN" w:bidi="hi-IN"/>
-        </w:rPr>
+        <w:rPr/>
+      </w:r>
+    </w:p>
+    <w:p>
+      <w:pPr>
+        <w:pStyle w:val="Normal"/>
+        <w:jc w:val="both"/>
+        <w:rPr>
+          <w:rFonts w:ascii="Garamond" w:hAnsi="Garamond" w:eastAsia="Times New Roman" w:cs="Times New Roman"/>
+          <w:color w:val="000000"/>
+          <w:kern w:val="0"/>
+          <w:sz w:val="36"/>
+          <w:szCs w:val="36"/>
+          <w:shd w:fill="auto" w:val="clear"/>
+          <w:lang w:val="en-US" w:eastAsia="zh-CN" w:bidi="hi-IN"/>
+        </w:rPr>
+      </w:pPr>
+      <w:r>
+        <w:rPr>
+          <w:rFonts w:eastAsia="Times New Roman" w:cs="Times New Roman" w:ascii="Garamond" w:hAnsi="Garamond"/>
+          <w:color w:val="000000"/>
+          <w:kern w:val="0"/>
+          <w:sz w:val="36"/>
+          <w:szCs w:val="36"/>
+          <w:shd w:fill="auto" w:val="clear"/>
+          <w:lang w:val="en-US" w:eastAsia="zh-CN" w:bidi="hi-IN"/>
+        </w:rPr>
+        <w:t>O sono da invigilância é terreno fértil para o surgimento do joio. Por isso Jesus nos recomendou o orai e vigiai.</w:t>
+      </w:r>
+    </w:p>
+    <w:p>
+      <w:pPr>
+        <w:pStyle w:val="Normal"/>
+        <w:jc w:val="both"/>
+        <w:rPr>
+          <w:rFonts w:ascii="Garamond" w:hAnsi="Garamond" w:eastAsia="Times New Roman" w:cs="Times New Roman"/>
+          <w:color w:val="000000"/>
+          <w:kern w:val="0"/>
+          <w:sz w:val="36"/>
+          <w:szCs w:val="36"/>
+          <w:shd w:fill="auto" w:val="clear"/>
+          <w:lang w:val="en-US" w:eastAsia="zh-CN" w:bidi="hi-IN"/>
+        </w:rPr>
+      </w:pPr>
+      <w:r>
+        <w:rPr>
+          <w:rFonts w:eastAsia="Times New Roman" w:cs="Times New Roman" w:ascii="Garamond" w:hAnsi="Garamond"/>
+          <w:color w:val="000000"/>
+          <w:kern w:val="0"/>
+          <w:sz w:val="36"/>
+          <w:szCs w:val="36"/>
+          <w:shd w:fill="auto" w:val="clear"/>
+          <w:lang w:val="en-US" w:eastAsia="zh-CN" w:bidi="hi-IN"/>
+        </w:rPr>
+      </w:r>
+    </w:p>
+    <w:p>
+      <w:pPr>
+        <w:pStyle w:val="Normal"/>
+        <w:jc w:val="both"/>
+        <w:rPr>
+          <w:rFonts w:ascii="Garamond" w:hAnsi="Garamond" w:eastAsia="Times New Roman" w:cs="Times New Roman"/>
+          <w:color w:val="000000"/>
+          <w:kern w:val="0"/>
+          <w:sz w:val="36"/>
+          <w:szCs w:val="36"/>
+          <w:shd w:fill="auto" w:val="clear"/>
+          <w:lang w:val="en-US" w:eastAsia="zh-CN" w:bidi="hi-IN"/>
+        </w:rPr>
+      </w:pPr>
+      <w:r>
+        <w:rPr>
+          <w:rFonts w:eastAsia="Times New Roman" w:cs="Times New Roman" w:ascii="Garamond" w:hAnsi="Garamond"/>
+          <w:i/>
+          <w:iCs/>
+          <w:color w:val="000000"/>
+          <w:kern w:val="0"/>
+          <w:sz w:val="36"/>
+          <w:szCs w:val="36"/>
+          <w:shd w:fill="auto" w:val="clear"/>
+          <w:lang w:val="en-US" w:eastAsia="zh-CN" w:bidi="hi-IN"/>
+        </w:rPr>
+        <w:t>Veio o seu inimigo</w:t>
+      </w:r>
+      <w:r>
+        <w:rPr>
+          <w:rFonts w:eastAsia="Times New Roman" w:cs="Times New Roman" w:ascii="Garamond" w:hAnsi="Garamond"/>
+          <w:color w:val="000000"/>
+          <w:kern w:val="0"/>
+          <w:sz w:val="36"/>
+          <w:szCs w:val="36"/>
+          <w:shd w:fill="auto" w:val="clear"/>
+          <w:lang w:val="en-US" w:eastAsia="zh-CN" w:bidi="hi-IN"/>
+        </w:rPr>
+        <w:t>: [ Parei aqui em 05/06/2026 ]</w:t>
       </w:r>
     </w:p>
     <w:p>
@@ -4901,7 +5045,7 @@
           <w:shd w:fill="auto" w:val="clear"/>
           <w:lang w:val="en-US" w:eastAsia="zh-CN" w:bidi="hi-IN"/>
         </w:rPr>
-        <w:t>Esta é a única parábola de Jesus que é explicada  pelo próprio Mestre [ Errado: a parábola do semeador também é explicada por Jesus ]</w:t>
+        <w:t>A parábola traz um enunciado sobre o "fim dos tempos", momento em que Jesus diz que haverá a separação do joio e do trigo. Nós, espíritas, sabemos que não haverá o fim dos tempos ou o fim do mundo conforme entendido por grande parte das escolas religiosas do nosso planeta. O que haverá - e isso já se encontra em andamento a pleno vapor - é a mudança da Terra na escala evolutiva dos mundos. Nosso planeta deixará de ser um mundo de provas e expiações e irá se tornar um mundo de regeneração. Estamos muito próximos do fim dessa transição. Segundo informações do nosso querido e saudoso Chico Xavier, o ápice  da mudança deve ser no ano 2057. Uma das consequências desse processo - e isso é algo que já vem acontecendo - é que, Espíritos rebeldes, orgulhosos, insubmissos aos desígnios de Deus, não terão mais condições de reencarnar na Terra. Se permanecessem na Terra regenerada, eles seriam como maus alunos que permanecem na sala de aula sem estudar, sem fazer suas tarefas, perguntando a ordem, o professor e os colegas que realmente desejam aprender. Tais alunos precisam ir para outra turma para não atrapalhar o desenvolvimento dos demais. É a mesma coisa com os Espíritos que, por hora, se recusam a trabalhar e evoluir moral e espiritualmente: a condição espiritual deles é incompatível com a nova proposta do nosso planeta. Eles serão o joio atado em feixes para serem queimados. Quando se fala em queimar, no sentido religioso, para a grande maioria das pessoas surge a ideia do inferno. Nós, espíritas, também sabemos que o céu e o inferno, como lugares de descanso e sofrimento eternos, não existem. Portanto, esses espíritos que não poderão mais permanecer na Terra regenerada, serão degredados a mundos inferiores, onde terão que trabalhar, vencer suas imperfeições para conquistarem o direito de voltar à Terra;</w:t>
       </w:r>
     </w:p>
     <w:p>
@@ -4927,59 +5071,7 @@
           <w:shd w:fill="auto" w:val="clear"/>
           <w:lang w:val="en-US" w:eastAsia="zh-CN" w:bidi="hi-IN"/>
         </w:rPr>
-        <w:t>A parábola traz um enunciado sobre o "fim dos tempos", momento em que Jesus diz que haverá a separação do joio e do trigo. Nós, espíritas, sabemos que não haverá o fim dos tempos ou o fim do mundo conforme entendido por grande parte das escolas religiosas do nosso planeta. O que haverá - e isso já se encontra em andamento a pleno vapor - é a mudança da Terra na escala evolutiva dos mundos. Nosso planeta deixará de ser um mundo de provas e expiações e irá se tornar um mundo de regeneração. Estamos muito próximos do fim dessa transição. Segundo informações do nosso querido e saudoso Chico Xavier, o ápice  da mudança deve ser no ano 2057. Uma das consequências desse processo - e isso é algo que já vem acontecendo - é que, Espíritos rebeldes, orgulhosos, insubmissos aos desígnios de Deus, não terão mais condições de reencarnar na Terra. Se permanecessem na Terra regenerada, eles seriam como maus alunos que permanecem na sala de aula sem estudar, sem fazer suas tarefas, perguntando a ordem, o professor e os colegas que realmente desejam aprender. Tais alunos precisam ir para outra turma para não atrapalhar o desenvolvimento dos demais. É a mesma coisa com os Espíritos que, por hora, se recusam a trabalhar e evoluir moral e espiritualmente: a condição espiritual deles é incompatível com a nova proposta do nosso planeta. Eles serão o joio atado em feixes para serem queimados. Quando se fala em queimar, no sentido religioso, para a grande maioria das pessoas surge a ideia do inferno. Nós, espíritas, também sabemos que o céu e o inferno, como lugares de descanso e sofrimento eternos, não existem. Portanto, esses espíritos que não poderão mais permanecer na Terra regenerada, serão degredados a mundos inferiores, onde terão que trabalhar, vencer suas imperfeições para conquistarem o direito de voltar à Terra;</w:t>
-      </w:r>
-    </w:p>
-    <w:p>
-      <w:pPr>
-        <w:pStyle w:val="Normal"/>
-        <w:numPr>
-          <w:ilvl w:val="0"/>
-          <w:numId w:val="1"/>
-        </w:numPr>
-        <w:jc w:val="both"/>
-        <w:rPr>
-          <w:sz w:val="36"/>
-          <w:szCs w:val="36"/>
-        </w:rPr>
-      </w:pPr>
-      <w:r>
-        <w:rPr>
-          <w:rFonts w:eastAsia="Times New Roman" w:cs="Times New Roman" w:ascii="Garamond" w:hAnsi="Garamond"/>
-          <w:color w:val="000000"/>
-          <w:kern w:val="0"/>
-          <w:sz w:val="36"/>
-          <w:szCs w:val="36"/>
-          <w:shd w:fill="auto" w:val="clear"/>
-          <w:lang w:val="en-US" w:eastAsia="zh-CN" w:bidi="hi-IN"/>
-        </w:rPr>
         <w:t>[ Ver onde melhor se encaixará esse parágrafo ] A semelhança entre as duas plantas é tão grande, que em algumas regiões costuma-se denominar o joio como "falso trigo". O joio pode ser venenoso e uma pequena quantidade de joio colhida e processada junto ao trigo pode comprometer a qualidade do produto obtido. Podemos fazer uma analogia das plantas com as ações do homem. Muitas pessoas praticam más ações, mas elas são hábeis em esconder sua verdadeira intenção. Elas dão aos seus atos um verniz de bondade, o que faz com que pareçam boas ações. É o joio dando aparência de trigo. Também o fato de que uma pequena quantidade joio que permaneça junto ao trigo processado pode estragar toda a produção. Assim também é conosco. Muitas vezes, pelo esforço que empreendemos e com o auxílio da Espiritualidade amiga, pouco a pouco vamos desenvolvendo e conquistando virtudes. Entretanto, ainda existe em nós o joio de nossas imperfeições. Se não formos vigilantes, a manifestação de uma pequena parte do joio pode comprometer gravemente o trigo já cultivado;</w:t>
-      </w:r>
-    </w:p>
-    <w:p>
-      <w:pPr>
-        <w:pStyle w:val="Normal"/>
-        <w:numPr>
-          <w:ilvl w:val="0"/>
-          <w:numId w:val="1"/>
-        </w:numPr>
-        <w:jc w:val="both"/>
-        <w:rPr>
-          <w:sz w:val="36"/>
-          <w:szCs w:val="36"/>
-        </w:rPr>
-      </w:pPr>
-      <w:r>
-        <w:rPr>
-          <w:rFonts w:eastAsia="Times New Roman" w:cs="Times New Roman" w:ascii="Garamond" w:hAnsi="Garamond"/>
-          <w:color w:val="000000"/>
-          <w:kern w:val="0"/>
-          <w:sz w:val="36"/>
-          <w:szCs w:val="36"/>
-          <w:shd w:fill="auto" w:val="clear"/>
-          <w:lang w:val="en-US" w:eastAsia="zh-CN" w:bidi="hi-IN"/>
-        </w:rPr>
-        <w:t>O "Enquanto todos dormiam..." pode também simbolizar a grande parcela da humanidade que ainda não despertou para as realidades da vida espiritual, aqueles que "dormem" em uma existência completamente material e terrena [ Essa ideia deve ser desenvolvida ];</w:t>
       </w:r>
     </w:p>
     <w:p>
@@ -5154,20 +5246,162 @@
         <w:pStyle w:val="Normal"/>
         <w:jc w:val="both"/>
         <w:rPr>
-          <w:sz w:val="36"/>
-          <w:szCs w:val="36"/>
-        </w:rPr>
-      </w:pPr>
-      <w:r>
-        <w:rPr/>
+          <w:color w:val="FC5C00"/>
+        </w:rPr>
+      </w:pPr>
+      <w:r>
+        <w:rPr>
+          <w:rFonts w:eastAsia="Times New Roman" w:cs="Times New Roman" w:ascii="Garamond" w:hAnsi="Garamond"/>
+          <w:color w:val="FC5C00"/>
+          <w:kern w:val="0"/>
+          <w:sz w:val="36"/>
+          <w:szCs w:val="36"/>
+          <w:shd w:fill="auto" w:val="clear"/>
+          <w:lang w:val="en-US" w:eastAsia="zh-CN" w:bidi="hi-IN"/>
+        </w:rPr>
+        <w:t xml:space="preserve">[ Usar essa passagem evangélica </w:t>
+      </w:r>
+      <w:r>
+        <w:rPr>
+          <w:rFonts w:eastAsia="Times New Roman" w:cs="Times New Roman" w:ascii="Garamond" w:hAnsi="Garamond"/>
+          <w:color w:val="FC5C00"/>
+          <w:kern w:val="0"/>
+          <w:sz w:val="36"/>
+          <w:szCs w:val="36"/>
+          <w:shd w:fill="auto" w:val="clear"/>
+          <w:lang w:val="en-US" w:eastAsia="zh-CN" w:bidi="hi-IN"/>
+        </w:rPr>
+        <w:t>para encerrar a palestra</w:t>
+      </w:r>
+      <w:r>
+        <w:rPr>
+          <w:rFonts w:eastAsia="Times New Roman" w:cs="Times New Roman" w:ascii="Garamond" w:hAnsi="Garamond"/>
+          <w:color w:val="FC5C00"/>
+          <w:kern w:val="0"/>
+          <w:sz w:val="36"/>
+          <w:szCs w:val="36"/>
+          <w:shd w:fill="auto" w:val="clear"/>
+          <w:lang w:val="en-US" w:eastAsia="zh-CN" w:bidi="hi-IN"/>
+        </w:rPr>
+        <w:t xml:space="preserve"> ]</w:t>
+      </w:r>
+    </w:p>
+    <w:p>
+      <w:pPr>
+        <w:pStyle w:val="Normal"/>
+        <w:jc w:val="both"/>
+        <w:rPr>
+          <w:color w:val="auto"/>
+        </w:rPr>
+      </w:pPr>
+      <w:r>
+        <w:rPr>
+          <w:rFonts w:eastAsia="Times New Roman" w:cs="Times New Roman" w:ascii="Garamond" w:hAnsi="Garamond"/>
+          <w:color w:val="000000"/>
+          <w:kern w:val="0"/>
+          <w:sz w:val="36"/>
+          <w:szCs w:val="36"/>
+          <w:shd w:fill="auto" w:val="clear"/>
+          <w:lang w:val="en-US" w:eastAsia="zh-CN" w:bidi="hi-IN"/>
+        </w:rPr>
+        <w:t>"Por mim mesmo juro - disse o Senhor Deus - que não quero a morte do ímpio, senão que ele se converta, que deixe o mau caminho e que viva".</w:t>
+      </w:r>
+    </w:p>
+    <w:p>
+      <w:pPr>
+        <w:pStyle w:val="Normal"/>
+        <w:jc w:val="both"/>
+        <w:rPr>
+          <w:color w:val="auto"/>
+        </w:rPr>
+      </w:pPr>
+      <w:r>
+        <w:rPr>
+          <w:rFonts w:eastAsia="Times New Roman" w:cs="Times New Roman" w:ascii="Garamond" w:hAnsi="Garamond"/>
+          <w:color w:val="000000"/>
+          <w:kern w:val="0"/>
+          <w:sz w:val="36"/>
+          <w:szCs w:val="36"/>
+          <w:shd w:fill="auto" w:val="clear"/>
+          <w:lang w:val="en-US" w:eastAsia="zh-CN" w:bidi="hi-IN"/>
+        </w:rPr>
+        <w:t>(EZEQUIEL, 33:11.)</w:t>
+      </w:r>
+    </w:p>
+    <w:p>
+      <w:pPr>
+        <w:pStyle w:val="Normal"/>
+        <w:jc w:val="both"/>
+        <w:rPr>
+          <w:color w:val="FC5C00"/>
+        </w:rPr>
+      </w:pPr>
+      <w:r>
+        <w:rPr>
+          <w:rFonts w:eastAsia="Times New Roman" w:cs="Times New Roman" w:ascii="Garamond" w:hAnsi="Garamond"/>
+          <w:color w:val="FC5C00"/>
+          <w:kern w:val="0"/>
+          <w:sz w:val="36"/>
+          <w:szCs w:val="36"/>
+          <w:shd w:fill="auto" w:val="clear"/>
+          <w:lang w:val="en-US" w:eastAsia="zh-CN" w:bidi="hi-IN"/>
+        </w:rPr>
+        <w:t>[ Usar essa passagem evangélica em algum ponto ]</w:t>
+      </w:r>
+    </w:p>
+    <w:p>
+      <w:pPr>
+        <w:pStyle w:val="Normal"/>
+        <w:jc w:val="both"/>
+        <w:rPr>
+          <w:rFonts w:ascii="Garamond" w:hAnsi="Garamond" w:eastAsia="Times New Roman" w:cs="Times New Roman"/>
+          <w:color w:val="000000"/>
+          <w:kern w:val="0"/>
+          <w:sz w:val="36"/>
+          <w:szCs w:val="36"/>
+          <w:shd w:fill="auto" w:val="clear"/>
+          <w:lang w:val="en-US" w:eastAsia="zh-CN" w:bidi="hi-IN"/>
+        </w:rPr>
+      </w:pPr>
+      <w:r>
+        <w:rPr>
+          <w:rFonts w:eastAsia="Times New Roman" w:cs="Times New Roman" w:ascii="Garamond" w:hAnsi="Garamond"/>
+          <w:color w:val="000000"/>
+          <w:kern w:val="0"/>
+          <w:sz w:val="36"/>
+          <w:szCs w:val="36"/>
+          <w:shd w:fill="auto" w:val="clear"/>
+          <w:lang w:val="en-US" w:eastAsia="zh-CN" w:bidi="hi-IN"/>
+        </w:rPr>
+      </w:r>
+    </w:p>
+    <w:p>
+      <w:pPr>
+        <w:pStyle w:val="Normal"/>
+        <w:jc w:val="both"/>
+        <w:rPr>
+          <w:color w:val="FC5C00"/>
+        </w:rPr>
+      </w:pPr>
+      <w:r>
+        <w:rPr>
+          <w:rFonts w:eastAsia="Times New Roman" w:cs="Times New Roman" w:ascii="Garamond" w:hAnsi="Garamond"/>
+          <w:color w:val="FC5C00"/>
+          <w:kern w:val="0"/>
+          <w:sz w:val="36"/>
+          <w:szCs w:val="36"/>
+          <w:shd w:fill="auto" w:val="clear"/>
+          <w:lang w:val="en-US" w:eastAsia="zh-CN" w:bidi="hi-IN"/>
+        </w:rPr>
+        <w:t>[ Procurar no ESE onde se fala que, enquanto o homem insistir em praticar o mal, Deus continuará usando o homem como instrumento de evolução do próprio homem ]</w:t>
       </w:r>
     </w:p>
     <w:sectPr>
-      <w:headerReference w:type="default" r:id="rId3"/>
-      <w:type w:val="continuous"/>
+      <w:headerReference w:type="default" r:id="rId2"/>
+      <w:type w:val="nextPage"/>
       <w:pgSz w:w="11906" w:h="16838"/>
       <w:pgMar w:left="1440" w:right="1440" w:gutter="0" w:header="720" w:top="1440" w:footer="0" w:bottom="1440"/>
-      <w:pgNumType w:fmt="decimal"/>
+      <w:pgNumType w:start="1" w:fmt="decimal"/>
       <w:formProt w:val="false"/>
       <w:textDirection w:val="lrTb"/>
       <w:docGrid w:type="default" w:linePitch="100" w:charSpace="4096"/>
@@ -5231,79 +5465,7 @@
         <w:bCs/>
         <w:rFonts w:ascii="Garamond" w:hAnsi="Garamond"/>
       </w:rPr>
-      <w:t>23</w:t>
-    </w:r>
-    <w:r>
-      <w:rPr>
-        <w:sz w:val="40"/>
-        <w:b/>
-        <w:shd w:fill="auto" w:val="clear"/>
-        <w:szCs w:val="40"/>
-        <w:bCs/>
-        <w:rFonts w:ascii="Garamond" w:hAnsi="Garamond"/>
-      </w:rPr>
-      <w:fldChar w:fldCharType="end"/>
-    </w:r>
-  </w:p>
-</w:hdr>
-</file>
-
-<file path=word/header2.xml><?xml version="1.0" encoding="utf-8"?>
-<w:hdr xmlns:o="urn:schemas-microsoft-com:office:office" xmlns:r="http://schemas.openxmlformats.org/officeDocument/2006/relationships" xmlns:v="urn:schemas-microsoft-com:vml" xmlns:w="http://schemas.openxmlformats.org/wordprocessingml/2006/main" xmlns:w10="urn:schemas-microsoft-com:office:word" xmlns:wp="http://schemas.openxmlformats.org/drawingml/2006/wordprocessingDrawing" xmlns:wps="http://schemas.microsoft.com/office/word/2010/wordprocessingShape" xmlns:wpg="http://schemas.microsoft.com/office/word/2010/wordprocessingGroup" xmlns:mc="http://schemas.openxmlformats.org/markup-compatibility/2006" xmlns:wp14="http://schemas.microsoft.com/office/word/2010/wordprocessingDrawing" xmlns:w14="http://schemas.microsoft.com/office/word/2010/wordml" mc:Ignorable="w14 wp14">
-  <w:p>
-    <w:pPr>
-      <w:pStyle w:val="LOnormal"/>
-      <w:jc w:val="right"/>
-      <w:rPr>
-        <w:sz w:val="40"/>
-        <w:szCs w:val="40"/>
-        <w:highlight w:val="none"/>
-        <w:shd w:fill="auto" w:val="clear"/>
-      </w:rPr>
-    </w:pPr>
-    <w:r>
-      <w:rPr>
-        <w:rFonts w:ascii="Garamond" w:hAnsi="Garamond"/>
-        <w:b/>
-        <w:bCs/>
-        <w:sz w:val="40"/>
-        <w:szCs w:val="40"/>
-        <w:shd w:fill="auto" w:val="clear"/>
-      </w:rPr>
-      <w:fldChar w:fldCharType="begin"/>
-    </w:r>
-    <w:r>
-      <w:rPr>
-        <w:sz w:val="40"/>
-        <w:b/>
-        <w:shd w:fill="auto" w:val="clear"/>
-        <w:szCs w:val="40"/>
-        <w:bCs/>
-        <w:rFonts w:ascii="Garamond" w:hAnsi="Garamond"/>
-      </w:rPr>
-      <w:instrText> PAGE </w:instrText>
-    </w:r>
-    <w:r>
-      <w:rPr>
-        <w:sz w:val="40"/>
-        <w:b/>
-        <w:shd w:fill="auto" w:val="clear"/>
-        <w:szCs w:val="40"/>
-        <w:bCs/>
-        <w:rFonts w:ascii="Garamond" w:hAnsi="Garamond"/>
-      </w:rPr>
-      <w:fldChar w:fldCharType="separate"/>
-    </w:r>
-    <w:r>
-      <w:rPr>
-        <w:sz w:val="40"/>
-        <w:b/>
-        <w:shd w:fill="auto" w:val="clear"/>
-        <w:szCs w:val="40"/>
-        <w:bCs/>
-        <w:rFonts w:ascii="Garamond" w:hAnsi="Garamond"/>
-      </w:rPr>
-      <w:t>23</w:t>
+      <w:t>27</w:t>
     </w:r>
     <w:r>
       <w:rPr>

</xml_diff>

<commit_message>
07/06/2026 - 21:03 h
</commit_message>
<xml_diff>
--- a/O joio e o trigo, o mal e o bem/O joio e o trigo.docx
+++ b/O joio e o trigo, o mal e o bem/O joio e o trigo.docx
@@ -1640,55 +1640,7 @@
           <w:shd w:fill="auto" w:val="clear"/>
           <w:lang w:val="en-US" w:eastAsia="zh-CN" w:bidi="hi-IN"/>
         </w:rPr>
-        <w:t xml:space="preserve">É importante </w:t>
-      </w:r>
-      <w:r>
-        <w:rPr>
-          <w:rFonts w:eastAsia="Times New Roman" w:cs="Times New Roman" w:ascii="Garamond" w:hAnsi="Garamond"/>
-          <w:color w:val="000000"/>
-          <w:kern w:val="0"/>
-          <w:sz w:val="36"/>
-          <w:szCs w:val="36"/>
-          <w:shd w:fill="auto" w:val="clear"/>
-          <w:lang w:val="en-US" w:eastAsia="zh-CN" w:bidi="hi-IN"/>
-        </w:rPr>
-        <w:t xml:space="preserve">nós </w:t>
-      </w:r>
-      <w:r>
-        <w:rPr>
-          <w:rFonts w:eastAsia="Times New Roman" w:cs="Times New Roman" w:ascii="Garamond" w:hAnsi="Garamond"/>
-          <w:color w:val="000000"/>
-          <w:kern w:val="0"/>
-          <w:sz w:val="36"/>
-          <w:szCs w:val="36"/>
-          <w:shd w:fill="auto" w:val="clear"/>
-          <w:lang w:val="en-US" w:eastAsia="zh-CN" w:bidi="hi-IN"/>
-        </w:rPr>
-        <w:t>compreender</w:t>
-      </w:r>
-      <w:r>
-        <w:rPr>
-          <w:rFonts w:eastAsia="Times New Roman" w:cs="Times New Roman" w:ascii="Garamond" w:hAnsi="Garamond"/>
-          <w:color w:val="000000"/>
-          <w:kern w:val="0"/>
-          <w:sz w:val="36"/>
-          <w:szCs w:val="36"/>
-          <w:shd w:fill="auto" w:val="clear"/>
-          <w:lang w:val="en-US" w:eastAsia="zh-CN" w:bidi="hi-IN"/>
-        </w:rPr>
-        <w:t>mos</w:t>
-      </w:r>
-      <w:r>
-        <w:rPr>
-          <w:rFonts w:eastAsia="Times New Roman" w:cs="Times New Roman" w:ascii="Garamond" w:hAnsi="Garamond"/>
-          <w:color w:val="000000"/>
-          <w:kern w:val="0"/>
-          <w:sz w:val="36"/>
-          <w:szCs w:val="36"/>
-          <w:shd w:fill="auto" w:val="clear"/>
-          <w:lang w:val="en-US" w:eastAsia="zh-CN" w:bidi="hi-IN"/>
-        </w:rPr>
-        <w:t xml:space="preserve"> o contexto em que Jesus apresentou esta parábola.</w:t>
+        <w:t>Assim como aconteceu com a parábola do semeador, Jesus também explica a parábola do joio e do trigo. Esta explicação está em Mateus 13:36–43:</w:t>
       </w:r>
       <w:r>
         <w:br w:type="page"/>
@@ -1697,6 +1649,611 @@
     <w:p>
       <w:pPr>
         <w:pStyle w:val="Normal"/>
+        <w:ind w:left="720" w:hanging="0"/>
+        <w:jc w:val="both"/>
+        <w:rPr>
+          <w:rFonts w:ascii="Garamond" w:hAnsi="Garamond" w:eastAsia="Times New Roman" w:cs="Times New Roman"/>
+          <w:color w:val="000000"/>
+          <w:kern w:val="0"/>
+          <w:sz w:val="36"/>
+          <w:szCs w:val="36"/>
+          <w:shd w:fill="auto" w:val="clear"/>
+          <w:lang w:val="en-US" w:eastAsia="zh-CN" w:bidi="hi-IN"/>
+        </w:rPr>
+      </w:pPr>
+      <w:r>
+        <w:rPr>
+          <w:rFonts w:eastAsia="Times New Roman" w:cs="Times New Roman" w:ascii="Garamond" w:hAnsi="Garamond"/>
+          <w:color w:val="000000"/>
+          <w:kern w:val="0"/>
+          <w:sz w:val="36"/>
+          <w:szCs w:val="36"/>
+          <w:shd w:fill="auto" w:val="clear"/>
+          <w:lang w:val="en-US" w:eastAsia="zh-CN" w:bidi="hi-IN"/>
+        </w:rPr>
+        <w:t>Então, tendo despedido a multidão, foi Jesus para casa. E chegaram a ele os seus discípulos, dizendo: Explica-nos a parábola do joio do campo.</w:t>
+      </w:r>
+    </w:p>
+    <w:p>
+      <w:pPr>
+        <w:pStyle w:val="Normal"/>
+        <w:ind w:left="720" w:hanging="0"/>
+        <w:jc w:val="both"/>
+        <w:rPr>
+          <w:rFonts w:ascii="Garamond" w:hAnsi="Garamond" w:eastAsia="Times New Roman" w:cs="Times New Roman"/>
+          <w:color w:val="000000"/>
+          <w:kern w:val="0"/>
+          <w:sz w:val="36"/>
+          <w:szCs w:val="36"/>
+          <w:shd w:fill="auto" w:val="clear"/>
+          <w:lang w:val="en-US" w:eastAsia="zh-CN" w:bidi="hi-IN"/>
+        </w:rPr>
+      </w:pPr>
+      <w:r>
+        <w:rPr>
+          <w:rFonts w:eastAsia="Times New Roman" w:cs="Times New Roman" w:ascii="Garamond" w:hAnsi="Garamond"/>
+          <w:color w:val="000000"/>
+          <w:kern w:val="0"/>
+          <w:sz w:val="36"/>
+          <w:szCs w:val="36"/>
+          <w:shd w:fill="auto" w:val="clear"/>
+          <w:lang w:val="en-US" w:eastAsia="zh-CN" w:bidi="hi-IN"/>
+        </w:rPr>
+      </w:r>
+    </w:p>
+    <w:p>
+      <w:pPr>
+        <w:pStyle w:val="Normal"/>
+        <w:ind w:left="720" w:hanging="0"/>
+        <w:jc w:val="both"/>
+        <w:rPr>
+          <w:rFonts w:ascii="Garamond" w:hAnsi="Garamond" w:eastAsia="Times New Roman" w:cs="Times New Roman"/>
+          <w:color w:val="000000"/>
+          <w:kern w:val="0"/>
+          <w:sz w:val="36"/>
+          <w:szCs w:val="36"/>
+          <w:shd w:fill="auto" w:val="clear"/>
+          <w:lang w:val="en-US" w:eastAsia="zh-CN" w:bidi="hi-IN"/>
+        </w:rPr>
+      </w:pPr>
+      <w:r>
+        <w:rPr>
+          <w:rFonts w:eastAsia="Times New Roman" w:cs="Times New Roman" w:ascii="Garamond" w:hAnsi="Garamond"/>
+          <w:color w:val="000000"/>
+          <w:kern w:val="0"/>
+          <w:sz w:val="36"/>
+          <w:szCs w:val="36"/>
+          <w:shd w:fill="auto" w:val="clear"/>
+          <w:lang w:val="en-US" w:eastAsia="zh-CN" w:bidi="hi-IN"/>
+        </w:rPr>
+        <w:t>E ele, respondendo, disse-lhes:</w:t>
+      </w:r>
+    </w:p>
+    <w:p>
+      <w:pPr>
+        <w:pStyle w:val="Normal"/>
+        <w:ind w:left="720" w:hanging="0"/>
+        <w:jc w:val="both"/>
+        <w:rPr>
+          <w:rFonts w:ascii="Garamond" w:hAnsi="Garamond" w:eastAsia="Times New Roman" w:cs="Times New Roman"/>
+          <w:color w:val="000000"/>
+          <w:kern w:val="0"/>
+          <w:sz w:val="36"/>
+          <w:szCs w:val="36"/>
+          <w:shd w:fill="auto" w:val="clear"/>
+          <w:lang w:val="en-US" w:eastAsia="zh-CN" w:bidi="hi-IN"/>
+        </w:rPr>
+      </w:pPr>
+      <w:r>
+        <w:rPr>
+          <w:rFonts w:eastAsia="Times New Roman" w:cs="Times New Roman" w:ascii="Garamond" w:hAnsi="Garamond"/>
+          <w:color w:val="000000"/>
+          <w:kern w:val="0"/>
+          <w:sz w:val="36"/>
+          <w:szCs w:val="36"/>
+          <w:shd w:fill="auto" w:val="clear"/>
+          <w:lang w:val="en-US" w:eastAsia="zh-CN" w:bidi="hi-IN"/>
+        </w:rPr>
+      </w:r>
+    </w:p>
+    <w:p>
+      <w:pPr>
+        <w:pStyle w:val="Normal"/>
+        <w:ind w:left="720" w:hanging="0"/>
+        <w:jc w:val="both"/>
+        <w:rPr>
+          <w:rFonts w:ascii="Garamond" w:hAnsi="Garamond" w:eastAsia="Times New Roman" w:cs="Times New Roman"/>
+          <w:color w:val="000000"/>
+          <w:kern w:val="0"/>
+          <w:sz w:val="36"/>
+          <w:szCs w:val="36"/>
+          <w:shd w:fill="auto" w:val="clear"/>
+          <w:lang w:val="en-US" w:eastAsia="zh-CN" w:bidi="hi-IN"/>
+        </w:rPr>
+      </w:pPr>
+      <w:r>
+        <w:rPr>
+          <w:rFonts w:eastAsia="Times New Roman" w:cs="Times New Roman" w:ascii="Garamond" w:hAnsi="Garamond"/>
+          <w:i/>
+          <w:iCs/>
+          <w:color w:val="000000"/>
+          <w:kern w:val="0"/>
+          <w:sz w:val="36"/>
+          <w:szCs w:val="36"/>
+          <w:shd w:fill="auto" w:val="clear"/>
+          <w:lang w:val="en-US" w:eastAsia="zh-CN" w:bidi="hi-IN"/>
+        </w:rPr>
+        <w:t>O que semeia a boa semente, é o Filho do homem;</w:t>
+      </w:r>
+    </w:p>
+    <w:p>
+      <w:pPr>
+        <w:pStyle w:val="Normal"/>
+        <w:ind w:left="720" w:hanging="0"/>
+        <w:jc w:val="both"/>
+        <w:rPr>
+          <w:rFonts w:ascii="Garamond" w:hAnsi="Garamond" w:eastAsia="Times New Roman" w:cs="Times New Roman"/>
+          <w:i/>
+          <w:i/>
+          <w:iCs/>
+          <w:color w:val="000000"/>
+          <w:kern w:val="0"/>
+          <w:sz w:val="36"/>
+          <w:szCs w:val="36"/>
+          <w:shd w:fill="auto" w:val="clear"/>
+          <w:lang w:val="en-US" w:eastAsia="zh-CN" w:bidi="hi-IN"/>
+        </w:rPr>
+      </w:pPr>
+      <w:r>
+        <w:rPr>
+          <w:rFonts w:eastAsia="Times New Roman" w:cs="Times New Roman" w:ascii="Garamond" w:hAnsi="Garamond"/>
+          <w:i/>
+          <w:iCs/>
+          <w:color w:val="000000"/>
+          <w:kern w:val="0"/>
+          <w:sz w:val="36"/>
+          <w:szCs w:val="36"/>
+          <w:shd w:fill="auto" w:val="clear"/>
+          <w:lang w:val="en-US" w:eastAsia="zh-CN" w:bidi="hi-IN"/>
+        </w:rPr>
+      </w:r>
+    </w:p>
+    <w:p>
+      <w:pPr>
+        <w:pStyle w:val="Normal"/>
+        <w:ind w:left="720" w:hanging="0"/>
+        <w:jc w:val="both"/>
+        <w:rPr>
+          <w:rFonts w:ascii="Garamond" w:hAnsi="Garamond" w:eastAsia="Times New Roman" w:cs="Times New Roman"/>
+          <w:i/>
+          <w:i/>
+          <w:iCs/>
+          <w:color w:val="000000"/>
+          <w:kern w:val="0"/>
+          <w:sz w:val="36"/>
+          <w:szCs w:val="36"/>
+          <w:shd w:fill="auto" w:val="clear"/>
+          <w:lang w:val="en-US" w:eastAsia="zh-CN" w:bidi="hi-IN"/>
+        </w:rPr>
+      </w:pPr>
+      <w:r>
+        <w:rPr>
+          <w:rFonts w:eastAsia="Times New Roman" w:cs="Times New Roman" w:ascii="Garamond" w:hAnsi="Garamond"/>
+          <w:i/>
+          <w:iCs/>
+          <w:color w:val="000000"/>
+          <w:kern w:val="0"/>
+          <w:sz w:val="36"/>
+          <w:szCs w:val="36"/>
+          <w:shd w:fill="auto" w:val="clear"/>
+          <w:lang w:val="en-US" w:eastAsia="zh-CN" w:bidi="hi-IN"/>
+        </w:rPr>
+        <w:t>O campo é o mundo; e a boa semente são os filhos do reino; e o joio são os filhos do maligno;</w:t>
+      </w:r>
+    </w:p>
+    <w:p>
+      <w:pPr>
+        <w:pStyle w:val="Normal"/>
+        <w:ind w:left="720" w:hanging="0"/>
+        <w:jc w:val="both"/>
+        <w:rPr>
+          <w:rFonts w:ascii="Garamond" w:hAnsi="Garamond" w:eastAsia="Times New Roman" w:cs="Times New Roman"/>
+          <w:i/>
+          <w:i/>
+          <w:iCs/>
+          <w:color w:val="000000"/>
+          <w:kern w:val="0"/>
+          <w:sz w:val="36"/>
+          <w:szCs w:val="36"/>
+          <w:shd w:fill="auto" w:val="clear"/>
+          <w:lang w:val="en-US" w:eastAsia="zh-CN" w:bidi="hi-IN"/>
+        </w:rPr>
+      </w:pPr>
+      <w:r>
+        <w:rPr>
+          <w:rFonts w:eastAsia="Times New Roman" w:cs="Times New Roman" w:ascii="Garamond" w:hAnsi="Garamond"/>
+          <w:i/>
+          <w:iCs/>
+          <w:color w:val="000000"/>
+          <w:kern w:val="0"/>
+          <w:sz w:val="36"/>
+          <w:szCs w:val="36"/>
+          <w:shd w:fill="auto" w:val="clear"/>
+          <w:lang w:val="en-US" w:eastAsia="zh-CN" w:bidi="hi-IN"/>
+        </w:rPr>
+      </w:r>
+    </w:p>
+    <w:p>
+      <w:pPr>
+        <w:pStyle w:val="Normal"/>
+        <w:ind w:left="720" w:hanging="0"/>
+        <w:jc w:val="both"/>
+        <w:rPr>
+          <w:rFonts w:ascii="Garamond" w:hAnsi="Garamond" w:eastAsia="Times New Roman" w:cs="Times New Roman"/>
+          <w:i/>
+          <w:i/>
+          <w:iCs/>
+          <w:color w:val="000000"/>
+          <w:kern w:val="0"/>
+          <w:sz w:val="36"/>
+          <w:szCs w:val="36"/>
+          <w:shd w:fill="auto" w:val="clear"/>
+          <w:lang w:val="en-US" w:eastAsia="zh-CN" w:bidi="hi-IN"/>
+        </w:rPr>
+      </w:pPr>
+      <w:r>
+        <w:rPr>
+          <w:rFonts w:eastAsia="Times New Roman" w:cs="Times New Roman" w:ascii="Garamond" w:hAnsi="Garamond"/>
+          <w:i/>
+          <w:iCs/>
+          <w:color w:val="000000"/>
+          <w:kern w:val="0"/>
+          <w:sz w:val="36"/>
+          <w:szCs w:val="36"/>
+          <w:shd w:fill="auto" w:val="clear"/>
+          <w:lang w:val="en-US" w:eastAsia="zh-CN" w:bidi="hi-IN"/>
+        </w:rPr>
+        <w:t>O inimigo, que o semeou, é o diabo; e a ceifa é o fim do mundo; e os ceifeiros são os anjos.</w:t>
+      </w:r>
+    </w:p>
+    <w:p>
+      <w:pPr>
+        <w:pStyle w:val="Normal"/>
+        <w:ind w:left="720" w:hanging="0"/>
+        <w:jc w:val="both"/>
+        <w:rPr>
+          <w:rFonts w:ascii="Garamond" w:hAnsi="Garamond" w:eastAsia="Times New Roman" w:cs="Times New Roman"/>
+          <w:i/>
+          <w:i/>
+          <w:iCs/>
+          <w:color w:val="000000"/>
+          <w:kern w:val="0"/>
+          <w:sz w:val="36"/>
+          <w:szCs w:val="36"/>
+          <w:shd w:fill="auto" w:val="clear"/>
+          <w:lang w:val="en-US" w:eastAsia="zh-CN" w:bidi="hi-IN"/>
+        </w:rPr>
+      </w:pPr>
+      <w:r>
+        <w:rPr>
+          <w:rFonts w:eastAsia="Times New Roman" w:cs="Times New Roman" w:ascii="Garamond" w:hAnsi="Garamond"/>
+          <w:i/>
+          <w:iCs/>
+          <w:color w:val="000000"/>
+          <w:kern w:val="0"/>
+          <w:sz w:val="36"/>
+          <w:szCs w:val="36"/>
+          <w:shd w:fill="auto" w:val="clear"/>
+          <w:lang w:val="en-US" w:eastAsia="zh-CN" w:bidi="hi-IN"/>
+        </w:rPr>
+      </w:r>
+    </w:p>
+    <w:p>
+      <w:pPr>
+        <w:pStyle w:val="Normal"/>
+        <w:ind w:left="720" w:hanging="0"/>
+        <w:jc w:val="both"/>
+        <w:rPr>
+          <w:rFonts w:ascii="Garamond" w:hAnsi="Garamond" w:eastAsia="Times New Roman" w:cs="Times New Roman"/>
+          <w:i/>
+          <w:i/>
+          <w:iCs/>
+          <w:color w:val="000000"/>
+          <w:kern w:val="0"/>
+          <w:sz w:val="36"/>
+          <w:szCs w:val="36"/>
+          <w:shd w:fill="auto" w:val="clear"/>
+          <w:lang w:val="en-US" w:eastAsia="zh-CN" w:bidi="hi-IN"/>
+        </w:rPr>
+      </w:pPr>
+      <w:r>
+        <w:rPr>
+          <w:rFonts w:eastAsia="Times New Roman" w:cs="Times New Roman" w:ascii="Garamond" w:hAnsi="Garamond"/>
+          <w:i/>
+          <w:iCs/>
+          <w:color w:val="000000"/>
+          <w:kern w:val="0"/>
+          <w:sz w:val="36"/>
+          <w:szCs w:val="36"/>
+          <w:shd w:fill="auto" w:val="clear"/>
+          <w:lang w:val="en-US" w:eastAsia="zh-CN" w:bidi="hi-IN"/>
+        </w:rPr>
+        <w:t>Assim como o joio é colhido e queimado no fogo, assim será na consumação deste mundo.</w:t>
+      </w:r>
+    </w:p>
+    <w:p>
+      <w:pPr>
+        <w:pStyle w:val="Normal"/>
+        <w:ind w:left="720" w:hanging="0"/>
+        <w:jc w:val="both"/>
+        <w:rPr>
+          <w:rFonts w:ascii="Garamond" w:hAnsi="Garamond" w:eastAsia="Times New Roman" w:cs="Times New Roman"/>
+          <w:i/>
+          <w:i/>
+          <w:iCs/>
+          <w:color w:val="000000"/>
+          <w:kern w:val="0"/>
+          <w:sz w:val="36"/>
+          <w:szCs w:val="36"/>
+          <w:shd w:fill="auto" w:val="clear"/>
+          <w:lang w:val="en-US" w:eastAsia="zh-CN" w:bidi="hi-IN"/>
+        </w:rPr>
+      </w:pPr>
+      <w:r>
+        <w:rPr>
+          <w:rFonts w:eastAsia="Times New Roman" w:cs="Times New Roman" w:ascii="Garamond" w:hAnsi="Garamond"/>
+          <w:i/>
+          <w:iCs/>
+          <w:color w:val="000000"/>
+          <w:kern w:val="0"/>
+          <w:sz w:val="36"/>
+          <w:szCs w:val="36"/>
+          <w:shd w:fill="auto" w:val="clear"/>
+          <w:lang w:val="en-US" w:eastAsia="zh-CN" w:bidi="hi-IN"/>
+        </w:rPr>
+      </w:r>
+    </w:p>
+    <w:p>
+      <w:pPr>
+        <w:pStyle w:val="Normal"/>
+        <w:ind w:left="720" w:hanging="0"/>
+        <w:jc w:val="both"/>
+        <w:rPr>
+          <w:rFonts w:ascii="Garamond" w:hAnsi="Garamond" w:eastAsia="Times New Roman" w:cs="Times New Roman"/>
+          <w:i/>
+          <w:i/>
+          <w:iCs/>
+          <w:color w:val="000000"/>
+          <w:kern w:val="0"/>
+          <w:sz w:val="36"/>
+          <w:szCs w:val="36"/>
+          <w:shd w:fill="auto" w:val="clear"/>
+          <w:lang w:val="en-US" w:eastAsia="zh-CN" w:bidi="hi-IN"/>
+        </w:rPr>
+      </w:pPr>
+      <w:r>
+        <w:rPr>
+          <w:rFonts w:eastAsia="Times New Roman" w:cs="Times New Roman" w:ascii="Garamond" w:hAnsi="Garamond"/>
+          <w:i/>
+          <w:iCs/>
+          <w:color w:val="000000"/>
+          <w:kern w:val="0"/>
+          <w:sz w:val="36"/>
+          <w:szCs w:val="36"/>
+          <w:shd w:fill="auto" w:val="clear"/>
+          <w:lang w:val="en-US" w:eastAsia="zh-CN" w:bidi="hi-IN"/>
+        </w:rPr>
+        <w:t>Mandará o Filho do homem os seus anjos, e eles colherão do seu reino tudo o que causa escândalo, e os que cometem iniquidade.</w:t>
+      </w:r>
+    </w:p>
+    <w:p>
+      <w:pPr>
+        <w:pStyle w:val="Normal"/>
+        <w:ind w:left="720" w:hanging="0"/>
+        <w:jc w:val="both"/>
+        <w:rPr>
+          <w:rFonts w:ascii="Garamond" w:hAnsi="Garamond" w:eastAsia="Times New Roman" w:cs="Times New Roman"/>
+          <w:i/>
+          <w:i/>
+          <w:iCs/>
+          <w:color w:val="000000"/>
+          <w:kern w:val="0"/>
+          <w:sz w:val="36"/>
+          <w:szCs w:val="36"/>
+          <w:shd w:fill="auto" w:val="clear"/>
+          <w:lang w:val="en-US" w:eastAsia="zh-CN" w:bidi="hi-IN"/>
+        </w:rPr>
+      </w:pPr>
+      <w:r>
+        <w:rPr>
+          <w:rFonts w:eastAsia="Times New Roman" w:cs="Times New Roman" w:ascii="Garamond" w:hAnsi="Garamond"/>
+          <w:i/>
+          <w:iCs/>
+          <w:color w:val="000000"/>
+          <w:kern w:val="0"/>
+          <w:sz w:val="36"/>
+          <w:szCs w:val="36"/>
+          <w:shd w:fill="auto" w:val="clear"/>
+          <w:lang w:val="en-US" w:eastAsia="zh-CN" w:bidi="hi-IN"/>
+        </w:rPr>
+      </w:r>
+    </w:p>
+    <w:p>
+      <w:pPr>
+        <w:pStyle w:val="Normal"/>
+        <w:ind w:left="720" w:hanging="0"/>
+        <w:jc w:val="both"/>
+        <w:rPr>
+          <w:rFonts w:ascii="Garamond" w:hAnsi="Garamond" w:eastAsia="Times New Roman" w:cs="Times New Roman"/>
+          <w:i/>
+          <w:i/>
+          <w:iCs/>
+          <w:color w:val="000000"/>
+          <w:kern w:val="0"/>
+          <w:sz w:val="36"/>
+          <w:szCs w:val="36"/>
+          <w:shd w:fill="auto" w:val="clear"/>
+          <w:lang w:val="en-US" w:eastAsia="zh-CN" w:bidi="hi-IN"/>
+        </w:rPr>
+      </w:pPr>
+      <w:r>
+        <w:rPr>
+          <w:rFonts w:eastAsia="Times New Roman" w:cs="Times New Roman" w:ascii="Garamond" w:hAnsi="Garamond"/>
+          <w:i/>
+          <w:iCs/>
+          <w:color w:val="000000"/>
+          <w:kern w:val="0"/>
+          <w:sz w:val="36"/>
+          <w:szCs w:val="36"/>
+          <w:shd w:fill="auto" w:val="clear"/>
+          <w:lang w:val="en-US" w:eastAsia="zh-CN" w:bidi="hi-IN"/>
+        </w:rPr>
+        <w:t>E lançá-los-ão na fornalha de fogo; ali haverá pranto e ranger de dentes.</w:t>
+      </w:r>
+    </w:p>
+    <w:p>
+      <w:pPr>
+        <w:pStyle w:val="Normal"/>
+        <w:ind w:left="720" w:hanging="0"/>
+        <w:jc w:val="both"/>
+        <w:rPr>
+          <w:rFonts w:ascii="Garamond" w:hAnsi="Garamond" w:eastAsia="Times New Roman" w:cs="Times New Roman"/>
+          <w:i/>
+          <w:i/>
+          <w:iCs/>
+          <w:color w:val="000000"/>
+          <w:kern w:val="0"/>
+          <w:sz w:val="36"/>
+          <w:szCs w:val="36"/>
+          <w:shd w:fill="auto" w:val="clear"/>
+          <w:lang w:val="en-US" w:eastAsia="zh-CN" w:bidi="hi-IN"/>
+        </w:rPr>
+      </w:pPr>
+      <w:r>
+        <w:rPr>
+          <w:rFonts w:eastAsia="Times New Roman" w:cs="Times New Roman" w:ascii="Garamond" w:hAnsi="Garamond"/>
+          <w:i/>
+          <w:iCs/>
+          <w:color w:val="000000"/>
+          <w:kern w:val="0"/>
+          <w:sz w:val="36"/>
+          <w:szCs w:val="36"/>
+          <w:shd w:fill="auto" w:val="clear"/>
+          <w:lang w:val="en-US" w:eastAsia="zh-CN" w:bidi="hi-IN"/>
+        </w:rPr>
+      </w:r>
+    </w:p>
+    <w:p>
+      <w:pPr>
+        <w:pStyle w:val="Normal"/>
+        <w:ind w:left="720" w:hanging="0"/>
+        <w:jc w:val="both"/>
+        <w:rPr>
+          <w:rFonts w:ascii="Garamond" w:hAnsi="Garamond" w:eastAsia="Times New Roman" w:cs="Times New Roman"/>
+          <w:i/>
+          <w:i/>
+          <w:iCs/>
+          <w:color w:val="000000"/>
+          <w:kern w:val="0"/>
+          <w:sz w:val="36"/>
+          <w:szCs w:val="36"/>
+          <w:shd w:fill="auto" w:val="clear"/>
+          <w:lang w:val="en-US" w:eastAsia="zh-CN" w:bidi="hi-IN"/>
+        </w:rPr>
+      </w:pPr>
+      <w:r>
+        <w:rPr>
+          <w:rFonts w:eastAsia="Times New Roman" w:cs="Times New Roman" w:ascii="Garamond" w:hAnsi="Garamond"/>
+          <w:i/>
+          <w:iCs/>
+          <w:color w:val="000000"/>
+          <w:kern w:val="0"/>
+          <w:sz w:val="36"/>
+          <w:szCs w:val="36"/>
+          <w:shd w:fill="auto" w:val="clear"/>
+          <w:lang w:val="en-US" w:eastAsia="zh-CN" w:bidi="hi-IN"/>
+        </w:rPr>
+        <w:t>Então os justos resplandecerão como o sol, no reino de seu Pai. Quem tem ouvidos para ouvir, ouça.</w:t>
+      </w:r>
+    </w:p>
+    <w:p>
+      <w:pPr>
+        <w:pStyle w:val="Normal"/>
+        <w:ind w:left="720" w:hanging="0"/>
+        <w:jc w:val="both"/>
+        <w:rPr>
+          <w:rFonts w:ascii="Garamond" w:hAnsi="Garamond" w:eastAsia="Times New Roman" w:cs="Times New Roman"/>
+          <w:i/>
+          <w:i/>
+          <w:iCs/>
+          <w:color w:val="000000"/>
+          <w:kern w:val="0"/>
+          <w:sz w:val="36"/>
+          <w:szCs w:val="36"/>
+          <w:shd w:fill="auto" w:val="clear"/>
+          <w:lang w:val="en-US" w:eastAsia="zh-CN" w:bidi="hi-IN"/>
+        </w:rPr>
+      </w:pPr>
+      <w:r>
+        <w:rPr>
+          <w:rFonts w:eastAsia="Times New Roman" w:cs="Times New Roman" w:ascii="Garamond" w:hAnsi="Garamond"/>
+          <w:color w:val="000000"/>
+          <w:kern w:val="0"/>
+          <w:sz w:val="36"/>
+          <w:szCs w:val="36"/>
+          <w:shd w:fill="auto" w:val="clear"/>
+          <w:lang w:val="en-US" w:eastAsia="zh-CN" w:bidi="hi-IN"/>
+        </w:rPr>
+      </w:r>
+    </w:p>
+    <w:p>
+      <w:pPr>
+        <w:pStyle w:val="Normal"/>
+        <w:jc w:val="both"/>
+        <w:rPr>
+          <w:rFonts w:ascii="Garamond" w:hAnsi="Garamond" w:eastAsia="Times New Roman" w:cs="Times New Roman"/>
+          <w:color w:val="000000"/>
+          <w:kern w:val="0"/>
+          <w:sz w:val="36"/>
+          <w:szCs w:val="36"/>
+          <w:shd w:fill="auto" w:val="clear"/>
+          <w:lang w:val="en-US" w:eastAsia="zh-CN" w:bidi="hi-IN"/>
+        </w:rPr>
+      </w:pPr>
+      <w:r>
+        <w:rPr>
+          <w:rFonts w:eastAsia="Times New Roman" w:cs="Times New Roman" w:ascii="Garamond" w:hAnsi="Garamond"/>
+          <w:color w:val="000000"/>
+          <w:kern w:val="0"/>
+          <w:sz w:val="36"/>
+          <w:szCs w:val="36"/>
+          <w:shd w:fill="auto" w:val="clear"/>
+          <w:lang w:val="en-US" w:eastAsia="zh-CN" w:bidi="hi-IN"/>
+        </w:rPr>
+        <w:t>É importante nós compreendermos o contexto em que Jesus apresentou esta parábola.</w:t>
+      </w:r>
+    </w:p>
+    <w:p>
+      <w:pPr>
+        <w:pStyle w:val="Normal"/>
+        <w:jc w:val="both"/>
+        <w:rPr>
+          <w:rFonts w:ascii="Garamond" w:hAnsi="Garamond" w:eastAsia="Times New Roman" w:cs="Times New Roman"/>
+          <w:color w:val="000000"/>
+          <w:kern w:val="0"/>
+          <w:sz w:val="36"/>
+          <w:szCs w:val="36"/>
+          <w:shd w:fill="auto" w:val="clear"/>
+          <w:lang w:val="en-US" w:eastAsia="zh-CN" w:bidi="hi-IN"/>
+        </w:rPr>
+      </w:pPr>
+      <w:r>
+        <w:rPr/>
+      </w:r>
+    </w:p>
+    <w:p>
+      <w:pPr>
+        <w:pStyle w:val="Normal"/>
         <w:jc w:val="both"/>
         <w:rPr>
           <w:rFonts w:ascii="Garamond" w:hAnsi="Garamond" w:eastAsia="Times New Roman" w:cs="Times New Roman"/>
@@ -1771,19 +2328,7 @@
           <w:shd w:fill="auto" w:val="clear"/>
           <w:lang w:val="en-US" w:eastAsia="zh-CN" w:bidi="hi-IN"/>
         </w:rPr>
-        <w:t>Antes dele, o Mestre já se utilizava de imagens e comparações em seus ensinamentos. Nós temos, por exemplo</w:t>
-      </w:r>
-      <w:r>
-        <w:rPr>
-          <w:rFonts w:eastAsia="Times New Roman" w:cs="Times New Roman" w:ascii="Garamond" w:hAnsi="Garamond"/>
-          <w:color w:val="000000"/>
-          <w:kern w:val="0"/>
-          <w:sz w:val="36"/>
-          <w:szCs w:val="36"/>
-          <w:shd w:fill="auto" w:val="clear"/>
-          <w:lang w:val="en-US" w:eastAsia="zh-CN" w:bidi="hi-IN"/>
-        </w:rPr>
-        <w:t>, o capítulo 5 quando Jesus diz que somos o sal da terra e a luz do mundo, e o capítulo 7 quando ele fala sobre a porta estreita e a porta larga, a árvore boa e a árvore má.</w:t>
+        <w:t>Antes dele, o Mestre já se utilizava de imagens e comparações em seus ensinamentos. Nós temos, por exemplo, o capítulo 5 quando Jesus diz que somos o sal da terra e a luz do mundo, e o capítulo 7 quando ele fala sobre a porta estreita e a porta larga, a árvore boa e a árvore má.</w:t>
       </w:r>
     </w:p>
     <w:p>
@@ -1847,6 +2392,112 @@
         </w:rPr>
       </w:pPr>
       <w:r>
+        <w:rPr>
+          <w:rFonts w:eastAsia="Times New Roman" w:cs="Times New Roman" w:ascii="Garamond" w:hAnsi="Garamond"/>
+          <w:color w:val="000000"/>
+          <w:kern w:val="0"/>
+          <w:sz w:val="36"/>
+          <w:szCs w:val="36"/>
+          <w:shd w:fill="auto" w:val="clear"/>
+          <w:lang w:val="en-US" w:eastAsia="zh-CN" w:bidi="hi-IN"/>
+        </w:rPr>
+      </w:r>
+    </w:p>
+    <w:p>
+      <w:pPr>
+        <w:pStyle w:val="Normal"/>
+        <w:jc w:val="both"/>
+        <w:rPr>
+          <w:rFonts w:ascii="Garamond" w:hAnsi="Garamond" w:eastAsia="Times New Roman" w:cs="Times New Roman"/>
+          <w:color w:val="000000"/>
+          <w:kern w:val="0"/>
+          <w:sz w:val="36"/>
+          <w:szCs w:val="36"/>
+          <w:shd w:fill="auto" w:val="clear"/>
+          <w:lang w:val="en-US" w:eastAsia="zh-CN" w:bidi="hi-IN"/>
+        </w:rPr>
+      </w:pPr>
+      <w:r>
+        <w:rPr>
+          <w:rFonts w:eastAsia="Times New Roman" w:cs="Times New Roman" w:ascii="Garamond" w:hAnsi="Garamond"/>
+          <w:color w:val="000000"/>
+          <w:kern w:val="0"/>
+          <w:sz w:val="36"/>
+          <w:szCs w:val="36"/>
+          <w:shd w:fill="auto" w:val="clear"/>
+          <w:lang w:val="en-US" w:eastAsia="zh-CN" w:bidi="hi-IN"/>
+        </w:rPr>
+        <w:t xml:space="preserve">A partir do capítulo 13, Jesus passa a ensinar intensamente por parábolas, usando símbolos como sementes, plantio, solo, joio, árvores e colheita. </w:t>
+      </w:r>
+    </w:p>
+    <w:p>
+      <w:pPr>
+        <w:pStyle w:val="Normal"/>
+        <w:jc w:val="both"/>
+        <w:rPr>
+          <w:rFonts w:ascii="Garamond" w:hAnsi="Garamond" w:eastAsia="Times New Roman" w:cs="Times New Roman"/>
+          <w:color w:val="000000"/>
+          <w:kern w:val="0"/>
+          <w:sz w:val="36"/>
+          <w:szCs w:val="36"/>
+          <w:shd w:fill="auto" w:val="clear"/>
+          <w:lang w:val="en-US" w:eastAsia="zh-CN" w:bidi="hi-IN"/>
+        </w:rPr>
+      </w:pPr>
+      <w:r>
+        <w:rPr>
+          <w:rFonts w:eastAsia="Times New Roman" w:cs="Times New Roman" w:ascii="Garamond" w:hAnsi="Garamond"/>
+          <w:color w:val="000000"/>
+          <w:kern w:val="0"/>
+          <w:sz w:val="36"/>
+          <w:szCs w:val="36"/>
+          <w:shd w:fill="auto" w:val="clear"/>
+          <w:lang w:val="en-US" w:eastAsia="zh-CN" w:bidi="hi-IN"/>
+        </w:rPr>
+      </w:r>
+    </w:p>
+    <w:p>
+      <w:pPr>
+        <w:pStyle w:val="Normal"/>
+        <w:jc w:val="both"/>
+        <w:rPr>
+          <w:rFonts w:ascii="Garamond" w:hAnsi="Garamond" w:eastAsia="Times New Roman" w:cs="Times New Roman"/>
+          <w:color w:val="000000"/>
+          <w:kern w:val="0"/>
+          <w:sz w:val="36"/>
+          <w:szCs w:val="36"/>
+          <w:shd w:fill="auto" w:val="clear"/>
+          <w:lang w:val="en-US" w:eastAsia="zh-CN" w:bidi="hi-IN"/>
+        </w:rPr>
+      </w:pPr>
+      <w:r>
+        <w:rPr>
+          <w:rFonts w:eastAsia="Times New Roman" w:cs="Times New Roman" w:ascii="Garamond" w:hAnsi="Garamond"/>
+          <w:color w:val="000000"/>
+          <w:kern w:val="0"/>
+          <w:sz w:val="36"/>
+          <w:szCs w:val="36"/>
+          <w:shd w:fill="auto" w:val="clear"/>
+          <w:lang w:val="en-US" w:eastAsia="zh-CN" w:bidi="hi-IN"/>
+        </w:rPr>
+        <w:t>A sociedade da Galiléia era fortemente rural, então era muito faćil para aquele povo compreender as referências feitas por Jesus.</w:t>
+      </w:r>
+    </w:p>
+    <w:p>
+      <w:pPr>
+        <w:pStyle w:val="Normal"/>
+        <w:jc w:val="both"/>
+        <w:rPr>
+          <w:rFonts w:ascii="Garamond" w:hAnsi="Garamond" w:eastAsia="Times New Roman" w:cs="Times New Roman"/>
+          <w:color w:val="000000"/>
+          <w:kern w:val="0"/>
+          <w:sz w:val="36"/>
+          <w:szCs w:val="36"/>
+          <w:shd w:fill="auto" w:val="clear"/>
+          <w:lang w:val="en-US" w:eastAsia="zh-CN" w:bidi="hi-IN"/>
+        </w:rPr>
+      </w:pPr>
+      <w:r>
         <w:rPr/>
       </w:r>
     </w:p>
@@ -1874,114 +2525,7 @@
           <w:shd w:fill="auto" w:val="clear"/>
           <w:lang w:val="en-US" w:eastAsia="zh-CN" w:bidi="hi-IN"/>
         </w:rPr>
-        <w:t xml:space="preserve">A partir do capítulo 13, Jesus passa a ensinar intensamente por parábolas, usando símbolos como sementes, plantio, solo, joio, árvores e colheita. </w:t>
-      </w:r>
-    </w:p>
-    <w:p>
-      <w:pPr>
-        <w:pStyle w:val="Normal"/>
-        <w:jc w:val="both"/>
-        <w:rPr>
-          <w:rFonts w:ascii="Garamond" w:hAnsi="Garamond" w:eastAsia="Times New Roman" w:cs="Times New Roman"/>
-          <w:color w:val="000000"/>
-          <w:kern w:val="0"/>
-          <w:sz w:val="36"/>
-          <w:szCs w:val="36"/>
-          <w:shd w:fill="auto" w:val="clear"/>
-          <w:lang w:val="en-US" w:eastAsia="zh-CN" w:bidi="hi-IN"/>
-        </w:rPr>
-      </w:pPr>
-      <w:r>
-        <w:rPr>
-          <w:rFonts w:eastAsia="Times New Roman" w:cs="Times New Roman" w:ascii="Garamond" w:hAnsi="Garamond"/>
-          <w:color w:val="000000"/>
-          <w:kern w:val="0"/>
-          <w:sz w:val="36"/>
-          <w:szCs w:val="36"/>
-          <w:shd w:fill="auto" w:val="clear"/>
-          <w:lang w:val="en-US" w:eastAsia="zh-CN" w:bidi="hi-IN"/>
-        </w:rPr>
-      </w:r>
-    </w:p>
-    <w:p>
-      <w:pPr>
-        <w:pStyle w:val="Normal"/>
-        <w:jc w:val="both"/>
-        <w:rPr>
-          <w:rFonts w:ascii="Garamond" w:hAnsi="Garamond" w:eastAsia="Times New Roman" w:cs="Times New Roman"/>
-          <w:color w:val="000000"/>
-          <w:kern w:val="0"/>
-          <w:sz w:val="36"/>
-          <w:szCs w:val="36"/>
-          <w:shd w:fill="auto" w:val="clear"/>
-          <w:lang w:val="en-US" w:eastAsia="zh-CN" w:bidi="hi-IN"/>
-        </w:rPr>
-      </w:pPr>
-      <w:r>
-        <w:rPr>
-          <w:rFonts w:eastAsia="Times New Roman" w:cs="Times New Roman" w:ascii="Garamond" w:hAnsi="Garamond"/>
-          <w:color w:val="000000"/>
-          <w:kern w:val="0"/>
-          <w:sz w:val="36"/>
-          <w:szCs w:val="36"/>
-          <w:shd w:fill="auto" w:val="clear"/>
-          <w:lang w:val="en-US" w:eastAsia="zh-CN" w:bidi="hi-IN"/>
-        </w:rPr>
-        <w:t>A sociedade da Galiléia era fortemente rural, então era muito faćil para aquele povo compreender as referências feitas por Jesus.</w:t>
-      </w:r>
-      <w:r>
-        <w:br w:type="page"/>
-      </w:r>
-    </w:p>
-    <w:p>
-      <w:pPr>
-        <w:pStyle w:val="Normal"/>
-        <w:jc w:val="both"/>
-        <w:rPr>
-          <w:rFonts w:ascii="Garamond" w:hAnsi="Garamond" w:eastAsia="Times New Roman" w:cs="Times New Roman"/>
-          <w:color w:val="000000"/>
-          <w:kern w:val="0"/>
-          <w:sz w:val="36"/>
-          <w:szCs w:val="36"/>
-          <w:shd w:fill="auto" w:val="clear"/>
-          <w:lang w:val="en-US" w:eastAsia="zh-CN" w:bidi="hi-IN"/>
-        </w:rPr>
-      </w:pPr>
-      <w:r>
-        <w:rPr>
-          <w:rFonts w:eastAsia="Times New Roman" w:cs="Times New Roman" w:ascii="Garamond" w:hAnsi="Garamond"/>
-          <w:color w:val="000000"/>
-          <w:kern w:val="0"/>
-          <w:sz w:val="36"/>
-          <w:szCs w:val="36"/>
-          <w:shd w:fill="auto" w:val="clear"/>
-          <w:lang w:val="en-US" w:eastAsia="zh-CN" w:bidi="hi-IN"/>
-        </w:rPr>
-        <w:t xml:space="preserve">E por que houve essa mudança? Se olharmos os capítulos 11 e 12, </w:t>
-      </w:r>
-      <w:r>
-        <w:rPr>
-          <w:rFonts w:eastAsia="Times New Roman" w:cs="Times New Roman" w:ascii="Garamond" w:hAnsi="Garamond"/>
-          <w:color w:val="000000"/>
-          <w:kern w:val="0"/>
-          <w:sz w:val="36"/>
-          <w:szCs w:val="36"/>
-          <w:shd w:fill="auto" w:val="clear"/>
-          <w:lang w:val="en-US" w:eastAsia="zh-CN" w:bidi="hi-IN"/>
-        </w:rPr>
-        <w:t>ainda n</w:t>
-      </w:r>
-      <w:r>
-        <w:rPr>
-          <w:rFonts w:eastAsia="Times New Roman" w:cs="Times New Roman" w:ascii="Garamond" w:hAnsi="Garamond"/>
-          <w:color w:val="000000"/>
-          <w:kern w:val="0"/>
-          <w:sz w:val="36"/>
-          <w:szCs w:val="36"/>
-          <w:shd w:fill="auto" w:val="clear"/>
-          <w:lang w:val="en-US" w:eastAsia="zh-CN" w:bidi="hi-IN"/>
-        </w:rPr>
-        <w:t>o evangelho de Mateus, veremos que há neles uma crescente rejeição aos ensinamentos de Jesus.</w:t>
+        <w:t>E por que houve essa mudança? Se olharmos os capítulos 11 e 12, ainda no evangelho de Mateus, veremos que há neles uma crescente rejeição aos ensinamentos de Jesus.</w:t>
       </w:r>
     </w:p>
     <w:p>
@@ -2153,7 +2697,10 @@
         </w:rPr>
       </w:pPr>
       <w:r>
-        <w:rPr/>
+        <w:rPr>
+          <w:b w:val="false"/>
+          <w:bCs w:val="false"/>
+        </w:rPr>
       </w:r>
     </w:p>
     <w:p>
@@ -2180,9 +2727,6 @@
         </w:rPr>
         <w:t>Eles também pedem a Jesus um “sinal”, mesmo após tantos milagres, revelando não falta de evidências, mas uma recusa interior em acolher a mensagem do Mestre.</w:t>
       </w:r>
-      <w:r>
-        <w:br w:type="page"/>
-      </w:r>
     </w:p>
     <w:p>
       <w:pPr>
@@ -2195,6 +2739,20 @@
         </w:rPr>
       </w:pPr>
       <w:r>
+        <w:rPr/>
+      </w:r>
+    </w:p>
+    <w:p>
+      <w:pPr>
+        <w:pStyle w:val="Normal"/>
+        <w:jc w:val="both"/>
+        <w:rPr>
+          <w:b w:val="false"/>
+          <w:b w:val="false"/>
+          <w:bCs w:val="false"/>
+        </w:rPr>
+      </w:pPr>
+      <w:r>
         <w:rPr>
           <w:rFonts w:eastAsia="Times New Roman" w:cs="Times New Roman" w:ascii="Garamond" w:hAnsi="Garamond"/>
           <w:color w:val="000000"/>
@@ -2333,7 +2891,15 @@
         </w:rPr>
       </w:pPr>
       <w:r>
-        <w:rPr/>
+        <w:rPr>
+          <w:rFonts w:eastAsia="Times New Roman" w:cs="Times New Roman" w:ascii="Garamond" w:hAnsi="Garamond"/>
+          <w:color w:val="000000"/>
+          <w:kern w:val="0"/>
+          <w:sz w:val="36"/>
+          <w:szCs w:val="36"/>
+          <w:shd w:fill="auto" w:val="clear"/>
+          <w:lang w:val="en-US" w:eastAsia="zh-CN" w:bidi="hi-IN"/>
+        </w:rPr>
       </w:r>
     </w:p>
     <w:p>
@@ -2392,7 +2958,43 @@
           <w:shd w:fill="auto" w:val="clear"/>
           <w:lang w:val="en-US" w:eastAsia="zh-CN" w:bidi="hi-IN"/>
         </w:rPr>
-        <w:t>O próprio Mestre Jesus nos explicou o significado da parábola do joio e do trigo. Embora não tenhamos a pretensão de acrescentar nada aos ensinamentos que Ele nos deixou, exploraremos alguns de seus elementos sob uma perspectiva complementar.</w:t>
+        <w:t>Como o</w:t>
+      </w:r>
+      <w:r>
+        <w:rPr>
+          <w:rFonts w:eastAsia="Times New Roman" w:cs="Times New Roman" w:ascii="Garamond" w:hAnsi="Garamond"/>
+          <w:color w:val="000000"/>
+          <w:kern w:val="0"/>
+          <w:sz w:val="36"/>
+          <w:szCs w:val="36"/>
+          <w:shd w:fill="auto" w:val="clear"/>
+          <w:lang w:val="en-US" w:eastAsia="zh-CN" w:bidi="hi-IN"/>
+        </w:rPr>
+        <w:t xml:space="preserve"> próprio Mestre Jesus nos explicou o significado da parábola</w:t>
+      </w:r>
+      <w:r>
+        <w:rPr>
+          <w:rFonts w:eastAsia="Times New Roman" w:cs="Times New Roman" w:ascii="Garamond" w:hAnsi="Garamond"/>
+          <w:color w:val="000000"/>
+          <w:kern w:val="0"/>
+          <w:sz w:val="36"/>
+          <w:szCs w:val="36"/>
+          <w:shd w:fill="auto" w:val="clear"/>
+          <w:lang w:val="en-US" w:eastAsia="zh-CN" w:bidi="hi-IN"/>
+        </w:rPr>
+        <w:t>, nossa intenção é apenas explorar</w:t>
+      </w:r>
+      <w:r>
+        <w:rPr>
+          <w:rFonts w:eastAsia="Times New Roman" w:cs="Times New Roman" w:ascii="Garamond" w:hAnsi="Garamond"/>
+          <w:color w:val="000000"/>
+          <w:kern w:val="0"/>
+          <w:sz w:val="36"/>
+          <w:szCs w:val="36"/>
+          <w:shd w:fill="auto" w:val="clear"/>
+          <w:lang w:val="en-US" w:eastAsia="zh-CN" w:bidi="hi-IN"/>
+        </w:rPr>
+        <w:t xml:space="preserve"> alguns de seus elementos sob uma perspectiva complementar.</w:t>
       </w:r>
     </w:p>
     <w:p>
@@ -2411,7 +3013,15 @@
         </w:rPr>
       </w:pPr>
       <w:r>
-        <w:rPr/>
+        <w:rPr>
+          <w:rFonts w:eastAsia="Times New Roman" w:cs="Times New Roman" w:ascii="Garamond" w:hAnsi="Garamond"/>
+          <w:color w:val="000000"/>
+          <w:kern w:val="0"/>
+          <w:sz w:val="36"/>
+          <w:szCs w:val="36"/>
+          <w:shd w:fill="auto" w:val="clear"/>
+          <w:lang w:val="en-US" w:eastAsia="zh-CN" w:bidi="hi-IN"/>
+        </w:rPr>
       </w:r>
     </w:p>
     <w:p>
@@ -2599,31 +3209,7 @@
           <w:shd w:fill="auto" w:val="clear"/>
           <w:lang w:val="en-US" w:eastAsia="zh-CN" w:bidi="hi-IN"/>
         </w:rPr>
-        <w:t xml:space="preserve">No sentido figurado, o Reino dos Céus diz respeito à soberania que cada um de nós tem sobre </w:t>
-      </w:r>
-      <w:r>
-        <w:rPr>
-          <w:rFonts w:eastAsia="Times New Roman" w:cs="Times New Roman" w:ascii="Garamond" w:hAnsi="Garamond"/>
-          <w:color w:val="000000"/>
-          <w:kern w:val="0"/>
-          <w:sz w:val="36"/>
-          <w:szCs w:val="36"/>
-          <w:shd w:fill="auto" w:val="clear"/>
-          <w:lang w:val="en-US" w:eastAsia="zh-CN" w:bidi="hi-IN"/>
-        </w:rPr>
-        <w:t>o</w:t>
-      </w:r>
-      <w:r>
-        <w:rPr>
-          <w:rFonts w:eastAsia="Times New Roman" w:cs="Times New Roman" w:ascii="Garamond" w:hAnsi="Garamond"/>
-          <w:color w:val="000000"/>
-          <w:kern w:val="0"/>
-          <w:sz w:val="36"/>
-          <w:szCs w:val="36"/>
-          <w:shd w:fill="auto" w:val="clear"/>
-          <w:lang w:val="en-US" w:eastAsia="zh-CN" w:bidi="hi-IN"/>
-        </w:rPr>
-        <w:t xml:space="preserve"> que escolhe pensar, sentir e fazer. Pelo exercício do livre-arbítrio, tornamo-nos senhores de nós mesmos; escolhemos os valores espirituais que cultivaremos em nosso íntimo.</w:t>
+        <w:t>No sentido figurado, o Reino dos Céus diz respeito à soberania que cada um de nós tem sobre o que escolhe pensar, sentir e fazer. Pelo exercício do livre-arbítrio, tornamo-nos senhores de nós mesmos; escolhemos os valores espirituais que cultivaremos em nosso íntimo.</w:t>
       </w:r>
     </w:p>
     <w:p>
@@ -2823,8 +3409,252 @@
           <w:shd w:fill="auto" w:val="clear"/>
           <w:lang w:val="en-US" w:eastAsia="zh-CN" w:bidi="hi-IN"/>
         </w:rPr>
-        <w:t>O h</w:t>
-      </w:r>
+        <w:t>O homem que semeia boa semente</w:t>
+      </w:r>
+      <w:r>
+        <w:rPr>
+          <w:rFonts w:eastAsia="Times New Roman" w:cs="Times New Roman" w:ascii="Garamond" w:hAnsi="Garamond"/>
+          <w:color w:val="000000"/>
+          <w:kern w:val="0"/>
+          <w:sz w:val="36"/>
+          <w:szCs w:val="36"/>
+          <w:shd w:fill="auto" w:val="clear"/>
+          <w:lang w:val="en-US" w:eastAsia="zh-CN" w:bidi="hi-IN"/>
+        </w:rPr>
+        <w:t xml:space="preserve">: como o próprio Mestre Jesus </w:t>
+      </w:r>
+      <w:r>
+        <w:rPr>
+          <w:rFonts w:eastAsia="Times New Roman" w:cs="Times New Roman" w:ascii="Garamond" w:hAnsi="Garamond"/>
+          <w:color w:val="000000"/>
+          <w:kern w:val="0"/>
+          <w:sz w:val="36"/>
+          <w:szCs w:val="36"/>
+          <w:shd w:fill="auto" w:val="clear"/>
+          <w:lang w:val="en-US" w:eastAsia="zh-CN" w:bidi="hi-IN"/>
+        </w:rPr>
+        <w:t>disse,</w:t>
+      </w:r>
+      <w:r>
+        <w:rPr>
+          <w:rFonts w:eastAsia="Times New Roman" w:cs="Times New Roman" w:ascii="Garamond" w:hAnsi="Garamond"/>
+          <w:color w:val="000000"/>
+          <w:kern w:val="0"/>
+          <w:sz w:val="36"/>
+          <w:szCs w:val="36"/>
+          <w:shd w:fill="auto" w:val="clear"/>
+          <w:lang w:val="en-US" w:eastAsia="zh-CN" w:bidi="hi-IN"/>
+        </w:rPr>
+        <w:t xml:space="preserve"> Ele é o divino Semeador, e a boa semente é o seu Evangelho de luz e de amor.</w:t>
+      </w:r>
+    </w:p>
+    <w:p>
+      <w:pPr>
+        <w:pStyle w:val="Normal"/>
+        <w:ind w:left="0" w:hanging="0"/>
+        <w:jc w:val="both"/>
+        <w:rPr>
+          <w:rFonts w:ascii="Garamond" w:hAnsi="Garamond" w:eastAsia="Times New Roman" w:cs="Times New Roman"/>
+          <w:color w:val="000000"/>
+          <w:kern w:val="0"/>
+          <w:sz w:val="36"/>
+          <w:szCs w:val="36"/>
+          <w:shd w:fill="auto" w:val="clear"/>
+          <w:lang w:val="en-US" w:eastAsia="zh-CN" w:bidi="hi-IN"/>
+        </w:rPr>
+      </w:pPr>
+      <w:r>
+        <w:rPr>
+          <w:rFonts w:eastAsia="Times New Roman" w:cs="Times New Roman" w:ascii="Garamond" w:hAnsi="Garamond"/>
+          <w:color w:val="000000"/>
+          <w:kern w:val="0"/>
+          <w:sz w:val="36"/>
+          <w:szCs w:val="36"/>
+          <w:shd w:fill="auto" w:val="clear"/>
+          <w:lang w:val="en-US" w:eastAsia="zh-CN" w:bidi="hi-IN"/>
+        </w:rPr>
+      </w:r>
+    </w:p>
+    <w:p>
+      <w:pPr>
+        <w:pStyle w:val="Normal"/>
+        <w:ind w:left="0" w:hanging="0"/>
+        <w:jc w:val="both"/>
+        <w:rPr>
+          <w:rFonts w:ascii="Garamond" w:hAnsi="Garamond" w:eastAsia="Times New Roman" w:cs="Times New Roman"/>
+          <w:color w:val="000000"/>
+          <w:kern w:val="0"/>
+          <w:sz w:val="36"/>
+          <w:szCs w:val="36"/>
+          <w:shd w:fill="auto" w:val="clear"/>
+          <w:lang w:val="en-US" w:eastAsia="zh-CN" w:bidi="hi-IN"/>
+        </w:rPr>
+      </w:pPr>
+      <w:r>
+        <w:rPr>
+          <w:rFonts w:eastAsia="Times New Roman" w:cs="Times New Roman" w:ascii="Garamond" w:hAnsi="Garamond"/>
+          <w:color w:val="000000"/>
+          <w:kern w:val="0"/>
+          <w:sz w:val="36"/>
+          <w:szCs w:val="36"/>
+          <w:shd w:fill="auto" w:val="clear"/>
+          <w:lang w:val="en-US" w:eastAsia="zh-CN" w:bidi="hi-IN"/>
+        </w:rPr>
+        <w:t>Ao longo dos milênios, o Cristo tem semeado, nos corações d</w:t>
+      </w:r>
+      <w:r>
+        <w:rPr>
+          <w:rFonts w:eastAsia="Times New Roman" w:cs="Times New Roman" w:ascii="Garamond" w:hAnsi="Garamond"/>
+          <w:color w:val="000000"/>
+          <w:kern w:val="0"/>
+          <w:sz w:val="36"/>
+          <w:szCs w:val="36"/>
+          <w:shd w:fill="auto" w:val="clear"/>
+          <w:lang w:val="en-US" w:eastAsia="zh-CN" w:bidi="hi-IN"/>
+        </w:rPr>
+        <w:t>e toda a</w:t>
+      </w:r>
+      <w:r>
+        <w:rPr>
+          <w:rFonts w:eastAsia="Times New Roman" w:cs="Times New Roman" w:ascii="Garamond" w:hAnsi="Garamond"/>
+          <w:color w:val="000000"/>
+          <w:kern w:val="0"/>
+          <w:sz w:val="36"/>
+          <w:szCs w:val="36"/>
+          <w:shd w:fill="auto" w:val="clear"/>
+          <w:lang w:val="en-US" w:eastAsia="zh-CN" w:bidi="hi-IN"/>
+        </w:rPr>
+        <w:t xml:space="preserve"> humanidade, a semente do bem. E, em Sua infinita misericórdia, aguarda paciente que essa semente germine, floresça e dê frutos — no tempo de cada um de nós.</w:t>
+      </w:r>
+    </w:p>
+    <w:p>
+      <w:pPr>
+        <w:pStyle w:val="Normal"/>
+        <w:ind w:left="0" w:hanging="0"/>
+        <w:jc w:val="both"/>
+        <w:rPr>
+          <w:rFonts w:ascii="Garamond" w:hAnsi="Garamond" w:eastAsia="Times New Roman" w:cs="Times New Roman"/>
+          <w:color w:val="000000"/>
+          <w:kern w:val="0"/>
+          <w:sz w:val="36"/>
+          <w:szCs w:val="36"/>
+          <w:shd w:fill="auto" w:val="clear"/>
+          <w:lang w:val="en-US" w:eastAsia="zh-CN" w:bidi="hi-IN"/>
+        </w:rPr>
+      </w:pPr>
+      <w:r>
+        <w:rPr>
+          <w:rFonts w:eastAsia="Times New Roman" w:cs="Times New Roman" w:ascii="Garamond" w:hAnsi="Garamond"/>
+          <w:color w:val="000000"/>
+          <w:kern w:val="0"/>
+          <w:sz w:val="36"/>
+          <w:szCs w:val="36"/>
+          <w:shd w:fill="auto" w:val="clear"/>
+          <w:lang w:val="en-US" w:eastAsia="zh-CN" w:bidi="hi-IN"/>
+        </w:rPr>
+      </w:r>
+    </w:p>
+    <w:p>
+      <w:pPr>
+        <w:pStyle w:val="Normal"/>
+        <w:ind w:left="0" w:hanging="0"/>
+        <w:jc w:val="both"/>
+        <w:rPr>
+          <w:rFonts w:ascii="Garamond" w:hAnsi="Garamond" w:eastAsia="Times New Roman" w:cs="Times New Roman"/>
+          <w:color w:val="000000"/>
+          <w:kern w:val="0"/>
+          <w:sz w:val="36"/>
+          <w:szCs w:val="36"/>
+          <w:shd w:fill="auto" w:val="clear"/>
+          <w:lang w:val="en-US" w:eastAsia="zh-CN" w:bidi="hi-IN"/>
+        </w:rPr>
+      </w:pPr>
+      <w:r>
+        <w:rPr>
+          <w:rFonts w:eastAsia="Times New Roman" w:cs="Times New Roman" w:ascii="Garamond" w:hAnsi="Garamond"/>
+          <w:color w:val="000000"/>
+          <w:kern w:val="0"/>
+          <w:sz w:val="36"/>
+          <w:szCs w:val="36"/>
+          <w:shd w:fill="auto" w:val="clear"/>
+          <w:lang w:val="en-US" w:eastAsia="zh-CN" w:bidi="hi-IN"/>
+        </w:rPr>
+        <w:t>Mas esse “homem que semeia boa semente” também pode ser aplicado a nós mesmos. À medida que conhecemos e internalizamos os ensinamentos de Jesus, aumenta nossa capacidade de discernir entre o certo e o errado, o bem e o mal, o trigo e o joio. Com isso, adquirimos maior autonomia em nossas escolhas.</w:t>
+      </w:r>
+    </w:p>
+    <w:p>
+      <w:pPr>
+        <w:pStyle w:val="Normal"/>
+        <w:ind w:left="0" w:hanging="0"/>
+        <w:jc w:val="both"/>
+        <w:rPr>
+          <w:rFonts w:ascii="Garamond" w:hAnsi="Garamond" w:eastAsia="Times New Roman" w:cs="Times New Roman"/>
+          <w:color w:val="000000"/>
+          <w:kern w:val="0"/>
+          <w:sz w:val="36"/>
+          <w:szCs w:val="36"/>
+          <w:shd w:fill="auto" w:val="clear"/>
+          <w:lang w:val="en-US" w:eastAsia="zh-CN" w:bidi="hi-IN"/>
+        </w:rPr>
+      </w:pPr>
+      <w:r>
+        <w:rPr>
+          <w:rFonts w:eastAsia="Times New Roman" w:cs="Times New Roman" w:ascii="Garamond" w:hAnsi="Garamond"/>
+          <w:color w:val="000000"/>
+          <w:kern w:val="0"/>
+          <w:sz w:val="36"/>
+          <w:szCs w:val="36"/>
+          <w:shd w:fill="auto" w:val="clear"/>
+          <w:lang w:val="en-US" w:eastAsia="zh-CN" w:bidi="hi-IN"/>
+        </w:rPr>
+      </w:r>
+    </w:p>
+    <w:p>
+      <w:pPr>
+        <w:pStyle w:val="Normal"/>
+        <w:ind w:left="0" w:hanging="0"/>
+        <w:jc w:val="both"/>
+        <w:rPr>
+          <w:rFonts w:ascii="Garamond" w:hAnsi="Garamond" w:eastAsia="Times New Roman" w:cs="Times New Roman"/>
+          <w:color w:val="000000"/>
+          <w:kern w:val="0"/>
+          <w:sz w:val="36"/>
+          <w:szCs w:val="36"/>
+          <w:shd w:fill="auto" w:val="clear"/>
+          <w:lang w:val="en-US" w:eastAsia="zh-CN" w:bidi="hi-IN"/>
+        </w:rPr>
+      </w:pPr>
+      <w:r>
+        <w:rPr>
+          <w:rFonts w:eastAsia="Times New Roman" w:cs="Times New Roman" w:ascii="Garamond" w:hAnsi="Garamond"/>
+          <w:color w:val="000000"/>
+          <w:kern w:val="0"/>
+          <w:sz w:val="36"/>
+          <w:szCs w:val="36"/>
+          <w:shd w:fill="auto" w:val="clear"/>
+          <w:lang w:val="en-US" w:eastAsia="zh-CN" w:bidi="hi-IN"/>
+        </w:rPr>
+        <w:t>Consequentemente, tornamo-nos mais seletivos quanto àquilo que aceitamos e àquilo que rejeitamos. A boa semente passa a representar, para nós, os valores morais e intelectuais superiores.</w:t>
+      </w:r>
+      <w:r>
+        <w:br w:type="page"/>
+      </w:r>
+    </w:p>
+    <w:p>
+      <w:pPr>
+        <w:pStyle w:val="Normal"/>
+        <w:ind w:left="0" w:hanging="0"/>
+        <w:jc w:val="both"/>
+        <w:rPr>
+          <w:rFonts w:ascii="Garamond" w:hAnsi="Garamond" w:eastAsia="Times New Roman" w:cs="Times New Roman"/>
+          <w:color w:val="000000"/>
+          <w:kern w:val="0"/>
+          <w:sz w:val="36"/>
+          <w:szCs w:val="36"/>
+          <w:shd w:fill="auto" w:val="clear"/>
+          <w:lang w:val="en-US" w:eastAsia="zh-CN" w:bidi="hi-IN"/>
+        </w:rPr>
+      </w:pPr>
       <w:r>
         <w:rPr>
           <w:rFonts w:eastAsia="Times New Roman" w:cs="Times New Roman" w:ascii="Garamond" w:hAnsi="Garamond"/>
@@ -2839,19 +3669,119 @@
           <w:shd w:fill="auto" w:val="clear"/>
           <w:lang w:val="en-US" w:eastAsia="zh-CN" w:bidi="hi-IN"/>
         </w:rPr>
-        <w:t>omem que semeia boa semente</w:t>
-      </w:r>
-      <w:r>
-        <w:rPr>
-          <w:rFonts w:eastAsia="Times New Roman" w:cs="Times New Roman" w:ascii="Garamond" w:hAnsi="Garamond"/>
-          <w:color w:val="000000"/>
-          <w:kern w:val="0"/>
-          <w:sz w:val="36"/>
-          <w:szCs w:val="36"/>
-          <w:shd w:fill="auto" w:val="clear"/>
-          <w:lang w:val="en-US" w:eastAsia="zh-CN" w:bidi="hi-IN"/>
-        </w:rPr>
-        <w:t>: como o próprio Mestre Jesus nos ensina na explicação da parábola, Ele é o divino Semeador, e a boa semente é o seu Evangelho de luz e de amor, pelo qual podemos nos libertar de nossas imperfeições.</w:t>
+        <w:t>O campo</w:t>
+      </w:r>
+      <w:r>
+        <w:rPr>
+          <w:rFonts w:eastAsia="Times New Roman" w:cs="Times New Roman" w:ascii="Garamond" w:hAnsi="Garamond"/>
+          <w:color w:val="000000"/>
+          <w:kern w:val="0"/>
+          <w:sz w:val="36"/>
+          <w:szCs w:val="36"/>
+          <w:shd w:fill="auto" w:val="clear"/>
+          <w:lang w:val="en-US" w:eastAsia="zh-CN" w:bidi="hi-IN"/>
+        </w:rPr>
+        <w:t xml:space="preserve">: Jesus nos diz que o campo onde ele semeia é o mundo inteiro. Emmanuel, na obra </w:t>
+      </w:r>
+      <w:r>
+        <w:rPr>
+          <w:rFonts w:eastAsia="Times New Roman" w:cs="Times New Roman" w:ascii="Garamond" w:hAnsi="Garamond"/>
+          <w:i/>
+          <w:iCs/>
+          <w:color w:val="000000"/>
+          <w:kern w:val="0"/>
+          <w:sz w:val="36"/>
+          <w:szCs w:val="36"/>
+          <w:shd w:fill="auto" w:val="clear"/>
+          <w:lang w:val="en-US" w:eastAsia="zh-CN" w:bidi="hi-IN"/>
+        </w:rPr>
+        <w:t>Vinha de Luz</w:t>
+      </w:r>
+      <w:r>
+        <w:rPr>
+          <w:rFonts w:eastAsia="Times New Roman" w:cs="Times New Roman" w:ascii="Garamond" w:hAnsi="Garamond"/>
+          <w:color w:val="000000"/>
+          <w:kern w:val="0"/>
+          <w:sz w:val="36"/>
+          <w:szCs w:val="36"/>
+          <w:shd w:fill="auto" w:val="clear"/>
+          <w:lang w:val="en-US" w:eastAsia="zh-CN" w:bidi="hi-IN"/>
+        </w:rPr>
+        <w:t xml:space="preserve">, com psicografia de Chico Xavier, na lição de número 68 intitulada </w:t>
+      </w:r>
+      <w:r>
+        <w:rPr>
+          <w:rFonts w:eastAsia="Times New Roman" w:cs="Times New Roman" w:ascii="Garamond" w:hAnsi="Garamond"/>
+          <w:i/>
+          <w:iCs/>
+          <w:color w:val="000000"/>
+          <w:kern w:val="0"/>
+          <w:sz w:val="36"/>
+          <w:szCs w:val="36"/>
+          <w:shd w:fill="auto" w:val="clear"/>
+          <w:lang w:val="en-US" w:eastAsia="zh-CN" w:bidi="hi-IN"/>
+        </w:rPr>
+        <w:t>O Campo</w:t>
+      </w:r>
+      <w:r>
+        <w:rPr>
+          <w:rFonts w:eastAsia="Times New Roman" w:cs="Times New Roman" w:ascii="Garamond" w:hAnsi="Garamond"/>
+          <w:color w:val="000000"/>
+          <w:kern w:val="0"/>
+          <w:sz w:val="36"/>
+          <w:szCs w:val="36"/>
+          <w:shd w:fill="auto" w:val="clear"/>
+          <w:lang w:val="en-US" w:eastAsia="zh-CN" w:bidi="hi-IN"/>
+        </w:rPr>
+        <w:t>, reafirma as palavras do Mestre, mas nos diz também que, como em qualquer campo de lavoura, o mundo possui faixas de terra excelentes e zonas necessitadas</w:t>
+      </w:r>
+      <w:r>
+        <w:rPr>
+          <w:rFonts w:eastAsia="Times New Roman" w:cs="Times New Roman" w:ascii="Garamond" w:hAnsi="Garamond"/>
+          <w:color w:val="000000"/>
+          <w:kern w:val="0"/>
+          <w:sz w:val="36"/>
+          <w:szCs w:val="36"/>
+          <w:shd w:fill="auto" w:val="clear"/>
+          <w:lang w:val="en-US" w:eastAsia="zh-CN" w:bidi="hi-IN"/>
+        </w:rPr>
+        <w:t xml:space="preserve"> de </w:t>
+      </w:r>
+      <w:r>
+        <w:rPr>
+          <w:rFonts w:eastAsia="Times New Roman" w:cs="Times New Roman" w:ascii="Garamond" w:hAnsi="Garamond"/>
+          <w:color w:val="000000"/>
+          <w:kern w:val="0"/>
+          <w:sz w:val="36"/>
+          <w:szCs w:val="36"/>
+          <w:shd w:fill="auto" w:val="clear"/>
+          <w:lang w:val="en-US" w:eastAsia="zh-CN" w:bidi="hi-IN"/>
+        </w:rPr>
+        <w:t xml:space="preserve"> </w:t>
+      </w:r>
+      <w:r>
+        <w:rPr>
+          <w:rFonts w:eastAsia="Times New Roman" w:cs="Times New Roman" w:ascii="Garamond" w:hAnsi="Garamond"/>
+          <w:color w:val="000000"/>
+          <w:kern w:val="0"/>
+          <w:sz w:val="36"/>
+          <w:szCs w:val="36"/>
+          <w:shd w:fill="auto" w:val="clear"/>
+          <w:lang w:val="en-US" w:eastAsia="zh-CN" w:bidi="hi-IN"/>
+        </w:rPr>
+        <w:t>tratamento</w:t>
+      </w:r>
+      <w:r>
+        <w:rPr>
+          <w:rFonts w:eastAsia="Times New Roman" w:cs="Times New Roman" w:ascii="Garamond" w:hAnsi="Garamond"/>
+          <w:color w:val="000000"/>
+          <w:kern w:val="0"/>
+          <w:sz w:val="36"/>
+          <w:szCs w:val="36"/>
+          <w:shd w:fill="auto" w:val="clear"/>
+          <w:lang w:val="en-US" w:eastAsia="zh-CN" w:bidi="hi-IN"/>
+        </w:rPr>
+        <w:t>.</w:t>
       </w:r>
     </w:p>
     <w:p>
@@ -2906,7 +3836,7 @@
           <w:shd w:fill="auto" w:val="clear"/>
           <w:lang w:val="en-US" w:eastAsia="zh-CN" w:bidi="hi-IN"/>
         </w:rPr>
-        <w:t>Ao longo dos milênios, o Cristo tem semeado, nos corações da humanidade, a semente do bem. E, em Sua infinita misericórdia, aguarda paciente que essa semente germine, floresça e dê frutos — no tempo de cada um de nós.</w:t>
+        <w:t>Ele também afirma que, se desejamos verdadeiramente servir com Jesus, não temos o direito de querer trabalhar apenas em áreas de solo fértil. É necessário que trabalhemos também nos pântanos, nos desertos e nos espinheiros.</w:t>
       </w:r>
     </w:p>
     <w:p>
@@ -2961,7 +3891,7 @@
           <w:shd w:fill="auto" w:val="clear"/>
           <w:lang w:val="en-US" w:eastAsia="zh-CN" w:bidi="hi-IN"/>
         </w:rPr>
-        <w:t>Mas esse “homem que semeia boa semente” também pode ser aplicado a nós mesmos. À medida que conhecemos e internalizamos os ensinamentos de Jesus, aumenta nossa capacidade de discernir entre o certo e o errado, o bem e o mal, o trigo e o joio. Com isso, adquirimos maior autonomia em nossas escolhas.</w:t>
+        <w:t>É uma analogia utilizada por Emmanuel para dizer que devemos, sim, nos precaver contra os males causados pelo joio, mas não podemos fugir ao contato com ele. Jesus exemplificou seus ensinamentos junto a criminosos, doentes, prostitutas e malfeitores.</w:t>
       </w:r>
     </w:p>
     <w:p>
@@ -3016,10 +3946,7 @@
           <w:shd w:fill="auto" w:val="clear"/>
           <w:lang w:val="en-US" w:eastAsia="zh-CN" w:bidi="hi-IN"/>
         </w:rPr>
-        <w:t>Consequentemente, tornamo-nos mais seletivos quanto àquilo que aceitamos e àquilo que rejeitamos. A boa semente passa a representar, para nós, os valores morais e intelectuais superiores.</w:t>
-      </w:r>
-      <w:r>
-        <w:br w:type="page"/>
+        <w:t>Se o Mestre serviu indistintamente a todos os que queriam ser ajudados por Ele, que direito temos nós de escolher a quem servir?</w:t>
       </w:r>
     </w:p>
     <w:p>
@@ -3040,110 +3967,13 @@
       <w:r>
         <w:rPr>
           <w:rFonts w:eastAsia="Times New Roman" w:cs="Times New Roman" w:ascii="Garamond" w:hAnsi="Garamond"/>
-          <w:b/>
-          <w:bCs/>
-          <w:i/>
-          <w:iCs/>
-          <w:color w:val="FC5C00"/>
-          <w:kern w:val="0"/>
-          <w:sz w:val="36"/>
-          <w:szCs w:val="36"/>
-          <w:shd w:fill="auto" w:val="clear"/>
-          <w:lang w:val="en-US" w:eastAsia="zh-CN" w:bidi="hi-IN"/>
-        </w:rPr>
-        <w:t xml:space="preserve">O </w:t>
-      </w:r>
-      <w:r>
-        <w:rPr>
-          <w:rFonts w:eastAsia="Times New Roman" w:cs="Times New Roman" w:ascii="Garamond" w:hAnsi="Garamond"/>
-          <w:b/>
-          <w:bCs/>
-          <w:i/>
-          <w:iCs/>
-          <w:color w:val="FC5C00"/>
-          <w:kern w:val="0"/>
-          <w:sz w:val="36"/>
-          <w:szCs w:val="36"/>
-          <w:shd w:fill="auto" w:val="clear"/>
-          <w:lang w:val="en-US" w:eastAsia="zh-CN" w:bidi="hi-IN"/>
-        </w:rPr>
-        <w:t>campo</w:t>
-      </w:r>
-      <w:r>
-        <w:rPr>
-          <w:rFonts w:eastAsia="Times New Roman" w:cs="Times New Roman" w:ascii="Garamond" w:hAnsi="Garamond"/>
-          <w:color w:val="000000"/>
-          <w:kern w:val="0"/>
-          <w:sz w:val="36"/>
-          <w:szCs w:val="36"/>
-          <w:shd w:fill="auto" w:val="clear"/>
-          <w:lang w:val="en-US" w:eastAsia="zh-CN" w:bidi="hi-IN"/>
-        </w:rPr>
-        <w:t xml:space="preserve">: </w:t>
-      </w:r>
-      <w:r>
-        <w:rPr>
-          <w:rFonts w:eastAsia="Times New Roman" w:cs="Times New Roman" w:ascii="Garamond" w:hAnsi="Garamond"/>
-          <w:color w:val="000000"/>
-          <w:kern w:val="0"/>
-          <w:sz w:val="36"/>
-          <w:szCs w:val="36"/>
-          <w:shd w:fill="auto" w:val="clear"/>
-          <w:lang w:val="en-US" w:eastAsia="zh-CN" w:bidi="hi-IN"/>
-        </w:rPr>
-        <w:t xml:space="preserve">Jesus nos diz que o campo onde ele semeia é o mundo inteiro. Emmanuel, na obra </w:t>
-      </w:r>
-      <w:r>
-        <w:rPr>
-          <w:rFonts w:eastAsia="Times New Roman" w:cs="Times New Roman" w:ascii="Garamond" w:hAnsi="Garamond"/>
-          <w:i/>
-          <w:iCs/>
-          <w:color w:val="000000"/>
-          <w:kern w:val="0"/>
-          <w:sz w:val="36"/>
-          <w:szCs w:val="36"/>
-          <w:shd w:fill="auto" w:val="clear"/>
-          <w:lang w:val="en-US" w:eastAsia="zh-CN" w:bidi="hi-IN"/>
-        </w:rPr>
-        <w:t>Vinha de Luz</w:t>
-      </w:r>
-      <w:r>
-        <w:rPr>
-          <w:rFonts w:eastAsia="Times New Roman" w:cs="Times New Roman" w:ascii="Garamond" w:hAnsi="Garamond"/>
-          <w:color w:val="000000"/>
-          <w:kern w:val="0"/>
-          <w:sz w:val="36"/>
-          <w:szCs w:val="36"/>
-          <w:shd w:fill="auto" w:val="clear"/>
-          <w:lang w:val="en-US" w:eastAsia="zh-CN" w:bidi="hi-IN"/>
-        </w:rPr>
-        <w:t xml:space="preserve">, com psicografia de Chico Xavier, na lição de número 68 intitulada </w:t>
-      </w:r>
-      <w:r>
-        <w:rPr>
-          <w:rFonts w:eastAsia="Times New Roman" w:cs="Times New Roman" w:ascii="Garamond" w:hAnsi="Garamond"/>
-          <w:i/>
-          <w:iCs/>
-          <w:color w:val="000000"/>
-          <w:kern w:val="0"/>
-          <w:sz w:val="36"/>
-          <w:szCs w:val="36"/>
-          <w:shd w:fill="auto" w:val="clear"/>
-          <w:lang w:val="en-US" w:eastAsia="zh-CN" w:bidi="hi-IN"/>
-        </w:rPr>
-        <w:t>O Campo</w:t>
-      </w:r>
-      <w:r>
-        <w:rPr>
-          <w:rFonts w:eastAsia="Times New Roman" w:cs="Times New Roman" w:ascii="Garamond" w:hAnsi="Garamond"/>
-          <w:color w:val="000000"/>
-          <w:kern w:val="0"/>
-          <w:sz w:val="36"/>
-          <w:szCs w:val="36"/>
-          <w:shd w:fill="auto" w:val="clear"/>
-          <w:lang w:val="en-US" w:eastAsia="zh-CN" w:bidi="hi-IN"/>
-        </w:rPr>
-        <w:t>, reafirma as palavras do Mestre, mas nos diz também que, como em qualquer campo de lavoura, o mundo possui faixas de terra excelentes e zonas necessitadas arrimo, corretivo e proteção.</w:t>
+          <w:color w:val="000000"/>
+          <w:kern w:val="0"/>
+          <w:sz w:val="36"/>
+          <w:szCs w:val="36"/>
+          <w:shd w:fill="auto" w:val="clear"/>
+          <w:lang w:val="en-US" w:eastAsia="zh-CN" w:bidi="hi-IN"/>
+        </w:rPr>
       </w:r>
     </w:p>
     <w:p>
@@ -3171,171 +4001,7 @@
           <w:shd w:fill="auto" w:val="clear"/>
           <w:lang w:val="en-US" w:eastAsia="zh-CN" w:bidi="hi-IN"/>
         </w:rPr>
-      </w:r>
-    </w:p>
-    <w:p>
-      <w:pPr>
-        <w:pStyle w:val="Normal"/>
-        <w:ind w:left="0" w:hanging="0"/>
-        <w:jc w:val="both"/>
-        <w:rPr>
-          <w:rFonts w:ascii="Garamond" w:hAnsi="Garamond" w:eastAsia="Times New Roman" w:cs="Times New Roman"/>
-          <w:color w:val="000000"/>
-          <w:kern w:val="0"/>
-          <w:sz w:val="36"/>
-          <w:szCs w:val="36"/>
-          <w:shd w:fill="auto" w:val="clear"/>
-          <w:lang w:val="en-US" w:eastAsia="zh-CN" w:bidi="hi-IN"/>
-        </w:rPr>
-      </w:pPr>
-      <w:r>
-        <w:rPr>
-          <w:rFonts w:eastAsia="Times New Roman" w:cs="Times New Roman" w:ascii="Garamond" w:hAnsi="Garamond"/>
-          <w:color w:val="000000"/>
-          <w:kern w:val="0"/>
-          <w:sz w:val="36"/>
-          <w:szCs w:val="36"/>
-          <w:shd w:fill="auto" w:val="clear"/>
-          <w:lang w:val="en-US" w:eastAsia="zh-CN" w:bidi="hi-IN"/>
-        </w:rPr>
-        <w:t>[ Prosseguir desse ponto ]</w:t>
-      </w:r>
-    </w:p>
-    <w:p>
-      <w:pPr>
-        <w:pStyle w:val="Normal"/>
-        <w:ind w:left="0" w:hanging="0"/>
-        <w:jc w:val="both"/>
-        <w:rPr>
-          <w:rFonts w:ascii="Garamond" w:hAnsi="Garamond" w:eastAsia="Times New Roman" w:cs="Times New Roman"/>
-          <w:color w:val="000000"/>
-          <w:kern w:val="0"/>
-          <w:sz w:val="36"/>
-          <w:szCs w:val="36"/>
-          <w:shd w:fill="auto" w:val="clear"/>
-          <w:lang w:val="en-US" w:eastAsia="zh-CN" w:bidi="hi-IN"/>
-        </w:rPr>
-      </w:pPr>
-      <w:r>
-        <w:rPr>
-          <w:rFonts w:eastAsia="Times New Roman" w:cs="Times New Roman" w:ascii="Garamond" w:hAnsi="Garamond"/>
-          <w:color w:val="000000"/>
-          <w:kern w:val="0"/>
-          <w:sz w:val="36"/>
-          <w:szCs w:val="36"/>
-          <w:shd w:fill="auto" w:val="clear"/>
-          <w:lang w:val="en-US" w:eastAsia="zh-CN" w:bidi="hi-IN"/>
-        </w:rPr>
-      </w:r>
-    </w:p>
-    <w:p>
-      <w:pPr>
-        <w:pStyle w:val="Normal"/>
-        <w:ind w:left="0" w:hanging="0"/>
-        <w:jc w:val="both"/>
-        <w:rPr>
-          <w:rFonts w:ascii="Garamond" w:hAnsi="Garamond" w:eastAsia="Times New Roman" w:cs="Times New Roman"/>
-          <w:color w:val="000000"/>
-          <w:kern w:val="0"/>
-          <w:sz w:val="36"/>
-          <w:szCs w:val="36"/>
-          <w:shd w:fill="auto" w:val="clear"/>
-          <w:lang w:val="en-US" w:eastAsia="zh-CN" w:bidi="hi-IN"/>
-        </w:rPr>
-      </w:pPr>
-      <w:r>
-        <w:rPr>
-          <w:rFonts w:eastAsia="Times New Roman" w:cs="Times New Roman" w:ascii="Garamond" w:hAnsi="Garamond"/>
-          <w:color w:val="000000"/>
-          <w:kern w:val="0"/>
-          <w:sz w:val="36"/>
-          <w:szCs w:val="36"/>
-          <w:shd w:fill="auto" w:val="clear"/>
-          <w:lang w:val="en-US" w:eastAsia="zh-CN" w:bidi="hi-IN"/>
-        </w:rPr>
-        <w:t>como o próprio Mestre Jesus nos ensina na explicação da parábola, Ele é o divino Semeador, e a boa semente é o seu Evangelho de luz e de amor, pelo qual podemos nos libertar de nossas imperfeições.</w:t>
-      </w:r>
-    </w:p>
-    <w:p>
-      <w:pPr>
-        <w:pStyle w:val="Normal"/>
-        <w:ind w:left="0" w:hanging="0"/>
-        <w:jc w:val="both"/>
-        <w:rPr>
-          <w:rFonts w:ascii="Garamond" w:hAnsi="Garamond" w:eastAsia="Times New Roman" w:cs="Times New Roman"/>
-          <w:color w:val="000000"/>
-          <w:kern w:val="0"/>
-          <w:sz w:val="36"/>
-          <w:szCs w:val="36"/>
-          <w:shd w:fill="auto" w:val="clear"/>
-          <w:lang w:val="en-US" w:eastAsia="zh-CN" w:bidi="hi-IN"/>
-        </w:rPr>
-      </w:pPr>
-      <w:r>
-        <w:rPr>
-          <w:rFonts w:eastAsia="Times New Roman" w:cs="Times New Roman" w:ascii="Garamond" w:hAnsi="Garamond"/>
-          <w:color w:val="000000"/>
-          <w:kern w:val="0"/>
-          <w:sz w:val="36"/>
-          <w:szCs w:val="36"/>
-          <w:shd w:fill="auto" w:val="clear"/>
-          <w:lang w:val="en-US" w:eastAsia="zh-CN" w:bidi="hi-IN"/>
-        </w:rPr>
-      </w:r>
-    </w:p>
-    <w:p>
-      <w:pPr>
-        <w:pStyle w:val="Normal"/>
-        <w:ind w:left="0" w:hanging="0"/>
-        <w:jc w:val="both"/>
-        <w:rPr>
-          <w:rFonts w:ascii="Garamond" w:hAnsi="Garamond" w:eastAsia="Times New Roman" w:cs="Times New Roman"/>
-          <w:color w:val="000000"/>
-          <w:kern w:val="0"/>
-          <w:sz w:val="36"/>
-          <w:szCs w:val="36"/>
-          <w:shd w:fill="auto" w:val="clear"/>
-          <w:lang w:val="en-US" w:eastAsia="zh-CN" w:bidi="hi-IN"/>
-        </w:rPr>
-      </w:pPr>
-      <w:r>
-        <w:rPr>
-          <w:rFonts w:eastAsia="Times New Roman" w:cs="Times New Roman" w:ascii="Garamond" w:hAnsi="Garamond"/>
-          <w:color w:val="000000"/>
-          <w:kern w:val="0"/>
-          <w:sz w:val="36"/>
-          <w:szCs w:val="36"/>
-          <w:shd w:fill="auto" w:val="clear"/>
-          <w:lang w:val="en-US" w:eastAsia="zh-CN" w:bidi="hi-IN"/>
-        </w:rPr>
-        <w:t>tem nos concedido o tempo</w:t>
-      </w:r>
-    </w:p>
-    <w:p>
-      <w:pPr>
-        <w:pStyle w:val="Normal"/>
-        <w:ind w:left="0" w:hanging="0"/>
-        <w:jc w:val="both"/>
-        <w:rPr>
-          <w:rFonts w:ascii="Garamond" w:hAnsi="Garamond" w:eastAsia="Times New Roman" w:cs="Times New Roman"/>
-          <w:color w:val="000000"/>
-          <w:kern w:val="0"/>
-          <w:sz w:val="36"/>
-          <w:szCs w:val="36"/>
-          <w:shd w:fill="auto" w:val="clear"/>
-          <w:lang w:val="en-US" w:eastAsia="zh-CN" w:bidi="hi-IN"/>
-        </w:rPr>
-      </w:pPr>
-      <w:r>
-        <w:rPr>
-          <w:rFonts w:eastAsia="Times New Roman" w:cs="Times New Roman" w:ascii="Garamond" w:hAnsi="Garamond"/>
-          <w:color w:val="000000"/>
-          <w:kern w:val="0"/>
-          <w:sz w:val="36"/>
-          <w:szCs w:val="36"/>
-          <w:shd w:fill="auto" w:val="clear"/>
-          <w:lang w:val="en-US" w:eastAsia="zh-CN" w:bidi="hi-IN"/>
-        </w:rPr>
+        <w:t>O Evangelho não é um diploma para ser guardado no cérebro; é um roteiro para ser cultivado no coração.</w:t>
       </w:r>
     </w:p>
     <w:p>
@@ -3441,9 +4107,11 @@
       <w:r>
         <w:rPr>
           <w:rFonts w:eastAsia="Times New Roman" w:cs="Times New Roman" w:ascii="Garamond" w:hAnsi="Garamond"/>
+          <w:b/>
+          <w:bCs/>
           <w:i/>
           <w:iCs/>
-          <w:color w:val="000000"/>
+          <w:color w:val="FC5C00"/>
           <w:kern w:val="0"/>
           <w:sz w:val="36"/>
           <w:szCs w:val="36"/>
@@ -3653,7 +4321,7 @@
           <w:shd w:fill="auto" w:val="clear"/>
           <w:lang w:val="en-US" w:eastAsia="zh-CN" w:bidi="hi-IN"/>
         </w:rPr>
-        <w:t>Também podemos interpretar o ato de dormir como sendo nossa invigilância. Não sei se vocês já ouviram falar de Amir Klink. Ele é um renomado navegador, escritor e palestrante brasileiro, famoso por suas inéditas expedições marítimas, como a primeira travessia a remo do Oceano Atlântico Sul em 1984 e suas inúmeras viagens à Antártica.</w:t>
+        <w:t>Também podemos interpretar o ato de dormir como sendo nossa invigilância. Não sei se vocês já ouviram falar de Amir Klink. Ele é um renomado navegador, escritor e palestrante brasileiro, famoso por suas expedições marítimas, como a primeira travessia a remo do Oceano Atlântico Sul em 1984 e suas inúmeras viagens à Antártica.</w:t>
       </w:r>
     </w:p>
     <w:p>
@@ -3818,7 +4486,19 @@
           <w:shd w:fill="auto" w:val="clear"/>
           <w:lang w:val="en-US" w:eastAsia="zh-CN" w:bidi="hi-IN"/>
         </w:rPr>
-        <w:t xml:space="preserve">É exatamente isso que acontece conosco. Quando estamos nos momentos turbulentos da vida, com muitos problemas, muitas preocupações, costumamos ficar atentos. </w:t>
+        <w:t>Assim acontece</w:t>
+      </w:r>
+      <w:r>
+        <w:rPr>
+          <w:rFonts w:eastAsia="Times New Roman" w:cs="Times New Roman" w:ascii="Garamond" w:hAnsi="Garamond"/>
+          <w:color w:val="000000"/>
+          <w:kern w:val="0"/>
+          <w:sz w:val="36"/>
+          <w:szCs w:val="36"/>
+          <w:shd w:fill="auto" w:val="clear"/>
+          <w:lang w:val="en-US" w:eastAsia="zh-CN" w:bidi="hi-IN"/>
+        </w:rPr>
+        <w:t xml:space="preserve"> conosco. Quando estamos nos momentos turbulentos da vida, com muitos problemas, muitas preocupações, costumamos ficar atentos. </w:t>
       </w:r>
     </w:p>
     <w:p>
@@ -3873,7 +4553,7 @@
           <w:shd w:fill="auto" w:val="clear"/>
           <w:lang w:val="en-US" w:eastAsia="zh-CN" w:bidi="hi-IN"/>
         </w:rPr>
-        <w:t>Nós oramos com mais fé, procuramos melhorar nossa sintonia com os amigos espirituais, ficamos atentos, alertas.</w:t>
+        <w:t>Nós oramos com mais fé, procuramos melhorar nossa sintonia com os amigos espirituais, ficamos alertas.</w:t>
       </w:r>
     </w:p>
     <w:p>
@@ -3983,7 +4663,67 @@
           <w:shd w:fill="auto" w:val="clear"/>
           <w:lang w:val="en-US" w:eastAsia="zh-CN" w:bidi="hi-IN"/>
         </w:rPr>
-        <w:t xml:space="preserve">O mar da vida se torna revolto e nossa embarcação fica à deriva. Nesse momento, o joio é semeado em nossa vida. </w:t>
+        <w:t>Em momentos assim</w:t>
+      </w:r>
+      <w:r>
+        <w:rPr>
+          <w:rFonts w:eastAsia="Times New Roman" w:cs="Times New Roman" w:ascii="Garamond" w:hAnsi="Garamond"/>
+          <w:color w:val="000000"/>
+          <w:kern w:val="0"/>
+          <w:sz w:val="36"/>
+          <w:szCs w:val="36"/>
+          <w:shd w:fill="auto" w:val="clear"/>
+          <w:lang w:val="en-US" w:eastAsia="zh-CN" w:bidi="hi-IN"/>
+        </w:rPr>
+        <w:t xml:space="preserve">, o joio </w:t>
+      </w:r>
+      <w:r>
+        <w:rPr>
+          <w:rFonts w:eastAsia="Times New Roman" w:cs="Times New Roman" w:ascii="Garamond" w:hAnsi="Garamond"/>
+          <w:color w:val="000000"/>
+          <w:kern w:val="0"/>
+          <w:sz w:val="36"/>
+          <w:szCs w:val="36"/>
+          <w:shd w:fill="auto" w:val="clear"/>
+          <w:lang w:val="en-US" w:eastAsia="zh-CN" w:bidi="hi-IN"/>
+        </w:rPr>
+        <w:t>encontra terreno em nossos corações</w:t>
+      </w:r>
+      <w:r>
+        <w:rPr>
+          <w:rFonts w:eastAsia="Times New Roman" w:cs="Times New Roman" w:ascii="Garamond" w:hAnsi="Garamond"/>
+          <w:color w:val="000000"/>
+          <w:kern w:val="0"/>
+          <w:sz w:val="36"/>
+          <w:szCs w:val="36"/>
+          <w:shd w:fill="auto" w:val="clear"/>
+          <w:lang w:val="en-US" w:eastAsia="zh-CN" w:bidi="hi-IN"/>
+        </w:rPr>
+        <w:t xml:space="preserve">. </w:t>
+      </w:r>
+      <w:r>
+        <w:rPr>
+          <w:rFonts w:eastAsia="Times New Roman" w:cs="Times New Roman" w:ascii="Garamond" w:hAnsi="Garamond"/>
+          <w:color w:val="000000"/>
+          <w:kern w:val="0"/>
+          <w:sz w:val="36"/>
+          <w:szCs w:val="36"/>
+          <w:shd w:fill="auto" w:val="clear"/>
+          <w:lang w:val="en-US" w:eastAsia="zh-CN" w:bidi="hi-IN"/>
+        </w:rPr>
+        <w:t>Então, o</w:t>
+      </w:r>
+      <w:r>
+        <w:rPr>
+          <w:rFonts w:eastAsia="Times New Roman" w:cs="Times New Roman" w:ascii="Garamond" w:hAnsi="Garamond"/>
+          <w:color w:val="000000"/>
+          <w:kern w:val="0"/>
+          <w:sz w:val="36"/>
+          <w:szCs w:val="36"/>
+          <w:shd w:fill="auto" w:val="clear"/>
+          <w:lang w:val="en-US" w:eastAsia="zh-CN" w:bidi="hi-IN"/>
+        </w:rPr>
+        <w:t xml:space="preserve"> mar da vida se torna revolto e nossa embarcação fica à deriva. </w:t>
       </w:r>
     </w:p>
     <w:p>
@@ -4064,7 +4804,207 @@
           <w:shd w:fill="auto" w:val="clear"/>
           <w:lang w:val="en-US" w:eastAsia="zh-CN" w:bidi="hi-IN"/>
         </w:rPr>
-        <w:t xml:space="preserve"> é ainda mais fácil de ser compreendida. Basta um único olhar mais apurado sobre a humanidade  para percebermos claramente que bilhões de pessoas em todo o mundo, sequer despertaram para a realidade da vida espiritual. </w:t>
+        <w:t xml:space="preserve"> é ainda mais fácil de ser compreendida. Basta um olhar </w:t>
+      </w:r>
+      <w:r>
+        <w:rPr>
+          <w:rFonts w:eastAsia="Times New Roman" w:cs="Times New Roman" w:ascii="Garamond" w:hAnsi="Garamond"/>
+          <w:color w:val="000000"/>
+          <w:kern w:val="0"/>
+          <w:sz w:val="36"/>
+          <w:szCs w:val="36"/>
+          <w:shd w:fill="auto" w:val="clear"/>
+          <w:lang w:val="en-US" w:eastAsia="zh-CN" w:bidi="hi-IN"/>
+        </w:rPr>
+        <w:t xml:space="preserve">um pouco </w:t>
+      </w:r>
+      <w:r>
+        <w:rPr>
+          <w:rFonts w:eastAsia="Times New Roman" w:cs="Times New Roman" w:ascii="Garamond" w:hAnsi="Garamond"/>
+          <w:color w:val="000000"/>
+          <w:kern w:val="0"/>
+          <w:sz w:val="36"/>
+          <w:szCs w:val="36"/>
+          <w:shd w:fill="auto" w:val="clear"/>
+          <w:lang w:val="en-US" w:eastAsia="zh-CN" w:bidi="hi-IN"/>
+        </w:rPr>
+        <w:t xml:space="preserve">mais apurado para percebermos claramente que bilhões de pessoas em todo o mundo, sequer despertaram para a realidade da vida espiritual. </w:t>
+      </w:r>
+    </w:p>
+    <w:p>
+      <w:pPr>
+        <w:pStyle w:val="Normal"/>
+        <w:jc w:val="both"/>
+        <w:rPr>
+          <w:sz w:val="36"/>
+          <w:szCs w:val="36"/>
+        </w:rPr>
+      </w:pPr>
+      <w:r>
+        <w:rPr>
+          <w:rFonts w:eastAsia="Times New Roman" w:cs="Times New Roman" w:ascii="Garamond" w:hAnsi="Garamond"/>
+          <w:color w:val="000000"/>
+          <w:kern w:val="0"/>
+          <w:sz w:val="36"/>
+          <w:szCs w:val="36"/>
+          <w:shd w:fill="auto" w:val="clear"/>
+          <w:lang w:val="en-US" w:eastAsia="zh-CN" w:bidi="hi-IN"/>
+        </w:rPr>
+        <w:t xml:space="preserve">Emmanuel, na obra </w:t>
+      </w:r>
+      <w:r>
+        <w:rPr>
+          <w:rFonts w:eastAsia="Times New Roman" w:cs="Times New Roman" w:ascii="Garamond" w:hAnsi="Garamond"/>
+          <w:i/>
+          <w:iCs/>
+          <w:color w:val="000000"/>
+          <w:kern w:val="0"/>
+          <w:sz w:val="36"/>
+          <w:szCs w:val="36"/>
+          <w:shd w:fill="auto" w:val="clear"/>
+          <w:lang w:val="en-US" w:eastAsia="zh-CN" w:bidi="hi-IN"/>
+        </w:rPr>
+        <w:t>A Caminho da Luz</w:t>
+      </w:r>
+      <w:r>
+        <w:rPr>
+          <w:rFonts w:eastAsia="Times New Roman" w:cs="Times New Roman" w:ascii="Garamond" w:hAnsi="Garamond"/>
+          <w:color w:val="000000"/>
+          <w:kern w:val="0"/>
+          <w:sz w:val="36"/>
+          <w:szCs w:val="36"/>
+          <w:shd w:fill="auto" w:val="clear"/>
+          <w:lang w:val="en-US" w:eastAsia="zh-CN" w:bidi="hi-IN"/>
+        </w:rPr>
+        <w:t xml:space="preserve">, no capítulo IX — </w:t>
+      </w:r>
+      <w:r>
+        <w:rPr>
+          <w:rFonts w:eastAsia="Times New Roman" w:cs="Times New Roman" w:ascii="Garamond" w:hAnsi="Garamond"/>
+          <w:i/>
+          <w:iCs/>
+          <w:color w:val="000000"/>
+          <w:kern w:val="0"/>
+          <w:sz w:val="36"/>
+          <w:szCs w:val="36"/>
+          <w:shd w:fill="auto" w:val="clear"/>
+          <w:lang w:val="en-US" w:eastAsia="zh-CN" w:bidi="hi-IN"/>
+        </w:rPr>
+        <w:t>As grandes religiões do passado</w:t>
+      </w:r>
+      <w:r>
+        <w:rPr>
+          <w:rFonts w:eastAsia="Times New Roman" w:cs="Times New Roman" w:ascii="Garamond" w:hAnsi="Garamond"/>
+          <w:color w:val="000000"/>
+          <w:kern w:val="0"/>
+          <w:sz w:val="36"/>
+          <w:szCs w:val="36"/>
+          <w:shd w:fill="auto" w:val="clear"/>
+          <w:lang w:val="en-US" w:eastAsia="zh-CN" w:bidi="hi-IN"/>
+        </w:rPr>
+        <w:t xml:space="preserve">, item </w:t>
+      </w:r>
+      <w:r>
+        <w:rPr>
+          <w:rFonts w:eastAsia="Times New Roman" w:cs="Times New Roman" w:ascii="Garamond" w:hAnsi="Garamond"/>
+          <w:i/>
+          <w:iCs/>
+          <w:color w:val="000000"/>
+          <w:kern w:val="0"/>
+          <w:sz w:val="36"/>
+          <w:szCs w:val="36"/>
+          <w:shd w:fill="auto" w:val="clear"/>
+          <w:lang w:val="en-US" w:eastAsia="zh-CN" w:bidi="hi-IN"/>
+        </w:rPr>
+        <w:t>A gênese das crenças religiosas</w:t>
+      </w:r>
+      <w:r>
+        <w:rPr>
+          <w:rFonts w:eastAsia="Times New Roman" w:cs="Times New Roman" w:ascii="Garamond" w:hAnsi="Garamond"/>
+          <w:color w:val="000000"/>
+          <w:kern w:val="0"/>
+          <w:sz w:val="36"/>
+          <w:szCs w:val="36"/>
+          <w:shd w:fill="auto" w:val="clear"/>
+          <w:lang w:val="en-US" w:eastAsia="zh-CN" w:bidi="hi-IN"/>
+        </w:rPr>
+        <w:t xml:space="preserve"> —, nos diz que todas as religiões do mundo têm sua origem no amor incondicional do Cristo.</w:t>
+      </w:r>
+    </w:p>
+    <w:p>
+      <w:pPr>
+        <w:pStyle w:val="Normal"/>
+        <w:jc w:val="both"/>
+        <w:rPr>
+          <w:sz w:val="36"/>
+          <w:szCs w:val="36"/>
+        </w:rPr>
+      </w:pPr>
+      <w:r>
+        <w:rPr>
+          <w:sz w:val="36"/>
+          <w:szCs w:val="36"/>
+        </w:rPr>
+      </w:r>
+    </w:p>
+    <w:p>
+      <w:pPr>
+        <w:pStyle w:val="Normal"/>
+        <w:jc w:val="both"/>
+        <w:rPr>
+          <w:sz w:val="36"/>
+          <w:szCs w:val="36"/>
+        </w:rPr>
+      </w:pPr>
+      <w:r>
+        <w:rPr>
+          <w:rFonts w:eastAsia="Times New Roman" w:cs="Times New Roman" w:ascii="Garamond" w:hAnsi="Garamond"/>
+          <w:color w:val="000000"/>
+          <w:kern w:val="0"/>
+          <w:sz w:val="36"/>
+          <w:szCs w:val="36"/>
+          <w:shd w:fill="auto" w:val="clear"/>
+          <w:lang w:val="en-US" w:eastAsia="zh-CN" w:bidi="hi-IN"/>
+        </w:rPr>
+        <w:t>Ele nos diz também que os grandes líderes religiosos e filosóficos da humanidade — como Buda, Lao-Tsé, Confúcio, Moisés e Maomé — exerceram suas missões junto aos seus povos sob o seu comando.</w:t>
+      </w:r>
+    </w:p>
+    <w:p>
+      <w:pPr>
+        <w:pStyle w:val="Normal"/>
+        <w:jc w:val="both"/>
+        <w:rPr>
+          <w:sz w:val="36"/>
+          <w:szCs w:val="36"/>
+        </w:rPr>
+      </w:pPr>
+      <w:r>
+        <w:rPr>
+          <w:sz w:val="36"/>
+          <w:szCs w:val="36"/>
+        </w:rPr>
+      </w:r>
+    </w:p>
+    <w:p>
+      <w:pPr>
+        <w:pStyle w:val="Normal"/>
+        <w:jc w:val="both"/>
+        <w:rPr>
+          <w:sz w:val="36"/>
+          <w:szCs w:val="36"/>
+        </w:rPr>
+      </w:pPr>
+      <w:r>
+        <w:rPr>
+          <w:rFonts w:eastAsia="Times New Roman" w:cs="Times New Roman" w:ascii="Garamond" w:hAnsi="Garamond"/>
+          <w:color w:val="000000"/>
+          <w:kern w:val="0"/>
+          <w:sz w:val="36"/>
+          <w:szCs w:val="36"/>
+          <w:shd w:fill="auto" w:val="clear"/>
+          <w:lang w:val="en-US" w:eastAsia="zh-CN" w:bidi="hi-IN"/>
+        </w:rPr>
+        <w:t>Portanto, não há povo ou civilização que não tenha recebido, direta ou indiretamente, esses ensinamentos.</w:t>
       </w:r>
     </w:p>
     <w:p>
@@ -4097,521 +5037,802 @@
     <w:p>
       <w:pPr>
         <w:pStyle w:val="Normal"/>
-        <w:jc w:val="both"/>
-        <w:rPr>
-          <w:sz w:val="36"/>
-          <w:szCs w:val="36"/>
-        </w:rPr>
-      </w:pPr>
-      <w:r>
-        <w:rPr>
-          <w:rFonts w:eastAsia="Times New Roman" w:cs="Times New Roman" w:ascii="Garamond" w:hAnsi="Garamond"/>
-          <w:color w:val="000000"/>
-          <w:kern w:val="0"/>
-          <w:sz w:val="36"/>
-          <w:szCs w:val="36"/>
-          <w:shd w:fill="auto" w:val="clear"/>
-          <w:lang w:val="en-US" w:eastAsia="zh-CN" w:bidi="hi-IN"/>
-        </w:rPr>
-        <w:t xml:space="preserve">Emmanuel, na obra </w:t>
-      </w:r>
-      <w:r>
-        <w:rPr>
-          <w:rFonts w:eastAsia="Times New Roman" w:cs="Times New Roman" w:ascii="Garamond" w:hAnsi="Garamond"/>
+        <w:ind w:left="0" w:hanging="0"/>
+        <w:jc w:val="both"/>
+        <w:rPr/>
+      </w:pPr>
+      <w:r>
+        <w:rPr>
+          <w:rFonts w:eastAsia="Times New Roman" w:cs="Times New Roman" w:ascii="Garamond" w:hAnsi="Garamond"/>
+          <w:color w:val="000000"/>
+          <w:kern w:val="0"/>
+          <w:sz w:val="36"/>
+          <w:szCs w:val="36"/>
+          <w:shd w:fill="auto" w:val="clear"/>
+          <w:lang w:val="en-US" w:eastAsia="zh-CN" w:bidi="hi-IN"/>
+        </w:rPr>
+        <w:t>Apesar disso, uma enorme parcela da humanidade ainda vive voltada exclusivamente para as questões materiais e terrenas. Nem mesmo a dor e o sofrimento têm sido suficientes para o despertar dessas pessoas.</w:t>
+      </w:r>
+    </w:p>
+    <w:p>
+      <w:pPr>
+        <w:pStyle w:val="Normal"/>
+        <w:ind w:left="0" w:hanging="0"/>
+        <w:jc w:val="both"/>
+        <w:rPr>
+          <w:rFonts w:ascii="Garamond" w:hAnsi="Garamond" w:eastAsia="Times New Roman" w:cs="Times New Roman"/>
+          <w:color w:val="000000"/>
+          <w:kern w:val="0"/>
+          <w:sz w:val="36"/>
+          <w:szCs w:val="36"/>
+          <w:shd w:fill="auto" w:val="clear"/>
+          <w:lang w:val="en-US" w:eastAsia="zh-CN" w:bidi="hi-IN"/>
+        </w:rPr>
+      </w:pPr>
+      <w:r>
+        <w:rPr>
+          <w:rFonts w:eastAsia="Times New Roman" w:cs="Times New Roman" w:ascii="Garamond" w:hAnsi="Garamond"/>
+          <w:color w:val="000000"/>
+          <w:kern w:val="0"/>
+          <w:sz w:val="36"/>
+          <w:szCs w:val="36"/>
+          <w:shd w:fill="auto" w:val="clear"/>
+          <w:lang w:val="en-US" w:eastAsia="zh-CN" w:bidi="hi-IN"/>
+        </w:rPr>
+      </w:r>
+    </w:p>
+    <w:p>
+      <w:pPr>
+        <w:pStyle w:val="Normal"/>
+        <w:ind w:left="0" w:hanging="0"/>
+        <w:jc w:val="both"/>
+        <w:rPr/>
+      </w:pPr>
+      <w:r>
+        <w:rPr>
+          <w:rFonts w:eastAsia="Times New Roman" w:cs="Times New Roman" w:ascii="Garamond" w:hAnsi="Garamond"/>
+          <w:color w:val="000000"/>
+          <w:kern w:val="0"/>
+          <w:sz w:val="36"/>
+          <w:szCs w:val="36"/>
+          <w:shd w:fill="auto" w:val="clear"/>
+          <w:lang w:val="en-US" w:eastAsia="zh-CN" w:bidi="hi-IN"/>
+        </w:rPr>
+        <w:t>Temos um exemplo muito claro disso na pandemia. Foi um período de muita tristeza e medo para a população mundial. Ali, deveríamos ter aprendido a valorizar a liberdade, o contato com amigos, familiares, vizinhos e colegas de trabalho; deveríamos ter aprendido a ser mais solidários, empáticos e caridosos.</w:t>
+      </w:r>
+    </w:p>
+    <w:p>
+      <w:pPr>
+        <w:pStyle w:val="Normal"/>
+        <w:ind w:left="0" w:hanging="0"/>
+        <w:jc w:val="both"/>
+        <w:rPr>
+          <w:rFonts w:ascii="Garamond" w:hAnsi="Garamond" w:eastAsia="Times New Roman" w:cs="Times New Roman"/>
+          <w:color w:val="000000"/>
+          <w:kern w:val="0"/>
+          <w:sz w:val="36"/>
+          <w:szCs w:val="36"/>
+          <w:shd w:fill="auto" w:val="clear"/>
+          <w:lang w:val="en-US" w:eastAsia="zh-CN" w:bidi="hi-IN"/>
+        </w:rPr>
+      </w:pPr>
+      <w:r>
+        <w:rPr>
+          <w:rFonts w:eastAsia="Times New Roman" w:cs="Times New Roman" w:ascii="Garamond" w:hAnsi="Garamond"/>
+          <w:color w:val="000000"/>
+          <w:kern w:val="0"/>
+          <w:sz w:val="36"/>
+          <w:szCs w:val="36"/>
+          <w:shd w:fill="auto" w:val="clear"/>
+          <w:lang w:val="en-US" w:eastAsia="zh-CN" w:bidi="hi-IN"/>
+        </w:rPr>
+      </w:r>
+    </w:p>
+    <w:p>
+      <w:pPr>
+        <w:pStyle w:val="Normal"/>
+        <w:ind w:left="0" w:hanging="0"/>
+        <w:jc w:val="both"/>
+        <w:rPr/>
+      </w:pPr>
+      <w:r>
+        <w:rPr>
+          <w:rFonts w:eastAsia="Times New Roman" w:cs="Times New Roman" w:ascii="Garamond" w:hAnsi="Garamond"/>
+          <w:color w:val="000000"/>
+          <w:kern w:val="0"/>
+          <w:sz w:val="36"/>
+          <w:szCs w:val="36"/>
+          <w:shd w:fill="auto" w:val="clear"/>
+          <w:lang w:val="en-US" w:eastAsia="zh-CN" w:bidi="hi-IN"/>
+        </w:rPr>
+        <w:t>Mas, tão logo a pandemia terminou, o que aconteceu? As pessoas voltaram ao seu antigo modo de vida, ignorando as dores e dificuldades alheias e buscando freneticamente a satisfação dos prazeres materiais, como quem deseja recuperar o tempo perdido.</w:t>
+      </w:r>
+    </w:p>
+    <w:p>
+      <w:pPr>
+        <w:pStyle w:val="Normal"/>
+        <w:jc w:val="both"/>
+        <w:rPr>
+          <w:rFonts w:ascii="Garamond" w:hAnsi="Garamond" w:eastAsia="Times New Roman" w:cs="Times New Roman"/>
+          <w:color w:val="000000"/>
+          <w:kern w:val="0"/>
+          <w:sz w:val="36"/>
+          <w:szCs w:val="36"/>
+          <w:shd w:fill="auto" w:val="clear"/>
+          <w:lang w:val="en-US" w:eastAsia="zh-CN" w:bidi="hi-IN"/>
+        </w:rPr>
+      </w:pPr>
+      <w:r>
+        <w:rPr>
+          <w:rFonts w:eastAsia="Times New Roman" w:cs="Times New Roman" w:ascii="Garamond" w:hAnsi="Garamond"/>
+          <w:color w:val="000000"/>
+          <w:kern w:val="0"/>
+          <w:sz w:val="36"/>
+          <w:szCs w:val="36"/>
+          <w:shd w:fill="auto" w:val="clear"/>
+          <w:lang w:val="en-US" w:eastAsia="zh-CN" w:bidi="hi-IN"/>
+        </w:rPr>
+      </w:r>
+    </w:p>
+    <w:p>
+      <w:pPr>
+        <w:pStyle w:val="Normal"/>
+        <w:jc w:val="both"/>
+        <w:rPr>
+          <w:rFonts w:ascii="Garamond" w:hAnsi="Garamond" w:eastAsia="Times New Roman" w:cs="Times New Roman"/>
+          <w:color w:val="000000"/>
+          <w:kern w:val="0"/>
+          <w:sz w:val="36"/>
+          <w:szCs w:val="36"/>
+          <w:shd w:fill="auto" w:val="clear"/>
+          <w:lang w:val="en-US" w:eastAsia="zh-CN" w:bidi="hi-IN"/>
+        </w:rPr>
+      </w:pPr>
+      <w:r>
+        <w:rPr>
+          <w:rFonts w:eastAsia="Times New Roman" w:cs="Times New Roman" w:ascii="Garamond" w:hAnsi="Garamond"/>
+          <w:color w:val="000000"/>
+          <w:kern w:val="0"/>
+          <w:sz w:val="36"/>
+          <w:szCs w:val="36"/>
+          <w:shd w:fill="auto" w:val="clear"/>
+          <w:lang w:val="en-US" w:eastAsia="zh-CN" w:bidi="hi-IN"/>
+        </w:rPr>
+        <w:t>A maioria das pessoas saiu da pandemia sem aprender nada, sem despertar para a vida espiritual.</w:t>
+      </w:r>
+    </w:p>
+    <w:p>
+      <w:pPr>
+        <w:pStyle w:val="Normal"/>
+        <w:jc w:val="both"/>
+        <w:rPr>
+          <w:color w:val="FC5C00"/>
+        </w:rPr>
+      </w:pPr>
+      <w:r>
+        <w:rPr>
+          <w:color w:val="FC5C00"/>
+        </w:rPr>
+      </w:r>
+    </w:p>
+    <w:p>
+      <w:pPr>
+        <w:pStyle w:val="Normal"/>
+        <w:jc w:val="both"/>
+        <w:rPr>
+          <w:rFonts w:ascii="Garamond" w:hAnsi="Garamond" w:eastAsia="Times New Roman" w:cs="Times New Roman"/>
+          <w:color w:val="000000"/>
+          <w:kern w:val="0"/>
+          <w:sz w:val="36"/>
+          <w:szCs w:val="36"/>
+          <w:shd w:fill="auto" w:val="clear"/>
+          <w:lang w:val="en-US" w:eastAsia="zh-CN" w:bidi="hi-IN"/>
+        </w:rPr>
+      </w:pPr>
+      <w:r>
+        <w:rPr>
+          <w:rFonts w:eastAsia="Times New Roman" w:cs="Times New Roman" w:ascii="Garamond" w:hAnsi="Garamond"/>
+          <w:color w:val="000000"/>
+          <w:kern w:val="0"/>
+          <w:sz w:val="36"/>
+          <w:szCs w:val="36"/>
+          <w:shd w:fill="auto" w:val="clear"/>
+          <w:lang w:val="en-US" w:eastAsia="zh-CN" w:bidi="hi-IN"/>
+        </w:rPr>
+        <w:t>O sono da invigilância é terreno fértil para o surgimento do joio. Por isso Jesus nos recomendou o orai e vigiai.</w:t>
+      </w:r>
+    </w:p>
+    <w:p>
+      <w:pPr>
+        <w:pStyle w:val="Normal"/>
+        <w:jc w:val="both"/>
+        <w:rPr>
+          <w:rFonts w:ascii="Garamond" w:hAnsi="Garamond" w:eastAsia="Times New Roman" w:cs="Times New Roman"/>
+          <w:color w:val="000000"/>
+          <w:kern w:val="0"/>
+          <w:sz w:val="36"/>
+          <w:szCs w:val="36"/>
+          <w:shd w:fill="auto" w:val="clear"/>
+          <w:lang w:val="en-US" w:eastAsia="zh-CN" w:bidi="hi-IN"/>
+        </w:rPr>
+      </w:pPr>
+      <w:r>
+        <w:rPr>
+          <w:rFonts w:eastAsia="Times New Roman" w:cs="Times New Roman" w:ascii="Garamond" w:hAnsi="Garamond"/>
+          <w:color w:val="000000"/>
+          <w:kern w:val="0"/>
+          <w:sz w:val="36"/>
+          <w:szCs w:val="36"/>
+          <w:shd w:fill="auto" w:val="clear"/>
+          <w:lang w:val="en-US" w:eastAsia="zh-CN" w:bidi="hi-IN"/>
+        </w:rPr>
+      </w:r>
+    </w:p>
+    <w:p>
+      <w:pPr>
+        <w:pStyle w:val="Normal"/>
+        <w:jc w:val="both"/>
+        <w:rPr>
+          <w:rFonts w:ascii="Garamond" w:hAnsi="Garamond" w:eastAsia="Times New Roman" w:cs="Times New Roman"/>
+          <w:color w:val="000000"/>
+          <w:kern w:val="0"/>
+          <w:sz w:val="36"/>
+          <w:szCs w:val="36"/>
+          <w:shd w:fill="auto" w:val="clear"/>
+          <w:lang w:val="en-US" w:eastAsia="zh-CN" w:bidi="hi-IN"/>
+        </w:rPr>
+      </w:pPr>
+      <w:r>
+        <w:rPr>
+          <w:rFonts w:eastAsia="Times New Roman" w:cs="Times New Roman" w:ascii="Garamond" w:hAnsi="Garamond"/>
+          <w:b/>
+          <w:bCs/>
           <w:i/>
           <w:iCs/>
-          <w:color w:val="000000"/>
-          <w:kern w:val="0"/>
-          <w:sz w:val="36"/>
-          <w:szCs w:val="36"/>
-          <w:shd w:fill="auto" w:val="clear"/>
-          <w:lang w:val="en-US" w:eastAsia="zh-CN" w:bidi="hi-IN"/>
-        </w:rPr>
-        <w:t>A Caminho da Luz</w:t>
-      </w:r>
-      <w:r>
-        <w:rPr>
-          <w:rFonts w:eastAsia="Times New Roman" w:cs="Times New Roman" w:ascii="Garamond" w:hAnsi="Garamond"/>
-          <w:color w:val="000000"/>
-          <w:kern w:val="0"/>
-          <w:sz w:val="36"/>
-          <w:szCs w:val="36"/>
-          <w:shd w:fill="auto" w:val="clear"/>
-          <w:lang w:val="en-US" w:eastAsia="zh-CN" w:bidi="hi-IN"/>
-        </w:rPr>
-        <w:t xml:space="preserve">, no capítulo IX — </w:t>
-      </w:r>
-      <w:r>
-        <w:rPr>
-          <w:rFonts w:eastAsia="Times New Roman" w:cs="Times New Roman" w:ascii="Garamond" w:hAnsi="Garamond"/>
+          <w:color w:val="FC5C00"/>
+          <w:kern w:val="0"/>
+          <w:sz w:val="36"/>
+          <w:szCs w:val="36"/>
+          <w:shd w:fill="auto" w:val="clear"/>
+          <w:lang w:val="en-US" w:eastAsia="zh-CN" w:bidi="hi-IN"/>
+        </w:rPr>
+        <w:t>Veio o seu inimigo</w:t>
+      </w:r>
+      <w:r>
+        <w:rPr>
+          <w:rFonts w:eastAsia="Times New Roman" w:cs="Times New Roman" w:ascii="Garamond" w:hAnsi="Garamond"/>
+          <w:color w:val="000000"/>
+          <w:kern w:val="0"/>
+          <w:sz w:val="36"/>
+          <w:szCs w:val="36"/>
+          <w:shd w:fill="auto" w:val="clear"/>
+          <w:lang w:val="en-US" w:eastAsia="zh-CN" w:bidi="hi-IN"/>
+        </w:rPr>
+        <w:t xml:space="preserve">: </w:t>
+      </w:r>
+      <w:r>
+        <w:rPr>
+          <w:rFonts w:eastAsia="Times New Roman" w:cs="Times New Roman" w:ascii="Garamond" w:hAnsi="Garamond"/>
+          <w:color w:val="000000"/>
+          <w:kern w:val="0"/>
+          <w:sz w:val="36"/>
+          <w:szCs w:val="36"/>
+          <w:shd w:fill="auto" w:val="clear"/>
+          <w:lang w:val="en-US" w:eastAsia="zh-CN" w:bidi="hi-IN"/>
+        </w:rPr>
+        <w:t>quando falamos em inimigos, a primeira ideia que nos vem é de uma pessoa que não gosta de nós e que, tendo oportunidade, irá nos prejudicar.</w:t>
+      </w:r>
+    </w:p>
+    <w:p>
+      <w:pPr>
+        <w:pStyle w:val="Normal"/>
+        <w:jc w:val="both"/>
+        <w:rPr>
+          <w:rFonts w:ascii="Garamond" w:hAnsi="Garamond" w:eastAsia="Times New Roman" w:cs="Times New Roman"/>
+          <w:color w:val="000000"/>
+          <w:kern w:val="0"/>
+          <w:sz w:val="36"/>
+          <w:szCs w:val="36"/>
+          <w:shd w:fill="auto" w:val="clear"/>
+          <w:lang w:val="en-US" w:eastAsia="zh-CN" w:bidi="hi-IN"/>
+        </w:rPr>
+      </w:pPr>
+      <w:r>
+        <w:rPr/>
+      </w:r>
+    </w:p>
+    <w:p>
+      <w:pPr>
+        <w:pStyle w:val="Normal"/>
+        <w:jc w:val="both"/>
+        <w:rPr>
+          <w:rFonts w:ascii="Garamond" w:hAnsi="Garamond" w:eastAsia="Times New Roman" w:cs="Times New Roman"/>
+          <w:color w:val="000000"/>
+          <w:kern w:val="0"/>
+          <w:sz w:val="36"/>
+          <w:szCs w:val="36"/>
+          <w:shd w:fill="auto" w:val="clear"/>
+          <w:lang w:val="en-US" w:eastAsia="zh-CN" w:bidi="hi-IN"/>
+        </w:rPr>
+      </w:pPr>
+      <w:r>
+        <w:rPr>
+          <w:rFonts w:eastAsia="Times New Roman" w:cs="Times New Roman" w:ascii="Garamond" w:hAnsi="Garamond"/>
+          <w:color w:val="000000"/>
+          <w:kern w:val="0"/>
+          <w:sz w:val="36"/>
+          <w:szCs w:val="36"/>
+          <w:shd w:fill="auto" w:val="clear"/>
+          <w:lang w:val="en-US" w:eastAsia="zh-CN" w:bidi="hi-IN"/>
+        </w:rPr>
+        <w:t xml:space="preserve">Contudo, precisamos compreender que os vícios e as paixões que carregamos, também são nossos inimigos. Orgulho, egoísmo, cólera, intolerância, vaidade, entre outros, </w:t>
+      </w:r>
+      <w:r>
+        <w:rPr>
+          <w:rFonts w:eastAsia="Times New Roman" w:cs="Times New Roman" w:ascii="Garamond" w:hAnsi="Garamond"/>
+          <w:color w:val="000000"/>
+          <w:kern w:val="0"/>
+          <w:sz w:val="36"/>
+          <w:szCs w:val="36"/>
+          <w:shd w:fill="auto" w:val="clear"/>
+          <w:lang w:val="en-US" w:eastAsia="zh-CN" w:bidi="hi-IN"/>
+        </w:rPr>
+        <w:t xml:space="preserve">também </w:t>
+      </w:r>
+      <w:r>
+        <w:rPr>
+          <w:rFonts w:eastAsia="Times New Roman" w:cs="Times New Roman" w:ascii="Garamond" w:hAnsi="Garamond"/>
+          <w:color w:val="000000"/>
+          <w:kern w:val="0"/>
+          <w:sz w:val="36"/>
+          <w:szCs w:val="36"/>
+          <w:shd w:fill="auto" w:val="clear"/>
+          <w:lang w:val="en-US" w:eastAsia="zh-CN" w:bidi="hi-IN"/>
+        </w:rPr>
+        <w:t>são nossos inimigos</w:t>
+      </w:r>
+      <w:r>
+        <w:rPr>
+          <w:rFonts w:eastAsia="Times New Roman" w:cs="Times New Roman" w:ascii="Garamond" w:hAnsi="Garamond"/>
+          <w:color w:val="000000"/>
+          <w:kern w:val="0"/>
+          <w:sz w:val="36"/>
+          <w:szCs w:val="36"/>
+          <w:shd w:fill="auto" w:val="clear"/>
+          <w:lang w:val="en-US" w:eastAsia="zh-CN" w:bidi="hi-IN"/>
+        </w:rPr>
+        <w:t>, e são os</w:t>
+      </w:r>
+      <w:r>
+        <w:rPr>
+          <w:rFonts w:eastAsia="Times New Roman" w:cs="Times New Roman" w:ascii="Garamond" w:hAnsi="Garamond"/>
+          <w:color w:val="000000"/>
+          <w:kern w:val="0"/>
+          <w:sz w:val="36"/>
+          <w:szCs w:val="36"/>
+          <w:shd w:fill="auto" w:val="clear"/>
+          <w:lang w:val="en-US" w:eastAsia="zh-CN" w:bidi="hi-IN"/>
+        </w:rPr>
+        <w:t xml:space="preserve"> mais perigosos porque nos acompanham 24 horas por dia.</w:t>
+      </w:r>
+    </w:p>
+    <w:p>
+      <w:pPr>
+        <w:pStyle w:val="Normal"/>
+        <w:jc w:val="both"/>
+        <w:rPr>
+          <w:rFonts w:ascii="Garamond" w:hAnsi="Garamond" w:eastAsia="Times New Roman" w:cs="Times New Roman"/>
+          <w:color w:val="000000"/>
+          <w:kern w:val="0"/>
+          <w:sz w:val="36"/>
+          <w:szCs w:val="36"/>
+          <w:shd w:fill="auto" w:val="clear"/>
+          <w:lang w:val="en-US" w:eastAsia="zh-CN" w:bidi="hi-IN"/>
+        </w:rPr>
+      </w:pPr>
+      <w:r>
+        <w:rPr/>
+      </w:r>
+    </w:p>
+    <w:p>
+      <w:pPr>
+        <w:pStyle w:val="Normal"/>
+        <w:jc w:val="both"/>
+        <w:rPr>
+          <w:rFonts w:ascii="Garamond" w:hAnsi="Garamond" w:eastAsia="Times New Roman" w:cs="Times New Roman"/>
+          <w:color w:val="000000"/>
+          <w:kern w:val="0"/>
+          <w:sz w:val="36"/>
+          <w:szCs w:val="36"/>
+          <w:shd w:fill="auto" w:val="clear"/>
+          <w:lang w:val="en-US" w:eastAsia="zh-CN" w:bidi="hi-IN"/>
+        </w:rPr>
+      </w:pPr>
+      <w:r>
+        <w:rPr>
+          <w:rFonts w:eastAsia="Times New Roman" w:cs="Times New Roman" w:ascii="Garamond" w:hAnsi="Garamond"/>
+          <w:color w:val="000000"/>
+          <w:kern w:val="0"/>
+          <w:sz w:val="36"/>
+          <w:szCs w:val="36"/>
+          <w:shd w:fill="auto" w:val="clear"/>
+          <w:lang w:val="en-US" w:eastAsia="zh-CN" w:bidi="hi-IN"/>
+        </w:rPr>
+        <w:t>Entretanto, são os inimigos que nos permitem avaliar o nosso nível de progresso: quanto mais formos capazes de resistir a eles, mais evoluídos estaremos.</w:t>
+      </w:r>
+    </w:p>
+    <w:p>
+      <w:pPr>
+        <w:pStyle w:val="Normal"/>
+        <w:jc w:val="both"/>
+        <w:rPr>
+          <w:rFonts w:ascii="Garamond" w:hAnsi="Garamond" w:eastAsia="Times New Roman" w:cs="Times New Roman"/>
+          <w:color w:val="000000"/>
+          <w:kern w:val="0"/>
+          <w:sz w:val="36"/>
+          <w:szCs w:val="36"/>
+          <w:shd w:fill="auto" w:val="clear"/>
+          <w:lang w:val="en-US" w:eastAsia="zh-CN" w:bidi="hi-IN"/>
+        </w:rPr>
+      </w:pPr>
+      <w:r>
+        <w:rPr/>
+      </w:r>
+    </w:p>
+    <w:p>
+      <w:pPr>
+        <w:pStyle w:val="Normal"/>
+        <w:jc w:val="both"/>
+        <w:rPr>
+          <w:rFonts w:ascii="Garamond" w:hAnsi="Garamond" w:eastAsia="Times New Roman" w:cs="Times New Roman"/>
+          <w:color w:val="000000"/>
+          <w:kern w:val="0"/>
+          <w:sz w:val="36"/>
+          <w:szCs w:val="36"/>
+          <w:shd w:fill="auto" w:val="clear"/>
+          <w:lang w:val="en-US" w:eastAsia="zh-CN" w:bidi="hi-IN"/>
+        </w:rPr>
+      </w:pPr>
+      <w:r>
+        <w:rPr>
+          <w:rFonts w:eastAsia="Times New Roman" w:cs="Times New Roman" w:ascii="Garamond" w:hAnsi="Garamond"/>
+          <w:color w:val="000000"/>
+          <w:kern w:val="0"/>
+          <w:sz w:val="36"/>
+          <w:szCs w:val="36"/>
+          <w:shd w:fill="auto" w:val="clear"/>
+          <w:lang w:val="en-US" w:eastAsia="zh-CN" w:bidi="hi-IN"/>
+        </w:rPr>
+        <w:t>Para os propósitos do nosso estudo de hoje, devemos entender que a invigilância é sempre uma porta aberta para que o inimigo - seja interno, seja externo -, encontre caminho livre para semear o joio junto ao trigo que já conseguimos cultivar em nossos corações.</w:t>
+      </w:r>
+    </w:p>
+    <w:p>
+      <w:pPr>
+        <w:pStyle w:val="Normal"/>
+        <w:jc w:val="both"/>
+        <w:rPr>
+          <w:rFonts w:ascii="Garamond" w:hAnsi="Garamond" w:eastAsia="Times New Roman" w:cs="Times New Roman"/>
+          <w:color w:val="000000"/>
+          <w:kern w:val="0"/>
+          <w:sz w:val="36"/>
+          <w:szCs w:val="36"/>
+          <w:shd w:fill="auto" w:val="clear"/>
+          <w:lang w:val="en-US" w:eastAsia="zh-CN" w:bidi="hi-IN"/>
+        </w:rPr>
+      </w:pPr>
+      <w:r>
+        <w:rPr/>
+      </w:r>
+    </w:p>
+    <w:p>
+      <w:pPr>
+        <w:pStyle w:val="Normal"/>
+        <w:jc w:val="both"/>
+        <w:rPr>
+          <w:rFonts w:ascii="Garamond" w:hAnsi="Garamond" w:eastAsia="Times New Roman" w:cs="Times New Roman"/>
+          <w:color w:val="000000"/>
+          <w:kern w:val="0"/>
+          <w:sz w:val="36"/>
+          <w:szCs w:val="36"/>
+          <w:shd w:fill="auto" w:val="clear"/>
+          <w:lang w:val="en-US" w:eastAsia="zh-CN" w:bidi="hi-IN"/>
+        </w:rPr>
+      </w:pPr>
+      <w:r>
+        <w:rPr>
+          <w:rFonts w:eastAsia="Times New Roman" w:cs="Times New Roman" w:ascii="Garamond" w:hAnsi="Garamond"/>
+          <w:b/>
+          <w:bCs/>
           <w:i/>
           <w:iCs/>
-          <w:color w:val="000000"/>
-          <w:kern w:val="0"/>
-          <w:sz w:val="36"/>
-          <w:szCs w:val="36"/>
-          <w:shd w:fill="auto" w:val="clear"/>
-          <w:lang w:val="en-US" w:eastAsia="zh-CN" w:bidi="hi-IN"/>
-        </w:rPr>
-        <w:t>As grandes religiões do passado</w:t>
-      </w:r>
-      <w:r>
-        <w:rPr>
-          <w:rFonts w:eastAsia="Times New Roman" w:cs="Times New Roman" w:ascii="Garamond" w:hAnsi="Garamond"/>
-          <w:color w:val="000000"/>
-          <w:kern w:val="0"/>
-          <w:sz w:val="36"/>
-          <w:szCs w:val="36"/>
-          <w:shd w:fill="auto" w:val="clear"/>
-          <w:lang w:val="en-US" w:eastAsia="zh-CN" w:bidi="hi-IN"/>
-        </w:rPr>
-        <w:t xml:space="preserve">, item </w:t>
-      </w:r>
-      <w:r>
-        <w:rPr>
-          <w:rFonts w:eastAsia="Times New Roman" w:cs="Times New Roman" w:ascii="Garamond" w:hAnsi="Garamond"/>
+          <w:color w:val="FC5C00"/>
+          <w:kern w:val="0"/>
+          <w:sz w:val="36"/>
+          <w:szCs w:val="36"/>
+          <w:shd w:fill="auto" w:val="clear"/>
+          <w:lang w:val="en-US" w:eastAsia="zh-CN" w:bidi="hi-IN"/>
+        </w:rPr>
+        <w:t>E retirou-se</w:t>
+      </w:r>
+      <w:r>
+        <w:rPr>
+          <w:rFonts w:eastAsia="Times New Roman" w:cs="Times New Roman" w:ascii="Garamond" w:hAnsi="Garamond"/>
+          <w:color w:val="000000"/>
+          <w:kern w:val="0"/>
+          <w:sz w:val="36"/>
+          <w:szCs w:val="36"/>
+          <w:shd w:fill="auto" w:val="clear"/>
+          <w:lang w:val="en-US" w:eastAsia="zh-CN" w:bidi="hi-IN"/>
+        </w:rPr>
+        <w:t>. Existe um ensinamento sutil, porém, importantíssimo aqui. Na parábola, o inimigo não semeou o joio em meio ao trigo e permaneceu lá, acompanhando o desenvolvimento da erva daninha. Ele foi embora.</w:t>
+      </w:r>
+    </w:p>
+    <w:p>
+      <w:pPr>
+        <w:pStyle w:val="Normal"/>
+        <w:jc w:val="both"/>
+        <w:rPr>
+          <w:rFonts w:ascii="Garamond" w:hAnsi="Garamond" w:eastAsia="Times New Roman" w:cs="Times New Roman"/>
+          <w:color w:val="000000"/>
+          <w:kern w:val="0"/>
+          <w:sz w:val="36"/>
+          <w:szCs w:val="36"/>
+          <w:shd w:fill="auto" w:val="clear"/>
+          <w:lang w:val="en-US" w:eastAsia="zh-CN" w:bidi="hi-IN"/>
+        </w:rPr>
+      </w:pPr>
+      <w:r>
+        <w:rPr/>
+      </w:r>
+    </w:p>
+    <w:p>
+      <w:pPr>
+        <w:pStyle w:val="Normal"/>
+        <w:jc w:val="both"/>
+        <w:rPr>
+          <w:rFonts w:ascii="Garamond" w:hAnsi="Garamond" w:eastAsia="Times New Roman" w:cs="Times New Roman"/>
+          <w:color w:val="000000"/>
+          <w:kern w:val="0"/>
+          <w:sz w:val="36"/>
+          <w:szCs w:val="36"/>
+          <w:shd w:fill="auto" w:val="clear"/>
+          <w:lang w:val="en-US" w:eastAsia="zh-CN" w:bidi="hi-IN"/>
+        </w:rPr>
+      </w:pPr>
+      <w:r>
+        <w:rPr>
+          <w:rFonts w:eastAsia="Times New Roman" w:cs="Times New Roman" w:ascii="Garamond" w:hAnsi="Garamond"/>
+          <w:color w:val="000000"/>
+          <w:kern w:val="0"/>
+          <w:sz w:val="36"/>
+          <w:szCs w:val="36"/>
+          <w:shd w:fill="auto" w:val="clear"/>
+          <w:lang w:val="en-US" w:eastAsia="zh-CN" w:bidi="hi-IN"/>
+        </w:rPr>
+        <w:t>Isso significa que, por mais que tenhamos contato com o mal, por mais que o joio seja lançado no solo de nossos corações, a decisão final de cultivá-lo é sempre nossa. Nós decidimos se deixamos a semente do joio progredir ou se vamos deixá-la secar [ Parei aqui em 07/06/2026 ]</w:t>
+      </w:r>
+    </w:p>
+    <w:p>
+      <w:pPr>
+        <w:pStyle w:val="Normal"/>
+        <w:jc w:val="both"/>
+        <w:rPr>
+          <w:rFonts w:ascii="Garamond" w:hAnsi="Garamond" w:eastAsia="Times New Roman" w:cs="Times New Roman"/>
+          <w:color w:val="000000"/>
+          <w:kern w:val="0"/>
+          <w:sz w:val="36"/>
+          <w:szCs w:val="36"/>
+          <w:shd w:fill="auto" w:val="clear"/>
+          <w:lang w:val="en-US" w:eastAsia="zh-CN" w:bidi="hi-IN"/>
+        </w:rPr>
+      </w:pPr>
+      <w:r>
+        <w:rPr>
+          <w:rFonts w:eastAsia="Times New Roman" w:cs="Times New Roman" w:ascii="Garamond" w:hAnsi="Garamond"/>
+          <w:color w:val="000000"/>
+          <w:kern w:val="0"/>
+          <w:sz w:val="36"/>
+          <w:szCs w:val="36"/>
+          <w:shd w:fill="auto" w:val="clear"/>
+          <w:lang w:val="en-US" w:eastAsia="zh-CN" w:bidi="hi-IN"/>
+        </w:rPr>
+      </w:r>
+      <w:r>
+        <w:br w:type="page"/>
+      </w:r>
+    </w:p>
+    <w:p>
+      <w:pPr>
+        <w:pStyle w:val="Normal"/>
+        <w:jc w:val="both"/>
+        <w:rPr>
+          <w:color w:val="FC5C00"/>
+        </w:rPr>
+      </w:pPr>
+      <w:r>
+        <w:rPr>
+          <w:rFonts w:eastAsia="Times New Roman" w:cs="Times New Roman" w:ascii="Garamond" w:hAnsi="Garamond"/>
+          <w:color w:val="FC5C00"/>
+          <w:kern w:val="0"/>
+          <w:sz w:val="36"/>
+          <w:szCs w:val="36"/>
+          <w:shd w:fill="auto" w:val="clear"/>
+          <w:lang w:val="en-US" w:eastAsia="zh-CN" w:bidi="hi-IN"/>
+        </w:rPr>
+        <w:t xml:space="preserve">[ </w:t>
+      </w:r>
+      <w:r>
+        <w:rPr>
+          <w:rFonts w:eastAsia="Times New Roman" w:cs="Times New Roman" w:ascii="Garamond" w:hAnsi="Garamond"/>
+          <w:color w:val="FC5C00"/>
+          <w:kern w:val="0"/>
+          <w:sz w:val="36"/>
+          <w:szCs w:val="36"/>
+          <w:shd w:fill="auto" w:val="clear"/>
+          <w:lang w:val="en-US" w:eastAsia="zh-CN" w:bidi="hi-IN"/>
+        </w:rPr>
+        <w:t>Conclusão</w:t>
+      </w:r>
+      <w:r>
+        <w:rPr>
+          <w:rFonts w:eastAsia="Times New Roman" w:cs="Times New Roman" w:ascii="Garamond" w:hAnsi="Garamond"/>
+          <w:color w:val="FC5C00"/>
+          <w:kern w:val="0"/>
+          <w:sz w:val="36"/>
+          <w:szCs w:val="36"/>
+          <w:shd w:fill="auto" w:val="clear"/>
+          <w:lang w:val="en-US" w:eastAsia="zh-CN" w:bidi="hi-IN"/>
+        </w:rPr>
+        <w:t xml:space="preserve"> ]</w:t>
+      </w:r>
+    </w:p>
+    <w:p>
+      <w:pPr>
+        <w:pStyle w:val="Normal"/>
+        <w:jc w:val="both"/>
+        <w:rPr>
+          <w:color w:val="auto"/>
+        </w:rPr>
+      </w:pPr>
+      <w:r>
+        <w:rPr/>
+      </w:r>
+    </w:p>
+    <w:p>
+      <w:pPr>
+        <w:pStyle w:val="Normal"/>
+        <w:jc w:val="both"/>
+        <w:rPr>
+          <w:color w:val="auto"/>
+        </w:rPr>
+      </w:pPr>
+      <w:r>
+        <w:rPr>
+          <w:rFonts w:eastAsia="Times New Roman" w:cs="Times New Roman" w:ascii="Garamond" w:hAnsi="Garamond"/>
+          <w:color w:val="000000"/>
+          <w:kern w:val="0"/>
+          <w:sz w:val="36"/>
+          <w:szCs w:val="36"/>
+          <w:shd w:fill="auto" w:val="clear"/>
+          <w:lang w:val="en-US" w:eastAsia="zh-CN" w:bidi="hi-IN"/>
+        </w:rPr>
+        <w:t>Caminhando para o término de nossas reflexões, quem já leu a obra O Céu e o Inferno deve ter observado que, na mesma página em que se encontra o título da obra, consta também o versículo 11 do capítulo 33 do Livro de Ezequiel, no qual o profeta diz:</w:t>
+      </w:r>
+    </w:p>
+    <w:p>
+      <w:pPr>
+        <w:pStyle w:val="Normal"/>
+        <w:jc w:val="both"/>
+        <w:rPr>
+          <w:color w:val="auto"/>
+        </w:rPr>
+      </w:pPr>
+      <w:r>
+        <w:rPr/>
+      </w:r>
+    </w:p>
+    <w:p>
+      <w:pPr>
+        <w:pStyle w:val="Normal"/>
+        <w:ind w:left="720" w:hanging="0"/>
+        <w:jc w:val="both"/>
+        <w:rPr>
+          <w:i/>
           <w:i/>
           <w:iCs/>
-          <w:color w:val="000000"/>
-          <w:kern w:val="0"/>
-          <w:sz w:val="36"/>
-          <w:szCs w:val="36"/>
-          <w:shd w:fill="auto" w:val="clear"/>
-          <w:lang w:val="en-US" w:eastAsia="zh-CN" w:bidi="hi-IN"/>
-        </w:rPr>
-        <w:t>A gênese das crenças religiosas</w:t>
-      </w:r>
-      <w:r>
-        <w:rPr>
-          <w:rFonts w:eastAsia="Times New Roman" w:cs="Times New Roman" w:ascii="Garamond" w:hAnsi="Garamond"/>
-          <w:color w:val="000000"/>
-          <w:kern w:val="0"/>
-          <w:sz w:val="36"/>
-          <w:szCs w:val="36"/>
-          <w:shd w:fill="auto" w:val="clear"/>
-          <w:lang w:val="en-US" w:eastAsia="zh-CN" w:bidi="hi-IN"/>
-        </w:rPr>
-        <w:t xml:space="preserve"> —, nos diz que todas as religiões do mundo têm sua origem no amor incondicional do Cristo.</w:t>
-      </w:r>
-    </w:p>
-    <w:p>
-      <w:pPr>
-        <w:pStyle w:val="Normal"/>
-        <w:jc w:val="both"/>
-        <w:rPr>
-          <w:sz w:val="36"/>
-          <w:szCs w:val="36"/>
-        </w:rPr>
-      </w:pPr>
-      <w:r>
-        <w:rPr>
-          <w:sz w:val="36"/>
-          <w:szCs w:val="36"/>
-        </w:rPr>
-      </w:r>
-    </w:p>
-    <w:p>
-      <w:pPr>
-        <w:pStyle w:val="Normal"/>
-        <w:jc w:val="both"/>
-        <w:rPr>
-          <w:sz w:val="36"/>
-          <w:szCs w:val="36"/>
-        </w:rPr>
-      </w:pPr>
-      <w:r>
-        <w:rPr>
-          <w:rFonts w:eastAsia="Times New Roman" w:cs="Times New Roman" w:ascii="Garamond" w:hAnsi="Garamond"/>
-          <w:color w:val="000000"/>
-          <w:kern w:val="0"/>
-          <w:sz w:val="36"/>
-          <w:szCs w:val="36"/>
-          <w:shd w:fill="auto" w:val="clear"/>
-          <w:lang w:val="en-US" w:eastAsia="zh-CN" w:bidi="hi-IN"/>
-        </w:rPr>
-        <w:t>Ele nos diz também que os grandes líderes religiosos e filosóficos da humanidade — como Buda, Lao-Tsé, Confúcio, Moisés e Maomé — exerceram suas missões junto aos seus povos sob o seu comando.</w:t>
-      </w:r>
-    </w:p>
-    <w:p>
-      <w:pPr>
-        <w:pStyle w:val="Normal"/>
-        <w:jc w:val="both"/>
-        <w:rPr>
-          <w:sz w:val="36"/>
-          <w:szCs w:val="36"/>
-        </w:rPr>
-      </w:pPr>
-      <w:r>
-        <w:rPr>
-          <w:sz w:val="36"/>
-          <w:szCs w:val="36"/>
-        </w:rPr>
-      </w:r>
-    </w:p>
-    <w:p>
-      <w:pPr>
-        <w:pStyle w:val="Normal"/>
-        <w:jc w:val="both"/>
-        <w:rPr>
-          <w:sz w:val="36"/>
-          <w:szCs w:val="36"/>
-        </w:rPr>
-      </w:pPr>
-      <w:r>
-        <w:rPr>
-          <w:rFonts w:eastAsia="Times New Roman" w:cs="Times New Roman" w:ascii="Garamond" w:hAnsi="Garamond"/>
-          <w:color w:val="000000"/>
-          <w:kern w:val="0"/>
-          <w:sz w:val="36"/>
-          <w:szCs w:val="36"/>
-          <w:shd w:fill="auto" w:val="clear"/>
-          <w:lang w:val="en-US" w:eastAsia="zh-CN" w:bidi="hi-IN"/>
-        </w:rPr>
-        <w:t>Portanto, não há povo ou civilização que não tenha recebido, direta ou indiretamente, esses ensinamentos.</w:t>
-      </w:r>
-    </w:p>
-    <w:p>
-      <w:pPr>
-        <w:pStyle w:val="Normal"/>
-        <w:ind w:left="0" w:hanging="0"/>
-        <w:jc w:val="both"/>
-        <w:rPr>
-          <w:rFonts w:ascii="Garamond" w:hAnsi="Garamond" w:eastAsia="Times New Roman" w:cs="Times New Roman"/>
-          <w:color w:val="000000"/>
-          <w:kern w:val="0"/>
-          <w:sz w:val="36"/>
-          <w:szCs w:val="36"/>
-          <w:shd w:fill="auto" w:val="clear"/>
-          <w:lang w:val="en-US" w:eastAsia="zh-CN" w:bidi="hi-IN"/>
-        </w:rPr>
-      </w:pPr>
-      <w:r>
-        <w:rPr>
-          <w:rFonts w:eastAsia="Times New Roman" w:cs="Times New Roman" w:ascii="Garamond" w:hAnsi="Garamond"/>
-          <w:color w:val="000000"/>
-          <w:kern w:val="0"/>
-          <w:sz w:val="36"/>
-          <w:szCs w:val="36"/>
-          <w:shd w:fill="auto" w:val="clear"/>
-          <w:lang w:val="en-US" w:eastAsia="zh-CN" w:bidi="hi-IN"/>
-        </w:rPr>
-      </w:r>
-    </w:p>
-    <w:p>
-      <w:pPr>
-        <w:pStyle w:val="Normal"/>
-        <w:ind w:left="0" w:hanging="0"/>
-        <w:jc w:val="both"/>
+        </w:rPr>
+      </w:pPr>
+      <w:r>
+        <w:rPr>
+          <w:rFonts w:eastAsia="Times New Roman" w:cs="Times New Roman" w:ascii="Garamond" w:hAnsi="Garamond"/>
+          <w:i/>
+          <w:iCs/>
+          <w:color w:val="000000"/>
+          <w:kern w:val="0"/>
+          <w:sz w:val="36"/>
+          <w:szCs w:val="36"/>
+          <w:shd w:fill="auto" w:val="clear"/>
+          <w:lang w:val="en-US" w:eastAsia="zh-CN" w:bidi="hi-IN"/>
+        </w:rPr>
+        <w:t>Por mim mesmo juro - disse o Senhor Deus - que não quero a morte do ímpio, senão que ele se converta, que deixe o mau caminho e que viva.</w:t>
+      </w:r>
+    </w:p>
+    <w:p>
+      <w:pPr>
+        <w:pStyle w:val="Normal"/>
+        <w:jc w:val="both"/>
+        <w:rPr>
+          <w:color w:val="auto"/>
+        </w:rPr>
+      </w:pPr>
+      <w:r>
         <w:rPr/>
-      </w:pPr>
-      <w:r>
-        <w:rPr>
-          <w:rFonts w:eastAsia="Times New Roman" w:cs="Times New Roman" w:ascii="Garamond" w:hAnsi="Garamond"/>
-          <w:color w:val="000000"/>
-          <w:kern w:val="0"/>
-          <w:sz w:val="36"/>
-          <w:szCs w:val="36"/>
-          <w:shd w:fill="auto" w:val="clear"/>
-          <w:lang w:val="en-US" w:eastAsia="zh-CN" w:bidi="hi-IN"/>
-        </w:rPr>
-        <w:t>Apesar disso, uma enorme parcela da humanidade ainda vive voltada exclusivamente para as questões materiais e terrenas. Nem mesmo a dor e o sofrimento têm sido suficientes para o despertar dessas pessoas.</w:t>
-      </w:r>
-    </w:p>
-    <w:p>
-      <w:pPr>
-        <w:pStyle w:val="Normal"/>
-        <w:ind w:left="0" w:hanging="0"/>
-        <w:jc w:val="both"/>
-        <w:rPr>
-          <w:rFonts w:ascii="Garamond" w:hAnsi="Garamond" w:eastAsia="Times New Roman" w:cs="Times New Roman"/>
-          <w:color w:val="000000"/>
-          <w:kern w:val="0"/>
-          <w:sz w:val="36"/>
-          <w:szCs w:val="36"/>
-          <w:shd w:fill="auto" w:val="clear"/>
-          <w:lang w:val="en-US" w:eastAsia="zh-CN" w:bidi="hi-IN"/>
-        </w:rPr>
-      </w:pPr>
-      <w:r>
-        <w:rPr>
-          <w:rFonts w:eastAsia="Times New Roman" w:cs="Times New Roman" w:ascii="Garamond" w:hAnsi="Garamond"/>
-          <w:color w:val="000000"/>
-          <w:kern w:val="0"/>
-          <w:sz w:val="36"/>
-          <w:szCs w:val="36"/>
-          <w:shd w:fill="auto" w:val="clear"/>
-          <w:lang w:val="en-US" w:eastAsia="zh-CN" w:bidi="hi-IN"/>
-        </w:rPr>
-      </w:r>
-    </w:p>
-    <w:p>
-      <w:pPr>
-        <w:pStyle w:val="Normal"/>
-        <w:ind w:left="0" w:hanging="0"/>
-        <w:jc w:val="both"/>
+      </w:r>
+    </w:p>
+    <w:p>
+      <w:pPr>
+        <w:pStyle w:val="Normal"/>
+        <w:jc w:val="both"/>
+        <w:rPr>
+          <w:color w:val="auto"/>
+        </w:rPr>
+      </w:pPr>
+      <w:r>
+        <w:rPr>
+          <w:rFonts w:eastAsia="Times New Roman" w:cs="Times New Roman" w:ascii="Garamond" w:hAnsi="Garamond"/>
+          <w:color w:val="000000"/>
+          <w:kern w:val="0"/>
+          <w:sz w:val="36"/>
+          <w:szCs w:val="36"/>
+          <w:shd w:fill="auto" w:val="clear"/>
+          <w:lang w:val="en-US" w:eastAsia="zh-CN" w:bidi="hi-IN"/>
+        </w:rPr>
+        <w:t>Esse texto, escrito 585 anos antes da vinda de Jesus, já nos mostra que Deus é um Pai misericordioso, que não deseja a morte nem a destruição de nenhum de seus filhos que se desviaram do bom caminho.</w:t>
+      </w:r>
+    </w:p>
+    <w:p>
+      <w:pPr>
+        <w:pStyle w:val="Normal"/>
+        <w:jc w:val="both"/>
+        <w:rPr>
+          <w:color w:val="auto"/>
+        </w:rPr>
+      </w:pPr>
+      <w:r>
         <w:rPr/>
-      </w:pPr>
-      <w:r>
-        <w:rPr>
-          <w:rFonts w:eastAsia="Times New Roman" w:cs="Times New Roman" w:ascii="Garamond" w:hAnsi="Garamond"/>
-          <w:color w:val="000000"/>
-          <w:kern w:val="0"/>
-          <w:sz w:val="36"/>
-          <w:szCs w:val="36"/>
-          <w:shd w:fill="auto" w:val="clear"/>
-          <w:lang w:val="en-US" w:eastAsia="zh-CN" w:bidi="hi-IN"/>
-        </w:rPr>
-        <w:t>Temos um exemplo muito claro disso na pandemia. Foi um período de muita tristeza e medo para a população mundial. Ali, deveríamos ter aprendido a valorizar a liberdade, o contato com amigos, familiares, vizinhos e colegas de trabalho; deveríamos ter aprendido a ser mais solidários, empáticos e caridosos.</w:t>
-      </w:r>
-    </w:p>
-    <w:p>
-      <w:pPr>
-        <w:pStyle w:val="Normal"/>
-        <w:ind w:left="0" w:hanging="0"/>
-        <w:jc w:val="both"/>
-        <w:rPr>
-          <w:rFonts w:ascii="Garamond" w:hAnsi="Garamond" w:eastAsia="Times New Roman" w:cs="Times New Roman"/>
-          <w:color w:val="000000"/>
-          <w:kern w:val="0"/>
-          <w:sz w:val="36"/>
-          <w:szCs w:val="36"/>
-          <w:shd w:fill="auto" w:val="clear"/>
-          <w:lang w:val="en-US" w:eastAsia="zh-CN" w:bidi="hi-IN"/>
-        </w:rPr>
-      </w:pPr>
-      <w:r>
-        <w:rPr>
-          <w:rFonts w:eastAsia="Times New Roman" w:cs="Times New Roman" w:ascii="Garamond" w:hAnsi="Garamond"/>
-          <w:color w:val="000000"/>
-          <w:kern w:val="0"/>
-          <w:sz w:val="36"/>
-          <w:szCs w:val="36"/>
-          <w:shd w:fill="auto" w:val="clear"/>
-          <w:lang w:val="en-US" w:eastAsia="zh-CN" w:bidi="hi-IN"/>
-        </w:rPr>
-      </w:r>
-    </w:p>
-    <w:p>
-      <w:pPr>
-        <w:pStyle w:val="Normal"/>
-        <w:ind w:left="0" w:hanging="0"/>
-        <w:jc w:val="both"/>
+      </w:r>
+    </w:p>
+    <w:p>
+      <w:pPr>
+        <w:pStyle w:val="Normal"/>
+        <w:jc w:val="both"/>
+        <w:rPr>
+          <w:color w:val="auto"/>
+        </w:rPr>
+      </w:pPr>
+      <w:r>
+        <w:rPr>
+          <w:rFonts w:eastAsia="Times New Roman" w:cs="Times New Roman" w:ascii="Garamond" w:hAnsi="Garamond"/>
+          <w:color w:val="000000"/>
+          <w:kern w:val="0"/>
+          <w:sz w:val="36"/>
+          <w:szCs w:val="36"/>
+          <w:shd w:fill="auto" w:val="clear"/>
+          <w:lang w:val="en-US" w:eastAsia="zh-CN" w:bidi="hi-IN"/>
+        </w:rPr>
+        <w:t>É exatamente por isso que Jesus, atendendo aos desígnios de Deus, pede que o joio cresça junto ao trigo até o momento da ceifa.</w:t>
+      </w:r>
+    </w:p>
+    <w:p>
+      <w:pPr>
+        <w:pStyle w:val="Normal"/>
+        <w:jc w:val="both"/>
+        <w:rPr>
+          <w:color w:val="auto"/>
+        </w:rPr>
+      </w:pPr>
+      <w:r>
         <w:rPr/>
-      </w:pPr>
-      <w:r>
-        <w:rPr>
-          <w:rFonts w:eastAsia="Times New Roman" w:cs="Times New Roman" w:ascii="Garamond" w:hAnsi="Garamond"/>
-          <w:color w:val="000000"/>
-          <w:kern w:val="0"/>
-          <w:sz w:val="36"/>
-          <w:szCs w:val="36"/>
-          <w:shd w:fill="auto" w:val="clear"/>
-          <w:lang w:val="en-US" w:eastAsia="zh-CN" w:bidi="hi-IN"/>
-        </w:rPr>
-        <w:t>Mas, tão logo a pandemia terminou, o que aconteceu? As pessoas voltaram ao seu antigo modo de vida, ignorando as dores e dificuldades alheias e buscando freneticamente a satisfação dos prazeres materiais, como quem deseja recuperar o tempo perdido.</w:t>
-      </w:r>
-    </w:p>
-    <w:p>
-      <w:pPr>
-        <w:pStyle w:val="Normal"/>
-        <w:jc w:val="both"/>
-        <w:rPr>
-          <w:rFonts w:ascii="Garamond" w:hAnsi="Garamond" w:eastAsia="Times New Roman" w:cs="Times New Roman"/>
-          <w:color w:val="000000"/>
-          <w:kern w:val="0"/>
-          <w:sz w:val="36"/>
-          <w:szCs w:val="36"/>
-          <w:shd w:fill="auto" w:val="clear"/>
-          <w:lang w:val="en-US" w:eastAsia="zh-CN" w:bidi="hi-IN"/>
-        </w:rPr>
-      </w:pPr>
-      <w:r>
-        <w:rPr>
-          <w:rFonts w:eastAsia="Times New Roman" w:cs="Times New Roman" w:ascii="Garamond" w:hAnsi="Garamond"/>
-          <w:color w:val="000000"/>
-          <w:kern w:val="0"/>
-          <w:sz w:val="36"/>
-          <w:szCs w:val="36"/>
-          <w:shd w:fill="auto" w:val="clear"/>
-          <w:lang w:val="en-US" w:eastAsia="zh-CN" w:bidi="hi-IN"/>
-        </w:rPr>
-      </w:r>
-    </w:p>
-    <w:p>
-      <w:pPr>
-        <w:pStyle w:val="Normal"/>
-        <w:jc w:val="both"/>
-        <w:rPr>
-          <w:rFonts w:ascii="Garamond" w:hAnsi="Garamond" w:eastAsia="Times New Roman" w:cs="Times New Roman"/>
-          <w:color w:val="000000"/>
-          <w:kern w:val="0"/>
-          <w:sz w:val="36"/>
-          <w:szCs w:val="36"/>
-          <w:shd w:fill="auto" w:val="clear"/>
-          <w:lang w:val="en-US" w:eastAsia="zh-CN" w:bidi="hi-IN"/>
-        </w:rPr>
-      </w:pPr>
-      <w:r>
-        <w:rPr>
-          <w:rFonts w:eastAsia="Times New Roman" w:cs="Times New Roman" w:ascii="Garamond" w:hAnsi="Garamond"/>
-          <w:color w:val="000000"/>
-          <w:kern w:val="0"/>
-          <w:sz w:val="36"/>
-          <w:szCs w:val="36"/>
-          <w:shd w:fill="auto" w:val="clear"/>
-          <w:lang w:val="en-US" w:eastAsia="zh-CN" w:bidi="hi-IN"/>
-        </w:rPr>
-        <w:t>A maioria das pessoas saiu da pandemia sem aprender nada, sem despertar para a vida espiritual.</w:t>
-      </w:r>
-    </w:p>
-    <w:p>
-      <w:pPr>
-        <w:pStyle w:val="Normal"/>
-        <w:jc w:val="both"/>
-        <w:rPr>
-          <w:color w:val="FC5C00"/>
-        </w:rPr>
-      </w:pPr>
-      <w:r>
-        <w:rPr>
-          <w:color w:val="FC5C00"/>
-        </w:rPr>
-      </w:r>
-    </w:p>
-    <w:p>
-      <w:pPr>
-        <w:pStyle w:val="Normal"/>
-        <w:jc w:val="both"/>
-        <w:rPr>
-          <w:rFonts w:ascii="Garamond" w:hAnsi="Garamond" w:eastAsia="Times New Roman" w:cs="Times New Roman"/>
-          <w:color w:val="000000"/>
-          <w:kern w:val="0"/>
-          <w:sz w:val="36"/>
-          <w:szCs w:val="36"/>
-          <w:shd w:fill="auto" w:val="clear"/>
-          <w:lang w:val="en-US" w:eastAsia="zh-CN" w:bidi="hi-IN"/>
-        </w:rPr>
-      </w:pPr>
-      <w:r>
-        <w:rPr>
-          <w:rFonts w:eastAsia="Times New Roman" w:cs="Times New Roman" w:ascii="Garamond" w:hAnsi="Garamond"/>
-          <w:color w:val="000000"/>
-          <w:kern w:val="0"/>
-          <w:sz w:val="36"/>
-          <w:szCs w:val="36"/>
-          <w:shd w:fill="auto" w:val="clear"/>
-          <w:lang w:val="en-US" w:eastAsia="zh-CN" w:bidi="hi-IN"/>
-        </w:rPr>
-        <w:t>O sono da invigilância é terreno fértil para o surgimento do joio. Por isso Jesus nos recomendou o orai e vigiai.</w:t>
-      </w:r>
-    </w:p>
-    <w:p>
-      <w:pPr>
-        <w:pStyle w:val="Normal"/>
-        <w:jc w:val="both"/>
-        <w:rPr>
-          <w:rFonts w:ascii="Garamond" w:hAnsi="Garamond" w:eastAsia="Times New Roman" w:cs="Times New Roman"/>
-          <w:color w:val="000000"/>
-          <w:kern w:val="0"/>
-          <w:sz w:val="36"/>
-          <w:szCs w:val="36"/>
-          <w:shd w:fill="auto" w:val="clear"/>
-          <w:lang w:val="en-US" w:eastAsia="zh-CN" w:bidi="hi-IN"/>
-        </w:rPr>
-      </w:pPr>
-      <w:r>
-        <w:rPr>
-          <w:rFonts w:eastAsia="Times New Roman" w:cs="Times New Roman" w:ascii="Garamond" w:hAnsi="Garamond"/>
-          <w:color w:val="000000"/>
-          <w:kern w:val="0"/>
-          <w:sz w:val="36"/>
-          <w:szCs w:val="36"/>
-          <w:shd w:fill="auto" w:val="clear"/>
-          <w:lang w:val="en-US" w:eastAsia="zh-CN" w:bidi="hi-IN"/>
-        </w:rPr>
-      </w:r>
-    </w:p>
-    <w:p>
-      <w:pPr>
-        <w:pStyle w:val="Normal"/>
-        <w:jc w:val="both"/>
-        <w:rPr>
-          <w:rFonts w:ascii="Garamond" w:hAnsi="Garamond" w:eastAsia="Times New Roman" w:cs="Times New Roman"/>
-          <w:color w:val="000000"/>
-          <w:kern w:val="0"/>
-          <w:sz w:val="36"/>
-          <w:szCs w:val="36"/>
-          <w:shd w:fill="auto" w:val="clear"/>
-          <w:lang w:val="en-US" w:eastAsia="zh-CN" w:bidi="hi-IN"/>
-        </w:rPr>
-      </w:pPr>
-      <w:r>
-        <w:rPr>
-          <w:rFonts w:eastAsia="Times New Roman" w:cs="Times New Roman" w:ascii="Garamond" w:hAnsi="Garamond"/>
-          <w:i/>
-          <w:iCs/>
-          <w:color w:val="000000"/>
-          <w:kern w:val="0"/>
-          <w:sz w:val="36"/>
-          <w:szCs w:val="36"/>
-          <w:shd w:fill="auto" w:val="clear"/>
-          <w:lang w:val="en-US" w:eastAsia="zh-CN" w:bidi="hi-IN"/>
-        </w:rPr>
-        <w:t>Veio o seu inimigo</w:t>
-      </w:r>
-      <w:r>
-        <w:rPr>
-          <w:rFonts w:eastAsia="Times New Roman" w:cs="Times New Roman" w:ascii="Garamond" w:hAnsi="Garamond"/>
-          <w:color w:val="000000"/>
-          <w:kern w:val="0"/>
-          <w:sz w:val="36"/>
-          <w:szCs w:val="36"/>
-          <w:shd w:fill="auto" w:val="clear"/>
-          <w:lang w:val="en-US" w:eastAsia="zh-CN" w:bidi="hi-IN"/>
-        </w:rPr>
-        <w:t>: [ Parei aqui em 05/06/2026 ]</w:t>
-      </w:r>
-    </w:p>
-    <w:p>
-      <w:pPr>
-        <w:pStyle w:val="Normal"/>
-        <w:jc w:val="both"/>
-        <w:rPr>
-          <w:rFonts w:ascii="Garamond" w:hAnsi="Garamond" w:eastAsia="Times New Roman" w:cs="Times New Roman"/>
-          <w:color w:val="000000"/>
-          <w:kern w:val="0"/>
-          <w:sz w:val="36"/>
-          <w:szCs w:val="36"/>
-          <w:shd w:fill="auto" w:val="clear"/>
-          <w:lang w:val="en-US" w:eastAsia="zh-CN" w:bidi="hi-IN"/>
-        </w:rPr>
-      </w:pPr>
-      <w:r>
-        <w:rPr>
-          <w:sz w:val="36"/>
-          <w:szCs w:val="36"/>
-        </w:rPr>
-      </w:r>
-    </w:p>
-    <w:p>
-      <w:pPr>
-        <w:pStyle w:val="Normal"/>
-        <w:jc w:val="both"/>
-        <w:rPr>
-          <w:color w:val="FC5C00"/>
-        </w:rPr>
-      </w:pPr>
-      <w:r>
-        <w:rPr>
-          <w:rFonts w:eastAsia="Times New Roman" w:cs="Times New Roman" w:ascii="Garamond" w:hAnsi="Garamond"/>
-          <w:color w:val="FC5C00"/>
-          <w:kern w:val="0"/>
-          <w:sz w:val="36"/>
-          <w:szCs w:val="36"/>
-          <w:shd w:fill="auto" w:val="clear"/>
-          <w:lang w:val="en-US" w:eastAsia="zh-CN" w:bidi="hi-IN"/>
-        </w:rPr>
-        <w:t>[ Usar essa passagem evangélica para encerrar a palestra ]</w:t>
       </w:r>
     </w:p>
     <w:p>
@@ -4632,7 +5853,7 @@
           <w:shd w:fill="auto" w:val="clear"/>
           <w:lang w:val="en-US" w:eastAsia="zh-CN" w:bidi="hi-IN"/>
         </w:rPr>
-        <w:t>"Por mim mesmo juro - disse o Senhor Deus - que não quero a morte do ímpio, senão que ele se converta, que deixe o mau caminho e que viva".</w:t>
+        <w:t>Esse momento se aproxima. Em breve, a Terra encerrará seu processo de transição para um mundo de regeneração. Mas, até que isso se concretize, o joio se tornará cada vez mais visível entre nós.</w:t>
       </w:r>
     </w:p>
     <w:p>
@@ -4644,84 +5865,339 @@
         </w:rPr>
       </w:pPr>
       <w:r>
-        <w:rPr>
-          <w:rFonts w:eastAsia="Times New Roman" w:cs="Times New Roman" w:ascii="Garamond" w:hAnsi="Garamond"/>
-          <w:color w:val="000000"/>
-          <w:kern w:val="0"/>
-          <w:sz w:val="36"/>
-          <w:szCs w:val="36"/>
-          <w:shd w:fill="auto" w:val="clear"/>
-          <w:lang w:val="en-US" w:eastAsia="zh-CN" w:bidi="hi-IN"/>
-        </w:rPr>
-        <w:t>(EZEQUIEL, 33:11.)</w:t>
-      </w:r>
-    </w:p>
-    <w:p>
-      <w:pPr>
-        <w:pStyle w:val="Normal"/>
-        <w:jc w:val="both"/>
-        <w:rPr>
-          <w:color w:val="FC5C00"/>
-        </w:rPr>
-      </w:pPr>
-      <w:r>
-        <w:rPr>
-          <w:rFonts w:eastAsia="Times New Roman" w:cs="Times New Roman" w:ascii="Garamond" w:hAnsi="Garamond"/>
-          <w:color w:val="FC5C00"/>
-          <w:kern w:val="0"/>
-          <w:sz w:val="36"/>
-          <w:szCs w:val="36"/>
-          <w:shd w:fill="auto" w:val="clear"/>
-          <w:lang w:val="en-US" w:eastAsia="zh-CN" w:bidi="hi-IN"/>
-        </w:rPr>
-        <w:t>[ Usar essa passagem evangélica em algum ponto ]</w:t>
-      </w:r>
-    </w:p>
-    <w:p>
-      <w:pPr>
-        <w:pStyle w:val="Normal"/>
-        <w:jc w:val="both"/>
-        <w:rPr>
-          <w:rFonts w:ascii="Garamond" w:hAnsi="Garamond" w:eastAsia="Times New Roman" w:cs="Times New Roman"/>
-          <w:color w:val="000000"/>
-          <w:kern w:val="0"/>
-          <w:sz w:val="36"/>
-          <w:szCs w:val="36"/>
-          <w:shd w:fill="auto" w:val="clear"/>
-          <w:lang w:val="en-US" w:eastAsia="zh-CN" w:bidi="hi-IN"/>
-        </w:rPr>
-      </w:pPr>
-      <w:r>
-        <w:rPr>
-          <w:rFonts w:eastAsia="Times New Roman" w:cs="Times New Roman" w:ascii="Garamond" w:hAnsi="Garamond"/>
-          <w:color w:val="000000"/>
-          <w:kern w:val="0"/>
-          <w:sz w:val="36"/>
-          <w:szCs w:val="36"/>
-          <w:shd w:fill="auto" w:val="clear"/>
-          <w:lang w:val="en-US" w:eastAsia="zh-CN" w:bidi="hi-IN"/>
-        </w:rPr>
-      </w:r>
-    </w:p>
-    <w:p>
-      <w:pPr>
-        <w:pStyle w:val="Normal"/>
-        <w:jc w:val="both"/>
-        <w:rPr>
-          <w:color w:val="FC5C00"/>
-        </w:rPr>
-      </w:pPr>
-      <w:r>
-        <w:rPr>
-          <w:rFonts w:eastAsia="Times New Roman" w:cs="Times New Roman" w:ascii="Garamond" w:hAnsi="Garamond"/>
-          <w:color w:val="FC5C00"/>
-          <w:kern w:val="0"/>
-          <w:sz w:val="36"/>
-          <w:szCs w:val="36"/>
-          <w:shd w:fill="auto" w:val="clear"/>
-          <w:lang w:val="en-US" w:eastAsia="zh-CN" w:bidi="hi-IN"/>
-        </w:rPr>
-        <w:t>[ Procurar no ESE onde se fala que, enquanto o homem insistir em praticar o mal, Deus continuará usando o homem como instrumento de evolução do próprio homem ]</w:t>
+        <w:rPr/>
+      </w:r>
+    </w:p>
+    <w:p>
+      <w:pPr>
+        <w:pStyle w:val="Normal"/>
+        <w:jc w:val="both"/>
+        <w:rPr>
+          <w:color w:val="auto"/>
+        </w:rPr>
+      </w:pPr>
+      <w:r>
+        <w:rPr>
+          <w:rFonts w:eastAsia="Times New Roman" w:cs="Times New Roman" w:ascii="Garamond" w:hAnsi="Garamond"/>
+          <w:color w:val="000000"/>
+          <w:kern w:val="0"/>
+          <w:sz w:val="36"/>
+          <w:szCs w:val="36"/>
+          <w:shd w:fill="auto" w:val="clear"/>
+          <w:lang w:val="en-US" w:eastAsia="zh-CN" w:bidi="hi-IN"/>
+        </w:rPr>
+        <w:t>Ao mesmo tempo em que isso nos permite distinguir com muita clareza o bem do mal, é também prova incontestável de que muitos de nossos irmãos de caminhada ainda se recusam a viver segundo as leis de Deus.</w:t>
+      </w:r>
+    </w:p>
+    <w:p>
+      <w:pPr>
+        <w:pStyle w:val="Normal"/>
+        <w:jc w:val="both"/>
+        <w:rPr>
+          <w:color w:val="auto"/>
+        </w:rPr>
+      </w:pPr>
+      <w:r>
+        <w:rPr/>
+      </w:r>
+    </w:p>
+    <w:p>
+      <w:pPr>
+        <w:pStyle w:val="Normal"/>
+        <w:jc w:val="both"/>
+        <w:rPr>
+          <w:color w:val="auto"/>
+        </w:rPr>
+      </w:pPr>
+      <w:r>
+        <w:rPr>
+          <w:rFonts w:eastAsia="Times New Roman" w:cs="Times New Roman" w:ascii="Garamond" w:hAnsi="Garamond"/>
+          <w:color w:val="000000"/>
+          <w:kern w:val="0"/>
+          <w:sz w:val="36"/>
+          <w:szCs w:val="36"/>
+          <w:shd w:fill="auto" w:val="clear"/>
+          <w:lang w:val="en-US" w:eastAsia="zh-CN" w:bidi="hi-IN"/>
+        </w:rPr>
+        <w:t>Esse é um grande desafio para nós: estar em contato com o mal e não nos deixarmos contaminar por ele. E esse desafio não se limita a simplesmente não ceder às suas investidas. Ele envolve, sobretudo, a maneira como pensamos, como agimos e como reagimos diante d</w:t>
+      </w:r>
+      <w:r>
+        <w:rPr>
+          <w:rFonts w:eastAsia="Times New Roman" w:cs="Times New Roman" w:ascii="Garamond" w:hAnsi="Garamond"/>
+          <w:color w:val="000000"/>
+          <w:kern w:val="0"/>
+          <w:sz w:val="36"/>
+          <w:szCs w:val="36"/>
+          <w:shd w:fill="auto" w:val="clear"/>
+          <w:lang w:val="en-US" w:eastAsia="zh-CN" w:bidi="hi-IN"/>
+        </w:rPr>
+        <w:t>o mal</w:t>
+      </w:r>
+      <w:r>
+        <w:rPr>
+          <w:rFonts w:eastAsia="Times New Roman" w:cs="Times New Roman" w:ascii="Garamond" w:hAnsi="Garamond"/>
+          <w:color w:val="000000"/>
+          <w:kern w:val="0"/>
+          <w:sz w:val="36"/>
+          <w:szCs w:val="36"/>
+          <w:shd w:fill="auto" w:val="clear"/>
+          <w:lang w:val="en-US" w:eastAsia="zh-CN" w:bidi="hi-IN"/>
+        </w:rPr>
+        <w:t>.</w:t>
+      </w:r>
+    </w:p>
+    <w:p>
+      <w:pPr>
+        <w:pStyle w:val="Normal"/>
+        <w:jc w:val="both"/>
+        <w:rPr>
+          <w:rFonts w:ascii="Garamond" w:hAnsi="Garamond" w:eastAsia="Times New Roman" w:cs="Times New Roman"/>
+          <w:color w:val="000000"/>
+          <w:kern w:val="0"/>
+          <w:sz w:val="36"/>
+          <w:szCs w:val="36"/>
+          <w:highlight w:val="none"/>
+          <w:shd w:fill="auto" w:val="clear"/>
+          <w:lang w:val="en-US" w:eastAsia="zh-CN" w:bidi="hi-IN"/>
+        </w:rPr>
+      </w:pPr>
+      <w:r>
+        <w:rPr>
+          <w:rFonts w:eastAsia="Times New Roman" w:cs="Times New Roman" w:ascii="Garamond" w:hAnsi="Garamond"/>
+          <w:color w:val="000000"/>
+          <w:kern w:val="0"/>
+          <w:sz w:val="36"/>
+          <w:szCs w:val="36"/>
+          <w:shd w:fill="auto" w:val="clear"/>
+          <w:lang w:val="en-US" w:eastAsia="zh-CN" w:bidi="hi-IN"/>
+        </w:rPr>
+      </w:r>
+    </w:p>
+    <w:p>
+      <w:pPr>
+        <w:pStyle w:val="Normal"/>
+        <w:jc w:val="both"/>
+        <w:rPr>
+          <w:highlight w:val="none"/>
+          <w:shd w:fill="auto" w:val="clear"/>
+        </w:rPr>
+      </w:pPr>
+      <w:r>
+        <w:rPr>
+          <w:rFonts w:eastAsia="Times New Roman" w:cs="Times New Roman" w:ascii="Garamond" w:hAnsi="Garamond"/>
+          <w:color w:val="000000"/>
+          <w:kern w:val="0"/>
+          <w:sz w:val="36"/>
+          <w:szCs w:val="36"/>
+          <w:shd w:fill="auto" w:val="clear"/>
+          <w:lang w:val="en-US" w:eastAsia="zh-CN" w:bidi="hi-IN"/>
+        </w:rPr>
+        <w:t>O que eu desejo para os maus? Peço a Deus que lhes retire a vida, pois não merecem viver? Desejo que sejam aniquilados, exterminados, varridos da face da Terra? É isso que penso e desejo a eles?</w:t>
+      </w:r>
+    </w:p>
+    <w:p>
+      <w:pPr>
+        <w:pStyle w:val="Normal"/>
+        <w:jc w:val="both"/>
+        <w:rPr>
+          <w:rFonts w:ascii="Garamond" w:hAnsi="Garamond" w:eastAsia="Times New Roman" w:cs="Times New Roman"/>
+          <w:color w:val="000000"/>
+          <w:kern w:val="0"/>
+          <w:sz w:val="36"/>
+          <w:szCs w:val="36"/>
+          <w:lang w:val="en-US" w:eastAsia="zh-CN" w:bidi="hi-IN"/>
+        </w:rPr>
+      </w:pPr>
+      <w:r>
+        <w:rPr>
+          <w:shd w:fill="auto" w:val="clear"/>
+        </w:rPr>
+      </w:r>
+    </w:p>
+    <w:p>
+      <w:pPr>
+        <w:pStyle w:val="Normal"/>
+        <w:jc w:val="both"/>
+        <w:rPr>
+          <w:highlight w:val="none"/>
+          <w:shd w:fill="auto" w:val="clear"/>
+        </w:rPr>
+      </w:pPr>
+      <w:r>
+        <w:rPr>
+          <w:rFonts w:eastAsia="Times New Roman" w:cs="Times New Roman" w:ascii="Garamond" w:hAnsi="Garamond"/>
+          <w:color w:val="000000"/>
+          <w:kern w:val="0"/>
+          <w:sz w:val="36"/>
+          <w:szCs w:val="36"/>
+          <w:shd w:fill="auto" w:val="clear"/>
+          <w:lang w:val="en-US" w:eastAsia="zh-CN" w:bidi="hi-IN"/>
+        </w:rPr>
+        <w:t>Se Jesus, o governador espiritual do nosso planeta, é paciente e tolerante com os maus — sem ser conivente com eles —, oferecendo-lhes tempo para se redimirem, por que haveríamos de agir de maneira diferente, se ainda trazemos o joio no solo de nossos corações?</w:t>
+      </w:r>
+    </w:p>
+    <w:p>
+      <w:pPr>
+        <w:pStyle w:val="Normal"/>
+        <w:jc w:val="both"/>
+        <w:rPr>
+          <w:rFonts w:ascii="Garamond" w:hAnsi="Garamond" w:eastAsia="Times New Roman" w:cs="Times New Roman"/>
+          <w:color w:val="000000"/>
+          <w:kern w:val="0"/>
+          <w:sz w:val="36"/>
+          <w:szCs w:val="36"/>
+          <w:lang w:val="en-US" w:eastAsia="zh-CN" w:bidi="hi-IN"/>
+        </w:rPr>
+      </w:pPr>
+      <w:r>
+        <w:rPr>
+          <w:shd w:fill="auto" w:val="clear"/>
+        </w:rPr>
+      </w:r>
+    </w:p>
+    <w:p>
+      <w:pPr>
+        <w:pStyle w:val="Normal"/>
+        <w:jc w:val="both"/>
+        <w:rPr>
+          <w:highlight w:val="none"/>
+          <w:shd w:fill="auto" w:val="clear"/>
+        </w:rPr>
+      </w:pPr>
+      <w:r>
+        <w:rPr>
+          <w:rFonts w:eastAsia="Times New Roman" w:cs="Times New Roman" w:ascii="Garamond" w:hAnsi="Garamond"/>
+          <w:color w:val="000000"/>
+          <w:kern w:val="0"/>
+          <w:sz w:val="36"/>
+          <w:szCs w:val="36"/>
+          <w:shd w:fill="auto" w:val="clear"/>
+          <w:lang w:val="en-US" w:eastAsia="zh-CN" w:bidi="hi-IN"/>
+        </w:rPr>
+        <w:t>Nosso futuro espiritual depende dessa postura. Kardec foi claro ao afirmar: “Fora da caridade não há salvação”.</w:t>
+      </w:r>
+    </w:p>
+    <w:p>
+      <w:pPr>
+        <w:pStyle w:val="Normal"/>
+        <w:jc w:val="both"/>
+        <w:rPr>
+          <w:rFonts w:ascii="Garamond" w:hAnsi="Garamond" w:eastAsia="Times New Roman" w:cs="Times New Roman"/>
+          <w:color w:val="000000"/>
+          <w:kern w:val="0"/>
+          <w:sz w:val="36"/>
+          <w:szCs w:val="36"/>
+          <w:lang w:val="en-US" w:eastAsia="zh-CN" w:bidi="hi-IN"/>
+        </w:rPr>
+      </w:pPr>
+      <w:r>
+        <w:rPr>
+          <w:shd w:fill="auto" w:val="clear"/>
+        </w:rPr>
+      </w:r>
+    </w:p>
+    <w:p>
+      <w:pPr>
+        <w:pStyle w:val="Normal"/>
+        <w:jc w:val="both"/>
+        <w:rPr>
+          <w:highlight w:val="none"/>
+          <w:shd w:fill="auto" w:val="clear"/>
+        </w:rPr>
+      </w:pPr>
+      <w:r>
+        <w:rPr>
+          <w:rFonts w:eastAsia="Times New Roman" w:cs="Times New Roman" w:ascii="Garamond" w:hAnsi="Garamond"/>
+          <w:color w:val="000000"/>
+          <w:kern w:val="0"/>
+          <w:sz w:val="36"/>
+          <w:szCs w:val="36"/>
+          <w:shd w:fill="auto" w:val="clear"/>
+          <w:lang w:val="en-US" w:eastAsia="zh-CN" w:bidi="hi-IN"/>
+        </w:rPr>
+        <w:t>Nos vinculamos ao mal, vibrando em suas faixas inferiores, perdendo assim a oportunidade de merecer um lugar na Terra de regeneração?</w:t>
+      </w:r>
+    </w:p>
+    <w:p>
+      <w:pPr>
+        <w:pStyle w:val="Normal"/>
+        <w:jc w:val="both"/>
+        <w:rPr>
+          <w:rFonts w:ascii="Garamond" w:hAnsi="Garamond" w:eastAsia="Times New Roman" w:cs="Times New Roman"/>
+          <w:color w:val="000000"/>
+          <w:kern w:val="0"/>
+          <w:sz w:val="36"/>
+          <w:szCs w:val="36"/>
+          <w:lang w:val="en-US" w:eastAsia="zh-CN" w:bidi="hi-IN"/>
+        </w:rPr>
+      </w:pPr>
+      <w:r>
+        <w:rPr>
+          <w:shd w:fill="auto" w:val="clear"/>
+        </w:rPr>
+      </w:r>
+    </w:p>
+    <w:p>
+      <w:pPr>
+        <w:pStyle w:val="Normal"/>
+        <w:jc w:val="both"/>
+        <w:rPr>
+          <w:highlight w:val="none"/>
+          <w:shd w:fill="auto" w:val="clear"/>
+        </w:rPr>
+      </w:pPr>
+      <w:r>
+        <w:rPr>
+          <w:rFonts w:eastAsia="Times New Roman" w:cs="Times New Roman" w:ascii="Garamond" w:hAnsi="Garamond"/>
+          <w:color w:val="000000"/>
+          <w:kern w:val="0"/>
+          <w:sz w:val="36"/>
+          <w:szCs w:val="36"/>
+          <w:shd w:fill="auto" w:val="clear"/>
+          <w:lang w:val="en-US" w:eastAsia="zh-CN" w:bidi="hi-IN"/>
+        </w:rPr>
+        <w:t>Ou seguimos cultivando o trigo das boas ações, atentos para que ele não seja contaminado pelo joio — seja aquele que ainda existe em nós, seja aquele que possa ser semeado pelos outros?</w:t>
+      </w:r>
+    </w:p>
+    <w:p>
+      <w:pPr>
+        <w:pStyle w:val="Normal"/>
+        <w:jc w:val="both"/>
+        <w:rPr>
+          <w:rFonts w:ascii="Garamond" w:hAnsi="Garamond" w:eastAsia="Times New Roman" w:cs="Times New Roman"/>
+          <w:color w:val="000000"/>
+          <w:kern w:val="0"/>
+          <w:sz w:val="36"/>
+          <w:szCs w:val="36"/>
+          <w:lang w:val="en-US" w:eastAsia="zh-CN" w:bidi="hi-IN"/>
+        </w:rPr>
+      </w:pPr>
+      <w:r>
+        <w:rPr>
+          <w:shd w:fill="auto" w:val="clear"/>
+        </w:rPr>
+      </w:r>
+    </w:p>
+    <w:p>
+      <w:pPr>
+        <w:pStyle w:val="Normal"/>
+        <w:jc w:val="both"/>
+        <w:rPr>
+          <w:highlight w:val="none"/>
+          <w:shd w:fill="auto" w:val="clear"/>
+        </w:rPr>
+      </w:pPr>
+      <w:r>
+        <w:rPr>
+          <w:rFonts w:eastAsia="Times New Roman" w:cs="Times New Roman" w:ascii="Garamond" w:hAnsi="Garamond"/>
+          <w:color w:val="000000"/>
+          <w:kern w:val="0"/>
+          <w:sz w:val="36"/>
+          <w:szCs w:val="36"/>
+          <w:shd w:fill="auto" w:val="clear"/>
+          <w:lang w:val="en-US" w:eastAsia="zh-CN" w:bidi="hi-IN"/>
+        </w:rPr>
+        <w:t>A decisão é nossa.</w:t>
       </w:r>
     </w:p>
     <w:sectPr>
@@ -4793,7 +6269,7 @@
         <w:bCs/>
         <w:rFonts w:ascii="Garamond" w:hAnsi="Garamond"/>
       </w:rPr>
-      <w:t>19</w:t>
+      <w:t>25</w:t>
     </w:r>
     <w:r>
       <w:rPr>

</xml_diff>

<commit_message>
11/06/2026 - 21:03 h
</commit_message>
<xml_diff>
--- a/O joio e o trigo, o mal e o bem/O joio e o trigo.docx
+++ b/O joio e o trigo, o mal e o bem/O joio e o trigo.docx
@@ -2197,6 +2197,8 @@
       <w:r>
         <w:rPr>
           <w:rFonts w:eastAsia="Times New Roman" w:cs="Times New Roman" w:ascii="Garamond" w:hAnsi="Garamond"/>
+          <w:i/>
+          <w:iCs/>
           <w:color w:val="000000"/>
           <w:kern w:val="0"/>
           <w:sz w:val="36"/>
@@ -2248,7 +2250,15 @@
         </w:rPr>
       </w:pPr>
       <w:r>
-        <w:rPr/>
+        <w:rPr>
+          <w:rFonts w:eastAsia="Times New Roman" w:cs="Times New Roman" w:ascii="Garamond" w:hAnsi="Garamond"/>
+          <w:color w:val="000000"/>
+          <w:kern w:val="0"/>
+          <w:sz w:val="36"/>
+          <w:szCs w:val="36"/>
+          <w:shd w:fill="auto" w:val="clear"/>
+          <w:lang w:val="en-US" w:eastAsia="zh-CN" w:bidi="hi-IN"/>
+        </w:rPr>
       </w:r>
     </w:p>
     <w:p>
@@ -2498,7 +2508,15 @@
         </w:rPr>
       </w:pPr>
       <w:r>
-        <w:rPr/>
+        <w:rPr>
+          <w:rFonts w:eastAsia="Times New Roman" w:cs="Times New Roman" w:ascii="Garamond" w:hAnsi="Garamond"/>
+          <w:color w:val="000000"/>
+          <w:kern w:val="0"/>
+          <w:sz w:val="36"/>
+          <w:szCs w:val="36"/>
+          <w:shd w:fill="auto" w:val="clear"/>
+          <w:lang w:val="en-US" w:eastAsia="zh-CN" w:bidi="hi-IN"/>
+        </w:rPr>
       </w:r>
     </w:p>
     <w:p>
@@ -2739,7 +2757,10 @@
         </w:rPr>
       </w:pPr>
       <w:r>
-        <w:rPr/>
+        <w:rPr>
+          <w:b w:val="false"/>
+          <w:bCs w:val="false"/>
+        </w:rPr>
       </w:r>
     </w:p>
     <w:p>
@@ -2958,43 +2979,7 @@
           <w:shd w:fill="auto" w:val="clear"/>
           <w:lang w:val="en-US" w:eastAsia="zh-CN" w:bidi="hi-IN"/>
         </w:rPr>
-        <w:t>Como o</w:t>
-      </w:r>
-      <w:r>
-        <w:rPr>
-          <w:rFonts w:eastAsia="Times New Roman" w:cs="Times New Roman" w:ascii="Garamond" w:hAnsi="Garamond"/>
-          <w:color w:val="000000"/>
-          <w:kern w:val="0"/>
-          <w:sz w:val="36"/>
-          <w:szCs w:val="36"/>
-          <w:shd w:fill="auto" w:val="clear"/>
-          <w:lang w:val="en-US" w:eastAsia="zh-CN" w:bidi="hi-IN"/>
-        </w:rPr>
-        <w:t xml:space="preserve"> próprio Mestre Jesus nos explicou o significado da parábola</w:t>
-      </w:r>
-      <w:r>
-        <w:rPr>
-          <w:rFonts w:eastAsia="Times New Roman" w:cs="Times New Roman" w:ascii="Garamond" w:hAnsi="Garamond"/>
-          <w:color w:val="000000"/>
-          <w:kern w:val="0"/>
-          <w:sz w:val="36"/>
-          <w:szCs w:val="36"/>
-          <w:shd w:fill="auto" w:val="clear"/>
-          <w:lang w:val="en-US" w:eastAsia="zh-CN" w:bidi="hi-IN"/>
-        </w:rPr>
-        <w:t>, nossa intenção é apenas explorar</w:t>
-      </w:r>
-      <w:r>
-        <w:rPr>
-          <w:rFonts w:eastAsia="Times New Roman" w:cs="Times New Roman" w:ascii="Garamond" w:hAnsi="Garamond"/>
-          <w:color w:val="000000"/>
-          <w:kern w:val="0"/>
-          <w:sz w:val="36"/>
-          <w:szCs w:val="36"/>
-          <w:shd w:fill="auto" w:val="clear"/>
-          <w:lang w:val="en-US" w:eastAsia="zh-CN" w:bidi="hi-IN"/>
-        </w:rPr>
-        <w:t xml:space="preserve"> alguns de seus elementos sob uma perspectiva complementar.</w:t>
+        <w:t>Como o próprio Mestre Jesus nos explicou o significado da parábola, nossa intenção é apenas explorar alguns de seus elementos sob uma perspectiva complementar.</w:t>
       </w:r>
     </w:p>
     <w:p>
@@ -3421,31 +3406,7 @@
           <w:shd w:fill="auto" w:val="clear"/>
           <w:lang w:val="en-US" w:eastAsia="zh-CN" w:bidi="hi-IN"/>
         </w:rPr>
-        <w:t xml:space="preserve">: como o próprio Mestre Jesus </w:t>
-      </w:r>
-      <w:r>
-        <w:rPr>
-          <w:rFonts w:eastAsia="Times New Roman" w:cs="Times New Roman" w:ascii="Garamond" w:hAnsi="Garamond"/>
-          <w:color w:val="000000"/>
-          <w:kern w:val="0"/>
-          <w:sz w:val="36"/>
-          <w:szCs w:val="36"/>
-          <w:shd w:fill="auto" w:val="clear"/>
-          <w:lang w:val="en-US" w:eastAsia="zh-CN" w:bidi="hi-IN"/>
-        </w:rPr>
-        <w:t>disse,</w:t>
-      </w:r>
-      <w:r>
-        <w:rPr>
-          <w:rFonts w:eastAsia="Times New Roman" w:cs="Times New Roman" w:ascii="Garamond" w:hAnsi="Garamond"/>
-          <w:color w:val="000000"/>
-          <w:kern w:val="0"/>
-          <w:sz w:val="36"/>
-          <w:szCs w:val="36"/>
-          <w:shd w:fill="auto" w:val="clear"/>
-          <w:lang w:val="en-US" w:eastAsia="zh-CN" w:bidi="hi-IN"/>
-        </w:rPr>
-        <w:t xml:space="preserve"> Ele é o divino Semeador, e a boa semente é o seu Evangelho de luz e de amor.</w:t>
+        <w:t>: como o próprio Mestre Jesus disse, Ele é o divino Semeador, e a boa semente é o seu Evangelho de luz e de amor.</w:t>
       </w:r>
     </w:p>
     <w:p>
@@ -3500,31 +3461,7 @@
           <w:shd w:fill="auto" w:val="clear"/>
           <w:lang w:val="en-US" w:eastAsia="zh-CN" w:bidi="hi-IN"/>
         </w:rPr>
-        <w:t>Ao longo dos milênios, o Cristo tem semeado, nos corações d</w:t>
-      </w:r>
-      <w:r>
-        <w:rPr>
-          <w:rFonts w:eastAsia="Times New Roman" w:cs="Times New Roman" w:ascii="Garamond" w:hAnsi="Garamond"/>
-          <w:color w:val="000000"/>
-          <w:kern w:val="0"/>
-          <w:sz w:val="36"/>
-          <w:szCs w:val="36"/>
-          <w:shd w:fill="auto" w:val="clear"/>
-          <w:lang w:val="en-US" w:eastAsia="zh-CN" w:bidi="hi-IN"/>
-        </w:rPr>
-        <w:t>e toda a</w:t>
-      </w:r>
-      <w:r>
-        <w:rPr>
-          <w:rFonts w:eastAsia="Times New Roman" w:cs="Times New Roman" w:ascii="Garamond" w:hAnsi="Garamond"/>
-          <w:color w:val="000000"/>
-          <w:kern w:val="0"/>
-          <w:sz w:val="36"/>
-          <w:szCs w:val="36"/>
-          <w:shd w:fill="auto" w:val="clear"/>
-          <w:lang w:val="en-US" w:eastAsia="zh-CN" w:bidi="hi-IN"/>
-        </w:rPr>
-        <w:t xml:space="preserve"> humanidade, a semente do bem. E, em Sua infinita misericórdia, aguarda paciente que essa semente germine, floresça e dê frutos — no tempo de cada um de nós.</w:t>
+        <w:t>Ao longo dos milênios, o Cristo tem semeado, nos corações de toda a humanidade, a semente do bem. E, em Sua infinita misericórdia, aguarda paciente que essa semente germine, floresça e dê frutos — no tempo de cada um de nós.</w:t>
       </w:r>
     </w:p>
     <w:p>
@@ -3733,55 +3670,7 @@
           <w:shd w:fill="auto" w:val="clear"/>
           <w:lang w:val="en-US" w:eastAsia="zh-CN" w:bidi="hi-IN"/>
         </w:rPr>
-        <w:t>, reafirma as palavras do Mestre, mas nos diz também que, como em qualquer campo de lavoura, o mundo possui faixas de terra excelentes e zonas necessitadas</w:t>
-      </w:r>
-      <w:r>
-        <w:rPr>
-          <w:rFonts w:eastAsia="Times New Roman" w:cs="Times New Roman" w:ascii="Garamond" w:hAnsi="Garamond"/>
-          <w:color w:val="000000"/>
-          <w:kern w:val="0"/>
-          <w:sz w:val="36"/>
-          <w:szCs w:val="36"/>
-          <w:shd w:fill="auto" w:val="clear"/>
-          <w:lang w:val="en-US" w:eastAsia="zh-CN" w:bidi="hi-IN"/>
-        </w:rPr>
-        <w:t xml:space="preserve"> de </w:t>
-      </w:r>
-      <w:r>
-        <w:rPr>
-          <w:rFonts w:eastAsia="Times New Roman" w:cs="Times New Roman" w:ascii="Garamond" w:hAnsi="Garamond"/>
-          <w:color w:val="000000"/>
-          <w:kern w:val="0"/>
-          <w:sz w:val="36"/>
-          <w:szCs w:val="36"/>
-          <w:shd w:fill="auto" w:val="clear"/>
-          <w:lang w:val="en-US" w:eastAsia="zh-CN" w:bidi="hi-IN"/>
-        </w:rPr>
-        <w:t xml:space="preserve"> </w:t>
-      </w:r>
-      <w:r>
-        <w:rPr>
-          <w:rFonts w:eastAsia="Times New Roman" w:cs="Times New Roman" w:ascii="Garamond" w:hAnsi="Garamond"/>
-          <w:color w:val="000000"/>
-          <w:kern w:val="0"/>
-          <w:sz w:val="36"/>
-          <w:szCs w:val="36"/>
-          <w:shd w:fill="auto" w:val="clear"/>
-          <w:lang w:val="en-US" w:eastAsia="zh-CN" w:bidi="hi-IN"/>
-        </w:rPr>
-        <w:t>tratamento</w:t>
-      </w:r>
-      <w:r>
-        <w:rPr>
-          <w:rFonts w:eastAsia="Times New Roman" w:cs="Times New Roman" w:ascii="Garamond" w:hAnsi="Garamond"/>
-          <w:color w:val="000000"/>
-          <w:kern w:val="0"/>
-          <w:sz w:val="36"/>
-          <w:szCs w:val="36"/>
-          <w:shd w:fill="auto" w:val="clear"/>
-          <w:lang w:val="en-US" w:eastAsia="zh-CN" w:bidi="hi-IN"/>
-        </w:rPr>
-        <w:t>.</w:t>
+        <w:t>, reafirma as palavras do Mestre, mas nos diz também que, como em qualquer campo de lavoura, o mundo possui faixas de terra excelentes e zonas necessitadas de  tratamento.</w:t>
       </w:r>
     </w:p>
     <w:p>
@@ -4486,19 +4375,7 @@
           <w:shd w:fill="auto" w:val="clear"/>
           <w:lang w:val="en-US" w:eastAsia="zh-CN" w:bidi="hi-IN"/>
         </w:rPr>
-        <w:t>Assim acontece</w:t>
-      </w:r>
-      <w:r>
-        <w:rPr>
-          <w:rFonts w:eastAsia="Times New Roman" w:cs="Times New Roman" w:ascii="Garamond" w:hAnsi="Garamond"/>
-          <w:color w:val="000000"/>
-          <w:kern w:val="0"/>
-          <w:sz w:val="36"/>
-          <w:szCs w:val="36"/>
-          <w:shd w:fill="auto" w:val="clear"/>
-          <w:lang w:val="en-US" w:eastAsia="zh-CN" w:bidi="hi-IN"/>
-        </w:rPr>
-        <w:t xml:space="preserve"> conosco. Quando estamos nos momentos turbulentos da vida, com muitos problemas, muitas preocupações, costumamos ficar atentos. </w:t>
+        <w:t xml:space="preserve">Assim acontece conosco. Quando estamos nos momentos turbulentos da vida, com muitos problemas, muitas preocupações, costumamos ficar atentos. </w:t>
       </w:r>
     </w:p>
     <w:p>
@@ -4663,67 +4540,7 @@
           <w:shd w:fill="auto" w:val="clear"/>
           <w:lang w:val="en-US" w:eastAsia="zh-CN" w:bidi="hi-IN"/>
         </w:rPr>
-        <w:t>Em momentos assim</w:t>
-      </w:r>
-      <w:r>
-        <w:rPr>
-          <w:rFonts w:eastAsia="Times New Roman" w:cs="Times New Roman" w:ascii="Garamond" w:hAnsi="Garamond"/>
-          <w:color w:val="000000"/>
-          <w:kern w:val="0"/>
-          <w:sz w:val="36"/>
-          <w:szCs w:val="36"/>
-          <w:shd w:fill="auto" w:val="clear"/>
-          <w:lang w:val="en-US" w:eastAsia="zh-CN" w:bidi="hi-IN"/>
-        </w:rPr>
-        <w:t xml:space="preserve">, o joio </w:t>
-      </w:r>
-      <w:r>
-        <w:rPr>
-          <w:rFonts w:eastAsia="Times New Roman" w:cs="Times New Roman" w:ascii="Garamond" w:hAnsi="Garamond"/>
-          <w:color w:val="000000"/>
-          <w:kern w:val="0"/>
-          <w:sz w:val="36"/>
-          <w:szCs w:val="36"/>
-          <w:shd w:fill="auto" w:val="clear"/>
-          <w:lang w:val="en-US" w:eastAsia="zh-CN" w:bidi="hi-IN"/>
-        </w:rPr>
-        <w:t>encontra terreno em nossos corações</w:t>
-      </w:r>
-      <w:r>
-        <w:rPr>
-          <w:rFonts w:eastAsia="Times New Roman" w:cs="Times New Roman" w:ascii="Garamond" w:hAnsi="Garamond"/>
-          <w:color w:val="000000"/>
-          <w:kern w:val="0"/>
-          <w:sz w:val="36"/>
-          <w:szCs w:val="36"/>
-          <w:shd w:fill="auto" w:val="clear"/>
-          <w:lang w:val="en-US" w:eastAsia="zh-CN" w:bidi="hi-IN"/>
-        </w:rPr>
-        <w:t xml:space="preserve">. </w:t>
-      </w:r>
-      <w:r>
-        <w:rPr>
-          <w:rFonts w:eastAsia="Times New Roman" w:cs="Times New Roman" w:ascii="Garamond" w:hAnsi="Garamond"/>
-          <w:color w:val="000000"/>
-          <w:kern w:val="0"/>
-          <w:sz w:val="36"/>
-          <w:szCs w:val="36"/>
-          <w:shd w:fill="auto" w:val="clear"/>
-          <w:lang w:val="en-US" w:eastAsia="zh-CN" w:bidi="hi-IN"/>
-        </w:rPr>
-        <w:t>Então, o</w:t>
-      </w:r>
-      <w:r>
-        <w:rPr>
-          <w:rFonts w:eastAsia="Times New Roman" w:cs="Times New Roman" w:ascii="Garamond" w:hAnsi="Garamond"/>
-          <w:color w:val="000000"/>
-          <w:kern w:val="0"/>
-          <w:sz w:val="36"/>
-          <w:szCs w:val="36"/>
-          <w:shd w:fill="auto" w:val="clear"/>
-          <w:lang w:val="en-US" w:eastAsia="zh-CN" w:bidi="hi-IN"/>
-        </w:rPr>
-        <w:t xml:space="preserve"> mar da vida se torna revolto e nossa embarcação fica à deriva. </w:t>
+        <w:t xml:space="preserve">Em momentos assim, o joio encontra terreno em nossos corações. Então, o mar da vida se torna revolto e nossa embarcação fica à deriva. </w:t>
       </w:r>
     </w:p>
     <w:p>
@@ -4804,31 +4621,7 @@
           <w:shd w:fill="auto" w:val="clear"/>
           <w:lang w:val="en-US" w:eastAsia="zh-CN" w:bidi="hi-IN"/>
         </w:rPr>
-        <w:t xml:space="preserve"> é ainda mais fácil de ser compreendida. Basta um olhar </w:t>
-      </w:r>
-      <w:r>
-        <w:rPr>
-          <w:rFonts w:eastAsia="Times New Roman" w:cs="Times New Roman" w:ascii="Garamond" w:hAnsi="Garamond"/>
-          <w:color w:val="000000"/>
-          <w:kern w:val="0"/>
-          <w:sz w:val="36"/>
-          <w:szCs w:val="36"/>
-          <w:shd w:fill="auto" w:val="clear"/>
-          <w:lang w:val="en-US" w:eastAsia="zh-CN" w:bidi="hi-IN"/>
-        </w:rPr>
-        <w:t xml:space="preserve">um pouco </w:t>
-      </w:r>
-      <w:r>
-        <w:rPr>
-          <w:rFonts w:eastAsia="Times New Roman" w:cs="Times New Roman" w:ascii="Garamond" w:hAnsi="Garamond"/>
-          <w:color w:val="000000"/>
-          <w:kern w:val="0"/>
-          <w:sz w:val="36"/>
-          <w:szCs w:val="36"/>
-          <w:shd w:fill="auto" w:val="clear"/>
-          <w:lang w:val="en-US" w:eastAsia="zh-CN" w:bidi="hi-IN"/>
-        </w:rPr>
-        <w:t xml:space="preserve">mais apurado para percebermos claramente que bilhões de pessoas em todo o mundo, sequer despertaram para a realidade da vida espiritual. </w:t>
+        <w:t xml:space="preserve"> é ainda mais fácil de ser compreendida. Basta um olhar um pouco mais apurado para percebermos claramente que bilhões de pessoas em todo o mundo, sequer despertaram para a realidade da vida espiritual. </w:t>
       </w:r>
     </w:p>
     <w:p>
@@ -5206,13 +4999,17 @@
         <w:pStyle w:val="Normal"/>
         <w:jc w:val="both"/>
         <w:rPr>
-          <w:color w:val="FC5C00"/>
-        </w:rPr>
-      </w:pPr>
-      <w:r>
-        <w:rPr>
-          <w:color w:val="FC5C00"/>
-        </w:rPr>
+          <w:rFonts w:ascii="Garamond" w:hAnsi="Garamond" w:eastAsia="Times New Roman" w:cs="Times New Roman"/>
+          <w:color w:val="000000"/>
+          <w:kern w:val="0"/>
+          <w:sz w:val="36"/>
+          <w:szCs w:val="36"/>
+          <w:shd w:fill="auto" w:val="clear"/>
+          <w:lang w:val="en-US" w:eastAsia="zh-CN" w:bidi="hi-IN"/>
+        </w:rPr>
+      </w:pPr>
+      <w:r>
+        <w:rPr/>
       </w:r>
     </w:p>
     <w:p>
@@ -5308,130 +5105,110 @@
           <w:shd w:fill="auto" w:val="clear"/>
           <w:lang w:val="en-US" w:eastAsia="zh-CN" w:bidi="hi-IN"/>
         </w:rPr>
-        <w:t xml:space="preserve">: </w:t>
-      </w:r>
-      <w:r>
-        <w:rPr>
-          <w:rFonts w:eastAsia="Times New Roman" w:cs="Times New Roman" w:ascii="Garamond" w:hAnsi="Garamond"/>
-          <w:color w:val="000000"/>
-          <w:kern w:val="0"/>
-          <w:sz w:val="36"/>
-          <w:szCs w:val="36"/>
-          <w:shd w:fill="auto" w:val="clear"/>
-          <w:lang w:val="en-US" w:eastAsia="zh-CN" w:bidi="hi-IN"/>
-        </w:rPr>
-        <w:t>quando falamos em inimigos, a primeira ideia que nos vem é de uma pessoa que não gosta de nós e que, tendo oportunidade, irá nos prejudicar.</w:t>
-      </w:r>
-    </w:p>
-    <w:p>
-      <w:pPr>
-        <w:pStyle w:val="Normal"/>
-        <w:jc w:val="both"/>
-        <w:rPr>
-          <w:rFonts w:ascii="Garamond" w:hAnsi="Garamond" w:eastAsia="Times New Roman" w:cs="Times New Roman"/>
-          <w:color w:val="000000"/>
-          <w:kern w:val="0"/>
-          <w:sz w:val="36"/>
-          <w:szCs w:val="36"/>
-          <w:shd w:fill="auto" w:val="clear"/>
-          <w:lang w:val="en-US" w:eastAsia="zh-CN" w:bidi="hi-IN"/>
-        </w:rPr>
-      </w:pPr>
-      <w:r>
-        <w:rPr/>
-      </w:r>
-    </w:p>
-    <w:p>
-      <w:pPr>
-        <w:pStyle w:val="Normal"/>
-        <w:jc w:val="both"/>
-        <w:rPr>
-          <w:rFonts w:ascii="Garamond" w:hAnsi="Garamond" w:eastAsia="Times New Roman" w:cs="Times New Roman"/>
-          <w:color w:val="000000"/>
-          <w:kern w:val="0"/>
-          <w:sz w:val="36"/>
-          <w:szCs w:val="36"/>
-          <w:shd w:fill="auto" w:val="clear"/>
-          <w:lang w:val="en-US" w:eastAsia="zh-CN" w:bidi="hi-IN"/>
-        </w:rPr>
-      </w:pPr>
-      <w:r>
-        <w:rPr>
-          <w:rFonts w:eastAsia="Times New Roman" w:cs="Times New Roman" w:ascii="Garamond" w:hAnsi="Garamond"/>
-          <w:color w:val="000000"/>
-          <w:kern w:val="0"/>
-          <w:sz w:val="36"/>
-          <w:szCs w:val="36"/>
-          <w:shd w:fill="auto" w:val="clear"/>
-          <w:lang w:val="en-US" w:eastAsia="zh-CN" w:bidi="hi-IN"/>
-        </w:rPr>
-        <w:t xml:space="preserve">Contudo, precisamos compreender que os vícios e as paixões que carregamos, também são nossos inimigos. Orgulho, egoísmo, cólera, intolerância, vaidade, entre outros, </w:t>
-      </w:r>
-      <w:r>
-        <w:rPr>
-          <w:rFonts w:eastAsia="Times New Roman" w:cs="Times New Roman" w:ascii="Garamond" w:hAnsi="Garamond"/>
-          <w:color w:val="000000"/>
-          <w:kern w:val="0"/>
-          <w:sz w:val="36"/>
-          <w:szCs w:val="36"/>
-          <w:shd w:fill="auto" w:val="clear"/>
-          <w:lang w:val="en-US" w:eastAsia="zh-CN" w:bidi="hi-IN"/>
-        </w:rPr>
-        <w:t xml:space="preserve">também </w:t>
-      </w:r>
-      <w:r>
-        <w:rPr>
-          <w:rFonts w:eastAsia="Times New Roman" w:cs="Times New Roman" w:ascii="Garamond" w:hAnsi="Garamond"/>
-          <w:color w:val="000000"/>
-          <w:kern w:val="0"/>
-          <w:sz w:val="36"/>
-          <w:szCs w:val="36"/>
-          <w:shd w:fill="auto" w:val="clear"/>
-          <w:lang w:val="en-US" w:eastAsia="zh-CN" w:bidi="hi-IN"/>
-        </w:rPr>
-        <w:t>são nossos inimigos</w:t>
-      </w:r>
-      <w:r>
-        <w:rPr>
-          <w:rFonts w:eastAsia="Times New Roman" w:cs="Times New Roman" w:ascii="Garamond" w:hAnsi="Garamond"/>
-          <w:color w:val="000000"/>
-          <w:kern w:val="0"/>
-          <w:sz w:val="36"/>
-          <w:szCs w:val="36"/>
-          <w:shd w:fill="auto" w:val="clear"/>
-          <w:lang w:val="en-US" w:eastAsia="zh-CN" w:bidi="hi-IN"/>
-        </w:rPr>
-        <w:t>, e são os</w:t>
-      </w:r>
-      <w:r>
-        <w:rPr>
-          <w:rFonts w:eastAsia="Times New Roman" w:cs="Times New Roman" w:ascii="Garamond" w:hAnsi="Garamond"/>
-          <w:color w:val="000000"/>
-          <w:kern w:val="0"/>
-          <w:sz w:val="36"/>
-          <w:szCs w:val="36"/>
-          <w:shd w:fill="auto" w:val="clear"/>
-          <w:lang w:val="en-US" w:eastAsia="zh-CN" w:bidi="hi-IN"/>
-        </w:rPr>
-        <w:t xml:space="preserve"> mais perigosos porque nos acompanham 24 horas por dia.</w:t>
-      </w:r>
-    </w:p>
-    <w:p>
-      <w:pPr>
-        <w:pStyle w:val="Normal"/>
-        <w:jc w:val="both"/>
-        <w:rPr>
-          <w:rFonts w:ascii="Garamond" w:hAnsi="Garamond" w:eastAsia="Times New Roman" w:cs="Times New Roman"/>
-          <w:color w:val="000000"/>
-          <w:kern w:val="0"/>
-          <w:sz w:val="36"/>
-          <w:szCs w:val="36"/>
-          <w:shd w:fill="auto" w:val="clear"/>
-          <w:lang w:val="en-US" w:eastAsia="zh-CN" w:bidi="hi-IN"/>
-        </w:rPr>
-      </w:pPr>
-      <w:r>
-        <w:rPr/>
+        <w:t>: quando falamos em inimigos, a primeira ideia que nos vem é de uma pessoa que não gosta de nós e que, tendo oportunidade, irá nos prejudicar.</w:t>
+      </w:r>
+    </w:p>
+    <w:p>
+      <w:pPr>
+        <w:pStyle w:val="Normal"/>
+        <w:jc w:val="both"/>
+        <w:rPr>
+          <w:rFonts w:ascii="Garamond" w:hAnsi="Garamond" w:eastAsia="Times New Roman" w:cs="Times New Roman"/>
+          <w:color w:val="000000"/>
+          <w:kern w:val="0"/>
+          <w:sz w:val="36"/>
+          <w:szCs w:val="36"/>
+          <w:shd w:fill="auto" w:val="clear"/>
+          <w:lang w:val="en-US" w:eastAsia="zh-CN" w:bidi="hi-IN"/>
+        </w:rPr>
+      </w:pPr>
+      <w:r>
+        <w:rPr>
+          <w:rFonts w:eastAsia="Times New Roman" w:cs="Times New Roman" w:ascii="Garamond" w:hAnsi="Garamond"/>
+          <w:color w:val="000000"/>
+          <w:kern w:val="0"/>
+          <w:sz w:val="36"/>
+          <w:szCs w:val="36"/>
+          <w:shd w:fill="auto" w:val="clear"/>
+          <w:lang w:val="en-US" w:eastAsia="zh-CN" w:bidi="hi-IN"/>
+        </w:rPr>
+      </w:r>
+    </w:p>
+    <w:p>
+      <w:pPr>
+        <w:pStyle w:val="Normal"/>
+        <w:jc w:val="both"/>
+        <w:rPr>
+          <w:rFonts w:ascii="Garamond" w:hAnsi="Garamond" w:eastAsia="Times New Roman" w:cs="Times New Roman"/>
+          <w:color w:val="000000"/>
+          <w:kern w:val="0"/>
+          <w:sz w:val="36"/>
+          <w:szCs w:val="36"/>
+          <w:shd w:fill="auto" w:val="clear"/>
+          <w:lang w:val="en-US" w:eastAsia="zh-CN" w:bidi="hi-IN"/>
+        </w:rPr>
+      </w:pPr>
+      <w:r>
+        <w:rPr>
+          <w:rFonts w:eastAsia="Times New Roman" w:cs="Times New Roman" w:ascii="Garamond" w:hAnsi="Garamond"/>
+          <w:color w:val="000000"/>
+          <w:kern w:val="0"/>
+          <w:sz w:val="36"/>
+          <w:szCs w:val="36"/>
+          <w:shd w:fill="auto" w:val="clear"/>
+          <w:lang w:val="en-US" w:eastAsia="zh-CN" w:bidi="hi-IN"/>
+        </w:rPr>
+        <w:t xml:space="preserve">Contudo, precisamos compreender que os vícios e as paixões que carregamos, também são nossos inimigos. Orgulho, egoísmo, cólera, intolerância, vaidade, entre outros, também são </w:t>
+      </w:r>
+      <w:r>
+        <w:rPr>
+          <w:rFonts w:eastAsia="Times New Roman" w:cs="Times New Roman" w:ascii="Garamond" w:hAnsi="Garamond"/>
+          <w:color w:val="000000"/>
+          <w:kern w:val="0"/>
+          <w:sz w:val="36"/>
+          <w:szCs w:val="36"/>
+          <w:shd w:fill="auto" w:val="clear"/>
+          <w:lang w:val="en-US" w:eastAsia="zh-CN" w:bidi="hi-IN"/>
+        </w:rPr>
+        <w:t xml:space="preserve">os </w:t>
+      </w:r>
+      <w:r>
+        <w:rPr>
+          <w:rFonts w:eastAsia="Times New Roman" w:cs="Times New Roman" w:ascii="Garamond" w:hAnsi="Garamond"/>
+          <w:color w:val="000000"/>
+          <w:kern w:val="0"/>
+          <w:sz w:val="36"/>
+          <w:szCs w:val="36"/>
+          <w:shd w:fill="auto" w:val="clear"/>
+          <w:lang w:val="en-US" w:eastAsia="zh-CN" w:bidi="hi-IN"/>
+        </w:rPr>
+        <w:t>nossos inimigos mais perigosos porque nos acompanham 24 horas por dia.</w:t>
+      </w:r>
+    </w:p>
+    <w:p>
+      <w:pPr>
+        <w:pStyle w:val="Normal"/>
+        <w:jc w:val="both"/>
+        <w:rPr>
+          <w:rFonts w:ascii="Garamond" w:hAnsi="Garamond" w:eastAsia="Times New Roman" w:cs="Times New Roman"/>
+          <w:color w:val="000000"/>
+          <w:kern w:val="0"/>
+          <w:sz w:val="36"/>
+          <w:szCs w:val="36"/>
+          <w:shd w:fill="auto" w:val="clear"/>
+          <w:lang w:val="en-US" w:eastAsia="zh-CN" w:bidi="hi-IN"/>
+        </w:rPr>
+      </w:pPr>
+      <w:r>
+        <w:rPr>
+          <w:rFonts w:eastAsia="Times New Roman" w:cs="Times New Roman" w:ascii="Garamond" w:hAnsi="Garamond"/>
+          <w:color w:val="000000"/>
+          <w:kern w:val="0"/>
+          <w:sz w:val="36"/>
+          <w:szCs w:val="36"/>
+          <w:shd w:fill="auto" w:val="clear"/>
+          <w:lang w:val="en-US" w:eastAsia="zh-CN" w:bidi="hi-IN"/>
+        </w:rPr>
       </w:r>
     </w:p>
     <w:p>
@@ -5476,7 +5253,15 @@
         </w:rPr>
       </w:pPr>
       <w:r>
-        <w:rPr/>
+        <w:rPr>
+          <w:rFonts w:eastAsia="Times New Roman" w:cs="Times New Roman" w:ascii="Garamond" w:hAnsi="Garamond"/>
+          <w:color w:val="000000"/>
+          <w:kern w:val="0"/>
+          <w:sz w:val="36"/>
+          <w:szCs w:val="36"/>
+          <w:shd w:fill="auto" w:val="clear"/>
+          <w:lang w:val="en-US" w:eastAsia="zh-CN" w:bidi="hi-IN"/>
+        </w:rPr>
       </w:r>
     </w:p>
     <w:p>
@@ -5521,7 +5306,15 @@
         </w:rPr>
       </w:pPr>
       <w:r>
-        <w:rPr/>
+        <w:rPr>
+          <w:rFonts w:eastAsia="Times New Roman" w:cs="Times New Roman" w:ascii="Garamond" w:hAnsi="Garamond"/>
+          <w:color w:val="000000"/>
+          <w:kern w:val="0"/>
+          <w:sz w:val="36"/>
+          <w:szCs w:val="36"/>
+          <w:shd w:fill="auto" w:val="clear"/>
+          <w:lang w:val="en-US" w:eastAsia="zh-CN" w:bidi="hi-IN"/>
+        </w:rPr>
       </w:r>
     </w:p>
     <w:p>
@@ -5582,6 +5375,71 @@
         </w:rPr>
       </w:pPr>
       <w:r>
+        <w:rPr>
+          <w:rFonts w:eastAsia="Times New Roman" w:cs="Times New Roman" w:ascii="Garamond" w:hAnsi="Garamond"/>
+          <w:color w:val="000000"/>
+          <w:kern w:val="0"/>
+          <w:sz w:val="36"/>
+          <w:szCs w:val="36"/>
+          <w:shd w:fill="auto" w:val="clear"/>
+          <w:lang w:val="en-US" w:eastAsia="zh-CN" w:bidi="hi-IN"/>
+        </w:rPr>
+      </w:r>
+    </w:p>
+    <w:p>
+      <w:pPr>
+        <w:pStyle w:val="Normal"/>
+        <w:jc w:val="both"/>
+        <w:rPr>
+          <w:rFonts w:ascii="Garamond" w:hAnsi="Garamond" w:eastAsia="Times New Roman" w:cs="Times New Roman"/>
+          <w:color w:val="000000"/>
+          <w:kern w:val="0"/>
+          <w:sz w:val="36"/>
+          <w:szCs w:val="36"/>
+          <w:shd w:fill="auto" w:val="clear"/>
+          <w:lang w:val="en-US" w:eastAsia="zh-CN" w:bidi="hi-IN"/>
+        </w:rPr>
+      </w:pPr>
+      <w:r>
+        <w:rPr>
+          <w:rFonts w:eastAsia="Times New Roman" w:cs="Times New Roman" w:ascii="Garamond" w:hAnsi="Garamond"/>
+          <w:color w:val="000000"/>
+          <w:kern w:val="0"/>
+          <w:sz w:val="36"/>
+          <w:szCs w:val="36"/>
+          <w:shd w:fill="auto" w:val="clear"/>
+          <w:lang w:val="en-US" w:eastAsia="zh-CN" w:bidi="hi-IN"/>
+        </w:rPr>
+        <w:t>Isso significa que, por mais que tenhamos contato com o mal, por mais que o joio seja lançado no solo de nossos corações, a decisão final de cultivá-lo é sempre nossa. Nós decidimos se deixamos a semente do joio progredir ou se vamos deixá-la secar</w:t>
+      </w:r>
+      <w:r>
+        <w:rPr>
+          <w:rFonts w:eastAsia="Times New Roman" w:cs="Times New Roman" w:ascii="Garamond" w:hAnsi="Garamond"/>
+          <w:color w:val="000000"/>
+          <w:kern w:val="0"/>
+          <w:sz w:val="36"/>
+          <w:szCs w:val="36"/>
+          <w:shd w:fill="auto" w:val="clear"/>
+          <w:lang w:val="en-US" w:eastAsia="zh-CN" w:bidi="hi-IN"/>
+        </w:rPr>
+        <w:t>.</w:t>
+      </w:r>
+    </w:p>
+    <w:p>
+      <w:pPr>
+        <w:pStyle w:val="Normal"/>
+        <w:jc w:val="both"/>
+        <w:rPr>
+          <w:rFonts w:ascii="Garamond" w:hAnsi="Garamond" w:eastAsia="Times New Roman" w:cs="Times New Roman"/>
+          <w:color w:val="000000"/>
+          <w:kern w:val="0"/>
+          <w:sz w:val="36"/>
+          <w:szCs w:val="36"/>
+          <w:shd w:fill="auto" w:val="clear"/>
+          <w:lang w:val="en-US" w:eastAsia="zh-CN" w:bidi="hi-IN"/>
+        </w:rPr>
+      </w:pPr>
+      <w:r>
         <w:rPr/>
       </w:r>
     </w:p>
@@ -5609,33 +5467,931 @@
           <w:shd w:fill="auto" w:val="clear"/>
           <w:lang w:val="en-US" w:eastAsia="zh-CN" w:bidi="hi-IN"/>
         </w:rPr>
-        <w:t>Isso significa que, por mais que tenhamos contato com o mal, por mais que o joio seja lançado no solo de nossos corações, a decisão final de cultivá-lo é sempre nossa. Nós decidimos se deixamos a semente do joio progredir ou se vamos deixá-la secar [ Parei aqui em 07/06/2026 ]</w:t>
-      </w:r>
-    </w:p>
-    <w:p>
-      <w:pPr>
-        <w:pStyle w:val="Normal"/>
-        <w:jc w:val="both"/>
-        <w:rPr>
-          <w:rFonts w:ascii="Garamond" w:hAnsi="Garamond" w:eastAsia="Times New Roman" w:cs="Times New Roman"/>
-          <w:color w:val="000000"/>
-          <w:kern w:val="0"/>
-          <w:sz w:val="36"/>
-          <w:szCs w:val="36"/>
-          <w:shd w:fill="auto" w:val="clear"/>
-          <w:lang w:val="en-US" w:eastAsia="zh-CN" w:bidi="hi-IN"/>
-        </w:rPr>
-      </w:pPr>
-      <w:r>
-        <w:rPr>
-          <w:rFonts w:eastAsia="Times New Roman" w:cs="Times New Roman" w:ascii="Garamond" w:hAnsi="Garamond"/>
-          <w:color w:val="000000"/>
-          <w:kern w:val="0"/>
-          <w:sz w:val="36"/>
-          <w:szCs w:val="36"/>
-          <w:shd w:fill="auto" w:val="clear"/>
-          <w:lang w:val="en-US" w:eastAsia="zh-CN" w:bidi="hi-IN"/>
-        </w:rPr>
+        <w:t xml:space="preserve">Recorrendo uma vez mais à Emmanuel, agora na obra </w:t>
+      </w:r>
+      <w:r>
+        <w:rPr>
+          <w:rFonts w:eastAsia="Times New Roman" w:cs="Times New Roman" w:ascii="Garamond" w:hAnsi="Garamond"/>
+          <w:i/>
+          <w:iCs/>
+          <w:color w:val="000000"/>
+          <w:kern w:val="0"/>
+          <w:sz w:val="36"/>
+          <w:szCs w:val="36"/>
+          <w:shd w:fill="auto" w:val="clear"/>
+          <w:lang w:val="en-US" w:eastAsia="zh-CN" w:bidi="hi-IN"/>
+        </w:rPr>
+        <w:t>Pão Nosso</w:t>
+      </w:r>
+      <w:r>
+        <w:rPr>
+          <w:rFonts w:eastAsia="Times New Roman" w:cs="Times New Roman" w:ascii="Garamond" w:hAnsi="Garamond"/>
+          <w:color w:val="000000"/>
+          <w:kern w:val="0"/>
+          <w:sz w:val="36"/>
+          <w:szCs w:val="36"/>
+          <w:shd w:fill="auto" w:val="clear"/>
+          <w:lang w:val="en-US" w:eastAsia="zh-CN" w:bidi="hi-IN"/>
+        </w:rPr>
+        <w:t xml:space="preserve">, lição de número 91 intitulada </w:t>
+      </w:r>
+      <w:r>
+        <w:rPr>
+          <w:rFonts w:eastAsia="Times New Roman" w:cs="Times New Roman" w:ascii="Garamond" w:hAnsi="Garamond"/>
+          <w:i/>
+          <w:iCs/>
+          <w:color w:val="000000"/>
+          <w:kern w:val="0"/>
+          <w:sz w:val="36"/>
+          <w:szCs w:val="36"/>
+          <w:shd w:fill="auto" w:val="clear"/>
+          <w:lang w:val="en-US" w:eastAsia="zh-CN" w:bidi="hi-IN"/>
+        </w:rPr>
+        <w:t>Isso é Contigo</w:t>
+      </w:r>
+      <w:r>
+        <w:rPr>
+          <w:rFonts w:eastAsia="Times New Roman" w:cs="Times New Roman" w:ascii="Garamond" w:hAnsi="Garamond"/>
+          <w:color w:val="000000"/>
+          <w:kern w:val="0"/>
+          <w:sz w:val="36"/>
+          <w:szCs w:val="36"/>
+          <w:shd w:fill="auto" w:val="clear"/>
+          <w:lang w:val="en-US" w:eastAsia="zh-CN" w:bidi="hi-IN"/>
+        </w:rPr>
+        <w:t>. Nessa lição, Emmanuel se utiliza do caso de Judas para nos dizer que, por mais que alguém nos induza ao erro, a decisão final de aceitar tais sugestões é sempre nossa.</w:t>
+      </w:r>
+    </w:p>
+    <w:p>
+      <w:pPr>
+        <w:pStyle w:val="Normal"/>
+        <w:jc w:val="both"/>
+        <w:rPr>
+          <w:rFonts w:ascii="Garamond" w:hAnsi="Garamond" w:eastAsia="Times New Roman" w:cs="Times New Roman"/>
+          <w:color w:val="000000"/>
+          <w:kern w:val="0"/>
+          <w:sz w:val="36"/>
+          <w:szCs w:val="36"/>
+          <w:shd w:fill="auto" w:val="clear"/>
+          <w:lang w:val="en-US" w:eastAsia="zh-CN" w:bidi="hi-IN"/>
+        </w:rPr>
+      </w:pPr>
+      <w:r>
+        <w:rPr/>
+      </w:r>
+    </w:p>
+    <w:p>
+      <w:pPr>
+        <w:pStyle w:val="Normal"/>
+        <w:jc w:val="both"/>
+        <w:rPr>
+          <w:rFonts w:ascii="Garamond" w:hAnsi="Garamond" w:eastAsia="Times New Roman" w:cs="Times New Roman"/>
+          <w:color w:val="000000"/>
+          <w:kern w:val="0"/>
+          <w:sz w:val="36"/>
+          <w:szCs w:val="36"/>
+          <w:shd w:fill="auto" w:val="clear"/>
+          <w:lang w:val="en-US" w:eastAsia="zh-CN" w:bidi="hi-IN"/>
+        </w:rPr>
+      </w:pPr>
+      <w:r>
+        <w:rPr>
+          <w:rFonts w:eastAsia="Times New Roman" w:cs="Times New Roman" w:ascii="Garamond" w:hAnsi="Garamond"/>
+          <w:color w:val="000000"/>
+          <w:kern w:val="0"/>
+          <w:sz w:val="36"/>
+          <w:szCs w:val="36"/>
+          <w:shd w:fill="auto" w:val="clear"/>
+          <w:lang w:val="en-US" w:eastAsia="zh-CN" w:bidi="hi-IN"/>
+        </w:rPr>
+        <w:t xml:space="preserve">Judas, </w:t>
+      </w:r>
+      <w:r>
+        <w:rPr>
+          <w:rFonts w:eastAsia="Times New Roman" w:cs="Times New Roman" w:ascii="Garamond" w:hAnsi="Garamond"/>
+          <w:color w:val="000000"/>
+          <w:kern w:val="0"/>
+          <w:sz w:val="36"/>
+          <w:szCs w:val="36"/>
+          <w:shd w:fill="auto" w:val="clear"/>
+          <w:lang w:val="en-US" w:eastAsia="zh-CN" w:bidi="hi-IN"/>
+        </w:rPr>
+        <w:t>quando tomou consciência das consequências do seu ato de entregar Jesus, procurou os sumo sacerdotes para devolver-lhes as 30 moedas e desfazer o acordo.</w:t>
+      </w:r>
+    </w:p>
+    <w:p>
+      <w:pPr>
+        <w:pStyle w:val="Normal"/>
+        <w:jc w:val="both"/>
+        <w:rPr>
+          <w:rFonts w:ascii="Garamond" w:hAnsi="Garamond" w:eastAsia="Times New Roman" w:cs="Times New Roman"/>
+          <w:color w:val="000000"/>
+          <w:kern w:val="0"/>
+          <w:sz w:val="36"/>
+          <w:szCs w:val="36"/>
+          <w:shd w:fill="auto" w:val="clear"/>
+          <w:lang w:val="en-US" w:eastAsia="zh-CN" w:bidi="hi-IN"/>
+        </w:rPr>
+      </w:pPr>
+      <w:r>
+        <w:rPr/>
+      </w:r>
+    </w:p>
+    <w:p>
+      <w:pPr>
+        <w:pStyle w:val="Normal"/>
+        <w:jc w:val="both"/>
+        <w:rPr>
+          <w:rFonts w:ascii="Garamond" w:hAnsi="Garamond" w:eastAsia="Times New Roman" w:cs="Times New Roman"/>
+          <w:color w:val="000000"/>
+          <w:kern w:val="0"/>
+          <w:sz w:val="36"/>
+          <w:szCs w:val="36"/>
+          <w:shd w:fill="auto" w:val="clear"/>
+          <w:lang w:val="en-US" w:eastAsia="zh-CN" w:bidi="hi-IN"/>
+        </w:rPr>
+      </w:pPr>
+      <w:r>
+        <w:rPr>
+          <w:rFonts w:eastAsia="Times New Roman" w:cs="Times New Roman" w:ascii="Garamond" w:hAnsi="Garamond"/>
+          <w:color w:val="000000"/>
+          <w:kern w:val="0"/>
+          <w:sz w:val="36"/>
+          <w:szCs w:val="36"/>
+          <w:shd w:fill="auto" w:val="clear"/>
+          <w:lang w:val="en-US" w:eastAsia="zh-CN" w:bidi="hi-IN"/>
+        </w:rPr>
+        <w:t xml:space="preserve">Ele diz aos sumo sacerdotes: </w:t>
+      </w:r>
+      <w:r>
+        <w:rPr>
+          <w:rFonts w:eastAsia="Times New Roman" w:cs="Times New Roman" w:ascii="Garamond" w:hAnsi="Garamond"/>
+          <w:i/>
+          <w:iCs/>
+          <w:color w:val="000000"/>
+          <w:kern w:val="0"/>
+          <w:sz w:val="36"/>
+          <w:szCs w:val="36"/>
+          <w:shd w:fill="auto" w:val="clear"/>
+          <w:lang w:val="en-US" w:eastAsia="zh-CN" w:bidi="hi-IN"/>
+        </w:rPr>
+        <w:t>Pequei, traindo o sangue inocente</w:t>
+      </w:r>
+      <w:r>
+        <w:rPr>
+          <w:rFonts w:eastAsia="Times New Roman" w:cs="Times New Roman" w:ascii="Garamond" w:hAnsi="Garamond"/>
+          <w:color w:val="000000"/>
+          <w:kern w:val="0"/>
+          <w:sz w:val="36"/>
+          <w:szCs w:val="36"/>
+          <w:shd w:fill="auto" w:val="clear"/>
+          <w:lang w:val="en-US" w:eastAsia="zh-CN" w:bidi="hi-IN"/>
+        </w:rPr>
+        <w:t xml:space="preserve">. Eles, porém, responderam: </w:t>
+      </w:r>
+      <w:r>
+        <w:rPr>
+          <w:rFonts w:eastAsia="Times New Roman" w:cs="Times New Roman" w:ascii="Garamond" w:hAnsi="Garamond"/>
+          <w:i/>
+          <w:iCs/>
+          <w:color w:val="000000"/>
+          <w:kern w:val="0"/>
+          <w:sz w:val="36"/>
+          <w:szCs w:val="36"/>
+          <w:shd w:fill="auto" w:val="clear"/>
+          <w:lang w:val="en-US" w:eastAsia="zh-CN" w:bidi="hi-IN"/>
+        </w:rPr>
+        <w:t>Que nos importa? Isso é contigo</w:t>
+      </w:r>
+      <w:r>
+        <w:rPr>
+          <w:rFonts w:eastAsia="Times New Roman" w:cs="Times New Roman" w:ascii="Garamond" w:hAnsi="Garamond"/>
+          <w:color w:val="000000"/>
+          <w:kern w:val="0"/>
+          <w:sz w:val="36"/>
+          <w:szCs w:val="36"/>
+          <w:shd w:fill="auto" w:val="clear"/>
+          <w:lang w:val="en-US" w:eastAsia="zh-CN" w:bidi="hi-IN"/>
+        </w:rPr>
+        <w:t>.</w:t>
+      </w:r>
+    </w:p>
+    <w:p>
+      <w:pPr>
+        <w:pStyle w:val="Normal"/>
+        <w:jc w:val="both"/>
+        <w:rPr>
+          <w:rFonts w:ascii="Garamond" w:hAnsi="Garamond" w:eastAsia="Times New Roman" w:cs="Times New Roman"/>
+          <w:color w:val="000000"/>
+          <w:kern w:val="0"/>
+          <w:sz w:val="36"/>
+          <w:szCs w:val="36"/>
+          <w:shd w:fill="auto" w:val="clear"/>
+          <w:lang w:val="en-US" w:eastAsia="zh-CN" w:bidi="hi-IN"/>
+        </w:rPr>
+      </w:pPr>
+      <w:r>
+        <w:rPr/>
+      </w:r>
+    </w:p>
+    <w:p>
+      <w:pPr>
+        <w:pStyle w:val="Normal"/>
+        <w:jc w:val="both"/>
+        <w:rPr>
+          <w:rFonts w:ascii="Garamond" w:hAnsi="Garamond" w:eastAsia="Times New Roman" w:cs="Times New Roman"/>
+          <w:color w:val="000000"/>
+          <w:kern w:val="0"/>
+          <w:sz w:val="36"/>
+          <w:szCs w:val="36"/>
+          <w:shd w:fill="auto" w:val="clear"/>
+          <w:lang w:val="en-US" w:eastAsia="zh-CN" w:bidi="hi-IN"/>
+        </w:rPr>
+      </w:pPr>
+      <w:r>
+        <w:rPr>
+          <w:rFonts w:eastAsia="Times New Roman" w:cs="Times New Roman" w:ascii="Garamond" w:hAnsi="Garamond"/>
+          <w:color w:val="000000"/>
+          <w:kern w:val="0"/>
+          <w:sz w:val="36"/>
+          <w:szCs w:val="36"/>
+          <w:shd w:fill="auto" w:val="clear"/>
+          <w:lang w:val="en-US" w:eastAsia="zh-CN" w:bidi="hi-IN"/>
+        </w:rPr>
+        <w:t>É como se dissessem a Judas: nós lhe fizemos uma proposta para trair e entregar seu mestre e amigo. Você aceitou porque quis. Não nos culpe por isso e nem espere que voltemos atrás em nosso acordo.</w:t>
+      </w:r>
+    </w:p>
+    <w:p>
+      <w:pPr>
+        <w:pStyle w:val="Normal"/>
+        <w:jc w:val="both"/>
+        <w:rPr>
+          <w:rFonts w:ascii="Garamond" w:hAnsi="Garamond" w:eastAsia="Times New Roman" w:cs="Times New Roman"/>
+          <w:color w:val="000000"/>
+          <w:kern w:val="0"/>
+          <w:sz w:val="36"/>
+          <w:szCs w:val="36"/>
+          <w:shd w:fill="auto" w:val="clear"/>
+          <w:lang w:val="en-US" w:eastAsia="zh-CN" w:bidi="hi-IN"/>
+        </w:rPr>
+      </w:pPr>
+      <w:r>
+        <w:rPr/>
+      </w:r>
+    </w:p>
+    <w:p>
+      <w:pPr>
+        <w:pStyle w:val="Normal"/>
+        <w:jc w:val="both"/>
+        <w:rPr>
+          <w:rFonts w:ascii="Garamond" w:hAnsi="Garamond" w:eastAsia="Times New Roman" w:cs="Times New Roman"/>
+          <w:color w:val="000000"/>
+          <w:kern w:val="0"/>
+          <w:sz w:val="36"/>
+          <w:szCs w:val="36"/>
+          <w:shd w:fill="auto" w:val="clear"/>
+          <w:lang w:val="en-US" w:eastAsia="zh-CN" w:bidi="hi-IN"/>
+        </w:rPr>
+      </w:pPr>
+      <w:r>
+        <w:rPr>
+          <w:rFonts w:eastAsia="Times New Roman" w:cs="Times New Roman" w:ascii="Garamond" w:hAnsi="Garamond"/>
+          <w:color w:val="000000"/>
+          <w:kern w:val="0"/>
+          <w:sz w:val="36"/>
+          <w:szCs w:val="36"/>
+          <w:shd w:fill="auto" w:val="clear"/>
+          <w:lang w:val="en-US" w:eastAsia="zh-CN" w:bidi="hi-IN"/>
+        </w:rPr>
+        <w:t xml:space="preserve">Sempre haverá alguém que vai semear joio no terreno de nossos corações. Esse alguém lança a semente e se afasta, muitas vezes nos observando e aguardando nossa reação. </w:t>
+      </w:r>
+    </w:p>
+    <w:p>
+      <w:pPr>
+        <w:pStyle w:val="Normal"/>
+        <w:jc w:val="both"/>
+        <w:rPr>
+          <w:rFonts w:ascii="Garamond" w:hAnsi="Garamond" w:eastAsia="Times New Roman" w:cs="Times New Roman"/>
+          <w:color w:val="000000"/>
+          <w:kern w:val="0"/>
+          <w:sz w:val="36"/>
+          <w:szCs w:val="36"/>
+          <w:shd w:fill="auto" w:val="clear"/>
+          <w:lang w:val="en-US" w:eastAsia="zh-CN" w:bidi="hi-IN"/>
+        </w:rPr>
+      </w:pPr>
+      <w:r>
+        <w:rPr/>
+      </w:r>
+    </w:p>
+    <w:p>
+      <w:pPr>
+        <w:pStyle w:val="Normal"/>
+        <w:jc w:val="both"/>
+        <w:rPr>
+          <w:rFonts w:ascii="Garamond" w:hAnsi="Garamond" w:eastAsia="Times New Roman" w:cs="Times New Roman"/>
+          <w:color w:val="000000"/>
+          <w:kern w:val="0"/>
+          <w:sz w:val="36"/>
+          <w:szCs w:val="36"/>
+          <w:shd w:fill="auto" w:val="clear"/>
+          <w:lang w:val="en-US" w:eastAsia="zh-CN" w:bidi="hi-IN"/>
+        </w:rPr>
+      </w:pPr>
+      <w:r>
+        <w:rPr>
+          <w:rFonts w:eastAsia="Times New Roman" w:cs="Times New Roman" w:ascii="Garamond" w:hAnsi="Garamond"/>
+          <w:color w:val="000000"/>
+          <w:kern w:val="0"/>
+          <w:sz w:val="36"/>
+          <w:szCs w:val="36"/>
+          <w:shd w:fill="auto" w:val="clear"/>
+          <w:lang w:val="en-US" w:eastAsia="zh-CN" w:bidi="hi-IN"/>
+        </w:rPr>
+        <w:t>Se oferecemos solo fértil a essa semente, não temos o direito de culpar quem a lançou em nós. A decisão final de acolher ou repelir a semente do joio é sempre nossa.</w:t>
+      </w:r>
+    </w:p>
+    <w:p>
+      <w:pPr>
+        <w:pStyle w:val="Normal"/>
+        <w:jc w:val="both"/>
+        <w:rPr>
+          <w:rFonts w:ascii="Garamond" w:hAnsi="Garamond" w:eastAsia="Times New Roman" w:cs="Times New Roman"/>
+          <w:color w:val="000000"/>
+          <w:kern w:val="0"/>
+          <w:sz w:val="36"/>
+          <w:szCs w:val="36"/>
+          <w:shd w:fill="auto" w:val="clear"/>
+          <w:lang w:val="en-US" w:eastAsia="zh-CN" w:bidi="hi-IN"/>
+        </w:rPr>
+      </w:pPr>
+      <w:r>
+        <w:rPr>
+          <w:rFonts w:eastAsia="Times New Roman" w:cs="Times New Roman" w:ascii="Garamond" w:hAnsi="Garamond"/>
+          <w:color w:val="000000"/>
+          <w:kern w:val="0"/>
+          <w:sz w:val="36"/>
+          <w:szCs w:val="36"/>
+          <w:shd w:fill="auto" w:val="clear"/>
+          <w:lang w:val="en-US" w:eastAsia="zh-CN" w:bidi="hi-IN"/>
+        </w:rPr>
+      </w:r>
+    </w:p>
+    <w:p>
+      <w:pPr>
+        <w:pStyle w:val="Normal"/>
+        <w:jc w:val="both"/>
+        <w:rPr>
+          <w:rFonts w:ascii="Garamond" w:hAnsi="Garamond" w:eastAsia="Times New Roman" w:cs="Times New Roman"/>
+          <w:i/>
+          <w:i/>
+          <w:iCs/>
+          <w:color w:val="000000"/>
+          <w:kern w:val="0"/>
+          <w:sz w:val="36"/>
+          <w:szCs w:val="36"/>
+          <w:u w:val="single"/>
+          <w:shd w:fill="auto" w:val="clear"/>
+          <w:lang w:val="en-US" w:eastAsia="zh-CN" w:bidi="hi-IN"/>
+        </w:rPr>
+      </w:pPr>
+      <w:r>
+        <w:rPr>
+          <w:rFonts w:eastAsia="Times New Roman" w:cs="Times New Roman" w:ascii="Garamond" w:hAnsi="Garamond"/>
+          <w:i/>
+          <w:iCs/>
+          <w:color w:val="000000"/>
+          <w:kern w:val="0"/>
+          <w:sz w:val="36"/>
+          <w:szCs w:val="36"/>
+          <w:u w:val="single"/>
+          <w:shd w:fill="auto" w:val="clear"/>
+          <w:lang w:val="en-US" w:eastAsia="zh-CN" w:bidi="hi-IN"/>
+        </w:rPr>
+        <w:t xml:space="preserve">E, quando a erva cresceu e frutificou, apareceu também o joio. </w:t>
+      </w:r>
+    </w:p>
+    <w:p>
+      <w:pPr>
+        <w:pStyle w:val="Normal"/>
+        <w:jc w:val="both"/>
+        <w:rPr>
+          <w:rFonts w:ascii="Garamond" w:hAnsi="Garamond" w:eastAsia="Times New Roman" w:cs="Times New Roman"/>
+          <w:color w:val="000000"/>
+          <w:kern w:val="0"/>
+          <w:sz w:val="36"/>
+          <w:szCs w:val="36"/>
+          <w:shd w:fill="auto" w:val="clear"/>
+          <w:lang w:val="en-US" w:eastAsia="zh-CN" w:bidi="hi-IN"/>
+        </w:rPr>
+      </w:pPr>
+      <w:r>
+        <w:rPr>
+          <w:rFonts w:eastAsia="Times New Roman" w:cs="Times New Roman" w:ascii="Garamond" w:hAnsi="Garamond"/>
+          <w:color w:val="000000"/>
+          <w:kern w:val="0"/>
+          <w:sz w:val="36"/>
+          <w:szCs w:val="36"/>
+          <w:shd w:fill="auto" w:val="clear"/>
+          <w:lang w:val="en-US" w:eastAsia="zh-CN" w:bidi="hi-IN"/>
+        </w:rPr>
+      </w:r>
+    </w:p>
+    <w:p>
+      <w:pPr>
+        <w:pStyle w:val="Normal"/>
+        <w:jc w:val="both"/>
+        <w:rPr>
+          <w:rFonts w:ascii="Garamond" w:hAnsi="Garamond" w:eastAsia="Times New Roman" w:cs="Times New Roman"/>
+          <w:color w:val="00A0FC"/>
+          <w:kern w:val="0"/>
+          <w:sz w:val="36"/>
+          <w:szCs w:val="36"/>
+          <w:shd w:fill="auto" w:val="clear"/>
+          <w:lang w:val="en-US" w:eastAsia="zh-CN" w:bidi="hi-IN"/>
+        </w:rPr>
+      </w:pPr>
+      <w:r>
+        <w:rPr>
+          <w:rFonts w:eastAsia="Times New Roman" w:cs="Times New Roman" w:ascii="Garamond" w:hAnsi="Garamond"/>
+          <w:color w:val="00A0FC"/>
+          <w:kern w:val="0"/>
+          <w:sz w:val="36"/>
+          <w:szCs w:val="36"/>
+          <w:shd w:fill="auto" w:val="clear"/>
+          <w:lang w:val="en-US" w:eastAsia="zh-CN" w:bidi="hi-IN"/>
+        </w:rPr>
+        <w:t>Na Natureza, tudo obedece a um processo gradual de evolução: a semente é lançada, germina, cresce e, por fim, produz frutos. O mesmo ocorre com o bem e o mal. Cada um colhe, no devido tempo, os resultados daquilo que semeia por meio de seus pensamentos, palavras e ações. Por isso, Jesus nos alerta que o joio também precisa crescer, pois nem sempre sua presença é imediatamente percebida.</w:t>
+      </w:r>
+    </w:p>
+    <w:p>
+      <w:pPr>
+        <w:pStyle w:val="Normal"/>
+        <w:jc w:val="both"/>
+        <w:rPr>
+          <w:rFonts w:ascii="Garamond" w:hAnsi="Garamond" w:eastAsia="Times New Roman" w:cs="Times New Roman"/>
+          <w:color w:val="00A0FC"/>
+          <w:kern w:val="0"/>
+          <w:sz w:val="36"/>
+          <w:szCs w:val="36"/>
+          <w:shd w:fill="auto" w:val="clear"/>
+          <w:lang w:val="en-US" w:eastAsia="zh-CN" w:bidi="hi-IN"/>
+        </w:rPr>
+      </w:pPr>
+      <w:r>
+        <w:rPr>
+          <w:rFonts w:eastAsia="Times New Roman" w:cs="Times New Roman" w:ascii="Garamond" w:hAnsi="Garamond"/>
+          <w:color w:val="00A0FC"/>
+          <w:kern w:val="0"/>
+          <w:sz w:val="36"/>
+          <w:szCs w:val="36"/>
+          <w:shd w:fill="auto" w:val="clear"/>
+          <w:lang w:val="en-US" w:eastAsia="zh-CN" w:bidi="hi-IN"/>
+        </w:rPr>
+      </w:r>
+    </w:p>
+    <w:p>
+      <w:pPr>
+        <w:pStyle w:val="Normal"/>
+        <w:jc w:val="both"/>
+        <w:rPr>
+          <w:rFonts w:ascii="Garamond" w:hAnsi="Garamond" w:eastAsia="Times New Roman" w:cs="Times New Roman"/>
+          <w:color w:val="00A0FC"/>
+          <w:kern w:val="0"/>
+          <w:sz w:val="36"/>
+          <w:szCs w:val="36"/>
+          <w:shd w:fill="auto" w:val="clear"/>
+          <w:lang w:val="en-US" w:eastAsia="zh-CN" w:bidi="hi-IN"/>
+        </w:rPr>
+      </w:pPr>
+      <w:r>
+        <w:rPr>
+          <w:rFonts w:eastAsia="Times New Roman" w:cs="Times New Roman" w:ascii="Garamond" w:hAnsi="Garamond"/>
+          <w:color w:val="00A0FC"/>
+          <w:kern w:val="0"/>
+          <w:sz w:val="36"/>
+          <w:szCs w:val="36"/>
+          <w:shd w:fill="auto" w:val="clear"/>
+          <w:lang w:val="en-US" w:eastAsia="zh-CN" w:bidi="hi-IN"/>
+        </w:rPr>
+        <w:t>No estágio evolutivo em que nos encontramos, o bem e o mal coexistem lado a lado. Essa convivência não apenas nos permite desenvolver o discernimento necessário para distingui-los, mas também oferece ao bem a oportunidade de influenciar e transformar o mal. Assim, os bons exemplos tornam-se instrumentos de educação e progresso para aqueles que ainda se encontram afastados do caminho do bem.</w:t>
+      </w:r>
+    </w:p>
+    <w:p>
+      <w:pPr>
+        <w:pStyle w:val="Normal"/>
+        <w:jc w:val="both"/>
+        <w:rPr>
+          <w:rFonts w:ascii="Garamond" w:hAnsi="Garamond" w:eastAsia="Times New Roman" w:cs="Times New Roman"/>
+          <w:color w:val="000000"/>
+          <w:kern w:val="0"/>
+          <w:sz w:val="36"/>
+          <w:szCs w:val="36"/>
+          <w:shd w:fill="auto" w:val="clear"/>
+          <w:lang w:val="en-US" w:eastAsia="zh-CN" w:bidi="hi-IN"/>
+        </w:rPr>
+      </w:pPr>
+      <w:r>
+        <w:rPr>
+          <w:rFonts w:eastAsia="Times New Roman" w:cs="Times New Roman" w:ascii="Garamond" w:hAnsi="Garamond"/>
+          <w:color w:val="000000"/>
+          <w:kern w:val="0"/>
+          <w:sz w:val="36"/>
+          <w:szCs w:val="36"/>
+          <w:shd w:fill="auto" w:val="clear"/>
+          <w:lang w:val="en-US" w:eastAsia="zh-CN" w:bidi="hi-IN"/>
+        </w:rPr>
+      </w:r>
+    </w:p>
+    <w:p>
+      <w:pPr>
+        <w:pStyle w:val="Normal"/>
+        <w:jc w:val="both"/>
+        <w:rPr>
+          <w:rFonts w:ascii="Garamond" w:hAnsi="Garamond" w:eastAsia="Times New Roman" w:cs="Times New Roman"/>
+          <w:color w:val="000000"/>
+          <w:kern w:val="0"/>
+          <w:sz w:val="36"/>
+          <w:szCs w:val="36"/>
+          <w:shd w:fill="auto" w:val="clear"/>
+          <w:lang w:val="en-US" w:eastAsia="zh-CN" w:bidi="hi-IN"/>
+        </w:rPr>
+      </w:pPr>
+      <w:r>
+        <w:rPr>
+          <w:rFonts w:eastAsia="Times New Roman" w:cs="Times New Roman" w:ascii="Garamond" w:hAnsi="Garamond"/>
+          <w:i/>
+          <w:iCs/>
+          <w:color w:val="000000"/>
+          <w:kern w:val="0"/>
+          <w:sz w:val="36"/>
+          <w:szCs w:val="36"/>
+          <w:u w:val="single"/>
+          <w:shd w:fill="auto" w:val="clear"/>
+          <w:lang w:val="en-US" w:eastAsia="zh-CN" w:bidi="hi-IN"/>
+        </w:rPr>
+        <w:t>E os servos</w:t>
+      </w:r>
+      <w:r>
+        <w:rPr>
+          <w:rFonts w:eastAsia="Times New Roman" w:cs="Times New Roman" w:ascii="Garamond" w:hAnsi="Garamond"/>
+          <w:i/>
+          <w:iCs/>
+          <w:color w:val="000000"/>
+          <w:kern w:val="0"/>
+          <w:sz w:val="36"/>
+          <w:szCs w:val="36"/>
+          <w:u w:val="single"/>
+          <w:shd w:fill="auto" w:val="clear"/>
+          <w:lang w:val="en-US" w:eastAsia="zh-CN" w:bidi="hi-IN"/>
+        </w:rPr>
+        <w:t xml:space="preserve"> </w:t>
+      </w:r>
+      <w:r>
+        <w:rPr>
+          <w:rFonts w:eastAsia="Times New Roman" w:cs="Times New Roman" w:ascii="Garamond" w:hAnsi="Garamond"/>
+          <w:i/>
+          <w:iCs/>
+          <w:color w:val="000000"/>
+          <w:kern w:val="0"/>
+          <w:sz w:val="36"/>
+          <w:szCs w:val="36"/>
+          <w:u w:val="single"/>
+          <w:shd w:fill="auto" w:val="clear"/>
+          <w:lang w:val="en-US" w:eastAsia="zh-CN" w:bidi="hi-IN"/>
+        </w:rPr>
+        <w:t>do pai de família, indo ter com ele, disseram-lhe: Senhor, não semeaste</w:t>
+      </w:r>
+      <w:r>
+        <w:rPr>
+          <w:rFonts w:eastAsia="Times New Roman" w:cs="Times New Roman" w:ascii="Garamond" w:hAnsi="Garamond"/>
+          <w:i/>
+          <w:iCs/>
+          <w:color w:val="000000"/>
+          <w:kern w:val="0"/>
+          <w:sz w:val="36"/>
+          <w:szCs w:val="36"/>
+          <w:u w:val="single"/>
+          <w:shd w:fill="auto" w:val="clear"/>
+          <w:lang w:val="en-US" w:eastAsia="zh-CN" w:bidi="hi-IN"/>
+        </w:rPr>
+        <w:t xml:space="preserve"> </w:t>
+      </w:r>
+      <w:r>
+        <w:rPr>
+          <w:rFonts w:eastAsia="Times New Roman" w:cs="Times New Roman" w:ascii="Garamond" w:hAnsi="Garamond"/>
+          <w:i/>
+          <w:iCs/>
+          <w:color w:val="000000"/>
+          <w:kern w:val="0"/>
+          <w:sz w:val="36"/>
+          <w:szCs w:val="36"/>
+          <w:u w:val="single"/>
+          <w:shd w:fill="auto" w:val="clear"/>
+          <w:lang w:val="en-US" w:eastAsia="zh-CN" w:bidi="hi-IN"/>
+        </w:rPr>
+        <w:t>tu no teu campo boa semente? Por que tem, então, joio?</w:t>
+      </w:r>
+      <w:r>
+        <w:rPr>
+          <w:rFonts w:eastAsia="Times New Roman" w:cs="Times New Roman" w:ascii="Garamond" w:hAnsi="Garamond"/>
+          <w:color w:val="000000"/>
+          <w:kern w:val="0"/>
+          <w:sz w:val="36"/>
+          <w:szCs w:val="36"/>
+          <w:shd w:fill="auto" w:val="clear"/>
+          <w:lang w:val="en-US" w:eastAsia="zh-CN" w:bidi="hi-IN"/>
+        </w:rPr>
+        <w:t xml:space="preserve"> </w:t>
+      </w:r>
+    </w:p>
+    <w:p>
+      <w:pPr>
+        <w:pStyle w:val="Normal"/>
+        <w:jc w:val="both"/>
+        <w:rPr>
+          <w:rFonts w:ascii="Garamond" w:hAnsi="Garamond" w:eastAsia="Times New Roman" w:cs="Times New Roman"/>
+          <w:color w:val="000000"/>
+          <w:kern w:val="0"/>
+          <w:sz w:val="36"/>
+          <w:szCs w:val="36"/>
+          <w:shd w:fill="auto" w:val="clear"/>
+          <w:lang w:val="en-US" w:eastAsia="zh-CN" w:bidi="hi-IN"/>
+        </w:rPr>
+      </w:pPr>
+      <w:r>
+        <w:rPr>
+          <w:rFonts w:eastAsia="Times New Roman" w:cs="Times New Roman" w:ascii="Garamond" w:hAnsi="Garamond"/>
+          <w:color w:val="000000"/>
+          <w:kern w:val="0"/>
+          <w:sz w:val="36"/>
+          <w:szCs w:val="36"/>
+          <w:shd w:fill="auto" w:val="clear"/>
+          <w:lang w:val="en-US" w:eastAsia="zh-CN" w:bidi="hi-IN"/>
+        </w:rPr>
+      </w:r>
+    </w:p>
+    <w:p>
+      <w:pPr>
+        <w:pStyle w:val="Normal"/>
+        <w:jc w:val="both"/>
+        <w:rPr>
+          <w:rFonts w:ascii="Garamond" w:hAnsi="Garamond" w:eastAsia="Times New Roman" w:cs="Times New Roman"/>
+          <w:color w:val="00A0FC"/>
+          <w:kern w:val="0"/>
+          <w:sz w:val="36"/>
+          <w:szCs w:val="36"/>
+          <w:shd w:fill="auto" w:val="clear"/>
+          <w:lang w:val="en-US" w:eastAsia="zh-CN" w:bidi="hi-IN"/>
+        </w:rPr>
+      </w:pPr>
+      <w:r>
+        <w:rPr>
+          <w:rFonts w:eastAsia="Times New Roman" w:cs="Times New Roman" w:ascii="Garamond" w:hAnsi="Garamond"/>
+          <w:color w:val="00A0FC"/>
+          <w:kern w:val="0"/>
+          <w:sz w:val="36"/>
+          <w:szCs w:val="36"/>
+          <w:shd w:fill="auto" w:val="clear"/>
+          <w:lang w:val="en-US" w:eastAsia="zh-CN" w:bidi="hi-IN"/>
+        </w:rPr>
+        <w:t>Ao perceberem a presença do joio entre o trigo, os servos perguntam ao Senhor se deveriam arrancá-lo, mas recebem a orientação de deixá-los crescer juntos até a ceifa. Nessa interpretação, o pai de família representa Deus, enquanto os servos simbolizam os trabalhadores da seara divina, isto é, todos aqueles que atuam como instrumentos do bem sob a direção de Jesus. Metaforicamente, eles representam as inteligências e mãos dedicadas ao serviço do amor e da evolução espiritual.</w:t>
+      </w:r>
+    </w:p>
+    <w:p>
+      <w:pPr>
+        <w:pStyle w:val="Normal"/>
+        <w:jc w:val="both"/>
+        <w:rPr>
+          <w:rFonts w:ascii="Garamond" w:hAnsi="Garamond" w:eastAsia="Times New Roman" w:cs="Times New Roman"/>
+          <w:color w:val="000000"/>
+          <w:kern w:val="0"/>
+          <w:sz w:val="36"/>
+          <w:szCs w:val="36"/>
+          <w:shd w:fill="auto" w:val="clear"/>
+          <w:lang w:val="en-US" w:eastAsia="zh-CN" w:bidi="hi-IN"/>
+        </w:rPr>
+      </w:pPr>
+      <w:r>
+        <w:rPr>
+          <w:rFonts w:eastAsia="Times New Roman" w:cs="Times New Roman" w:ascii="Garamond" w:hAnsi="Garamond"/>
+          <w:color w:val="000000"/>
+          <w:kern w:val="0"/>
+          <w:sz w:val="36"/>
+          <w:szCs w:val="36"/>
+          <w:shd w:fill="auto" w:val="clear"/>
+          <w:lang w:val="en-US" w:eastAsia="zh-CN" w:bidi="hi-IN"/>
+        </w:rPr>
+        <w:t>E ele lhes disse:</w:t>
+      </w:r>
+      <w:r>
+        <w:rPr>
+          <w:rFonts w:eastAsia="Times New Roman" w:cs="Times New Roman" w:ascii="Garamond" w:hAnsi="Garamond"/>
+          <w:color w:val="000000"/>
+          <w:kern w:val="0"/>
+          <w:sz w:val="36"/>
+          <w:szCs w:val="36"/>
+          <w:shd w:fill="auto" w:val="clear"/>
+          <w:lang w:val="en-US" w:eastAsia="zh-CN" w:bidi="hi-IN"/>
+        </w:rPr>
+        <w:t xml:space="preserve"> </w:t>
+      </w:r>
+      <w:r>
+        <w:rPr>
+          <w:rFonts w:eastAsia="Times New Roman" w:cs="Times New Roman" w:ascii="Garamond" w:hAnsi="Garamond"/>
+          <w:color w:val="000000"/>
+          <w:kern w:val="0"/>
+          <w:sz w:val="36"/>
+          <w:szCs w:val="36"/>
+          <w:shd w:fill="auto" w:val="clear"/>
+          <w:lang w:val="en-US" w:eastAsia="zh-CN" w:bidi="hi-IN"/>
+        </w:rPr>
+        <w:t>Um inimigo é quem fez isso. E os servos lhe disseram: Queres, pois, que</w:t>
+      </w:r>
+      <w:r>
+        <w:rPr>
+          <w:rFonts w:eastAsia="Times New Roman" w:cs="Times New Roman" w:ascii="Garamond" w:hAnsi="Garamond"/>
+          <w:color w:val="000000"/>
+          <w:kern w:val="0"/>
+          <w:sz w:val="36"/>
+          <w:szCs w:val="36"/>
+          <w:shd w:fill="auto" w:val="clear"/>
+          <w:lang w:val="en-US" w:eastAsia="zh-CN" w:bidi="hi-IN"/>
+        </w:rPr>
+        <w:t xml:space="preserve"> </w:t>
+      </w:r>
+      <w:r>
+        <w:rPr>
+          <w:rFonts w:eastAsia="Times New Roman" w:cs="Times New Roman" w:ascii="Garamond" w:hAnsi="Garamond"/>
+          <w:color w:val="000000"/>
+          <w:kern w:val="0"/>
+          <w:sz w:val="36"/>
+          <w:szCs w:val="36"/>
+          <w:shd w:fill="auto" w:val="clear"/>
+          <w:lang w:val="en-US" w:eastAsia="zh-CN" w:bidi="hi-IN"/>
+        </w:rPr>
+        <w:t>vamos arrancá-lo? Porém ele lhes disse: Não; para que, ao colher o joio,</w:t>
+      </w:r>
+      <w:r>
+        <w:rPr>
+          <w:rFonts w:eastAsia="Times New Roman" w:cs="Times New Roman" w:ascii="Garamond" w:hAnsi="Garamond"/>
+          <w:color w:val="000000"/>
+          <w:kern w:val="0"/>
+          <w:sz w:val="36"/>
+          <w:szCs w:val="36"/>
+          <w:shd w:fill="auto" w:val="clear"/>
+          <w:lang w:val="en-US" w:eastAsia="zh-CN" w:bidi="hi-IN"/>
+        </w:rPr>
+        <w:t xml:space="preserve"> </w:t>
+      </w:r>
+      <w:r>
+        <w:rPr>
+          <w:rFonts w:eastAsia="Times New Roman" w:cs="Times New Roman" w:ascii="Garamond" w:hAnsi="Garamond"/>
+          <w:color w:val="000000"/>
+          <w:kern w:val="0"/>
+          <w:sz w:val="36"/>
+          <w:szCs w:val="36"/>
+          <w:shd w:fill="auto" w:val="clear"/>
+          <w:lang w:val="en-US" w:eastAsia="zh-CN" w:bidi="hi-IN"/>
+        </w:rPr>
+        <w:t>não arranqueis também o trigo com ele. Deixai crescer ambos juntos</w:t>
+      </w:r>
+      <w:r>
+        <w:rPr>
+          <w:rFonts w:eastAsia="Times New Roman" w:cs="Times New Roman" w:ascii="Garamond" w:hAnsi="Garamond"/>
+          <w:color w:val="000000"/>
+          <w:kern w:val="0"/>
+          <w:sz w:val="36"/>
+          <w:szCs w:val="36"/>
+          <w:shd w:fill="auto" w:val="clear"/>
+          <w:lang w:val="en-US" w:eastAsia="zh-CN" w:bidi="hi-IN"/>
+        </w:rPr>
+        <w:t xml:space="preserve"> </w:t>
+      </w:r>
+      <w:r>
+        <w:rPr>
+          <w:rFonts w:eastAsia="Times New Roman" w:cs="Times New Roman" w:ascii="Garamond" w:hAnsi="Garamond"/>
+          <w:color w:val="000000"/>
+          <w:kern w:val="0"/>
+          <w:sz w:val="36"/>
+          <w:szCs w:val="36"/>
+          <w:shd w:fill="auto" w:val="clear"/>
+          <w:lang w:val="en-US" w:eastAsia="zh-CN" w:bidi="hi-IN"/>
+        </w:rPr>
+        <w:t>até à ceifa; e, por ocasião da ceifa, direi aos ceifeiros: colhei primeiro o</w:t>
+      </w:r>
+      <w:r>
+        <w:rPr>
+          <w:rFonts w:eastAsia="Times New Roman" w:cs="Times New Roman" w:ascii="Garamond" w:hAnsi="Garamond"/>
+          <w:color w:val="000000"/>
+          <w:kern w:val="0"/>
+          <w:sz w:val="36"/>
+          <w:szCs w:val="36"/>
+          <w:shd w:fill="auto" w:val="clear"/>
+          <w:lang w:val="en-US" w:eastAsia="zh-CN" w:bidi="hi-IN"/>
+        </w:rPr>
+        <w:t xml:space="preserve"> </w:t>
+      </w:r>
+      <w:r>
+        <w:rPr>
+          <w:rFonts w:eastAsia="Times New Roman" w:cs="Times New Roman" w:ascii="Garamond" w:hAnsi="Garamond"/>
+          <w:color w:val="000000"/>
+          <w:kern w:val="0"/>
+          <w:sz w:val="36"/>
+          <w:szCs w:val="36"/>
+          <w:shd w:fill="auto" w:val="clear"/>
+          <w:lang w:val="en-US" w:eastAsia="zh-CN" w:bidi="hi-IN"/>
+        </w:rPr>
+        <w:t>joio e atai-o em molhos para o queimar; mas o trigo, ajuntai-o no meu</w:t>
+      </w:r>
+      <w:r>
+        <w:rPr>
+          <w:rFonts w:eastAsia="Times New Roman" w:cs="Times New Roman" w:ascii="Garamond" w:hAnsi="Garamond"/>
+          <w:color w:val="000000"/>
+          <w:kern w:val="0"/>
+          <w:sz w:val="36"/>
+          <w:szCs w:val="36"/>
+          <w:shd w:fill="auto" w:val="clear"/>
+          <w:lang w:val="en-US" w:eastAsia="zh-CN" w:bidi="hi-IN"/>
+        </w:rPr>
+        <w:t xml:space="preserve"> </w:t>
+      </w:r>
+      <w:r>
+        <w:rPr>
+          <w:rFonts w:eastAsia="Times New Roman" w:cs="Times New Roman" w:ascii="Garamond" w:hAnsi="Garamond"/>
+          <w:color w:val="000000"/>
+          <w:kern w:val="0"/>
+          <w:sz w:val="36"/>
+          <w:szCs w:val="36"/>
+          <w:shd w:fill="auto" w:val="clear"/>
+          <w:lang w:val="en-US" w:eastAsia="zh-CN" w:bidi="hi-IN"/>
+        </w:rPr>
+        <w:t>celeiro</w:t>
+      </w:r>
+      <w:r>
+        <w:rPr>
+          <w:rFonts w:eastAsia="Times New Roman" w:cs="Times New Roman" w:ascii="Garamond" w:hAnsi="Garamond"/>
+          <w:color w:val="000000"/>
+          <w:kern w:val="0"/>
+          <w:sz w:val="36"/>
+          <w:szCs w:val="36"/>
+          <w:shd w:fill="auto" w:val="clear"/>
+          <w:lang w:val="en-US" w:eastAsia="zh-CN" w:bidi="hi-IN"/>
+        </w:rPr>
+        <w:t>.</w:t>
+      </w:r>
+    </w:p>
+    <w:p>
+      <w:pPr>
+        <w:pStyle w:val="Normal"/>
+        <w:jc w:val="both"/>
+        <w:rPr>
+          <w:rFonts w:ascii="Garamond" w:hAnsi="Garamond" w:eastAsia="Times New Roman" w:cs="Times New Roman"/>
+          <w:color w:val="000000"/>
+          <w:kern w:val="0"/>
+          <w:sz w:val="36"/>
+          <w:szCs w:val="36"/>
+          <w:shd w:fill="auto" w:val="clear"/>
+          <w:lang w:val="en-US" w:eastAsia="zh-CN" w:bidi="hi-IN"/>
+        </w:rPr>
+      </w:pPr>
+      <w:r>
+        <w:rPr>
+          <w:rFonts w:eastAsia="Times New Roman" w:cs="Times New Roman" w:ascii="Garamond" w:hAnsi="Garamond"/>
+          <w:color w:val="000000"/>
+          <w:kern w:val="0"/>
+          <w:sz w:val="36"/>
+          <w:szCs w:val="36"/>
+          <w:shd w:fill="auto" w:val="clear"/>
+          <w:lang w:val="en-US" w:eastAsia="zh-CN" w:bidi="hi-IN"/>
+        </w:rPr>
+      </w:r>
+    </w:p>
+    <w:p>
+      <w:pPr>
+        <w:pStyle w:val="Normal"/>
+        <w:jc w:val="both"/>
+        <w:rPr>
+          <w:rFonts w:ascii="Garamond" w:hAnsi="Garamond" w:eastAsia="Times New Roman" w:cs="Times New Roman"/>
+          <w:color w:val="000000"/>
+          <w:kern w:val="0"/>
+          <w:sz w:val="36"/>
+          <w:szCs w:val="36"/>
+          <w:shd w:fill="auto" w:val="clear"/>
+          <w:lang w:val="en-US" w:eastAsia="zh-CN" w:bidi="hi-IN"/>
+        </w:rPr>
+      </w:pPr>
+      <w:r>
+        <w:rPr>
+          <w:rFonts w:eastAsia="Times New Roman" w:cs="Times New Roman" w:ascii="Garamond" w:hAnsi="Garamond"/>
+          <w:color w:val="000000"/>
+          <w:kern w:val="0"/>
+          <w:sz w:val="36"/>
+          <w:szCs w:val="36"/>
+          <w:shd w:fill="auto" w:val="clear"/>
+          <w:lang w:val="en-US" w:eastAsia="zh-CN" w:bidi="hi-IN"/>
+        </w:rPr>
+        <w:t>[ Parei aqui em 11/06/2026 ]</w:t>
       </w:r>
       <w:r>
         <w:br w:type="page"/>
@@ -5659,31 +6415,7 @@
           <w:shd w:fill="auto" w:val="clear"/>
           <w:lang w:val="en-US" w:eastAsia="zh-CN" w:bidi="hi-IN"/>
         </w:rPr>
-        <w:t xml:space="preserve">[ </w:t>
-      </w:r>
-      <w:r>
-        <w:rPr>
-          <w:rFonts w:eastAsia="Times New Roman" w:cs="Times New Roman" w:ascii="Garamond" w:hAnsi="Garamond"/>
-          <w:color w:val="FC5C00"/>
-          <w:kern w:val="0"/>
-          <w:sz w:val="36"/>
-          <w:szCs w:val="36"/>
-          <w:shd w:fill="auto" w:val="clear"/>
-          <w:lang w:val="en-US" w:eastAsia="zh-CN" w:bidi="hi-IN"/>
-        </w:rPr>
-        <w:t>Conclusão</w:t>
-      </w:r>
-      <w:r>
-        <w:rPr>
-          <w:rFonts w:eastAsia="Times New Roman" w:cs="Times New Roman" w:ascii="Garamond" w:hAnsi="Garamond"/>
-          <w:color w:val="FC5C00"/>
-          <w:kern w:val="0"/>
-          <w:sz w:val="36"/>
-          <w:szCs w:val="36"/>
-          <w:shd w:fill="auto" w:val="clear"/>
-          <w:lang w:val="en-US" w:eastAsia="zh-CN" w:bidi="hi-IN"/>
-        </w:rPr>
-        <w:t xml:space="preserve"> ]</w:t>
+        <w:t>[ Conclusão ]</w:t>
       </w:r>
     </w:p>
     <w:p>
@@ -5695,16 +6427,18 @@
         </w:rPr>
       </w:pPr>
       <w:r>
-        <w:rPr/>
-      </w:r>
-    </w:p>
-    <w:p>
-      <w:pPr>
-        <w:pStyle w:val="Normal"/>
-        <w:jc w:val="both"/>
         <w:rPr>
           <w:color w:val="auto"/>
         </w:rPr>
+      </w:r>
+    </w:p>
+    <w:p>
+      <w:pPr>
+        <w:pStyle w:val="Normal"/>
+        <w:jc w:val="both"/>
+        <w:rPr>
+          <w:color w:val="auto"/>
+        </w:rPr>
       </w:pPr>
       <w:r>
         <w:rPr>
@@ -5728,7 +6462,9 @@
         </w:rPr>
       </w:pPr>
       <w:r>
-        <w:rPr/>
+        <w:rPr>
+          <w:color w:val="auto"/>
+        </w:rPr>
       </w:r>
     </w:p>
     <w:p>
@@ -5766,16 +6502,18 @@
         </w:rPr>
       </w:pPr>
       <w:r>
-        <w:rPr/>
-      </w:r>
-    </w:p>
-    <w:p>
-      <w:pPr>
-        <w:pStyle w:val="Normal"/>
-        <w:jc w:val="both"/>
         <w:rPr>
           <w:color w:val="auto"/>
         </w:rPr>
+      </w:r>
+    </w:p>
+    <w:p>
+      <w:pPr>
+        <w:pStyle w:val="Normal"/>
+        <w:jc w:val="both"/>
+        <w:rPr>
+          <w:color w:val="auto"/>
+        </w:rPr>
       </w:pPr>
       <w:r>
         <w:rPr>
@@ -5799,16 +6537,18 @@
         </w:rPr>
       </w:pPr>
       <w:r>
-        <w:rPr/>
-      </w:r>
-    </w:p>
-    <w:p>
-      <w:pPr>
-        <w:pStyle w:val="Normal"/>
-        <w:jc w:val="both"/>
         <w:rPr>
           <w:color w:val="auto"/>
         </w:rPr>
+      </w:r>
+    </w:p>
+    <w:p>
+      <w:pPr>
+        <w:pStyle w:val="Normal"/>
+        <w:jc w:val="both"/>
+        <w:rPr>
+          <w:color w:val="auto"/>
+        </w:rPr>
       </w:pPr>
       <w:r>
         <w:rPr>
@@ -5832,16 +6572,18 @@
         </w:rPr>
       </w:pPr>
       <w:r>
-        <w:rPr/>
-      </w:r>
-    </w:p>
-    <w:p>
-      <w:pPr>
-        <w:pStyle w:val="Normal"/>
-        <w:jc w:val="both"/>
         <w:rPr>
           <w:color w:val="auto"/>
         </w:rPr>
+      </w:r>
+    </w:p>
+    <w:p>
+      <w:pPr>
+        <w:pStyle w:val="Normal"/>
+        <w:jc w:val="both"/>
+        <w:rPr>
+          <w:color w:val="auto"/>
+        </w:rPr>
       </w:pPr>
       <w:r>
         <w:rPr>
@@ -5865,16 +6607,18 @@
         </w:rPr>
       </w:pPr>
       <w:r>
-        <w:rPr/>
-      </w:r>
-    </w:p>
-    <w:p>
-      <w:pPr>
-        <w:pStyle w:val="Normal"/>
-        <w:jc w:val="both"/>
         <w:rPr>
           <w:color w:val="auto"/>
         </w:rPr>
+      </w:r>
+    </w:p>
+    <w:p>
+      <w:pPr>
+        <w:pStyle w:val="Normal"/>
+        <w:jc w:val="both"/>
+        <w:rPr>
+          <w:color w:val="auto"/>
+        </w:rPr>
       </w:pPr>
       <w:r>
         <w:rPr>
@@ -5898,52 +6642,30 @@
         </w:rPr>
       </w:pPr>
       <w:r>
-        <w:rPr/>
-      </w:r>
-    </w:p>
-    <w:p>
-      <w:pPr>
-        <w:pStyle w:val="Normal"/>
-        <w:jc w:val="both"/>
         <w:rPr>
           <w:color w:val="auto"/>
         </w:rPr>
-      </w:pPr>
-      <w:r>
-        <w:rPr>
-          <w:rFonts w:eastAsia="Times New Roman" w:cs="Times New Roman" w:ascii="Garamond" w:hAnsi="Garamond"/>
-          <w:color w:val="000000"/>
-          <w:kern w:val="0"/>
-          <w:sz w:val="36"/>
-          <w:szCs w:val="36"/>
-          <w:shd w:fill="auto" w:val="clear"/>
-          <w:lang w:val="en-US" w:eastAsia="zh-CN" w:bidi="hi-IN"/>
-        </w:rPr>
-        <w:t>Esse é um grande desafio para nós: estar em contato com o mal e não nos deixarmos contaminar por ele. E esse desafio não se limita a simplesmente não ceder às suas investidas. Ele envolve, sobretudo, a maneira como pensamos, como agimos e como reagimos diante d</w:t>
-      </w:r>
-      <w:r>
-        <w:rPr>
-          <w:rFonts w:eastAsia="Times New Roman" w:cs="Times New Roman" w:ascii="Garamond" w:hAnsi="Garamond"/>
-          <w:color w:val="000000"/>
-          <w:kern w:val="0"/>
-          <w:sz w:val="36"/>
-          <w:szCs w:val="36"/>
-          <w:shd w:fill="auto" w:val="clear"/>
-          <w:lang w:val="en-US" w:eastAsia="zh-CN" w:bidi="hi-IN"/>
-        </w:rPr>
-        <w:t>o mal</w:t>
-      </w:r>
-      <w:r>
-        <w:rPr>
-          <w:rFonts w:eastAsia="Times New Roman" w:cs="Times New Roman" w:ascii="Garamond" w:hAnsi="Garamond"/>
-          <w:color w:val="000000"/>
-          <w:kern w:val="0"/>
-          <w:sz w:val="36"/>
-          <w:szCs w:val="36"/>
-          <w:shd w:fill="auto" w:val="clear"/>
-          <w:lang w:val="en-US" w:eastAsia="zh-CN" w:bidi="hi-IN"/>
-        </w:rPr>
-        <w:t>.</w:t>
+      </w:r>
+    </w:p>
+    <w:p>
+      <w:pPr>
+        <w:pStyle w:val="Normal"/>
+        <w:jc w:val="both"/>
+        <w:rPr>
+          <w:color w:val="auto"/>
+        </w:rPr>
+      </w:pPr>
+      <w:r>
+        <w:rPr>
+          <w:rFonts w:eastAsia="Times New Roman" w:cs="Times New Roman" w:ascii="Garamond" w:hAnsi="Garamond"/>
+          <w:color w:val="000000"/>
+          <w:kern w:val="0"/>
+          <w:sz w:val="36"/>
+          <w:szCs w:val="36"/>
+          <w:shd w:fill="auto" w:val="clear"/>
+          <w:lang w:val="en-US" w:eastAsia="zh-CN" w:bidi="hi-IN"/>
+        </w:rPr>
+        <w:t>Esse é um grande desafio para nós: estar em contato com o mal e não nos deixarmos contaminar por ele. E esse desafio não se limita a simplesmente não ceder às suas investidas. Ele envolve, sobretudo, a maneira como pensamos, como agimos e como reagimos diante do mal.</w:t>
       </w:r>
     </w:p>
     <w:p>
@@ -6010,7 +6732,12 @@
       </w:pPr>
       <w:r>
         <w:rPr>
-          <w:shd w:fill="auto" w:val="clear"/>
+          <w:rFonts w:eastAsia="Times New Roman" w:cs="Times New Roman" w:ascii="Garamond" w:hAnsi="Garamond"/>
+          <w:color w:val="000000"/>
+          <w:kern w:val="0"/>
+          <w:sz w:val="36"/>
+          <w:szCs w:val="36"/>
+          <w:lang w:val="en-US" w:eastAsia="zh-CN" w:bidi="hi-IN"/>
         </w:rPr>
       </w:r>
     </w:p>
@@ -6051,7 +6778,12 @@
       </w:pPr>
       <w:r>
         <w:rPr>
-          <w:shd w:fill="auto" w:val="clear"/>
+          <w:rFonts w:eastAsia="Times New Roman" w:cs="Times New Roman" w:ascii="Garamond" w:hAnsi="Garamond"/>
+          <w:color w:val="000000"/>
+          <w:kern w:val="0"/>
+          <w:sz w:val="36"/>
+          <w:szCs w:val="36"/>
+          <w:lang w:val="en-US" w:eastAsia="zh-CN" w:bidi="hi-IN"/>
         </w:rPr>
       </w:r>
     </w:p>
@@ -6092,7 +6824,12 @@
       </w:pPr>
       <w:r>
         <w:rPr>
-          <w:shd w:fill="auto" w:val="clear"/>
+          <w:rFonts w:eastAsia="Times New Roman" w:cs="Times New Roman" w:ascii="Garamond" w:hAnsi="Garamond"/>
+          <w:color w:val="000000"/>
+          <w:kern w:val="0"/>
+          <w:sz w:val="36"/>
+          <w:szCs w:val="36"/>
+          <w:lang w:val="en-US" w:eastAsia="zh-CN" w:bidi="hi-IN"/>
         </w:rPr>
       </w:r>
     </w:p>
@@ -6133,7 +6870,12 @@
       </w:pPr>
       <w:r>
         <w:rPr>
-          <w:shd w:fill="auto" w:val="clear"/>
+          <w:rFonts w:eastAsia="Times New Roman" w:cs="Times New Roman" w:ascii="Garamond" w:hAnsi="Garamond"/>
+          <w:color w:val="000000"/>
+          <w:kern w:val="0"/>
+          <w:sz w:val="36"/>
+          <w:szCs w:val="36"/>
+          <w:lang w:val="en-US" w:eastAsia="zh-CN" w:bidi="hi-IN"/>
         </w:rPr>
       </w:r>
     </w:p>
@@ -6174,7 +6916,12 @@
       </w:pPr>
       <w:r>
         <w:rPr>
-          <w:shd w:fill="auto" w:val="clear"/>
+          <w:rFonts w:eastAsia="Times New Roman" w:cs="Times New Roman" w:ascii="Garamond" w:hAnsi="Garamond"/>
+          <w:color w:val="000000"/>
+          <w:kern w:val="0"/>
+          <w:sz w:val="36"/>
+          <w:szCs w:val="36"/>
+          <w:lang w:val="en-US" w:eastAsia="zh-CN" w:bidi="hi-IN"/>
         </w:rPr>
       </w:r>
     </w:p>
@@ -6197,7 +6944,31 @@
           <w:shd w:fill="auto" w:val="clear"/>
           <w:lang w:val="en-US" w:eastAsia="zh-CN" w:bidi="hi-IN"/>
         </w:rPr>
-        <w:t>A decisão é nossa.</w:t>
+        <w:t xml:space="preserve">A </w:t>
+      </w:r>
+      <w:r>
+        <w:rPr>
+          <w:rFonts w:eastAsia="Times New Roman" w:cs="Times New Roman" w:ascii="Garamond" w:hAnsi="Garamond"/>
+          <w:color w:val="000000"/>
+          <w:kern w:val="0"/>
+          <w:sz w:val="36"/>
+          <w:szCs w:val="36"/>
+          <w:shd w:fill="auto" w:val="clear"/>
+          <w:lang w:val="en-US" w:eastAsia="zh-CN" w:bidi="hi-IN"/>
+        </w:rPr>
+        <w:t>escolha</w:t>
+      </w:r>
+      <w:r>
+        <w:rPr>
+          <w:rFonts w:eastAsia="Times New Roman" w:cs="Times New Roman" w:ascii="Garamond" w:hAnsi="Garamond"/>
+          <w:color w:val="000000"/>
+          <w:kern w:val="0"/>
+          <w:sz w:val="36"/>
+          <w:szCs w:val="36"/>
+          <w:shd w:fill="auto" w:val="clear"/>
+          <w:lang w:val="en-US" w:eastAsia="zh-CN" w:bidi="hi-IN"/>
+        </w:rPr>
+        <w:t xml:space="preserve"> é nossa.</w:t>
       </w:r>
     </w:p>
     <w:sectPr>
@@ -6269,7 +7040,7 @@
         <w:bCs/>
         <w:rFonts w:ascii="Garamond" w:hAnsi="Garamond"/>
       </w:rPr>
-      <w:t>25</w:t>
+      <w:t>29</w:t>
     </w:r>
     <w:r>
       <w:rPr>

</xml_diff>

<commit_message>
12/06/2026 - 22:05 h
</commit_message>
<xml_diff>
--- a/O joio e o trigo, o mal e o bem/O joio e o trigo.docx
+++ b/O joio e o trigo, o mal e o bem/O joio e o trigo.docx
@@ -5009,7 +5009,15 @@
         </w:rPr>
       </w:pPr>
       <w:r>
-        <w:rPr/>
+        <w:rPr>
+          <w:rFonts w:eastAsia="Times New Roman" w:cs="Times New Roman" w:ascii="Garamond" w:hAnsi="Garamond"/>
+          <w:color w:val="000000"/>
+          <w:kern w:val="0"/>
+          <w:sz w:val="36"/>
+          <w:szCs w:val="36"/>
+          <w:shd w:fill="auto" w:val="clear"/>
+          <w:lang w:val="en-US" w:eastAsia="zh-CN" w:bidi="hi-IN"/>
+        </w:rPr>
       </w:r>
     </w:p>
     <w:p>
@@ -5158,31 +5166,7 @@
           <w:shd w:fill="auto" w:val="clear"/>
           <w:lang w:val="en-US" w:eastAsia="zh-CN" w:bidi="hi-IN"/>
         </w:rPr>
-        <w:t xml:space="preserve">Contudo, precisamos compreender que os vícios e as paixões que carregamos, também são nossos inimigos. Orgulho, egoísmo, cólera, intolerância, vaidade, entre outros, também são </w:t>
-      </w:r>
-      <w:r>
-        <w:rPr>
-          <w:rFonts w:eastAsia="Times New Roman" w:cs="Times New Roman" w:ascii="Garamond" w:hAnsi="Garamond"/>
-          <w:color w:val="000000"/>
-          <w:kern w:val="0"/>
-          <w:sz w:val="36"/>
-          <w:szCs w:val="36"/>
-          <w:shd w:fill="auto" w:val="clear"/>
-          <w:lang w:val="en-US" w:eastAsia="zh-CN" w:bidi="hi-IN"/>
-        </w:rPr>
-        <w:t xml:space="preserve">os </w:t>
-      </w:r>
-      <w:r>
-        <w:rPr>
-          <w:rFonts w:eastAsia="Times New Roman" w:cs="Times New Roman" w:ascii="Garamond" w:hAnsi="Garamond"/>
-          <w:color w:val="000000"/>
-          <w:kern w:val="0"/>
-          <w:sz w:val="36"/>
-          <w:szCs w:val="36"/>
-          <w:shd w:fill="auto" w:val="clear"/>
-          <w:lang w:val="en-US" w:eastAsia="zh-CN" w:bidi="hi-IN"/>
-        </w:rPr>
-        <w:t>nossos inimigos mais perigosos porque nos acompanham 24 horas por dia.</w:t>
+        <w:t>Contudo, precisamos compreender que os vícios e as paixões que carregamos, também são nossos inimigos. Orgulho, egoísmo, cólera, intolerância, vaidade, entre outros, também são os nossos inimigos mais perigosos porque nos acompanham 24 horas por dia.</w:t>
       </w:r>
     </w:p>
     <w:p>
@@ -5410,7 +5394,258 @@
           <w:shd w:fill="auto" w:val="clear"/>
           <w:lang w:val="en-US" w:eastAsia="zh-CN" w:bidi="hi-IN"/>
         </w:rPr>
-        <w:t>Isso significa que, por mais que tenhamos contato com o mal, por mais que o joio seja lançado no solo de nossos corações, a decisão final de cultivá-lo é sempre nossa. Nós decidimos se deixamos a semente do joio progredir ou se vamos deixá-la secar</w:t>
+        <w:t>Isso significa que, por mais que tenhamos contato com o mal, por mais que o joio seja lançado no solo de nossos corações, a decisão final de cultivá-lo é sempre nossa. Nós decidimos se deixamos a semente do joio progredir ou se vamos deixá-la secar.</w:t>
+      </w:r>
+    </w:p>
+    <w:p>
+      <w:pPr>
+        <w:pStyle w:val="Normal"/>
+        <w:jc w:val="both"/>
+        <w:rPr>
+          <w:rFonts w:ascii="Garamond" w:hAnsi="Garamond" w:eastAsia="Times New Roman" w:cs="Times New Roman"/>
+          <w:color w:val="000000"/>
+          <w:kern w:val="0"/>
+          <w:sz w:val="36"/>
+          <w:szCs w:val="36"/>
+          <w:shd w:fill="auto" w:val="clear"/>
+          <w:lang w:val="en-US" w:eastAsia="zh-CN" w:bidi="hi-IN"/>
+        </w:rPr>
+      </w:pPr>
+      <w:r>
+        <w:rPr>
+          <w:rFonts w:eastAsia="Times New Roman" w:cs="Times New Roman" w:ascii="Garamond" w:hAnsi="Garamond"/>
+          <w:color w:val="000000"/>
+          <w:kern w:val="0"/>
+          <w:sz w:val="36"/>
+          <w:szCs w:val="36"/>
+          <w:shd w:fill="auto" w:val="clear"/>
+          <w:lang w:val="en-US" w:eastAsia="zh-CN" w:bidi="hi-IN"/>
+        </w:rPr>
+      </w:r>
+    </w:p>
+    <w:p>
+      <w:pPr>
+        <w:pStyle w:val="Normal"/>
+        <w:jc w:val="both"/>
+        <w:rPr>
+          <w:rFonts w:ascii="Garamond" w:hAnsi="Garamond" w:eastAsia="Times New Roman" w:cs="Times New Roman"/>
+          <w:color w:val="000000"/>
+          <w:kern w:val="0"/>
+          <w:sz w:val="36"/>
+          <w:szCs w:val="36"/>
+          <w:shd w:fill="auto" w:val="clear"/>
+          <w:lang w:val="en-US" w:eastAsia="zh-CN" w:bidi="hi-IN"/>
+        </w:rPr>
+      </w:pPr>
+      <w:r>
+        <w:rPr>
+          <w:rFonts w:eastAsia="Times New Roman" w:cs="Times New Roman" w:ascii="Garamond" w:hAnsi="Garamond"/>
+          <w:color w:val="000000"/>
+          <w:kern w:val="0"/>
+          <w:sz w:val="36"/>
+          <w:szCs w:val="36"/>
+          <w:shd w:fill="auto" w:val="clear"/>
+          <w:lang w:val="en-US" w:eastAsia="zh-CN" w:bidi="hi-IN"/>
+        </w:rPr>
+        <w:t xml:space="preserve">Recorrendo uma vez mais à Emmanuel, agora na obra </w:t>
+      </w:r>
+      <w:r>
+        <w:rPr>
+          <w:rFonts w:eastAsia="Times New Roman" w:cs="Times New Roman" w:ascii="Garamond" w:hAnsi="Garamond"/>
+          <w:i/>
+          <w:iCs/>
+          <w:color w:val="000000"/>
+          <w:kern w:val="0"/>
+          <w:sz w:val="36"/>
+          <w:szCs w:val="36"/>
+          <w:shd w:fill="auto" w:val="clear"/>
+          <w:lang w:val="en-US" w:eastAsia="zh-CN" w:bidi="hi-IN"/>
+        </w:rPr>
+        <w:t>Pão Nosso</w:t>
+      </w:r>
+      <w:r>
+        <w:rPr>
+          <w:rFonts w:eastAsia="Times New Roman" w:cs="Times New Roman" w:ascii="Garamond" w:hAnsi="Garamond"/>
+          <w:color w:val="000000"/>
+          <w:kern w:val="0"/>
+          <w:sz w:val="36"/>
+          <w:szCs w:val="36"/>
+          <w:shd w:fill="auto" w:val="clear"/>
+          <w:lang w:val="en-US" w:eastAsia="zh-CN" w:bidi="hi-IN"/>
+        </w:rPr>
+        <w:t xml:space="preserve">, lição de número 91 intitulada </w:t>
+      </w:r>
+      <w:r>
+        <w:rPr>
+          <w:rFonts w:eastAsia="Times New Roman" w:cs="Times New Roman" w:ascii="Garamond" w:hAnsi="Garamond"/>
+          <w:i/>
+          <w:iCs/>
+          <w:color w:val="000000"/>
+          <w:kern w:val="0"/>
+          <w:sz w:val="36"/>
+          <w:szCs w:val="36"/>
+          <w:shd w:fill="auto" w:val="clear"/>
+          <w:lang w:val="en-US" w:eastAsia="zh-CN" w:bidi="hi-IN"/>
+        </w:rPr>
+        <w:t>Isso é Contigo</w:t>
+      </w:r>
+      <w:r>
+        <w:rPr>
+          <w:rFonts w:eastAsia="Times New Roman" w:cs="Times New Roman" w:ascii="Garamond" w:hAnsi="Garamond"/>
+          <w:color w:val="000000"/>
+          <w:kern w:val="0"/>
+          <w:sz w:val="36"/>
+          <w:szCs w:val="36"/>
+          <w:shd w:fill="auto" w:val="clear"/>
+          <w:lang w:val="en-US" w:eastAsia="zh-CN" w:bidi="hi-IN"/>
+        </w:rPr>
+        <w:t>. Nessa lição, Emmanuel se utiliza do caso de Judas para nos dizer que, por mais que alguém nos induza ao erro, a decisão final de aceitar tais sugestões é sempre nossa.</w:t>
+      </w:r>
+    </w:p>
+    <w:p>
+      <w:pPr>
+        <w:pStyle w:val="Normal"/>
+        <w:jc w:val="both"/>
+        <w:rPr>
+          <w:rFonts w:ascii="Garamond" w:hAnsi="Garamond" w:eastAsia="Times New Roman" w:cs="Times New Roman"/>
+          <w:color w:val="000000"/>
+          <w:kern w:val="0"/>
+          <w:sz w:val="36"/>
+          <w:szCs w:val="36"/>
+          <w:shd w:fill="auto" w:val="clear"/>
+          <w:lang w:val="en-US" w:eastAsia="zh-CN" w:bidi="hi-IN"/>
+        </w:rPr>
+      </w:pPr>
+      <w:r>
+        <w:rPr>
+          <w:rFonts w:eastAsia="Times New Roman" w:cs="Times New Roman" w:ascii="Garamond" w:hAnsi="Garamond"/>
+          <w:color w:val="000000"/>
+          <w:kern w:val="0"/>
+          <w:sz w:val="36"/>
+          <w:szCs w:val="36"/>
+          <w:shd w:fill="auto" w:val="clear"/>
+          <w:lang w:val="en-US" w:eastAsia="zh-CN" w:bidi="hi-IN"/>
+        </w:rPr>
+      </w:r>
+    </w:p>
+    <w:p>
+      <w:pPr>
+        <w:pStyle w:val="Normal"/>
+        <w:jc w:val="both"/>
+        <w:rPr>
+          <w:rFonts w:ascii="Garamond" w:hAnsi="Garamond" w:eastAsia="Times New Roman" w:cs="Times New Roman"/>
+          <w:color w:val="000000"/>
+          <w:kern w:val="0"/>
+          <w:sz w:val="36"/>
+          <w:szCs w:val="36"/>
+          <w:shd w:fill="auto" w:val="clear"/>
+          <w:lang w:val="en-US" w:eastAsia="zh-CN" w:bidi="hi-IN"/>
+        </w:rPr>
+      </w:pPr>
+      <w:r>
+        <w:rPr>
+          <w:rFonts w:eastAsia="Times New Roman" w:cs="Times New Roman" w:ascii="Garamond" w:hAnsi="Garamond"/>
+          <w:color w:val="000000"/>
+          <w:kern w:val="0"/>
+          <w:sz w:val="36"/>
+          <w:szCs w:val="36"/>
+          <w:shd w:fill="auto" w:val="clear"/>
+          <w:lang w:val="en-US" w:eastAsia="zh-CN" w:bidi="hi-IN"/>
+        </w:rPr>
+        <w:t>Judas, quando tomou consciência das consequências do seu ato de entregar Jesus, procurou os sumo sacerdotes para devolver-lhes as 30 moedas e desfazer o acordo.</w:t>
+      </w:r>
+    </w:p>
+    <w:p>
+      <w:pPr>
+        <w:pStyle w:val="Normal"/>
+        <w:jc w:val="both"/>
+        <w:rPr>
+          <w:rFonts w:ascii="Garamond" w:hAnsi="Garamond" w:eastAsia="Times New Roman" w:cs="Times New Roman"/>
+          <w:color w:val="000000"/>
+          <w:kern w:val="0"/>
+          <w:sz w:val="36"/>
+          <w:szCs w:val="36"/>
+          <w:shd w:fill="auto" w:val="clear"/>
+          <w:lang w:val="en-US" w:eastAsia="zh-CN" w:bidi="hi-IN"/>
+        </w:rPr>
+      </w:pPr>
+      <w:r>
+        <w:rPr>
+          <w:rFonts w:eastAsia="Times New Roman" w:cs="Times New Roman" w:ascii="Garamond" w:hAnsi="Garamond"/>
+          <w:color w:val="000000"/>
+          <w:kern w:val="0"/>
+          <w:sz w:val="36"/>
+          <w:szCs w:val="36"/>
+          <w:shd w:fill="auto" w:val="clear"/>
+          <w:lang w:val="en-US" w:eastAsia="zh-CN" w:bidi="hi-IN"/>
+        </w:rPr>
+      </w:r>
+    </w:p>
+    <w:p>
+      <w:pPr>
+        <w:pStyle w:val="Normal"/>
+        <w:jc w:val="both"/>
+        <w:rPr>
+          <w:rFonts w:ascii="Garamond" w:hAnsi="Garamond" w:eastAsia="Times New Roman" w:cs="Times New Roman"/>
+          <w:color w:val="000000"/>
+          <w:kern w:val="0"/>
+          <w:sz w:val="36"/>
+          <w:szCs w:val="36"/>
+          <w:shd w:fill="auto" w:val="clear"/>
+          <w:lang w:val="en-US" w:eastAsia="zh-CN" w:bidi="hi-IN"/>
+        </w:rPr>
+      </w:pPr>
+      <w:r>
+        <w:rPr>
+          <w:rFonts w:eastAsia="Times New Roman" w:cs="Times New Roman" w:ascii="Garamond" w:hAnsi="Garamond"/>
+          <w:color w:val="000000"/>
+          <w:kern w:val="0"/>
+          <w:sz w:val="36"/>
+          <w:szCs w:val="36"/>
+          <w:shd w:fill="auto" w:val="clear"/>
+          <w:lang w:val="en-US" w:eastAsia="zh-CN" w:bidi="hi-IN"/>
+        </w:rPr>
+        <w:t xml:space="preserve">Ele diz aos sumo sacerdotes: </w:t>
+      </w:r>
+      <w:r>
+        <w:rPr>
+          <w:rFonts w:eastAsia="Times New Roman" w:cs="Times New Roman" w:ascii="Garamond" w:hAnsi="Garamond"/>
+          <w:i/>
+          <w:iCs/>
+          <w:color w:val="000000"/>
+          <w:kern w:val="0"/>
+          <w:sz w:val="36"/>
+          <w:szCs w:val="36"/>
+          <w:shd w:fill="auto" w:val="clear"/>
+          <w:lang w:val="en-US" w:eastAsia="zh-CN" w:bidi="hi-IN"/>
+        </w:rPr>
+        <w:t>Pequei, traindo o sangue inocente</w:t>
+      </w:r>
+      <w:r>
+        <w:rPr>
+          <w:rFonts w:eastAsia="Times New Roman" w:cs="Times New Roman" w:ascii="Garamond" w:hAnsi="Garamond"/>
+          <w:color w:val="000000"/>
+          <w:kern w:val="0"/>
+          <w:sz w:val="36"/>
+          <w:szCs w:val="36"/>
+          <w:shd w:fill="auto" w:val="clear"/>
+          <w:lang w:val="en-US" w:eastAsia="zh-CN" w:bidi="hi-IN"/>
+        </w:rPr>
+        <w:t xml:space="preserve">. Eles, porém, responderam: </w:t>
+      </w:r>
+      <w:r>
+        <w:rPr>
+          <w:rFonts w:eastAsia="Times New Roman" w:cs="Times New Roman" w:ascii="Garamond" w:hAnsi="Garamond"/>
+          <w:i/>
+          <w:iCs/>
+          <w:color w:val="000000"/>
+          <w:kern w:val="0"/>
+          <w:sz w:val="36"/>
+          <w:szCs w:val="36"/>
+          <w:shd w:fill="auto" w:val="clear"/>
+          <w:lang w:val="en-US" w:eastAsia="zh-CN" w:bidi="hi-IN"/>
+        </w:rPr>
+        <w:t>Que nos importa? Isso é contigo</w:t>
       </w:r>
       <w:r>
         <w:rPr>
@@ -5440,6 +5675,306 @@
         </w:rPr>
       </w:pPr>
       <w:r>
+        <w:rPr>
+          <w:rFonts w:eastAsia="Times New Roman" w:cs="Times New Roman" w:ascii="Garamond" w:hAnsi="Garamond"/>
+          <w:color w:val="000000"/>
+          <w:kern w:val="0"/>
+          <w:sz w:val="36"/>
+          <w:szCs w:val="36"/>
+          <w:shd w:fill="auto" w:val="clear"/>
+          <w:lang w:val="en-US" w:eastAsia="zh-CN" w:bidi="hi-IN"/>
+        </w:rPr>
+      </w:r>
+    </w:p>
+    <w:p>
+      <w:pPr>
+        <w:pStyle w:val="Normal"/>
+        <w:jc w:val="both"/>
+        <w:rPr>
+          <w:rFonts w:ascii="Garamond" w:hAnsi="Garamond" w:eastAsia="Times New Roman" w:cs="Times New Roman"/>
+          <w:color w:val="000000"/>
+          <w:kern w:val="0"/>
+          <w:sz w:val="36"/>
+          <w:szCs w:val="36"/>
+          <w:shd w:fill="auto" w:val="clear"/>
+          <w:lang w:val="en-US" w:eastAsia="zh-CN" w:bidi="hi-IN"/>
+        </w:rPr>
+      </w:pPr>
+      <w:r>
+        <w:rPr>
+          <w:rFonts w:eastAsia="Times New Roman" w:cs="Times New Roman" w:ascii="Garamond" w:hAnsi="Garamond"/>
+          <w:color w:val="000000"/>
+          <w:kern w:val="0"/>
+          <w:sz w:val="36"/>
+          <w:szCs w:val="36"/>
+          <w:shd w:fill="auto" w:val="clear"/>
+          <w:lang w:val="en-US" w:eastAsia="zh-CN" w:bidi="hi-IN"/>
+        </w:rPr>
+        <w:t>É como se dissessem a Judas: nós lhe fizemos uma proposta para trair e entregar seu mestre e amigo. Você aceitou porque quis. Não nos culpe por isso e nem espere que voltemos atrás em nosso acordo.</w:t>
+      </w:r>
+    </w:p>
+    <w:p>
+      <w:pPr>
+        <w:pStyle w:val="Normal"/>
+        <w:jc w:val="both"/>
+        <w:rPr>
+          <w:rFonts w:ascii="Garamond" w:hAnsi="Garamond" w:eastAsia="Times New Roman" w:cs="Times New Roman"/>
+          <w:color w:val="000000"/>
+          <w:kern w:val="0"/>
+          <w:sz w:val="36"/>
+          <w:szCs w:val="36"/>
+          <w:shd w:fill="auto" w:val="clear"/>
+          <w:lang w:val="en-US" w:eastAsia="zh-CN" w:bidi="hi-IN"/>
+        </w:rPr>
+      </w:pPr>
+      <w:r>
+        <w:rPr>
+          <w:rFonts w:eastAsia="Times New Roman" w:cs="Times New Roman" w:ascii="Garamond" w:hAnsi="Garamond"/>
+          <w:color w:val="000000"/>
+          <w:kern w:val="0"/>
+          <w:sz w:val="36"/>
+          <w:szCs w:val="36"/>
+          <w:shd w:fill="auto" w:val="clear"/>
+          <w:lang w:val="en-US" w:eastAsia="zh-CN" w:bidi="hi-IN"/>
+        </w:rPr>
+      </w:r>
+    </w:p>
+    <w:p>
+      <w:pPr>
+        <w:pStyle w:val="Normal"/>
+        <w:jc w:val="both"/>
+        <w:rPr>
+          <w:rFonts w:ascii="Garamond" w:hAnsi="Garamond" w:eastAsia="Times New Roman" w:cs="Times New Roman"/>
+          <w:color w:val="000000"/>
+          <w:kern w:val="0"/>
+          <w:sz w:val="36"/>
+          <w:szCs w:val="36"/>
+          <w:shd w:fill="auto" w:val="clear"/>
+          <w:lang w:val="en-US" w:eastAsia="zh-CN" w:bidi="hi-IN"/>
+        </w:rPr>
+      </w:pPr>
+      <w:r>
+        <w:rPr>
+          <w:rFonts w:eastAsia="Times New Roman" w:cs="Times New Roman" w:ascii="Garamond" w:hAnsi="Garamond"/>
+          <w:color w:val="000000"/>
+          <w:kern w:val="0"/>
+          <w:sz w:val="36"/>
+          <w:szCs w:val="36"/>
+          <w:shd w:fill="auto" w:val="clear"/>
+          <w:lang w:val="en-US" w:eastAsia="zh-CN" w:bidi="hi-IN"/>
+        </w:rPr>
+        <w:t xml:space="preserve">Sempre haverá alguém que vai semear joio no terreno de nossos corações. Esse alguém lança a semente e se afasta, muitas vezes nos observando e aguardando nossa reação. </w:t>
+      </w:r>
+    </w:p>
+    <w:p>
+      <w:pPr>
+        <w:pStyle w:val="Normal"/>
+        <w:jc w:val="both"/>
+        <w:rPr>
+          <w:rFonts w:ascii="Garamond" w:hAnsi="Garamond" w:eastAsia="Times New Roman" w:cs="Times New Roman"/>
+          <w:color w:val="000000"/>
+          <w:kern w:val="0"/>
+          <w:sz w:val="36"/>
+          <w:szCs w:val="36"/>
+          <w:shd w:fill="auto" w:val="clear"/>
+          <w:lang w:val="en-US" w:eastAsia="zh-CN" w:bidi="hi-IN"/>
+        </w:rPr>
+      </w:pPr>
+      <w:r>
+        <w:rPr>
+          <w:rFonts w:eastAsia="Times New Roman" w:cs="Times New Roman" w:ascii="Garamond" w:hAnsi="Garamond"/>
+          <w:color w:val="000000"/>
+          <w:kern w:val="0"/>
+          <w:sz w:val="36"/>
+          <w:szCs w:val="36"/>
+          <w:shd w:fill="auto" w:val="clear"/>
+          <w:lang w:val="en-US" w:eastAsia="zh-CN" w:bidi="hi-IN"/>
+        </w:rPr>
+      </w:r>
+    </w:p>
+    <w:p>
+      <w:pPr>
+        <w:pStyle w:val="Normal"/>
+        <w:jc w:val="both"/>
+        <w:rPr>
+          <w:rFonts w:ascii="Garamond" w:hAnsi="Garamond" w:eastAsia="Times New Roman" w:cs="Times New Roman"/>
+          <w:color w:val="000000"/>
+          <w:kern w:val="0"/>
+          <w:sz w:val="36"/>
+          <w:szCs w:val="36"/>
+          <w:shd w:fill="auto" w:val="clear"/>
+          <w:lang w:val="en-US" w:eastAsia="zh-CN" w:bidi="hi-IN"/>
+        </w:rPr>
+      </w:pPr>
+      <w:r>
+        <w:rPr>
+          <w:rFonts w:eastAsia="Times New Roman" w:cs="Times New Roman" w:ascii="Garamond" w:hAnsi="Garamond"/>
+          <w:color w:val="000000"/>
+          <w:kern w:val="0"/>
+          <w:sz w:val="36"/>
+          <w:szCs w:val="36"/>
+          <w:shd w:fill="auto" w:val="clear"/>
+          <w:lang w:val="en-US" w:eastAsia="zh-CN" w:bidi="hi-IN"/>
+        </w:rPr>
+        <w:t>Se oferecemos solo fértil a essa semente, não temos o direito de culpar quem a lançou em nós. A decisão final de acolher ou repelir a semente do joio é sempre nossa.</w:t>
+      </w:r>
+    </w:p>
+    <w:p>
+      <w:pPr>
+        <w:pStyle w:val="Normal"/>
+        <w:jc w:val="both"/>
+        <w:rPr>
+          <w:rFonts w:ascii="Garamond" w:hAnsi="Garamond" w:eastAsia="Times New Roman" w:cs="Times New Roman"/>
+          <w:color w:val="000000"/>
+          <w:kern w:val="0"/>
+          <w:sz w:val="36"/>
+          <w:szCs w:val="36"/>
+          <w:shd w:fill="auto" w:val="clear"/>
+          <w:lang w:val="en-US" w:eastAsia="zh-CN" w:bidi="hi-IN"/>
+        </w:rPr>
+      </w:pPr>
+      <w:r>
+        <w:rPr>
+          <w:rFonts w:eastAsia="Times New Roman" w:cs="Times New Roman" w:ascii="Garamond" w:hAnsi="Garamond"/>
+          <w:color w:val="000000"/>
+          <w:kern w:val="0"/>
+          <w:sz w:val="36"/>
+          <w:szCs w:val="36"/>
+          <w:shd w:fill="auto" w:val="clear"/>
+          <w:lang w:val="en-US" w:eastAsia="zh-CN" w:bidi="hi-IN"/>
+        </w:rPr>
+      </w:r>
+    </w:p>
+    <w:p>
+      <w:pPr>
+        <w:pStyle w:val="Normal"/>
+        <w:jc w:val="both"/>
+        <w:rPr>
+          <w:rFonts w:ascii="Garamond" w:hAnsi="Garamond" w:eastAsia="Times New Roman" w:cs="Times New Roman"/>
+          <w:i/>
+          <w:i/>
+          <w:iCs/>
+          <w:color w:val="000000"/>
+          <w:kern w:val="0"/>
+          <w:sz w:val="36"/>
+          <w:szCs w:val="36"/>
+          <w:u w:val="single"/>
+          <w:shd w:fill="auto" w:val="clear"/>
+          <w:lang w:val="en-US" w:eastAsia="zh-CN" w:bidi="hi-IN"/>
+        </w:rPr>
+      </w:pPr>
+      <w:r>
+        <w:rPr>
+          <w:rFonts w:eastAsia="Times New Roman" w:cs="Times New Roman" w:ascii="Garamond" w:hAnsi="Garamond"/>
+          <w:i/>
+          <w:iCs/>
+          <w:color w:val="000000"/>
+          <w:kern w:val="0"/>
+          <w:sz w:val="36"/>
+          <w:szCs w:val="36"/>
+          <w:u w:val="single"/>
+          <w:shd w:fill="auto" w:val="clear"/>
+          <w:lang w:val="en-US" w:eastAsia="zh-CN" w:bidi="hi-IN"/>
+        </w:rPr>
+        <w:t xml:space="preserve">E, quando a erva cresceu e frutificou, apareceu também o joio. </w:t>
+      </w:r>
+    </w:p>
+    <w:p>
+      <w:pPr>
+        <w:pStyle w:val="Normal"/>
+        <w:jc w:val="both"/>
+        <w:rPr>
+          <w:rFonts w:ascii="Garamond" w:hAnsi="Garamond" w:eastAsia="Times New Roman" w:cs="Times New Roman"/>
+          <w:color w:val="000000"/>
+          <w:kern w:val="0"/>
+          <w:sz w:val="36"/>
+          <w:szCs w:val="36"/>
+          <w:shd w:fill="auto" w:val="clear"/>
+          <w:lang w:val="en-US" w:eastAsia="zh-CN" w:bidi="hi-IN"/>
+        </w:rPr>
+      </w:pPr>
+      <w:r>
+        <w:rPr>
+          <w:rFonts w:eastAsia="Times New Roman" w:cs="Times New Roman" w:ascii="Garamond" w:hAnsi="Garamond"/>
+          <w:color w:val="000000"/>
+          <w:kern w:val="0"/>
+          <w:sz w:val="36"/>
+          <w:szCs w:val="36"/>
+          <w:shd w:fill="auto" w:val="clear"/>
+          <w:lang w:val="en-US" w:eastAsia="zh-CN" w:bidi="hi-IN"/>
+        </w:rPr>
+      </w:r>
+    </w:p>
+    <w:p>
+      <w:pPr>
+        <w:pStyle w:val="Normal"/>
+        <w:jc w:val="both"/>
+        <w:rPr>
+          <w:rFonts w:ascii="Garamond" w:hAnsi="Garamond" w:eastAsia="Times New Roman" w:cs="Times New Roman"/>
+          <w:color w:val="00A0FC"/>
+          <w:kern w:val="0"/>
+          <w:sz w:val="36"/>
+          <w:szCs w:val="36"/>
+          <w:shd w:fill="auto" w:val="clear"/>
+          <w:lang w:val="en-US" w:eastAsia="zh-CN" w:bidi="hi-IN"/>
+        </w:rPr>
+      </w:pPr>
+      <w:r>
+        <w:rPr>
+          <w:rFonts w:eastAsia="Times New Roman" w:cs="Times New Roman" w:ascii="Garamond" w:hAnsi="Garamond"/>
+          <w:b/>
+          <w:bCs/>
+          <w:i/>
+          <w:iCs/>
+          <w:color w:val="FC5C00"/>
+          <w:kern w:val="0"/>
+          <w:sz w:val="36"/>
+          <w:szCs w:val="36"/>
+          <w:shd w:fill="auto" w:val="clear"/>
+          <w:lang w:val="en-US" w:eastAsia="zh-CN" w:bidi="hi-IN"/>
+        </w:rPr>
+        <w:t>E, quando a erva cresceu e fruticou</w:t>
+      </w:r>
+      <w:r>
+        <w:rPr>
+          <w:rFonts w:eastAsia="Times New Roman" w:cs="Times New Roman" w:ascii="Garamond" w:hAnsi="Garamond"/>
+          <w:color w:val="000000"/>
+          <w:kern w:val="0"/>
+          <w:sz w:val="36"/>
+          <w:szCs w:val="36"/>
+          <w:shd w:fill="auto" w:val="clear"/>
+          <w:lang w:val="en-US" w:eastAsia="zh-CN" w:bidi="hi-IN"/>
+        </w:rPr>
+        <w:t>:</w:t>
+      </w:r>
+      <w:r>
+        <w:rPr>
+          <w:rFonts w:eastAsia="Times New Roman" w:cs="Times New Roman" w:ascii="Garamond" w:hAnsi="Garamond"/>
+          <w:color w:val="000000"/>
+          <w:kern w:val="0"/>
+          <w:sz w:val="36"/>
+          <w:szCs w:val="36"/>
+          <w:shd w:fill="auto" w:val="clear"/>
+          <w:lang w:val="en-US" w:eastAsia="zh-CN" w:bidi="hi-IN"/>
+        </w:rPr>
+        <w:t xml:space="preserve"> aqui Jesus nos lembra que tudo aquilo que plantamos na vida, irá frutificar a seu tempo. Não importa quanto tempo leve, toda semente resultará em frutos. A qualidade dos frutos depende da qualidade da semente.</w:t>
+      </w:r>
+    </w:p>
+    <w:p>
+      <w:pPr>
+        <w:pStyle w:val="Normal"/>
+        <w:jc w:val="both"/>
+        <w:rPr>
+          <w:rFonts w:ascii="Garamond" w:hAnsi="Garamond" w:eastAsia="Times New Roman" w:cs="Times New Roman"/>
+          <w:color w:val="00A0FC"/>
+          <w:kern w:val="0"/>
+          <w:sz w:val="36"/>
+          <w:szCs w:val="36"/>
+          <w:shd w:fill="auto" w:val="clear"/>
+          <w:lang w:val="en-US" w:eastAsia="zh-CN" w:bidi="hi-IN"/>
+        </w:rPr>
+      </w:pPr>
+      <w:r>
         <w:rPr/>
       </w:r>
     </w:p>
@@ -5449,86 +5984,34 @@
         <w:jc w:val="both"/>
         <w:rPr>
           <w:rFonts w:ascii="Garamond" w:hAnsi="Garamond" w:eastAsia="Times New Roman" w:cs="Times New Roman"/>
-          <w:color w:val="000000"/>
-          <w:kern w:val="0"/>
-          <w:sz w:val="36"/>
-          <w:szCs w:val="36"/>
-          <w:shd w:fill="auto" w:val="clear"/>
-          <w:lang w:val="en-US" w:eastAsia="zh-CN" w:bidi="hi-IN"/>
-        </w:rPr>
-      </w:pPr>
-      <w:r>
-        <w:rPr>
-          <w:rFonts w:eastAsia="Times New Roman" w:cs="Times New Roman" w:ascii="Garamond" w:hAnsi="Garamond"/>
-          <w:color w:val="000000"/>
-          <w:kern w:val="0"/>
-          <w:sz w:val="36"/>
-          <w:szCs w:val="36"/>
-          <w:shd w:fill="auto" w:val="clear"/>
-          <w:lang w:val="en-US" w:eastAsia="zh-CN" w:bidi="hi-IN"/>
-        </w:rPr>
-        <w:t xml:space="preserve">Recorrendo uma vez mais à Emmanuel, agora na obra </w:t>
-      </w:r>
-      <w:r>
-        <w:rPr>
-          <w:rFonts w:eastAsia="Times New Roman" w:cs="Times New Roman" w:ascii="Garamond" w:hAnsi="Garamond"/>
-          <w:i/>
-          <w:iCs/>
-          <w:color w:val="000000"/>
-          <w:kern w:val="0"/>
-          <w:sz w:val="36"/>
-          <w:szCs w:val="36"/>
-          <w:shd w:fill="auto" w:val="clear"/>
-          <w:lang w:val="en-US" w:eastAsia="zh-CN" w:bidi="hi-IN"/>
-        </w:rPr>
-        <w:t>Pão Nosso</w:t>
-      </w:r>
-      <w:r>
-        <w:rPr>
-          <w:rFonts w:eastAsia="Times New Roman" w:cs="Times New Roman" w:ascii="Garamond" w:hAnsi="Garamond"/>
-          <w:color w:val="000000"/>
-          <w:kern w:val="0"/>
-          <w:sz w:val="36"/>
-          <w:szCs w:val="36"/>
-          <w:shd w:fill="auto" w:val="clear"/>
-          <w:lang w:val="en-US" w:eastAsia="zh-CN" w:bidi="hi-IN"/>
-        </w:rPr>
-        <w:t xml:space="preserve">, lição de número 91 intitulada </w:t>
-      </w:r>
-      <w:r>
-        <w:rPr>
-          <w:rFonts w:eastAsia="Times New Roman" w:cs="Times New Roman" w:ascii="Garamond" w:hAnsi="Garamond"/>
-          <w:i/>
-          <w:iCs/>
-          <w:color w:val="000000"/>
-          <w:kern w:val="0"/>
-          <w:sz w:val="36"/>
-          <w:szCs w:val="36"/>
-          <w:shd w:fill="auto" w:val="clear"/>
-          <w:lang w:val="en-US" w:eastAsia="zh-CN" w:bidi="hi-IN"/>
-        </w:rPr>
-        <w:t>Isso é Contigo</w:t>
-      </w:r>
-      <w:r>
-        <w:rPr>
-          <w:rFonts w:eastAsia="Times New Roman" w:cs="Times New Roman" w:ascii="Garamond" w:hAnsi="Garamond"/>
-          <w:color w:val="000000"/>
-          <w:kern w:val="0"/>
-          <w:sz w:val="36"/>
-          <w:szCs w:val="36"/>
-          <w:shd w:fill="auto" w:val="clear"/>
-          <w:lang w:val="en-US" w:eastAsia="zh-CN" w:bidi="hi-IN"/>
-        </w:rPr>
-        <w:t>. Nessa lição, Emmanuel se utiliza do caso de Judas para nos dizer que, por mais que alguém nos induza ao erro, a decisão final de aceitar tais sugestões é sempre nossa.</w:t>
-      </w:r>
-    </w:p>
-    <w:p>
-      <w:pPr>
-        <w:pStyle w:val="Normal"/>
-        <w:jc w:val="both"/>
-        <w:rPr>
-          <w:rFonts w:ascii="Garamond" w:hAnsi="Garamond" w:eastAsia="Times New Roman" w:cs="Times New Roman"/>
-          <w:color w:val="000000"/>
+          <w:color w:val="00A0FC"/>
+          <w:kern w:val="0"/>
+          <w:sz w:val="36"/>
+          <w:szCs w:val="36"/>
+          <w:shd w:fill="auto" w:val="clear"/>
+          <w:lang w:val="en-US" w:eastAsia="zh-CN" w:bidi="hi-IN"/>
+        </w:rPr>
+      </w:pPr>
+      <w:r>
+        <w:rPr>
+          <w:rFonts w:eastAsia="Times New Roman" w:cs="Times New Roman" w:ascii="Garamond" w:hAnsi="Garamond"/>
+          <w:color w:val="000000"/>
+          <w:kern w:val="0"/>
+          <w:sz w:val="36"/>
+          <w:szCs w:val="36"/>
+          <w:shd w:fill="auto" w:val="clear"/>
+          <w:lang w:val="en-US" w:eastAsia="zh-CN" w:bidi="hi-IN"/>
+        </w:rPr>
+        <w:t>Por isso a necessidade de vigiarmos constantemente nossos pensamentos, palavras, e, principalmente nossas ações.</w:t>
+      </w:r>
+    </w:p>
+    <w:p>
+      <w:pPr>
+        <w:pStyle w:val="Normal"/>
+        <w:jc w:val="both"/>
+        <w:rPr>
+          <w:rFonts w:ascii="Garamond" w:hAnsi="Garamond" w:eastAsia="Times New Roman" w:cs="Times New Roman"/>
+          <w:color w:val="00A0FC"/>
           <w:kern w:val="0"/>
           <w:sz w:val="36"/>
           <w:szCs w:val="36"/>
@@ -5546,46 +6029,50 @@
         <w:jc w:val="both"/>
         <w:rPr>
           <w:rFonts w:ascii="Garamond" w:hAnsi="Garamond" w:eastAsia="Times New Roman" w:cs="Times New Roman"/>
-          <w:color w:val="000000"/>
-          <w:kern w:val="0"/>
-          <w:sz w:val="36"/>
-          <w:szCs w:val="36"/>
-          <w:shd w:fill="auto" w:val="clear"/>
-          <w:lang w:val="en-US" w:eastAsia="zh-CN" w:bidi="hi-IN"/>
-        </w:rPr>
-      </w:pPr>
-      <w:r>
-        <w:rPr>
-          <w:rFonts w:eastAsia="Times New Roman" w:cs="Times New Roman" w:ascii="Garamond" w:hAnsi="Garamond"/>
-          <w:color w:val="000000"/>
-          <w:kern w:val="0"/>
-          <w:sz w:val="36"/>
-          <w:szCs w:val="36"/>
-          <w:shd w:fill="auto" w:val="clear"/>
-          <w:lang w:val="en-US" w:eastAsia="zh-CN" w:bidi="hi-IN"/>
-        </w:rPr>
-        <w:t xml:space="preserve">Judas, </w:t>
-      </w:r>
-      <w:r>
-        <w:rPr>
-          <w:rFonts w:eastAsia="Times New Roman" w:cs="Times New Roman" w:ascii="Garamond" w:hAnsi="Garamond"/>
-          <w:color w:val="000000"/>
-          <w:kern w:val="0"/>
-          <w:sz w:val="36"/>
-          <w:szCs w:val="36"/>
-          <w:shd w:fill="auto" w:val="clear"/>
-          <w:lang w:val="en-US" w:eastAsia="zh-CN" w:bidi="hi-IN"/>
-        </w:rPr>
-        <w:t>quando tomou consciência das consequências do seu ato de entregar Jesus, procurou os sumo sacerdotes para devolver-lhes as 30 moedas e desfazer o acordo.</w:t>
-      </w:r>
-    </w:p>
-    <w:p>
-      <w:pPr>
-        <w:pStyle w:val="Normal"/>
-        <w:jc w:val="both"/>
-        <w:rPr>
-          <w:rFonts w:ascii="Garamond" w:hAnsi="Garamond" w:eastAsia="Times New Roman" w:cs="Times New Roman"/>
-          <w:color w:val="000000"/>
+          <w:color w:val="00A0FC"/>
+          <w:kern w:val="0"/>
+          <w:sz w:val="36"/>
+          <w:szCs w:val="36"/>
+          <w:shd w:fill="auto" w:val="clear"/>
+          <w:lang w:val="en-US" w:eastAsia="zh-CN" w:bidi="hi-IN"/>
+        </w:rPr>
+      </w:pPr>
+      <w:r>
+        <w:rPr>
+          <w:rFonts w:eastAsia="Times New Roman" w:cs="Times New Roman" w:ascii="Garamond" w:hAnsi="Garamond"/>
+          <w:b/>
+          <w:bCs/>
+          <w:i/>
+          <w:iCs/>
+          <w:color w:val="FC5C00"/>
+          <w:kern w:val="0"/>
+          <w:sz w:val="36"/>
+          <w:szCs w:val="36"/>
+          <w:shd w:fill="auto" w:val="clear"/>
+          <w:lang w:val="en-US" w:eastAsia="zh-CN" w:bidi="hi-IN"/>
+        </w:rPr>
+        <w:t>Apareceu também o joio</w:t>
+      </w:r>
+      <w:r>
+        <w:rPr>
+          <w:rFonts w:eastAsia="Times New Roman" w:cs="Times New Roman" w:ascii="Garamond" w:hAnsi="Garamond"/>
+          <w:color w:val="000000"/>
+          <w:kern w:val="0"/>
+          <w:sz w:val="36"/>
+          <w:szCs w:val="36"/>
+          <w:shd w:fill="auto" w:val="clear"/>
+          <w:lang w:val="en-US" w:eastAsia="zh-CN" w:bidi="hi-IN"/>
+        </w:rPr>
+        <w:t>: Deus e Jesus, por misericórdia, nos dão a oportunidade de aprender, com o tempo. Ainda necessitamos dos contrastes para distinguir o bem do mal.</w:t>
+      </w:r>
+    </w:p>
+    <w:p>
+      <w:pPr>
+        <w:pStyle w:val="Normal"/>
+        <w:jc w:val="both"/>
+        <w:rPr>
+          <w:rFonts w:ascii="Garamond" w:hAnsi="Garamond" w:eastAsia="Times New Roman" w:cs="Times New Roman"/>
+          <w:color w:val="00A0FC"/>
           <w:kern w:val="0"/>
           <w:sz w:val="36"/>
           <w:szCs w:val="36"/>
@@ -5603,77 +6090,108 @@
         <w:jc w:val="both"/>
         <w:rPr>
           <w:rFonts w:ascii="Garamond" w:hAnsi="Garamond" w:eastAsia="Times New Roman" w:cs="Times New Roman"/>
-          <w:color w:val="000000"/>
-          <w:kern w:val="0"/>
-          <w:sz w:val="36"/>
-          <w:szCs w:val="36"/>
-          <w:shd w:fill="auto" w:val="clear"/>
-          <w:lang w:val="en-US" w:eastAsia="zh-CN" w:bidi="hi-IN"/>
-        </w:rPr>
-      </w:pPr>
-      <w:r>
-        <w:rPr>
-          <w:rFonts w:eastAsia="Times New Roman" w:cs="Times New Roman" w:ascii="Garamond" w:hAnsi="Garamond"/>
-          <w:color w:val="000000"/>
-          <w:kern w:val="0"/>
-          <w:sz w:val="36"/>
-          <w:szCs w:val="36"/>
-          <w:shd w:fill="auto" w:val="clear"/>
-          <w:lang w:val="en-US" w:eastAsia="zh-CN" w:bidi="hi-IN"/>
-        </w:rPr>
-        <w:t xml:space="preserve">Ele diz aos sumo sacerdotes: </w:t>
-      </w:r>
-      <w:r>
-        <w:rPr>
-          <w:rFonts w:eastAsia="Times New Roman" w:cs="Times New Roman" w:ascii="Garamond" w:hAnsi="Garamond"/>
-          <w:i/>
-          <w:iCs/>
-          <w:color w:val="000000"/>
-          <w:kern w:val="0"/>
-          <w:sz w:val="36"/>
-          <w:szCs w:val="36"/>
-          <w:shd w:fill="auto" w:val="clear"/>
-          <w:lang w:val="en-US" w:eastAsia="zh-CN" w:bidi="hi-IN"/>
-        </w:rPr>
-        <w:t>Pequei, traindo o sangue inocente</w:t>
-      </w:r>
-      <w:r>
-        <w:rPr>
-          <w:rFonts w:eastAsia="Times New Roman" w:cs="Times New Roman" w:ascii="Garamond" w:hAnsi="Garamond"/>
-          <w:color w:val="000000"/>
-          <w:kern w:val="0"/>
-          <w:sz w:val="36"/>
-          <w:szCs w:val="36"/>
-          <w:shd w:fill="auto" w:val="clear"/>
-          <w:lang w:val="en-US" w:eastAsia="zh-CN" w:bidi="hi-IN"/>
-        </w:rPr>
-        <w:t xml:space="preserve">. Eles, porém, responderam: </w:t>
-      </w:r>
-      <w:r>
-        <w:rPr>
-          <w:rFonts w:eastAsia="Times New Roman" w:cs="Times New Roman" w:ascii="Garamond" w:hAnsi="Garamond"/>
-          <w:i/>
-          <w:iCs/>
-          <w:color w:val="000000"/>
-          <w:kern w:val="0"/>
-          <w:sz w:val="36"/>
-          <w:szCs w:val="36"/>
-          <w:shd w:fill="auto" w:val="clear"/>
-          <w:lang w:val="en-US" w:eastAsia="zh-CN" w:bidi="hi-IN"/>
-        </w:rPr>
-        <w:t>Que nos importa? Isso é contigo</w:t>
-      </w:r>
-      <w:r>
-        <w:rPr>
-          <w:rFonts w:eastAsia="Times New Roman" w:cs="Times New Roman" w:ascii="Garamond" w:hAnsi="Garamond"/>
-          <w:color w:val="000000"/>
-          <w:kern w:val="0"/>
-          <w:sz w:val="36"/>
-          <w:szCs w:val="36"/>
-          <w:shd w:fill="auto" w:val="clear"/>
-          <w:lang w:val="en-US" w:eastAsia="zh-CN" w:bidi="hi-IN"/>
-        </w:rPr>
-        <w:t>.</w:t>
+          <w:color w:val="00A0FC"/>
+          <w:kern w:val="0"/>
+          <w:sz w:val="36"/>
+          <w:szCs w:val="36"/>
+          <w:shd w:fill="auto" w:val="clear"/>
+          <w:lang w:val="en-US" w:eastAsia="zh-CN" w:bidi="hi-IN"/>
+        </w:rPr>
+      </w:pPr>
+      <w:r>
+        <w:rPr>
+          <w:rFonts w:eastAsia="Times New Roman" w:cs="Times New Roman" w:ascii="Garamond" w:hAnsi="Garamond"/>
+          <w:color w:val="000000"/>
+          <w:kern w:val="0"/>
+          <w:sz w:val="36"/>
+          <w:szCs w:val="36"/>
+          <w:shd w:fill="auto" w:val="clear"/>
+          <w:lang w:val="en-US" w:eastAsia="zh-CN" w:bidi="hi-IN"/>
+        </w:rPr>
+        <w:t>Ao vê-los caminhando lado a lado, desenvolvemos o discernimento necessário para distinguir o bem do mal. Além disso, essa convivência permite que os bons exemplos exerçam uma influência benéfica sobre aqueles que ainda se encontram vinculados ao mal.</w:t>
+      </w:r>
+    </w:p>
+    <w:p>
+      <w:pPr>
+        <w:pStyle w:val="Normal"/>
+        <w:jc w:val="both"/>
+        <w:rPr>
+          <w:rFonts w:ascii="Garamond" w:hAnsi="Garamond" w:eastAsia="Times New Roman" w:cs="Times New Roman"/>
+          <w:color w:val="00A0FC"/>
+          <w:kern w:val="0"/>
+          <w:sz w:val="36"/>
+          <w:szCs w:val="36"/>
+          <w:shd w:fill="auto" w:val="clear"/>
+          <w:lang w:val="en-US" w:eastAsia="zh-CN" w:bidi="hi-IN"/>
+        </w:rPr>
+      </w:pPr>
+      <w:r>
+        <w:rPr>
+          <w:rFonts w:eastAsia="Times New Roman" w:cs="Times New Roman" w:ascii="Garamond" w:hAnsi="Garamond"/>
+          <w:color w:val="000000"/>
+          <w:kern w:val="0"/>
+          <w:sz w:val="36"/>
+          <w:szCs w:val="36"/>
+          <w:shd w:fill="auto" w:val="clear"/>
+          <w:lang w:val="en-US" w:eastAsia="zh-CN" w:bidi="hi-IN"/>
+        </w:rPr>
+      </w:r>
+    </w:p>
+    <w:p>
+      <w:pPr>
+        <w:pStyle w:val="Normal"/>
+        <w:jc w:val="both"/>
+        <w:rPr>
+          <w:rFonts w:ascii="Garamond" w:hAnsi="Garamond" w:eastAsia="Times New Roman" w:cs="Times New Roman"/>
+          <w:color w:val="000000"/>
+          <w:kern w:val="0"/>
+          <w:sz w:val="36"/>
+          <w:szCs w:val="36"/>
+          <w:shd w:fill="auto" w:val="clear"/>
+          <w:lang w:val="en-US" w:eastAsia="zh-CN" w:bidi="hi-IN"/>
+        </w:rPr>
+      </w:pPr>
+      <w:r>
+        <w:rPr>
+          <w:rFonts w:eastAsia="Times New Roman" w:cs="Times New Roman" w:ascii="Garamond" w:hAnsi="Garamond"/>
+          <w:i/>
+          <w:iCs/>
+          <w:color w:val="000000"/>
+          <w:kern w:val="0"/>
+          <w:sz w:val="36"/>
+          <w:szCs w:val="36"/>
+          <w:u w:val="single"/>
+          <w:shd w:fill="auto" w:val="clear"/>
+          <w:lang w:val="en-US" w:eastAsia="zh-CN" w:bidi="hi-IN"/>
+        </w:rPr>
+        <w:t xml:space="preserve">E os servos do pai de família, indo ter com ele, disseram-lhe: Senhor, não semeaste tu no teu campo </w:t>
+      </w:r>
+      <w:r>
+        <w:rPr>
+          <w:rFonts w:eastAsia="Times New Roman" w:cs="Times New Roman" w:ascii="Garamond" w:hAnsi="Garamond"/>
+          <w:i/>
+          <w:iCs/>
+          <w:color w:val="000000"/>
+          <w:kern w:val="0"/>
+          <w:sz w:val="36"/>
+          <w:szCs w:val="36"/>
+          <w:u w:val="single"/>
+          <w:shd w:fill="auto" w:val="clear"/>
+          <w:lang w:val="en-US" w:eastAsia="zh-CN" w:bidi="hi-IN"/>
+        </w:rPr>
+        <w:t>boa semente? Por que tem, então, joio?</w:t>
+      </w:r>
+      <w:r>
+        <w:rPr>
+          <w:rFonts w:eastAsia="Times New Roman" w:cs="Times New Roman" w:ascii="Garamond" w:hAnsi="Garamond"/>
+          <w:color w:val="000000"/>
+          <w:kern w:val="0"/>
+          <w:sz w:val="36"/>
+          <w:szCs w:val="36"/>
+          <w:shd w:fill="auto" w:val="clear"/>
+          <w:lang w:val="en-US" w:eastAsia="zh-CN" w:bidi="hi-IN"/>
+        </w:rPr>
+        <w:t xml:space="preserve"> </w:t>
       </w:r>
     </w:p>
     <w:p>
@@ -5700,209 +6218,6 @@
         <w:jc w:val="both"/>
         <w:rPr>
           <w:rFonts w:ascii="Garamond" w:hAnsi="Garamond" w:eastAsia="Times New Roman" w:cs="Times New Roman"/>
-          <w:color w:val="000000"/>
-          <w:kern w:val="0"/>
-          <w:sz w:val="36"/>
-          <w:szCs w:val="36"/>
-          <w:shd w:fill="auto" w:val="clear"/>
-          <w:lang w:val="en-US" w:eastAsia="zh-CN" w:bidi="hi-IN"/>
-        </w:rPr>
-      </w:pPr>
-      <w:r>
-        <w:rPr>
-          <w:rFonts w:eastAsia="Times New Roman" w:cs="Times New Roman" w:ascii="Garamond" w:hAnsi="Garamond"/>
-          <w:color w:val="000000"/>
-          <w:kern w:val="0"/>
-          <w:sz w:val="36"/>
-          <w:szCs w:val="36"/>
-          <w:shd w:fill="auto" w:val="clear"/>
-          <w:lang w:val="en-US" w:eastAsia="zh-CN" w:bidi="hi-IN"/>
-        </w:rPr>
-        <w:t>É como se dissessem a Judas: nós lhe fizemos uma proposta para trair e entregar seu mestre e amigo. Você aceitou porque quis. Não nos culpe por isso e nem espere que voltemos atrás em nosso acordo.</w:t>
-      </w:r>
-    </w:p>
-    <w:p>
-      <w:pPr>
-        <w:pStyle w:val="Normal"/>
-        <w:jc w:val="both"/>
-        <w:rPr>
-          <w:rFonts w:ascii="Garamond" w:hAnsi="Garamond" w:eastAsia="Times New Roman" w:cs="Times New Roman"/>
-          <w:color w:val="000000"/>
-          <w:kern w:val="0"/>
-          <w:sz w:val="36"/>
-          <w:szCs w:val="36"/>
-          <w:shd w:fill="auto" w:val="clear"/>
-          <w:lang w:val="en-US" w:eastAsia="zh-CN" w:bidi="hi-IN"/>
-        </w:rPr>
-      </w:pPr>
-      <w:r>
-        <w:rPr/>
-      </w:r>
-    </w:p>
-    <w:p>
-      <w:pPr>
-        <w:pStyle w:val="Normal"/>
-        <w:jc w:val="both"/>
-        <w:rPr>
-          <w:rFonts w:ascii="Garamond" w:hAnsi="Garamond" w:eastAsia="Times New Roman" w:cs="Times New Roman"/>
-          <w:color w:val="000000"/>
-          <w:kern w:val="0"/>
-          <w:sz w:val="36"/>
-          <w:szCs w:val="36"/>
-          <w:shd w:fill="auto" w:val="clear"/>
-          <w:lang w:val="en-US" w:eastAsia="zh-CN" w:bidi="hi-IN"/>
-        </w:rPr>
-      </w:pPr>
-      <w:r>
-        <w:rPr>
-          <w:rFonts w:eastAsia="Times New Roman" w:cs="Times New Roman" w:ascii="Garamond" w:hAnsi="Garamond"/>
-          <w:color w:val="000000"/>
-          <w:kern w:val="0"/>
-          <w:sz w:val="36"/>
-          <w:szCs w:val="36"/>
-          <w:shd w:fill="auto" w:val="clear"/>
-          <w:lang w:val="en-US" w:eastAsia="zh-CN" w:bidi="hi-IN"/>
-        </w:rPr>
-        <w:t xml:space="preserve">Sempre haverá alguém que vai semear joio no terreno de nossos corações. Esse alguém lança a semente e se afasta, muitas vezes nos observando e aguardando nossa reação. </w:t>
-      </w:r>
-    </w:p>
-    <w:p>
-      <w:pPr>
-        <w:pStyle w:val="Normal"/>
-        <w:jc w:val="both"/>
-        <w:rPr>
-          <w:rFonts w:ascii="Garamond" w:hAnsi="Garamond" w:eastAsia="Times New Roman" w:cs="Times New Roman"/>
-          <w:color w:val="000000"/>
-          <w:kern w:val="0"/>
-          <w:sz w:val="36"/>
-          <w:szCs w:val="36"/>
-          <w:shd w:fill="auto" w:val="clear"/>
-          <w:lang w:val="en-US" w:eastAsia="zh-CN" w:bidi="hi-IN"/>
-        </w:rPr>
-      </w:pPr>
-      <w:r>
-        <w:rPr/>
-      </w:r>
-    </w:p>
-    <w:p>
-      <w:pPr>
-        <w:pStyle w:val="Normal"/>
-        <w:jc w:val="both"/>
-        <w:rPr>
-          <w:rFonts w:ascii="Garamond" w:hAnsi="Garamond" w:eastAsia="Times New Roman" w:cs="Times New Roman"/>
-          <w:color w:val="000000"/>
-          <w:kern w:val="0"/>
-          <w:sz w:val="36"/>
-          <w:szCs w:val="36"/>
-          <w:shd w:fill="auto" w:val="clear"/>
-          <w:lang w:val="en-US" w:eastAsia="zh-CN" w:bidi="hi-IN"/>
-        </w:rPr>
-      </w:pPr>
-      <w:r>
-        <w:rPr>
-          <w:rFonts w:eastAsia="Times New Roman" w:cs="Times New Roman" w:ascii="Garamond" w:hAnsi="Garamond"/>
-          <w:color w:val="000000"/>
-          <w:kern w:val="0"/>
-          <w:sz w:val="36"/>
-          <w:szCs w:val="36"/>
-          <w:shd w:fill="auto" w:val="clear"/>
-          <w:lang w:val="en-US" w:eastAsia="zh-CN" w:bidi="hi-IN"/>
-        </w:rPr>
-        <w:t>Se oferecemos solo fértil a essa semente, não temos o direito de culpar quem a lançou em nós. A decisão final de acolher ou repelir a semente do joio é sempre nossa.</w:t>
-      </w:r>
-    </w:p>
-    <w:p>
-      <w:pPr>
-        <w:pStyle w:val="Normal"/>
-        <w:jc w:val="both"/>
-        <w:rPr>
-          <w:rFonts w:ascii="Garamond" w:hAnsi="Garamond" w:eastAsia="Times New Roman" w:cs="Times New Roman"/>
-          <w:color w:val="000000"/>
-          <w:kern w:val="0"/>
-          <w:sz w:val="36"/>
-          <w:szCs w:val="36"/>
-          <w:shd w:fill="auto" w:val="clear"/>
-          <w:lang w:val="en-US" w:eastAsia="zh-CN" w:bidi="hi-IN"/>
-        </w:rPr>
-      </w:pPr>
-      <w:r>
-        <w:rPr>
-          <w:rFonts w:eastAsia="Times New Roman" w:cs="Times New Roman" w:ascii="Garamond" w:hAnsi="Garamond"/>
-          <w:color w:val="000000"/>
-          <w:kern w:val="0"/>
-          <w:sz w:val="36"/>
-          <w:szCs w:val="36"/>
-          <w:shd w:fill="auto" w:val="clear"/>
-          <w:lang w:val="en-US" w:eastAsia="zh-CN" w:bidi="hi-IN"/>
-        </w:rPr>
-      </w:r>
-    </w:p>
-    <w:p>
-      <w:pPr>
-        <w:pStyle w:val="Normal"/>
-        <w:jc w:val="both"/>
-        <w:rPr>
-          <w:rFonts w:ascii="Garamond" w:hAnsi="Garamond" w:eastAsia="Times New Roman" w:cs="Times New Roman"/>
-          <w:i/>
-          <w:i/>
-          <w:iCs/>
-          <w:color w:val="000000"/>
-          <w:kern w:val="0"/>
-          <w:sz w:val="36"/>
-          <w:szCs w:val="36"/>
-          <w:u w:val="single"/>
-          <w:shd w:fill="auto" w:val="clear"/>
-          <w:lang w:val="en-US" w:eastAsia="zh-CN" w:bidi="hi-IN"/>
-        </w:rPr>
-      </w:pPr>
-      <w:r>
-        <w:rPr>
-          <w:rFonts w:eastAsia="Times New Roman" w:cs="Times New Roman" w:ascii="Garamond" w:hAnsi="Garamond"/>
-          <w:i/>
-          <w:iCs/>
-          <w:color w:val="000000"/>
-          <w:kern w:val="0"/>
-          <w:sz w:val="36"/>
-          <w:szCs w:val="36"/>
-          <w:u w:val="single"/>
-          <w:shd w:fill="auto" w:val="clear"/>
-          <w:lang w:val="en-US" w:eastAsia="zh-CN" w:bidi="hi-IN"/>
-        </w:rPr>
-        <w:t xml:space="preserve">E, quando a erva cresceu e frutificou, apareceu também o joio. </w:t>
-      </w:r>
-    </w:p>
-    <w:p>
-      <w:pPr>
-        <w:pStyle w:val="Normal"/>
-        <w:jc w:val="both"/>
-        <w:rPr>
-          <w:rFonts w:ascii="Garamond" w:hAnsi="Garamond" w:eastAsia="Times New Roman" w:cs="Times New Roman"/>
-          <w:color w:val="000000"/>
-          <w:kern w:val="0"/>
-          <w:sz w:val="36"/>
-          <w:szCs w:val="36"/>
-          <w:shd w:fill="auto" w:val="clear"/>
-          <w:lang w:val="en-US" w:eastAsia="zh-CN" w:bidi="hi-IN"/>
-        </w:rPr>
-      </w:pPr>
-      <w:r>
-        <w:rPr>
-          <w:rFonts w:eastAsia="Times New Roman" w:cs="Times New Roman" w:ascii="Garamond" w:hAnsi="Garamond"/>
-          <w:color w:val="000000"/>
-          <w:kern w:val="0"/>
-          <w:sz w:val="36"/>
-          <w:szCs w:val="36"/>
-          <w:shd w:fill="auto" w:val="clear"/>
-          <w:lang w:val="en-US" w:eastAsia="zh-CN" w:bidi="hi-IN"/>
-        </w:rPr>
-      </w:r>
-    </w:p>
-    <w:p>
-      <w:pPr>
-        <w:pStyle w:val="Normal"/>
-        <w:jc w:val="both"/>
-        <w:rPr>
-          <w:rFonts w:ascii="Garamond" w:hAnsi="Garamond" w:eastAsia="Times New Roman" w:cs="Times New Roman"/>
           <w:color w:val="00A0FC"/>
           <w:kern w:val="0"/>
           <w:sz w:val="36"/>
@@ -5914,6 +6229,38 @@
       <w:r>
         <w:rPr>
           <w:rFonts w:eastAsia="Times New Roman" w:cs="Times New Roman" w:ascii="Garamond" w:hAnsi="Garamond"/>
+          <w:b/>
+          <w:bCs/>
+          <w:i/>
+          <w:iCs/>
+          <w:color w:val="FC5C00"/>
+          <w:kern w:val="0"/>
+          <w:sz w:val="36"/>
+          <w:szCs w:val="36"/>
+          <w:shd w:fill="auto" w:val="clear"/>
+          <w:lang w:val="en-US" w:eastAsia="zh-CN" w:bidi="hi-IN"/>
+        </w:rPr>
+        <w:t>E os servos do pai de família, indo ter com ele, disseram-lhe</w:t>
+      </w:r>
+      <w:r>
+        <w:rPr>
+          <w:rFonts w:eastAsia="Times New Roman" w:cs="Times New Roman" w:ascii="Garamond" w:hAnsi="Garamond"/>
+          <w:color w:val="000000"/>
+          <w:kern w:val="0"/>
+          <w:sz w:val="36"/>
+          <w:szCs w:val="36"/>
+          <w:shd w:fill="auto" w:val="clear"/>
+          <w:lang w:val="en-US" w:eastAsia="zh-CN" w:bidi="hi-IN"/>
+        </w:rPr>
+        <w:t>: Deus está aqui representado na figura do pai de família. Como Jesus sempre opera em nome de Deus, os servos são todos aqueles que trabalham na seara do Mestre.</w:t>
+      </w:r>
+    </w:p>
+    <w:p>
+      <w:pPr>
+        <w:pStyle w:val="Normal"/>
+        <w:jc w:val="both"/>
+        <w:rPr>
+          <w:rFonts w:ascii="Garamond" w:hAnsi="Garamond" w:eastAsia="Times New Roman" w:cs="Times New Roman"/>
           <w:color w:val="00A0FC"/>
           <w:kern w:val="0"/>
           <w:sz w:val="36"/>
@@ -5921,7 +6268,11 @@
           <w:shd w:fill="auto" w:val="clear"/>
           <w:lang w:val="en-US" w:eastAsia="zh-CN" w:bidi="hi-IN"/>
         </w:rPr>
-        <w:t>Na Natureza, tudo obedece a um processo gradual de evolução: a semente é lançada, germina, cresce e, por fim, produz frutos. O mesmo ocorre com o bem e o mal. Cada um colhe, no devido tempo, os resultados daquilo que semeia por meio de seus pensamentos, palavras e ações. Por isso, Jesus nos alerta que o joio também precisa crescer, pois nem sempre sua presença é imediatamente percebida.</w:t>
+      </w:pPr>
+      <w:r>
+        <w:rPr>
+          <w:color w:val="000000"/>
+        </w:rPr>
       </w:r>
     </w:p>
     <w:p>
@@ -5941,6 +6292,38 @@
       <w:r>
         <w:rPr>
           <w:rFonts w:eastAsia="Times New Roman" w:cs="Times New Roman" w:ascii="Garamond" w:hAnsi="Garamond"/>
+          <w:b/>
+          <w:bCs/>
+          <w:i/>
+          <w:iCs/>
+          <w:color w:val="FC5C00"/>
+          <w:kern w:val="0"/>
+          <w:sz w:val="36"/>
+          <w:szCs w:val="36"/>
+          <w:shd w:fill="auto" w:val="clear"/>
+          <w:lang w:val="en-US" w:eastAsia="zh-CN" w:bidi="hi-IN"/>
+        </w:rPr>
+        <w:t>Senhor, não semeaste tu no teu campo boa semente? Por que tem, então, joio?</w:t>
+      </w:r>
+      <w:r>
+        <w:rPr>
+          <w:rFonts w:eastAsia="Times New Roman" w:cs="Times New Roman" w:ascii="Garamond" w:hAnsi="Garamond"/>
+          <w:color w:val="000000"/>
+          <w:kern w:val="0"/>
+          <w:sz w:val="36"/>
+          <w:szCs w:val="36"/>
+          <w:shd w:fill="auto" w:val="clear"/>
+          <w:lang w:val="en-US" w:eastAsia="zh-CN" w:bidi="hi-IN"/>
+        </w:rPr>
+        <w:t>: Esse trecho da parábola significa a capacidade de discernimento que aqueles que trabalham no bem, ainda que de maneira incompleta, têm para distinguir o bem do mal.</w:t>
+      </w:r>
+    </w:p>
+    <w:p>
+      <w:pPr>
+        <w:pStyle w:val="Normal"/>
+        <w:jc w:val="both"/>
+        <w:rPr>
+          <w:rFonts w:ascii="Garamond" w:hAnsi="Garamond" w:eastAsia="Times New Roman" w:cs="Times New Roman"/>
           <w:color w:val="00A0FC"/>
           <w:kern w:val="0"/>
           <w:sz w:val="36"/>
@@ -5948,6 +6331,11 @@
           <w:shd w:fill="auto" w:val="clear"/>
           <w:lang w:val="en-US" w:eastAsia="zh-CN" w:bidi="hi-IN"/>
         </w:rPr>
+      </w:pPr>
+      <w:r>
+        <w:rPr>
+          <w:color w:val="000000"/>
+        </w:rPr>
       </w:r>
     </w:p>
     <w:p>
@@ -5967,6 +6355,58 @@
       <w:r>
         <w:rPr>
           <w:rFonts w:eastAsia="Times New Roman" w:cs="Times New Roman" w:ascii="Garamond" w:hAnsi="Garamond"/>
+          <w:color w:val="000000"/>
+          <w:kern w:val="0"/>
+          <w:sz w:val="36"/>
+          <w:szCs w:val="36"/>
+          <w:shd w:fill="auto" w:val="clear"/>
+          <w:lang w:val="en-US" w:eastAsia="zh-CN" w:bidi="hi-IN"/>
+        </w:rPr>
+        <w:t>Tudo o que vem de Deus é bom. Por que então o mal surge em meio ao bem? Essa pergunta vai de encontro ao que trouxemos no início das nossas reflexões: o mal não emana de Deus</w:t>
+      </w:r>
+      <w:r>
+        <w:rPr>
+          <w:rFonts w:eastAsia="Times New Roman" w:cs="Times New Roman" w:ascii="Garamond" w:hAnsi="Garamond"/>
+          <w:color w:val="000000"/>
+          <w:kern w:val="0"/>
+          <w:sz w:val="36"/>
+          <w:szCs w:val="36"/>
+          <w:shd w:fill="auto" w:val="clear"/>
+          <w:lang w:val="en-US" w:eastAsia="zh-CN" w:bidi="hi-IN"/>
+        </w:rPr>
+        <w:t xml:space="preserve">; ele é </w:t>
+      </w:r>
+      <w:r>
+        <w:rPr>
+          <w:rFonts w:eastAsia="Times New Roman" w:cs="Times New Roman" w:ascii="Garamond" w:hAnsi="Garamond"/>
+          <w:color w:val="000000"/>
+          <w:kern w:val="0"/>
+          <w:sz w:val="36"/>
+          <w:szCs w:val="36"/>
+          <w:shd w:fill="auto" w:val="clear"/>
+          <w:lang w:val="en-US" w:eastAsia="zh-CN" w:bidi="hi-IN"/>
+        </w:rPr>
+        <w:t>consequência de nossas imperfeições</w:t>
+      </w:r>
+      <w:r>
+        <w:rPr>
+          <w:rFonts w:eastAsia="Times New Roman" w:cs="Times New Roman" w:ascii="Garamond" w:hAnsi="Garamond"/>
+          <w:color w:val="000000"/>
+          <w:kern w:val="0"/>
+          <w:sz w:val="36"/>
+          <w:szCs w:val="36"/>
+          <w:shd w:fill="auto" w:val="clear"/>
+          <w:lang w:val="en-US" w:eastAsia="zh-CN" w:bidi="hi-IN"/>
+        </w:rPr>
+        <w:t xml:space="preserve"> e do afastamento das leis de Deus. </w:t>
+      </w:r>
+    </w:p>
+    <w:p>
+      <w:pPr>
+        <w:pStyle w:val="Normal"/>
+        <w:jc w:val="both"/>
+        <w:rPr>
+          <w:rFonts w:ascii="Garamond" w:hAnsi="Garamond" w:eastAsia="Times New Roman" w:cs="Times New Roman"/>
           <w:color w:val="00A0FC"/>
           <w:kern w:val="0"/>
           <w:sz w:val="36"/>
@@ -5974,424 +6414,68 @@
           <w:shd w:fill="auto" w:val="clear"/>
           <w:lang w:val="en-US" w:eastAsia="zh-CN" w:bidi="hi-IN"/>
         </w:rPr>
-        <w:t>No estágio evolutivo em que nos encontramos, o bem e o mal coexistem lado a lado. Essa convivência não apenas nos permite desenvolver o discernimento necessário para distingui-los, mas também oferece ao bem a oportunidade de influenciar e transformar o mal. Assim, os bons exemplos tornam-se instrumentos de educação e progresso para aqueles que ainda se encontram afastados do caminho do bem.</w:t>
-      </w:r>
-    </w:p>
-    <w:p>
-      <w:pPr>
-        <w:pStyle w:val="Normal"/>
-        <w:jc w:val="both"/>
-        <w:rPr>
-          <w:rFonts w:ascii="Garamond" w:hAnsi="Garamond" w:eastAsia="Times New Roman" w:cs="Times New Roman"/>
-          <w:color w:val="000000"/>
-          <w:kern w:val="0"/>
-          <w:sz w:val="36"/>
-          <w:szCs w:val="36"/>
-          <w:shd w:fill="auto" w:val="clear"/>
-          <w:lang w:val="en-US" w:eastAsia="zh-CN" w:bidi="hi-IN"/>
-        </w:rPr>
-      </w:pPr>
-      <w:r>
-        <w:rPr>
-          <w:rFonts w:eastAsia="Times New Roman" w:cs="Times New Roman" w:ascii="Garamond" w:hAnsi="Garamond"/>
-          <w:color w:val="000000"/>
-          <w:kern w:val="0"/>
-          <w:sz w:val="36"/>
-          <w:szCs w:val="36"/>
-          <w:shd w:fill="auto" w:val="clear"/>
-          <w:lang w:val="en-US" w:eastAsia="zh-CN" w:bidi="hi-IN"/>
-        </w:rPr>
-      </w:r>
-    </w:p>
-    <w:p>
-      <w:pPr>
-        <w:pStyle w:val="Normal"/>
-        <w:jc w:val="both"/>
-        <w:rPr>
-          <w:rFonts w:ascii="Garamond" w:hAnsi="Garamond" w:eastAsia="Times New Roman" w:cs="Times New Roman"/>
-          <w:color w:val="000000"/>
-          <w:kern w:val="0"/>
-          <w:sz w:val="36"/>
-          <w:szCs w:val="36"/>
-          <w:shd w:fill="auto" w:val="clear"/>
-          <w:lang w:val="en-US" w:eastAsia="zh-CN" w:bidi="hi-IN"/>
-        </w:rPr>
-      </w:pPr>
-      <w:r>
-        <w:rPr>
-          <w:rFonts w:eastAsia="Times New Roman" w:cs="Times New Roman" w:ascii="Garamond" w:hAnsi="Garamond"/>
-          <w:i/>
-          <w:iCs/>
-          <w:color w:val="000000"/>
-          <w:kern w:val="0"/>
-          <w:sz w:val="36"/>
-          <w:szCs w:val="36"/>
-          <w:u w:val="single"/>
-          <w:shd w:fill="auto" w:val="clear"/>
-          <w:lang w:val="en-US" w:eastAsia="zh-CN" w:bidi="hi-IN"/>
-        </w:rPr>
-        <w:t>E os servos</w:t>
-      </w:r>
-      <w:r>
-        <w:rPr>
-          <w:rFonts w:eastAsia="Times New Roman" w:cs="Times New Roman" w:ascii="Garamond" w:hAnsi="Garamond"/>
-          <w:i/>
-          <w:iCs/>
-          <w:color w:val="000000"/>
-          <w:kern w:val="0"/>
-          <w:sz w:val="36"/>
-          <w:szCs w:val="36"/>
-          <w:u w:val="single"/>
-          <w:shd w:fill="auto" w:val="clear"/>
-          <w:lang w:val="en-US" w:eastAsia="zh-CN" w:bidi="hi-IN"/>
-        </w:rPr>
-        <w:t xml:space="preserve"> </w:t>
-      </w:r>
-      <w:r>
-        <w:rPr>
-          <w:rFonts w:eastAsia="Times New Roman" w:cs="Times New Roman" w:ascii="Garamond" w:hAnsi="Garamond"/>
-          <w:i/>
-          <w:iCs/>
-          <w:color w:val="000000"/>
-          <w:kern w:val="0"/>
-          <w:sz w:val="36"/>
-          <w:szCs w:val="36"/>
-          <w:u w:val="single"/>
-          <w:shd w:fill="auto" w:val="clear"/>
-          <w:lang w:val="en-US" w:eastAsia="zh-CN" w:bidi="hi-IN"/>
-        </w:rPr>
-        <w:t>do pai de família, indo ter com ele, disseram-lhe: Senhor, não semeaste</w:t>
-      </w:r>
-      <w:r>
-        <w:rPr>
-          <w:rFonts w:eastAsia="Times New Roman" w:cs="Times New Roman" w:ascii="Garamond" w:hAnsi="Garamond"/>
-          <w:i/>
-          <w:iCs/>
-          <w:color w:val="000000"/>
-          <w:kern w:val="0"/>
-          <w:sz w:val="36"/>
-          <w:szCs w:val="36"/>
-          <w:u w:val="single"/>
-          <w:shd w:fill="auto" w:val="clear"/>
-          <w:lang w:val="en-US" w:eastAsia="zh-CN" w:bidi="hi-IN"/>
-        </w:rPr>
-        <w:t xml:space="preserve"> </w:t>
-      </w:r>
-      <w:r>
-        <w:rPr>
-          <w:rFonts w:eastAsia="Times New Roman" w:cs="Times New Roman" w:ascii="Garamond" w:hAnsi="Garamond"/>
-          <w:i/>
-          <w:iCs/>
-          <w:color w:val="000000"/>
-          <w:kern w:val="0"/>
-          <w:sz w:val="36"/>
-          <w:szCs w:val="36"/>
-          <w:u w:val="single"/>
-          <w:shd w:fill="auto" w:val="clear"/>
-          <w:lang w:val="en-US" w:eastAsia="zh-CN" w:bidi="hi-IN"/>
-        </w:rPr>
-        <w:t>tu no teu campo boa semente? Por que tem, então, joio?</w:t>
-      </w:r>
-      <w:r>
-        <w:rPr>
-          <w:rFonts w:eastAsia="Times New Roman" w:cs="Times New Roman" w:ascii="Garamond" w:hAnsi="Garamond"/>
-          <w:color w:val="000000"/>
-          <w:kern w:val="0"/>
-          <w:sz w:val="36"/>
-          <w:szCs w:val="36"/>
-          <w:shd w:fill="auto" w:val="clear"/>
-          <w:lang w:val="en-US" w:eastAsia="zh-CN" w:bidi="hi-IN"/>
-        </w:rPr>
-        <w:t xml:space="preserve"> </w:t>
-      </w:r>
-    </w:p>
-    <w:p>
-      <w:pPr>
-        <w:pStyle w:val="Normal"/>
-        <w:jc w:val="both"/>
-        <w:rPr>
-          <w:rFonts w:ascii="Garamond" w:hAnsi="Garamond" w:eastAsia="Times New Roman" w:cs="Times New Roman"/>
-          <w:color w:val="000000"/>
-          <w:kern w:val="0"/>
-          <w:sz w:val="36"/>
-          <w:szCs w:val="36"/>
-          <w:shd w:fill="auto" w:val="clear"/>
-          <w:lang w:val="en-US" w:eastAsia="zh-CN" w:bidi="hi-IN"/>
-        </w:rPr>
-      </w:pPr>
-      <w:r>
-        <w:rPr>
-          <w:rFonts w:eastAsia="Times New Roman" w:cs="Times New Roman" w:ascii="Garamond" w:hAnsi="Garamond"/>
-          <w:color w:val="000000"/>
-          <w:kern w:val="0"/>
-          <w:sz w:val="36"/>
-          <w:szCs w:val="36"/>
-          <w:shd w:fill="auto" w:val="clear"/>
-          <w:lang w:val="en-US" w:eastAsia="zh-CN" w:bidi="hi-IN"/>
-        </w:rPr>
-      </w:r>
-    </w:p>
-    <w:p>
-      <w:pPr>
-        <w:pStyle w:val="Normal"/>
-        <w:jc w:val="both"/>
-        <w:rPr>
-          <w:rFonts w:ascii="Garamond" w:hAnsi="Garamond" w:eastAsia="Times New Roman" w:cs="Times New Roman"/>
-          <w:color w:val="00A0FC"/>
-          <w:kern w:val="0"/>
-          <w:sz w:val="36"/>
-          <w:szCs w:val="36"/>
-          <w:shd w:fill="auto" w:val="clear"/>
-          <w:lang w:val="en-US" w:eastAsia="zh-CN" w:bidi="hi-IN"/>
-        </w:rPr>
-      </w:pPr>
-      <w:r>
-        <w:rPr>
-          <w:rFonts w:eastAsia="Times New Roman" w:cs="Times New Roman" w:ascii="Garamond" w:hAnsi="Garamond"/>
-          <w:color w:val="00A0FC"/>
-          <w:kern w:val="0"/>
-          <w:sz w:val="36"/>
-          <w:szCs w:val="36"/>
-          <w:shd w:fill="auto" w:val="clear"/>
-          <w:lang w:val="en-US" w:eastAsia="zh-CN" w:bidi="hi-IN"/>
-        </w:rPr>
-        <w:t>Ao perceberem a presença do joio entre o trigo, os servos perguntam ao Senhor se deveriam arrancá-lo, mas recebem a orientação de deixá-los crescer juntos até a ceifa. Nessa interpretação, o pai de família representa Deus, enquanto os servos simbolizam os trabalhadores da seara divina, isto é, todos aqueles que atuam como instrumentos do bem sob a direção de Jesus. Metaforicamente, eles representam as inteligências e mãos dedicadas ao serviço do amor e da evolução espiritual.</w:t>
-      </w:r>
-    </w:p>
-    <w:p>
-      <w:pPr>
-        <w:pStyle w:val="Normal"/>
-        <w:jc w:val="both"/>
-        <w:rPr>
-          <w:rFonts w:ascii="Garamond" w:hAnsi="Garamond" w:eastAsia="Times New Roman" w:cs="Times New Roman"/>
-          <w:color w:val="000000"/>
-          <w:kern w:val="0"/>
-          <w:sz w:val="36"/>
-          <w:szCs w:val="36"/>
-          <w:shd w:fill="auto" w:val="clear"/>
-          <w:lang w:val="en-US" w:eastAsia="zh-CN" w:bidi="hi-IN"/>
-        </w:rPr>
-      </w:pPr>
-      <w:r>
-        <w:rPr>
-          <w:rFonts w:eastAsia="Times New Roman" w:cs="Times New Roman" w:ascii="Garamond" w:hAnsi="Garamond"/>
-          <w:color w:val="000000"/>
-          <w:kern w:val="0"/>
-          <w:sz w:val="36"/>
-          <w:szCs w:val="36"/>
-          <w:shd w:fill="auto" w:val="clear"/>
-          <w:lang w:val="en-US" w:eastAsia="zh-CN" w:bidi="hi-IN"/>
-        </w:rPr>
-        <w:t>E ele lhes disse:</w:t>
-      </w:r>
-      <w:r>
-        <w:rPr>
-          <w:rFonts w:eastAsia="Times New Roman" w:cs="Times New Roman" w:ascii="Garamond" w:hAnsi="Garamond"/>
-          <w:color w:val="000000"/>
-          <w:kern w:val="0"/>
-          <w:sz w:val="36"/>
-          <w:szCs w:val="36"/>
-          <w:shd w:fill="auto" w:val="clear"/>
-          <w:lang w:val="en-US" w:eastAsia="zh-CN" w:bidi="hi-IN"/>
-        </w:rPr>
-        <w:t xml:space="preserve"> </w:t>
-      </w:r>
-      <w:r>
-        <w:rPr>
-          <w:rFonts w:eastAsia="Times New Roman" w:cs="Times New Roman" w:ascii="Garamond" w:hAnsi="Garamond"/>
-          <w:color w:val="000000"/>
-          <w:kern w:val="0"/>
-          <w:sz w:val="36"/>
-          <w:szCs w:val="36"/>
-          <w:shd w:fill="auto" w:val="clear"/>
-          <w:lang w:val="en-US" w:eastAsia="zh-CN" w:bidi="hi-IN"/>
-        </w:rPr>
-        <w:t>Um inimigo é quem fez isso. E os servos lhe disseram: Queres, pois, que</w:t>
-      </w:r>
-      <w:r>
-        <w:rPr>
-          <w:rFonts w:eastAsia="Times New Roman" w:cs="Times New Roman" w:ascii="Garamond" w:hAnsi="Garamond"/>
-          <w:color w:val="000000"/>
-          <w:kern w:val="0"/>
-          <w:sz w:val="36"/>
-          <w:szCs w:val="36"/>
-          <w:shd w:fill="auto" w:val="clear"/>
-          <w:lang w:val="en-US" w:eastAsia="zh-CN" w:bidi="hi-IN"/>
-        </w:rPr>
-        <w:t xml:space="preserve"> </w:t>
-      </w:r>
-      <w:r>
-        <w:rPr>
-          <w:rFonts w:eastAsia="Times New Roman" w:cs="Times New Roman" w:ascii="Garamond" w:hAnsi="Garamond"/>
-          <w:color w:val="000000"/>
-          <w:kern w:val="0"/>
-          <w:sz w:val="36"/>
-          <w:szCs w:val="36"/>
-          <w:shd w:fill="auto" w:val="clear"/>
-          <w:lang w:val="en-US" w:eastAsia="zh-CN" w:bidi="hi-IN"/>
-        </w:rPr>
-        <w:t>vamos arrancá-lo? Porém ele lhes disse: Não; para que, ao colher o joio,</w:t>
-      </w:r>
-      <w:r>
-        <w:rPr>
-          <w:rFonts w:eastAsia="Times New Roman" w:cs="Times New Roman" w:ascii="Garamond" w:hAnsi="Garamond"/>
-          <w:color w:val="000000"/>
-          <w:kern w:val="0"/>
-          <w:sz w:val="36"/>
-          <w:szCs w:val="36"/>
-          <w:shd w:fill="auto" w:val="clear"/>
-          <w:lang w:val="en-US" w:eastAsia="zh-CN" w:bidi="hi-IN"/>
-        </w:rPr>
-        <w:t xml:space="preserve"> </w:t>
-      </w:r>
-      <w:r>
-        <w:rPr>
-          <w:rFonts w:eastAsia="Times New Roman" w:cs="Times New Roman" w:ascii="Garamond" w:hAnsi="Garamond"/>
-          <w:color w:val="000000"/>
-          <w:kern w:val="0"/>
-          <w:sz w:val="36"/>
-          <w:szCs w:val="36"/>
-          <w:shd w:fill="auto" w:val="clear"/>
-          <w:lang w:val="en-US" w:eastAsia="zh-CN" w:bidi="hi-IN"/>
-        </w:rPr>
-        <w:t>não arranqueis também o trigo com ele. Deixai crescer ambos juntos</w:t>
-      </w:r>
-      <w:r>
-        <w:rPr>
-          <w:rFonts w:eastAsia="Times New Roman" w:cs="Times New Roman" w:ascii="Garamond" w:hAnsi="Garamond"/>
-          <w:color w:val="000000"/>
-          <w:kern w:val="0"/>
-          <w:sz w:val="36"/>
-          <w:szCs w:val="36"/>
-          <w:shd w:fill="auto" w:val="clear"/>
-          <w:lang w:val="en-US" w:eastAsia="zh-CN" w:bidi="hi-IN"/>
-        </w:rPr>
-        <w:t xml:space="preserve"> </w:t>
-      </w:r>
-      <w:r>
-        <w:rPr>
-          <w:rFonts w:eastAsia="Times New Roman" w:cs="Times New Roman" w:ascii="Garamond" w:hAnsi="Garamond"/>
-          <w:color w:val="000000"/>
-          <w:kern w:val="0"/>
-          <w:sz w:val="36"/>
-          <w:szCs w:val="36"/>
-          <w:shd w:fill="auto" w:val="clear"/>
-          <w:lang w:val="en-US" w:eastAsia="zh-CN" w:bidi="hi-IN"/>
-        </w:rPr>
-        <w:t>até à ceifa; e, por ocasião da ceifa, direi aos ceifeiros: colhei primeiro o</w:t>
-      </w:r>
-      <w:r>
-        <w:rPr>
-          <w:rFonts w:eastAsia="Times New Roman" w:cs="Times New Roman" w:ascii="Garamond" w:hAnsi="Garamond"/>
-          <w:color w:val="000000"/>
-          <w:kern w:val="0"/>
-          <w:sz w:val="36"/>
-          <w:szCs w:val="36"/>
-          <w:shd w:fill="auto" w:val="clear"/>
-          <w:lang w:val="en-US" w:eastAsia="zh-CN" w:bidi="hi-IN"/>
-        </w:rPr>
-        <w:t xml:space="preserve"> </w:t>
-      </w:r>
-      <w:r>
-        <w:rPr>
-          <w:rFonts w:eastAsia="Times New Roman" w:cs="Times New Roman" w:ascii="Garamond" w:hAnsi="Garamond"/>
-          <w:color w:val="000000"/>
-          <w:kern w:val="0"/>
-          <w:sz w:val="36"/>
-          <w:szCs w:val="36"/>
-          <w:shd w:fill="auto" w:val="clear"/>
-          <w:lang w:val="en-US" w:eastAsia="zh-CN" w:bidi="hi-IN"/>
-        </w:rPr>
-        <w:t>joio e atai-o em molhos para o queimar; mas o trigo, ajuntai-o no meu</w:t>
-      </w:r>
-      <w:r>
-        <w:rPr>
-          <w:rFonts w:eastAsia="Times New Roman" w:cs="Times New Roman" w:ascii="Garamond" w:hAnsi="Garamond"/>
-          <w:color w:val="000000"/>
-          <w:kern w:val="0"/>
-          <w:sz w:val="36"/>
-          <w:szCs w:val="36"/>
-          <w:shd w:fill="auto" w:val="clear"/>
-          <w:lang w:val="en-US" w:eastAsia="zh-CN" w:bidi="hi-IN"/>
-        </w:rPr>
-        <w:t xml:space="preserve"> </w:t>
-      </w:r>
-      <w:r>
-        <w:rPr>
-          <w:rFonts w:eastAsia="Times New Roman" w:cs="Times New Roman" w:ascii="Garamond" w:hAnsi="Garamond"/>
-          <w:color w:val="000000"/>
-          <w:kern w:val="0"/>
-          <w:sz w:val="36"/>
-          <w:szCs w:val="36"/>
-          <w:shd w:fill="auto" w:val="clear"/>
-          <w:lang w:val="en-US" w:eastAsia="zh-CN" w:bidi="hi-IN"/>
-        </w:rPr>
-        <w:t>celeiro</w:t>
-      </w:r>
-      <w:r>
-        <w:rPr>
-          <w:rFonts w:eastAsia="Times New Roman" w:cs="Times New Roman" w:ascii="Garamond" w:hAnsi="Garamond"/>
-          <w:color w:val="000000"/>
-          <w:kern w:val="0"/>
-          <w:sz w:val="36"/>
-          <w:szCs w:val="36"/>
-          <w:shd w:fill="auto" w:val="clear"/>
-          <w:lang w:val="en-US" w:eastAsia="zh-CN" w:bidi="hi-IN"/>
-        </w:rPr>
-        <w:t>.</w:t>
-      </w:r>
-    </w:p>
-    <w:p>
-      <w:pPr>
-        <w:pStyle w:val="Normal"/>
-        <w:jc w:val="both"/>
-        <w:rPr>
-          <w:rFonts w:ascii="Garamond" w:hAnsi="Garamond" w:eastAsia="Times New Roman" w:cs="Times New Roman"/>
-          <w:color w:val="000000"/>
-          <w:kern w:val="0"/>
-          <w:sz w:val="36"/>
-          <w:szCs w:val="36"/>
-          <w:shd w:fill="auto" w:val="clear"/>
-          <w:lang w:val="en-US" w:eastAsia="zh-CN" w:bidi="hi-IN"/>
-        </w:rPr>
-      </w:pPr>
-      <w:r>
-        <w:rPr>
-          <w:rFonts w:eastAsia="Times New Roman" w:cs="Times New Roman" w:ascii="Garamond" w:hAnsi="Garamond"/>
-          <w:color w:val="000000"/>
-          <w:kern w:val="0"/>
-          <w:sz w:val="36"/>
-          <w:szCs w:val="36"/>
-          <w:shd w:fill="auto" w:val="clear"/>
-          <w:lang w:val="en-US" w:eastAsia="zh-CN" w:bidi="hi-IN"/>
-        </w:rPr>
-      </w:r>
-    </w:p>
-    <w:p>
-      <w:pPr>
-        <w:pStyle w:val="Normal"/>
-        <w:jc w:val="both"/>
-        <w:rPr>
-          <w:rFonts w:ascii="Garamond" w:hAnsi="Garamond" w:eastAsia="Times New Roman" w:cs="Times New Roman"/>
-          <w:color w:val="000000"/>
-          <w:kern w:val="0"/>
-          <w:sz w:val="36"/>
-          <w:szCs w:val="36"/>
-          <w:shd w:fill="auto" w:val="clear"/>
-          <w:lang w:val="en-US" w:eastAsia="zh-CN" w:bidi="hi-IN"/>
-        </w:rPr>
-      </w:pPr>
-      <w:r>
-        <w:rPr>
-          <w:rFonts w:eastAsia="Times New Roman" w:cs="Times New Roman" w:ascii="Garamond" w:hAnsi="Garamond"/>
-          <w:color w:val="000000"/>
-          <w:kern w:val="0"/>
-          <w:sz w:val="36"/>
-          <w:szCs w:val="36"/>
-          <w:shd w:fill="auto" w:val="clear"/>
-          <w:lang w:val="en-US" w:eastAsia="zh-CN" w:bidi="hi-IN"/>
-        </w:rPr>
-        <w:t>[ Parei aqui em 11/06/2026 ]</w:t>
+      </w:pPr>
+      <w:r>
+        <w:rPr>
+          <w:rFonts w:eastAsia="Times New Roman" w:cs="Times New Roman" w:ascii="Garamond" w:hAnsi="Garamond"/>
+          <w:color w:val="000000"/>
+          <w:kern w:val="0"/>
+          <w:sz w:val="36"/>
+          <w:szCs w:val="36"/>
+          <w:shd w:fill="auto" w:val="clear"/>
+          <w:lang w:val="en-US" w:eastAsia="zh-CN" w:bidi="hi-IN"/>
+        </w:rPr>
+      </w:r>
+    </w:p>
+    <w:p>
+      <w:pPr>
+        <w:pStyle w:val="Normal"/>
+        <w:jc w:val="both"/>
+        <w:rPr>
+          <w:rFonts w:ascii="Garamond" w:hAnsi="Garamond" w:eastAsia="Times New Roman" w:cs="Times New Roman"/>
+          <w:color w:val="000000"/>
+          <w:kern w:val="0"/>
+          <w:sz w:val="36"/>
+          <w:szCs w:val="36"/>
+          <w:shd w:fill="auto" w:val="clear"/>
+          <w:lang w:val="en-US" w:eastAsia="zh-CN" w:bidi="hi-IN"/>
+        </w:rPr>
+      </w:pPr>
+      <w:r>
+        <w:rPr>
+          <w:rFonts w:eastAsia="Times New Roman" w:cs="Times New Roman" w:ascii="Garamond" w:hAnsi="Garamond"/>
+          <w:color w:val="000000"/>
+          <w:kern w:val="0"/>
+          <w:sz w:val="36"/>
+          <w:szCs w:val="36"/>
+          <w:shd w:fill="auto" w:val="clear"/>
+          <w:lang w:val="en-US" w:eastAsia="zh-CN" w:bidi="hi-IN"/>
+        </w:rPr>
+        <w:t>[ Parei aqui em 1</w:t>
+      </w:r>
+      <w:r>
+        <w:rPr>
+          <w:rFonts w:eastAsia="Times New Roman" w:cs="Times New Roman" w:ascii="Garamond" w:hAnsi="Garamond"/>
+          <w:color w:val="000000"/>
+          <w:kern w:val="0"/>
+          <w:sz w:val="36"/>
+          <w:szCs w:val="36"/>
+          <w:shd w:fill="auto" w:val="clear"/>
+          <w:lang w:val="en-US" w:eastAsia="zh-CN" w:bidi="hi-IN"/>
+        </w:rPr>
+        <w:t>2</w:t>
+      </w:r>
+      <w:r>
+        <w:rPr>
+          <w:rFonts w:eastAsia="Times New Roman" w:cs="Times New Roman" w:ascii="Garamond" w:hAnsi="Garamond"/>
+          <w:color w:val="000000"/>
+          <w:kern w:val="0"/>
+          <w:sz w:val="36"/>
+          <w:szCs w:val="36"/>
+          <w:shd w:fill="auto" w:val="clear"/>
+          <w:lang w:val="en-US" w:eastAsia="zh-CN" w:bidi="hi-IN"/>
+        </w:rPr>
+        <w:t>/06/2026 ]</w:t>
       </w:r>
       <w:r>
         <w:br w:type="page"/>
@@ -6944,31 +7028,7 @@
           <w:shd w:fill="auto" w:val="clear"/>
           <w:lang w:val="en-US" w:eastAsia="zh-CN" w:bidi="hi-IN"/>
         </w:rPr>
-        <w:t xml:space="preserve">A </w:t>
-      </w:r>
-      <w:r>
-        <w:rPr>
-          <w:rFonts w:eastAsia="Times New Roman" w:cs="Times New Roman" w:ascii="Garamond" w:hAnsi="Garamond"/>
-          <w:color w:val="000000"/>
-          <w:kern w:val="0"/>
-          <w:sz w:val="36"/>
-          <w:szCs w:val="36"/>
-          <w:shd w:fill="auto" w:val="clear"/>
-          <w:lang w:val="en-US" w:eastAsia="zh-CN" w:bidi="hi-IN"/>
-        </w:rPr>
-        <w:t>escolha</w:t>
-      </w:r>
-      <w:r>
-        <w:rPr>
-          <w:rFonts w:eastAsia="Times New Roman" w:cs="Times New Roman" w:ascii="Garamond" w:hAnsi="Garamond"/>
-          <w:color w:val="000000"/>
-          <w:kern w:val="0"/>
-          <w:sz w:val="36"/>
-          <w:szCs w:val="36"/>
-          <w:shd w:fill="auto" w:val="clear"/>
-          <w:lang w:val="en-US" w:eastAsia="zh-CN" w:bidi="hi-IN"/>
-        </w:rPr>
-        <w:t xml:space="preserve"> é nossa.</w:t>
+        <w:t>A escolha é nossa.</w:t>
       </w:r>
     </w:p>
     <w:sectPr>

</xml_diff>